<commit_message>
fix: merge near-duplicate references and clean chapter 3 title
</commit_message>
<xml_diff>
--- a/output/final/thesis_ch1_to_ch3.docx
+++ b/output/final/thesis_ch1_to_ch3.docx
@@ -4613,7 +4613,7 @@
           <w:b/>
           <w:sz w:val="52"/>
         </w:rPr>
-        <w:t>روش‌شناسی پژوهش (بخش اول)</w:t>
+        <w:t>روش‌شناسی پژوهش</w:t>
       </w:r>
     </w:p>
     <w:p>
@@ -6151,7 +6151,7 @@
           <w:rFonts w:ascii="Times New Roman" w:hAnsi="Times New Roman" w:cs="B Nazanin"/>
           <w:sz w:val="22"/>
         </w:rPr>
-        <w:t>بهدیو، ع.، نمازی، م.، و خواجوی، ش. (۱۳۹۸). ارائه مدلی برای بررسی تأثیرات ترکیبی ریسک‌پذیری، ویژگی‌های فردی و فرهنگی بر بروز رفتار توده‌وار سرمایه‌گذاران در بورس اوراق بهادار تهران. پژوهش های حسابداری مالی و حسابرسی، ۱۱) ۴۲(، ۱-۲۶.</w:t>
+        <w:t>بهدیو، ع.، نمازی، م.، و خواجوی، ش. (۱۳۹۸). ارائه مدلی برای بررسی تأثیرات ترکیبی ریسک‌پذیری، ویژگی‌های فردی و فرهنگی بر بروز رفتار توده‌وار سرمایه‌گذاران در بورس اوراق بهادار تهران. پژوهش های حسابداری مالی و حسابرسی، ۱۱(۴۲)، ۱-۲۶.</w:t>
       </w:r>
     </w:p>
     <w:p>
@@ -6165,7 +6165,7 @@
           <w:rFonts w:ascii="Times New Roman" w:hAnsi="Times New Roman" w:cs="B Nazanin"/>
           <w:sz w:val="22"/>
         </w:rPr>
-        <w:t>بهدیو، ع.، نمازی، م.، و خواجوی، ش. (۱۳۹۸). ارائه مدلی برای بررسی تأثیرات ترکیبی ریسک‌پذیری، ویژگی‌های فردی و فرهنگی بر بروز رفتار توده‌وار سرمایه‌گذاران در بورس اوراق بهادار تهران. پژوهش های حسابداری مالی و حسابرسی، ۱۱) ۴۲ (، ۱-۲۶.</w:t>
+        <w:t>ستایش، م. ح.، کاظم‌پور، م.، و دلالی اصفهانی، ر. (۱۳۹۹). بررسی نقش منابع اطلاعاتی بر رابطه میان ویژگی‌های شخصیتی و رفتار معاملاتی سرمایه‌گذاران حقیقی در بورس اوراق بهادار تهران. مطالعات مدیریت مالی، ۸(۱۶)، ۲۹-۶۱.</w:t>
       </w:r>
     </w:p>
     <w:p>
@@ -6179,7 +6179,7 @@
           <w:rFonts w:ascii="Times New Roman" w:hAnsi="Times New Roman" w:cs="B Nazanin"/>
           <w:sz w:val="22"/>
         </w:rPr>
-        <w:t>ستایش، م. ح.، کاظم‌پور، م.، و دلالی اصفهانی، ر. (۱۳۹۹). بررسی نقش منابع اطلاعاتی بر رابطه میان ویژگی‌های شخصیتی و رفتار معاملاتی سرمایه‌گذاران حقیقی در بورس اوراق بهادار تهران. مطالعات مدیریت مالی، ۸) ۱۶(،۲۹-۶۱.</w:t>
+        <w:t>طالبی، محمد؛ یحیی‌زاده‌فر، محمود؛ و سعیدی، پرویز. (۱۳۹۸). اعتباریابی مقیاس تحمل ریسک مالی گرابل و لایتون در بورس اوراق بهادار تهران. فصلنامه علمی-پژوهشی دانش سرمایه‌گذاری، ۸(۳۱)، ۱۵۱-۱۶۸.</w:t>
       </w:r>
     </w:p>
     <w:p>
@@ -6193,7 +6193,7 @@
           <w:rFonts w:ascii="Times New Roman" w:hAnsi="Times New Roman" w:cs="B Nazanin"/>
           <w:sz w:val="22"/>
         </w:rPr>
-        <w:t>ستایش، م. ح.، کاظم‌پور، م.، و دلالی اصفهانی، ر. (۱۳۹۹). بررسی نقش منابع اطلاعاتی بر رابطه میان ویژگی‌های شخصیتی و رفتار معاملاتی سرمایه‌گذاران حقیقی در بورس اوراق بهادار تهران. مطالعات مدیریت مالی، ۸) ۱۶ (،۲۹-۶۱.</w:t>
+        <w:t>فروغی، د.، و تهرانی، ر. (۱۳۹۷). نقش سواد مالی در تعدیل رابطه بین سوگیری های رفتاری و عملکرد سرمایه گذاری در بورس اوراق بهادار تهران. تحقیقات مالی، ۲۰) ۲(، ۱۸۹-۲۰۸.</w:t>
       </w:r>
     </w:p>
     <w:p>
@@ -6207,7 +6207,7 @@
           <w:rFonts w:ascii="Times New Roman" w:hAnsi="Times New Roman" w:cs="B Nazanin"/>
           <w:sz w:val="22"/>
         </w:rPr>
-        <w:t>طالبی، محمد؛ یحیی‌زاده‌فر، محمود؛ و سعیدی، پرویز. (۱۳۹۸). اعتباریابی مقیاس تحمل ریسک مالی گرابل و لایتون در بورس اوراق بهادار تهران. فصلنامه علمی-پژوهشی دانش سرمایه‌گذاری، ۸(۳۱)، ۱۵۱-۱۶۸.</w:t>
+        <w:t>فلاح، م.، و خدایی، ا. (۱۳۹۸). رابطه هوش هیجانی و سبک های تصمیم گیری با عملکرد سرمایه گذاری در بورس اوراق بهادار تهران. فصلنامه علمی پژوهشی دانش مالی تحلیل اوراق بهادار، ۱۲) ۴۲(، ۱-۱۶.</w:t>
       </w:r>
     </w:p>
     <w:p>
@@ -6221,7 +6221,7 @@
           <w:rFonts w:ascii="Times New Roman" w:hAnsi="Times New Roman" w:cs="B Nazanin"/>
           <w:sz w:val="22"/>
         </w:rPr>
-        <w:t>فروغی، د.، و تهرانی، ر. (۱۳۹۷). نقش سواد مالی در تعدیل رابطه بین سوگیری های رفتاری و عملکرد سرمایه گذاری در بورس اوراق بهادار تهران. تحقیقات مالی، ۲۰) ۲(، ۱۸۹-۲۰۸.</w:t>
+        <w:t>نوری، ر.، و هاشمیان، ک. (۱۳۹۶). رابطه بین طرحواره های ناسازگار اولیه و اضطراب اجتماعی در دانشجویان. مطالعات روانشناختی، ۱۳(۲)، ۱۴۱-۱۵۸.</w:t>
       </w:r>
     </w:p>
     <w:p>
@@ -6235,34 +6235,6 @@
           <w:rFonts w:ascii="Times New Roman" w:hAnsi="Times New Roman" w:cs="B Nazanin"/>
           <w:sz w:val="22"/>
         </w:rPr>
-        <w:t>فلاح، م.، و خدایی، ا. (۱۳۹۸). رابطه هوش هیجانی و سبک های تصمیم گیری با عملکرد سرمایه گذاری در بورس اوراق بهادار تهران. فصلنامه علمی پژوهشی دانش مالی تحلیل اوراق بهادار، ۱۲) ۴۲(، ۱-۱۶.</w:t>
-      </w:r>
-    </w:p>
-    <w:p>
-      <w:pPr>
-        <w:bidi w:val="1"/>
-        <w:spacing w:lineRule="exact" w:line="580" w:after="40"/>
-        <w:jc w:val="both"/>
-      </w:pPr>
-      <w:r>
-        <w:rPr>
-          <w:rFonts w:ascii="Times New Roman" w:hAnsi="Times New Roman" w:cs="B Nazanin"/>
-          <w:sz w:val="22"/>
-        </w:rPr>
-        <w:t>نوری، ر.، و هاشمیان، ک. (۱۳۹۶). رابطه بین طرحواره های ناسازگار اولیه و اضطراب اجتماعی در دانشجویان. مطالعات روانشناختی، ۱۳(۲)، ۱۴۱-۱۵۸.</w:t>
-      </w:r>
-    </w:p>
-    <w:p>
-      <w:pPr>
-        <w:bidi w:val="1"/>
-        <w:spacing w:lineRule="exact" w:line="580" w:after="40"/>
-        <w:jc w:val="both"/>
-      </w:pPr>
-      <w:r>
-        <w:rPr>
-          <w:rFonts w:ascii="Times New Roman" w:hAnsi="Times New Roman" w:cs="B Nazanin"/>
-          <w:sz w:val="22"/>
-        </w:rPr>
         <w:t>یوسفی، ناصر. (۱۳۹۶). ویژگی‌های روان‌سنجی نسخه فارسی پرسشنامه طرحواره یانگ (فرم کوتاه) در نمونه غیربالینی. مجله روانشناسی بالینی، ۹(۲)، ۹۱-۱۰۲.</w:t>
       </w:r>
     </w:p>
@@ -6432,7 +6404,7 @@
           <w:rFonts w:ascii="Times New Roman" w:hAnsi="Times New Roman"/>
           <w:sz w:val="22"/>
         </w:rPr>
-        <w:t>Beck, A. T., &amp; Clark, D. A. (1997). An information processing model of anxiety: Automatic and strategic processes. Behaviour Research and Therapy, 35(1), 49-58.</w:t>
+        <w:t>Beck, A. T., &amp; Clark, D. A. (1997). An information processing model of anxiety: Automatic and strategic processes. Behaviour Research and Therapy, 35(1), 49–58. https://doi.org/10.1016/s0005-7967(96)00069-1</w:t>
       </w:r>
     </w:p>
     <w:p>
@@ -6446,7 +6418,7 @@
           <w:rFonts w:ascii="Times New Roman" w:hAnsi="Times New Roman"/>
           <w:sz w:val="22"/>
         </w:rPr>
-        <w:t>Beck, A. T., &amp; Clark, D. A. (1997). An information processing model of anxiety: Automatic and strategic processes. Behaviour Research and Therapy, 35(1), 49–58. https://doi.org/10.1016/s0005-7967(96)00069-1</w:t>
+        <w:t>Bishop, S. J. (2007). Neurocognitive mechanisms of anxiety: an integrative account. Trends in Cognitive Sciences, 11(7), 307-316.</w:t>
       </w:r>
     </w:p>
     <w:p>
@@ -6460,7 +6432,7 @@
           <w:rFonts w:ascii="Times New Roman" w:hAnsi="Times New Roman"/>
           <w:sz w:val="22"/>
         </w:rPr>
-        <w:t>Bishop, S. J. (2007). Neurocognitive mechanisms of anxiety: an integrative account. Trends in Cognitive Sciences, 11(7), 307-316.</w:t>
+        <w:t>Bodie, Z., Kane, A., &amp; Marcus, A. J. (2018). Investments (11th ed.). McGraw-Hill Education.</w:t>
       </w:r>
     </w:p>
     <w:p>
@@ -6474,7 +6446,7 @@
           <w:rFonts w:ascii="Times New Roman" w:hAnsi="Times New Roman"/>
           <w:sz w:val="22"/>
         </w:rPr>
-        <w:t>Bodie, Z., Kane, A., &amp; Marcus, A. J. (2018). Investments (11th ed.). McGraw-Hill Education.</w:t>
+        <w:t>Borkovec, T. D. (1994). The nature, functions, and origins of worry. In G. C. L. Davey &amp; F. Tallis (Eds.), Worrying: Perspectives on theory, assessment and treatment (pp. 5–33). Wiley.</w:t>
       </w:r>
     </w:p>
     <w:p>
@@ -6488,7 +6460,7 @@
           <w:rFonts w:ascii="Times New Roman" w:hAnsi="Times New Roman"/>
           <w:sz w:val="22"/>
         </w:rPr>
-        <w:t>Borkovec, T. D. (1994). The nature, functions, and origins of worry. In G. C. L. Davey &amp; F. Tallis (Eds.), Worrying: Perspectives on theory, assessment and treatment (pp. 5–33). Wiley.</w:t>
+        <w:t>Charles, V., &amp; Kasilingam, R. (2022). The role of anxiety in financial decisions. Review of Behavioral Finance, 14(5), 720-735.</w:t>
       </w:r>
     </w:p>
     <w:p>
@@ -6502,7 +6474,7 @@
           <w:rFonts w:ascii="Times New Roman" w:hAnsi="Times New Roman"/>
           <w:sz w:val="22"/>
         </w:rPr>
-        <w:t>Charles, V., &amp; Kasilingam, R. (2022). The role of anxiety in financial decisions. Review of Behavioral Finance, 14(5), 720-735.</w:t>
+        <w:t>Daniel, K., Hirshleifer, D., &amp; Subrahmanyam, A. (1998). Investor psychology and security market under- and overreactions. The Journal of Finance, 53(6), 1839–1885. https://doi.org/10.1111/0022-1082.00077</w:t>
       </w:r>
     </w:p>
     <w:p>
@@ -6516,7 +6488,7 @@
           <w:rFonts w:ascii="Times New Roman" w:hAnsi="Times New Roman"/>
           <w:sz w:val="22"/>
         </w:rPr>
-        <w:t>Daniel, K., Hirshleifer, D., &amp; Subrahmanyam, A. (1998). Investor psychology and security market under- and overreactions. The Journal of Finance, 53(6), 1839–1885. https://doi.org/10.1111/0022-1082.00077</w:t>
+        <w:t>De Martino, B., et al. (2006) Frames, biases, and rational decision-making in the human brain. Science, 313 (5787), 684–687.</w:t>
       </w:r>
     </w:p>
     <w:p>
@@ -6530,7 +6502,7 @@
           <w:rFonts w:ascii="Times New Roman" w:hAnsi="Times New Roman"/>
           <w:sz w:val="22"/>
         </w:rPr>
-        <w:t>De Martino, B., et al. (2006) Frames, biases, and rational decision-making in the human brain. Science, 313 (5787), 684–687.</w:t>
+        <w:t>Dhingra, J., &amp; Aggarwal, N. (2025). Exploring Trait Anxiety as a Psychological Construct: Impacts of Gender, Educational Attainment and Financial Training. Indian Journal of Positive Psychology, 16(1), 45-58.</w:t>
       </w:r>
     </w:p>
     <w:p>
@@ -6544,7 +6516,7 @@
           <w:rFonts w:ascii="Times New Roman" w:hAnsi="Times New Roman"/>
           <w:sz w:val="22"/>
         </w:rPr>
-        <w:t>Dhingra, J., &amp; Aggarwal, N. (2025). Exploring Trait Anxiety as a Psychological Construct: Impacts of Gender, Educational Attainment and Financial Training. Indian Journal of Positive Psychology, 16(1), 45-58.</w:t>
+        <w:t>Estévez, A., et al. (2024). Association between gambling motives, violence and early maladaptive schemas in women with gambling disorder. Journal of Gambling Studies. https://doi.org/10.1007/s10899-024-10285-8</w:t>
       </w:r>
     </w:p>
     <w:p>
@@ -6558,7 +6530,7 @@
           <w:rFonts w:ascii="Times New Roman" w:hAnsi="Times New Roman"/>
           <w:sz w:val="22"/>
         </w:rPr>
-        <w:t>Estévez, A., et al. (2024). Association between gambling motives, violence and early maladaptive schemas in women with gambling disorder. Journal of Gambling Studies. https://doi.org/10.1007/s10899-024-10285-8</w:t>
+        <w:t>Eysenck, M. W., Derakshan, N., Santos, R., &amp; Calvo, M. G. (2007). Anxiety and cognitive performance: attentional control theory. Emotion, 7(2), 336–353.</w:t>
       </w:r>
     </w:p>
     <w:p>
@@ -6572,7 +6544,7 @@
           <w:rFonts w:ascii="Times New Roman" w:hAnsi="Times New Roman"/>
           <w:sz w:val="22"/>
         </w:rPr>
-        <w:t>Eysenck, M. W., Derakshan, N., Santos, R., &amp; Calvo, M. G. (2007). Anxiety and cognitive performance: attentional control theory. Emotion, 7(2), 336-353.</w:t>
+        <w:t>Fenton-O'Creevy, M., et al. (2012). Emotion regulation and trader expertise: Heart rate variability on the trading floor. Journal of Neuroscience, Psychology, and Economics, 5(4), 227-237.</w:t>
       </w:r>
     </w:p>
     <w:p>
@@ -6586,7 +6558,7 @@
           <w:rFonts w:ascii="Times New Roman" w:hAnsi="Times New Roman"/>
           <w:sz w:val="22"/>
         </w:rPr>
-        <w:t>Eysenck, M. W., Derakshan, N., Santos, R., &amp; Calvo, M. G. (2007). Anxiety and cognitive performance: attentional control theory. Emotion, 7(2), 336–353.</w:t>
+        <w:t>Fenton-O'Creevy, M., Soane, E., Nicholson, N., &amp; Willman, P. (2011). Thinking, feeling and deciding: The influence of emotions on the decision making and performance of traders. Journal of Organizational Behavior, 32(8), 1044-1061. https://doi.org/10.1002/job.720</w:t>
       </w:r>
     </w:p>
     <w:p>
@@ -6600,7 +6572,7 @@
           <w:rFonts w:ascii="Times New Roman" w:hAnsi="Times New Roman"/>
           <w:sz w:val="22"/>
         </w:rPr>
-        <w:t>Fenton-O'Creevy, M., et al. (2012). Emotion regulation and trader expertise: Heart rate variability on the trading floor. Journal of Neuroscience, Psychology, and Economics, 5(4), 227-237.</w:t>
+        <w:t>Fenton-O’Creevy, M., et al. (2012) Emotion regulation and trader expertise: Heart rate variability on the trading floor. Journal of Neuroscience, Psychology, and Economics, 5 (4), 227–237</w:t>
       </w:r>
     </w:p>
     <w:p>
@@ -6614,7 +6586,7 @@
           <w:rFonts w:ascii="Times New Roman" w:hAnsi="Times New Roman"/>
           <w:sz w:val="22"/>
         </w:rPr>
-        <w:t>Fenton-O'Creevy, M., Soane, E., Nicholson, N., &amp; Willman, P. (2011). Thinking, feeling and deciding: The influence of emotions on the decision making and performance of traders. Journal of Organizational Behavior, 32(8), 1044-1061. https://doi.org/10.1002/job.720</w:t>
+        <w:t>Gambetti, E., &amp; Giusberti, F. (2012). The effect of anger and anxiety on investment decisions. Journal of Economic Psychology, 33 (5), 1059–1069</w:t>
       </w:r>
     </w:p>
     <w:p>
@@ -6628,7 +6600,7 @@
           <w:rFonts w:ascii="Times New Roman" w:hAnsi="Times New Roman"/>
           <w:sz w:val="22"/>
         </w:rPr>
-        <w:t>Fenton-O’Creevy, M., et al. (2012) Emotion regulation and trader expertise: Heart rate variability on the trading floor. Journal of Neuroscience, Psychology, and Economics, 5 (4), 227–237</w:t>
+        <w:t>Goetzmann, W. N., &amp; Kumar, A. (2008). Equity portfolio diversification. Review of Finance, 12(3), 433-463.</w:t>
       </w:r>
     </w:p>
     <w:p>
@@ -6642,7 +6614,7 @@
           <w:rFonts w:ascii="Times New Roman" w:hAnsi="Times New Roman"/>
           <w:sz w:val="22"/>
         </w:rPr>
-        <w:t>Gambetti, E., &amp; Giusberti, F. (2012). The effect of anger and anxiety on investment decisions. Journal of Economic Psychology, 33 (5), 1059–1069</w:t>
+        <w:t>Grable, J. E. (2017). Financial risk tolerance: A psychometric review. Financial Services Review, 26(2), 1-18.</w:t>
       </w:r>
     </w:p>
     <w:p>
@@ -6656,7 +6628,7 @@
           <w:rFonts w:ascii="Times New Roman" w:hAnsi="Times New Roman"/>
           <w:sz w:val="22"/>
         </w:rPr>
-        <w:t>Goetzmann, W. N., &amp; Kumar, A. (2008). Equity portfolio diversification. Review of Finance, 12(3), 433-463.</w:t>
+        <w:t>Grable, J. E., &amp; Lytton, R. H. (1999). Financial risk tolerance revisited: The development of a risk assessment instrument. Financial Services Review, 8(3), 163-181.</w:t>
       </w:r>
     </w:p>
     <w:p>
@@ -6670,7 +6642,7 @@
           <w:rFonts w:ascii="Times New Roman" w:hAnsi="Times New Roman"/>
           <w:sz w:val="22"/>
         </w:rPr>
-        <w:t>Grable, J. E. (2017). Financial risk tolerance: A psychometric review. Financial Services Review, 26(2), 1-18.</w:t>
+        <w:t>Grall-Bronnec, M., et al. (2025). Development and validation of the Trading Disorder Scale for assessing problematic trading behaviors. Journal of Behavioral Addictions, 14(1), 112-128.</w:t>
       </w:r>
     </w:p>
     <w:p>
@@ -6684,7 +6656,7 @@
           <w:rFonts w:ascii="Times New Roman" w:hAnsi="Times New Roman"/>
           <w:sz w:val="22"/>
         </w:rPr>
-        <w:t>Grable, J. E., &amp; Lytton, R. H. (1999). Financial risk tolerance revisited: The development of a risk assessment instrument. Financial Services Review, 8(3), 163-181.</w:t>
+        <w:t>Grupe, D. W., &amp; Nitschke, J. B. (2013). Uncertainty and anticipation in anxiety: an integrated neurobiological and psychological perspective. Nature Reviews Neuroscience, 14(7), 488-501.</w:t>
       </w:r>
     </w:p>
     <w:p>
@@ -6698,7 +6670,7 @@
           <w:rFonts w:ascii="Times New Roman" w:hAnsi="Times New Roman"/>
           <w:sz w:val="22"/>
         </w:rPr>
-        <w:t>Grall-Bronnec, M., et al. (2025). Development and validation of the Trading Disorder Scale for assessing problematic trading behaviors. Journal of Behavioral Addictions, 14(1), 112-128.</w:t>
+        <w:t>Halvorsen, M., Wang, C. E., Richter, J., Myrland, I., Pedersen, S. K., Eisemann, M., &amp; Waterloo, K. (2009). Early maladaptive schemas, temperament and character traits in clinically depressed and previously depressed subjects. Clinical Psychology &amp; Psychotherapy, 16(5), 394-407. https://doi.org/10.1002/cpp.618</w:t>
       </w:r>
     </w:p>
     <w:p>
@@ -6712,7 +6684,7 @@
           <w:rFonts w:ascii="Times New Roman" w:hAnsi="Times New Roman"/>
           <w:sz w:val="22"/>
         </w:rPr>
-        <w:t>Grupe, D. W., &amp; Nitschke, J. B. (2013). Uncertainty and anticipation in anxiety: an integrated neurobiological and psychological perspective. Nature Reviews Neuroscience, 14(7), 488-501.</w:t>
+        <w:t>Hartley, C. A., &amp; Phelps, E. A. (2012). Anxiety and decision-making. Biological Psychiatry, 72 (2), 113–118</w:t>
       </w:r>
     </w:p>
     <w:p>
@@ -6726,7 +6698,7 @@
           <w:rFonts w:ascii="Times New Roman" w:hAnsi="Times New Roman"/>
           <w:sz w:val="22"/>
         </w:rPr>
-        <w:t>Halvorsen, M., Wang, C. E., Richter, J., Myrland, I., Pedersen, S. K., Eisemann, M., &amp; Waterloo, K. (2009). Early maladaptive schemas, temperament and character traits in clinically depressed and previously depressed subjects. Clinical Psychology &amp; Psychotherapy, 16(5), 394-407. https://doi.org/10.1002/cpp.618</w:t>
+        <w:t>Hayes, A. F. (2018). Introduction to mediation, moderation, and conditional process analysis: A regression-based approach (2nd ed.). Guilford Press.</w:t>
       </w:r>
     </w:p>
     <w:p>
@@ -6740,7 +6712,7 @@
           <w:rFonts w:ascii="Times New Roman" w:hAnsi="Times New Roman"/>
           <w:sz w:val="22"/>
         </w:rPr>
-        <w:t>Hartley, C. A., &amp; Phelps, E. A. (2012). Anxiety and decision-making. Biological Psychiatry, 72 (2), 113–118</w:t>
+        <w:t>Hwang, S., &amp; Salmon, M. (2004). Market stress and herding. Journal of Empirical Finance, 11(4), 585-616.</w:t>
       </w:r>
     </w:p>
     <w:p>
@@ -6754,7 +6726,7 @@
           <w:rFonts w:ascii="Times New Roman" w:hAnsi="Times New Roman"/>
           <w:sz w:val="22"/>
         </w:rPr>
-        <w:t>Hayes, A. F. (2018). Introduction to mediation, moderation, and conditional process analysis: A regression-based approach (2nd ed.). Guilford Press.</w:t>
+        <w:t>Kahneman, D. (2011). Thinking, fast and slow. Farrar, Straus and Giroux.</w:t>
       </w:r>
     </w:p>
     <w:p>
@@ -6768,7 +6740,7 @@
           <w:rFonts w:ascii="Times New Roman" w:hAnsi="Times New Roman"/>
           <w:sz w:val="22"/>
         </w:rPr>
-        <w:t>Hwang, S., &amp; Salmon, M. (2004). Market stress and herding. Journal of Empirical Finance, 11(4), 585-616.</w:t>
+        <w:t>Kahneman, D., &amp; Tversky, A. (1979). Prospect theory: An analysis of decision under risk. Econometrica, 47(2), 263-291.</w:t>
       </w:r>
     </w:p>
     <w:p>
@@ -6782,7 +6754,7 @@
           <w:rFonts w:ascii="Times New Roman" w:hAnsi="Times New Roman"/>
           <w:sz w:val="22"/>
         </w:rPr>
-        <w:t>Kahneman, D. (2011). Thinking, fast and slow. Farrar, Straus and Giroux.</w:t>
+        <w:t>Kaplan, H. I., &amp; Sadock, B. J. (2015) Synopsis of Psychiatry: Behavioral Sciences/Clinical Psychiatry. Wolters Kluwer.</w:t>
       </w:r>
     </w:p>
     <w:p>
@@ -6796,7 +6768,7 @@
           <w:rFonts w:ascii="Times New Roman" w:hAnsi="Times New Roman"/>
           <w:sz w:val="22"/>
         </w:rPr>
-        <w:t>Kahneman, D., &amp; Tversky, A. (1979). Prospect theory: An analysis of decision under risk. Econometrica, 47(2), 263-291.</w:t>
+        <w:t>Kline, R. B. (2016). Principles and practice of structural equation modeling (4th ed.). Guilford Press.</w:t>
       </w:r>
     </w:p>
     <w:p>
@@ -6810,7 +6782,7 @@
           <w:rFonts w:ascii="Times New Roman" w:hAnsi="Times New Roman"/>
           <w:sz w:val="22"/>
         </w:rPr>
-        <w:t>Kaplan, H. I., &amp; Sadock, B. J. (2015) Synopsis of Psychiatry: Behavioral Sciences/Clinical Psychiatry. Wolters Kluwer.</w:t>
+        <w:t>Kuhnen, C. M., &amp; Chiao, J. Y. (2009). Genetic determinants of financial risk taking. PLOS ONE, 4 (2), e4362</w:t>
       </w:r>
     </w:p>
     <w:p>
@@ -6824,7 +6796,7 @@
           <w:rFonts w:ascii="Times New Roman" w:hAnsi="Times New Roman"/>
           <w:sz w:val="22"/>
         </w:rPr>
-        <w:t>Kline, R. B. (2016). Principles and practice of structural equation modeling (4th ed.). Guilford Press.</w:t>
+        <w:t>Lauriola, M., &amp; Levin, I. P. (2001). Personality traits and risky decision-making in a controlled experimental task: An exploratory study. Personality and Individual Differences, 31(2), 215-226.</w:t>
       </w:r>
     </w:p>
     <w:p>
@@ -6838,7 +6810,7 @@
           <w:rFonts w:ascii="Times New Roman" w:hAnsi="Times New Roman"/>
           <w:sz w:val="22"/>
         </w:rPr>
-        <w:t>Kuhnen, C. M., &amp; Chiao, J. Y. (2009). Genetic determinants of financial risk taking. PLOS ONE, 4 (2), e4362</w:t>
+        <w:t>Lindberg, N., et al. (2011). Early maladaptive schemas in pathological gambling. Journal of Gambling Studies, 27(2), 277-287.</w:t>
       </w:r>
     </w:p>
     <w:p>
@@ -6852,7 +6824,7 @@
           <w:rFonts w:ascii="Times New Roman" w:hAnsi="Times New Roman"/>
           <w:sz w:val="22"/>
         </w:rPr>
-        <w:t>Lauriola, M., &amp; Levin, I. P. (2001). Personality traits and risky decision-making in a controlled experimental task: An exploratory study. Personality and Individual Differences, 31(2), 215-226.</w:t>
+        <w:t>Lo, A. W., &amp; Repin, D. V. (2002). The psychophysiology of real-time financial risk processing. Journal of Cognitive Neuroscience, 14(3), 323-339.</w:t>
       </w:r>
     </w:p>
     <w:p>
@@ -6866,7 +6838,7 @@
           <w:rFonts w:ascii="Times New Roman" w:hAnsi="Times New Roman"/>
           <w:sz w:val="22"/>
         </w:rPr>
-        <w:t>Lindberg, N., et al. (2011). Early maladaptive schemas in pathological gambling. Journal of Gambling Studies, 27(2), 277-287.</w:t>
+        <w:t>Lo, A. W., Repin, D. V., &amp; Steenbarger, B. N. (2005). Fear and Greed in Financial Markets: A Clinical Study of Day-Traders. American Economic Review, 95 (2), 352–359.</w:t>
       </w:r>
     </w:p>
     <w:p>
@@ -6880,7 +6852,7 @@
           <w:rFonts w:ascii="Times New Roman" w:hAnsi="Times New Roman"/>
           <w:sz w:val="22"/>
         </w:rPr>
-        <w:t>Lo, A. W., &amp; Repin, D. V. (2002). The psychophysiology of real-time financial risk processing. Journal of Cognitive Neuroscience, 14(3), 323-339.</w:t>
+        <w:t>Mahato, S., et al. (2025). Millennials and zoomers as investors: Behavioral factors shaping financial choices. All Finance Journal, 3(2), 15-29.</w:t>
       </w:r>
     </w:p>
     <w:p>
@@ -6894,7 +6866,7 @@
           <w:rFonts w:ascii="Times New Roman" w:hAnsi="Times New Roman"/>
           <w:sz w:val="22"/>
         </w:rPr>
-        <w:t>Lo, A. W., Repin, D. V., &amp; Steenbarger, B. N. (2005). Fear and Greed in Financial Markets: A Clinical Study of Day-Traders. American Economic Review, 95 (2), 352–359.</w:t>
+        <w:t>Malkiel, B. G. (2003). The efficient market hypothesis and its critics. Journal of Economic Perspectives, 17(1), 59-82.</w:t>
       </w:r>
     </w:p>
     <w:p>
@@ -6908,7 +6880,7 @@
           <w:rFonts w:ascii="Times New Roman" w:hAnsi="Times New Roman"/>
           <w:sz w:val="22"/>
         </w:rPr>
-        <w:t>Mahato, S., et al. (2025). Millennials and zoomers as investors: Behavioral factors shaping financial choices. All Finance Journal, 3(2), 15-29.</w:t>
+        <w:t>Maner, J. K., &amp; Schmidt, N. B. (2006). The role of risk avoidance in anxiety. Behavior Therapy, 37 (3), 290–305.</w:t>
       </w:r>
     </w:p>
     <w:p>
@@ -6922,7 +6894,7 @@
           <w:rFonts w:ascii="Times New Roman" w:hAnsi="Times New Roman"/>
           <w:sz w:val="22"/>
         </w:rPr>
-        <w:t>Malkiel, B. G. (2003). The efficient market hypothesis and its critics. Journal of Economic Perspectives, 17(1), 59-82.</w:t>
+        <w:t>Mishkin, F. S. (2019). The economics of money, banking and financial markets (12th ed.). Pearson.</w:t>
       </w:r>
     </w:p>
     <w:p>
@@ -6936,7 +6908,7 @@
           <w:rFonts w:ascii="Times New Roman" w:hAnsi="Times New Roman"/>
           <w:sz w:val="22"/>
         </w:rPr>
-        <w:t>Maner, J. K., &amp; Schmidt, N. B. (2006). The role of risk avoidance in anxiety. Behavior Therapy, 37 (3), 290–305.</w:t>
+        <w:t>Mitte, K. (2007). Anxiety and risky decision-making: The role of cognitive processing. Psychological Review, 114 (4), 893-912.</w:t>
       </w:r>
     </w:p>
     <w:p>
@@ -6950,7 +6922,7 @@
           <w:rFonts w:ascii="Times New Roman" w:hAnsi="Times New Roman"/>
           <w:sz w:val="22"/>
         </w:rPr>
-        <w:t>Maner, J. K., &amp; Schmidt, N. B. (2006). The role of risk avoidance in anxiety. Behavior Therapy, 37(3), 290-305.</w:t>
+        <w:t>Nguyen, M. T. T., Nguyen, L. H., &amp; Ho, T. H. (2019). Personality traits and stock investment of individuals. Sustainability, 11(19), 5474.</w:t>
       </w:r>
     </w:p>
     <w:p>
@@ -6964,7 +6936,7 @@
           <w:rFonts w:ascii="Times New Roman" w:hAnsi="Times New Roman"/>
           <w:sz w:val="22"/>
         </w:rPr>
-        <w:t>Mishkin, F. S. (2019). The economics of money, banking and financial markets (12th ed.). Pearson.</w:t>
+        <w:t>OECD. (2021). Retail investors in capital markets: Key findings and main messages. OECD Publishing.</w:t>
       </w:r>
     </w:p>
     <w:p>
@@ -6978,7 +6950,7 @@
           <w:rFonts w:ascii="Times New Roman" w:hAnsi="Times New Roman"/>
           <w:sz w:val="22"/>
         </w:rPr>
-        <w:t>Mitte, K. (2007). Anxiety and risky decision-making: The role of cognitive processing. Psychological Review, 114 (4), 893-912.</w:t>
+        <w:t>Ololo, K., et al. (2024). Rational Emotive and Cognitive Behavior Coaching Intervention for Promoting College Students’ Financial Risk Tolerance. Journal of Rational-Emotive &amp; Cognitive-Behavior Therapy, 42, 398-418.</w:t>
       </w:r>
     </w:p>
     <w:p>
@@ -6992,7 +6964,7 @@
           <w:rFonts w:ascii="Times New Roman" w:hAnsi="Times New Roman"/>
           <w:sz w:val="22"/>
         </w:rPr>
-        <w:t>Nguyen, M. T. T., Nguyen, L. H., &amp; Ho, T. H. (2019). Personality traits and stock investment of individuals. Sustainability, 11(19), 5474.</w:t>
+        <w:t>Pak, O., &amp; Mahmood, M. (2019). Personality traits and investor profile analysis: A behavioral finance study. PLoS ONE, 14(3), e0213626.</w:t>
       </w:r>
     </w:p>
     <w:p>
@@ -7006,7 +6978,7 @@
           <w:rFonts w:ascii="Times New Roman" w:hAnsi="Times New Roman"/>
           <w:sz w:val="22"/>
         </w:rPr>
-        <w:t>OECD. (2021). Retail investors in capital markets: Key findings and main messages. OECD Publishing.</w:t>
+        <w:t>Rehm, I. C., et al. (2015). Neuroticism and its facets in relation to early maladaptive schemas. Journal of Affective Disorders, 172, 424-431.</w:t>
       </w:r>
     </w:p>
     <w:p>
@@ -7020,7 +6992,7 @@
           <w:rFonts w:ascii="Times New Roman" w:hAnsi="Times New Roman"/>
           <w:sz w:val="22"/>
         </w:rPr>
-        <w:t>Ololo, K., et al. (2024). Rational Emotive and Cognitive Behavior Coaching Intervention for Promoting College Students’ Financial Risk Tolerance. Journal of Rational-Emotive &amp; Cognitive-Behavior Therapy, 42, 398-418.</w:t>
+        <w:t>Safitri, H., Giriati, G., &amp; Wendy, W. (2025). Socio-Psychological Effect in Investment Decision-Making Mediated by Risk Tolerance. Journal of Information Systems Engineering and Management, 10(1), 22015.</w:t>
       </w:r>
     </w:p>
     <w:p>
@@ -7034,7 +7006,7 @@
           <w:rFonts w:ascii="Times New Roman" w:hAnsi="Times New Roman"/>
           <w:sz w:val="22"/>
         </w:rPr>
-        <w:t>Pak, O., &amp; Mahmood, M. (2019). Personality traits and investor profile analysis: A behavioral finance study. PLoS ONE, 14(3), e0213626.</w:t>
+        <w:t>Saggino, A., Balsamo, M., Carlucci, L., Cavalletti, V., Sergi, M. R., da Fermo, G., Dèttore, D., Marsigli, N., &amp; Tommasi, M. (2018). Psychometric properties of the Italian version of the Young Schema Questionnaire L-3: Preliminary results. Frontiers in Psychology, 9, 312. https://doi.org/10.3389/fpsyg.2018.00312</w:t>
       </w:r>
     </w:p>
     <w:p>
@@ -7048,7 +7020,7 @@
           <w:rFonts w:ascii="Times New Roman" w:hAnsi="Times New Roman"/>
           <w:sz w:val="22"/>
         </w:rPr>
-        <w:t>Rehm, I. C., et al. (2015). Neuroticism and its facets in relation to early maladaptive schemas. Journal of Affective Disorders, 172, 424-431.</w:t>
+        <w:t>Schmidt, N. B., Joiner, T. E., Young, J. E., &amp; Telch, M. J. (1995). The schema questionnaire: Investigation of psychometric properties and the hierarchical structure of a measure of maladaptive schemas. Cognitive Therapy and Research, 19(3), 295–321. https://doi.org/10.1007/bf02230402</w:t>
       </w:r>
     </w:p>
     <w:p>
@@ -7062,7 +7034,7 @@
           <w:rFonts w:ascii="Times New Roman" w:hAnsi="Times New Roman"/>
           <w:sz w:val="22"/>
         </w:rPr>
-        <w:t>Safitri, H., Giriati, G., &amp; Wendy, W. (2025). Socio-Psychological Effect in Investment Decision-Making Mediated by Risk Tolerance. Journal of Information Systems Engineering and Management, 10(1), 22015.</w:t>
+        <w:t>Sedighi Arfaee, F., Navabi Semiromi, M. J., &amp; Karami, A. A. (2023). The effect of early maladaptive schemas on tendency to risky behaviors with the mediating role of emotion regulation in male secondary school students. Knowledge &amp; Research in Applied Psychology. https://sanad.iau.ir/journal/jsrp</w:t>
       </w:r>
     </w:p>
     <w:p>
@@ -7076,7 +7048,7 @@
           <w:rFonts w:ascii="Times New Roman" w:hAnsi="Times New Roman"/>
           <w:sz w:val="22"/>
         </w:rPr>
-        <w:t>Saggino, A., Balsamo, M., Carlucci, L., Cavalletti, V., Sergi, M. R., da Fermo, G., Dèttore, D., Marsigli, N., &amp; Tommasi, M. (2018). Psychometric properties of the Italian version of the Young Schema Questionnaire L-3: Preliminary results. Frontiers in Psychology, 9, 312. https://doi.org/10.3389/fpsyg.2018.00312</w:t>
+        <w:t>Shefrin, H., &amp; Statman, M. (1985). The disposition to sell winners too early and ride losers too long: Theory and evidence. The Journal of Finance, 40(3), 777-790.</w:t>
       </w:r>
     </w:p>
     <w:p>
@@ -7090,77 +7062,7 @@
           <w:rFonts w:ascii="Times New Roman" w:hAnsi="Times New Roman"/>
           <w:sz w:val="22"/>
         </w:rPr>
-        <w:t>Schmidt, N. B., Joiner, T. E., Young, J. E., &amp; Telch, M. J. (1995). The schema questionnaire: Investigation of psychometric properties and the hierarchical structure of a measure of maladaptive schemas. Cognitive Therapy and Research, 19(3), 295-321.</w:t>
-      </w:r>
-    </w:p>
-    <w:p>
-      <w:pPr>
-        <w:bidi w:val="1"/>
-        <w:spacing w:lineRule="exact" w:line="580" w:after="40"/>
-        <w:jc w:val="left"/>
-      </w:pPr>
-      <w:r>
-        <w:rPr>
-          <w:rFonts w:ascii="Times New Roman" w:hAnsi="Times New Roman"/>
-          <w:sz w:val="22"/>
-        </w:rPr>
-        <w:t>Schmidt, N. B., Joiner, T. E., Young, J. E., &amp; Telch, M. J. (1995). The schema questionnaire: Investigation of psychometric properties and the hierarchical structure of a measure of maladaptive schemas. Cognitive Therapy and Research, 19(3), 295–321. https://doi.org/10.1007/bf02230402</w:t>
-      </w:r>
-    </w:p>
-    <w:p>
-      <w:pPr>
-        <w:bidi w:val="1"/>
-        <w:spacing w:lineRule="exact" w:line="580" w:after="40"/>
-        <w:jc w:val="left"/>
-      </w:pPr>
-      <w:r>
-        <w:rPr>
-          <w:rFonts w:ascii="Times New Roman" w:hAnsi="Times New Roman"/>
-          <w:sz w:val="22"/>
-        </w:rPr>
-        <w:t>Sedighi Arfaee, F., Navabi Semiromi, M. J., &amp; Karami, A. A. (2023). The effect of early maladaptive schemas on tendency to risky behaviors with the mediating role of emotion regulation in male secondary school students. Knowledge &amp; Research in Applied Psychology. https://sanad.iau.ir/journal/jsrp</w:t>
-      </w:r>
-    </w:p>
-    <w:p>
-      <w:pPr>
-        <w:bidi w:val="1"/>
-        <w:spacing w:lineRule="exact" w:line="580" w:after="40"/>
-        <w:jc w:val="left"/>
-      </w:pPr>
-      <w:r>
-        <w:rPr>
-          <w:rFonts w:ascii="Times New Roman" w:hAnsi="Times New Roman"/>
-          <w:sz w:val="22"/>
-        </w:rPr>
-        <w:t>Shefrin, H., &amp; Statman, M. (1985). The disposition to sell winners too early and ride losers too long: Theory and evidence. The Journal of Finance, 40(3), 777-790.</w:t>
-      </w:r>
-    </w:p>
-    <w:p>
-      <w:pPr>
-        <w:bidi w:val="1"/>
-        <w:spacing w:lineRule="exact" w:line="580" w:after="40"/>
-        <w:jc w:val="left"/>
-      </w:pPr>
-      <w:r>
-        <w:rPr>
-          <w:rFonts w:ascii="Times New Roman" w:hAnsi="Times New Roman"/>
-          <w:sz w:val="22"/>
-        </w:rPr>
         <w:t>Shiller, R. J. (2015). Irrational exuberance (3rd ed.). Princeton University Press.</w:t>
-      </w:r>
-    </w:p>
-    <w:p>
-      <w:pPr>
-        <w:bidi w:val="1"/>
-        <w:spacing w:lineRule="exact" w:line="580" w:after="40"/>
-        <w:jc w:val="left"/>
-      </w:pPr>
-      <w:r>
-        <w:rPr>
-          <w:rFonts w:ascii="Times New Roman" w:hAnsi="Times New Roman"/>
-          <w:sz w:val="22"/>
-        </w:rPr>
-        <w:t>Shorey, R. C., et al. (2012). Gambling and early maladaptive schemas in a treatment seeking sample of male alcohol users: A preliminary investigation. Addictive Disorders &amp; Their Treatment, 11(4), 173-182.</w:t>
       </w:r>
     </w:p>
     <w:p>

</xml_diff>

<commit_message>
fix: add narrative-name footnotes and disambiguate Fenton-O'Creevy 2011/2012 with years
</commit_message>
<xml_diff>
--- a/output/final/thesis_ch1_to_ch3.docx
+++ b/output/final/thesis_ch1_to_ch3.docx
@@ -4837,7 +4837,25 @@
           <w:sz w:val="24"/>
           <w:szCs w:val="24"/>
         </w:rPr>
-        <w:t xml:space="preserve">در نظریه روانکاوی کلاسیک، زیگموند فروید اضطراب را به عنوان «هسته اصلی روان‌رنجوری» و یک سیگنال خطر حیاتی برای «من» (ایگو) تلقی می‌کرد. از نظر فروید، اضطراب هشداری است که به «من» اعلام می‌کند تعادل روانی در خطر است و یک تکانه غریزی و غیرقابل قبول از سوی «نهاد» (اید) در شرف ورود به حیطه آگاهی است (کاپلان و سادوک، ۲۰۱۵). او سه نوع اضطراب را از هم متمایز کرد: اضطراب واقعی (پاسخ به یک خطر بیرونی)، اضطراب نوروتیک (ترس از اینکه تکانه‌های «نهاد» از کنترل خارج شوند) و اضطراب اخلاقی (ترس از قضاوت «فرامن» یا وجدان).</w:t>
+        <w:t xml:space="preserve">در نظریه روانکاوی کلاسیک، زیگموند فروید</w:t>
+      </w:r>
+      <w:r>
+        <w:rPr>
+          <w:rFonts w:ascii="B Nazanin" w:hAnsi="B Nazanin" w:cs="B Nazanin" w:hint="cs"/>
+          <w:rtl/>
+          <w:vertAlign w:val="superscript"/>
+        </w:rPr>
+        <w:footnoteReference w:id="89"/>
+      </w:r>
+      <w:r>
+        <w:rPr>
+          <w:rFonts w:ascii="B Nazanin" w:hAnsi="B Nazanin" w:cs="B Nazanin" w:hint="cs"/>
+          <w:rtl/>
+          <w:lang w:bidi="fa-IR"/>
+          <w:sz w:val="24"/>
+          <w:szCs w:val="24"/>
+        </w:rPr>
+        <w:t xml:space="preserve"> اضطراب را به عنوان «هسته اصلی روان‌رنجوری» و یک سیگنال خطر حیاتی برای «من» (ایگو) تلقی می‌کرد. از نظر فروید، اضطراب هشداری است که به «من» اعلام می‌کند تعادل روانی در خطر است و یک تکانه غریزی و غیرقابل قبول از سوی «نهاد» (اید) در شرف ورود به حیطه آگاهی است (کاپلان و سادوک، ۲۰۱۵). او سه نوع اضطراب را از هم متمایز کرد: اضطراب واقعی (پاسخ به یک خطر بیرونی)، اضطراب نوروتیک (ترس از اینکه تکانه‌های «نهاد» از کنترل خارج شوند) و اضطراب اخلاقی (ترس از قضاوت «فرامن» یا وجدان).</w:t>
       </w:r>
     </w:p>
     <w:p>
@@ -4960,7 +4978,7 @@
           <w:sz w:val="24"/>
           <w:szCs w:val="24"/>
         </w:rPr>
-        <w:t xml:space="preserve">انقلاب شناختی در روانشناسی، کانون توجه را از محیط بیرونی به فرآیندهای پردازش اطلاعات درونی فرد معطوف کرد. طبق این دیدگاه، که پیشگامان آن آرون بک و آلبرت الیس بودند، این خود رویدادها نیستند که باعث اضطراب می‌شوند، بلکه تفسیر و ارزیابی فرد از آن رویدادهاست که هیجانات را شکل می‌دهد (بک، ۱۹۷۶). افراد مضطرب دارای «طرحواره‌های خطر» هستند که مانند یک فیلتر ذهنی، باعث می‌شوند اطلاعات محیطی به طور سوگیرانه پردازش شوند. این سوگیری‌ها در قالب «خطاهای شناختی» مشخصی ظاهر می‌شوند که در زمینه بازارهای مالی بسیار رایج هستند (دانیل، هیرشلایفر و سوبرامانیام</w:t>
+        <w:t xml:space="preserve">انقلاب شناختی در روانشناسی، کانون توجه را از محیط بیرونی به فرآیندهای پردازش اطلاعات درونی فرد معطوف کرد. طبق این دیدگاه، که پیشگامان آن آرون بک و آلبرت الیس</w:t>
       </w:r>
       <w:r>
         <w:rPr>
@@ -4968,7 +4986,25 @@
           <w:rtl/>
           <w:vertAlign w:val="superscript"/>
         </w:rPr>
-        <w:footnoteReference w:id="89"/>
+        <w:footnoteReference w:id="90"/>
+      </w:r>
+      <w:r>
+        <w:rPr>
+          <w:rFonts w:ascii="B Nazanin" w:hAnsi="B Nazanin" w:cs="B Nazanin" w:hint="cs"/>
+          <w:rtl/>
+          <w:lang w:bidi="fa-IR"/>
+          <w:sz w:val="24"/>
+          <w:szCs w:val="24"/>
+        </w:rPr>
+        <w:t xml:space="preserve"> بودند، این خود رویدادها نیستند که باعث اضطراب می‌شوند، بلکه تفسیر و ارزیابی فرد از آن رویدادهاست که هیجانات را شکل می‌دهد (بک، ۱۹۷۶). افراد مضطرب دارای «طرحواره‌های خطر» هستند که مانند یک فیلتر ذهنی، باعث می‌شوند اطلاعات محیطی به طور سوگیرانه پردازش شوند. این سوگیری‌ها در قالب «خطاهای شناختی» مشخصی ظاهر می‌شوند که در زمینه بازارهای مالی بسیار رایج هستند (دانیل، هیرشلایفر و سوبرامانیام</w:t>
+      </w:r>
+      <w:r>
+        <w:rPr>
+          <w:rFonts w:ascii="B Nazanin" w:hAnsi="B Nazanin" w:cs="B Nazanin" w:hint="cs"/>
+          <w:rtl/>
+          <w:vertAlign w:val="superscript"/>
+        </w:rPr>
+        <w:footnoteReference w:id="91"/>
       </w:r>
       <w:r>
         <w:rPr>
@@ -5082,7 +5118,7 @@
           <w:sz w:val="24"/>
           <w:szCs w:val="24"/>
         </w:rPr>
-        <w:t xml:space="preserve">این دیدگاه فلسفی‌تر، اضطراب را نه یک بیماری یا نقص، بلکه بخشی اجتناب‌ناپذیر از شرایط انسانی می‌داند. متفکرانی چون رولو می و اروین یالوم معتقدند که اضطراب، واکنشی عمیق به آگاهی از «دلواپسی‌های غایی» زندگی است: مرگ، آزادی، تنهایی و پوچی. از منظر این دیدگاه، اضطراب یک معامله‌گر صرفاً ناشی از ترس از زیان مالی نیست، بلکه می‌تواند تجلی «اضطراب وجودی» باشد. آزادی انتخاب برای خرید یا فروش و مسئولیت کامل در قبال پیامدهای آن، می‌تواند بار روانی سنگینی ایجاد کند. تنهایی در تصمیم‌گیری و آگاهی از اینکه در نهایت هیچ‌کس جز خود فرد مسئول سرنوشت مالی‌اش نیست، این اضطراب را تشدید می‌کند (یالوم</w:t>
+        <w:t xml:space="preserve">این دیدگاه فلسفی‌تر، اضطراب را نه یک بیماری یا نقص، بلکه بخشی اجتناب‌ناپذیر از شرایط انسانی می‌داند. متفکرانی چون رولو می</w:t>
       </w:r>
       <w:r>
         <w:rPr>
@@ -5090,7 +5126,25 @@
           <w:rtl/>
           <w:vertAlign w:val="superscript"/>
         </w:rPr>
-        <w:footnoteReference w:id="90"/>
+        <w:footnoteReference w:id="92"/>
+      </w:r>
+      <w:r>
+        <w:rPr>
+          <w:rFonts w:ascii="B Nazanin" w:hAnsi="B Nazanin" w:cs="B Nazanin" w:hint="cs"/>
+          <w:rtl/>
+          <w:lang w:bidi="fa-IR"/>
+          <w:sz w:val="24"/>
+          <w:szCs w:val="24"/>
+        </w:rPr>
+        <w:t xml:space="preserve"> و اروین یالوم معتقدند که اضطراب، واکنشی عمیق به آگاهی از «دلواپسی‌های غایی» زندگی است: مرگ، آزادی، تنهایی و پوچی. از منظر این دیدگاه، اضطراب یک معامله‌گر صرفاً ناشی از ترس از زیان مالی نیست، بلکه می‌تواند تجلی «اضطراب وجودی» باشد. آزادی انتخاب برای خرید یا فروش و مسئولیت کامل در قبال پیامدهای آن، می‌تواند بار روانی سنگینی ایجاد کند. تنهایی در تصمیم‌گیری و آگاهی از اینکه در نهایت هیچ‌کس جز خود فرد مسئول سرنوشت مالی‌اش نیست، این اضطراب را تشدید می‌کند (یالوم</w:t>
+      </w:r>
+      <w:r>
+        <w:rPr>
+          <w:rFonts w:ascii="B Nazanin" w:hAnsi="B Nazanin" w:cs="B Nazanin" w:hint="cs"/>
+          <w:rtl/>
+          <w:vertAlign w:val="superscript"/>
+        </w:rPr>
+        <w:footnoteReference w:id="93"/>
       </w:r>
       <w:r>
         <w:rPr>
@@ -5194,7 +5248,7 @@
           <w:rtl/>
           <w:vertAlign w:val="superscript"/>
         </w:rPr>
-        <w:footnoteReference w:id="91"/>
+        <w:footnoteReference w:id="94"/>
       </w:r>
       <w:r>
         <w:rPr>
@@ -5212,7 +5266,7 @@
           <w:rtl/>
           <w:vertAlign w:val="superscript"/>
         </w:rPr>
-        <w:footnoteReference w:id="92"/>
+        <w:footnoteReference w:id="95"/>
       </w:r>
       <w:r>
         <w:rPr>
@@ -5419,7 +5473,7 @@
           <w:rtl/>
           <w:vertAlign w:val="superscript"/>
         </w:rPr>
-        <w:footnoteReference w:id="93"/>
+        <w:footnoteReference w:id="96"/>
       </w:r>
       <w:r>
         <w:rPr>
@@ -6446,7 +6500,7 @@
           <w:rtl/>
           <w:vertAlign w:val="superscript"/>
         </w:rPr>
-        <w:footnoteReference w:id="94"/>
+        <w:footnoteReference w:id="97"/>
       </w:r>
       <w:r>
         <w:rPr>
@@ -6483,7 +6537,7 @@
           <w:rtl/>
           <w:vertAlign w:val="superscript"/>
         </w:rPr>
-        <w:footnoteReference w:id="95"/>
+        <w:footnoteReference w:id="98"/>
       </w:r>
       <w:r>
         <w:rPr>
@@ -7032,7 +7086,7 @@
           <w:rtl/>
           <w:vertAlign w:val="superscript"/>
         </w:rPr>
-        <w:footnoteReference w:id="96"/>
+        <w:footnoteReference w:id="99"/>
       </w:r>
       <w:r>
         <w:rPr>
@@ -7084,7 +7138,7 @@
           <w:rtl/>
           <w:vertAlign w:val="superscript"/>
         </w:rPr>
-        <w:footnoteReference w:id="97"/>
+        <w:footnoteReference w:id="100"/>
       </w:r>
       <w:r>
         <w:rPr>
@@ -7476,7 +7530,7 @@
           <w:rtl/>
           <w:vertAlign w:val="superscript"/>
         </w:rPr>
-        <w:footnoteReference w:id="98"/>
+        <w:footnoteReference w:id="101"/>
       </w:r>
       <w:r>
         <w:rPr>
@@ -7511,7 +7565,7 @@
           <w:rtl/>
           <w:vertAlign w:val="superscript"/>
         </w:rPr>
-        <w:footnoteReference w:id="99"/>
+        <w:footnoteReference w:id="102"/>
       </w:r>
       <w:r>
         <w:rPr>
@@ -7563,7 +7617,7 @@
           <w:rtl/>
           <w:vertAlign w:val="superscript"/>
         </w:rPr>
-        <w:footnoteReference w:id="100"/>
+        <w:footnoteReference w:id="103"/>
       </w:r>
       <w:r>
         <w:rPr>
@@ -7666,7 +7720,7 @@
           <w:rtl/>
           <w:vertAlign w:val="superscript"/>
         </w:rPr>
-        <w:footnoteReference w:id="101"/>
+        <w:footnoteReference w:id="104"/>
       </w:r>
       <w:r>
         <w:rPr>
@@ -7693,7 +7747,25 @@
           <w:sz w:val="24"/>
           <w:szCs w:val="24"/>
         </w:rPr>
-        <w:t xml:space="preserve">فنتون-اکریوی و همکاران (۲۰۱۱)  در پژوهشی چندوجهی روی معامله‌گران حرفه‌ای در بانک‌های سرمایه‌گذاری لندن، به بررسی "نقش هیجانات در تصمیم‌گیری معامله‌گران" پرداختند. موضوع دقیق پژوهش آن‌ها، درک این بود که معامله‌گران موفق، چگونه هیجانات خود را تنظیم می‌کنند. این پژوهش، هم شامل مصاحبه‌های کیفی و هم آزمون‌های روان‌سنجی بود. یافته کلیدی آن‌ها این بود که برخلاف تصور رایج، معامله‌گران موفق، افرادی بی‌هیجان نیستند، بلکه کسانی هستند که از هوش هیجانی بالاتری برخوردار بوده و بهتر می‌توانند هیجانات منفی مانند اضطراب و پشیمانی را مدیریت کنند. این مطالعه نشان داد که اضطراب، توانایی پردازش منطقی اطلاعات را کاهش داده و منجر به تصمیماتی می‌شود که خود معامله‌گران بعداً آن‌ها را غیرمنطقی ارزیابی می‌کنند.</w:t>
+        <w:t xml:space="preserve">فنتون-اکریوی و همکاران</w:t>
+      </w:r>
+      <w:r>
+        <w:rPr>
+          <w:rFonts w:ascii="B Nazanin" w:hAnsi="B Nazanin" w:cs="B Nazanin" w:hint="cs"/>
+          <w:rtl/>
+          <w:vertAlign w:val="superscript"/>
+        </w:rPr>
+        <w:footnoteReference w:id="105"/>
+      </w:r>
+      <w:r>
+        <w:rPr>
+          <w:rFonts w:ascii="B Nazanin" w:hAnsi="B Nazanin" w:cs="B Nazanin" w:hint="cs"/>
+          <w:rtl/>
+          <w:lang w:bidi="fa-IR"/>
+          <w:sz w:val="24"/>
+          <w:szCs w:val="24"/>
+        </w:rPr>
+        <w:t xml:space="preserve"> (۲۰۱۱)  در پژوهشی چندوجهی روی معامله‌گران حرفه‌ای در بانک‌های سرمایه‌گذاری لندن، به بررسی "نقش هیجانات در تصمیم‌گیری معامله‌گران" پرداختند. موضوع دقیق پژوهش آن‌ها، درک این بود که معامله‌گران موفق، چگونه هیجانات خود را تنظیم می‌کنند. این پژوهش، هم شامل مصاحبه‌های کیفی و هم آزمون‌های روان‌سنجی بود. یافته کلیدی آن‌ها این بود که برخلاف تصور رایج، معامله‌گران موفق، افرادی بی‌هیجان نیستند، بلکه کسانی هستند که از هوش هیجانی بالاتری برخوردار بوده و بهتر می‌توانند هیجانات منفی مانند اضطراب و پشیمانی را مدیریت کنند. این مطالعه نشان داد که اضطراب، توانایی پردازش منطقی اطلاعات را کاهش داده و منجر به تصمیماتی می‌شود که خود معامله‌گران بعداً آن‌ها را غیرمنطقی ارزیابی می‌کنند.</w:t>
       </w:r>
     </w:p>
     <w:p>
@@ -7735,7 +7807,7 @@
           <w:rtl/>
           <w:vertAlign w:val="superscript"/>
         </w:rPr>
-        <w:footnoteReference w:id="102"/>
+        <w:footnoteReference w:id="106"/>
       </w:r>
       <w:r>
         <w:rPr>
@@ -7804,7 +7876,7 @@
           <w:rtl/>
           <w:vertAlign w:val="superscript"/>
         </w:rPr>
-        <w:footnoteReference w:id="103"/>
+        <w:footnoteReference w:id="107"/>
       </w:r>
       <w:r>
         <w:rPr>
@@ -7908,7 +7980,7 @@
           <w:rtl/>
           <w:vertAlign w:val="superscript"/>
         </w:rPr>
-        <w:footnoteReference w:id="104"/>
+        <w:footnoteReference w:id="108"/>
       </w:r>
       <w:r>
         <w:rPr>
@@ -7943,7 +8015,7 @@
           <w:rtl/>
           <w:vertAlign w:val="superscript"/>
         </w:rPr>
-        <w:footnoteReference w:id="105"/>
+        <w:footnoteReference w:id="109"/>
       </w:r>
       <w:r>
         <w:rPr>
@@ -8983,7 +9055,7 @@
           <w:rtl/>
           <w:vertAlign w:val="superscript"/>
         </w:rPr>
-        <w:footnoteReference w:id="106"/>
+        <w:footnoteReference w:id="110"/>
       </w:r>
       <w:r>
         <w:rPr>
@@ -9212,7 +9284,7 @@
           <w:rtl/>
           <w:vertAlign w:val="superscript"/>
         </w:rPr>
-        <w:footnoteReference w:id="107"/>
+        <w:footnoteReference w:id="111"/>
       </w:r>
       <w:r>
         <w:rPr>
@@ -13790,7 +13862,7 @@
           <w:sz w:val="20"/>
           <w:szCs w:val="20"/>
         </w:rPr>
-        <w:t xml:space="preserve"> Fenton-O'Creevy et al.</w:t>
+        <w:t xml:space="preserve"> Fenton-O'Creevy et al., 2012</w:t>
       </w:r>
     </w:p>
   </w:footnote>
@@ -14147,7 +14219,7 @@
           <w:sz w:val="20"/>
           <w:szCs w:val="20"/>
         </w:rPr>
-        <w:t xml:space="preserve"> Daniel, Hirshleifer, &amp; Subrahmanyam</w:t>
+        <w:t xml:space="preserve"> Sigmund Freud</w:t>
       </w:r>
     </w:p>
   </w:footnote>
@@ -14168,7 +14240,7 @@
           <w:sz w:val="20"/>
           <w:szCs w:val="20"/>
         </w:rPr>
-        <w:t xml:space="preserve"> Yalom</w:t>
+        <w:t xml:space="preserve"> Albert Ellis</w:t>
       </w:r>
     </w:p>
   </w:footnote>
@@ -14189,7 +14261,7 @@
           <w:sz w:val="20"/>
           <w:szCs w:val="20"/>
         </w:rPr>
-        <w:t xml:space="preserve"> Charles &amp; Kasilingam</w:t>
+        <w:t xml:space="preserve"> Daniel, Hirshleifer, &amp; Subrahmanyam</w:t>
       </w:r>
     </w:p>
   </w:footnote>
@@ -14210,7 +14282,7 @@
           <w:sz w:val="20"/>
           <w:szCs w:val="20"/>
         </w:rPr>
-        <w:t xml:space="preserve"> An, Li, &amp; Wu</w:t>
+        <w:t xml:space="preserve"> Rollo May</w:t>
       </w:r>
     </w:p>
   </w:footnote>
@@ -14231,7 +14303,7 @@
           <w:sz w:val="20"/>
           <w:szCs w:val="20"/>
         </w:rPr>
-        <w:t xml:space="preserve"> Vieira et al.</w:t>
+        <w:t xml:space="preserve"> Yalom</w:t>
       </w:r>
     </w:p>
   </w:footnote>
@@ -14252,7 +14324,7 @@
           <w:sz w:val="20"/>
           <w:szCs w:val="20"/>
         </w:rPr>
-        <w:t xml:space="preserve"> Schmidt et al.</w:t>
+        <w:t xml:space="preserve"> Charles &amp; Kasilingam</w:t>
       </w:r>
     </w:p>
   </w:footnote>
@@ -14273,7 +14345,7 @@
           <w:sz w:val="20"/>
           <w:szCs w:val="20"/>
         </w:rPr>
-        <w:t xml:space="preserve"> Saggino et al.</w:t>
+        <w:t xml:space="preserve"> An, Li, &amp; Wu</w:t>
       </w:r>
     </w:p>
   </w:footnote>
@@ -14294,7 +14366,7 @@
           <w:sz w:val="20"/>
           <w:szCs w:val="20"/>
         </w:rPr>
-        <w:t xml:space="preserve"> Hayes</w:t>
+        <w:t xml:space="preserve"> Vieira et al.</w:t>
       </w:r>
     </w:p>
   </w:footnote>
@@ -14315,7 +14387,7 @@
           <w:sz w:val="20"/>
           <w:szCs w:val="20"/>
         </w:rPr>
-        <w:t xml:space="preserve"> Estévez et al.</w:t>
+        <w:t xml:space="preserve"> Schmidt et al.</w:t>
       </w:r>
     </w:p>
   </w:footnote>
@@ -14336,7 +14408,7 @@
           <w:sz w:val="20"/>
           <w:szCs w:val="20"/>
         </w:rPr>
-        <w:t xml:space="preserve"> Sedighi Arfaee et al.</w:t>
+        <w:t xml:space="preserve"> Saggino et al.</w:t>
       </w:r>
     </w:p>
   </w:footnote>
@@ -14357,7 +14429,7 @@
           <w:sz w:val="20"/>
           <w:szCs w:val="20"/>
         </w:rPr>
-        <w:t xml:space="preserve"> Arena et al.</w:t>
+        <w:t xml:space="preserve"> Hayes</w:t>
       </w:r>
     </w:p>
   </w:footnote>
@@ -14378,7 +14450,7 @@
           <w:sz w:val="20"/>
           <w:szCs w:val="20"/>
         </w:rPr>
-        <w:t xml:space="preserve"> An et al.</w:t>
+        <w:t xml:space="preserve"> Estévez et al.</w:t>
       </w:r>
     </w:p>
   </w:footnote>
@@ -14399,7 +14471,7 @@
           <w:sz w:val="20"/>
           <w:szCs w:val="20"/>
         </w:rPr>
-        <w:t xml:space="preserve"> Rehm et al.</w:t>
+        <w:t xml:space="preserve"> Sedighi Arfaee et al.</w:t>
       </w:r>
     </w:p>
   </w:footnote>
@@ -14420,7 +14492,7 @@
           <w:sz w:val="20"/>
           <w:szCs w:val="20"/>
         </w:rPr>
-        <w:t xml:space="preserve"> Halvorsen et al.</w:t>
+        <w:t xml:space="preserve"> Arena et al.</w:t>
       </w:r>
     </w:p>
   </w:footnote>
@@ -14441,7 +14513,7 @@
           <w:sz w:val="20"/>
           <w:szCs w:val="20"/>
         </w:rPr>
-        <w:t xml:space="preserve"> Lo &amp; Repin</w:t>
+        <w:t xml:space="preserve"> An et al.</w:t>
       </w:r>
     </w:p>
   </w:footnote>
@@ -14462,7 +14534,7 @@
           <w:sz w:val="20"/>
           <w:szCs w:val="20"/>
         </w:rPr>
-        <w:t xml:space="preserve"> Safitri et al.</w:t>
+        <w:t xml:space="preserve"> Rehm et al.</w:t>
       </w:r>
     </w:p>
   </w:footnote>
@@ -14483,7 +14555,7 @@
           <w:sz w:val="20"/>
           <w:szCs w:val="20"/>
         </w:rPr>
-        <w:t xml:space="preserve"> Ololo et al.</w:t>
+        <w:t xml:space="preserve"> Fenton-O'Creevy et al., 2011</w:t>
       </w:r>
     </w:p>
   </w:footnote>
@@ -14504,11 +14576,95 @@
           <w:sz w:val="20"/>
           <w:szCs w:val="20"/>
         </w:rPr>
-        <w:t xml:space="preserve"> Kline</w:t>
+        <w:t xml:space="preserve"> Halvorsen et al.</w:t>
       </w:r>
     </w:p>
   </w:footnote>
   <w:footnote w:id="107">
+    <w:p>
+      <w:pPr>
+        <w:bidi w:val="0"/>
+      </w:pPr>
+      <w:r>
+        <w:rPr>
+          <w:vertAlign w:val="superscript"/>
+        </w:rPr>
+        <w:footnoteRef/>
+      </w:r>
+      <w:r>
+        <w:rPr>
+          <w:rFonts w:ascii="Times New Roman" w:hAnsi="Times New Roman" w:cs="Times New Roman"/>
+          <w:sz w:val="20"/>
+          <w:szCs w:val="20"/>
+        </w:rPr>
+        <w:t xml:space="preserve"> Lo &amp; Repin</w:t>
+      </w:r>
+    </w:p>
+  </w:footnote>
+  <w:footnote w:id="108">
+    <w:p>
+      <w:pPr>
+        <w:bidi w:val="0"/>
+      </w:pPr>
+      <w:r>
+        <w:rPr>
+          <w:vertAlign w:val="superscript"/>
+        </w:rPr>
+        <w:footnoteRef/>
+      </w:r>
+      <w:r>
+        <w:rPr>
+          <w:rFonts w:ascii="Times New Roman" w:hAnsi="Times New Roman" w:cs="Times New Roman"/>
+          <w:sz w:val="20"/>
+          <w:szCs w:val="20"/>
+        </w:rPr>
+        <w:t xml:space="preserve"> Safitri et al.</w:t>
+      </w:r>
+    </w:p>
+  </w:footnote>
+  <w:footnote w:id="109">
+    <w:p>
+      <w:pPr>
+        <w:bidi w:val="0"/>
+      </w:pPr>
+      <w:r>
+        <w:rPr>
+          <w:vertAlign w:val="superscript"/>
+        </w:rPr>
+        <w:footnoteRef/>
+      </w:r>
+      <w:r>
+        <w:rPr>
+          <w:rFonts w:ascii="Times New Roman" w:hAnsi="Times New Roman" w:cs="Times New Roman"/>
+          <w:sz w:val="20"/>
+          <w:szCs w:val="20"/>
+        </w:rPr>
+        <w:t xml:space="preserve"> Ololo et al.</w:t>
+      </w:r>
+    </w:p>
+  </w:footnote>
+  <w:footnote w:id="110">
+    <w:p>
+      <w:pPr>
+        <w:bidi w:val="0"/>
+      </w:pPr>
+      <w:r>
+        <w:rPr>
+          <w:vertAlign w:val="superscript"/>
+        </w:rPr>
+        <w:footnoteRef/>
+      </w:r>
+      <w:r>
+        <w:rPr>
+          <w:rFonts w:ascii="Times New Roman" w:hAnsi="Times New Roman" w:cs="Times New Roman"/>
+          <w:sz w:val="20"/>
+          <w:szCs w:val="20"/>
+        </w:rPr>
+        <w:t xml:space="preserve"> Kline</w:t>
+      </w:r>
+    </w:p>
+  </w:footnote>
+  <w:footnote w:id="111">
     <w:p>
       <w:pPr>
         <w:bidi w:val="0"/>

</xml_diff>

<commit_message>
fix: normalize hamza, add OECD footnote, force RTL headings, fix cover layout
</commit_message>
<xml_diff>
--- a/output/final/thesis_ch1_to_ch3.docx
+++ b/output/final/thesis_ch1_to_ch3.docx
@@ -41,7 +41,7 @@
     <w:p>
       <w:pPr>
         <w:bidi w:val="1"/>
-        <w:spacing w:lineRule="exact" w:line="580" w:before="0" w:after="60"/>
+        <w:spacing w:lineRule="exact" w:line="580" w:before="0" w:after="360"/>
         <w:jc w:val="center"/>
       </w:pPr>
       <w:r>
@@ -54,32 +54,32 @@
           <w:b/>
           <w:bCs/>
         </w:rPr>
-        <w:t xml:space="preserve">[نام دانشگاه]</w:t>
+        <w:t xml:space="preserve">دانشگاه علم و هنر یزد</w:t>
+      </w:r>
+    </w:p>
+    <w:p>
+      <w:pPr>
+        <w:bidi w:val="1"/>
+        <w:spacing w:lineRule="exact" w:line="580" w:before="240" w:after="360"/>
+        <w:jc w:val="center"/>
+      </w:pPr>
+      <w:r>
+        <w:rPr>
+          <w:rFonts w:ascii="B Nazanin" w:hAnsi="B Nazanin" w:cs="B Nazanin" w:hint="cs"/>
+          <w:rtl/>
+          <w:lang w:bidi="fa-IR"/>
+          <w:sz w:val="48"/>
+          <w:szCs w:val="48"/>
+          <w:b/>
+          <w:bCs/>
+        </w:rPr>
+        <w:t xml:space="preserve">تعیین نقش میانجی‌گر طرحواره‌های ناسازگار اولیه در رابطه بین اضطراب صفتی و رفتارهای مالی پرخطر در معامله‌گران بازارهای مالی</w:t>
       </w:r>
     </w:p>
     <w:p>
       <w:pPr>
         <w:bidi w:val="1"/>
         <w:spacing w:lineRule="exact" w:line="580" w:before="0" w:after="360"/>
-        <w:jc w:val="center"/>
-      </w:pPr>
-      <w:r>
-        <w:rPr>
-          <w:rFonts w:ascii="B Nazanin" w:hAnsi="B Nazanin" w:cs="B Nazanin" w:hint="cs"/>
-          <w:rtl/>
-          <w:lang w:bidi="fa-IR"/>
-          <w:sz w:val="20"/>
-          <w:szCs w:val="20"/>
-          <w:b/>
-          <w:bCs/>
-        </w:rPr>
-        <w:t xml:space="preserve">وابسته به جهاد دانشگاهی</w:t>
-      </w:r>
-    </w:p>
-    <w:p>
-      <w:pPr>
-        <w:bidi w:val="1"/>
-        <w:spacing w:lineRule="exact" w:line="580" w:before="0" w:after="120"/>
         <w:jc w:val="center"/>
       </w:pPr>
       <w:r>
@@ -92,15 +92,25 @@
           <w:b/>
           <w:bCs/>
         </w:rPr>
-        <w:t xml:space="preserve">پایان‌نامه کارشناسی ارشد دانشکدهٔ روان‌شناسی</w:t>
+        <w:t xml:space="preserve">پایان‌نامه کارشناسی ارشد روان‌شناسی بالینی</w:t>
       </w:r>
     </w:p>
     <w:p>
       <w:pPr>
         <w:bidi w:val="1"/>
-        <w:spacing w:lineRule="exact" w:line="580" w:before="0" w:after="360"/>
+        <w:spacing w:lineRule="exact" w:line="580" w:before="0" w:after="180"/>
         <w:jc w:val="center"/>
       </w:pPr>
+      <w:r>
+        <w:rPr>
+          <w:rFonts w:ascii="B Nazanin" w:hAnsi="B Nazanin" w:cs="B Nazanin" w:hint="cs"/>
+          <w:rtl/>
+          <w:lang w:bidi="fa-IR"/>
+          <w:sz w:val="28"/>
+          <w:szCs w:val="28"/>
+        </w:rPr>
+        <w:t xml:space="preserve">استاد راهنما: </w:t>
+      </w:r>
       <w:r>
         <w:rPr>
           <w:rFonts w:ascii="B Nazanin" w:hAnsi="B Nazanin" w:cs="B Nazanin" w:hint="cs"/>
@@ -111,43 +121,7 @@
           <w:b/>
           <w:bCs/>
         </w:rPr>
-        <w:t xml:space="preserve">گروه روان‌شناسی بالینی</w:t>
-      </w:r>
-    </w:p>
-    <w:p>
-      <w:pPr>
-        <w:bidi w:val="1"/>
-        <w:spacing w:lineRule="exact" w:line="580" w:before="240" w:after="360"/>
-        <w:jc w:val="center"/>
-      </w:pPr>
-      <w:r>
-        <w:rPr>
-          <w:rFonts w:ascii="B Nazanin" w:hAnsi="B Nazanin" w:cs="B Nazanin" w:hint="cs"/>
-          <w:rtl/>
-          <w:lang w:bidi="fa-IR"/>
-          <w:sz w:val="48"/>
-          <w:szCs w:val="48"/>
-          <w:b/>
-          <w:bCs/>
-        </w:rPr>
-        <w:t xml:space="preserve">تعیین نقش میانجی‌گر طرحواره‌های ناسازگار اولیه در رابطه بین اضطراب صفتی و رفتارهای مالی پرخطر در معامله‌گران بازارهای مالی</w:t>
-      </w:r>
-    </w:p>
-    <w:p>
-      <w:pPr>
-        <w:bidi w:val="1"/>
-        <w:spacing w:lineRule="exact" w:line="580" w:before="0" w:after="60"/>
-        <w:jc w:val="right"/>
-      </w:pPr>
-      <w:r>
-        <w:rPr>
-          <w:rFonts w:ascii="B Nazanin" w:hAnsi="B Nazanin" w:cs="B Nazanin" w:hint="cs"/>
-          <w:rtl/>
-          <w:lang w:bidi="fa-IR"/>
-          <w:sz w:val="28"/>
-          <w:szCs w:val="28"/>
-        </w:rPr>
-        <w:t xml:space="preserve">استاد راهنما:</w:t>
+        <w:t xml:space="preserve">دکتر سعید وزیری یزدی</w:t>
       </w:r>
     </w:p>
     <w:p>
@@ -156,6 +130,16 @@
         <w:spacing w:lineRule="exact" w:line="580" w:before="0" w:after="180"/>
         <w:jc w:val="center"/>
       </w:pPr>
+      <w:r>
+        <w:rPr>
+          <w:rFonts w:ascii="B Nazanin" w:hAnsi="B Nazanin" w:cs="B Nazanin" w:hint="cs"/>
+          <w:rtl/>
+          <w:lang w:bidi="fa-IR"/>
+          <w:sz w:val="28"/>
+          <w:szCs w:val="28"/>
+        </w:rPr>
+        <w:t xml:space="preserve">نگارنده: </w:t>
+      </w:r>
       <w:r>
         <w:rPr>
           <w:rFonts w:ascii="B Nazanin" w:hAnsi="B Nazanin" w:cs="B Nazanin" w:hint="cs"/>
@@ -166,30 +150,13 @@
           <w:b/>
           <w:bCs/>
         </w:rPr>
-        <w:t xml:space="preserve">دکتر سعید وزیری یزدی</w:t>
+        <w:t xml:space="preserve">مریم قابل</w:t>
       </w:r>
     </w:p>
     <w:p>
       <w:pPr>
         <w:bidi w:val="1"/>
-        <w:spacing w:lineRule="exact" w:line="580" w:before="0" w:after="60"/>
-        <w:jc w:val="right"/>
-      </w:pPr>
-      <w:r>
-        <w:rPr>
-          <w:rFonts w:ascii="B Nazanin" w:hAnsi="B Nazanin" w:cs="B Nazanin" w:hint="cs"/>
-          <w:rtl/>
-          <w:lang w:bidi="fa-IR"/>
-          <w:sz w:val="28"/>
-          <w:szCs w:val="28"/>
-        </w:rPr>
-        <w:t xml:space="preserve">نام دانشجو:</w:t>
-      </w:r>
-    </w:p>
-    <w:p>
-      <w:pPr>
-        <w:bidi w:val="1"/>
-        <w:spacing w:lineRule="exact" w:line="580" w:before="0" w:after="180"/>
+        <w:spacing w:lineRule="exact" w:line="580" w:before="240" w:after="0"/>
         <w:jc w:val="center"/>
       </w:pPr>
       <w:r>
@@ -202,26 +169,7 @@
           <w:b/>
           <w:bCs/>
         </w:rPr>
-        <w:t xml:space="preserve">[نام دانشجو]</w:t>
-      </w:r>
-    </w:p>
-    <w:p>
-      <w:pPr>
-        <w:bidi w:val="1"/>
-        <w:spacing w:lineRule="exact" w:line="580" w:before="240" w:after="0"/>
-        <w:jc w:val="center"/>
-      </w:pPr>
-      <w:r>
-        <w:rPr>
-          <w:rFonts w:ascii="B Nazanin" w:hAnsi="B Nazanin" w:cs="B Nazanin" w:hint="cs"/>
-          <w:rtl/>
-          <w:lang w:bidi="fa-IR"/>
-          <w:sz w:val="28"/>
-          <w:szCs w:val="28"/>
-          <w:b/>
-          <w:bCs/>
-        </w:rPr>
-        <w:t xml:space="preserve">مهر ۱۴۰۵</w:t>
+        <w:t xml:space="preserve">۱۴۰۵</w:t>
       </w:r>
     </w:p>
     <w:p>
@@ -546,17 +494,17 @@
       <w:pPr>
         <w:bidi w:val="1"/>
         <w:spacing w:lineRule="exact" w:line="580" w:before="0" w:after="60"/>
-        <w:jc w:val="right"/>
-      </w:pPr>
-      <w:r>
-        <w:rPr>
-          <w:rFonts w:ascii="B Nazanin" w:hAnsi="B Nazanin" w:cs="B Nazanin" w:hint="cs"/>
-          <w:rtl/>
-          <w:lang w:bidi="fa-IR"/>
-          <w:sz w:val="24"/>
-          <w:szCs w:val="24"/>
-        </w:rPr>
-        <w:t xml:space="preserve">جدول ۲-۱. حوزه‌ها و طرحواره‌های ناسازگار اولیه در مدل یانگ — [شمارهٔ صفحه پس از صفحه‌بندی نهایی در </w:t>
+        <w:jc w:val="center"/>
+      </w:pPr>
+      <w:r>
+        <w:rPr>
+          <w:rFonts w:ascii="B Nazanin" w:hAnsi="B Nazanin" w:cs="B Nazanin" w:hint="cs"/>
+          <w:rtl/>
+          <w:lang w:bidi="fa-IR"/>
+          <w:sz w:val="24"/>
+          <w:szCs w:val="24"/>
+        </w:rPr>
+        <w:t xml:space="preserve">جدول ۲-۱. حوزه‌ها و طرحواره‌های ناسازگار اولیه در مدل یانگ — [شماره صفحه پس از صفحه‌بندی نهایی در </w:t>
       </w:r>
       <w:r>
         <w:rPr>
@@ -582,17 +530,17 @@
       <w:pPr>
         <w:bidi w:val="1"/>
         <w:spacing w:lineRule="exact" w:line="580" w:before="0" w:after="60"/>
-        <w:jc w:val="right"/>
-      </w:pPr>
-      <w:r>
-        <w:rPr>
-          <w:rFonts w:ascii="B Nazanin" w:hAnsi="B Nazanin" w:cs="B Nazanin" w:hint="cs"/>
-          <w:rtl/>
-          <w:lang w:bidi="fa-IR"/>
-          <w:sz w:val="24"/>
-          <w:szCs w:val="24"/>
-        </w:rPr>
-        <w:t xml:space="preserve">جدول ۳-۱. خلاصهٔ ابزارهای پژوهش — [شمارهٔ صفحه پس از صفحه‌بندی نهایی در </w:t>
+        <w:jc w:val="center"/>
+      </w:pPr>
+      <w:r>
+        <w:rPr>
+          <w:rFonts w:ascii="B Nazanin" w:hAnsi="B Nazanin" w:cs="B Nazanin" w:hint="cs"/>
+          <w:rtl/>
+          <w:lang w:bidi="fa-IR"/>
+          <w:sz w:val="24"/>
+          <w:szCs w:val="24"/>
+        </w:rPr>
+        <w:t xml:space="preserve">جدول ۳-۱. خلاصه ابزارهای پژوهش — [شماره صفحه پس از صفحه‌بندی نهایی در </w:t>
       </w:r>
       <w:r>
         <w:rPr>
@@ -642,17 +590,17 @@
       <w:pPr>
         <w:bidi w:val="1"/>
         <w:spacing w:lineRule="exact" w:line="580" w:before="0" w:after="60"/>
-        <w:jc w:val="right"/>
-      </w:pPr>
-      <w:r>
-        <w:rPr>
-          <w:rFonts w:ascii="B Nazanin" w:hAnsi="B Nazanin" w:cs="B Nazanin" w:hint="cs"/>
-          <w:rtl/>
-          <w:lang w:bidi="fa-IR"/>
-          <w:sz w:val="24"/>
-          <w:szCs w:val="24"/>
-        </w:rPr>
-        <w:t xml:space="preserve">شکل ۲-۱. مدل مفهومی پژوهش — [شمارهٔ صفحه پس از صفحه‌بندی نهایی در </w:t>
+        <w:jc w:val="center"/>
+      </w:pPr>
+      <w:r>
+        <w:rPr>
+          <w:rFonts w:ascii="B Nazanin" w:hAnsi="B Nazanin" w:cs="B Nazanin" w:hint="cs"/>
+          <w:rtl/>
+          <w:lang w:bidi="fa-IR"/>
+          <w:sz w:val="24"/>
+          <w:szCs w:val="24"/>
+        </w:rPr>
+        <w:t xml:space="preserve">شکل ۲-۱. مدل مفهومی پژوهش — [شماره صفحه پس از صفحه‌بندی نهایی در </w:t>
       </w:r>
       <w:r>
         <w:rPr>
@@ -775,6 +723,7 @@
       <w:pPr>
         <w:pStyle w:val="Heading2"/>
         <w:bidi w:val="1"/>
+        <w:jc w:val="right"/>
       </w:pPr>
       <w:r>
         <w:rPr>
@@ -821,7 +770,7 @@
           <w:sz w:val="24"/>
           <w:szCs w:val="24"/>
         </w:rPr>
-        <w:t xml:space="preserve"> در بازارهای مالی نوین، پیامد صرفِ ندانستن یا بی‌دقتی نیستند. ریشهٔ آن‌ها در تعاملی پیچیده نهفته است که میان ویژگی‌های شخصیتی پایدار، الگوهای شناختی عمیق و فشارهای لحظه‌ای محیط معاملاتی شکل می‌گیرد. پژوهش حاضر با عنوان «تعیین نقش میانجی‌گر طرحواره‌های ناسازگار اولیه در رابطه بین اضطراب صفتی و رفتارهای مالی پرخطر در معامله‌گران بازارهای مالی»، در پی آن است که نشان دهد چگونه این ویژگی، اضطراب صفتی </w:t>
+        <w:t xml:space="preserve"> در بازارهای مالی نوین، پیامد صرفِ ندانستن یا بی‌دقتی نیستند. ریشه آن‌ها در تعاملی پیچیده نهفته است که میان ویژگی‌های شخصیتی پایدار، الگوهای شناختی عمیق و فشارهای لحظه‌ای محیط معاملاتی شکل می‌گیرد. پژوهش حاضر با عنوان «تعیین نقش میانجی‌گر طرحواره‌های ناسازگار اولیه در رابطه بین اضطراب صفتی و رفتارهای مالی پرخطر در معامله‌گران بازارهای مالی»، در پی آن است که نشان دهد چگونه این ویژگی، اضطراب صفتی </w:t>
       </w:r>
       <w:r>
         <w:rPr>
@@ -874,7 +823,7 @@
           <w:sz w:val="24"/>
           <w:szCs w:val="24"/>
         </w:rPr>
-        <w:t xml:space="preserve">در دهه‌های اخیر، با گسترش پلتفرم‌های معاملاتی الکترونیک و کاهش هزینه‌های مبادله، ساختار بازارهای مالی دستخوش تحولی بنیادین شده و میلیون‌ها سرمایه‌گذار خرد بدون آموزش تخصصی و آمادگی روانشناختی وارد این بازارها شده‌اند (سازمان همکاری و توسعه اقتصادی، ۲۰۲۱). این گروه جدید، برخلاف سرمایه‌گذاران نهادی، برای تصمیم‌گیری‌های خود از تیم‌های تحلیلی متخصص یا نظام‌های مدیریت ریسک سازمان‌یافته بهره‌مند نیستند و در شرایط نوسان، باید به تنهایی با فشار هیجانی سنگین ناشی از سود و زیان‌های لحظه‌ای کنار بیایند. شواهد اخیر نیز گواه همین نکته‌اند که اضطراب در این سرمایه‌گذاران، مستقیماً بر کیفیت تصمیم‌گیری مالی اثر می‌گذارد و می‌تواند به اجتناب از تصمیم‌گیری، محافظه‌کاری افراطی یا واکنش‌های هیجانی و تکانشی منجر شود (ماهاتو و همکاران</w:t>
+        <w:t xml:space="preserve">در دهه‌های اخیر، با گسترش پلتفرم‌های معاملاتی الکترونیک و کاهش هزینه‌های مبادله، ساختار بازارهای مالی دستخوش تحولی بنیادین شده و میلیون‌ها سرمایه‌گذار خرد بدون آموزش تخصصی و آمادگی روانشناختی وارد این بازارها شده‌اند (سازمان همکاری و توسعه اقتصادی</w:t>
       </w:r>
       <w:r>
         <w:rPr>
@@ -892,7 +841,25 @@
           <w:sz w:val="24"/>
           <w:szCs w:val="24"/>
         </w:rPr>
-        <w:t xml:space="preserve">، ۲۰۲۵). از این رو، مطالعهٔ علمی عوامل روانشناختی زمینه‌ساز رفتارهای مالی، دیگر صرفاً یک علاقهٔ آکادمیک نیست، بلکه به ضرورتی اجتماعی بدل شده است.</w:t>
+        <w:t xml:space="preserve">، ۲۰۲۱). این گروه جدید، برخلاف سرمایه‌گذاران نهادی، برای تصمیم‌گیری‌های خود از تیم‌های تحلیلی متخصص یا نظام‌های مدیریت ریسک سازمان‌یافته بهره‌مند نیستند و در شرایط نوسان، باید به تنهایی با فشار هیجانی سنگین ناشی از سود و زیان‌های لحظه‌ای کنار بیایند. شواهد اخیر نیز گواه همین نکته‌اند که اضطراب در این سرمایه‌گذاران، مستقیماً بر کیفیت تصمیم‌گیری مالی اثر می‌گذارد و می‌تواند به اجتناب از تصمیم‌گیری، محافظه‌کاری افراطی یا واکنش‌های هیجانی و تکانشی منجر شود (ماهاتو و همکاران</w:t>
+      </w:r>
+      <w:r>
+        <w:rPr>
+          <w:rFonts w:ascii="B Nazanin" w:hAnsi="B Nazanin" w:cs="B Nazanin" w:hint="cs"/>
+          <w:rtl/>
+          <w:vertAlign w:val="superscript"/>
+        </w:rPr>
+        <w:footnoteReference w:id="45"/>
+      </w:r>
+      <w:r>
+        <w:rPr>
+          <w:rFonts w:ascii="B Nazanin" w:hAnsi="B Nazanin" w:cs="B Nazanin" w:hint="cs"/>
+          <w:rtl/>
+          <w:lang w:bidi="fa-IR"/>
+          <w:sz w:val="24"/>
+          <w:szCs w:val="24"/>
+        </w:rPr>
+        <w:t xml:space="preserve">، ۲۰۲۵). از این رو، مطالعه علمی عوامل روانشناختی زمینه‌ساز رفتارهای مالی، دیگر صرفاً یک علاقه آکادمیک نیست، بلکه به ضرورتی اجتماعی بدل شده است.</w:t>
       </w:r>
     </w:p>
     <w:p>
@@ -909,7 +876,7 @@
           <w:sz w:val="24"/>
           <w:szCs w:val="24"/>
         </w:rPr>
-        <w:t xml:space="preserve">در این چارچوب، اضطراب صفتی متغیر مستقل، رفتارهای مالی پرخطر متغیر وابسته و طرحواره‌های ناسازگار اولیه متغیر میانجی پژوهش هستند و جامعهٔ هدف را معامله‌گران حقیقی بازارهای مالی تشکیل می‌دهند. اهمیت این پژوهش آن است که به‌جای توقف در سطح همبستگی‌های دوجانبه، سازوکار شناختی تبدیل تنش هیجانی به رفتار مالی پرخطر را در یک مدل میانجی‌گری یکپارچه هدف می‌گیرد. مبانی نظری، پیشینهٔ تجربی و روش آزمون این مدل در فصل‌های بعدی به تفصیل ارائه خواهد شد.</w:t>
+        <w:t xml:space="preserve">در این چارچوب، اضطراب صفتی متغیر مستقل، رفتارهای مالی پرخطر متغیر وابسته و طرحواره‌های ناسازگار اولیه متغیر میانجی پژوهش هستند و جامعه هدف را معامله‌گران حقیقی بازارهای مالی تشکیل می‌دهند. اهمیت این پژوهش آن است که به‌جای توقف در سطح همبستگی‌های دوجانبه، سازوکار شناختی تبدیل تنش هیجانی به رفتار مالی پرخطر را در یک مدل میانجی‌گری یکپارچه هدف می‌گیرد. مبانی نظری، پیشینه تجربی و روش آزمون این مدل در فصل‌های بعدی به تفصیل ارائه خواهد شد.</w:t>
       </w:r>
     </w:p>
     <w:p>
@@ -934,7 +901,7 @@
           <w:rtl/>
           <w:vertAlign w:val="superscript"/>
         </w:rPr>
-        <w:footnoteReference w:id="45"/>
+        <w:footnoteReference w:id="46"/>
       </w:r>
       <w:r>
         <w:rPr>
@@ -951,6 +918,7 @@
       <w:pPr>
         <w:pStyle w:val="Heading2"/>
         <w:bidi w:val="1"/>
+        <w:jc w:val="right"/>
       </w:pPr>
       <w:r>
         <w:rPr>
@@ -969,6 +937,7 @@
       <w:pPr>
         <w:pStyle w:val="Heading3"/>
         <w:bidi w:val="1"/>
+        <w:jc w:val="right"/>
       </w:pPr>
       <w:r>
         <w:rPr>
@@ -1005,7 +974,7 @@
           <w:rtl/>
           <w:vertAlign w:val="superscript"/>
         </w:rPr>
-        <w:footnoteReference w:id="46"/>
+        <w:footnoteReference w:id="47"/>
       </w:r>
       <w:r>
         <w:rPr>
@@ -1074,7 +1043,7 @@
           <w:rtl/>
           <w:vertAlign w:val="superscript"/>
         </w:rPr>
-        <w:footnoteReference w:id="47"/>
+        <w:footnoteReference w:id="48"/>
       </w:r>
       <w:r>
         <w:rPr>
@@ -1101,7 +1070,7 @@
           <w:sz w:val="24"/>
           <w:szCs w:val="24"/>
         </w:rPr>
-        <w:t xml:space="preserve">در عصر حاضر، همگام با پیشرفت‌های خیره‌کننده فناوری اطلاعات و ارتباطات و ظهور اینترنت پرسرعت، مفهوم سنتی بازار فراتر از مرزهای جغرافیایی و زمانی گسترش یافته و ظهور نسل جدیدی از بازارهای مالی جهانی و تمام‌الکترونیک را رقم زده است. این اکوسیستم مالی نوین، دیگر محدود به ساعات کاری بورس‌های ملی نیست و شامل عرصه‌های پرجنب‌وجوش و بدون وقفه‌ای نظیر بازار تبادل ارزهای خارجی است که با حجم عظیم گردش مالی روزانه و ماهیت فرامرزی، به عنوان بزرگترین و نقدشونده‌ترین بازار مالی جهان شناخته می‌شود. در کنار آن، ظهور پدیده انقلابی بازار ارزهای دیجیتال و فناوری زیربنایی بلاک‌چین نیز پارادایم‌های مرسوم ارزش‌گذاری، مالکیت دارایی و حکمرانی پولی را به چالش کشیده است؛ طبقهٔ جدیدی از دارایی‌های غیرمتمرکز معرفی شده که ویژگی بارز آن‌ها، نوسانات شدید قیمتی و حساسیت بالا به اخبار و رویدادهای جهانی است (شیلر</w:t>
+        <w:t xml:space="preserve">در عصر حاضر، همگام با پیشرفت‌های خیره‌کننده فناوری اطلاعات و ارتباطات و ظهور اینترنت پرسرعت، مفهوم سنتی بازار فراتر از مرزهای جغرافیایی و زمانی گسترش یافته و ظهور نسل جدیدی از بازارهای مالی جهانی و تمام‌الکترونیک را رقم زده است. این اکوسیستم مالی نوین، دیگر محدود به ساعات کاری بورس‌های ملی نیست و شامل عرصه‌های پرجنب‌وجوش و بدون وقفه‌ای نظیر بازار تبادل ارزهای خارجی است که با حجم عظیم گردش مالی روزانه و ماهیت فرامرزی، به عنوان بزرگترین و نقدشونده‌ترین بازار مالی جهان شناخته می‌شود. در کنار آن، ظهور پدیده انقلابی بازار ارزهای دیجیتال و فناوری زیربنایی بلاک‌چین نیز پارادایم‌های مرسوم ارزش‌گذاری، مالکیت دارایی و حکمرانی پولی را به چالش کشیده است؛ طبقه جدیدی از دارایی‌های غیرمتمرکز معرفی شده که ویژگی بارز آن‌ها، نوسانات شدید قیمتی و حساسیت بالا به اخبار و رویدادهای جهانی است (شیلر</w:t>
       </w:r>
       <w:r>
         <w:rPr>
@@ -1109,7 +1078,7 @@
           <w:rtl/>
           <w:vertAlign w:val="superscript"/>
         </w:rPr>
-        <w:footnoteReference w:id="48"/>
+        <w:footnoteReference w:id="49"/>
       </w:r>
       <w:r>
         <w:rPr>
@@ -1177,6 +1146,7 @@
       <w:pPr>
         <w:pStyle w:val="Heading3"/>
         <w:bidi w:val="1"/>
+        <w:jc w:val="right"/>
       </w:pPr>
       <w:r>
         <w:rPr>
@@ -1205,7 +1175,7 @@
           <w:sz w:val="24"/>
           <w:szCs w:val="24"/>
         </w:rPr>
-        <w:t xml:space="preserve">در بخش بزرگی از قرن بیستم، ادبیات آکادمیک تحلیل بازارهای مالی تحت سیطرهٔ فرضیه بازار کارا </w:t>
+        <w:t xml:space="preserve">در بخش بزرگی از قرن بیستم، ادبیات آکادمیک تحلیل بازارهای مالی تحت سیطره فرضیه بازار کارا </w:t>
       </w:r>
       <w:r>
         <w:rPr>
@@ -1223,7 +1193,7 @@
           <w:sz w:val="24"/>
           <w:szCs w:val="24"/>
         </w:rPr>
-        <w:t xml:space="preserve"> قرار داشت؛ فرضیه‌ای که بر پایهٔ آن، قیمت دارایی‌ها در هر لحظه بازتاب‌دهندهٔ کامل اطلاعات موجود فرض می‌شد و سرمایه‌گذاران عاملانی کاملاً عقلانی تلقی می‌گردیدند (ملکیل</w:t>
+        <w:t xml:space="preserve"> قرار داشت؛ فرضیه‌ای که بر پایه آن، قیمت دارایی‌ها در هر لحظه بازتاب‌دهنده کامل اطلاعات موجود فرض می‌شد و سرمایه‌گذاران عاملانی کاملاً عقلانی تلقی می‌گردیدند (ملکیل</w:t>
       </w:r>
       <w:r>
         <w:rPr>
@@ -1231,7 +1201,7 @@
           <w:rtl/>
           <w:vertAlign w:val="superscript"/>
         </w:rPr>
-        <w:footnoteReference w:id="49"/>
+        <w:footnoteReference w:id="50"/>
       </w:r>
       <w:r>
         <w:rPr>
@@ -1258,7 +1228,7 @@
           <w:sz w:val="24"/>
           <w:szCs w:val="24"/>
         </w:rPr>
-        <w:t xml:space="preserve">فرضیه بازار کارا در جریان تکامل نظری خود، به طور برجسته توسط فاما در دههٔ ۱۹۷۰ میلادی در سه شکل ضعیف، نیمه‌قوی و قوی صورت‌بندی شد که هر یک دامنهٔ متفاوتی از اطلاعات را در قیمت‌ها منعکس‌شده فرض می‌کردند (ملکیل، ۲۰۰۳). این صورت‌بندی بر سه فرض بنیادین استوار بود: نخست، آنکه سرمایه‌گذاران عاملانی کاملاً عقلانی هستند و همواره در پی بهینه‌سازی مطلوبیت خود بر اساس نظریهٔ مطلوبیت انتظاری‌اند؛ دوم، آنکه تمام اطلاعات جدید به سرعت، به طور کامل و بدون سوگیری در قیمت دارایی‌ها منعکس می‌شوند؛ و سوم، آنکه در نتیجهٔ این دو، هیچ سرمایه‌گذاری نمی‌تواند با اتکا به اطلاعات گذشته یا تحلیل‌های عمومی، به طور مداوم بازدهی فراتر از میانگین بازار کسب کند. این چارچوب، سال‌ها مبنای نظری مدل‌های قیمت‌گذاری دارایی‌ها بود و انسجام ریاضی آن را به ابزاری کارآمد در مدل‌سازی‌های اقتصادی بدل ساخته بود (ملکیل، ۲۰۰۳).</w:t>
+        <w:t xml:space="preserve">فرضیه بازار کارا در جریان تکامل نظری خود، به طور برجسته توسط فاما در دهه ۱۹۷۰ میلادی در سه شکل ضعیف، نیمه‌قوی و قوی صورت‌بندی شد که هر یک دامنه متفاوتی از اطلاعات را در قیمت‌ها منعکس‌شده فرض می‌کردند (ملکیل، ۲۰۰۳). این صورت‌بندی بر سه فرض بنیادین استوار بود: نخست، آنکه سرمایه‌گذاران عاملانی کاملاً عقلانی هستند و همواره در پی بهینه‌سازی مطلوبیت خود بر اساس نظریه مطلوبیت انتظاری‌اند؛ دوم، آنکه تمام اطلاعات جدید به سرعت، به طور کامل و بدون سوگیری در قیمت دارایی‌ها منعکس می‌شوند؛ و سوم، آنکه در نتیجه این دو، هیچ سرمایه‌گذاری نمی‌تواند با اتکا به اطلاعات گذشته یا تحلیل‌های عمومی، به طور مداوم بازدهی فراتر از میانگین بازار کسب کند. این چارچوب، سال‌ها مبنای نظری مدل‌های قیمت‌گذاری دارایی‌ها بود و انسجام ریاضی آن را به ابزاری کارآمد در مدل‌سازی‌های اقتصادی بدل ساخته بود (ملکیل، ۲۰۰۳).</w:t>
       </w:r>
     </w:p>
     <w:p>
@@ -1275,7 +1245,7 @@
           <w:sz w:val="24"/>
           <w:szCs w:val="24"/>
         </w:rPr>
-        <w:t xml:space="preserve">با این حال، تکرار ناهنجاری‌ها در بازارهای واقعی، به تدریج تردیدهایی جدی دربارهٔ اعتبار توصیفی این فرضیه ایجاد کرد. در پدیده‌هایی مانند حباب دات-کام در سال ۲۰۰۰ — که در آن قیمت دارایی‌ها بسیار فراتر از ارزش ذاتی آن‌ها معامله می‌شد — یا سقوط ناگهانی دوشنبه سیاه در سال ۱۹۸۷ — که در آن فروش‌های هراسان بدون هیچ دلیل بنیادی مشخصی رخ داد — چارچوب بازار کارا در ارائهٔ تبیینی قانع‌کننده ناتوان ماند (شیلر، ۲۰۱۵). تکرار این پدیده‌ها نشان می‌داد که قیمت‌های بازار همواره تحت تأثیر عوامل روانشناختی فعالان بازار نیز قرار دارند؛ نه صرفاً بازتاب اطلاعات بنیادی. همین آگاهی، زمینه‌ساز چرخش تدریجی ادبیات تحلیل بازارهای مالی به سمت عوامل انسانی شد؛ چرخشی که در آن، نوسانات بازار نه صرفاً بازتاب اخبار بنیادی، بلکه محصول تعامل باورهای هیجانات و انتظارات سرمایه‌گذاران نیز تلقی می‌شود (شیلر، ۲۰۱۵).</w:t>
+        <w:t xml:space="preserve">با این حال، تکرار ناهنجاری‌ها در بازارهای واقعی، به تدریج تردیدهایی جدی درباره اعتبار توصیفی این فرضیه ایجاد کرد. در پدیده‌هایی مانند حباب دات-کام در سال ۲۰۰۰ — که در آن قیمت دارایی‌ها بسیار فراتر از ارزش ذاتی آن‌ها معامله می‌شد — یا سقوط ناگهانی دوشنبه سیاه در سال ۱۹۸۷ — که در آن فروش‌های هراسان بدون هیچ دلیل بنیادی مشخصی رخ داد — چارچوب بازار کارا در ارائه تبیینی قانع‌کننده ناتوان ماند (شیلر، ۲۰۱۵). تکرار این پدیده‌ها نشان می‌داد که قیمت‌های بازار همواره تحت تأثیر عوامل روانشناختی فعالان بازار نیز قرار دارند؛ نه صرفاً بازتاب اطلاعات بنیادی. همین آگاهی، زمینه‌ساز چرخش تدریجی ادبیات تحلیل بازارهای مالی به سمت عوامل انسانی شد؛ چرخشی که در آن، نوسانات بازار نه صرفاً بازتاب اخبار بنیادی، بلکه محصول تعامل باورهای هیجانات و انتظارات سرمایه‌گذاران نیز تلقی می‌شود (شیلر، ۲۰۱۵).</w:t>
       </w:r>
     </w:p>
     <w:p>
@@ -1318,7 +1288,7 @@
           <w:rtl/>
           <w:vertAlign w:val="superscript"/>
         </w:rPr>
-        <w:footnoteReference w:id="50"/>
+        <w:footnoteReference w:id="51"/>
       </w:r>
       <w:r>
         <w:rPr>
@@ -1354,17 +1324,17 @@
           <w:rtl/>
           <w:vertAlign w:val="superscript"/>
         </w:rPr>
-        <w:footnoteReference w:id="51"/>
-      </w:r>
-      <w:r>
-        <w:rPr>
-          <w:rFonts w:ascii="B Nazanin" w:hAnsi="B Nazanin" w:cs="B Nazanin" w:hint="cs"/>
-          <w:rtl/>
-          <w:lang w:bidi="fa-IR"/>
-          <w:sz w:val="24"/>
-          <w:szCs w:val="24"/>
-        </w:rPr>
-        <w:t xml:space="preserve"> (۱۹۷۹) آن را ارائه کردند و بر پایهٔ آن، افراد به‌جای ارزیابی سطح نهایی ثروت، تغییرات سود و زیان را نسبت به یک نقطهٔ مرجع ذهنی می‌سنجند و زیان‌گریزی </w:t>
+        <w:footnoteReference w:id="52"/>
+      </w:r>
+      <w:r>
+        <w:rPr>
+          <w:rFonts w:ascii="B Nazanin" w:hAnsi="B Nazanin" w:cs="B Nazanin" w:hint="cs"/>
+          <w:rtl/>
+          <w:lang w:bidi="fa-IR"/>
+          <w:sz w:val="24"/>
+          <w:szCs w:val="24"/>
+        </w:rPr>
+        <w:t xml:space="preserve"> (۱۹۷۹) آن را ارائه کردند و بر پایه آن، افراد به‌جای ارزیابی سطح نهایی ثروت، تغییرات سود و زیان را نسبت به یک نقطه مرجع ذهنی می‌سنجند و زیان‌گریزی </w:t>
       </w:r>
       <w:r>
         <w:rPr>
@@ -1390,7 +1360,7 @@
           <w:rtl/>
           <w:vertAlign w:val="superscript"/>
         </w:rPr>
-        <w:footnoteReference w:id="52"/>
+        <w:footnoteReference w:id="53"/>
       </w:r>
       <w:r>
         <w:rPr>
@@ -1443,17 +1413,17 @@
           <w:rtl/>
           <w:vertAlign w:val="superscript"/>
         </w:rPr>
-        <w:footnoteReference w:id="53"/>
-      </w:r>
-      <w:r>
-        <w:rPr>
-          <w:rFonts w:ascii="B Nazanin" w:hAnsi="B Nazanin" w:cs="B Nazanin" w:hint="cs"/>
-          <w:rtl/>
-          <w:lang w:bidi="fa-IR"/>
-          <w:sz w:val="24"/>
-          <w:szCs w:val="24"/>
-        </w:rPr>
-        <w:t xml:space="preserve">، ۲۰۲۳). این پدیده ارتباط نزدیکی با رفتار گله‌ای دارد؛ در این رفتار، افراد به جای اتکا به تحلیل شخصی، از اقدامات دیگر معامله‌گران — به ویژه در شرایط استرس و نوسانات بالای بازار — پیروی می‌کنند و همین تقلید جمعی می‌تواند نیروی پیش‌برندهٔ شکل‌گیری حباب‌های قیمتی خطرناک شود (هوانگ و سالمون</w:t>
+        <w:footnoteReference w:id="54"/>
+      </w:r>
+      <w:r>
+        <w:rPr>
+          <w:rFonts w:ascii="B Nazanin" w:hAnsi="B Nazanin" w:cs="B Nazanin" w:hint="cs"/>
+          <w:rtl/>
+          <w:lang w:bidi="fa-IR"/>
+          <w:sz w:val="24"/>
+          <w:szCs w:val="24"/>
+        </w:rPr>
+        <w:t xml:space="preserve">، ۲۰۲۳). این پدیده ارتباط نزدیکی با رفتار گله‌ای دارد؛ در این رفتار، افراد به جای اتکا به تحلیل شخصی، از اقدامات دیگر معامله‌گران — به ویژه در شرایط استرس و نوسانات بالای بازار — پیروی می‌کنند و همین تقلید جمعی می‌تواند نیروی پیش‌برنده شکل‌گیری حباب‌های قیمتی خطرناک شود (هوانگ و سالمون</w:t>
       </w:r>
       <w:r>
         <w:rPr>
@@ -1461,23 +1431,24 @@
           <w:rtl/>
           <w:vertAlign w:val="superscript"/>
         </w:rPr>
-        <w:footnoteReference w:id="54"/>
-      </w:r>
-      <w:r>
-        <w:rPr>
-          <w:rFonts w:ascii="B Nazanin" w:hAnsi="B Nazanin" w:cs="B Nazanin" w:hint="cs"/>
-          <w:rtl/>
-          <w:lang w:bidi="fa-IR"/>
-          <w:sz w:val="24"/>
-          <w:szCs w:val="24"/>
-        </w:rPr>
-        <w:t xml:space="preserve">، ۲۰۰۴). همزیستی این دو سازوکار نشان می‌دهد که بازارهای مالی مدرن بیش از آنکه صرفاً پدیده‌هایی اقتصادی باشند، عرصهٔ فرآیندهای روانشناختی اجتماعی نیز هستند و شناخت این فرآیندها بدون ابزارهای دقیق روانشناسی ممکن نیست.</w:t>
+        <w:footnoteReference w:id="55"/>
+      </w:r>
+      <w:r>
+        <w:rPr>
+          <w:rFonts w:ascii="B Nazanin" w:hAnsi="B Nazanin" w:cs="B Nazanin" w:hint="cs"/>
+          <w:rtl/>
+          <w:lang w:bidi="fa-IR"/>
+          <w:sz w:val="24"/>
+          <w:szCs w:val="24"/>
+        </w:rPr>
+        <w:t xml:space="preserve">، ۲۰۰۴). همزیستی این دو سازوکار نشان می‌دهد که بازارهای مالی مدرن بیش از آنکه صرفاً پدیده‌هایی اقتصادی باشند، عرصه فرآیندهای روانشناختی اجتماعی نیز هستند و شناخت این فرآیندها بدون ابزارهای دقیق روانشناسی ممکن نیست.</w:t>
       </w:r>
     </w:p>
     <w:p>
       <w:pPr>
         <w:pStyle w:val="Heading3"/>
         <w:bidi w:val="1"/>
+        <w:jc w:val="right"/>
       </w:pPr>
       <w:r>
         <w:rPr>
@@ -1489,7 +1460,7 @@
           <w:b/>
           <w:bCs/>
         </w:rPr>
-        <w:t xml:space="preserve">بافت ویژهٔ اقتصادی و اجتماعی ایران</w:t>
+        <w:t xml:space="preserve">بافت ویژه اقتصادی و اجتماعی ایران</w:t>
       </w:r>
     </w:p>
     <w:p>
@@ -1557,13 +1528,14 @@
           <w:sz w:val="24"/>
           <w:szCs w:val="24"/>
         </w:rPr>
-        <w:t xml:space="preserve">بدین ترتیب، بافت سه‌گانهٔ اقتصاد ایران — تورم مزمن، نوسانات ارزی و ضعف آموزش مالی عمومی — محیط روانشناختی منحصر به فردی را برای معامله‌گر ایرانی شکل می‌دهد؛ محیطی که در آن، ویژگی‌های شخصیتی و شناختی فرد بیش از اقتصادهای باثبات، نقشی برجسته در تبیین رفتار ایفا می‌کنند (ستایش و همکاران، ۱۳۹۹). در چنین بافتی است که بررسی نقش میانجی‌گر طرحواره‌های ناسازگار اولیه در رابطهٔ اضطراب صفتی با رفتارهای مالی پرخطر، معنایی دوچندان می‌یابد؛ زیرا هم به لحاظ نظری شکافی را در ادبیات پر می‌کند و هم به لحاظ عملی، پاسخی به نیاز واقعی جامعهٔ معامله‌گران ایرانی ارائه می‌دهد.</w:t>
+        <w:t xml:space="preserve">بدین ترتیب، بافت سه‌گانه اقتصاد ایران — تورم مزمن، نوسانات ارزی و ضعف آموزش مالی عمومی — محیط روانشناختی منحصر به فردی را برای معامله‌گر ایرانی شکل می‌دهد؛ محیطی که در آن، ویژگی‌های شخصیتی و شناختی فرد بیش از اقتصادهای باثبات، نقشی برجسته در تبیین رفتار ایفا می‌کنند (ستایش و همکاران، ۱۳۹۹). در چنین بافتی است که بررسی نقش میانجی‌گر طرحواره‌های ناسازگار اولیه در رابطه اضطراب صفتی با رفتارهای مالی پرخطر، معنایی دوچندان می‌یابد؛ زیرا هم به لحاظ نظری شکافی را در ادبیات پر می‌کند و هم به لحاظ عملی، پاسخی به نیاز واقعی جامعه معامله‌گران ایرانی ارائه می‌دهد.</w:t>
       </w:r>
     </w:p>
     <w:p>
       <w:pPr>
         <w:pStyle w:val="Heading3"/>
         <w:bidi w:val="1"/>
+        <w:jc w:val="right"/>
       </w:pPr>
       <w:r>
         <w:rPr>
@@ -1592,7 +1564,7 @@
           <w:sz w:val="24"/>
           <w:szCs w:val="24"/>
         </w:rPr>
-        <w:t xml:space="preserve">در سطح فردی، اضطراب صفتی به دلیل ارتباط مستقیم با نحوهٔ پردازش اطلاعات تهدیدآمیز و مدیریت عدم قطعیت، جایگاه ویژه‌ای در روانشناسی مالی دارد. بر اساس مدل کلاسیک اسپیلبرگر، افراد با اضطراب صفتی بالا دارای سیستم هشدار روانی بیش‌فعالی هستند که موقعیت‌های مبهم — مانند نوسانات طبیعی بازار — را تهدیدآمیز ادراک می‌کند و با نگرانی، تنش و برانگیختگی فیزیولوژیک بیشتری به آن‌ها پاسخ می‌دهد (اسپیلبرگر</w:t>
+        <w:t xml:space="preserve">در سطح فردی، اضطراب صفتی به دلیل ارتباط مستقیم با نحوه پردازش اطلاعات تهدیدآمیز و مدیریت عدم قطعیت، جایگاه ویژه‌ای در روانشناسی مالی دارد. بر اساس مدل کلاسیک اسپیلبرگر، افراد با اضطراب صفتی بالا دارای سیستم هشدار روانی بیش‌فعالی هستند که موقعیت‌های مبهم — مانند نوسانات طبیعی بازار — را تهدیدآمیز ادراک می‌کند و با نگرانی، تنش و برانگیختگی فیزیولوژیک بیشتری به آن‌ها پاسخ می‌دهد (اسپیلبرگر</w:t>
       </w:r>
       <w:r>
         <w:rPr>
@@ -1600,7 +1572,7 @@
           <w:rtl/>
           <w:vertAlign w:val="superscript"/>
         </w:rPr>
-        <w:footnoteReference w:id="55"/>
+        <w:footnoteReference w:id="56"/>
       </w:r>
       <w:r>
         <w:rPr>
@@ -1618,7 +1590,7 @@
           <w:rtl/>
           <w:vertAlign w:val="superscript"/>
         </w:rPr>
-        <w:footnoteReference w:id="56"/>
+        <w:footnoteReference w:id="57"/>
       </w:r>
       <w:r>
         <w:rPr>
@@ -1645,7 +1617,7 @@
           <w:sz w:val="24"/>
           <w:szCs w:val="24"/>
         </w:rPr>
-        <w:t xml:space="preserve">در سطح شناختی، اضطراب صفتی با سوگیری‌های نظام‌مند در پردازش اطلاعات تهدیدآمیز همراه است. شواهد عصب‌شناختی-شناختی نشان می‌دهند که در افراد مضطرب، سیستم توجهی به طور خودکار به سمت نشانه‌های بالقوهٔ خطر جهت‌گیری می‌کند و منابع شناختی از پردازش اطلاعات خنثی یا مثبت منحرف می‌شوند (بیشاپ</w:t>
+        <w:t xml:space="preserve">در سطح شناختی، اضطراب صفتی با سوگیری‌های نظام‌مند در پردازش اطلاعات تهدیدآمیز همراه است. شواهد عصب‌شناختی-شناختی نشان می‌دهند که در افراد مضطرب، سیستم توجهی به طور خودکار به سمت نشانه‌های بالقوه خطر جهت‌گیری می‌کند و منابع شناختی از پردازش اطلاعات خنثی یا مثبت منحرف می‌شوند (بیشاپ</w:t>
       </w:r>
       <w:r>
         <w:rPr>
@@ -1653,17 +1625,17 @@
           <w:rtl/>
           <w:vertAlign w:val="superscript"/>
         </w:rPr>
-        <w:footnoteReference w:id="57"/>
-      </w:r>
-      <w:r>
-        <w:rPr>
-          <w:rFonts w:ascii="B Nazanin" w:hAnsi="B Nazanin" w:cs="B Nazanin" w:hint="cs"/>
-          <w:rtl/>
-          <w:lang w:bidi="fa-IR"/>
-          <w:sz w:val="24"/>
-          <w:szCs w:val="24"/>
-        </w:rPr>
-        <w:t xml:space="preserve">، ۲۰۰۷). در بافت معامله‌گری، چنین نشانه‌هایی می‌توانند افت ناگهانی قیمت، اخبار منفی اقتصادی یا نوسان شدید سبد دارایی باشند؛ در این شرایط، معامله‌گر دارای اضطراب صفتی بالا، منابع شناختی محدود خود را به سرعت صرف پایش تهدید می‌کند و ظرفیت کمتری برای تحلیل منطقی و تصمیم‌گیری متوازن در اختیار دارد. علاوه بر این، الگوی پردازشی یادشده می‌تواند با تفسیر سوگیرانهٔ موقعیت‌های مبهم به عنوان موقعیت‌های تهدیدآمیز همراه باشد (بک و کلارک</w:t>
+        <w:footnoteReference w:id="58"/>
+      </w:r>
+      <w:r>
+        <w:rPr>
+          <w:rFonts w:ascii="B Nazanin" w:hAnsi="B Nazanin" w:cs="B Nazanin" w:hint="cs"/>
+          <w:rtl/>
+          <w:lang w:bidi="fa-IR"/>
+          <w:sz w:val="24"/>
+          <w:szCs w:val="24"/>
+        </w:rPr>
+        <w:t xml:space="preserve">، ۲۰۰۷). در بافت معامله‌گری، چنین نشانه‌هایی می‌توانند افت ناگهانی قیمت، اخبار منفی اقتصادی یا نوسان شدید سبد دارایی باشند؛ در این شرایط، معامله‌گر دارای اضطراب صفتی بالا، منابع شناختی محدود خود را به سرعت صرف پایش تهدید می‌کند و ظرفیت کمتری برای تحلیل منطقی و تصمیم‌گیری متوازن در اختیار دارد. علاوه بر این، الگوی پردازشی یادشده می‌تواند با تفسیر سوگیرانه موقعیت‌های مبهم به عنوان موقعیت‌های تهدیدآمیز همراه باشد (بک و کلارک</w:t>
       </w:r>
       <w:r>
         <w:rPr>
@@ -1671,7 +1643,7 @@
           <w:rtl/>
           <w:vertAlign w:val="superscript"/>
         </w:rPr>
-        <w:footnoteReference w:id="58"/>
+        <w:footnoteReference w:id="59"/>
       </w:r>
       <w:r>
         <w:rPr>
@@ -1698,7 +1670,7 @@
           <w:sz w:val="24"/>
           <w:szCs w:val="24"/>
         </w:rPr>
-        <w:t xml:space="preserve">اضطراب صفتی همچنین با ماهیت بنیادین بازارهای مالی — یعنی عدم قطعیت دربارهٔ آینده — پیوندی عمیق دارد. شواهد نشان می‌دهند که یکی از مؤلفه‌های کلیدی اضطراب، دشواری در تحمل عدم قطعیت و پیش‌بینی مکرر تهدیدهای احتمالی آینده است؛ فرآیندی که توانایی فرد را برای کاهش مؤثر عدم قطعیت و مدیریت ریسک مختل می‌سازد (گروپ و نیچکه</w:t>
+        <w:t xml:space="preserve">اضطراب صفتی همچنین با ماهیت بنیادین بازارهای مالی — یعنی عدم قطعیت درباره آینده — پیوندی عمیق دارد. شواهد نشان می‌دهند که یکی از مؤلفه‌های کلیدی اضطراب، دشواری در تحمل عدم قطعیت و پیش‌بینی مکرر تهدیدهای احتمالی آینده است؛ فرآیندی که توانایی فرد را برای کاهش مؤثر عدم قطعیت و مدیریت ریسک مختل می‌سازد (گروپ و نیچکه</w:t>
       </w:r>
       <w:r>
         <w:rPr>
@@ -1706,17 +1678,17 @@
           <w:rtl/>
           <w:vertAlign w:val="superscript"/>
         </w:rPr>
-        <w:footnoteReference w:id="59"/>
-      </w:r>
-      <w:r>
-        <w:rPr>
-          <w:rFonts w:ascii="B Nazanin" w:hAnsi="B Nazanin" w:cs="B Nazanin" w:hint="cs"/>
-          <w:rtl/>
-          <w:lang w:bidi="fa-IR"/>
-          <w:sz w:val="24"/>
-          <w:szCs w:val="24"/>
-        </w:rPr>
-        <w:t xml:space="preserve">، ۲۰۱۳). بر اساس نظریهٔ کنترل توجه </w:t>
+        <w:footnoteReference w:id="60"/>
+      </w:r>
+      <w:r>
+        <w:rPr>
+          <w:rFonts w:ascii="B Nazanin" w:hAnsi="B Nazanin" w:cs="B Nazanin" w:hint="cs"/>
+          <w:rtl/>
+          <w:lang w:bidi="fa-IR"/>
+          <w:sz w:val="24"/>
+          <w:szCs w:val="24"/>
+        </w:rPr>
+        <w:t xml:space="preserve">، ۲۰۱۳). بر اساس نظریه کنترل توجه </w:t>
       </w:r>
       <w:r>
         <w:rPr>
@@ -1742,17 +1714,17 @@
           <w:rtl/>
           <w:vertAlign w:val="superscript"/>
         </w:rPr>
-        <w:footnoteReference w:id="60"/>
-      </w:r>
-      <w:r>
-        <w:rPr>
-          <w:rFonts w:ascii="B Nazanin" w:hAnsi="B Nazanin" w:cs="B Nazanin" w:hint="cs"/>
-          <w:rtl/>
-          <w:lang w:bidi="fa-IR"/>
-          <w:sz w:val="24"/>
-          <w:szCs w:val="24"/>
-        </w:rPr>
-        <w:t xml:space="preserve">، ۲۰۰۷)؛ مکانیسمی که پیامد آن، اشغال منابع محدود حافظهٔ کاری توسط نگرانی‌های مزاحم و تضعیف ظرفیت تحلیل‌های منطقی چندمرحله‌ای است (بدلی، آیزنک و اندرسون</w:t>
+        <w:footnoteReference w:id="61"/>
+      </w:r>
+      <w:r>
+        <w:rPr>
+          <w:rFonts w:ascii="B Nazanin" w:hAnsi="B Nazanin" w:cs="B Nazanin" w:hint="cs"/>
+          <w:rtl/>
+          <w:lang w:bidi="fa-IR"/>
+          <w:sz w:val="24"/>
+          <w:szCs w:val="24"/>
+        </w:rPr>
+        <w:t xml:space="preserve">، ۲۰۰۷)؛ مکانیسمی که پیامد آن، اشغال منابع محدود حافظه کاری توسط نگرانی‌های مزاحم و تضعیف ظرفیت تحلیل‌های منطقی چندمرحله‌ای است (بدلی، آیزنک و اندرسون</w:t>
       </w:r>
       <w:r>
         <w:rPr>
@@ -1760,7 +1732,7 @@
           <w:rtl/>
           <w:vertAlign w:val="superscript"/>
         </w:rPr>
-        <w:footnoteReference w:id="61"/>
+        <w:footnoteReference w:id="62"/>
       </w:r>
       <w:r>
         <w:rPr>
@@ -1795,7 +1767,7 @@
           <w:rtl/>
           <w:vertAlign w:val="superscript"/>
         </w:rPr>
-        <w:footnoteReference w:id="62"/>
+        <w:footnoteReference w:id="63"/>
       </w:r>
       <w:r>
         <w:rPr>
@@ -1822,7 +1794,7 @@
           <w:sz w:val="24"/>
           <w:szCs w:val="24"/>
         </w:rPr>
-        <w:t xml:space="preserve">این طرحواره‌ها از خاطرات، هیجانات، شناخت‌واره‌ها و احساسات بدنی تشکیل شده‌اند و دارای هسته‌ای هیجانی قدرتمند و دردناک هستند؛ باورهای برآمده از آن‌ها اغلب عمیق، مطلق و ناهشیارند و فرد آن‌ها نه به عنوان یک تفسیر، بلکه به عنوان حقیقتی بدیهی دربارهٔ خود و جهان تجربه می‌کند (آرنتز و جیکوب</w:t>
+        <w:t xml:space="preserve">این طرحواره‌ها از خاطرات، هیجانات، شناخت‌واره‌ها و احساسات بدنی تشکیل شده‌اند و دارای هسته‌ای هیجانی قدرتمند و دردناک هستند؛ باورهای برآمده از آن‌ها اغلب عمیق، مطلق و ناهشیارند و فرد آن‌ها نه به عنوان یک تفسیر، بلکه به عنوان حقیقتی بدیهی درباره خود و جهان تجربه می‌کند (آرنتز و جیکوب</w:t>
       </w:r>
       <w:r>
         <w:rPr>
@@ -1830,7 +1802,7 @@
           <w:rtl/>
           <w:vertAlign w:val="superscript"/>
         </w:rPr>
-        <w:footnoteReference w:id="63"/>
+        <w:footnoteReference w:id="64"/>
       </w:r>
       <w:r>
         <w:rPr>
@@ -1865,7 +1837,7 @@
           <w:rtl/>
           <w:vertAlign w:val="superscript"/>
         </w:rPr>
-        <w:footnoteReference w:id="64"/>
+        <w:footnoteReference w:id="65"/>
       </w:r>
       <w:r>
         <w:rPr>
@@ -1883,17 +1855,17 @@
           <w:rtl/>
           <w:vertAlign w:val="superscript"/>
         </w:rPr>
-        <w:footnoteReference w:id="65"/>
-      </w:r>
-      <w:r>
-        <w:rPr>
-          <w:rFonts w:ascii="B Nazanin" w:hAnsi="B Nazanin" w:cs="B Nazanin" w:hint="cs"/>
-          <w:rtl/>
-          <w:lang w:bidi="fa-IR"/>
-          <w:sz w:val="24"/>
-          <w:szCs w:val="24"/>
-        </w:rPr>
-        <w:t xml:space="preserve">، ۲۰۱۱). انتقال این شواهد به بافت بازارهای مالی تصویر روشنی ترسیم می‌کند: معامله‌گری که طرحواره‌های فعال در این حوزه‌ها را همراه دارد، در شرایط فشار بازار بیشتر مستعد ورود به معاملات کنترل‌نشده و بی‌اعتنایی به قواعد مدیریت ریسک است؛ هرچند آزمون دقیق این پیوند در جامعهٔ معامله‌گران بازارهای مالی همچنان از شکاف‌های کمتر بررسی‌شدهٔ ادبیات محسوب می‌شود.</w:t>
+        <w:footnoteReference w:id="66"/>
+      </w:r>
+      <w:r>
+        <w:rPr>
+          <w:rFonts w:ascii="B Nazanin" w:hAnsi="B Nazanin" w:cs="B Nazanin" w:hint="cs"/>
+          <w:rtl/>
+          <w:lang w:bidi="fa-IR"/>
+          <w:sz w:val="24"/>
+          <w:szCs w:val="24"/>
+        </w:rPr>
+        <w:t xml:space="preserve">، ۲۰۱۱). انتقال این شواهد به بافت بازارهای مالی تصویر روشنی ترسیم می‌کند: معامله‌گری که طرحواره‌های فعال در این حوزه‌ها را همراه دارد، در شرایط فشار بازار بیشتر مستعد ورود به معاملات کنترل‌نشده و بی‌اعتنایی به قواعد مدیریت ریسک است؛ هرچند آزمون دقیق این پیوند در جامعه معامله‌گران بازارهای مالی همچنان از شکاف‌های کمتر بررسی‌شده ادبیات محسوب می‌شود.</w:t>
       </w:r>
     </w:p>
     <w:p>
@@ -1910,7 +1882,7 @@
           <w:sz w:val="24"/>
           <w:szCs w:val="24"/>
         </w:rPr>
-        <w:t xml:space="preserve">در میان طرحواره‌های مرتبط با رفتار معاملاتی، طرحوارهٔ «خویشتن‌داری/خودانضباطی ناکافی» از جایگاه ویژه‌ای برخوردار است؛ ویژگی اصلی این طرحواره، دشواری در تحمل ناکامی، کنترل تکانه و ناتوانی در به تعویق انداختن لذت است (یانگ و همکاران، ۲۰۰۳). معامله‌گر دارای این طرحواره ممکن است دانش کافی دربارهٔ اصول مدیریت ریسک داشته باشد، اما در لحظات فشار بازار نتواند به آن اصول پایبند بماند؛ زیرا زیربنای روانشناختی پایبندی به قواعد — یعنی بازداری تکانه و تحمل ناراحتی کوتاه‌مدت — در او آسیب‌پذیر است. بنابراین عدم پایبندی به استراتژی معاملاتی از پیش تعیین‌شده و ورود به معاملات پرریسک فراتر از ظرفیت، لزوماً یک کاستی آموزشی نیست؛ این رفتار می‌تواند تجلی رفتاری یک طرحوارهٔ عمیق باشد (یانگ و همکاران، ۲۰۰۳).</w:t>
+        <w:t xml:space="preserve">در میان طرحواره‌های مرتبط با رفتار معاملاتی، طرحواره «خویشتن‌داری/خودانضباطی ناکافی» از جایگاه ویژه‌ای برخوردار است؛ ویژگی اصلی این طرحواره، دشواری در تحمل ناکامی، کنترل تکانه و ناتوانی در به تعویق انداختن لذت است (یانگ و همکاران، ۲۰۰۳). معامله‌گر دارای این طرحواره ممکن است دانش کافی درباره اصول مدیریت ریسک داشته باشد، اما در لحظات فشار بازار نتواند به آن اصول پایبند بماند؛ زیرا زیربنای روانشناختی پایبندی به قواعد — یعنی بازداری تکانه و تحمل ناراحتی کوتاه‌مدت — در او آسیب‌پذیر است. بنابراین عدم پایبندی به استراتژی معاملاتی از پیش تعیین‌شده و ورود به معاملات پرریسک فراتر از ظرفیت، لزوماً یک کاستی آموزشی نیست؛ این رفتار می‌تواند تجلی رفتاری یک طرحواره عمیق باشد (یانگ و همکاران، ۲۰۰۳).</w:t>
       </w:r>
     </w:p>
     <w:p>
@@ -1935,7 +1907,7 @@
           <w:rtl/>
           <w:vertAlign w:val="superscript"/>
         </w:rPr>
-        <w:footnoteReference w:id="66"/>
+        <w:footnoteReference w:id="67"/>
       </w:r>
       <w:r>
         <w:rPr>
@@ -1971,7 +1943,7 @@
           <w:rtl/>
           <w:vertAlign w:val="superscript"/>
         </w:rPr>
-        <w:footnoteReference w:id="67"/>
+        <w:footnoteReference w:id="68"/>
       </w:r>
       <w:r>
         <w:rPr>
@@ -2007,7 +1979,7 @@
           <w:rtl/>
           <w:vertAlign w:val="superscript"/>
         </w:rPr>
-        <w:footnoteReference w:id="68"/>
+        <w:footnoteReference w:id="69"/>
       </w:r>
       <w:r>
         <w:rPr>
@@ -2043,7 +2015,7 @@
           <w:rtl/>
           <w:vertAlign w:val="superscript"/>
         </w:rPr>
-        <w:footnoteReference w:id="69"/>
+        <w:footnoteReference w:id="70"/>
       </w:r>
       <w:r>
         <w:rPr>
@@ -2070,7 +2042,7 @@
           <w:sz w:val="24"/>
           <w:szCs w:val="24"/>
         </w:rPr>
-        <w:t xml:space="preserve">برای هر یک از این ابعاد، شواهد تجربی پشتوانه‌ای قابل توجه وجود دارد. در بُعد معامله‌گری بیش از حد، پژوهش کلاسیک باربر و اودین (۲۰۰۰) نشان داد که معامله‌گران فردی به دلیل سوگیری بیش‌اطمینانی و تحمل هزینه‌های معاملاتی بالا، بازدهی به‌طور معناداری پایین‌تر از میانگین بازار کسب می‌کنند؛ در اینجا، حجم بالای معاملات نه یک ضرورت اطلاعاتی، بلکه رفتاری روانشناختی و پرهزینه است. در بُعد اثر گرایش نیز سرمایه‌گذاران تحت تأثیر نقطهٔ مرجع و زیان‌گریزی مطرح‌شده در نظریهٔ چشم‌انداز، تمایل دارند سهام سودده خود را زودهنگام بفروشند تا لذت شناسایی سود را تجربه کنند، اما سهام زیان‌ده را برای اجتناب از درد تحقق زیان، نگه دارند (شفرین و استاتمن، ۱۹۸۵)؛ الگویی که در بلندمدت بازدهی سبد را کاهش می‌دهد.</w:t>
+        <w:t xml:space="preserve">برای هر یک از این ابعاد، شواهد تجربی پشتوانه‌ای قابل توجه وجود دارد. در بُعد معامله‌گری بیش از حد، پژوهش کلاسیک باربر و اودین (۲۰۰۰) نشان داد که معامله‌گران فردی به دلیل سوگیری بیش‌اطمینانی و تحمل هزینه‌های معاملاتی بالا، بازدهی به‌طور معناداری پایین‌تر از میانگین بازار کسب می‌کنند؛ در اینجا، حجم بالای معاملات نه یک ضرورت اطلاعاتی، بلکه رفتاری روانشناختی و پرهزینه است. در بُعد اثر گرایش نیز سرمایه‌گذاران تحت تأثیر نقطه مرجع و زیان‌گریزی مطرح‌شده در نظریه چشم‌انداز، تمایل دارند سهام سودده خود را زودهنگام بفروشند تا لذت شناسایی سود را تجربه کنند، اما سهام زیان‌ده را برای اجتناب از درد تحقق زیان، نگه دارند (شفرین و استاتمن، ۱۹۸۵)؛ الگویی که در بلندمدت بازدهی سبد را کاهش می‌دهد.</w:t>
       </w:r>
     </w:p>
     <w:p>
@@ -2087,13 +2059,14 @@
           <w:sz w:val="24"/>
           <w:szCs w:val="24"/>
         </w:rPr>
-        <w:t xml:space="preserve">در بُعد رفتار گله‌ای، شواهد نشان می‌دهند که این پدیده به ویژه در شرایط استرس بازار و نوسانات بالا تشدید می‌شود؛ در چنین شرایطی، افراد رفتار دیگران را منبع اطلاعات تلقی کرده و به تقلید اجتماعی روی می‌آورند؛ فرآیندی که می‌تواند به شکل‌گیری حباب‌های قیمتی کاذب و سقوط‌های ناگهانی منجر شود (هوانگ و سالمون، ۲۰۰۴). در بُعد تمرکز ناکافی سبد دارایی نیز سرمایه‌گذاران به دلیل سوگیری‌هایی مانند تمایل به آشنایی، سرمایهٔ خود را در مجموعهٔ محدودی از دارایی‌ها متمرکز می‌کنند و خود را در معرض ریسک‌های غیرمتنوع‌شده قرار می‌دهند (گوتزمن و کومار، ۲۰۰۸). مجموع این چهار بُعد، هستهٔ اصلی سازهٔ «رفتارهای مالی پرخطر» را در پژوهش حاضر تشکیل می‌دهد و چارچوب سنجش آن را نیز تعیین می‌کند.</w:t>
+        <w:t xml:space="preserve">در بُعد رفتار گله‌ای، شواهد نشان می‌دهند که این پدیده به ویژه در شرایط استرس بازار و نوسانات بالا تشدید می‌شود؛ در چنین شرایطی، افراد رفتار دیگران را منبع اطلاعات تلقی کرده و به تقلید اجتماعی روی می‌آورند؛ فرآیندی که می‌تواند به شکل‌گیری حباب‌های قیمتی کاذب و سقوط‌های ناگهانی منجر شود (هوانگ و سالمون، ۲۰۰۴). در بُعد تمرکز ناکافی سبد دارایی نیز سرمایه‌گذاران به دلیل سوگیری‌هایی مانند تمایل به آشنایی، سرمایه خود را در مجموعه محدودی از دارایی‌ها متمرکز می‌کنند و خود را در معرض ریسک‌های غیرمتنوع‌شده قرار می‌دهند (گوتزمن و کومار، ۲۰۰۸). مجموع این چهار بُعد، هسته اصلی سازه «رفتارهای مالی پرخطر» را در پژوهش حاضر تشکیل می‌دهد و چارچوب سنجش آن را نیز تعیین می‌کند.</w:t>
       </w:r>
     </w:p>
     <w:p>
       <w:pPr>
         <w:pStyle w:val="Heading3"/>
         <w:bidi w:val="1"/>
+        <w:jc w:val="right"/>
       </w:pPr>
       <w:r>
         <w:rPr>
@@ -2122,7 +2095,7 @@
           <w:sz w:val="24"/>
           <w:szCs w:val="24"/>
         </w:rPr>
-        <w:t xml:space="preserve">با وجود این شواهد، یک شکاف تبیینی آشکار در ادبیات علمی وجود دارد. اغلب مطالعات به بررسی روابط دوجانبه پرداخته‌اند، اما سازوکار روانشناختی که نشان دهد چگونه یک ویژگی شخصیتی پایدار مانند اضطراب صفتی، از طریق یک فیلتر شناختی عمیق مانند طرحواره‌های ناسازگار اولیه، به رفتارهای مالی مشخص تبدیل می‌شود — به‌ویژه در جامعهٔ معامله‌گران — به ندرت مورد بررسی قرار گرفته است. پژوهش حاضر برای پر کردن همین شکاف، مدل میانجی‌گری را بر پایهٔ مدل استعداد-استرس </w:t>
+        <w:t xml:space="preserve">با وجود این شواهد، یک شکاف تبیینی آشکار در ادبیات علمی وجود دارد. اغلب مطالعات به بررسی روابط دوجانبه پرداخته‌اند، اما سازوکار روانشناختی که نشان دهد چگونه یک ویژگی شخصیتی پایدار مانند اضطراب صفتی، از طریق یک فیلتر شناختی عمیق مانند طرحواره‌های ناسازگار اولیه، به رفتارهای مالی مشخص تبدیل می‌شود — به‌ویژه در جامعه معامله‌گران — به ندرت مورد بررسی قرار گرفته است. پژوهش حاضر برای پر کردن همین شکاف، مدل میانجی‌گری را بر پایه مدل استعداد-استرس </w:t>
       </w:r>
       <w:r>
         <w:rPr>
@@ -2148,17 +2121,17 @@
           <w:rtl/>
           <w:vertAlign w:val="superscript"/>
         </w:rPr>
-        <w:footnoteReference w:id="70"/>
-      </w:r>
-      <w:r>
-        <w:rPr>
-          <w:rFonts w:ascii="B Nazanin" w:hAnsi="B Nazanin" w:cs="B Nazanin" w:hint="cs"/>
-          <w:rtl/>
-          <w:lang w:bidi="fa-IR"/>
-          <w:sz w:val="24"/>
-          <w:szCs w:val="24"/>
-        </w:rPr>
-        <w:t xml:space="preserve">، ۱۹۹۹) پیشنهاد می‌کند؛ مدلی که در آن اضطراب صفتی به‌عنوان استعداد آسیب‌پذیری، در تعامل با استرس‌های بازار فعال شده و از مجرای فعال‌سازی طرحواره‌ها، رفتار مالی نهایی را هدایت می‌کند. مسئلهٔ اصلی پژوهش نیز همین است: تبیین و آزمون تجربی همین نقش میانجی‌گر.</w:t>
+        <w:footnoteReference w:id="71"/>
+      </w:r>
+      <w:r>
+        <w:rPr>
+          <w:rFonts w:ascii="B Nazanin" w:hAnsi="B Nazanin" w:cs="B Nazanin" w:hint="cs"/>
+          <w:rtl/>
+          <w:lang w:bidi="fa-IR"/>
+          <w:sz w:val="24"/>
+          <w:szCs w:val="24"/>
+        </w:rPr>
+        <w:t xml:space="preserve">، ۱۹۹۹) پیشنهاد می‌کند؛ مدلی که در آن اضطراب صفتی به‌عنوان استعداد آسیب‌پذیری، در تعامل با استرس‌های بازار فعال شده و از مجرای فعال‌سازی طرحواره‌ها، رفتار مالی نهایی را هدایت می‌کند. مسئله اصلی پژوهش نیز همین است: تبیین و آزمون تجربی همین نقش میانجی‌گر.</w:t>
       </w:r>
     </w:p>
     <w:p>
@@ -2175,7 +2148,7 @@
           <w:sz w:val="24"/>
           <w:szCs w:val="24"/>
         </w:rPr>
-        <w:t xml:space="preserve">برای تبیین این تبدیل، پژوهش حاضر به منطق مدل استعداد-استرس تکیه می‌کند (زاکرمن، ۱۹۹۹). بر اساس این مدل، اضطراب صفتی به عنوان یک آسیب‌پذیری پایدار، لزوماً به تنهایی و به طور مستقیم به رفتار مالی پرخطر نمی‌انجامد؛ بلکه استرس‌های بازار — نوسانات شدید، زیان‌های سنگین یا فشار تصمیم‌گیری‌های شتاب‌زده — این استعداد را فعال می‌کنند و طرحواره‌های ناسازگار فرد را از حالت خفته به حالت فعال درمی‌آورند. در این لحظه، طرحواره‌های فعال‌شده هستند که تفسیر معامله‌گر از موقعیت را شکل داده و از طریق سبک‌های مقابله‌ای ناسازگار — نظیر تسلیم در برابر طرحواره یا جبران افراطی — رفتار مالی نهایی را هدایت می‌کنند. به این ترتیب، طرحواره حلقهٔ گمشدهٔ زنجیرهٔ تبدیل هیجان به عمل در بازارهای مالی محسوب می‌شود.</w:t>
+        <w:t xml:space="preserve">برای تبیین این تبدیل، پژوهش حاضر به منطق مدل استعداد-استرس تکیه می‌کند (زاکرمن، ۱۹۹۹). بر اساس این مدل، اضطراب صفتی به عنوان یک آسیب‌پذیری پایدار، لزوماً به تنهایی و به طور مستقیم به رفتار مالی پرخطر نمی‌انجامد؛ بلکه استرس‌های بازار — نوسانات شدید، زیان‌های سنگین یا فشار تصمیم‌گیری‌های شتاب‌زده — این استعداد را فعال می‌کنند و طرحواره‌های ناسازگار فرد را از حالت خفته به حالت فعال درمی‌آورند. در این لحظه، طرحواره‌های فعال‌شده هستند که تفسیر معامله‌گر از موقعیت را شکل داده و از طریق سبک‌های مقابله‌ای ناسازگار — نظیر تسلیم در برابر طرحواره یا جبران افراطی — رفتار مالی نهایی را هدایت می‌کنند. به این ترتیب، طرحواره حلقه گمشده زنجیره تبدیل هیجان به عمل در بازارهای مالی محسوب می‌شود.</w:t>
       </w:r>
     </w:p>
     <w:p>
@@ -2192,13 +2165,14 @@
           <w:sz w:val="24"/>
           <w:szCs w:val="24"/>
         </w:rPr>
-        <w:t xml:space="preserve">تمرکز بر جامعهٔ معامله‌گران بازارهای مالی نیز مبتنی بر یک ضرورت روش‌شناختی است: این افراد برخلاف جمعیت عمومی، به طور مداوم در موقعیت تصمیم‌گیری مالی واقعی با پیامدهای عینی و قابل اندازه‌گیری قرار دارند و واکنش‌های رفتاری آن‌ها به استرس، در بافتی واقعی قابل مطالعه است. آزمون تجربی مدل میانجی‌گری در این جامعه، نه تنها امکان ارزیابی مکانیسم نظری پیشنهادی را فراهم می‌آورد، بلکه می‌تواند مبنایی شواهد‌محور برای طراحی مداخلات روانشناختی ویژهٔ همین گروه ایجاد کند. از این رو، مسئلهٔ پژوهش حاضر از سطح توصیف همبستگی‌ها فراتر رفته و به دنبال پاسخ به پرسش تبیینی «چگونه و از طریق چه فرآیندی» است؛ پرسشی که پاسخ آن، در گسترش ادبیات روانشناسی مالی و ارتقای سلامت مالی معامله‌گران سهمی مستقیم خواهد داشت.</w:t>
+        <w:t xml:space="preserve">تمرکز بر جامعه معامله‌گران بازارهای مالی نیز مبتنی بر یک ضرورت روش‌شناختی است: این افراد برخلاف جمعیت عمومی، به طور مداوم در موقعیت تصمیم‌گیری مالی واقعی با پیامدهای عینی و قابل اندازه‌گیری قرار دارند و واکنش‌های رفتاری آن‌ها به استرس، در بافتی واقعی قابل مطالعه است. آزمون تجربی مدل میانجی‌گری در این جامعه، نه تنها امکان ارزیابی مکانیسم نظری پیشنهادی را فراهم می‌آورد، بلکه می‌تواند مبنایی شواهد‌محور برای طراحی مداخلات روانشناختی ویژه همین گروه ایجاد کند. از این رو، مسئله پژوهش حاضر از سطح توصیف همبستگی‌ها فراتر رفته و به دنبال پاسخ به پرسش تبیینی «چگونه و از طریق چه فرآیندی» است؛ پرسشی که پاسخ آن، در گسترش ادبیات روانشناسی مالی و ارتقای سلامت مالی معامله‌گران سهمی مستقیم خواهد داشت.</w:t>
       </w:r>
     </w:p>
     <w:p>
       <w:pPr>
         <w:pStyle w:val="Heading2"/>
         <w:bidi w:val="1"/>
+        <w:jc w:val="right"/>
       </w:pPr>
       <w:r>
         <w:rPr>
@@ -2217,6 +2191,7 @@
       <w:pPr>
         <w:pStyle w:val="Heading3"/>
         <w:bidi w:val="1"/>
+        <w:jc w:val="right"/>
       </w:pPr>
       <w:r>
         <w:rPr>
@@ -2270,7 +2245,7 @@
           <w:rtl/>
           <w:vertAlign w:val="superscript"/>
         </w:rPr>
-        <w:footnoteReference w:id="71"/>
+        <w:footnoteReference w:id="72"/>
       </w:r>
       <w:r>
         <w:rPr>
@@ -2331,13 +2306,14 @@
           <w:sz w:val="24"/>
           <w:szCs w:val="24"/>
         </w:rPr>
-        <w:t xml:space="preserve">از منظر دیگر، پژوهش حاضر پاسخی است به ضرورت همگرایی میان روانشناسی بالینی و اقتصاد مالی؛ همگرایی‌ای که پیشگامان اقتصاد رفتاری بر آن تأکید دارند، زیرا انحراف‌های نظام‌مند تصمیم‌گیری انسان نه خطاهایی گذرا، بلکه الگوهایی ریشه‌دار در شخصیت و شناخت او هستند (تیلر، ۲۰۱۶). وارد کردن سازه‌های عمیق بالینی، مانند طرحواره‌های ناسازگار اولیه، به تبیین این الگوها می‌تواند افق تازه‌ای در فهم رفتار مالی بگشاید و پایهٔ تجربی لازم برای طراحی مداخلاتی را فراهم آورد که تاکنون عمدتاً به شکل آموزش‌های عمومی ارائه شده‌اند.</w:t>
+        <w:t xml:space="preserve">از منظر دیگر، پژوهش حاضر پاسخی است به ضرورت همگرایی میان روانشناسی بالینی و اقتصاد مالی؛ همگرایی‌ای که پیشگامان اقتصاد رفتاری بر آن تأکید دارند، زیرا انحراف‌های نظام‌مند تصمیم‌گیری انسان نه خطاهایی گذرا، بلکه الگوهایی ریشه‌دار در شخصیت و شناخت او هستند (تیلر، ۲۰۱۶). وارد کردن سازه‌های عمیق بالینی، مانند طرحواره‌های ناسازگار اولیه، به تبیین این الگوها می‌تواند افق تازه‌ای در فهم رفتار مالی بگشاید و پایه تجربی لازم برای طراحی مداخلاتی را فراهم آورد که تاکنون عمدتاً به شکل آموزش‌های عمومی ارائه شده‌اند.</w:t>
       </w:r>
     </w:p>
     <w:p>
       <w:pPr>
         <w:pStyle w:val="Heading3"/>
         <w:bidi w:val="1"/>
+        <w:jc w:val="right"/>
       </w:pPr>
       <w:r>
         <w:rPr>
@@ -2408,7 +2384,7 @@
           <w:rtl/>
           <w:vertAlign w:val="superscript"/>
         </w:rPr>
-        <w:footnoteReference w:id="72"/>
+        <w:footnoteReference w:id="73"/>
       </w:r>
       <w:r>
         <w:rPr>
@@ -2476,6 +2452,7 @@
       <w:pPr>
         <w:pStyle w:val="Heading3"/>
         <w:bidi w:val="1"/>
+        <w:jc w:val="right"/>
       </w:pPr>
       <w:r>
         <w:rPr>
@@ -2589,13 +2566,14 @@
           <w:sz w:val="24"/>
           <w:szCs w:val="24"/>
         </w:rPr>
-        <w:t xml:space="preserve">نقش تقویت‌کنندهٔ رسانه‌های اجتماعی در این میان نباید نادیده گرفته شود. این رسانه‌ها با ایجاد جریان بی‌وقفه‌ای از محتوای مرتبط با سودهای دیگران، ترس از دست دادن فرصت را در سرمایه‌گذاران جوان تشدید کرده و آن‌ها را به تصمیمات هیجانی و بدون برنامه سوق می‌دهند (اور و شوماخر، ۲۰۲۳). از آنجا که شواهد موجود نشان می‌دهند نسل‌های جدید سرمایه‌گذار سطوح بالاتری از اضطراب را نسبت به نسل‌های پیشین تجربه می‌کنند (ماهاتو و همکاران، ۲۰۲۵)، تلاقی این دو عامل — اضطراب زمینه‌ای و محرک‌های رسانه‌ای — آسیب‌پذیری مضاعفی ایجاد می‌کند که طراحی مداخلات پیشگیرانهٔ روانشناختی ویژهٔ دوران دیجیتال را ضروری می‌سازد. شناخت دقیق این تلاقی، از جمله ابعاد کاربردی‌ای است که پژوهش حاضر می‌تواند به روشن شدن آن کمک کند.</w:t>
+        <w:t xml:space="preserve">نقش تقویت‌کننده رسانه‌های اجتماعی در این میان نباید نادیده گرفته شود. این رسانه‌ها با ایجاد جریان بی‌وقفه‌ای از محتوای مرتبط با سودهای دیگران، ترس از دست دادن فرصت را در سرمایه‌گذاران جوان تشدید کرده و آن‌ها را به تصمیمات هیجانی و بدون برنامه سوق می‌دهند (اور و شوماخر، ۲۰۲۳). از آنجا که شواهد موجود نشان می‌دهند نسل‌های جدید سرمایه‌گذار سطوح بالاتری از اضطراب را نسبت به نسل‌های پیشین تجربه می‌کنند (ماهاتو و همکاران، ۲۰۲۵)، تلاقی این دو عامل — اضطراب زمینه‌ای و محرک‌های رسانه‌ای — آسیب‌پذیری مضاعفی ایجاد می‌کند که طراحی مداخلات پیشگیرانه روانشناختی ویژه دوران دیجیتال را ضروری می‌سازد. شناخت دقیق این تلاقی، از جمله ابعاد کاربردی‌ای است که پژوهش حاضر می‌تواند به روشن شدن آن کمک کند.</w:t>
       </w:r>
     </w:p>
     <w:p>
       <w:pPr>
         <w:pStyle w:val="Heading3"/>
         <w:bidi w:val="1"/>
+        <w:jc w:val="right"/>
       </w:pPr>
       <w:r>
         <w:rPr>
@@ -2709,13 +2687,14 @@
           <w:sz w:val="24"/>
           <w:szCs w:val="24"/>
         </w:rPr>
-        <w:t xml:space="preserve">نکتهٔ دیگر در تبیین ضرورت این پژوهش در بافت ایران، ماهیت موجی ورود به بازارهای سرمایه است. در سال‌های اخیر، همزمان با هر تشدید فشار تورمی و نوسان ارزی، موج تازه‌ای از سرمایه‌گذاران خرد وارد بازار سرمایه شده‌اند که بسیاری از آن‌ها بدون آموزش تخصصی و آمادگی روانشناختی، با نوسانات بازار مواجه شده‌اند (بهدیو و همکاران، ۱۳۹۸). بار هیجانی برخاسته از این فرآیند، وقتی با رواج منابع اطلاعاتی غیررسمی و شایعات همراه می‌شود، به تشدید رفتار توده‌وار و شکل‌گیری حباب‌های قیمتی کاذب می‌انجامد (ستایش و همکاران، ۱۳۹۹). تداوم این چرخه بدون شناسایی علمی عوامل روانشناختی زمینه‌ساز، به معنای تکرار زیان‌های مالی گسترده است؛ از همین رو، پژوهش حاضر ضرورتی به‌موقع و فوری در بافت ایرانی محسوب می‌شود.</w:t>
+        <w:t xml:space="preserve">نکته دیگر در تبیین ضرورت این پژوهش در بافت ایران، ماهیت موجی ورود به بازارهای سرمایه است. در سال‌های اخیر، همزمان با هر تشدید فشار تورمی و نوسان ارزی، موج تازه‌ای از سرمایه‌گذاران خرد وارد بازار سرمایه شده‌اند که بسیاری از آن‌ها بدون آموزش تخصصی و آمادگی روانشناختی، با نوسانات بازار مواجه شده‌اند (بهدیو و همکاران، ۱۳۹۸). بار هیجانی برخاسته از این فرآیند، وقتی با رواج منابع اطلاعاتی غیررسمی و شایعات همراه می‌شود، به تشدید رفتار توده‌وار و شکل‌گیری حباب‌های قیمتی کاذب می‌انجامد (ستایش و همکاران، ۱۳۹۹). تداوم این چرخه بدون شناسایی علمی عوامل روانشناختی زمینه‌ساز، به معنای تکرار زیان‌های مالی گسترده است؛ از همین رو، پژوهش حاضر ضرورتی به‌موقع و فوری در بافت ایرانی محسوب می‌شود.</w:t>
       </w:r>
     </w:p>
     <w:p>
       <w:pPr>
         <w:pStyle w:val="Heading3"/>
         <w:bidi w:val="1"/>
+        <w:jc w:val="right"/>
       </w:pPr>
       <w:r>
         <w:rPr>
@@ -2761,13 +2740,14 @@
           <w:sz w:val="24"/>
           <w:szCs w:val="24"/>
         </w:rPr>
-        <w:t xml:space="preserve">مجموع ملاحظات نظری، کاربردی، اجتماعی و زمینه‌ای مطرح‌شده در این بخش، ضرورت اجرای پژوهش حاضر را از زوایای مکمل یکدیگر نشان می‌دهد. از منظر نظری، آزمون مدل میانجی‌گری پیشنهادی می‌تواند شکاف تبیینی موجود در ادبیات را پر کند و به درک چگونگی تبدیل یک ویژگی شخصیتی پایدار به رفتار مالی عینی بینجامد؛ از منظر کاربردی و اجتماعی نیز، یافته‌های آن می‌تواند پایه‌ای شواهد‌محور برای طراحی ابزارهای غربالگری، پروتکل‌های درمانی کوتاه‌مدت و ماژول‌های آموزشی روانشناسی معامله‌گری فراهم آورد؛ و در بافت بازارهای مالی ایران، این ضرورت به دلیل فشارهای تورمی مزمن و ورود موجی سرمایه‌گذاران فاقد آمادگی، فوریتی دوچندان می‌یابد. بر همین اساس، پژوهش حاضر با تمرکز بر نقش میانجی‌گر طرحواره‌های ناسازگار اولیه، در صدد است هم به پیشرفت دانش در این حوزه کمک کند و هم پاسخی عملی به نیازهای جامعهٔ معامله‌گران ارائه دهد.</w:t>
+        <w:t xml:space="preserve">مجموع ملاحظات نظری، کاربردی، اجتماعی و زمینه‌ای مطرح‌شده در این بخش، ضرورت اجرای پژوهش حاضر را از زوایای مکمل یکدیگر نشان می‌دهد. از منظر نظری، آزمون مدل میانجی‌گری پیشنهادی می‌تواند شکاف تبیینی موجود در ادبیات را پر کند و به درک چگونگی تبدیل یک ویژگی شخصیتی پایدار به رفتار مالی عینی بینجامد؛ از منظر کاربردی و اجتماعی نیز، یافته‌های آن می‌تواند پایه‌ای شواهد‌محور برای طراحی ابزارهای غربالگری، پروتکل‌های درمانی کوتاه‌مدت و ماژول‌های آموزشی روانشناسی معامله‌گری فراهم آورد؛ و در بافت بازارهای مالی ایران، این ضرورت به دلیل فشارهای تورمی مزمن و ورود موجی سرمایه‌گذاران فاقد آمادگی، فوریتی دوچندان می‌یابد. بر همین اساس، پژوهش حاضر با تمرکز بر نقش میانجی‌گر طرحواره‌های ناسازگار اولیه، در صدد است هم به پیشرفت دانش در این حوزه کمک کند و هم پاسخی عملی به نیازهای جامعه معامله‌گران ارائه دهد.</w:t>
       </w:r>
     </w:p>
     <w:p>
       <w:pPr>
         <w:pStyle w:val="Heading2"/>
         <w:bidi w:val="1"/>
+        <w:jc w:val="right"/>
       </w:pPr>
       <w:r>
         <w:rPr>
@@ -2796,13 +2776,14 @@
           <w:sz w:val="24"/>
           <w:szCs w:val="24"/>
         </w:rPr>
-        <w:t xml:space="preserve">اهداف پژوهش حاضر در راستای مدل مفهومی آن تدوین شده است؛ بر این اساس، هدف اصلی به نقش میانجی‌گر طرحواره‌های ناسازگار اولیه در رابطهٔ میان اضطراب صفتی و رفتارهای مالی پرخطر معطوف است و هر یک از اهداف فرعی نیز یکی از روابط دوجانبهٔ تشکیل‌دهندهٔ مسیرهای این مدل را هدف می‌گیرند.</w:t>
+        <w:t xml:space="preserve">اهداف پژوهش حاضر در راستای مدل مفهومی آن تدوین شده است؛ بر این اساس، هدف اصلی به نقش میانجی‌گر طرحواره‌های ناسازگار اولیه در رابطه میان اضطراب صفتی و رفتارهای مالی پرخطر معطوف است و هر یک از اهداف فرعی نیز یکی از روابط دوجانبه تشکیل‌دهنده مسیرهای این مدل را هدف می‌گیرند.</w:t>
       </w:r>
     </w:p>
     <w:p>
       <w:pPr>
         <w:pStyle w:val="Heading3"/>
         <w:bidi w:val="1"/>
+        <w:jc w:val="right"/>
       </w:pPr>
       <w:r>
         <w:rPr>
@@ -2838,6 +2819,7 @@
       <w:pPr>
         <w:pStyle w:val="Heading3"/>
         <w:bidi w:val="1"/>
+        <w:jc w:val="right"/>
       </w:pPr>
       <w:r>
         <w:rPr>
@@ -2907,6 +2889,7 @@
       <w:pPr>
         <w:pStyle w:val="Heading2"/>
         <w:bidi w:val="1"/>
+        <w:jc w:val="right"/>
       </w:pPr>
       <w:r>
         <w:rPr>
@@ -2935,7 +2918,7 @@
           <w:sz w:val="24"/>
           <w:szCs w:val="24"/>
         </w:rPr>
-        <w:t xml:space="preserve">فرضیه‌های پژوهش بر پایهٔ مدل میانجی‌گری سه‌متغیرهٔ پژوهش و در امتداد منطق مدل استعداد-استرس (زاکرمن، ۱۹۹۹) تدوین شده‌اند. در این مدل، اضطراب صفتی نقطهٔ آغاز، طرحواره‌های ناسازگار اولیه مجرای انتقال اثر اضطراب به رفتار، و رفتارهای مالی پرخطر پیامد نهایی فرآیند هستند. بر همین اساس، فرضیهٔ نخست نقش میانجی‌گر طرحواره‌ها را هدف می‌گیرد و سه فرضیهٔ پس از آن، روابط دوجانبهٔ تشکیل‌دهندهٔ مسیرهای مدل را می‌سنجند.</w:t>
+        <w:t xml:space="preserve">فرضیه‌های پژوهش بر پایه مدل میانجی‌گری سه‌متغیره پژوهش و در امتداد منطق مدل استعداد-استرس (زاکرمن، ۱۹۹۹) تدوین شده‌اند. در این مدل، اضطراب صفتی نقطه آغاز، طرحواره‌های ناسازگار اولیه مجرای انتقال اثر اضطراب به رفتار، و رفتارهای مالی پرخطر پیامد نهایی فرآیند هستند. بر همین اساس، فرضیه نخست نقش میانجی‌گر طرحواره‌ها را هدف می‌گیرد و سه فرضیه پس از آن، روابط دوجانبه تشکیل‌دهنده مسیرهای مدل را می‌سنجند.</w:t>
       </w:r>
     </w:p>
     <w:p>
@@ -3010,6 +2993,7 @@
       <w:pPr>
         <w:pStyle w:val="Heading2"/>
         <w:bidi w:val="1"/>
+        <w:jc w:val="right"/>
       </w:pPr>
       <w:r>
         <w:rPr>
@@ -3028,6 +3012,7 @@
       <w:pPr>
         <w:pStyle w:val="Heading3"/>
         <w:bidi w:val="1"/>
+        <w:jc w:val="right"/>
       </w:pPr>
       <w:r>
         <w:rPr>
@@ -3068,7 +3053,7 @@
           <w:sz w:val="24"/>
           <w:szCs w:val="24"/>
         </w:rPr>
-        <w:t xml:space="preserve"> اضطراب صفتی یک ویژگی شخصیتی پایدار است که تمایل فرد به درک موقعیت‌های مبهم یا چالش‌برانگیز به عنوان تهدیدآمیز و پاسخ به آن‌ها با اضطراب، تنش، نگرانی و برانگیختگی فیزیولوژیک شدیدتر را نشان می‌دهد. بر اساس نظریهٔ حالت-صفت اسپیلبرگر، اضطراب صفتی به یک سیستم هشدار روانیِ بیش‌فعال اشاره دارد که در طول زمان پایدار است و پایه‌ی پاسخ‌های اضطرابی (حالت اضطراب) فرد در موقعیت‌های مختلف را تشکیل می‌دهد (اسپیلبرگر، ۱۹۸۳).</w:t>
+        <w:t xml:space="preserve"> اضطراب صفتی یک ویژگی شخصیتی پایدار است که تمایل فرد به درک موقعیت‌های مبهم یا چالش‌برانگیز به عنوان تهدیدآمیز و پاسخ به آن‌ها با اضطراب، تنش، نگرانی و برانگیختگی فیزیولوژیک شدیدتر را نشان می‌دهد. بر اساس نظریه حالت-صفت اسپیلبرگر، اضطراب صفتی به یک سیستم هشدار روانیِ بیش‌فعال اشاره دارد که در طول زمان پایدار است و پایه‌ی پاسخ‌های اضطرابی (حالت اضطراب) فرد در موقعیت‌های مختلف را تشکیل می‌دهد (اسپیلبرگر، ۱۹۸۳).</w:t>
       </w:r>
     </w:p>
     <w:p>
@@ -3085,7 +3070,7 @@
           <w:sz w:val="24"/>
           <w:szCs w:val="24"/>
         </w:rPr>
-        <w:t xml:space="preserve">اضطراب صفتی در ادبیات روانشناسی بازارهای مالی از توجه ویژه‌ای برخوردار شده است؛ زیرا ویژگی‌ای پایدار و قابل سنجش است که مستقیماً با نحوهٔ پردازش عدم قطعیت و تهدید توسط فرد ارتباط دارد. شواهد نشان می‌دهند که افراد مضطرب به طور کلی به اجتناب از ریسک گرایش دارند و حتی در شرایطی که ارزش مورد انتظار گزینه‌ها یکسان است، گزینه‌های کم‌خطرتر را برمی‌گزینند؛ گرایشی که در رفتار مالی واقعی می‌تواند به شکل سبدهای محافظه‌کارانه یا اجتناب از تصمیم‌گیری نمود یابد (مانر و اشمیت</w:t>
+        <w:t xml:space="preserve">اضطراب صفتی در ادبیات روانشناسی بازارهای مالی از توجه ویژه‌ای برخوردار شده است؛ زیرا ویژگی‌ای پایدار و قابل سنجش است که مستقیماً با نحوه پردازش عدم قطعیت و تهدید توسط فرد ارتباط دارد. شواهد نشان می‌دهند که افراد مضطرب به طور کلی به اجتناب از ریسک گرایش دارند و حتی در شرایطی که ارزش مورد انتظار گزینه‌ها یکسان است، گزینه‌های کم‌خطرتر را برمی‌گزینند؛ گرایشی که در رفتار مالی واقعی می‌تواند به شکل سبدهای محافظه‌کارانه یا اجتناب از تصمیم‌گیری نمود یابد (مانر و اشمیت</w:t>
       </w:r>
       <w:r>
         <w:rPr>
@@ -3093,7 +3078,7 @@
           <w:rtl/>
           <w:vertAlign w:val="superscript"/>
         </w:rPr>
-        <w:footnoteReference w:id="73"/>
+        <w:footnoteReference w:id="74"/>
       </w:r>
       <w:r>
         <w:rPr>
@@ -3120,7 +3105,7 @@
           <w:sz w:val="24"/>
           <w:szCs w:val="24"/>
         </w:rPr>
-        <w:t xml:space="preserve">نکتهٔ مهم در فهم مفهومی این سازه، تمایز میان دو سطح «حالت» و «صفت» در نظریهٔ اسپیلبرگر است. اضطراب حالتی به واکنش هیجانی گذرا و وابسته به موقعیت اطلاق می‌شود که با تنش و برانگیختگی فیزیولوژیک همراه است و با رفع موقعیت فروکش می‌کند؛ اما اضطراب صفتی، تفاوت فردی پایداری در فراوانی و شدت تجربهٔ این حالت‌هاست و تعیین می‌کند که فرد با چه بسامدی در برابر عوامل استرس‌زا، واکنش اضطرابی نشان دهد (اسپیلبرگر، ۱۹۸۳). بر اساس این دیدگاه، معامله‌گر با اضطراب صفتی بالا، در مواجهه با نوسانات بازار، اپیزودهای مکررتر و شدیدتری از اضطراب حالتی را نسبت به دیگران تجربه می‌کند و در عمل، به طور مداوم با سطح پایه‌ای بالاتری از تنش روانی وارد فرآیند تصمیم‌گیری می‌شود؛ وضعیتی که تمام کارکردهای تحلیلی و رفتاری او را تحت تأثیر قرار می‌دهد.</w:t>
+        <w:t xml:space="preserve">نکته مهم در فهم مفهومی این سازه، تمایز میان دو سطح «حالت» و «صفت» در نظریه اسپیلبرگر است. اضطراب حالتی به واکنش هیجانی گذرا و وابسته به موقعیت اطلاق می‌شود که با تنش و برانگیختگی فیزیولوژیک همراه است و با رفع موقعیت فروکش می‌کند؛ اما اضطراب صفتی، تفاوت فردی پایداری در فراوانی و شدت تجربه این حالت‌هاست و تعیین می‌کند که فرد با چه بسامدی در برابر عوامل استرس‌زا، واکنش اضطرابی نشان دهد (اسپیلبرگر، ۱۹۸۳). بر اساس این دیدگاه، معامله‌گر با اضطراب صفتی بالا، در مواجهه با نوسانات بازار، اپیزودهای مکررتر و شدیدتری از اضطراب حالتی را نسبت به دیگران تجربه می‌کند و در عمل، به طور مداوم با سطح پایه‌ای بالاتری از تنش روانی وارد فرآیند تصمیم‌گیری می‌شود؛ وضعیتی که تمام کارکردهای تحلیلی و رفتاری او را تحت تأثیر قرار می‌دهد.</w:t>
       </w:r>
     </w:p>
     <w:p>
@@ -3186,13 +3171,14 @@
           <w:sz w:val="24"/>
           <w:szCs w:val="24"/>
         </w:rPr>
-        <w:t xml:space="preserve"> کسب می‌کند. نمرات بالاتر در این مقیاس، نشان‌دهنده سطح بالاتر اضطراب صفتی است. نمره‌گذاری گویه‌های این فرم بر اساس مقیاس ۴ درجه‌ای لیکرت (از ۱=تقریباً هرگز تا ۴=تقریباً همیشه) انجام می‌شود و دامنهٔ نمرهٔ کل بین ۲۰ تا ۸۰ است. پایایی درونی این ابزار در مطالعات متعدد با ضرایب آلفای کرونباخ بالا تأیید شده است (اسپیلبرگر، ۱۹۸۳) و در ایران نیز پژوهش بشارت و همکاران (۱۳۹۵) ساختار عاملی آن را در نمونه‌های ایرانی مجدداً تأیید کرده است؛ پایایی نسخهٔ فارسی این ابزار در پژوهش بشارت و همکاران (۱۳۹۵) با آلفای کرونباخ ۰٫۸۹ گزارش شده است.</w:t>
+        <w:t xml:space="preserve"> کسب می‌کند. نمرات بالاتر در این مقیاس، نشان‌دهنده سطح بالاتر اضطراب صفتی است. نمره‌گذاری گویه‌های این فرم بر اساس مقیاس ۴ درجه‌ای لیکرت (از ۱=تقریباً هرگز تا ۴=تقریباً همیشه) انجام می‌شود و دامنه نمره کل بین ۲۰ تا ۸۰ است. پایایی درونی این ابزار در مطالعات متعدد با ضرایب آلفای کرونباخ بالا تأیید شده است (اسپیلبرگر، ۱۹۸۳) و در ایران نیز پژوهش بشارت و همکاران (۱۳۹۵) ساختار عاملی آن را در نمونه‌های ایرانی مجدداً تأیید کرده است؛ پایایی نسخه فارسی این ابزار در پژوهش بشارت و همکاران (۱۳۹۵) با آلفای کرونباخ ۰٫۸۹ گزارش شده است.</w:t>
       </w:r>
     </w:p>
     <w:p>
       <w:pPr>
         <w:pStyle w:val="Heading3"/>
         <w:bidi w:val="1"/>
+        <w:jc w:val="right"/>
       </w:pPr>
       <w:r>
         <w:rPr>
@@ -3241,7 +3227,7 @@
           <w:rtl/>
           <w:vertAlign w:val="superscript"/>
         </w:rPr>
-        <w:footnoteReference w:id="74"/>
+        <w:footnoteReference w:id="75"/>
       </w:r>
       <w:r>
         <w:rPr>
@@ -3268,7 +3254,7 @@
           <w:sz w:val="24"/>
           <w:szCs w:val="24"/>
         </w:rPr>
-        <w:t xml:space="preserve">طرحواره‌های ناسازگار اولیه در حوزه‌هایی سازمان می‌یابند که هستهٔ مشترک آن‌ها ناکامی در ارضای نیازهای هیجانی بنیادین است؛ نیاز هایی مانند امنیت، دلبستگی، خودمختاری، پذیرش و محبت که هرگاه در محیط خانواده به طور مزمن برآورده نشوند، زمینه‌ساز شکل‌گیری طرحواره‌ها در حوزه‌هایی نظیر «بریدگی و طرد» و «محدودیت‌های مختل» می‌شوند (یانگ و همکاران، ۲۰۰۳). این طرحواره‌ها در بیشتر افراد، در حالت خفته باقی می‌مانند و در مواجهه با موقعیت‌های فعال‌ساز — به ویژه موقعیت‌های استرس‌زا و پرفشار — فعال می‌شوند؛ فعال‌سازی‌ای که ادراک، تفسیر و حافظهٔ فرد از موقعیت را رنگ‌آمیزی کرده و رفتار او را جهت می‌دهد (آرنتز و جیکوب، ۲۰۱۲). در بافت معامله‌گری، یک زیان مالی یا نوسان شدید می‌تواند نقش چنین فعال‌سازی را ایفا کند و به جای واکنش متوازن، واکنش‌های هیجانی و رفتاری طرحواره‌محور را برانگیزد.</w:t>
+        <w:t xml:space="preserve">طرحواره‌های ناسازگار اولیه در حوزه‌هایی سازمان می‌یابند که هسته مشترک آن‌ها ناکامی در ارضای نیازهای هیجانی بنیادین است؛ نیاز هایی مانند امنیت، دلبستگی، خودمختاری، پذیرش و محبت که هرگاه در محیط خانواده به طور مزمن برآورده نشوند، زمینه‌ساز شکل‌گیری طرحواره‌ها در حوزه‌هایی نظیر «بریدگی و طرد» و «محدودیت‌های مختل» می‌شوند (یانگ و همکاران، ۲۰۰۳). این طرحواره‌ها در بیشتر افراد، در حالت خفته باقی می‌مانند و در مواجهه با موقعیت‌های فعال‌ساز — به ویژه موقعیت‌های استرس‌زا و پرفشار — فعال می‌شوند؛ فعال‌سازی‌ای که ادراک، تفسیر و حافظه فرد از موقعیت را رنگ‌آمیزی کرده و رفتار او را جهت می‌دهد (آرنتز و جیکوب، ۲۰۱۲). در بافت معامله‌گری، یک زیان مالی یا نوسان شدید می‌تواند نقش چنین فعال‌سازی را ایفا کند و به جای واکنش متوازن، واکنش‌های هیجانی و رفتاری طرحواره‌محور را برانگیزد.</w:t>
       </w:r>
     </w:p>
     <w:p>
@@ -3315,7 +3301,7 @@
           <w:sz w:val="24"/>
           <w:szCs w:val="24"/>
         </w:rPr>
-        <w:t xml:space="preserve"> که دارای ۷۵ گویه و ۱۵ خرده‌مقیاس است، به دست می‌آورد. نمره‌گذاری گویه‌ها بر اساس مقیاس ۶ درجه‌ای لیکرت (از ۱=کاملاً دربارهٔ من نادرست است تا ۶=کاملاً مرا توصیف می‌کند) انجام می‌شود؛ برای هر طرحواره نمره‌ای بین ۵ تا ۳۰ به دست می‌آید و نمرهٔ بالاتر، نشان‌دهندهٔ شدت بیشتر آن طرحواره است (یانگ</w:t>
+        <w:t xml:space="preserve"> که دارای ۷۵ گویه و ۱۵ خرده‌مقیاس است، به دست می‌آورد. نمره‌گذاری گویه‌ها بر اساس مقیاس ۶ درجه‌ای لیکرت (از ۱=کاملاً درباره من نادرست است تا ۶=کاملاً مرا توصیف می‌کند) انجام می‌شود؛ برای هر طرحواره نمره‌ای بین ۵ تا ۳۰ به دست می‌آید و نمره بالاتر، نشان‌دهنده شدت بیشتر آن طرحواره است (یانگ</w:t>
       </w:r>
       <w:r>
         <w:rPr>
@@ -3323,23 +3309,24 @@
           <w:rtl/>
           <w:vertAlign w:val="superscript"/>
         </w:rPr>
-        <w:footnoteReference w:id="75"/>
-      </w:r>
-      <w:r>
-        <w:rPr>
-          <w:rFonts w:ascii="B Nazanin" w:hAnsi="B Nazanin" w:cs="B Nazanin" w:hint="cs"/>
-          <w:rtl/>
-          <w:lang w:bidi="fa-IR"/>
-          <w:sz w:val="24"/>
-          <w:szCs w:val="24"/>
-        </w:rPr>
-        <w:t xml:space="preserve">، ۱۹۹۸). پایایی نسخهٔ فارسی این پرسشنامه در پژوهش یوسفی (۱۳۹۶) با ضرایب آلفای ۰٫۶۸ تا ۰٫۸۵ برای خرده‌مقیاس‌ها گزارش شده و روایی سازهٔ آن در نمونهٔ غیربالینی قابل قبول بوده است (یوسفی، ۱۳۹۶).</w:t>
+        <w:footnoteReference w:id="76"/>
+      </w:r>
+      <w:r>
+        <w:rPr>
+          <w:rFonts w:ascii="B Nazanin" w:hAnsi="B Nazanin" w:cs="B Nazanin" w:hint="cs"/>
+          <w:rtl/>
+          <w:lang w:bidi="fa-IR"/>
+          <w:sz w:val="24"/>
+          <w:szCs w:val="24"/>
+        </w:rPr>
+        <w:t xml:space="preserve">، ۱۹۹۸). پایایی نسخه فارسی این پرسشنامه در پژوهش یوسفی (۱۳۹۶) با ضرایب آلفای ۰٫۶۸ تا ۰٫۸۵ برای خرده‌مقیاس‌ها گزارش شده و روایی سازه آن در نمونه غیربالینی قابل قبول بوده است (یوسفی، ۱۳۹۶).</w:t>
       </w:r>
     </w:p>
     <w:p>
       <w:pPr>
         <w:pStyle w:val="Heading3"/>
         <w:bidi w:val="1"/>
+        <w:jc w:val="right"/>
       </w:pPr>
       <w:r>
         <w:rPr>
@@ -3397,7 +3384,7 @@
           <w:sz w:val="24"/>
           <w:szCs w:val="24"/>
         </w:rPr>
-        <w:t xml:space="preserve">در ادبیات مالی رفتاری، سازهٔ رفتارهای مالی پرخطر با چهار بُعد اصلی شناسایی و سنجیده می‌شود: «معامله‌گری بیش از حد» که به انجام معاملات فراتر از ضرورت اطلاعاتی و برخاسته از بیش‌اطمینانی اشاره دارد؛ «اثر گرایش» که تمایل به فروش زودهنگام دارایی‌های سودده و نگهداری طولانی‌مدت دارایی‌های زیان‌ده است؛ «رفتار گله‌ای» که تقلید از دیگر معامله‌گران به جای اتکا بر تحلیل شخصی، به ویژه در شرایط پرنوسان، محسوب می‌شود؛ و «تمرکز ناکافی سبد دارایی» که از سوگیری‌هایی مانند تمایل به آشنایی نشأت می‌گیرد (بیکر و نوفسینگر، ۲۰۱۰؛ باربر و اودین، ۲۰۰۰؛ شفرین و استاتمن، ۱۹۸۵؛ هوانگ و سالمون، ۲۰۰۴؛ گوتزمن و کومار، ۲۰۰۸). در پژوهش حاضر، این مجموعه از ابعاد در قالب سازهٔ تحمل ریسک مالی اندازه‌گیری می‌شود.</w:t>
+        <w:t xml:space="preserve">در ادبیات مالی رفتاری، سازه رفتارهای مالی پرخطر با چهار بُعد اصلی شناسایی و سنجیده می‌شود: «معامله‌گری بیش از حد» که به انجام معاملات فراتر از ضرورت اطلاعاتی و برخاسته از بیش‌اطمینانی اشاره دارد؛ «اثر گرایش» که تمایل به فروش زودهنگام دارایی‌های سودده و نگهداری طولانی‌مدت دارایی‌های زیان‌ده است؛ «رفتار گله‌ای» که تقلید از دیگر معامله‌گران به جای اتکا بر تحلیل شخصی، به ویژه در شرایط پرنوسان، محسوب می‌شود؛ و «تمرکز ناکافی سبد دارایی» که از سوگیری‌هایی مانند تمایل به آشنایی نشأت می‌گیرد (بیکر و نوفسینگر، ۲۰۱۰؛ باربر و اودین، ۲۰۰۰؛ شفرین و استاتمن، ۱۹۸۵؛ هوانگ و سالمون، ۲۰۰۴؛ گوتزمن و کومار، ۲۰۰۸). در پژوهش حاضر، این مجموعه از ابعاد در قالب سازه تحمل ریسک مالی اندازه‌گیری می‌شود.</w:t>
       </w:r>
     </w:p>
     <w:p>
@@ -3432,7 +3419,7 @@
           <w:sz w:val="24"/>
           <w:szCs w:val="24"/>
         </w:rPr>
-        <w:t xml:space="preserve"> به بیشینهٔ سطح عدم قطعیتی اطلاق می‌شود که یک سرمایه‌گذار در اتخاذ تصمیم‌های مالی مایل به پذیرش آن است و میزان آمادگی روانشناختی فرد برای مواجهه با پیامدهای نامطلوب احتمالی را منعکس می‌کند. در این تعریف، تفکیک میان ظرفیت عینی ریسک — که به منابع و شرایط اقتصادی فرد بستگی دارد — و تحمل ذهنی ریسک — که ویژگی‌ای ادراکی و شخصیتی است — اهمیت بنیادین دارد؛ ناهماهنگی میان این دو سطح، به‌ویژه زمانی که تحمل ذهنی از ظرفیت عینی فراتر رود، یکی از زمینه‌های اصلی تصمیم‌های مالی آسیب‌زا محسوب می‌شود (گرابل و لایتون</w:t>
+        <w:t xml:space="preserve"> به بیشینه سطح عدم قطعیتی اطلاق می‌شود که یک سرمایه‌گذار در اتخاذ تصمیم‌های مالی مایل به پذیرش آن است و میزان آمادگی روانشناختی فرد برای مواجهه با پیامدهای نامطلوب احتمالی را منعکس می‌کند. در این تعریف، تفکیک میان ظرفیت عینی ریسک — که به منابع و شرایط اقتصادی فرد بستگی دارد — و تحمل ذهنی ریسک — که ویژگی‌ای ادراکی و شخصیتی است — اهمیت بنیادین دارد؛ ناهماهنگی میان این دو سطح، به‌ویژه زمانی که تحمل ذهنی از ظرفیت عینی فراتر رود، یکی از زمینه‌های اصلی تصمیم‌های مالی آسیب‌زا محسوب می‌شود (گرابل و لایتون</w:t>
       </w:r>
       <w:r>
         <w:rPr>
@@ -3440,17 +3427,17 @@
           <w:rtl/>
           <w:vertAlign w:val="superscript"/>
         </w:rPr>
-        <w:footnoteReference w:id="76"/>
-      </w:r>
-      <w:r>
-        <w:rPr>
-          <w:rFonts w:ascii="B Nazanin" w:hAnsi="B Nazanin" w:cs="B Nazanin" w:hint="cs"/>
-          <w:rtl/>
-          <w:lang w:bidi="fa-IR"/>
-          <w:sz w:val="24"/>
-          <w:szCs w:val="24"/>
-        </w:rPr>
-        <w:t xml:space="preserve">، ۱۹۹۹). البته اگرچه تحمل ریسک یک نگرش و رفتار پرخطر یک عمل است، شواهد گستردهٔ پژوهشی از روایی پیش‌بین بالای این مقیاس برای رفتار واقعی مالی حمایت می‌کنند؛ از این رو، مقیاس یادشده شاخص نیابتی قابل اعتمادی برای سنجش تمایل به رفتارهای مالی پرخطر به شمار می‌رود (گرابل</w:t>
+        <w:footnoteReference w:id="77"/>
+      </w:r>
+      <w:r>
+        <w:rPr>
+          <w:rFonts w:ascii="B Nazanin" w:hAnsi="B Nazanin" w:cs="B Nazanin" w:hint="cs"/>
+          <w:rtl/>
+          <w:lang w:bidi="fa-IR"/>
+          <w:sz w:val="24"/>
+          <w:szCs w:val="24"/>
+        </w:rPr>
+        <w:t xml:space="preserve">، ۱۹۹۹). البته اگرچه تحمل ریسک یک نگرش و رفتار پرخطر یک عمل است، شواهد گسترده پژوهشی از روایی پیش‌بین بالای این مقیاس برای رفتار واقعی مالی حمایت می‌کنند؛ از این رو، مقیاس یادشده شاخص نیابتی قابل اعتمادی برای سنجش تمایل به رفتارهای مالی پرخطر به شمار می‌رود (گرابل</w:t>
       </w:r>
       <w:r>
         <w:rPr>
@@ -3458,7 +3445,7 @@
           <w:rtl/>
           <w:vertAlign w:val="superscript"/>
         </w:rPr>
-        <w:footnoteReference w:id="77"/>
+        <w:footnoteReference w:id="78"/>
       </w:r>
       <w:r>
         <w:rPr>
@@ -3497,13 +3484,14 @@
           <w:sz w:val="24"/>
           <w:szCs w:val="24"/>
         </w:rPr>
-        <w:t xml:space="preserve"> در این پژوهش، منظور از رفتارهای مالی پرخطر، نمره‌ای است که آزمودنی از مقیاس ۱۳ سوالی تحمل ریسک مالی گرابل و لایتون (۱۹۹۹) کسب می‌کند. نمرات بالاتر در این مقیاس، نشان‌دهنده تمایل بیشتر به پذیرش ریسک و در نتیجه، بروز بیشتر رفتارهای مالی پرخطر است. نمرهٔ کل این مقیاس بین ۱۳ تا ۴۵ محاسبه می‌شود. روایی پیش‌بین بالای این مقیاس برای رفتار مالی واقعی در پژوهش‌های متعدد تأیید شده است (گرابل، ۲۰۱۷) و در ایران نیز توسط طالبی و همکاران (۱۳۹۸) بر روی نمونه‌ای از سرمایه‌گذاران بورس تهران اعتباریابی شده است؛ در همین هنجاریابی، پایایی مقیاس با آلفای کرونباخ ۰٫۷۹ گزارش و ساختار عاملی آن نیز تأیید شده است.</w:t>
+        <w:t xml:space="preserve"> در این پژوهش، منظور از رفتارهای مالی پرخطر، نمره‌ای است که آزمودنی از مقیاس ۱۳ سوالی تحمل ریسک مالی گرابل و لایتون (۱۹۹۹) کسب می‌کند. نمرات بالاتر در این مقیاس، نشان‌دهنده تمایل بیشتر به پذیرش ریسک و در نتیجه، بروز بیشتر رفتارهای مالی پرخطر است. نمره کل این مقیاس بین ۱۳ تا ۴۵ محاسبه می‌شود. روایی پیش‌بین بالای این مقیاس برای رفتار مالی واقعی در پژوهش‌های متعدد تأیید شده است (گرابل، ۲۰۱۷) و در ایران نیز توسط طالبی و همکاران (۱۳۹۸) بر روی نمونه‌ای از سرمایه‌گذاران بورس تهران اعتباریابی شده است؛ در همین هنجاریابی، پایایی مقیاس با آلفای کرونباخ ۰٫۷۹ گزارش و ساختار عاملی آن نیز تأیید شده است.</w:t>
       </w:r>
     </w:p>
     <w:p>
       <w:pPr>
         <w:pStyle w:val="Heading2"/>
         <w:bidi w:val="1"/>
+        <w:jc w:val="right"/>
       </w:pPr>
       <w:r>
         <w:rPr>
@@ -3532,7 +3520,7 @@
           <w:sz w:val="24"/>
           <w:szCs w:val="24"/>
         </w:rPr>
-        <w:t xml:space="preserve">این رساله در پنج فصل تنظیم شده است؛ فصل‌هایی مجزا و متناسب با فرآیند منطقی اجرای پژوهش. فصل اول به عنوان چارچوب کلی پژوهش، شامل بیان مسأله، اهمیت و ضرورت، اهداف، فرضیه‌ها و تعاریف مفهومی و عملیاتی متغیرهاست. فصل دوم به مبانی نظری و پیشینهٔ پژوهش اختصاص دارد. در بخش مبانی نظری، ابتدا ادبیات اضطراب صفتی با تأکید بر سازوکارهای شناختی و توجهی مرور می‌شود؛ سپس ادبیات طرحواره‌های ناسازگار اولیه و نظریهٔ طرحواره، و پس از آن ادبیات رفتارهای مالی پرخطر شامل اقتصاد رفتاری و سازهٔ تحمل ریسک مالی. در پایان این بخش، مدل مفهومی پژوهش ارائه می‌شود و بخش پیشینه نیز مطالعات تجربی داخلی و خارجی مرتبط را پوشش می‌دهد. فصل سوم، روش‌شناسی پژوهش را در قالب طرح توصیفی-همبستگی کاربردی تبیین می‌کند و به جامعهٔ آماری و روش نمونه‌گیری، ابزارهای اندازه‌گیری، روایی و پایایی، روش اجرا، روش‌های تحلیل داده‌ها شامل همبستگی پیرسون و مدل‌سازی معادلات ساختاری و ملاحظات اخلاقی می‌پردازد. فصل چهارم یافته‌های پژوهش را در دو بخش توصیفی و استنباطی ارائه می‌دهد؛ یافته‌های استنباطی شامل ماتریس همبستگی میان سه متغیر برای آزمون فرضیه‌های فرعی و نتایج آزمون مدل میانجی‌گری برای فرضیهٔ اصلی است. فصل پنجم نیز به بحث و تبیین یافته‌ها در چارچوب مدل استعداد-استرس، بررسی همسویی و ناهمسویی آن‌ها با پیشینهٔ پژوهشی، کاربردهای عملی، محدودیت‌ها و پیشنهادهای پژوهشی و کاربردی اختصاص دارد. در مجموع، فصل‌های پنج‌گانهٔ رساله به ترتیب از چرایی و چیستی پژوهش آغاز می‌شوند، به چگونگی اجرا و یافته‌های آن می‌رسند و در نهایت به تبیین نظری یافته‌ها و ارائهٔ کاربردهای عملی نتایج ختم می‌گردند.</w:t>
+        <w:t xml:space="preserve">این رساله در پنج فصل تنظیم شده است؛ فصل‌هایی مجزا و متناسب با فرآیند منطقی اجرای پژوهش. فصل اول به عنوان چارچوب کلی پژوهش، شامل بیان مسأله، اهمیت و ضرورت، اهداف، فرضیه‌ها و تعاریف مفهومی و عملیاتی متغیرهاست. فصل دوم به مبانی نظری و پیشینه پژوهش اختصاص دارد. در بخش مبانی نظری، ابتدا ادبیات اضطراب صفتی با تأکید بر سازوکارهای شناختی و توجهی مرور می‌شود؛ سپس ادبیات طرحواره‌های ناسازگار اولیه و نظریه طرحواره، و پس از آن ادبیات رفتارهای مالی پرخطر شامل اقتصاد رفتاری و سازه تحمل ریسک مالی. در پایان این بخش، مدل مفهومی پژوهش ارائه می‌شود و بخش پیشینه نیز مطالعات تجربی داخلی و خارجی مرتبط را پوشش می‌دهد. فصل سوم، روش‌شناسی پژوهش را در قالب طرح توصیفی-همبستگی کاربردی تبیین می‌کند و به جامعه آماری و روش نمونه‌گیری، ابزارهای اندازه‌گیری، روایی و پایایی، روش اجرا، روش‌های تحلیل داده‌ها شامل همبستگی پیرسون و مدل‌سازی معادلات ساختاری و ملاحظات اخلاقی می‌پردازد. فصل چهارم یافته‌های پژوهش را در دو بخش توصیفی و استنباطی ارائه می‌دهد؛ یافته‌های استنباطی شامل ماتریس همبستگی میان سه متغیر برای آزمون فرضیه‌های فرعی و نتایج آزمون مدل میانجی‌گری برای فرضیه اصلی است. فصل پنجم نیز به بحث و تبیین یافته‌ها در چارچوب مدل استعداد-استرس، بررسی همسویی و ناهمسویی آن‌ها با پیشینه پژوهشی، کاربردهای عملی، محدودیت‌ها و پیشنهادهای پژوهشی و کاربردی اختصاص دارد. در مجموع، فصل‌های پنج‌گانه رساله به ترتیب از چرایی و چیستی پژوهش آغاز می‌شوند، به چگونگی اجرا و یافته‌های آن می‌رسند و در نهایت به تبیین نظری یافته‌ها و ارائه کاربردهای عملی نتایج ختم می‌گردند.</w:t>
       </w:r>
     </w:p>
     <w:p>
@@ -3597,6 +3585,7 @@
       <w:pPr>
         <w:pStyle w:val="Heading2"/>
         <w:bidi w:val="1"/>
+        <w:jc w:val="right"/>
       </w:pPr>
       <w:r>
         <w:rPr>
@@ -3625,7 +3614,7 @@
           <w:sz w:val="24"/>
           <w:szCs w:val="24"/>
         </w:rPr>
-        <w:t xml:space="preserve">فصل حاضر به مرور جامع مبانی نظری و پیشینهٔ تجربی متغیرهای اصلی مطالعهٔ حاضر اختصاص دارد. در مدل مفهومی این مطالعه، اضطراب صفتی به‌عنوان متغیر مستقل، رفتارهای مالی پرخطر به‌عنوان متغیر وابسته و طرحواره‌های ناسازگار اولیه به‌عنوان متغیر میانجی در نظر گرفته شده‌اند. مبانی نظری پژوهش ریشه در رویکردهای شناختی دارد؛ در دیدگاه بک، رویدادها به‌خودی‌خود موجب شکل‌گیری هیجان‌ها نمی‌شوند، بلکه تفسیر و ارزیابی فرد از آن رویدادهاست که واکنش‌های هیجانی را می‌سازد (بک، ۱۹۷۶). بر این اساس، اضطراب صفتی را می‌توان نوعی آسیب‌پذیری شناختی-هیجانی پایدار دانست که بر شیوهٔ پردازش اطلاعات و تصمیم‌گیری اثر می‌گذارد. از سوی دیگر، طرحواره‌های ناسازگار اولیه در مدل یانگ، الگوهایی فراگیر و عمیق هستند که در جریان رشد اولیه شکل گرفته‌اند و ادراک فرد از خود و محیط را در بزرگسالی نیز هدایت می‌کنند (یانگ و همکاران، ۲۰۰۳). مرور این چارچوب‌های نظری و یافته‌های تجربی برخاسته از آن‌ها به تبیین دقیق‌تر مکانیسم‌های شناختی و هیجانی حاکم بر تصمیم‌گیری معامله‌گران بازارهای مالی </w:t>
+        <w:t xml:space="preserve">فصل حاضر به مرور جامع مبانی نظری و پیشینه تجربی متغیرهای اصلی مطالعه حاضر اختصاص دارد. در مدل مفهومی این مطالعه، اضطراب صفتی به‌عنوان متغیر مستقل، رفتارهای مالی پرخطر به‌عنوان متغیر وابسته و طرحواره‌های ناسازگار اولیه به‌عنوان متغیر میانجی در نظر گرفته شده‌اند. مبانی نظری پژوهش ریشه در رویکردهای شناختی دارد؛ در دیدگاه بک، رویدادها به‌خودی‌خود موجب شکل‌گیری هیجان‌ها نمی‌شوند، بلکه تفسیر و ارزیابی فرد از آن رویدادهاست که واکنش‌های هیجانی را می‌سازد (بک، ۱۹۷۶). بر این اساس، اضطراب صفتی را می‌توان نوعی آسیب‌پذیری شناختی-هیجانی پایدار دانست که بر شیوه پردازش اطلاعات و تصمیم‌گیری اثر می‌گذارد. از سوی دیگر، طرحواره‌های ناسازگار اولیه در مدل یانگ، الگوهایی فراگیر و عمیق هستند که در جریان رشد اولیه شکل گرفته‌اند و ادراک فرد از خود و محیط را در بزرگسالی نیز هدایت می‌کنند (یانگ و همکاران، ۲۰۰۳). مرور این چارچوب‌های نظری و یافته‌های تجربی برخاسته از آن‌ها به تبیین دقیق‌تر مکانیسم‌های شناختی و هیجانی حاکم بر تصمیم‌گیری معامله‌گران بازارهای مالی </w:t>
       </w:r>
       <w:r>
         <w:rPr>
@@ -3660,7 +3649,7 @@
           <w:sz w:val="24"/>
           <w:szCs w:val="24"/>
         </w:rPr>
-        <w:t xml:space="preserve">ساختار فصل حاضر مسیر مشخصی را طی می‌کند. نخست در بخش‌های ۲-۲-۱ تا ۲-۲-۳، تعاریف، نظریه‌ها و ابعاد هر یک از متغیرهای پژوهش به‌طور مجزا بررسی می‌شود. در ادامه، در بخش ۲-۲-۴ روابط بین متغیرها و مدل نظری میانجی‌گری تحلیل می‌گردد؛ از جمله روابط دوجانبهٔ میان اضطراب صفتی و رفتارهای مالی پرخطر و نقش طرحواره‌های ناسازگار اولیه در تبیین این روابط. سپس در بخش ۲-۳ پیشینهٔ پژوهشی داخلی و خارجی مرور می‌شود و مدل میانجی‌گری پژوهش در پرتو آن به تصویر درمی‌آید؛ هدف، مشخص‌شدن شکاف پژوهشی </w:t>
+        <w:t xml:space="preserve">ساختار فصل حاضر مسیر مشخصی را طی می‌کند. نخست در بخش‌های ۲-۲-۱ تا ۲-۲-۳، تعاریف، نظریه‌ها و ابعاد هر یک از متغیرهای پژوهش به‌طور مجزا بررسی می‌شود. در ادامه، در بخش ۲-۲-۴ روابط بین متغیرها و مدل نظری میانجی‌گری تحلیل می‌گردد؛ از جمله روابط دوجانبه میان اضطراب صفتی و رفتارهای مالی پرخطر و نقش طرحواره‌های ناسازگار اولیه در تبیین این روابط. سپس در بخش ۲-۳ پیشینه پژوهشی داخلی و خارجی مرور می‌شود و مدل میانجی‌گری پژوهش در پرتو آن به تصویر درمی‌آید؛ هدف، مشخص‌شدن شکاف پژوهشی </w:t>
       </w:r>
       <w:r>
         <w:rPr>
@@ -3678,13 +3667,14 @@
           <w:sz w:val="24"/>
           <w:szCs w:val="24"/>
         </w:rPr>
-        <w:t xml:space="preserve"> موجود در ادبیات و روشن‌ترشدن ضرورت انجام پژوهش حاضر است. در مرور پیشینهٔ تجربی، اولویت با مطالعاتی است که در جمعیت معامله‌گران انجام شده‌اند یا یافته‌های آن‌ها قابلیت تعمیم به این جمعیت را دارد؛ بدین ترتیب، مسیر منطقی فصل از مفاهیم بنیادین به‌سوی مدل مفهومی نهایی پژوهش پیش می‌رود.</w:t>
+        <w:t xml:space="preserve"> موجود در ادبیات و روشن‌ترشدن ضرورت انجام پژوهش حاضر است. در مرور پیشینه تجربی، اولویت با مطالعاتی است که در جمعیت معامله‌گران انجام شده‌اند یا یافته‌های آن‌ها قابلیت تعمیم به این جمعیت را دارد؛ بدین ترتیب، مسیر منطقی فصل از مفاهیم بنیادین به‌سوی مدل مفهومی نهایی پژوهش پیش می‌رود.</w:t>
       </w:r>
     </w:p>
     <w:p>
       <w:pPr>
         <w:pStyle w:val="Heading2"/>
         <w:bidi w:val="1"/>
+        <w:jc w:val="right"/>
       </w:pPr>
       <w:r>
         <w:rPr>
@@ -3703,6 +3693,7 @@
       <w:pPr>
         <w:pStyle w:val="Heading3"/>
         <w:bidi w:val="1"/>
+        <w:jc w:val="right"/>
       </w:pPr>
       <w:r>
         <w:rPr>
@@ -3875,7 +3866,7 @@
           <w:rtl/>
           <w:vertAlign w:val="superscript"/>
         </w:rPr>
-        <w:footnoteReference w:id="78"/>
+        <w:footnoteReference w:id="79"/>
       </w:r>
       <w:r>
         <w:rPr>
@@ -3964,7 +3955,7 @@
           <w:rtl/>
           <w:vertAlign w:val="superscript"/>
         </w:rPr>
-        <w:footnoteReference w:id="79"/>
+        <w:footnoteReference w:id="80"/>
       </w:r>
       <w:r>
         <w:rPr>
@@ -4016,7 +4007,7 @@
           <w:rtl/>
           <w:vertAlign w:val="superscript"/>
         </w:rPr>
-        <w:footnoteReference w:id="80"/>
+        <w:footnoteReference w:id="81"/>
       </w:r>
       <w:r>
         <w:rPr>
@@ -4051,7 +4042,7 @@
           <w:rtl/>
           <w:vertAlign w:val="superscript"/>
         </w:rPr>
-        <w:footnoteReference w:id="81"/>
+        <w:footnoteReference w:id="82"/>
       </w:r>
       <w:r>
         <w:rPr>
@@ -4103,7 +4094,7 @@
           <w:rtl/>
           <w:vertAlign w:val="superscript"/>
         </w:rPr>
-        <w:footnoteReference w:id="82"/>
+        <w:footnoteReference w:id="83"/>
       </w:r>
       <w:r>
         <w:rPr>
@@ -4191,7 +4182,7 @@
           <w:rtl/>
           <w:vertAlign w:val="superscript"/>
         </w:rPr>
-        <w:footnoteReference w:id="83"/>
+        <w:footnoteReference w:id="84"/>
       </w:r>
       <w:r>
         <w:rPr>
@@ -4348,7 +4339,7 @@
           <w:rtl/>
           <w:vertAlign w:val="superscript"/>
         </w:rPr>
-        <w:footnoteReference w:id="84"/>
+        <w:footnoteReference w:id="85"/>
       </w:r>
       <w:r>
         <w:rPr>
@@ -4366,7 +4357,7 @@
           <w:rtl/>
           <w:vertAlign w:val="superscript"/>
         </w:rPr>
-        <w:footnoteReference w:id="85"/>
+        <w:footnoteReference w:id="86"/>
       </w:r>
       <w:r>
         <w:rPr>
@@ -4384,7 +4375,7 @@
           <w:rtl/>
           <w:vertAlign w:val="superscript"/>
         </w:rPr>
-        <w:footnoteReference w:id="86"/>
+        <w:footnoteReference w:id="87"/>
       </w:r>
       <w:r>
         <w:rPr>
@@ -4506,7 +4497,7 @@
           <w:rtl/>
           <w:vertAlign w:val="superscript"/>
         </w:rPr>
-        <w:footnoteReference w:id="87"/>
+        <w:footnoteReference w:id="88"/>
       </w:r>
       <w:r>
         <w:rPr>
@@ -4648,7 +4639,7 @@
           <w:rtl/>
           <w:vertAlign w:val="superscript"/>
         </w:rPr>
-        <w:footnoteReference w:id="88"/>
+        <w:footnoteReference w:id="89"/>
       </w:r>
       <w:r>
         <w:rPr>
@@ -4845,7 +4836,7 @@
           <w:rtl/>
           <w:vertAlign w:val="superscript"/>
         </w:rPr>
-        <w:footnoteReference w:id="89"/>
+        <w:footnoteReference w:id="90"/>
       </w:r>
       <w:r>
         <w:rPr>
@@ -4986,7 +4977,7 @@
           <w:rtl/>
           <w:vertAlign w:val="superscript"/>
         </w:rPr>
-        <w:footnoteReference w:id="90"/>
+        <w:footnoteReference w:id="91"/>
       </w:r>
       <w:r>
         <w:rPr>
@@ -5004,7 +4995,7 @@
           <w:rtl/>
           <w:vertAlign w:val="superscript"/>
         </w:rPr>
-        <w:footnoteReference w:id="91"/>
+        <w:footnoteReference w:id="92"/>
       </w:r>
       <w:r>
         <w:rPr>
@@ -5126,7 +5117,7 @@
           <w:rtl/>
           <w:vertAlign w:val="superscript"/>
         </w:rPr>
-        <w:footnoteReference w:id="92"/>
+        <w:footnoteReference w:id="93"/>
       </w:r>
       <w:r>
         <w:rPr>
@@ -5144,7 +5135,7 @@
           <w:rtl/>
           <w:vertAlign w:val="superscript"/>
         </w:rPr>
-        <w:footnoteReference w:id="93"/>
+        <w:footnoteReference w:id="94"/>
       </w:r>
       <w:r>
         <w:rPr>
@@ -5188,7 +5179,7 @@
           <w:sz w:val="24"/>
           <w:szCs w:val="24"/>
         </w:rPr>
-        <w:t xml:space="preserve">با توجه به مبانی نظری و سازوکارهای شناختی-عصبی مطرح‌شده در بخش‌های پیشین، اضطراب صفتی  را نمی‌توان صرفاً یک واکنش هیجانی گذرا دانست. این متغیر زمینهٔ شخصیتی پایداری است که بر کل فرایند تصمیم‌گیری معامله‌گر سایه می‌افکند. بر اساس مدل اسپیلبرگر، افراد دارای اضطراب صفتی بالا در مواجهه با رویدادهای تنش‌زای بازار، واکنش‌های اضطراب حالتی مکررتر و شدیدتری را تجربه می‌کنند و این فعال‌سازی مزمن، نظام هشدار روانی آن‌ها را در وضعیت آماده‌باش دائمی نگه می‌دارد (اسپیلبرگر، ۱۹۸۳). در محیط بازارهای مالی که ذاتاً با عدم قطعیت، غیرقابل پیش‌بینی بودن و زیان‌ها و سودهای پی‌درپی همراه است، این استعداد به آن معناست که معامله‌گر به‌طور مداوم با سطح بالاتری از تنش روانی به مصاف نوسانات بازار می‌رود و منابع شناختی او پیش از هرگونه تحلیل فنی یا بنیادی، صرف مدیریت همین تنش درونی می‌شود. در واقع، این متغیر همچون عدسی عمل می‌کند که اطلاعات بازار پیش از هر پردازش تحلیلی از آن عبور می‌کنند و سطح پایهٔ تهدید ادراک‌شده را تعیین می‌کند؛ بدین ترتیب، اضطراب صفتی بافت هیجانی و انگیزشی تصمیم‌گیری مالی را شکل می‌دهد.</w:t>
+        <w:t xml:space="preserve">با توجه به مبانی نظری و سازوکارهای شناختی-عصبی مطرح‌شده در بخش‌های پیشین، اضطراب صفتی  را نمی‌توان صرفاً یک واکنش هیجانی گذرا دانست. این متغیر زمینه شخصیتی پایداری است که بر کل فرایند تصمیم‌گیری معامله‌گر سایه می‌افکند. بر اساس مدل اسپیلبرگر، افراد دارای اضطراب صفتی بالا در مواجهه با رویدادهای تنش‌زای بازار، واکنش‌های اضطراب حالتی مکررتر و شدیدتری را تجربه می‌کنند و این فعال‌سازی مزمن، نظام هشدار روانی آن‌ها را در وضعیت آماده‌باش دائمی نگه می‌دارد (اسپیلبرگر، ۱۹۸۳). در محیط بازارهای مالی که ذاتاً با عدم قطعیت، غیرقابل پیش‌بینی بودن و زیان‌ها و سودهای پی‌درپی همراه است، این استعداد به آن معناست که معامله‌گر به‌طور مداوم با سطح بالاتری از تنش روانی به مصاف نوسانات بازار می‌رود و منابع شناختی او پیش از هرگونه تحلیل فنی یا بنیادی، صرف مدیریت همین تنش درونی می‌شود. در واقع، این متغیر همچون عدسی عمل می‌کند که اطلاعات بازار پیش از هر پردازش تحلیلی از آن عبور می‌کنند و سطح پایه تهدید ادراک‌شده را تعیین می‌کند؛ بدین ترتیب، اضطراب صفتی بافت هیجانی و انگیزشی تصمیم‌گیری مالی را شکل می‌دهد.</w:t>
       </w:r>
     </w:p>
     <w:p>
@@ -5223,7 +5214,7 @@
           <w:sz w:val="24"/>
           <w:szCs w:val="24"/>
         </w:rPr>
-        <w:t xml:space="preserve"> است. شواهد تجربی نشان می‌دهند که اضطراب با گرایش به اجتناب از ریسک همراه است؛ به این معنا که افراد مضطرب برای تنظیم هیجان منفی و فرار از تهدید، حتی در شرایطی که ارزش مورد انتظار گزینه‌ها یکسان است، گزینه‌های کم‌خطرتر را برمی‌گزینند (مانر و اشمیت، ۲۰۰۶). در ادبیات روانشناسی مالی، این گرایش در قالب سازهٔ تحمل ریسک مالی مطالعه می‌شود؛ سازه‌ای که سنجش آن قادر است رفتار واقعی مالی و تصمیم‌های واقعی افراد دربارهٔ دارایی‌هایشان را پیش‌بینی کند (گرابل و لایتون، ۱۹۹۹). ارزیابی‌های روان‌سنجی بعدی این مقیاس نیز روایی و پایایی آن را برای کاربردهای بالینی و مشاوره‌ای تأیید کرده‌اند (گرابل، ۲۰۱۷). بنابراین، اضطراب صفتی بالای یک معامله‌گر می‌تواند به سطح پایین‌تری از تحمل ریسک مالی بینجامد و این کاهش صرفاً در پاسخ‌های نگرشی به پرسشنامه باقی نمی‌ماند، بلکه در ترکیب واقعی سبد دارایی، حجم معاملات و میزان پایبندی به راهبردهای پرخطر عینیت می‌یابد.</w:t>
+        <w:t xml:space="preserve"> است. شواهد تجربی نشان می‌دهند که اضطراب با گرایش به اجتناب از ریسک همراه است؛ به این معنا که افراد مضطرب برای تنظیم هیجان منفی و فرار از تهدید، حتی در شرایطی که ارزش مورد انتظار گزینه‌ها یکسان است، گزینه‌های کم‌خطرتر را برمی‌گزینند (مانر و اشمیت، ۲۰۰۶). در ادبیات روانشناسی مالی، این گرایش در قالب سازه تحمل ریسک مالی مطالعه می‌شود؛ سازه‌ای که سنجش آن قادر است رفتار واقعی مالی و تصمیم‌های واقعی افراد درباره دارایی‌هایشان را پیش‌بینی کند (گرابل و لایتون، ۱۹۹۹). ارزیابی‌های روان‌سنجی بعدی این مقیاس نیز روایی و پایایی آن را برای کاربردهای بالینی و مشاوره‌ای تأیید کرده‌اند (گرابل، ۲۰۱۷). بنابراین، اضطراب صفتی بالای یک معامله‌گر می‌تواند به سطح پایین‌تری از تحمل ریسک مالی بینجامد و این کاهش صرفاً در پاسخ‌های نگرشی به پرسشنامه باقی نمی‌ماند، بلکه در ترکیب واقعی سبد دارایی، حجم معاملات و میزان پایبندی به راهبردهای پرخطر عینیت می‌یابد.</w:t>
       </w:r>
     </w:p>
     <w:p>
@@ -5240,7 +5231,7 @@
           <w:sz w:val="24"/>
           <w:szCs w:val="24"/>
         </w:rPr>
-        <w:t xml:space="preserve">بررسی مستقیم رابطهٔ اضطراب با تصمیم‌های مالی نیز شواهد همسویی به دست داده است. در یک مرور تحلیلی جامع نشان داده شد که اضطراب به‌طور نظام‌مند با تصمیم‌گیری در شرایط ریسک و عدم قطعیت مرتبط است و این ارتباط به نمونه‌های بالینی محدود نمی‌شود (میت، ۲۰۰۷). در مطالعات جدیدتر با بافت واقعی بازارهای مالی نیز نقش اضطراب در تصمیمات مالی به‌عنوان عاملی مستقل تأیید شده است (چارلز و کاسیلینگام</w:t>
+        <w:t xml:space="preserve">بررسی مستقیم رابطه اضطراب با تصمیم‌های مالی نیز شواهد همسویی به دست داده است. در یک مرور تحلیلی جامع نشان داده شد که اضطراب به‌طور نظام‌مند با تصمیم‌گیری در شرایط ریسک و عدم قطعیت مرتبط است و این ارتباط به نمونه‌های بالینی محدود نمی‌شود (میت، ۲۰۰۷). در مطالعات جدیدتر با بافت واقعی بازارهای مالی نیز نقش اضطراب در تصمیمات مالی به‌عنوان عاملی مستقل تأیید شده است (چارلز و کاسیلینگام</w:t>
       </w:r>
       <w:r>
         <w:rPr>
@@ -5248,7 +5239,7 @@
           <w:rtl/>
           <w:vertAlign w:val="superscript"/>
         </w:rPr>
-        <w:footnoteReference w:id="94"/>
+        <w:footnoteReference w:id="95"/>
       </w:r>
       <w:r>
         <w:rPr>
@@ -5266,17 +5257,17 @@
           <w:rtl/>
           <w:vertAlign w:val="superscript"/>
         </w:rPr>
-        <w:footnoteReference w:id="95"/>
-      </w:r>
-      <w:r>
-        <w:rPr>
-          <w:rFonts w:ascii="B Nazanin" w:hAnsi="B Nazanin" w:cs="B Nazanin" w:hint="cs"/>
-          <w:rtl/>
-          <w:lang w:bidi="fa-IR"/>
-          <w:sz w:val="24"/>
-          <w:szCs w:val="24"/>
-        </w:rPr>
-        <w:t xml:space="preserve">، ۲۰۲۱). همچنین در پژوهش‌های تجربی تصمیم‌گیری سرمایه‌گذاری، اضطراب به‌عنوان یکی از متغیرهای هیجانی شناسایی شده است که الگوی انتخاب افراد را در مواجهه با انتخاب‌های پرخطر مالی تغییر می‌دهد (گامبتی و گیوسبرتی، ۲۰۱۲). نکتهٔ حائز اهمیت آن است که این شواهد در فرهنگ‌ها، بازارها و طرح‌های روش‌شناختی مختلف به دست آمده‌اند و از تعمیم‌پذیری قابل قبولی برخوردارند. در مجموع، این یافته‌ها نشان می‌دهند که اثر اضطراب صفتی به تجربهٔ درونی معامله‌گر محدود نمی‌ماند، بلکه به شکل عینی و قابل اندازه‌گیری در سطح ریسک و ترکیب دارایی‌های او نمود می‌یابد.</w:t>
+        <w:footnoteReference w:id="96"/>
+      </w:r>
+      <w:r>
+        <w:rPr>
+          <w:rFonts w:ascii="B Nazanin" w:hAnsi="B Nazanin" w:cs="B Nazanin" w:hint="cs"/>
+          <w:rtl/>
+          <w:lang w:bidi="fa-IR"/>
+          <w:sz w:val="24"/>
+          <w:szCs w:val="24"/>
+        </w:rPr>
+        <w:t xml:space="preserve">، ۲۰۲۱). همچنین در پژوهش‌های تجربی تصمیم‌گیری سرمایه‌گذاری، اضطراب به‌عنوان یکی از متغیرهای هیجانی شناسایی شده است که الگوی انتخاب افراد را در مواجهه با انتخاب‌های پرخطر مالی تغییر می‌دهد (گامبتی و گیوسبرتی، ۲۰۱۲). نکته حائز اهمیت آن است که این شواهد در فرهنگ‌ها، بازارها و طرح‌های روش‌شناختی مختلف به دست آمده‌اند و از تعمیم‌پذیری قابل قبولی برخوردارند. در مجموع، این یافته‌ها نشان می‌دهند که اثر اضطراب صفتی به تجربه درونی معامله‌گر محدود نمی‌ماند، بلکه به شکل عینی و قابل اندازه‌گیری در سطح ریسک و ترکیب دارایی‌های او نمود می‌یابد.</w:t>
       </w:r>
     </w:p>
     <w:p>
@@ -5311,7 +5302,7 @@
           <w:sz w:val="24"/>
           <w:szCs w:val="24"/>
         </w:rPr>
-        <w:t xml:space="preserve"> نیز اثر می‌گذارد. پژوهش‌ها نشان می‌دهند که این هیجان با تغییر در ارزیابی فرد از کنترل و احتمال‌ها، داوری دربارهٔ گزینه‌ها را در شرایط عدم قطعیت دگرگون می‌سازد (هارتلی و فلپس، ۲۰۱۲) و ویژگی‌های شخصیتی مرتبط با اضطراب قادرند تصمیم‌گیری پرخطر واقعی را در موقعیت‌های زندگی واقعی پیش‌بینی کنند (لوریولا و لوین، ۲۰۰۱). در بافت معامله‌گری، معنای کاربردی این یافته‌ها آن است که نقض انضباط معاملاتی از سوی معامله‌گران با اضطراب صفتی بالا را نباید صرفاً ناشی از دانش فنی ناکافی یا ناآگاهی از قواعد مدیریت ریسک دانست، بلکه باید آن را پیامد رفتاری یک نظام تنظیم هیجانی تحت فشار مزمن تلقی کرد. این دیدگاه، کانون تبیین را از سطح اطلاعات و دانش معامله‌گر به سطح معماری روانشناختی او منتقل می‌سازد و پیامد مستقیمی برای برنامه‌های آموزشی و خدمات بالینی ویژهٔ معامله‌گران دارد؛ زیرا مداخله‌ای که تنها سطح دانش را هدف بگیرد و تنظیم هیجان را نادیده بگذارد، بعید است به تغییر رفتار پایدار منجر شود.</w:t>
+        <w:t xml:space="preserve"> نیز اثر می‌گذارد. پژوهش‌ها نشان می‌دهند که این هیجان با تغییر در ارزیابی فرد از کنترل و احتمال‌ها، داوری درباره گزینه‌ها را در شرایط عدم قطعیت دگرگون می‌سازد (هارتلی و فلپس، ۲۰۱۲) و ویژگی‌های شخصیتی مرتبط با اضطراب قادرند تصمیم‌گیری پرخطر واقعی را در موقعیت‌های زندگی واقعی پیش‌بینی کنند (لوریولا و لوین، ۲۰۰۱). در بافت معامله‌گری، معنای کاربردی این یافته‌ها آن است که نقض انضباط معاملاتی از سوی معامله‌گران با اضطراب صفتی بالا را نباید صرفاً ناشی از دانش فنی ناکافی یا ناآگاهی از قواعد مدیریت ریسک دانست، بلکه باید آن را پیامد رفتاری یک نظام تنظیم هیجانی تحت فشار مزمن تلقی کرد. این دیدگاه، کانون تبیین را از سطح اطلاعات و دانش معامله‌گر به سطح معماری روانشناختی او منتقل می‌سازد و پیامد مستقیمی برای برنامه‌های آموزشی و خدمات بالینی ویژه معامله‌گران دارد؛ زیرا مداخله‌ای که تنها سطح دانش را هدف بگیرد و تنظیم هیجان را نادیده بگذارد، بعید است به تغییر رفتار پایدار منجر شود.</w:t>
       </w:r>
     </w:p>
     <w:p>
@@ -5328,13 +5319,14 @@
           <w:sz w:val="24"/>
           <w:szCs w:val="24"/>
         </w:rPr>
-        <w:t xml:space="preserve">مجموع شواهد مرورشده جهت مشخصی را نشان می‌دهد: در مدل مفهومی پژوهش حاضر، اضطراب صفتی به‌عنوان پیشایند اصلی و بنیادینی جای می‌گیرد که از مسیر تشدید ادراک تهدید و فرسایش منابع شناختی، زمینهٔ رفتارهای مالی پرخطر را فراهم می‌آورد. البته شواهدی ناهمسو نیز وجود دارد: اضطراب گاه به رفتار پرخطر تکانشی برای فرار از تنش هیجانی منجر می‌شود؛ مانند معامله‌گری برای گریز از پریشانی هیجانی که از مؤلفه‌های اختلال معامله‌گری است (گرال-برونک و همکاران، ۲۰۲۵). با این حال، شواهد تجربی همچنین نشان می‌دهند که رابطهٔ این متغیر با پیامدهای مالی، ساده، مستقیم و همسان نیست و افراد در تبدیل اضطراب به رفتار، تفاوت‌های چشمگیری با یکدیگر دارند. همین مشاهده ضرورت جست‌وجوی سازوکارهای میانجی پایدار را برای تبیین این تبدیل مطرح می‌سازد و مبنای منطقی بررسی نقش طرحواره‌های ناسازگار اولیه را در بخش‌های بعدی این فصل فراهم می‌آورد. از منظر کاربردی نیز، تبیین جایگاه اضطراب صفتی در تصمیم‌گیری مالی، هم طراحی ابزارهای غربالگری هدفمند برای شناسایی معامله‌گران آسیب‌پذیر و هم تدوین مداخله‌های روانشناختی کوتاه‌مدت ویژهٔ این جمعیت را توجیه می‌کند و همزمان چرایی انتخاب این متغیر به‌عنوان نقطهٔ آغاز مدل ساختاری فرضیه‌های پژوهش را روشن می‌سازد.</w:t>
+        <w:t xml:space="preserve">مجموع شواهد مرورشده جهت مشخصی را نشان می‌دهد: در مدل مفهومی پژوهش حاضر، اضطراب صفتی به‌عنوان پیشایند اصلی و بنیادینی جای می‌گیرد که از مسیر تشدید ادراک تهدید و فرسایش منابع شناختی، زمینه رفتارهای مالی پرخطر را فراهم می‌آورد. البته شواهدی ناهمسو نیز وجود دارد: اضطراب گاه به رفتار پرخطر تکانشی برای فرار از تنش هیجانی منجر می‌شود؛ مانند معامله‌گری برای گریز از پریشانی هیجانی که از مؤلفه‌های اختلال معامله‌گری است (گرال-برونک و همکاران، ۲۰۲۵). با این حال، شواهد تجربی همچنین نشان می‌دهند که رابطه این متغیر با پیامدهای مالی، ساده، مستقیم و همسان نیست و افراد در تبدیل اضطراب به رفتار، تفاوت‌های چشمگیری با یکدیگر دارند. همین مشاهده ضرورت جست‌وجوی سازوکارهای میانجی پایدار را برای تبیین این تبدیل مطرح می‌سازد و مبنای منطقی بررسی نقش طرحواره‌های ناسازگار اولیه را در بخش‌های بعدی این فصل فراهم می‌آورد. از منظر کاربردی نیز، تبیین جایگاه اضطراب صفتی در تصمیم‌گیری مالی، هم طراحی ابزارهای غربالگری هدفمند برای شناسایی معامله‌گران آسیب‌پذیر و هم تدوین مداخله‌های روانشناختی کوتاه‌مدت ویژه این جمعیت را توجیه می‌کند و همزمان چرایی انتخاب این متغیر به‌عنوان نقطه آغاز مدل ساختاری فرضیه‌های پژوهش را روشن می‌سازد.</w:t>
       </w:r>
     </w:p>
     <w:p>
       <w:pPr>
         <w:pStyle w:val="Heading3"/>
         <w:bidi w:val="1"/>
+        <w:jc w:val="right"/>
       </w:pPr>
       <w:r>
         <w:rPr>
@@ -5473,7 +5465,7 @@
           <w:rtl/>
           <w:vertAlign w:val="superscript"/>
         </w:rPr>
-        <w:footnoteReference w:id="96"/>
+        <w:footnoteReference w:id="97"/>
       </w:r>
       <w:r>
         <w:rPr>
@@ -5551,7 +5543,7 @@
           <w:sz w:val="24"/>
           <w:szCs w:val="24"/>
         </w:rPr>
-        <w:t xml:space="preserve">نظریه طرحواره یانگ، ساختار شخصیت را بر پایهٔ مجموعه‌ای از نیازهای هیجانی بنیادین تبیین می‌کند که برآورده‌نشدن آن‌ها در دوران رشد، زمینهٔ شکل‌گیری طرحواره‌های ناسازگار اولیه را فراهم می‌آورد. در مدل یانگ و همکاران، هجده طرحواره در قالب پنج حوزهٔ طرحواره‌ای </w:t>
+        <w:t xml:space="preserve">نظریه طرحواره یانگ، ساختار شخصیت را بر پایه مجموعه‌ای از نیازهای هیجانی بنیادین تبیین می‌کند که برآورده‌نشدن آن‌ها در دوران رشد، زمینه شکل‌گیری طرحواره‌های ناسازگار اولیه را فراهم می‌آورد. در مدل یانگ و همکاران، هجده طرحواره در قالب پنج حوزه طرحواره‌ای </w:t>
       </w:r>
       <w:r>
         <w:rPr>
@@ -5569,7 +5561,7 @@
           <w:sz w:val="24"/>
           <w:szCs w:val="24"/>
         </w:rPr>
-        <w:t xml:space="preserve"> سازمان یافته‌اند و هر حوزه بازتاب محرومیت پایدار از یک یا چند نیاز هیجانی مشخص است؛ به بیان دیگر، حوزه‌ها نه بر اساس شباهت ظاهری طرحواره‌ها، بلکه بر اساس منطق تحولی مشترک آن‌ها تعریف شده‌اند (یانگ و همکاران، ۲۰۰۳). این سازمان‌دهی سلسله‌مراتبی دو کارکرد مهم دارد: نخست، شناسایی نیاز برآورده‌نشدهٔ زیربنایی هر طرحواره را ممکن می‌سازد و دوم، پیش‌بینی می‌کند که طرحواره‌های هم‌حوزه معمولاً به‌طور هم‌زمان فعال شوند و تجربهٔ هیجانی فرد را به‌شکل هماهنگ رنگ‌آمیزی کنند. از منظر بالینی نیز، این طبقه‌بندی نقطهٔ آغاز مداخله را مشخص می‌سازد؛ زیرا بازپروری نیاز هیجانی برآورده‌نشدهٔ هر حوزه، هدف اصلی فرایند درمان در طرحواره‌درمانی است. فهرست کامل حوزه‌ها و طرحواره‌های این مدل در جدول زیر ارائه شده است.</w:t>
+        <w:t xml:space="preserve"> سازمان یافته‌اند و هر حوزه بازتاب محرومیت پایدار از یک یا چند نیاز هیجانی مشخص است؛ به بیان دیگر، حوزه‌ها نه بر اساس شباهت ظاهری طرحواره‌ها، بلکه بر اساس منطق تحولی مشترک آن‌ها تعریف شده‌اند (یانگ و همکاران، ۲۰۰۳). این سازمان‌دهی سلسله‌مراتبی دو کارکرد مهم دارد: نخست، شناسایی نیاز برآورده‌نشده زیربنایی هر طرحواره را ممکن می‌سازد و دوم، پیش‌بینی می‌کند که طرحواره‌های هم‌حوزه معمولاً به‌طور هم‌زمان فعال شوند و تجربه هیجانی فرد را به‌شکل هماهنگ رنگ‌آمیزی کنند. از منظر بالینی نیز، این طبقه‌بندی نقطه آغاز مداخله را مشخص می‌سازد؛ زیرا بازپروری نیاز هیجانی برآورده‌نشده هر حوزه، هدف اصلی فرایند درمان در طرحواره‌درمانی است. فهرست کامل حوزه‌ها و طرحواره‌های این مدل در جدول زیر ارائه شده است.</w:t>
       </w:r>
     </w:p>
     <w:p>
@@ -6369,7 +6361,7 @@
           <w:sz w:val="24"/>
           <w:szCs w:val="24"/>
         </w:rPr>
-        <w:t xml:space="preserve">منطق تحولی این حوزه‌ها بر این اصل استوار است که محیط رشد، به‌جای فراهم‌سازی ممتد نیازهای هیجانی کودک، تجربه‌های مکرر محرومیت، تراکم، تنبیه یا فقدان مرزبندی را جایگزین می‌کند و ذهن کودک برای معنابخشی به این تجربه‌ها، باورهای پایداری دربارهٔ خود و جهان می‌سازد. برای نمونه، کودکی که نیازش به دلبستگی ایمن و همدلی به‌طور مکرر نادیده گرفته شده است، طرحواره‌های حوزهٔ بریدگی و طرد را درونی می‌کند و در بزرگسالی روابط را ناامن و دیگران را غیرقابل اتکا می‌پندارد. به همین ترتیب، پرورش در محیطی فاقد محدودیت‌های واقع‌بینانه، شکل‌گیری طرحواره‌های حوزهٔ محدودیت‌های مختل را تسهیل می‌کند؛ حوزه‌ای که در تبیین رفتارهای تکانشی و دشواری پایبندی به قوانین از اهمیت ویژه‌ای برخوردار است. این منطق تحولی، طرحواره‌ها را نه صفات ذاتی، بلکه یادگیری‌های عمیق و قابل تغییر معرفی می‌کند و مبنای امید به مداخله‌های روانشناختی هدفمند قرار می‌دهد (یانگ و همکاران، ۲۰۰۳). بر این اساس، ارزیابی بالینی هر فرد نیز نه با شمارش صرف طرحواره‌ها، بلکه با بازشناسی حوزه‌های غالب و نیازهای برآورده‌نشدهٔ زیربنایی آن‌ها انجام می‌گیرد؛ امری که کانون مداخله را از سطح نشانه‌ها به سطح نیازهای تحولی ارتقا می‌دهد.</w:t>
+        <w:t xml:space="preserve">منطق تحولی این حوزه‌ها بر این اصل استوار است که محیط رشد، به‌جای فراهم‌سازی ممتد نیازهای هیجانی کودک، تجربه‌های مکرر محرومیت، تراکم، تنبیه یا فقدان مرزبندی را جایگزین می‌کند و ذهن کودک برای معنابخشی به این تجربه‌ها، باورهای پایداری درباره خود و جهان می‌سازد. برای نمونه، کودکی که نیازش به دلبستگی ایمن و همدلی به‌طور مکرر نادیده گرفته شده است، طرحواره‌های حوزه بریدگی و طرد را درونی می‌کند و در بزرگسالی روابط را ناامن و دیگران را غیرقابل اتکا می‌پندارد. به همین ترتیب، پرورش در محیطی فاقد محدودیت‌های واقع‌بینانه، شکل‌گیری طرحواره‌های حوزه محدودیت‌های مختل را تسهیل می‌کند؛ حوزه‌ای که در تبیین رفتارهای تکانشی و دشواری پایبندی به قوانین از اهمیت ویژه‌ای برخوردار است. این منطق تحولی، طرحواره‌ها را نه صفات ذاتی، بلکه یادگیری‌های عمیق و قابل تغییر معرفی می‌کند و مبنای امید به مداخله‌های روانشناختی هدفمند قرار می‌دهد (یانگ و همکاران، ۲۰۰۳). بر این اساس، ارزیابی بالینی هر فرد نیز نه با شمارش صرف طرحواره‌ها، بلکه با بازشناسی حوزه‌های غالب و نیازهای برآورده‌نشده زیربنایی آن‌ها انجام می‌گیرد؛ امری که کانون مداخله را از سطح نشانه‌ها به سطح نیازهای تحولی ارتقا می‌دهد.</w:t>
       </w:r>
     </w:p>
     <w:p>
@@ -6458,7 +6450,7 @@
           <w:sz w:val="24"/>
           <w:szCs w:val="24"/>
         </w:rPr>
-        <w:t xml:space="preserve">، که در آن فرد دقیقاً برخلاف پیام طرحواره رفتار می‌کند تا از درد زیربنایی آن در امان بماند (یانگ و همکاران، ۲۰۰۳). راهبردهای اجتنابی نیز خود می‌توانند اشکال گوناگونی داشته باشند، از دوری شناختی از افکار و خاطرات فعال‌کننده گرفته تا مشغول‌سازی افراطی ذهن یا پناه بردن به رفتارهای تسکین‌دهنده. در چارچوب طرحواره‌درمانی، فعال شدن طرحواره و سبک مقابله‌ای برآمده از آن، تجربهٔ هیجانی شدیدی ایجاد می‌کند که رفتار فرد را در همان لحظه هدایت می‌سازد و درک این زنجیره برای تبیین واکنش‌های لحظه‌ای ضروری است (آرنتز و جیکوب، ۲۰۱۲).</w:t>
+        <w:t xml:space="preserve">، که در آن فرد دقیقاً برخلاف پیام طرحواره رفتار می‌کند تا از درد زیربنایی آن در امان بماند (یانگ و همکاران، ۲۰۰۳). راهبردهای اجتنابی نیز خود می‌توانند اشکال گوناگونی داشته باشند، از دوری شناختی از افکار و خاطرات فعال‌کننده گرفته تا مشغول‌سازی افراطی ذهن یا پناه بردن به رفتارهای تسکین‌دهنده. در چارچوب طرحواره‌درمانی، فعال شدن طرحواره و سبک مقابله‌ای برآمده از آن، تجربه هیجانی شدیدی ایجاد می‌کند که رفتار فرد را در همان لحظه هدایت می‌سازد و درک این زنجیره برای تبیین واکنش‌های لحظه‌ای ضروری است (آرنتز و جیکوب، ۲۰۱۲).</w:t>
       </w:r>
     </w:p>
     <w:p>
@@ -6475,7 +6467,7 @@
           <w:sz w:val="24"/>
           <w:szCs w:val="24"/>
         </w:rPr>
-        <w:t xml:space="preserve">نکتهٔ کلیدی این چارچوب برای تبیین رفتار مالی آن است که یک طرحوارهٔ واحد می‌تواند بسته به سبک مقابله‌ای غالب، به رفتارهای کاملاً متضاد بینجامد. به بیان ساده‌تر، رفتار مشاهده‌شده بیش از آنکه آینهٔ مستقیم طرحواره باشد، آینهٔ راهبرد مقابله‌ای فرد در برابر آن طرحواره است. برای نمونه، طرحواره‌ای واحد در یک فرد ممکن است در قالب ریسک‌گریزی افراطی و اجتناب از هرگونه تصمیم مالی نمایان شود و در فردی دیگر، به شکل ریسک‌پذیری تکانشی و تلاش برای اثبات ارزشمندی خود. این ویژگی نظری، تبیین ناهمسانی رفتارهای مالی را بدون توسل به فرض‌های موردی ممکن می‌سازد؛ به این معنا که هم‌زمانی ریسک‌گریزی و ریسک‌پذیری افراطی در جمعیت‌های مختلف، نه لزوماً نشانهٔ تناقض در داده‌ها، بلکه می‌تواند بازتاب سبک‌های مقابله‌ای متفاوت در برابر طرحواره‌های مشابه باشد. البته این استدلال صرفاً یک چارچوب تبیینی نظری است و آزمون تجربی آن در بافت معامله‌گری، از جمله اهداف پژوهش حاضر محسوب می‌شود؛ آزمونی که مستلزم سنجش هم‌زمان طرحواره‌ها و سبک‌های رفتاری برآمده از آن‌هاست.</w:t>
+        <w:t xml:space="preserve">نکته کلیدی این چارچوب برای تبیین رفتار مالی آن است که یک طرحواره واحد می‌تواند بسته به سبک مقابله‌ای غالب، به رفتارهای کاملاً متضاد بینجامد. به بیان ساده‌تر، رفتار مشاهده‌شده بیش از آنکه آینه مستقیم طرحواره باشد، آینه راهبرد مقابله‌ای فرد در برابر آن طرحواره است. برای نمونه، طرحواره‌ای واحد در یک فرد ممکن است در قالب ریسک‌گریزی افراطی و اجتناب از هرگونه تصمیم مالی نمایان شود و در فردی دیگر، به شکل ریسک‌پذیری تکانشی و تلاش برای اثبات ارزشمندی خود. این ویژگی نظری، تبیین ناهمسانی رفتارهای مالی را بدون توسل به فرض‌های موردی ممکن می‌سازد؛ به این معنا که هم‌زمانی ریسک‌گریزی و ریسک‌پذیری افراطی در جمعیت‌های مختلف، نه لزوماً نشانه تناقض در داده‌ها، بلکه می‌تواند بازتاب سبک‌های مقابله‌ای متفاوت در برابر طرحواره‌های مشابه باشد. البته این استدلال صرفاً یک چارچوب تبیینی نظری است و آزمون تجربی آن در بافت معامله‌گری، از جمله اهداف پژوهش حاضر محسوب می‌شود؛ آزمونی که مستلزم سنجش هم‌زمان طرحواره‌ها و سبک‌های رفتاری برآمده از آن‌هاست.</w:t>
       </w:r>
     </w:p>
     <w:p>
@@ -6492,7 +6484,7 @@
           <w:sz w:val="24"/>
           <w:szCs w:val="24"/>
         </w:rPr>
-        <w:t xml:space="preserve">از منظر سنجش، پرسشنامهٔ طرحواره یانگ مهم‌ترین ابزار ارزیابی این سازه‌هاست و ویژگی‌های روان‌سنجی آن در مطالعات متعدد بررسی شده است. نخستین ارزیابی نظام‌مند این ابزار در مطالعهٔ اشمیت و همکاران انجام گرفت که ویژگی‌های روان‌سنجی و ساختار سلسله‌مراتبی پرسشنامه را بررسی و شواهد مقدماتی روایی و پایایی آن را گزارش کردند (اشمیت و همکاران</w:t>
+        <w:t xml:space="preserve">از منظر سنجش، پرسشنامه طرحواره یانگ مهم‌ترین ابزار ارزیابی این سازه‌هاست و ویژگی‌های روان‌سنجی آن در مطالعات متعدد بررسی شده است. نخستین ارزیابی نظام‌مند این ابزار در مطالعه اشمیت و همکاران انجام گرفت که ویژگی‌های روان‌سنجی و ساختار سلسله‌مراتبی پرسشنامه را بررسی و شواهد مقدماتی روایی و پایایی آن را گزارش کردند (اشمیت و همکاران</w:t>
       </w:r>
       <w:r>
         <w:rPr>
@@ -6500,17 +6492,17 @@
           <w:rtl/>
           <w:vertAlign w:val="superscript"/>
         </w:rPr>
-        <w:footnoteReference w:id="97"/>
-      </w:r>
-      <w:r>
-        <w:rPr>
-          <w:rFonts w:ascii="B Nazanin" w:hAnsi="B Nazanin" w:cs="B Nazanin" w:hint="cs"/>
-          <w:rtl/>
-          <w:lang w:bidi="fa-IR"/>
-          <w:sz w:val="24"/>
-          <w:szCs w:val="24"/>
-        </w:rPr>
-        <w:t xml:space="preserve">، ۱۹۹۵). این پرسشنامه در دو قالب اصلی تدوین شده است: فرم بلند که پوشش تفصیلی همهٔ طرحواره‌ها را برای اهداف پژوهشی و بالینی فراهم می‌آورد و فرم کوتاه که نسخهٔ فشردهٔ آن برای غربالگری و پژوهش‌های میدانی طراحی شده است. در ادامه، نسخه‌های بین‌المللی این ابزار نیز در فرهنگ‌های مختلف اعتباریابی شده‌اند؛ از جمله ساژینو و همکاران که ویژگی‌های روان‌سنجی نسخهٔ ایتالیایی فرم بلند پرسشنامه (</w:t>
+        <w:footnoteReference w:id="98"/>
+      </w:r>
+      <w:r>
+        <w:rPr>
+          <w:rFonts w:ascii="B Nazanin" w:hAnsi="B Nazanin" w:cs="B Nazanin" w:hint="cs"/>
+          <w:rtl/>
+          <w:lang w:bidi="fa-IR"/>
+          <w:sz w:val="24"/>
+          <w:szCs w:val="24"/>
+        </w:rPr>
+        <w:t xml:space="preserve">، ۱۹۹۵). این پرسشنامه در دو قالب اصلی تدوین شده است: فرم بلند که پوشش تفصیلی همه طرحواره‌ها را برای اهداف پژوهشی و بالینی فراهم می‌آورد و فرم کوتاه که نسخه فشرده آن برای غربالگری و پژوهش‌های میدانی طراحی شده است. در ادامه، نسخه‌های بین‌المللی این ابزار نیز در فرهنگ‌های مختلف اعتباریابی شده‌اند؛ از جمله ساژینو و همکاران که ویژگی‌های روان‌سنجی نسخه ایتالیایی فرم بلند پرسشنامه (</w:t>
       </w:r>
       <w:r>
         <w:rPr>
@@ -6529,7 +6521,7 @@
           <w:sz w:val="24"/>
           <w:szCs w:val="24"/>
         </w:rPr>
-        <w:t xml:space="preserve">3) را در یک مطالعهٔ مقدماتی ارزیابی کردند و شواهدی برای ساختار عاملی این نسخه ارائه دادند (ساژینو و همکاران</w:t>
+        <w:t xml:space="preserve">3) را در یک مطالعه مقدماتی ارزیابی کردند و شواهدی برای ساختار عاملی این نسخه ارائه دادند (ساژینو و همکاران</w:t>
       </w:r>
       <w:r>
         <w:rPr>
@@ -6537,17 +6529,17 @@
           <w:rtl/>
           <w:vertAlign w:val="superscript"/>
         </w:rPr>
-        <w:footnoteReference w:id="98"/>
-      </w:r>
-      <w:r>
-        <w:rPr>
-          <w:rFonts w:ascii="B Nazanin" w:hAnsi="B Nazanin" w:cs="B Nazanin" w:hint="cs"/>
-          <w:rtl/>
-          <w:lang w:bidi="fa-IR"/>
-          <w:sz w:val="24"/>
-          <w:szCs w:val="24"/>
-        </w:rPr>
-        <w:t xml:space="preserve">، ۲۰۱۸). اهمیت این مطالعات بین‌فرهنگی در آن است که کاربردپذیری مدل هجده‌طرحواره‌ای را فراتر از بافت اصلی تدوین آن نشان می‌دهند. ویژگی‌های روان‌سنجی نسخهٔ فارسی نیز پیش‌تر به‌طور مستقل بررسی شده است (یوسفی، ۱۳۹۶) و فرم کوتاه این ابزار، مبنای سنجش طرحواره‌ها در پژوهش حاضر خواهد بود.</w:t>
+        <w:footnoteReference w:id="99"/>
+      </w:r>
+      <w:r>
+        <w:rPr>
+          <w:rFonts w:ascii="B Nazanin" w:hAnsi="B Nazanin" w:cs="B Nazanin" w:hint="cs"/>
+          <w:rtl/>
+          <w:lang w:bidi="fa-IR"/>
+          <w:sz w:val="24"/>
+          <w:szCs w:val="24"/>
+        </w:rPr>
+        <w:t xml:space="preserve">، ۲۰۱۸). اهمیت این مطالعات بین‌فرهنگی در آن است که کاربردپذیری مدل هجده‌طرحواره‌ای را فراتر از بافت اصلی تدوین آن نشان می‌دهند. ویژگی‌های روان‌سنجی نسخه فارسی نیز پیش‌تر به‌طور مستقل بررسی شده است (یوسفی، ۱۳۹۶) و فرم کوتاه این ابزار، مبنای سنجش طرحواره‌ها در پژوهش حاضر خواهد بود.</w:t>
       </w:r>
     </w:p>
     <w:p>
@@ -6564,13 +6556,14 @@
           <w:sz w:val="24"/>
           <w:szCs w:val="24"/>
         </w:rPr>
-        <w:t xml:space="preserve">در جمع، سازمان‌دهی طرحواره‌ها در پنج حوزه و تبیین سبک‌های مقابله‌ای، چارچوبی فراهم می‌آورد که می‌تواند حلقهٔ اتصال میان آسیب‌پذیری‌های هیجانی پایدار و رفتارهای عینی قابل مشاهده باشد. این چارچوب نشان می‌دهد که چگونه تجربه‌های رشدی دور می‌توانند از مسیر باورهای عمیق و راهبردهای مقابله‌ای، بر تصمیم‌های لحظه‌ای مالی اثر بگذارند؛ از این رو، طرحواره‌های ناسازگار اولیه نامزد اصلی برای تبیین مکانیسم میانجی در رابطهٔ اضطراب صفتی و رفتارهای مالی پرخطر هستند و در بخش‌های آتی این فصل، شواهد تجربی این نقش میانجی‌گر مرور خواهد شد. انتظار می‌رود چنین مروری نشان دهد که طرحواره‌ها صرفاً همبسته‌های آماری این رابطه نیستند، بلکه سازوکار شناختی-هیجانی مشخصی را برای تبدیل تنش اضطرابی به رفتار مالی پرخطر فراهم می‌آورند؛ سازوکاری که در بخش روابط بین متغیرها و مدل نظری به تفصیل تبیین خواهد شد. این تمهید همچنین امکان می‌دهد که یافته‌های پژوهش حاضر در چارچوب نظری واحدی تفسیر شوند و از سطح توصیف صرف فراتر روند.</w:t>
+        <w:t xml:space="preserve">در جمع، سازمان‌دهی طرحواره‌ها در پنج حوزه و تبیین سبک‌های مقابله‌ای، چارچوبی فراهم می‌آورد که می‌تواند حلقه اتصال میان آسیب‌پذیری‌های هیجانی پایدار و رفتارهای عینی قابل مشاهده باشد. این چارچوب نشان می‌دهد که چگونه تجربه‌های رشدی دور می‌توانند از مسیر باورهای عمیق و راهبردهای مقابله‌ای، بر تصمیم‌های لحظه‌ای مالی اثر بگذارند؛ از این رو، طرحواره‌های ناسازگار اولیه نامزد اصلی برای تبیین مکانیسم میانجی در رابطه اضطراب صفتی و رفتارهای مالی پرخطر هستند و در بخش‌های آتی این فصل، شواهد تجربی این نقش میانجی‌گر مرور خواهد شد. انتظار می‌رود چنین مروری نشان دهد که طرحواره‌ها صرفاً همبسته‌های آماری این رابطه نیستند، بلکه سازوکار شناختی-هیجانی مشخصی را برای تبدیل تنش اضطرابی به رفتار مالی پرخطر فراهم می‌آورند؛ سازوکاری که در بخش روابط بین متغیرها و مدل نظری به تفصیل تبیین خواهد شد. این تمهید همچنین امکان می‌دهد که یافته‌های پژوهش حاضر در چارچوب نظری واحدی تفسیر شوند و از سطح توصیف صرف فراتر روند.</w:t>
       </w:r>
     </w:p>
     <w:p>
       <w:pPr>
         <w:pStyle w:val="Heading3"/>
         <w:bidi w:val="1"/>
+        <w:jc w:val="right"/>
       </w:pPr>
       <w:r>
         <w:rPr>
@@ -6871,7 +6864,7 @@
           <w:sz w:val="24"/>
           <w:szCs w:val="24"/>
         </w:rPr>
-        <w:t xml:space="preserve">علاوه بر سازه‌های شناختی و ابعاد رفتاری مرورشده، یکی دیگر از متغیرهای کلیدی در تبیین تصمیم‌های مالی پرخطر، سازهٔ تحمل ریسک مالی  است. این سازه به بیشینهٔ مقدار عدم قطعیتی اشاره دارد که یک سرمایه‌گذار در اتخاذ تصمیم‌های مالی مایل به پذیرش آن است و سطح آمادگی روانشناختی فرد برای مواجهه با پیامدهای نامطلوب احتمالی را منعکس می‌کند. در ادبیات روانشناسی مالی، تفکیک میان ظرفیت عینی ریسک </w:t>
+        <w:t xml:space="preserve">علاوه بر سازه‌های شناختی و ابعاد رفتاری مرورشده، یکی دیگر از متغیرهای کلیدی در تبیین تصمیم‌های مالی پرخطر، سازه تحمل ریسک مالی  است. این سازه به بیشینه مقدار عدم قطعیتی اشاره دارد که یک سرمایه‌گذار در اتخاذ تصمیم‌های مالی مایل به پذیرش آن است و سطح آمادگی روانشناختی فرد برای مواجهه با پیامدهای نامطلوب احتمالی را منعکس می‌کند. در ادبیات روانشناسی مالی، تفکیک میان ظرفیت عینی ریسک </w:t>
       </w:r>
       <w:r>
         <w:rPr>
@@ -6924,7 +6917,7 @@
           <w:sz w:val="24"/>
           <w:szCs w:val="24"/>
         </w:rPr>
-        <w:t xml:space="preserve">برای سنجش این سازه، گرابل و لایتون ابزار استانداردی را توسعه دادند که سطح تحمل ریسک مالی افراد را در قالب یک مقیاس روان‌سنجی ارزیابی می‌کند و در مطالعات متعدد، توانایی آن در پیش‌بینی رفتار واقعی مالی نشان داده شده است (گرابل و لایتون، ۱۹۹۹). مرورهای بعدی نیز ویژگی‌های روان‌سنجی این مقیاس و جایگاه آن را در میان ابزارهای سنجش ریسک به‌طور نظام‌مند بررسی و کاربرد بالینی و مشاوره‌ای آن را تأیید کرده‌اند (گرابل، ۲۰۱۷). در بافت داخلی نیز این ابزار در جامعهٔ سرمایه‌گذاران هنجاریابی و اعتباریابی شده است و شواهد روایی و پایایی مناسبی برای کاربرد آن در پژوهش‌های بومی گزارش شده است (طالبی و همکاران، ۱۳۹۸). در دست بودن نسخهٔ هنجاریابی‌شدهٔ فارسی، امکان مقایسهٔ نمرات معامله‌گران ایرانی را با جمعیت مرجع فراهم می‌آورد و سنجش این متغیر در پژوهش حاضر را توجیه می‌کند.</w:t>
+        <w:t xml:space="preserve">برای سنجش این سازه، گرابل و لایتون ابزار استانداردی را توسعه دادند که سطح تحمل ریسک مالی افراد را در قالب یک مقیاس روان‌سنجی ارزیابی می‌کند و در مطالعات متعدد، توانایی آن در پیش‌بینی رفتار واقعی مالی نشان داده شده است (گرابل و لایتون، ۱۹۹۹). مرورهای بعدی نیز ویژگی‌های روان‌سنجی این مقیاس و جایگاه آن را در میان ابزارهای سنجش ریسک به‌طور نظام‌مند بررسی و کاربرد بالینی و مشاوره‌ای آن را تأیید کرده‌اند (گرابل، ۲۰۱۷). در بافت داخلی نیز این ابزار در جامعه سرمایه‌گذاران هنجاریابی و اعتباریابی شده است و شواهد روایی و پایایی مناسبی برای کاربرد آن در پژوهش‌های بومی گزارش شده است (طالبی و همکاران، ۱۳۹۸). در دست بودن نسخه هنجاریابی‌شده فارسی، امکان مقایسه نمرات معامله‌گران ایرانی را با جمعیت مرجع فراهم می‌آورد و سنجش این متغیر در پژوهش حاضر را توجیه می‌کند.</w:t>
       </w:r>
     </w:p>
     <w:p>
@@ -6941,13 +6934,14 @@
           <w:sz w:val="24"/>
           <w:szCs w:val="24"/>
         </w:rPr>
-        <w:t xml:space="preserve">اهمیت این سازه برای پژوهش حاضر در پیوند آن با رفتارهای مالی پرخطر نهفته است. شواهد موجود نشان می‌دهند نمرات نامتعارف در تحمل ریسک، به‌ویژه سطوح بسیار بالای آن، با الگوهای معاملاتی آسیب‌زا همراه است؛ از جمله تمایل به استفاده از اهرم‌های نامتعارف که زیان‌های بالقوه را به‌شکل غیرمتقارنی بزرگ می‌کند، حجم معاملات فراتر از سطح بهینه، و بی‌توجهی به سازوکارهای محدودکنندهٔ زیان که برای محافظت از سرمایه طراحی شده‌اند. چنین الگوهایی نه لزوماً از ندانستن قواعد مدیریت ریسک، بلکه از برآورد خوش‌بینانهٔ توان خود در تحمل پیامدهای نامطلوب سرچشمه می‌گیرند و در شرایط فشار بازار تشدید می‌شوند. از این رو، تحمل ریسک مالی می‌تواند به‌عنوان شاخصی روان‌سنجانه از آمادگی فرد برای رفتار پرخطر، حلقهٔ اتصال میان ویژگی‌های شناختی-هیجانی و پیامدهای عینی معاملاتی عمل کند و سنجش آن در کنار اضطراب صفتی و طرحواره‌های ناسازگار اولیه، تصویر کامل‌تری از عوامل روانشناختی رفتارهای مالی پرخطر به دست می‌دهد (گرابل، ۲۰۱۷).</w:t>
+        <w:t xml:space="preserve">اهمیت این سازه برای پژوهش حاضر در پیوند آن با رفتارهای مالی پرخطر نهفته است. شواهد موجود نشان می‌دهند نمرات نامتعارف در تحمل ریسک، به‌ویژه سطوح بسیار بالای آن، با الگوهای معاملاتی آسیب‌زا همراه است؛ از جمله تمایل به استفاده از اهرم‌های نامتعارف که زیان‌های بالقوه را به‌شکل غیرمتقارنی بزرگ می‌کند، حجم معاملات فراتر از سطح بهینه، و بی‌توجهی به سازوکارهای محدودکننده زیان که برای محافظت از سرمایه طراحی شده‌اند. چنین الگوهایی نه لزوماً از ندانستن قواعد مدیریت ریسک، بلکه از برآورد خوش‌بینانه توان خود در تحمل پیامدهای نامطلوب سرچشمه می‌گیرند و در شرایط فشار بازار تشدید می‌شوند. از این رو، تحمل ریسک مالی می‌تواند به‌عنوان شاخصی روان‌سنجانه از آمادگی فرد برای رفتار پرخطر، حلقه اتصال میان ویژگی‌های شناختی-هیجانی و پیامدهای عینی معاملاتی عمل کند و سنجش آن در کنار اضطراب صفتی و طرحواره‌های ناسازگار اولیه، تصویر کامل‌تری از عوامل روانشناختی رفتارهای مالی پرخطر به دست می‌دهد (گرابل، ۲۰۱۷).</w:t>
       </w:r>
     </w:p>
     <w:p>
       <w:pPr>
         <w:pStyle w:val="Heading3"/>
         <w:bidi w:val="1"/>
+        <w:jc w:val="right"/>
       </w:pPr>
       <w:r>
         <w:rPr>
@@ -7078,7 +7072,7 @@
           <w:sz w:val="24"/>
           <w:szCs w:val="24"/>
         </w:rPr>
-        <w:t xml:space="preserve">پیش از تبیین مسیرهای مدل، ضرورت منطقی وارد کردن متغیر میانجی باید روشن شود. رابطهٔ مستقیم میان اضطراب صفتی و رفتارهای مالی پرخطر، حتی در صورت معنادار بودن، تمام واریانس رفتار را تبیین نمی‌کند؛ زیرا دو فرد با سطح مشابهی از اضطراب ممکن است رفتارهای مالی کاملاً متفاوتی نشان دهند. این ناهمسانی نشان می‌دهد که اضطراب به‌خودی‌خود عامل نزدیک رفتار نیست، بلکه اثر خود را از طریق ساختارهای شناختی عمیق‌تری اعمال می‌کند که تفاوت‌های فردی در تبدیل تنش هیجانی به رفتار را تعیین می‌کنند. از منظر مدل‌سازی علّی، متغیر میانجی متغیری است که مکانیسم انتقال اثر از متغیر پیش‌بین به متغیر ملاک را بازنمایی می‌کند و آزمون آن، تبیین صرف همبستگی را به تبیین فرایندی ارتقا می‌دهد (هایز</w:t>
+        <w:t xml:space="preserve">پیش از تبیین مسیرهای مدل، ضرورت منطقی وارد کردن متغیر میانجی باید روشن شود. رابطه مستقیم میان اضطراب صفتی و رفتارهای مالی پرخطر، حتی در صورت معنادار بودن، تمام واریانس رفتار را تبیین نمی‌کند؛ زیرا دو فرد با سطح مشابهی از اضطراب ممکن است رفتارهای مالی کاملاً متفاوتی نشان دهند. این ناهمسانی نشان می‌دهد که اضطراب به‌خودی‌خود عامل نزدیک رفتار نیست، بلکه اثر خود را از طریق ساختارهای شناختی عمیق‌تری اعمال می‌کند که تفاوت‌های فردی در تبدیل تنش هیجانی به رفتار را تعیین می‌کنند. از منظر مدل‌سازی علّی، متغیر میانجی متغیری است که مکانیسم انتقال اثر از متغیر پیش‌بین به متغیر ملاک را بازنمایی می‌کند و آزمون آن، تبیین صرف همبستگی را به تبیین فرایندی ارتقا می‌دهد (هایز</w:t>
       </w:r>
       <w:r>
         <w:rPr>
@@ -7086,7 +7080,7 @@
           <w:rtl/>
           <w:vertAlign w:val="superscript"/>
         </w:rPr>
-        <w:footnoteReference w:id="99"/>
+        <w:footnoteReference w:id="100"/>
       </w:r>
       <w:r>
         <w:rPr>
@@ -7113,7 +7107,7 @@
           <w:sz w:val="24"/>
           <w:szCs w:val="24"/>
         </w:rPr>
-        <w:t xml:space="preserve">مسیر نخست مدل، سازوکار اثرگذاری اضطراب صفتی بر فعال‌سازی طرحواره‌ها را تبیین می‌کند. اضطراب پایدار صفتی با دو فرایند موازی، زمینهٔ فعال شدن طرحواره‌های ناسازگار خفته را فراهم می‌آورد: از یک سو، برانگیختگی مزمن فیزیولوژیک و درگیری مداوم ذهنی با تهدیدهای احتمالی، ظرفیت پردازش شناختی فرد را فرسوده می‌سازد و توان ارزیابی مجدد و بازدارندگی شناختی را کاهش می‌دهد؛ از سوی دیگر، مدل شناختی اضطراب نشان می‌دهد که نظام پردازش اطلاعات در افراد مضطرب به‌صورت خودکار و راهبردی بر نشانه‌های تهدید متمرکز می‌شود و همین سوگیری، دسترسی به حافظه‌ها و باورهای مرتبط با خطر را تسهیل می‌کند (بک و کلارک، ۱۹۹۷). در چارچوب نظریه طرحواره، موقعیت‌های تنش‌زا به‌ویژه هنگامی که با مضمون تجربه‌های شکل‌دهندهٔ طرحواره همخوانی دارند، نقش محرک برانگیزاننده را ایفا می‌کنند و هستهٔ هیجانی طرحواره را بیدار می‌سازند (یانگ و همکاران، ۲۰۰۳). در بافت معامله‌گری، نوسانات بازار و زیان‌های پی‌درپی دقیقاً چنین کارکردی دارند و طرحواره‌های حوزه‌های بریدگی و طرد و محدودیت‌های مختل را که با تجربهٔ بی‌ثباتی و فقدان مرزبندی پیوند دارند، بیش از سایر حوزه‌ها فعال می‌کنند.</w:t>
+        <w:t xml:space="preserve">مسیر نخست مدل، سازوکار اثرگذاری اضطراب صفتی بر فعال‌سازی طرحواره‌ها را تبیین می‌کند. اضطراب پایدار صفتی با دو فرایند موازی، زمینه فعال شدن طرحواره‌های ناسازگار خفته را فراهم می‌آورد: از یک سو، برانگیختگی مزمن فیزیولوژیک و درگیری مداوم ذهنی با تهدیدهای احتمالی، ظرفیت پردازش شناختی فرد را فرسوده می‌سازد و توان ارزیابی مجدد و بازدارندگی شناختی را کاهش می‌دهد؛ از سوی دیگر، مدل شناختی اضطراب نشان می‌دهد که نظام پردازش اطلاعات در افراد مضطرب به‌صورت خودکار و راهبردی بر نشانه‌های تهدید متمرکز می‌شود و همین سوگیری، دسترسی به حافظه‌ها و باورهای مرتبط با خطر را تسهیل می‌کند (بک و کلارک، ۱۹۹۷). در چارچوب نظریه طرحواره، موقعیت‌های تنش‌زا به‌ویژه هنگامی که با مضمون تجربه‌های شکل‌دهنده طرحواره همخوانی دارند، نقش محرک برانگیزاننده را ایفا می‌کنند و هسته هیجانی طرحواره را بیدار می‌سازند (یانگ و همکاران، ۲۰۰۳). در بافت معامله‌گری، نوسانات بازار و زیان‌های پی‌درپی دقیقاً چنین کارکردی دارند و طرحواره‌های حوزه‌های بریدگی و طرد و محدودیت‌های مختل را که با تجربه بی‌ثباتی و فقدان مرزبندی پیوند دارند، بیش از سایر حوزه‌ها فعال می‌کنند.</w:t>
       </w:r>
     </w:p>
     <w:p>
@@ -7130,7 +7124,7 @@
           <w:sz w:val="24"/>
           <w:szCs w:val="24"/>
         </w:rPr>
-        <w:t xml:space="preserve">مسیر دوم، چگونگی تبدیل طرحواره‌های فعال‌شده به رفتارهای مالی پرخطر را توضیح می‌دهد. طرحوارهٔ فعال‌شده از طریق سبک‌های مقابله‌ای به رفتار عینی بدل می‌شود و دو سبک در این مسیر اهمیت ویژه‌ای دارند. در قالب جبران افراطی، فردی که طرحواره‌های استحقاق یا خودبزرگ‌بینی دارد می‌کوشد برخلاف پیام زیربنایی طرحواره عمل کند و با پذیرش ریسک‌های بزرگ و معاملات جسورانه، برتری و کنترل خود را اثبات کند؛ رفتاری که ماهیتاً شبیه شرط‌بندی است و پیامدهای آن نادیده گرفته می‌شود. در قالب سبک‌های اجتنابی نیز معامله‌گری می‌تواند کارکرد فرار از تنش هیجانی پیدا کند و فرد برای گریز از حالات درونی ناخوشایند، به اقدام‌های تکانشگرانه روی بیاورد. شواهد مرورشده نشان می‌دهند طرحواره‌های ناسازگار اولیه با طیفی از رفتارهای تکانشی و اعتیادگونه، از جمله قماربازی و الگوهای معامله‌گری آسیب‌زا، مرتبط‌اند (شوری و همکاران، ۲۰۱۲؛ ویرا و همکاران، ۲۰۲۳) و در جمعیت‌های دارای رفتارهای قمارگونه، شدت این طرحواره‌ها با پیامدهای رفتاری همراه است (استِوِز و همکاران</w:t>
+        <w:t xml:space="preserve">مسیر دوم، چگونگی تبدیل طرحواره‌های فعال‌شده به رفتارهای مالی پرخطر را توضیح می‌دهد. طرحواره فعال‌شده از طریق سبک‌های مقابله‌ای به رفتار عینی بدل می‌شود و دو سبک در این مسیر اهمیت ویژه‌ای دارند. در قالب جبران افراطی، فردی که طرحواره‌های استحقاق یا خودبزرگ‌بینی دارد می‌کوشد برخلاف پیام زیربنایی طرحواره عمل کند و با پذیرش ریسک‌های بزرگ و معاملات جسورانه، برتری و کنترل خود را اثبات کند؛ رفتاری که ماهیتاً شبیه شرط‌بندی است و پیامدهای آن نادیده گرفته می‌شود. در قالب سبک‌های اجتنابی نیز معامله‌گری می‌تواند کارکرد فرار از تنش هیجانی پیدا کند و فرد برای گریز از حالات درونی ناخوشایند، به اقدام‌های تکانشگرانه روی بیاورد. شواهد مرورشده نشان می‌دهند طرحواره‌های ناسازگار اولیه با طیفی از رفتارهای تکانشی و اعتیادگونه، از جمله قماربازی و الگوهای معامله‌گری آسیب‌زا، مرتبط‌اند (شوری و همکاران، ۲۰۱۲؛ ویرا و همکاران، ۲۰۲۳) و در جمعیت‌های دارای رفتارهای قمارگونه، شدت این طرحواره‌ها با پیامدهای رفتاری همراه است (استِوِز و همکاران</w:t>
       </w:r>
       <w:r>
         <w:rPr>
@@ -7138,7 +7132,7 @@
           <w:rtl/>
           <w:vertAlign w:val="superscript"/>
         </w:rPr>
-        <w:footnoteReference w:id="100"/>
+        <w:footnoteReference w:id="101"/>
       </w:r>
       <w:r>
         <w:rPr>
@@ -7165,7 +7159,7 @@
           <w:sz w:val="24"/>
           <w:szCs w:val="24"/>
         </w:rPr>
-        <w:t xml:space="preserve">در سطح تحلیل آماری، این چارچوب نظری به مدل میانجی‌گری ساده‌ای ترجمه می‌شود که در آن اضطراب صفتی متغیر پیش‌بین، رفتارهای مالی پرخطر متغیر ملاک و طرحواره‌های ناسازگار اولیه متغیر میانجی است. منطق این مدل بر تجزیهٔ اثر کل به دو مؤلفه استوار است: اثر مستقیم متغیر پیش‌بین بر ملاک و اثر غیرمستقیمی که از ضرب مسیر پیش‌بین به میانجی در مسیر میانجی به ملاک به دست می‌آید؛ معناداری این اثر غیرمستقیم، شاهد آماری بر مکانیسم میانجی‌گری تلقی می‌شود (هایز، ۲۰۱۸). این الگو را می‌توان در چارچوب مدل‌سازی معادلات ساختاری </w:t>
+        <w:t xml:space="preserve">در سطح تحلیل آماری، این چارچوب نظری به مدل میانجی‌گری ساده‌ای ترجمه می‌شود که در آن اضطراب صفتی متغیر پیش‌بین، رفتارهای مالی پرخطر متغیر ملاک و طرحواره‌های ناسازگار اولیه متغیر میانجی است. منطق این مدل بر تجزیه اثر کل به دو مؤلفه استوار است: اثر مستقیم متغیر پیش‌بین بر ملاک و اثر غیرمستقیمی که از ضرب مسیر پیش‌بین به میانجی در مسیر میانجی به ملاک به دست می‌آید؛ معناداری این اثر غیرمستقیم، شاهد آماری بر مکانیسم میانجی‌گری تلقی می‌شود (هایز، ۲۰۱۸). این الگو را می‌توان در چارچوب مدل‌سازی معادلات ساختاری </w:t>
       </w:r>
       <w:r>
         <w:rPr>
@@ -7183,7 +7177,7 @@
           <w:sz w:val="24"/>
           <w:szCs w:val="24"/>
         </w:rPr>
-        <w:t xml:space="preserve"> برآورد کرد که امکان سنجش هم‌زمان مسیرها و ارزیابی برازش کلی مدل را فراهم می‌آورد، و نیز در چارچوب رگرسیون‌محور با الگوی شمارهٔ ۴ ابزار پراسس </w:t>
+        <w:t xml:space="preserve"> برآورد کرد که امکان سنجش هم‌زمان مسیرها و ارزیابی برازش کلی مدل را فراهم می‌آورد، و نیز در چارچوب رگرسیون‌محور با الگوی شماره ۴ ابزار پراسس </w:t>
       </w:r>
       <w:r>
         <w:rPr>
@@ -7227,13 +7221,14 @@
           <w:sz w:val="24"/>
           <w:szCs w:val="24"/>
         </w:rPr>
-        <w:t xml:space="preserve">در جمع‌بندی سازوکار پیشنهادی، مدل حاضر اضطراب صفتی را نه صرفاً همبستهٔ رفتار پرخطر، بلکه نقطهٔ آغاز زنجیره‌ای شناختی-هیجانی می‌داند که از فعال‌سازی طرحواره‌های ناسازگار می‌گذرد و در قالب سبک‌های مقابله‌ای ناسازگار به تصمیم‌های مالی تکانشگرانه و شرط‌بندی‌گونه ختم می‌شود. اهمیت این فرمول‌بندی در آن است که هم ناهمسانی رفتارهای مالی در افراد هم‌سطح از نظر اضطراب را تبیین می‌کند و هم هدف مداخله‌های بالینی را از مدیریت صرف اضطراب به بازسازی طرحواره‌ها و اصلاح سبک‌های مقابله‌ای گسترش می‌دهد. آزمون تجربی این مسیرها با فرضیه‌های پژوهش حاضر و بر اساس داده‌های گردآوری‌شده از جامعهٔ معامله‌گران انجام خواهد شد و نتایج آن در فصل‌های آتی گزارش می‌شود. در صورت تأیید تجربی، این مدل نه‌تنها شکاف تبیینی موجود در ادبیات روانشناسی مالی را پر می‌کند، بلکه مبنایی برای طراحی مداخله‌های هدفمند در حوزهٔ سلامت روان معامله‌گران فراهم می‌آورد؛ مداخله‌هایی که به‌جای تمرکز صرف بر دانش مالی، لایه‌های عمیق‌تر شناختی-هیجانی رفتار معاملاتی را هدف می‌گیرند و همین چشم‌انداز، اهمیت بالینی پژوهش حاضر را فراتر از ابعاد نظری آن روشن می‌سازد.</w:t>
+        <w:t xml:space="preserve">در جمع‌بندی سازوکار پیشنهادی، مدل حاضر اضطراب صفتی را نه صرفاً همبسته رفتار پرخطر، بلکه نقطه آغاز زنجیره‌ای شناختی-هیجانی می‌داند که از فعال‌سازی طرحواره‌های ناسازگار می‌گذرد و در قالب سبک‌های مقابله‌ای ناسازگار به تصمیم‌های مالی تکانشگرانه و شرط‌بندی‌گونه ختم می‌شود. اهمیت این فرمول‌بندی در آن است که هم ناهمسانی رفتارهای مالی در افراد هم‌سطح از نظر اضطراب را تبیین می‌کند و هم هدف مداخله‌های بالینی را از مدیریت صرف اضطراب به بازسازی طرحواره‌ها و اصلاح سبک‌های مقابله‌ای گسترش می‌دهد. آزمون تجربی این مسیرها با فرضیه‌های پژوهش حاضر و بر اساس داده‌های گردآوری‌شده از جامعه معامله‌گران انجام خواهد شد و نتایج آن در فصل‌های آتی گزارش می‌شود. در صورت تأیید تجربی، این مدل نه‌تنها شکاف تبیینی موجود در ادبیات روانشناسی مالی را پر می‌کند، بلکه مبنایی برای طراحی مداخله‌های هدفمند در حوزه سلامت روان معامله‌گران فراهم می‌آورد؛ مداخله‌هایی که به‌جای تمرکز صرف بر دانش مالی، لایه‌های عمیق‌تر شناختی-هیجانی رفتار معاملاتی را هدف می‌گیرند و همین چشم‌انداز، اهمیت بالینی پژوهش حاضر را فراتر از ابعاد نظری آن روشن می‌سازد.</w:t>
       </w:r>
     </w:p>
     <w:p>
       <w:pPr>
         <w:pStyle w:val="Heading2"/>
         <w:bidi w:val="1"/>
+        <w:jc w:val="right"/>
       </w:pPr>
       <w:r>
         <w:rPr>
@@ -7252,6 +7247,7 @@
       <w:pPr>
         <w:pStyle w:val="Heading3"/>
         <w:bidi w:val="1"/>
+        <w:jc w:val="right"/>
       </w:pPr>
       <w:r>
         <w:rPr>
@@ -7372,6 +7368,7 @@
       <w:pPr>
         <w:pStyle w:val="Heading3"/>
         <w:bidi w:val="1"/>
+        <w:jc w:val="right"/>
       </w:pPr>
       <w:r>
         <w:rPr>
@@ -7530,17 +7527,17 @@
           <w:rtl/>
           <w:vertAlign w:val="superscript"/>
         </w:rPr>
-        <w:footnoteReference w:id="101"/>
-      </w:r>
-      <w:r>
-        <w:rPr>
-          <w:rFonts w:ascii="B Nazanin" w:hAnsi="B Nazanin" w:cs="B Nazanin" w:hint="cs"/>
-          <w:rtl/>
-          <w:lang w:bidi="fa-IR"/>
-          <w:sz w:val="24"/>
-          <w:szCs w:val="24"/>
-        </w:rPr>
-        <w:t xml:space="preserve"> (۲۰۲۳) در پژوهشی با عنوان «تأثیر طرحواره‌های ناسازگار اولیه بر گرایش به رفتارهای پرخطر با نقش میانجی تنظیم هیجان در دانش‌آموزان پسر دورهٔ دوم متوسطه»، به بررسی ریشه‌های شناختی رفتارهای پرخطر در نوجوانان پرداختند. موضوع دقیق پژوهش آن‌ها، آزمون این فرضیه بود که آیا طرحواره‌های ناسازگار اولیه می‌توانند پیش‌بینی‌کننده تمایل فرد به اتخاذ موقعیت‌های پرخطر باشند. یافته کلیدی این مطالعه نشان داد که طرحواره‌ها اثر مستقیم، مثبت و معناداری بر رفتارهای پرخطر دارند و نقش واسطه‌ای "تنظیم هیجان" در این فرآیند تأیید شد. این پژوهش، هرچند در جامعه‌ای متفاوت (دانش‌آموزان) انجام شده، با فرضیهٔ اصلی پژوهش حاضر هم‌راستاست و نشان می‌دهد که باورهای عمیق شناختی، محرک رفتارهای پرخطر هستند.</w:t>
+        <w:footnoteReference w:id="102"/>
+      </w:r>
+      <w:r>
+        <w:rPr>
+          <w:rFonts w:ascii="B Nazanin" w:hAnsi="B Nazanin" w:cs="B Nazanin" w:hint="cs"/>
+          <w:rtl/>
+          <w:lang w:bidi="fa-IR"/>
+          <w:sz w:val="24"/>
+          <w:szCs w:val="24"/>
+        </w:rPr>
+        <w:t xml:space="preserve"> (۲۰۲۳) در پژوهشی با عنوان «تأثیر طرحواره‌های ناسازگار اولیه بر گرایش به رفتارهای پرخطر با نقش میانجی تنظیم هیجان در دانش‌آموزان پسر دوره دوم متوسطه»، به بررسی ریشه‌های شناختی رفتارهای پرخطر در نوجوانان پرداختند. موضوع دقیق پژوهش آن‌ها، آزمون این فرضیه بود که آیا طرحواره‌های ناسازگار اولیه می‌توانند پیش‌بینی‌کننده تمایل فرد به اتخاذ موقعیت‌های پرخطر باشند. یافته کلیدی این مطالعه نشان داد که طرحواره‌ها اثر مستقیم، مثبت و معناداری بر رفتارهای پرخطر دارند و نقش واسطه‌ای "تنظیم هیجان" در این فرآیند تأیید شد. این پژوهش، هرچند در جامعه‌ای متفاوت (دانش‌آموزان) انجام شده، با فرضیه اصلی پژوهش حاضر هم‌راستاست و نشان می‌دهد که باورهای عمیق شناختی، محرک رفتارهای پرخطر هستند.</w:t>
       </w:r>
     </w:p>
     <w:p>
@@ -7565,7 +7562,7 @@
           <w:rtl/>
           <w:vertAlign w:val="superscript"/>
         </w:rPr>
-        <w:footnoteReference w:id="102"/>
+        <w:footnoteReference w:id="103"/>
       </w:r>
       <w:r>
         <w:rPr>
@@ -7617,7 +7614,7 @@
           <w:rtl/>
           <w:vertAlign w:val="superscript"/>
         </w:rPr>
-        <w:footnoteReference w:id="103"/>
+        <w:footnoteReference w:id="104"/>
       </w:r>
       <w:r>
         <w:rPr>
@@ -7720,7 +7717,7 @@
           <w:rtl/>
           <w:vertAlign w:val="superscript"/>
         </w:rPr>
-        <w:footnoteReference w:id="104"/>
+        <w:footnoteReference w:id="105"/>
       </w:r>
       <w:r>
         <w:rPr>
@@ -7755,7 +7752,7 @@
           <w:rtl/>
           <w:vertAlign w:val="superscript"/>
         </w:rPr>
-        <w:footnoteReference w:id="105"/>
+        <w:footnoteReference w:id="106"/>
       </w:r>
       <w:r>
         <w:rPr>
@@ -7807,7 +7804,7 @@
           <w:rtl/>
           <w:vertAlign w:val="superscript"/>
         </w:rPr>
-        <w:footnoteReference w:id="106"/>
+        <w:footnoteReference w:id="107"/>
       </w:r>
       <w:r>
         <w:rPr>
@@ -7876,7 +7873,7 @@
           <w:rtl/>
           <w:vertAlign w:val="superscript"/>
         </w:rPr>
-        <w:footnoteReference w:id="107"/>
+        <w:footnoteReference w:id="108"/>
       </w:r>
       <w:r>
         <w:rPr>
@@ -7944,6 +7941,7 @@
       <w:pPr>
         <w:pStyle w:val="Heading3"/>
         <w:bidi w:val="1"/>
+        <w:jc w:val="right"/>
       </w:pPr>
       <w:r>
         <w:rPr>
@@ -7972,7 +7970,7 @@
           <w:sz w:val="24"/>
           <w:szCs w:val="24"/>
         </w:rPr>
-        <w:t xml:space="preserve">مرور پیشینهٔ داخلی و خارجی این فصل یک تصویر کلی روشن دارد: ادبیات موجود، دو رشته شاهد تجربی نسبتاً منسجم را فراهم آورده است. در رشتهٔ نخست، شواهدی از پیوند میان متغیرهای مرتبط با اضطراب و پیامدهای مالی گزارش شده است: در بافت داخلی، روان‌رنجورخویی با الگوهای رفتار معاملاتی سرمایه‌گذاران بورس تهران رابطهٔ معنادار داشته (ستایش و همکاران، ۱۳۹۹) و ویژگی‌های فردی و سطح ریسک‌پذیری، بروز رفتار توده‌وار را پیش‌بینی کرده‌اند (بهدیو و همکاران، ۱۳۹۸)؛ در بافت خارجی نیز نقش اضطراب در تصمیم‌های مالی (چارلز و کاسیلینگام، ۲۰۲۲) و تأثیر اضطراب مالی بر کاهش نگهداری دارایی‌های پرریسک (آن و همکاران، ۲۰۲۱) تأیید شده و عوامل اضطرابی، هم فرایند تصمیم‌گیری و هم ظرفیت تحمل ریسک را مختل ساخته‌اند (سافیتری و همکاران</w:t>
+        <w:t xml:space="preserve">مرور پیشینه داخلی و خارجی این فصل یک تصویر کلی روشن دارد: ادبیات موجود، دو رشته شاهد تجربی نسبتاً منسجم را فراهم آورده است. در رشته نخست، شواهدی از پیوند میان متغیرهای مرتبط با اضطراب و پیامدهای مالی گزارش شده است: در بافت داخلی، روان‌رنجورخویی با الگوهای رفتار معاملاتی سرمایه‌گذاران بورس تهران رابطه معنادار داشته (ستایش و همکاران، ۱۳۹۹) و ویژگی‌های فردی و سطح ریسک‌پذیری، بروز رفتار توده‌وار را پیش‌بینی کرده‌اند (بهدیو و همکاران، ۱۳۹۸)؛ در بافت خارجی نیز نقش اضطراب در تصمیم‌های مالی (چارلز و کاسیلینگام، ۲۰۲۲) و تأثیر اضطراب مالی بر کاهش نگهداری دارایی‌های پرریسک (آن و همکاران، ۲۰۲۱) تأیید شده و عوامل اضطرابی، هم فرایند تصمیم‌گیری و هم ظرفیت تحمل ریسک را مختل ساخته‌اند (سافیتری و همکاران</w:t>
       </w:r>
       <w:r>
         <w:rPr>
@@ -7980,17 +7978,17 @@
           <w:rtl/>
           <w:vertAlign w:val="superscript"/>
         </w:rPr>
-        <w:footnoteReference w:id="108"/>
-      </w:r>
-      <w:r>
-        <w:rPr>
-          <w:rFonts w:ascii="B Nazanin" w:hAnsi="B Nazanin" w:cs="B Nazanin" w:hint="cs"/>
-          <w:rtl/>
-          <w:lang w:bidi="fa-IR"/>
-          <w:sz w:val="24"/>
-          <w:szCs w:val="24"/>
-        </w:rPr>
-        <w:t xml:space="preserve">، ۲۰۲۵). در رشتهٔ دوم، طرحواره‌های ناسازگار اولیه با رفتارهای تکانشی و اعتیادگونه مرتبط بوده‌اند؛ به‌گونه‌ای که حوزه‌های محدودیت‌های مختل و بریدگی و طرد، گرایش به اعتیاد را پیش‌بینی کرده‌اند (امیدی و همکاران، ۱۳۹۲)، شدت این طرحواره‌ها در قماربازان آسیب‌شناختی بیشتر بوده است (لیندبرگ و همکاران، ۲۰۱۱) و مرور نظام‌مند شواهد نیز پیوند آن‌ها را با اعتیادهای رفتاری تأیید کرده است (ویرا و همکاران، ۲۰۲۳).</w:t>
+        <w:footnoteReference w:id="109"/>
+      </w:r>
+      <w:r>
+        <w:rPr>
+          <w:rFonts w:ascii="B Nazanin" w:hAnsi="B Nazanin" w:cs="B Nazanin" w:hint="cs"/>
+          <w:rtl/>
+          <w:lang w:bidi="fa-IR"/>
+          <w:sz w:val="24"/>
+          <w:szCs w:val="24"/>
+        </w:rPr>
+        <w:t xml:space="preserve">، ۲۰۲۵). در رشته دوم، طرحواره‌های ناسازگار اولیه با رفتارهای تکانشی و اعتیادگونه مرتبط بوده‌اند؛ به‌گونه‌ای که حوزه‌های محدودیت‌های مختل و بریدگی و طرد، گرایش به اعتیاد را پیش‌بینی کرده‌اند (امیدی و همکاران، ۱۳۹۲)، شدت این طرحواره‌ها در قماربازان آسیب‌شناختی بیشتر بوده است (لیندبرگ و همکاران، ۲۰۱۱) و مرور نظام‌مند شواهد نیز پیوند آن‌ها را با اعتیادهای رفتاری تأیید کرده است (ویرا و همکاران، ۲۰۲۳).</w:t>
       </w:r>
     </w:p>
     <w:p>
@@ -8007,7 +8005,7 @@
           <w:sz w:val="24"/>
           <w:szCs w:val="24"/>
         </w:rPr>
-        <w:t xml:space="preserve">با وجود این شواهد، ادبیات موجود از چند ناهمسانی و محدودیت مهم رنج می‌برد. نخست، جهت رابطهٔ اضطراب با رفتار پرخطر یکسان نیست: در مقابل شواهد ریسک‌گریزی، مانند کاهش سهم دارایی‌های پرریسک در افراد مضطرب (آن و همکاران، ۲۰۲۱)، شواهدی نیز از واکنش‌های پرخطر گزارش شده است؛ از جمله معامله‌گری برای فرار از پریشانی هیجانی که از مؤلفه‌های اختلال معامله‌گری شناسایی شده است (گرال-برونک و همکاران، ۲۰۲۵). دوم، بخش قابل‌توجهی از مطالعات به‌جای معامله‌گران واقعی، بر نمونه‌های دانشجویی (نوری و هاشمیان، ۱۳۹۶؛ امیدی و همکاران، ۱۳۹۲؛ اولولو و همکاران</w:t>
+        <w:t xml:space="preserve">با وجود این شواهد، ادبیات موجود از چند ناهمسانی و محدودیت مهم رنج می‌برد. نخست، جهت رابطه اضطراب با رفتار پرخطر یکسان نیست: در مقابل شواهد ریسک‌گریزی، مانند کاهش سهم دارایی‌های پرریسک در افراد مضطرب (آن و همکاران، ۲۰۲۱)، شواهدی نیز از واکنش‌های پرخطر گزارش شده است؛ از جمله معامله‌گری برای فرار از پریشانی هیجانی که از مؤلفه‌های اختلال معامله‌گری شناسایی شده است (گرال-برونک و همکاران، ۲۰۲۵). دوم، بخش قابل‌توجهی از مطالعات به‌جای معامله‌گران واقعی، بر نمونه‌های دانشجویی (نوری و هاشمیان، ۱۳۹۶؛ امیدی و همکاران، ۱۳۹۲؛ اولولو و همکاران</w:t>
       </w:r>
       <w:r>
         <w:rPr>
@@ -8015,7 +8013,7 @@
           <w:rtl/>
           <w:vertAlign w:val="superscript"/>
         </w:rPr>
-        <w:footnoteReference w:id="109"/>
+        <w:footnoteReference w:id="110"/>
       </w:r>
       <w:r>
         <w:rPr>
@@ -8042,13 +8040,14 @@
           <w:sz w:val="24"/>
           <w:szCs w:val="24"/>
         </w:rPr>
-        <w:t xml:space="preserve">برآیند این بررسی، شکاف پژوهشی  مشخصی را نمایان می‌سازد: بر اساس مرور انجام‌شده، پژوهشی که در آن رابطهٔ اضطراب صفتی با رفتارهای مالی پرخطر از مسیر میانجی‌گری طرحواره‌های ناسازگار اولیه و در جامعهٔ معامله‌گران ایرانی به‌طور هم‌زمان آزمون شده باشد، یافت نشد. پژوهش حاضر در پی پر کردن این شکاف است؛ به این صورت که سه متغیر اصلی را در یک مدل میانجی یکپارچه و بر روی نمونه‌ای از معامله‌گران بازارهای مالی می‌آزماید و از این رهگذر، هم به ابهام موجود دربارهٔ جهت رابطهٔ اضطراب و ریسک‌پذیری پاسخ می‌دهد و هم مکانیسم شناختی تبدیل تنش هیجانی به رفتار مالی پرخطر را تبیین می‌کند. از سوی دیگر، تمرکز بر سازوکار میانجی امکان طراحی مداخله‌های هدفمندتر را فراهم می‌آورد؛ زیرا نقطهٔ اثرگذاری بالینی را از مدیریت صرف اضطراب به سطح باورهای بنیادین منتقل می‌سازد. بر این اساس، نتایج این آزمون، مبنای بحث دربارهٔ تعمیم‌پذیری یافته‌ها و کاربردهای بالینی آن‌ها در فصل‌های آتی قرار خواهد گرفت.</w:t>
+        <w:t xml:space="preserve">برآیند این بررسی، شکاف پژوهشی  مشخصی را نمایان می‌سازد: بر اساس مرور انجام‌شده، پژوهشی که در آن رابطه اضطراب صفتی با رفتارهای مالی پرخطر از مسیر میانجی‌گری طرحواره‌های ناسازگار اولیه و در جامعه معامله‌گران ایرانی به‌طور هم‌زمان آزمون شده باشد، یافت نشد. پژوهش حاضر در پی پر کردن این شکاف است؛ به این صورت که سه متغیر اصلی را در یک مدل میانجی یکپارچه و بر روی نمونه‌ای از معامله‌گران بازارهای مالی می‌آزماید و از این رهگذر، هم به ابهام موجود درباره جهت رابطه اضطراب و ریسک‌پذیری پاسخ می‌دهد و هم مکانیسم شناختی تبدیل تنش هیجانی به رفتار مالی پرخطر را تبیین می‌کند. از سوی دیگر، تمرکز بر سازوکار میانجی امکان طراحی مداخله‌های هدفمندتر را فراهم می‌آورد؛ زیرا نقطه اثرگذاری بالینی را از مدیریت صرف اضطراب به سطح باورهای بنیادین منتقل می‌سازد. بر این اساس، نتایج این آزمون، مبنای بحث درباره تعمیم‌پذیری یافته‌ها و کاربردهای بالینی آن‌ها در فصل‌های آتی قرار خواهد گرفت.</w:t>
       </w:r>
     </w:p>
     <w:p>
       <w:pPr>
         <w:pStyle w:val="Heading2"/>
         <w:bidi w:val="1"/>
+        <w:jc w:val="right"/>
       </w:pPr>
       <w:r>
         <w:rPr>
@@ -8077,7 +8076,7 @@
           <w:sz w:val="24"/>
           <w:szCs w:val="24"/>
         </w:rPr>
-        <w:t xml:space="preserve">بر پایهٔ مبانی نظری و پیشینهٔ پژوهشی مرورشده در این فصل، مدل مفهومی پژوهش حاضر از سه متغیر اصلی تشکیل شده است که جایگاه هر یک در ساختار مدل و ابزار سنجش آن به‌طور مشخص تعریف می‌شود. اضطراب صفتی به‌عنوان متغیر مستقل، نقطهٔ آغاز مدل است و با فرم اضطراب صفتی (</w:t>
+        <w:t xml:space="preserve">بر پایه مبانی نظری و پیشینه پژوهشی مرورشده در این فصل، مدل مفهومی پژوهش حاضر از سه متغیر اصلی تشکیل شده است که جایگاه هر یک در ساختار مدل و ابزار سنجش آن به‌طور مشخص تعریف می‌شود. اضطراب صفتی به‌عنوان متغیر مستقل، نقطه آغاز مدل است و با فرم اضطراب صفتی (</w:t>
       </w:r>
       <w:r>
         <w:rPr>
@@ -8096,7 +8095,7 @@
           <w:sz w:val="24"/>
           <w:szCs w:val="24"/>
         </w:rPr>
-        <w:t xml:space="preserve">-2) پرسشنامهٔ اضطراب حالت-صفت اسپیلبرگر سنجیده می‌شود. طرحواره‌های ناسازگار اولیه به‌عنوان متغیر میانجی، مکانیسم انتقال اثر اضطراب به رفتار مالی را بازنمایی می‌کنند و با پرسشنامهٔ طرحوارهٔ یانگ — فرم کوتاه ارزیابی می‌گردند. رفتارهای مالی پرخطر نیز به‌عنوان متغیر وابسته، در قالب سازهٔ تحمل ریسک مالی و با مقیاس سیزده‌سؤالی گرابل و لایتون اندازه‌گیری می‌شود؛ به‌گونه‌ای که نمرات بالاتر، نشان‌دهندهٔ تمایل بیشتر به پذیرش ریسک و در نتیجه بروز بیشتر رفتارهای مالی پرخطر است. انتخاب این سه سازه و ابزارهای سنجش آن‌ها، برآیند مستقیم تحلیل نظری فصل حاضر است و در عین حال با تعاریف عملیاتی مندرج در فصل اول پایان‌نامه هم‌خوانی کامل دارد.</w:t>
+        <w:t xml:space="preserve">-2) پرسشنامه اضطراب حالت-صفت اسپیلبرگر سنجیده می‌شود. طرحواره‌های ناسازگار اولیه به‌عنوان متغیر میانجی، مکانیسم انتقال اثر اضطراب به رفتار مالی را بازنمایی می‌کنند و با پرسشنامه طرحواره یانگ — فرم کوتاه ارزیابی می‌گردند. رفتارهای مالی پرخطر نیز به‌عنوان متغیر وابسته، در قالب سازه تحمل ریسک مالی و با مقیاس سیزده‌سؤالی گرابل و لایتون اندازه‌گیری می‌شود؛ به‌گونه‌ای که نمرات بالاتر، نشان‌دهنده تمایل بیشتر به پذیرش ریسک و در نتیجه بروز بیشتر رفتارهای مالی پرخطر است. انتخاب این سه سازه و ابزارهای سنجش آن‌ها، برآیند مستقیم تحلیل نظری فصل حاضر است و در عین حال با تعاریف عملیاتی مندرج در فصل اول پایان‌نامه هم‌خوانی کامل دارد.</w:t>
       </w:r>
     </w:p>
     <w:tbl>
@@ -8460,7 +8459,7 @@
           <w:sz w:val="24"/>
           <w:szCs w:val="24"/>
         </w:rPr>
-        <w:t xml:space="preserve">فرضیه‌های پژوهش دقیقاً بر همین ساختار مسیرها استوارند و هر فرضیه به مسیر متناظر خود در مدل ارجاع می‌شود. بر این اساس، فرضیهٔ فرعی دوم مقرر می‌دارد که «بین اضطراب صفتی و رفتارهای مالی پرخطر، رابطه مثبت و معناداری وجود دارد» و ناظر به مسیر مستقیم مدل است. فرضیهٔ فرعی سوم بیان می‌کند که «بین اضطراب صفتی و طرحواره‌های ناسازگار اولیه، رابطه مثبت و معناداری وجود دارد» و مسیر </w:t>
+        <w:t xml:space="preserve">فرضیه‌های پژوهش دقیقاً بر همین ساختار مسیرها استوارند و هر فرضیه به مسیر متناظر خود در مدل ارجاع می‌شود. بر این اساس، فرضیه فرعی دوم مقرر می‌دارد که «بین اضطراب صفتی و رفتارهای مالی پرخطر، رابطه مثبت و معناداری وجود دارد» و ناظر به مسیر مستقیم مدل است. فرضیه فرعی سوم بیان می‌کند که «بین اضطراب صفتی و طرحواره‌های ناسازگار اولیه، رابطه مثبت و معناداری وجود دارد» و مسیر </w:t>
       </w:r>
       <w:r>
         <w:rPr>
@@ -8479,7 +8478,7 @@
           <w:sz w:val="24"/>
           <w:szCs w:val="24"/>
         </w:rPr>
-        <w:t xml:space="preserve"> را آزمون می‌کند. فرضیهٔ فرعی چهارم نیز مقرر می‌دارد که «بین طرحواره‌های ناسازگار اولیه و رفتارهای مالی پرخطر، رابطه مثبت و معناداری وجود دارد» و با مسیر </w:t>
+        <w:t xml:space="preserve"> را آزمون می‌کند. فرضیه فرعی چهارم نیز مقرر می‌دارد که «بین طرحواره‌های ناسازگار اولیه و رفتارهای مالی پرخطر، رابطه مثبت و معناداری وجود دارد» و با مسیر </w:t>
       </w:r>
       <w:r>
         <w:rPr>
@@ -8498,7 +8497,7 @@
           <w:sz w:val="24"/>
           <w:szCs w:val="24"/>
         </w:rPr>
-        <w:t xml:space="preserve"> متناظر است. در نهایت، فرضیهٔ اصلی پژوهش تصریح می‌کند که «طرحواره‌های ناسازگار اولیه در رابطه بین اضطراب صفتی و رفتارهای مالی پرخطر، نقش میانجی‌گر معناداری دارند»؛ این فرضیه به‌طور مشخص بر معناداری مسیر غیرمستقیم (</w:t>
+        <w:t xml:space="preserve"> متناظر است. در نهایت، فرضیه اصلی پژوهش تصریح می‌کند که «طرحواره‌های ناسازگار اولیه در رابطه بین اضطراب صفتی و رفتارهای مالی پرخطر، نقش میانجی‌گر معناداری دارند»؛ این فرضیه به‌طور مشخص بر معناداری مسیر غیرمستقیم (</w:t>
       </w:r>
       <w:r>
         <w:rPr>
@@ -8517,7 +8516,7 @@
           <w:sz w:val="24"/>
           <w:szCs w:val="24"/>
         </w:rPr>
-        <w:t xml:space="preserve">) دلالت دارد و آزمون آن، هستهٔ تحلیلی پژوهش حاضر را تشکیل می‌دهد.</w:t>
+        <w:t xml:space="preserve">) دلالت دارد و آزمون آن، هسته تحلیلی پژوهش حاضر را تشکیل می‌دهد.</w:t>
       </w:r>
     </w:p>
     <w:p>
@@ -8534,7 +8533,7 @@
           <w:sz w:val="24"/>
           <w:szCs w:val="24"/>
         </w:rPr>
-        <w:t xml:space="preserve">مهم‌ترین ویژگی این مدل مفهومی، یکپارچه‌سازی سه سطح تحلیل در یک چارچوب واحد است. این سه سطح عبارت‌اند از سطح هیجانی با سازهٔ اضطراب صفتی، سطح شناختی عمیق با سازهٔ طرحواره‌های ناسازگار اولیه، و سطح رفتار عینی با سازهٔ رفتارهای مالی پرخطر. این یکپارچگی امکان آن را فراهم می‌آورد که پژوهش حاضر از توصیف صرف روابط دوجانبه فراتر رفته و به پرسش مکانیسمی پاسخ دهد؛ پرسشی که می‌پرسد اضطراب از چه مسیری به رفتار مالی پرخطر تبدیل می‌شود. در عین حال، این مدل با تکیه بر ابزارهای استاندارد و اعتباریابی‌شده، امکان آزمون کمّی دقیق فرضیه‌ها را در چارچوب روش‌های تحلیل چندمتغیری فراهم می‌سازد و چارچوبی روشن برای تفسیر یافته‌ها در فصل‌های بعدی ارائه می‌دهد. شایان ذکر است که ساختار تک‌میانجی این مدل، سادگی تحلیلی لازم برای آزمون در حجم نمونهٔ پیش‌بینی‌شده را حفظ می‌کند و در صورت تأیید، می‌تواند در پژوهش‌های آتی با افزودن میانجی‌ها یا متغیرهای تعدیل‌گر بیشتر گسترش یابد.</w:t>
+        <w:t xml:space="preserve">مهم‌ترین ویژگی این مدل مفهومی، یکپارچه‌سازی سه سطح تحلیل در یک چارچوب واحد است. این سه سطح عبارت‌اند از سطح هیجانی با سازه اضطراب صفتی، سطح شناختی عمیق با سازه طرحواره‌های ناسازگار اولیه، و سطح رفتار عینی با سازه رفتارهای مالی پرخطر. این یکپارچگی امکان آن را فراهم می‌آورد که پژوهش حاضر از توصیف صرف روابط دوجانبه فراتر رفته و به پرسش مکانیسمی پاسخ دهد؛ پرسشی که می‌پرسد اضطراب از چه مسیری به رفتار مالی پرخطر تبدیل می‌شود. در عین حال، این مدل با تکیه بر ابزارهای استاندارد و اعتباریابی‌شده، امکان آزمون کمّی دقیق فرضیه‌ها را در چارچوب روش‌های تحلیل چندمتغیری فراهم می‌سازد و چارچوبی روشن برای تفسیر یافته‌ها در فصل‌های بعدی ارائه می‌دهد. شایان ذکر است که ساختار تک‌میانجی این مدل، سادگی تحلیلی لازم برای آزمون در حجم نمونه پیش‌بینی‌شده را حفظ می‌کند و در صورت تأیید، می‌تواند در پژوهش‌های آتی با افزودن میانجی‌ها یا متغیرهای تعدیل‌گر بیشتر گسترش یابد.</w:t>
       </w:r>
     </w:p>
     <w:p>
@@ -8551,7 +8550,7 @@
           <w:sz w:val="24"/>
           <w:szCs w:val="24"/>
         </w:rPr>
-        <w:t xml:space="preserve">با تکمیل مبانی نظری، پیشینهٔ پژوهشی و مدل مفهومی در این فصل، زمینهٔ ورود به مرحلهٔ عملیاتی پژوهش فراهم می‌شود. در فصل سوم، روش پژوهش شامل طرح مطالعه، جامعه و نمونه، ابزارهای اندازه‌گیری و روش تحلیل داده‌ها برای آزمون فرضیه‌های مدل مفهومی به تفصیل ارائه خواهد شد. تا چارچوب مفهومی این فصل به برنامه‌ای اجرایی و قابل آزمون تبدیل شود.</w:t>
+        <w:t xml:space="preserve">با تکمیل مبانی نظری، پیشینه پژوهشی و مدل مفهومی در این فصل، زمینه ورود به مرحله عملیاتی پژوهش فراهم می‌شود. در فصل سوم، روش پژوهش شامل طرح مطالعه، جامعه و نمونه، ابزارهای اندازه‌گیری و روش تحلیل داده‌ها برای آزمون فرضیه‌های مدل مفهومی به تفصیل ارائه خواهد شد. تا چارچوب مفهومی این فصل به برنامه‌ای اجرایی و قابل آزمون تبدیل شود.</w:t>
       </w:r>
     </w:p>
     <w:p>
@@ -8616,6 +8615,7 @@
       <w:pPr>
         <w:pStyle w:val="Heading2"/>
         <w:bidi w:val="1"/>
+        <w:jc w:val="right"/>
       </w:pPr>
       <w:r>
         <w:rPr>
@@ -8644,13 +8644,14 @@
           <w:sz w:val="24"/>
           <w:szCs w:val="24"/>
         </w:rPr>
-        <w:t xml:space="preserve">فصل سوم به تشریح دقیق روش پژوهش اختصاص دارد؛ روشی که برای آزمون فرضیه‌های پژوهش تدوین شده و در همهٔ مراحل اجرا مبنای عمل خواهد بود. در پژوهش‌های همبستگی، به‌ویژه هنگامی که داده‌ها در بافت طبیعی و بدون کنترل آزمایشگاهی گردآوری می‌شوند، شفافیت روش‌شناختی اهمیت مضاعفی می‌یابد؛ زیرا اعتبار نتیجه‌گیری‌ها بیش از آنکه به حجم داده‌ها وابسته باشد، به وضوح و از پیش تعیین‌شدگی مسیر گردآوری و تحلیل آن‌ها وابسته است. بر این اساس، در این فصل نخست طرح پژوهش (بخش ۳-۲) معرفی می‌شود و پس از آن، جامعهٔ آماری، نمونه و روش نمونه‌گیری (بخش ۳-۳) و ابزارهای اندازه‌گیری (بخش ۳-۴) ارائه خواهند شد. ادامهٔ فصل نیز به روش اجرای پژوهش (بخش ۳-۵)، روش تحلیل داده‌ها (بخش ۳-۶) و ملاحظات اخلاقی (بخش ۳-۷) اختصاص دارد. آنچه در ادامهٔ این بخش از فصل می‌آید، چهار بخش نخست را در بر می‌گیرد و بخش‌های بعدی در ادامهٔ تدوین فصل تکمیل خواهند شد.</w:t>
+        <w:t xml:space="preserve">فصل سوم به تشریح دقیق روش پژوهش اختصاص دارد؛ روشی که برای آزمون فرضیه‌های پژوهش تدوین شده و در همه مراحل اجرا مبنای عمل خواهد بود. در پژوهش‌های همبستگی، به‌ویژه هنگامی که داده‌ها در بافت طبیعی و بدون کنترل آزمایشگاهی گردآوری می‌شوند، شفافیت روش‌شناختی اهمیت مضاعفی می‌یابد؛ زیرا اعتبار نتیجه‌گیری‌ها بیش از آنکه به حجم داده‌ها وابسته باشد، به وضوح و از پیش تعیین‌شدگی مسیر گردآوری و تحلیل آن‌ها وابسته است. بر این اساس، در این فصل نخست طرح پژوهش (بخش ۳-۲) معرفی می‌شود و پس از آن، جامعه آماری، نمونه و روش نمونه‌گیری (بخش ۳-۳) و ابزارهای اندازه‌گیری (بخش ۳-۴) ارائه خواهند شد. ادامه فصل نیز به روش اجرای پژوهش (بخش ۳-۵)، روش تحلیل داده‌ها (بخش ۳-۶) و ملاحظات اخلاقی (بخش ۳-۷) اختصاص دارد. آنچه در ادامه این بخش از فصل می‌آید، چهار بخش نخست را در بر می‌گیرد و بخش‌های بعدی در ادامه تدوین فصل تکمیل خواهند شد.</w:t>
       </w:r>
     </w:p>
     <w:p>
       <w:pPr>
         <w:pStyle w:val="Heading2"/>
         <w:bidi w:val="1"/>
+        <w:jc w:val="right"/>
       </w:pPr>
       <w:r>
         <w:rPr>
@@ -8679,7 +8680,7 @@
           <w:sz w:val="24"/>
           <w:szCs w:val="24"/>
         </w:rPr>
-        <w:t xml:space="preserve">پژوهش حاضر از نظر هدف، در زمرهٔ پژوهش‌های کاربردی </w:t>
+        <w:t xml:space="preserve">پژوهش حاضر از نظر هدف، در زمره پژوهش‌های کاربردی </w:t>
       </w:r>
       <w:r>
         <w:rPr>
@@ -8697,7 +8698,7 @@
           <w:sz w:val="24"/>
           <w:szCs w:val="24"/>
         </w:rPr>
-        <w:t xml:space="preserve"> قرار می‌گیرد؛ زیرا در پی تولید دانشی است که نتایج آن به طور مستقیم در طراحی ابزارهای غربالگری روانشناختی، تدوین پروتکل‌های درمانی کوتاه‌مدت و برنامه‌های آموزشی ویژهٔ معامله‌گران بازارهای مالی به کار گرفته می‌شود. در واقع، خروجی این پژوهش صرفاً توصیف یک وضعیت نیست، بلکه مبنایی عملیاتی برای مداخله در یکی از مسائل ملموس سلامت روان در بازارهای مالی فراهم می‌آورد.</w:t>
+        <w:t xml:space="preserve"> قرار می‌گیرد؛ زیرا در پی تولید دانشی است که نتایج آن به طور مستقیم در طراحی ابزارهای غربالگری روانشناختی، تدوین پروتکل‌های درمانی کوتاه‌مدت و برنامه‌های آموزشی ویژه معامله‌گران بازارهای مالی به کار گرفته می‌شود. در واقع، خروجی این پژوهش صرفاً توصیف یک وضعیت نیست، بلکه مبنایی عملیاتی برای مداخله در یکی از مسائل ملموس سلامت روان در بازارهای مالی فراهم می‌آورد.</w:t>
       </w:r>
     </w:p>
     <w:p>
@@ -8767,7 +8768,7 @@
           <w:sz w:val="24"/>
           <w:szCs w:val="24"/>
         </w:rPr>
-        <w:t xml:space="preserve"> است. از آنجا که پرسش بنیادین پژوهش حاضر نه صرفاً وجود رابطه میان اضطراب صفتی و رفتارهای مالی پرخطر، بلکه چگونگی تبدیل یک ویژگی شخصیتی پایدار به رفتار مالی عینی است، طرح همبستگی ساده برای پاسخ به آن کافی نیست. مدل میانجی‌گری امکان می‌دهد اثر کل اضطراب صفتی (متغیر مستقل) بر رفتارهای مالی پرخطر (متغیر وابسته) به دو مؤلفهٔ اثر مستقیم و اثر غیرمستقیم تجزیه شود؛ اثر غیرمستقیم مسیری است که از مجرای طرحواره‌های ناسازگار اولیه (متغیر میانجی) عبور می‌کند و در واقع سازوکار شناختی پیشنهادی پژوهش را به آزمون می‌گذارد.</w:t>
+        <w:t xml:space="preserve"> است. از آنجا که پرسش بنیادین پژوهش حاضر نه صرفاً وجود رابطه میان اضطراب صفتی و رفتارهای مالی پرخطر، بلکه چگونگی تبدیل یک ویژگی شخصیتی پایدار به رفتار مالی عینی است، طرح همبستگی ساده برای پاسخ به آن کافی نیست. مدل میانجی‌گری امکان می‌دهد اثر کل اضطراب صفتی (متغیر مستقل) بر رفتارهای مالی پرخطر (متغیر وابسته) به دو مؤلفه اثر مستقیم و اثر غیرمستقیم تجزیه شود؛ اثر غیرمستقیم مسیری است که از مجرای طرحواره‌های ناسازگار اولیه (متغیر میانجی) عبور می‌کند و در واقع سازوکار شناختی پیشنهادی پژوهش را به آزمون می‌گذارد.</w:t>
       </w:r>
     </w:p>
     <w:p>
@@ -8801,7 +8802,7 @@
           <w:sz w:val="24"/>
           <w:szCs w:val="24"/>
         </w:rPr>
-        <w:t xml:space="preserve">برای برآورد این مدل، دو چارچوب تحلیلی در نظر گرفته شده است: روش اصلی، مدل‌سازی معادلات ساختاری است که در صورت کفایت حجم نمونه به کار گرفته خواهد شد، و روش جایگزین، تحلیل مسیر با ماکروی پراسس — الگوی شمارهٔ ۴ (</w:t>
+        <w:t xml:space="preserve">برای برآورد این مدل، دو چارچوب تحلیلی در نظر گرفته شده است: روش اصلی، مدل‌سازی معادلات ساختاری است که در صورت کفایت حجم نمونه به کار گرفته خواهد شد، و روش جایگزین، تحلیل مسیر با ماکروی پراسس — الگوی شماره ۴ (</w:t>
       </w:r>
       <w:r>
         <w:rPr>
@@ -8844,6 +8845,7 @@
       <w:pPr>
         <w:pStyle w:val="Heading2"/>
         <w:bidi w:val="1"/>
+        <w:jc w:val="right"/>
       </w:pPr>
       <w:r>
         <w:rPr>
@@ -8855,13 +8857,14 @@
           <w:b/>
           <w:bCs/>
         </w:rPr>
-        <w:t xml:space="preserve">۳-۳. جامعهٔ آماری، نمونه و روش نمونه‌گیری</w:t>
+        <w:t xml:space="preserve">۳-۳. جامعه آماری، نمونه و روش نمونه‌گیری</w:t>
       </w:r>
     </w:p>
     <w:p>
       <w:pPr>
         <w:pStyle w:val="Heading3"/>
         <w:bidi w:val="1"/>
+        <w:jc w:val="right"/>
       </w:pPr>
       <w:r>
         <w:rPr>
@@ -8873,7 +8876,7 @@
           <w:b/>
           <w:bCs/>
         </w:rPr>
-        <w:t xml:space="preserve">۳-۳-۱. جامعهٔ آماری</w:t>
+        <w:t xml:space="preserve">۳-۳-۱. جامعه آماری</w:t>
       </w:r>
     </w:p>
     <w:p>
@@ -8890,13 +8893,14 @@
           <w:sz w:val="24"/>
           <w:szCs w:val="24"/>
         </w:rPr>
-        <w:t xml:space="preserve">جامعهٔ آماری پژوهش حاضر را کلیهٔ معامله‌گران حقیقی فارسی‌زبان تشکیل می‌دهند که در بازهٔ زمانی اجرای پژوهش، حداقل به مدت شش ماه در بازارهای مالی ایران (شامل بورس اوراق بهادار تهران، فرابورس و بورس انرژی) یا بازارهای مالی بین‌المللی (شامل بازار تبادل ارزهای خارجی و بازار ارزهای دیجیتال) سابقهٔ فعالیت و انجام معامله داشته‌اند. انتخاب این جامعه از آن رو است که پژوهش حاضر به دنبال تبیین رفتار مالی در شرایط واقعی تصمیم‌گیری با پیامدهای عینی است و معامله‌گران حقیقی — برخلاف سرمایه‌گذاران نهادی — شخصاً بار هیجانی و شناختی تصمیم‌های مالی خود را تحمل می‌کنند؛ ویژگی‌ای که آنان را به جامعهٔ مناسبی برای مطالعهٔ نقش متغیرهای روانشناختی در رفتار مالی بدل می‌سازد.</w:t>
+        <w:t xml:space="preserve">جامعه آماری پژوهش حاضر را کلیه معامله‌گران حقیقی فارسی‌زبان تشکیل می‌دهند که در بازه زمانی اجرای پژوهش، حداقل به مدت شش ماه در بازارهای مالی ایران (شامل بورس اوراق بهادار تهران، فرابورس و بورس انرژی) یا بازارهای مالی بین‌المللی (شامل بازار تبادل ارزهای خارجی و بازار ارزهای دیجیتال) سابقه فعالیت و انجام معامله داشته‌اند. انتخاب این جامعه از آن رو است که پژوهش حاضر به دنبال تبیین رفتار مالی در شرایط واقعی تصمیم‌گیری با پیامدهای عینی است و معامله‌گران حقیقی — برخلاف سرمایه‌گذاران نهادی — شخصاً بار هیجانی و شناختی تصمیم‌های مالی خود را تحمل می‌کنند؛ ویژگی‌ای که آنان را به جامعه مناسبی برای مطالعه نقش متغیرهای روانشناختی در رفتار مالی بدل می‌سازد.</w:t>
       </w:r>
     </w:p>
     <w:p>
       <w:pPr>
         <w:pStyle w:val="Heading3"/>
         <w:bidi w:val="1"/>
+        <w:jc w:val="right"/>
       </w:pPr>
       <w:r>
         <w:rPr>
@@ -8961,7 +8965,7 @@
           <w:sz w:val="24"/>
           <w:szCs w:val="24"/>
         </w:rPr>
-        <w:t xml:space="preserve"> استفاده می‌شود. بدین صورت که پرسشنامهٔ آنلاین پژوهش — شامل فرم رضایت آگاهانه، سؤالات جمعیت‌شناختی و ابزارهای اندازه‌گیری متغیرها — در پلتفرم پرس‌لاین طراحی شده و از طریق کانال‌ها، گروه‌ها و انجمن‌های تخصصی معامله‌گری در شبکه‌های اجتماعی (مانند تلگرام، اینستاگرام و سایر پلتفرم‌ها) منتشر می‌شود. از شرکت‌کنندگان واجد شرایط نیز خواسته می‌شود لینک پرسشنامه را برای سایر همکاران و آشنایان معامله‌گر خود ارسال کنند؛ هدف، افزایش دامنهٔ دسترسی به نمونه‌های واجد شرایط در بازارهای مختلف است. به این ترتیب، نمونهٔ پژوهش ترکیبی از معامله‌گران خُرد و نیمه‌حرفه‌ای خواهد بود که به صورت فردی یا در قالب عضویت در گروه‌ها و کانال‌های آموزشی-تحلیلی بازارهای مالی فعالیت می‌کنند.</w:t>
+        <w:t xml:space="preserve"> استفاده می‌شود. بدین صورت که پرسشنامه آنلاین پژوهش — شامل فرم رضایت آگاهانه، سؤالات جمعیت‌شناختی و ابزارهای اندازه‌گیری متغیرها — در پلتفرم پرس‌لاین طراحی شده و از طریق کانال‌ها، گروه‌ها و انجمن‌های تخصصی معامله‌گری در شبکه‌های اجتماعی (مانند تلگرام، اینستاگرام و سایر پلتفرم‌ها) منتشر می‌شود. از شرکت‌کنندگان واجد شرایط نیز خواسته می‌شود لینک پرسشنامه را برای سایر همکاران و آشنایان معامله‌گر خود ارسال کنند؛ هدف، افزایش دامنه دسترسی به نمونه‌های واجد شرایط در بازارهای مختلف است. به این ترتیب، نمونه پژوهش ترکیبی از معامله‌گران خُرد و نیمه‌حرفه‌ای خواهد بود که به صورت فردی یا در قالب عضویت در گروه‌ها و کانال‌های آموزشی-تحلیلی بازارهای مالی فعالیت می‌کنند.</w:t>
       </w:r>
     </w:p>
     <w:p>
@@ -8978,7 +8982,7 @@
           <w:sz w:val="24"/>
           <w:szCs w:val="24"/>
         </w:rPr>
-        <w:t xml:space="preserve">گردآوری داده‌ها به شیوهٔ آنلاین، متناسب با ویژگی‌های جامعهٔ هدف انتخاب شده است؛ زیرا معامله‌گران در مناطق جغرافیایی مختلف پراکنده‌اند و بسیاری از آنان در بستر گروه‌ها و کانال‌های مجازی فعالیت می‌کنند. همچنین ناشناس بودن پاسخ‌دهی در فرم آنلاین، زمینهٔ گزارش‌دهی صادقانه‌تر را دربارهٔ خطاها و رفتارهای پرخطر معاملاتی فراهم می‌آورد؛ موضوعی که در پژوهش‌های مرتبط با تصمیم‌گیری مالی اهمیت ویژه‌ای دارد.</w:t>
+        <w:t xml:space="preserve">گردآوری داده‌ها به شیوه آنلاین، متناسب با ویژگی‌های جامعه هدف انتخاب شده است؛ زیرا معامله‌گران در مناطق جغرافیایی مختلف پراکنده‌اند و بسیاری از آنان در بستر گروه‌ها و کانال‌های مجازی فعالیت می‌کنند. همچنین ناشناس بودن پاسخ‌دهی در فرم آنلاین، زمینه گزارش‌دهی صادقانه‌تر را درباره خطاها و رفتارهای پرخطر معاملاتی فراهم می‌آورد؛ موضوعی که در پژوهش‌های مرتبط با تصمیم‌گیری مالی اهمیت ویژه‌ای دارد.</w:t>
       </w:r>
     </w:p>
     <w:p>
@@ -8995,7 +8999,7 @@
           <w:sz w:val="24"/>
           <w:szCs w:val="24"/>
         </w:rPr>
-        <w:t xml:space="preserve">گردآوری داده‌ها به مدت تقریبی دو ماه ادامه خواهد یافت و پس از رسیدن به حجم نمونهٔ مطلوب، متوقف می‌شود. در صفحهٔ ابتدایی پرسشنامه، رضایت‌نامهٔ آگاهانه الکترونیکی قرار داده شده است و شرکت‌کنندگان تنها در صورت تأیید گزینهٔ موافقت با شرکت در پژوهش، وارد بخش اصلی پرسشنامه‌ها می‌شوند؛ شرکت در پژوهش کاملاً داوطلبانه است و امکان انصراف در هر مرحله بدون هیچ پیامد منفی وجود دارد.</w:t>
+        <w:t xml:space="preserve">گردآوری داده‌ها به مدت تقریبی دو ماه ادامه خواهد یافت و پس از رسیدن به حجم نمونه مطلوب، متوقف می‌شود. در صفحه ابتدایی پرسشنامه، رضایت‌نامه آگاهانه الکترونیکی قرار داده شده است و شرکت‌کنندگان تنها در صورت تأیید گزینه موافقت با شرکت در پژوهش، وارد بخش اصلی پرسشنامه‌ها می‌شوند؛ شرکت در پژوهش کاملاً داوطلبانه است و امکان انصراف در هر مرحله بدون هیچ پیامد منفی وجود دارد.</w:t>
       </w:r>
     </w:p>
     <w:p>
@@ -9012,13 +9016,14 @@
           <w:sz w:val="24"/>
           <w:szCs w:val="24"/>
         </w:rPr>
-        <w:t xml:space="preserve">لازم است ذکر شود که استفاده از روش نمونه‌گیری غیرتصادفی، هرچند با توجه به ویژگی‌های جامعهٔ مورد نظر عملی‌ترین روش دسترسی به تعداد مناسبی از معامله‌گران است، قابلیت تعمیم‌پذیری نتایج را محدود می‌کند؛ این موضوع به عنوان یکی از محدودیت‌های اصلی پژوهش در فصل پنجم مورد بحث قرار خواهد گرفت.</w:t>
+        <w:t xml:space="preserve">لازم است ذکر شود که استفاده از روش نمونه‌گیری غیرتصادفی، هرچند با توجه به ویژگی‌های جامعه مورد نظر عملی‌ترین روش دسترسی به تعداد مناسبی از معامله‌گران است، قابلیت تعمیم‌پذیری نتایج را محدود می‌کند؛ این موضوع به عنوان یکی از محدودیت‌های اصلی پژوهش در فصل پنجم مورد بحث قرار خواهد گرفت.</w:t>
       </w:r>
     </w:p>
     <w:p>
       <w:pPr>
         <w:pStyle w:val="Heading3"/>
         <w:bidi w:val="1"/>
+        <w:jc w:val="right"/>
       </w:pPr>
       <w:r>
         <w:rPr>
@@ -9055,23 +9060,24 @@
           <w:rtl/>
           <w:vertAlign w:val="superscript"/>
         </w:rPr>
-        <w:footnoteReference w:id="110"/>
-      </w:r>
-      <w:r>
-        <w:rPr>
-          <w:rFonts w:ascii="B Nazanin" w:hAnsi="B Nazanin" w:cs="B Nazanin" w:hint="cs"/>
-          <w:rtl/>
-          <w:lang w:bidi="fa-IR"/>
-          <w:sz w:val="24"/>
-          <w:szCs w:val="24"/>
-        </w:rPr>
-        <w:t xml:space="preserve">، ۲۰۱۶)، برای دستیابی به برآوردهای پایا و نتایج قابل اعتماد، استفاده از حجم نمونهٔ حداقل ۲۰۰ نفر مناسب تلقی می‌شود؛ به ویژه زمانی که تعداد متغیرهای پنهان و مشاهده‌شده در مدل متوسط یا زیاد باشد. با این حال، با در نظر گرفتن محدودیت‌های عملی در دسترسی به معامله‌گران فعال و ماهیت داوطلبانهٔ شرکت در پژوهش، تلاش می‌شود حداقل بین ۱۵۰ تا ۲۰۰ نفر از شرکت‌کنندگان واجد شرایط وارد تحلیل نهایی شوند و در صورتی که امکان دسترسی کمتر از این مقدار فراهم شود، تحلیل با حداقل ۱۰۰ نفر نیز اجرا می‌گیرد؛ در این صورت، موضوع یادشده در گزارش نتایج به وضوح به‌عنوان یکی از محدودیت‌های پژوهش ذکر خواهد شد. لازم به تأکید است که حجم نهایی نمونهٔ تحقق‌یافته، پس از اتمام گردآوری و پاک‌سازی داده‌ها در فصل چهارم گزارش می‌شود. تعیین حجم نمونه پیش از آغاز گردآوری داده‌ها انجام شده و جمع‌آوری تا رسیدن به کران مطلوب ادامه می‌یابد.</w:t>
+        <w:footnoteReference w:id="111"/>
+      </w:r>
+      <w:r>
+        <w:rPr>
+          <w:rFonts w:ascii="B Nazanin" w:hAnsi="B Nazanin" w:cs="B Nazanin" w:hint="cs"/>
+          <w:rtl/>
+          <w:lang w:bidi="fa-IR"/>
+          <w:sz w:val="24"/>
+          <w:szCs w:val="24"/>
+        </w:rPr>
+        <w:t xml:space="preserve">، ۲۰۱۶)، برای دستیابی به برآوردهای پایا و نتایج قابل اعتماد، استفاده از حجم نمونه حداقل ۲۰۰ نفر مناسب تلقی می‌شود؛ به ویژه زمانی که تعداد متغیرهای پنهان و مشاهده‌شده در مدل متوسط یا زیاد باشد. با این حال، با در نظر گرفتن محدودیت‌های عملی در دسترسی به معامله‌گران فعال و ماهیت داوطلبانه شرکت در پژوهش، تلاش می‌شود حداقل بین ۱۵۰ تا ۲۰۰ نفر از شرکت‌کنندگان واجد شرایط وارد تحلیل نهایی شوند و در صورتی که امکان دسترسی کمتر از این مقدار فراهم شود، تحلیل با حداقل ۱۰۰ نفر نیز اجرا می‌گیرد؛ در این صورت، موضوع یادشده در گزارش نتایج به وضوح به‌عنوان یکی از محدودیت‌های پژوهش ذکر خواهد شد. لازم به تأکید است که حجم نهایی نمونه تحقق‌یافته، پس از اتمام گردآوری و پاک‌سازی داده‌ها در فصل چهارم گزارش می‌شود. تعیین حجم نمونه پیش از آغاز گردآوری داده‌ها انجام شده و جمع‌آوری تا رسیدن به کران مطلوب ادامه می‌یابد.</w:t>
       </w:r>
     </w:p>
     <w:p>
       <w:pPr>
         <w:pStyle w:val="Heading3"/>
         <w:bidi w:val="1"/>
+        <w:jc w:val="right"/>
       </w:pPr>
       <w:r>
         <w:rPr>
@@ -9112,7 +9118,7 @@
           <w:sz w:val="24"/>
           <w:szCs w:val="24"/>
         </w:rPr>
-        <w:t xml:space="preserve"> به پژوهش عبارت‌اند از: (۱) داشتن سن ۱۸ سال یا بیشتر؛ (۲) معامله‌گر حقیقی بودن و فعالیت با سرمایهٔ شخصی؛ (۳) داشتن حداقل ۶ ماه سابقهٔ فعالیت و انجام معاملهٔ واقعی (نه صرفاً حساب آزمایشی) در حداقل یکی از بازارهای بورس اوراق بهادار تهران، فرابورس، بورس انرژی، فارکس یا ارزهای دیجیتال؛ (۴) تسلط کافی به زبان فارسی جهت درک سؤالات پرسشنامه‌ها؛ و (۵) تمایل به شرکت در پژوهش و تأیید فرم رضایت‌نامهٔ آگاهانه.</w:t>
+        <w:t xml:space="preserve"> به پژوهش عبارت‌اند از: (۱) داشتن سن ۱۸ سال یا بیشتر؛ (۲) معامله‌گر حقیقی بودن و فعالیت با سرمایه شخصی؛ (۳) داشتن حداقل ۶ ماه سابقه فعالیت و انجام معامله واقعی (نه صرفاً حساب آزمایشی) در حداقل یکی از بازارهای بورس اوراق بهادار تهران، فرابورس، بورس انرژی، فارکس یا ارزهای دیجیتال؛ (۴) تسلط کافی به زبان فارسی جهت درک سؤالات پرسشنامه‌ها؛ و (۵) تمایل به شرکت در پژوهش و تأیید فرم رضایت‌نامه آگاهانه.</w:t>
       </w:r>
     </w:p>
     <w:p>
@@ -9141,7 +9147,7 @@
           <w:sz w:val="24"/>
           <w:szCs w:val="24"/>
         </w:rPr>
-        <w:t xml:space="preserve"> نیز شامل موارد زیر است: (۱) عدم تکمیل پرسشنامه‌ها به صورت کامل؛ (۲) انصراف شرکت‌کننده یا عدم تأیید رضایت‌نامهٔ آگاهانه؛ (۳) ارائهٔ پاسخ‌های تصادفی یا نامعتبر که از طریق نشانگرهایی مانند زمان پاسخ‌دهی بسیار کوتاه یا الگوی پاسخ یکسان در همهٔ گویه‌ها شناسایی می‌شوند؛ و (۴) گزارش نداشتن تجربهٔ معاملهٔ واقعی یا تمرکز اصلی بر حساب آزمایشی توسط شرکت‌کننده.</w:t>
+        <w:t xml:space="preserve"> نیز شامل موارد زیر است: (۱) عدم تکمیل پرسشنامه‌ها به صورت کامل؛ (۲) انصراف شرکت‌کننده یا عدم تأیید رضایت‌نامه آگاهانه؛ (۳) ارائه پاسخ‌های تصادفی یا نامعتبر که از طریق نشانگرهایی مانند زمان پاسخ‌دهی بسیار کوتاه یا الگوی پاسخ یکسان در همه گویه‌ها شناسایی می‌شوند؛ و (۴) گزارش نداشتن تجربه معامله واقعی یا تمرکز اصلی بر حساب آزمایشی توسط شرکت‌کننده.</w:t>
       </w:r>
     </w:p>
     <w:p>
@@ -9158,13 +9164,14 @@
           <w:sz w:val="24"/>
           <w:szCs w:val="24"/>
         </w:rPr>
-        <w:t xml:space="preserve">ملاک‌های خروج یادشده در مرحلهٔ پاک‌سازی داده‌ها و پیش از تحلیل نهایی اعمال می‌شوند تا کیفیت پاسخ‌های واردشده به مدل تضمین گردد.</w:t>
+        <w:t xml:space="preserve">ملاک‌های خروج یادشده در مرحله پاک‌سازی داده‌ها و پیش از تحلیل نهایی اعمال می‌شوند تا کیفیت پاسخ‌های واردشده به مدل تضمین گردد.</w:t>
       </w:r>
     </w:p>
     <w:p>
       <w:pPr>
         <w:pStyle w:val="Heading2"/>
         <w:bidi w:val="1"/>
+        <w:jc w:val="right"/>
       </w:pPr>
       <w:r>
         <w:rPr>
@@ -9193,7 +9200,7 @@
           <w:sz w:val="24"/>
           <w:szCs w:val="24"/>
         </w:rPr>
-        <w:t xml:space="preserve">برای سنجش متغیرهای پژوهش از سه ابزار استاندارد استفاده می‌شود که هر یک با یکی از متغیرهای مدل میانجی‌گری متناظر است: پرسشنامهٔ اضطراب حالت-صفت اسپیلبرگر — فرم صفتی (</w:t>
+        <w:t xml:space="preserve">برای سنجش متغیرهای پژوهش از سه ابزار استاندارد استفاده می‌شود که هر یک با یکی از متغیرهای مدل میانجی‌گری متناظر است: پرسشنامه اضطراب حالت-صفت اسپیلبرگر — فرم صفتی (</w:t>
       </w:r>
       <w:r>
         <w:rPr>
@@ -9212,13 +9219,14 @@
           <w:sz w:val="24"/>
           <w:szCs w:val="24"/>
         </w:rPr>
-        <w:t xml:space="preserve">-2) برای سنجش اضطراب صفتی، پرسشنامهٔ طرحوارهٔ یانگ — فرم کوتاه برای سنجش طرحواره‌های ناسازگار اولیه، و مقیاس تحمل ریسک مالی گرابل و لایتون برای سنجش رفتارهای مالی پرخطر. این سه ابزار به همراه سؤالات جمعیت‌شناختی در قالب یک پرسشنامهٔ آنلاین یکپارچه ارائه می‌شوند. در ادامه، ساختار، نمره‌گذاری و ویژگی‌های روان‌سنجی هر ابزار به تفصیل بیان می‌شود. در فرم آنلاین، این ابزارها به ترتیب پس از سؤالات جمعیت‌شناختی و با فاصله‌گذاری مناسب ارائه می‌شوند تا خستگی پاسخ‌دهنده به حداقل برسد.</w:t>
+        <w:t xml:space="preserve">-2) برای سنجش اضطراب صفتی، پرسشنامه طرحواره یانگ — فرم کوتاه برای سنجش طرحواره‌های ناسازگار اولیه، و مقیاس تحمل ریسک مالی گرابل و لایتون برای سنجش رفتارهای مالی پرخطر. این سه ابزار به همراه سؤالات جمعیت‌شناختی در قالب یک پرسشنامه آنلاین یکپارچه ارائه می‌شوند. در ادامه، ساختار، نمره‌گذاری و ویژگی‌های روان‌سنجی هر ابزار به تفصیل بیان می‌شود. در فرم آنلاین، این ابزارها به ترتیب پس از سؤالات جمعیت‌شناختی و با فاصله‌گذاری مناسب ارائه می‌شوند تا خستگی پاسخ‌دهنده به حداقل برسد.</w:t>
       </w:r>
     </w:p>
     <w:p>
       <w:pPr>
         <w:pStyle w:val="Heading3"/>
         <w:bidi w:val="1"/>
+        <w:jc w:val="right"/>
       </w:pPr>
       <w:r>
         <w:rPr>
@@ -9230,7 +9238,7 @@
           <w:b/>
           <w:bCs/>
         </w:rPr>
-        <w:t xml:space="preserve">۳-۴-۱. پرسشنامهٔ اضطراب حالت-صفت اسپیلبرگر — فرم صفتی (</w:t>
+        <w:t xml:space="preserve">۳-۴-۱. پرسشنامه اضطراب حالت-صفت اسپیلبرگر — فرم صفتی (</w:t>
       </w:r>
       <w:r>
         <w:rPr>
@@ -9258,7 +9266,7 @@
           <w:sz w:val="24"/>
           <w:szCs w:val="24"/>
         </w:rPr>
-        <w:t xml:space="preserve">پرسشنامهٔ اضطراب حالت-صفت اسپیلبرگر </w:t>
+        <w:t xml:space="preserve">پرسشنامه اضطراب حالت-صفت اسپیلبرگر </w:t>
       </w:r>
       <w:r>
         <w:rPr>
@@ -9284,17 +9292,17 @@
           <w:rtl/>
           <w:vertAlign w:val="superscript"/>
         </w:rPr>
-        <w:footnoteReference w:id="111"/>
-      </w:r>
-      <w:r>
-        <w:rPr>
-          <w:rFonts w:ascii="B Nazanin" w:hAnsi="B Nazanin" w:cs="B Nazanin" w:hint="cs"/>
-          <w:rtl/>
-          <w:lang w:bidi="fa-IR"/>
-          <w:sz w:val="24"/>
-          <w:szCs w:val="24"/>
-        </w:rPr>
-        <w:t xml:space="preserve"> (۱۹۷۰) ساخته شد و راهنمای بازنگری‌شدهٔ آن توسط اسپیلبرگر (۱۹۸۳) منتشر شده است. این پرسشنامه برای سنجش اضطراب در دو سطح طراحی شده است. سطح نخست، اضطراب حالتی است؛ واکنشی هیجانی، گذرا و وابسته به موقعیت. سطح دوم، اضطراب صفتی؛ یعنی ویژگی شخصیتی پایدار فرد. در پژوهش حاضر تنها از فرم اضطراب صفتی (</w:t>
+        <w:footnoteReference w:id="112"/>
+      </w:r>
+      <w:r>
+        <w:rPr>
+          <w:rFonts w:ascii="B Nazanin" w:hAnsi="B Nazanin" w:cs="B Nazanin" w:hint="cs"/>
+          <w:rtl/>
+          <w:lang w:bidi="fa-IR"/>
+          <w:sz w:val="24"/>
+          <w:szCs w:val="24"/>
+        </w:rPr>
+        <w:t xml:space="preserve"> (۱۹۷۰) ساخته شد و راهنمای بازنگری‌شده آن توسط اسپیلبرگر (۱۹۸۳) منتشر شده است. این پرسشنامه برای سنجش اضطراب در دو سطح طراحی شده است. سطح نخست، اضطراب حالتی است؛ واکنشی هیجانی، گذرا و وابسته به موقعیت. سطح دوم، اضطراب صفتی؛ یعنی ویژگی شخصیتی پایدار فرد. در پژوهش حاضر تنها از فرم اضطراب صفتی (</w:t>
       </w:r>
       <w:r>
         <w:rPr>
@@ -9313,7 +9321,7 @@
           <w:sz w:val="24"/>
           <w:szCs w:val="24"/>
         </w:rPr>
-        <w:t xml:space="preserve">-2) استفاده می‌شود؛ هدف، سنجش زمینهٔ شخصیتی پایدار اضطراب در معامله‌گران است، نه واکنش لحظه‌ای آنان به یک موقعیت خاص. بر همین اساس، فرم حالت (اضطراب حالتی) در این پژوهش اجرا نمی‌شود؛ چه آنکه هدف، سنجش زمینهٔ پایدار آسیب‌پذیری در برابر فشارهای بازار است، نه شدت اضطراب آزمودنی در لحظهٔ پاسخ‌دهی.</w:t>
+        <w:t xml:space="preserve">-2) استفاده می‌شود؛ هدف، سنجش زمینه شخصیتی پایدار اضطراب در معامله‌گران است، نه واکنش لحظه‌ای آنان به یک موقعیت خاص. بر همین اساس، فرم حالت (اضطراب حالتی) در این پژوهش اجرا نمی‌شود؛ چه آنکه هدف، سنجش زمینه پایدار آسیب‌پذیری در برابر فشارهای بازار است، نه شدت اضطراب آزمودنی در لحظه پاسخ‌دهی.</w:t>
       </w:r>
     </w:p>
     <w:p>
@@ -9330,7 +9338,7 @@
           <w:sz w:val="24"/>
           <w:szCs w:val="24"/>
         </w:rPr>
-        <w:t xml:space="preserve">فرم صفتی شامل ۲۰ گویه است که احساسات کلی و معمول فرد را توصیف می‌کنند و آزمودنی میزان انطباق هر گویه با احساسات خود را بر اساس مقیاس ۴ درجه‌ای لیکرت با گزینه‌های «تقریباً هرگز»، «گاهی اوقات»، «بیشتر اوقات» و «تقریباً همیشه» (از ۱ تا ۴) مشخص می‌کند. این فرم شامل گویه‌هایی با نمره‌گذاری معکوس نیز هست. دامنهٔ نمرهٔ کل بین ۲۰ تا ۸۰ است و نمرهٔ بالاتر نشان‌دهندهٔ سطح بالاتر اضطراب صفتی است.</w:t>
+        <w:t xml:space="preserve">فرم صفتی شامل ۲۰ گویه است که احساسات کلی و معمول فرد را توصیف می‌کنند و آزمودنی میزان انطباق هر گویه با احساسات خود را بر اساس مقیاس ۴ درجه‌ای لیکرت با گزینه‌های «تقریباً هرگز»، «گاهی اوقات»، «بیشتر اوقات» و «تقریباً همیشه» (از ۱ تا ۴) مشخص می‌کند. این فرم شامل گویه‌هایی با نمره‌گذاری معکوس نیز هست. دامنه نمره کل بین ۲۰ تا ۸۰ است و نمره بالاتر نشان‌دهنده سطح بالاتر اضطراب صفتی است.</w:t>
       </w:r>
     </w:p>
     <w:p>
@@ -9347,7 +9355,7 @@
           <w:sz w:val="24"/>
           <w:szCs w:val="24"/>
         </w:rPr>
-        <w:t xml:space="preserve">از نظر ویژگی‌های روان‌سنجی، پایایی درونی این ابزار از ابتدا با ضرایب آلفای کرونباخ بالا (۰٫۸۶ تا ۰٫۹۵) تأیید شده است (اسپیلبرگر، ۱۹۸۳). در ایران نیز پژوهش بشارت و همکاران (۱۳۹۵) ساختار عاملی و پایایی نسخهٔ فارسی این پرسشنامه را در نمونه‌های ایرانی بررسی و تأیید کرده است؛ در این پژوهش آلفای کرونباخ ۰٫۸۹ گزارش شده است.</w:t>
+        <w:t xml:space="preserve">از نظر ویژگی‌های روان‌سنجی، پایایی درونی این ابزار از ابتدا با ضرایب آلفای کرونباخ بالا (۰٫۸۶ تا ۰٫۹۵) تأیید شده است (اسپیلبرگر، ۱۹۸۳). در ایران نیز پژوهش بشارت و همکاران (۱۳۹۵) ساختار عاملی و پایایی نسخه فارسی این پرسشنامه را در نمونه‌های ایرانی بررسی و تأیید کرده است؛ در این پژوهش آلفای کرونباخ ۰٫۸۹ گزارش شده است.</w:t>
       </w:r>
     </w:p>
     <w:p>
@@ -9364,13 +9372,14 @@
           <w:sz w:val="24"/>
           <w:szCs w:val="24"/>
         </w:rPr>
-        <w:t xml:space="preserve">پایایی ابزار در نمونهٔ پژوهش حاضر با آلفای کرونباخ محاسبه و در فصل چهارم گزارش خواهد شد.</w:t>
+        <w:t xml:space="preserve">پایایی ابزار در نمونه پژوهش حاضر با آلفای کرونباخ محاسبه و در فصل چهارم گزارش خواهد شد.</w:t>
       </w:r>
     </w:p>
     <w:p>
       <w:pPr>
         <w:pStyle w:val="Heading3"/>
         <w:bidi w:val="1"/>
+        <w:jc w:val="right"/>
       </w:pPr>
       <w:r>
         <w:rPr>
@@ -9382,7 +9391,7 @@
           <w:b/>
           <w:bCs/>
         </w:rPr>
-        <w:t xml:space="preserve">۳-۴-۲. پرسشنامهٔ طرحواره‌های ناسازگار اولیهٔ یانگ — فرم کوتاه</w:t>
+        <w:t xml:space="preserve">۳-۴-۲. پرسشنامه طرحواره‌های ناسازگار اولیه یانگ — فرم کوتاه</w:t>
       </w:r>
     </w:p>
     <w:p>
@@ -9399,7 +9408,7 @@
           <w:sz w:val="24"/>
           <w:szCs w:val="24"/>
         </w:rPr>
-        <w:t xml:space="preserve">پرسشنامهٔ طرحوارهٔ یانگ — فرم کوتاه </w:t>
+        <w:t xml:space="preserve">پرسشنامه طرحواره یانگ — فرم کوتاه </w:t>
       </w:r>
       <w:r>
         <w:rPr>
@@ -9417,7 +9426,7 @@
           <w:sz w:val="24"/>
           <w:szCs w:val="24"/>
         </w:rPr>
-        <w:t xml:space="preserve"> توسط یانگ (۱۹۹۸) به عنوان نسخه‌ای کوتاه‌تر از ابزار اصلی برای سنجش ۱۵ طرحوارهٔ ناسازگار اولیه تدوین شده است. این پرسشنامه شامل ۷۵ گویه است که به ازای هر طرحواره، ۵ گویه را در بر می‌گیرد و بر اساس نظریهٔ طرحواره، الگوهای هیجانی و شناختی عمیق و پایداری را می‌سنجد که در دوران کودکی و نوجوانی شکل گرفته‌اند و تفسیر فرد از موقعیت‌های زندگی را جهت می‌دهند.</w:t>
+        <w:t xml:space="preserve"> توسط یانگ (۱۹۹۸) به عنوان نسخه‌ای کوتاه‌تر از ابزار اصلی برای سنجش ۱۵ طرحواره ناسازگار اولیه تدوین شده است. این پرسشنامه شامل ۷۵ گویه است که به ازای هر طرحواره، ۵ گویه را در بر می‌گیرد و بر اساس نظریه طرحواره، الگوهای هیجانی و شناختی عمیق و پایداری را می‌سنجد که در دوران کودکی و نوجوانی شکل گرفته‌اند و تفسیر فرد از موقعیت‌های زندگی را جهت می‌دهند.</w:t>
       </w:r>
     </w:p>
     <w:p>
@@ -9434,7 +9443,7 @@
           <w:sz w:val="24"/>
           <w:szCs w:val="24"/>
         </w:rPr>
-        <w:t xml:space="preserve">نمره‌گذاری گویه‌ها بر اساس مقیاس ۶ درجه‌ای لیکرت انجام می‌شود. گزینه‌های این مقیاس — همان‌گونه که در نسخهٔ آنلاین منتشرشدهٔ پژوهش آمده است — به ترتیب عبارت‌اند از: «۱=کاملاً در مورد من غلط است»، «۲=تقریباً غلط است»، «۳=بیشتر غلط است تا درست»، «۴=اندکی درست است»، «۵=تقریباً درست است» و «۶=کاملاً مرا توصیف می‌کند». برای هر طرحواره نمره‌ای بین ۵ تا ۳۰ به دست می‌آید و نمرهٔ بالاتر نشان‌دهندهٔ شدت بیشتر آن طرحواره است. ترتیب گزینه‌ها در نسخهٔ آنلاین منتشرشدهٔ پژوهش با همین جهت نمره‌گذاری هم‌خوان است و نیازی به وارونه‌سازی نمرات در مرحلهٔ کدگذاری وجود ندارد.</w:t>
+        <w:t xml:space="preserve">نمره‌گذاری گویه‌ها بر اساس مقیاس ۶ درجه‌ای لیکرت انجام می‌شود. گزینه‌های این مقیاس — همان‌گونه که در نسخه آنلاین منتشرشده پژوهش آمده است — به ترتیب عبارت‌اند از: «۱=کاملاً در مورد من غلط است»، «۲=تقریباً غلط است»، «۳=بیشتر غلط است تا درست»، «۴=اندکی درست است»، «۵=تقریباً درست است» و «۶=کاملاً مرا توصیف می‌کند». برای هر طرحواره نمره‌ای بین ۵ تا ۳۰ به دست می‌آید و نمره بالاتر نشان‌دهنده شدت بیشتر آن طرحواره است. ترتیب گزینه‌ها در نسخه آنلاین منتشرشده پژوهش با همین جهت نمره‌گذاری هم‌خوان است و نیازی به وارونه‌سازی نمرات در مرحله کدگذاری وجود ندارد.</w:t>
       </w:r>
     </w:p>
     <w:p>
@@ -9451,7 +9460,7 @@
           <w:sz w:val="24"/>
           <w:szCs w:val="24"/>
         </w:rPr>
-        <w:t xml:space="preserve">ویژگی‌های روان‌سنجی ابزار اصلی طرحواره‌ها در مطالعات متعدد بررسی و تأیید شده است (یانگ، ۱۹۹۸؛ اشمیت و همکاران، ۱۹۹۵). در ایران نیز پژوهش یوسفی (۱۳۹۶) ویژگی‌های روان‌سنجی نسخهٔ فارسی این پرسشنامه را در نمونهٔ غیربالینی بررسی کرده است؛ در این پژوهش پایایی خرده‌مقیاس‌ها با ضرایب آلفای ۰٫۶۸ تا ۰٫۸۵ و روایی سازهٔ قابل قبول گزارش شده است.</w:t>
+        <w:t xml:space="preserve">ویژگی‌های روان‌سنجی ابزار اصلی طرحواره‌ها در مطالعات متعدد بررسی و تأیید شده است (یانگ، ۱۹۹۸؛ اشمیت و همکاران، ۱۹۹۵). در ایران نیز پژوهش یوسفی (۱۳۹۶) ویژگی‌های روان‌سنجی نسخه فارسی این پرسشنامه را در نمونه غیربالینی بررسی کرده است؛ در این پژوهش پایایی خرده‌مقیاس‌ها با ضرایب آلفای ۰٫۶۸ تا ۰٫۸۵ و روایی سازه قابل قبول گزارش شده است.</w:t>
       </w:r>
     </w:p>
     <w:p>
@@ -9468,13 +9477,14 @@
           <w:sz w:val="24"/>
           <w:szCs w:val="24"/>
         </w:rPr>
-        <w:t xml:space="preserve">پایایی ابزار در نمونهٔ پژوهش حاضر با آلفای کرونباخ محاسبه و در فصل چهارم گزارش خواهد شد.</w:t>
+        <w:t xml:space="preserve">پایایی ابزار در نمونه پژوهش حاضر با آلفای کرونباخ محاسبه و در فصل چهارم گزارش خواهد شد.</w:t>
       </w:r>
     </w:p>
     <w:p>
       <w:pPr>
         <w:pStyle w:val="Heading3"/>
         <w:bidi w:val="1"/>
+        <w:jc w:val="right"/>
       </w:pPr>
       <w:r>
         <w:rPr>
@@ -9532,7 +9542,7 @@
           <w:sz w:val="24"/>
           <w:szCs w:val="24"/>
         </w:rPr>
-        <w:t xml:space="preserve"> توسط گرابل و لایتون (۱۹۹۹) ساخته شده است؛ ابزاری برای سنجش تمایل، ظرفیت و نگرش فرد نسبت به پذیرش ریسک در تصمیم‌های مالی. این مقیاس شامل ۱۳ سؤال تک‌گزینه‌ای است که هر سؤال گزینه‌های متنی مختص خود را دارد و پاسخ‌دهنده از میان چهار گزینهٔ هر سؤال، گزینه‌ای را انتخاب می‌کند که به بهترین وجه دیدگاه یا ترجیح واقعی او را منعکس می‌سازد؛ در این مقیاس پاسخ درست یا غلطی وجود ندارد. سؤالات این مقیاس عمدتاً در قالب موقعیت‌های فرضی و سؤالات ترجیحی طراحی شده‌اند؛ برای نمونه، انتخاب میان دریافت مبلغ قطعی یا شرکت در یک شانس با بازده بالاتر، یا تعیین ترجیح میان انواع دارایی‌های سرمایه‌گذاری. این ساختار موجب می‌شود پاسخ‌دهنده بدون آنکه خود را در معرض قضاوت ببیند، تمایل واقعی خود به پذیرش ریسک را آشکار سازد.</w:t>
+        <w:t xml:space="preserve"> توسط گرابل و لایتون (۱۹۹۹) ساخته شده است؛ ابزاری برای سنجش تمایل، ظرفیت و نگرش فرد نسبت به پذیرش ریسک در تصمیم‌های مالی. این مقیاس شامل ۱۳ سؤال تک‌گزینه‌ای است که هر سؤال گزینه‌های متنی مختص خود را دارد و پاسخ‌دهنده از میان چهار گزینه هر سؤال، گزینه‌ای را انتخاب می‌کند که به بهترین وجه دیدگاه یا ترجیح واقعی او را منعکس می‌سازد؛ در این مقیاس پاسخ درست یا غلطی وجود ندارد. سؤالات این مقیاس عمدتاً در قالب موقعیت‌های فرضی و سؤالات ترجیحی طراحی شده‌اند؛ برای نمونه، انتخاب میان دریافت مبلغ قطعی یا شرکت در یک شانس با بازده بالاتر، یا تعیین ترجیح میان انواع دارایی‌های سرمایه‌گذاری. این ساختار موجب می‌شود پاسخ‌دهنده بدون آنکه خود را در معرض قضاوت ببیند، تمایل واقعی خود به پذیرش ریسک را آشکار سازد.</w:t>
       </w:r>
     </w:p>
     <w:p>
@@ -9549,7 +9559,7 @@
           <w:sz w:val="24"/>
           <w:szCs w:val="24"/>
         </w:rPr>
-        <w:t xml:space="preserve">نمرهٔ کل مقیاس بین ۱۳ تا ۴۵ محاسبه می‌شود و نمرهٔ بالاتر نشان‌دهندهٔ تحمل ریسک بیشتر و در نتیجه تمایل بالاتر به بروز رفتارهای مالی پرخطر است.</w:t>
+        <w:t xml:space="preserve">نمره کل مقیاس بین ۱۳ تا ۴۵ محاسبه می‌شود و نمره بالاتر نشان‌دهنده تحمل ریسک بیشتر و در نتیجه تمایل بالاتر به بروز رفتارهای مالی پرخطر است.</w:t>
       </w:r>
     </w:p>
     <w:p>
@@ -9566,7 +9576,7 @@
           <w:sz w:val="24"/>
           <w:szCs w:val="24"/>
         </w:rPr>
-        <w:t xml:space="preserve">به‌کارگیری این مقیاس به عنوان شاخص عملیاتی رفتارهای مالی پرخطر نیازمند توضیح روش‌شناختی مشخص است. نکتهٔ کلیدی این است: «تحمل ریسک» یک نگرش روانشناختی است و «رفتار پرخطر» یک عمل عینی. با این حال، ادبیات پژوهشی گسترده نشان داده است که مقیاس گرابل و لایتون از روایی پیش‌بین بسیار بالایی برخوردار است؛ به این معنا که نمرات افراد در این مقیاس توانایی پیش‌بینی رفتارهای مالی واقعی آنان را دارد (گرابل و لایتون، ۱۹۹۹؛ گرابل، ۲۰۱۷). بر همین اساس، در پژوهش حاضر این مقیاس به عنوان شاخص نیابتی </w:t>
+        <w:t xml:space="preserve">به‌کارگیری این مقیاس به عنوان شاخص عملیاتی رفتارهای مالی پرخطر نیازمند توضیح روش‌شناختی مشخص است. نکته کلیدی این است: «تحمل ریسک» یک نگرش روانشناختی است و «رفتار پرخطر» یک عمل عینی. با این حال، ادبیات پژوهشی گسترده نشان داده است که مقیاس گرابل و لایتون از روایی پیش‌بین بسیار بالایی برخوردار است؛ به این معنا که نمرات افراد در این مقیاس توانایی پیش‌بینی رفتارهای مالی واقعی آنان را دارد (گرابل و لایتون، ۱۹۹۹؛ گرابل، ۲۰۱۷). بر همین اساس، در پژوهش حاضر این مقیاس به عنوان شاخص نیابتی </w:t>
       </w:r>
       <w:r>
         <w:rPr>
@@ -9601,7 +9611,7 @@
           <w:sz w:val="24"/>
           <w:szCs w:val="24"/>
         </w:rPr>
-        <w:t xml:space="preserve">نسخهٔ فارسی این مقیاس توسط طالبی و همکاران (۱۳۹۸) بر روی نمونه‌ای از سرمایه‌گذاران بورس اوراق بهادار تهران اعتباریابی شده است؛ در این پژوهش پایایی ابزار با آلفای کرونباخ ۰٫۷۹ گزارش و ساختار عاملی آن تأیید شده است.</w:t>
+        <w:t xml:space="preserve">نسخه فارسی این مقیاس توسط طالبی و همکاران (۱۳۹۸) بر روی نمونه‌ای از سرمایه‌گذاران بورس اوراق بهادار تهران اعتباریابی شده است؛ در این پژوهش پایایی ابزار با آلفای کرونباخ ۰٫۷۹ گزارش و ساختار عاملی آن تأیید شده است.</w:t>
       </w:r>
     </w:p>
     <w:p>
@@ -9618,7 +9628,7 @@
           <w:sz w:val="24"/>
           <w:szCs w:val="24"/>
         </w:rPr>
-        <w:t xml:space="preserve">پایایی ابزار در نمونهٔ پژوهش حاضر با آلفای کرونباخ محاسبه و در فصل چهارم گزارش خواهد شد.</w:t>
+        <w:t xml:space="preserve">پایایی ابزار در نمونه پژوهش حاضر با آلفای کرونباخ محاسبه و در فصل چهارم گزارش خواهد شد.</w:t>
       </w:r>
     </w:p>
     <w:p>
@@ -9637,7 +9647,7 @@
           <w:b/>
           <w:bCs/>
         </w:rPr>
-        <w:t xml:space="preserve">جدول ۳-۱. خلاصهٔ ابزارهای پژوهش</w:t>
+        <w:t xml:space="preserve">جدول ۳-۱. خلاصه ابزارهای پژوهش</w:t>
       </w:r>
     </w:p>
     <w:tbl>
@@ -9747,7 +9757,7 @@
                 <w:b/>
                 <w:bCs/>
               </w:rPr>
-              <w:t xml:space="preserve">دامنهٔ نمره</w:t>
+              <w:t xml:space="preserve">دامنه نمره</w:t>
             </w:r>
           </w:p>
         </w:tc>
@@ -9771,7 +9781,7 @@
                 <w:b/>
                 <w:bCs/>
               </w:rPr>
-              <w:t xml:space="preserve">نسخهٔ فارسی</w:t>
+              <w:t xml:space="preserve">نسخه فارسی</w:t>
             </w:r>
           </w:p>
         </w:tc>
@@ -9795,7 +9805,7 @@
                 <w:sz w:val="22"/>
                 <w:szCs w:val="22"/>
               </w:rPr>
-              <w:t xml:space="preserve">پرسشنامهٔ اضطراب حالت-صفت اسپیلبرگر — فرم صفتی (</w:t>
+              <w:t xml:space="preserve">پرسشنامه اضطراب حالت-صفت اسپیلبرگر — فرم صفتی (</w:t>
             </w:r>
             <w:r>
               <w:rPr>
@@ -9916,7 +9926,7 @@
                 <w:sz w:val="22"/>
                 <w:szCs w:val="22"/>
               </w:rPr>
-              <w:t xml:space="preserve">پرسشنامهٔ طرحوارهٔ یانگ — فرم کوتاه (</w:t>
+              <w:t xml:space="preserve">پرسشنامه طرحواره یانگ — فرم کوتاه (</w:t>
             </w:r>
             <w:r>
               <w:rPr>
@@ -10090,7 +10100,7 @@
                 <w:sz w:val="22"/>
                 <w:szCs w:val="22"/>
               </w:rPr>
-              <w:t xml:space="preserve">تک‌گزینه‌ای با ۴ گزینهٔ متنی ویژهٔ هر سؤال</w:t>
+              <w:t xml:space="preserve">تک‌گزینه‌ای با ۴ گزینه متنی ویژه هر سؤال</w:t>
             </w:r>
           </w:p>
         </w:tc>
@@ -10154,13 +10164,14 @@
           <w:sz w:val="24"/>
           <w:szCs w:val="24"/>
         </w:rPr>
-        <w:t xml:space="preserve">سه ابزار معرفی‌شده با مدل میانجی‌گری پژوهش هم‌راستا هستند؛ به این صورت که فرم صفتی اسپیلبرگر متغیر مستقل (اضطراب صفتی)، فرم کوتاه پرسشنامهٔ طرحوارهٔ یانگ متغیر میانجی (طرحواره‌های ناسازگار اولیه) و مقیاس تحمل ریسک مالی گرابل و لایتون متغیر وابسته (رفتارهای مالی پرخطر) را می‌سنجند. جهت نمره‌گذاری در هر سه ابزار به گونه‌ای تنظیم شده است که نمرهٔ بالاتر، نشان‌دهندهٔ شدت بیشتر سازهٔ متناظر باشد و این ویژگی، تفسیر روابط فرضیه‌های پژوهش را در فصل چهارم تسهیل می‌کند. هر سه ابزار به همراه سؤالات جمعیت‌شناختی در یک پرسشنامهٔ آنلاین یکپارچه در پلتفرم پرس‌لاین اجرا می‌شوند تا نرخ ریزش شرکت‌کنندگان در میانهٔ پاسخ‌دهی به حداقل برسد.</w:t>
+        <w:t xml:space="preserve">سه ابزار معرفی‌شده با مدل میانجی‌گری پژوهش هم‌راستا هستند؛ به این صورت که فرم صفتی اسپیلبرگر متغیر مستقل (اضطراب صفتی)، فرم کوتاه پرسشنامه طرحواره یانگ متغیر میانجی (طرحواره‌های ناسازگار اولیه) و مقیاس تحمل ریسک مالی گرابل و لایتون متغیر وابسته (رفتارهای مالی پرخطر) را می‌سنجند. جهت نمره‌گذاری در هر سه ابزار به گونه‌ای تنظیم شده است که نمره بالاتر، نشان‌دهنده شدت بیشتر سازه متناظر باشد و این ویژگی، تفسیر روابط فرضیه‌های پژوهش را در فصل چهارم تسهیل می‌کند. هر سه ابزار به همراه سؤالات جمعیت‌شناختی در یک پرسشنامه آنلاین یکپارچه در پلتفرم پرس‌لاین اجرا می‌شوند تا نرخ ریزش شرکت‌کنندگان در میانه پاسخ‌دهی به حداقل برسد.</w:t>
       </w:r>
     </w:p>
     <w:p>
       <w:pPr>
         <w:pStyle w:val="Heading2"/>
         <w:bidi w:val="1"/>
+        <w:jc w:val="right"/>
       </w:pPr>
       <w:r>
         <w:rPr>
@@ -10189,7 +10200,7 @@
           <w:sz w:val="24"/>
           <w:szCs w:val="24"/>
         </w:rPr>
-        <w:t xml:space="preserve">اجرای پژوهش حاضر به‌صورت آنلاین و از طریق یک فرم یکپارچه در نظر گرفته شده است و همهٔ مراحل آن — از اخذ رضایت آگاهانه تا آماده‌سازی داده‌ها برای تحلیل — بر اساس مصوبات پروپوزال طراحی شده است. پیش‌شرط آغاز گردآوری داده‌ها، طی‌شدن دو مرحلهٔ اداری است: تصویب نهایی پروپوزال در شورای پژوهشی دانشکده و ارسال آن به کمیتهٔ اخلاق در پژوهش دانشگاه علم و هنر یزد جهت اخذ کد اخلاق؛ بنابراین جمع‌آوری داده‌ها تنها پس از دریافت تأییدیهٔ نهایی کمیتهٔ اخلاق آغاز خواهد شد.</w:t>
+        <w:t xml:space="preserve">اجرای پژوهش حاضر به‌صورت آنلاین و از طریق یک فرم یکپارچه در نظر گرفته شده است و همه مراحل آن — از اخذ رضایت آگاهانه تا آماده‌سازی داده‌ها برای تحلیل — بر اساس مصوبات پروپوزال طراحی شده است. پیش‌شرط آغاز گردآوری داده‌ها، طی‌شدن دو مرحله اداری است: تصویب نهایی پروپوزال در شورای پژوهشی دانشکده و ارسال آن به کمیته اخلاق در پژوهش دانشگاه علم و هنر یزد جهت اخذ کد اخلاق؛ بنابراین جمع‌آوری داده‌ها تنها پس از دریافت تأییدیه نهایی کمیته اخلاق آغاز خواهد شد.</w:t>
       </w:r>
     </w:p>
     <w:p>
@@ -10206,7 +10217,7 @@
           <w:sz w:val="24"/>
           <w:szCs w:val="24"/>
         </w:rPr>
-        <w:t xml:space="preserve">ساختار فرم آنلاین که در پلتفرم پرس‌لاین طراحی شده است، صفحه‌های زیر را به ترتیب در بر می‌گیرد: صفحهٔ معرفی پژوهش؛ صفحهٔ رضایت‌نامهٔ آگاهانه همراه با سؤال موافقت؛ سه سؤال غربالگری؛ سؤالات جمعیت‌شناختی و معاملاتی؛ پرسشنامهٔ اضطراب حالت-صفت اسپیلبرگر — فرم صفتی؛ پرسشنامهٔ طرحوارهٔ یانگ — فرم کوتاه در سه صفحهٔ متوالی؛ مقیاس تحمل ریسک مالی گرابل و لایتون؛ و در پایان، صفحهٔ تشکر. همهٔ سؤالات فرم اجباری تنظیم شده‌اند تا از ثبت دادهٔ ناقص جلوگیری شود، نوار پیشرفت برای شرکت‌کنندگان فعال است و تکمیل فرم حدود ۱۵ تا ۲۰ دقیقه برآورد می‌شود.</w:t>
+        <w:t xml:space="preserve">ساختار فرم آنلاین که در پلتفرم پرس‌لاین طراحی شده است، صفحه‌های زیر را به ترتیب در بر می‌گیرد: صفحه معرفی پژوهش؛ صفحه رضایت‌نامه آگاهانه همراه با سؤال موافقت؛ سه سؤال غربالگری؛ سؤالات جمعیت‌شناختی و معاملاتی؛ پرسشنامه اضطراب حالت-صفت اسپیلبرگر — فرم صفتی؛ پرسشنامه طرحواره یانگ — فرم کوتاه در سه صفحه متوالی؛ مقیاس تحمل ریسک مالی گرابل و لایتون؛ و در پایان، صفحه تشکر. همه سؤالات فرم اجباری تنظیم شده‌اند تا از ثبت داده ناقص جلوگیری شود، نوار پیشرفت برای شرکت‌کنندگان فعال است و تکمیل فرم حدود ۱۵ تا ۲۰ دقیقه برآورد می‌شود.</w:t>
       </w:r>
     </w:p>
     <w:p>
@@ -10223,7 +10234,7 @@
           <w:sz w:val="24"/>
           <w:szCs w:val="24"/>
         </w:rPr>
-        <w:t xml:space="preserve">مراحل اخذ رضایت آگاهانه به این صورت طراحی شده است که در صفحهٔ نخست، متن کامل رضایت‌نامه شامل اهداف پژوهش، ماهیت داوطلبانهٔ شرکت، تضمین کامل محرمانه‌ماندن و ناشناس‌بودن اطلاعات شرکت‌کنندگان به‌طور شفاف در اختیار شرکت‌کننده قرار می‌گیرد و بر داوطلبانه و آزادانه‌بودن رضایت تأکید می‌شود. سپس سؤال تک‌گزینه‌ای موافقت با دو گزینهٔ «بله، رضایت دارم» و «خیر، مایل به شرکت نیستم» نمایش داده می‌شود. تنها در صورت انتخاب گزینهٔ موافقت، ورود به ادامهٔ فرم ممکن خواهد بود و در غیر این صورت، فرم با پیام تشکر پایان می‌یابد.</w:t>
+        <w:t xml:space="preserve">مراحل اخذ رضایت آگاهانه به این صورت طراحی شده است که در صفحه نخست، متن کامل رضایت‌نامه شامل اهداف پژوهش، ماهیت داوطلبانه شرکت، تضمین کامل محرمانه‌ماندن و ناشناس‌بودن اطلاعات شرکت‌کنندگان به‌طور شفاف در اختیار شرکت‌کننده قرار می‌گیرد و بر داوطلبانه و آزادانه‌بودن رضایت تأکید می‌شود. سپس سؤال تک‌گزینه‌ای موافقت با دو گزینه «بله، رضایت دارم» و «خیر، مایل به شرکت نیستم» نمایش داده می‌شود. تنها در صورت انتخاب گزینه موافقت، ورود به ادامه فرم ممکن خواهد بود و در غیر این صورت، فرم با پیام تشکر پایان می‌یابد.</w:t>
       </w:r>
     </w:p>
     <w:p>
@@ -10240,7 +10251,7 @@
           <w:sz w:val="24"/>
           <w:szCs w:val="24"/>
         </w:rPr>
-        <w:t xml:space="preserve">پس از تأیید رضایت، نوبت به منطق غربالگری می‌رسد؛ منطقی متشکل از سه سؤال بله/خیر اجباری: (۱) داشتن ۱۸ سال یا بیشتر؛ (۲) معامله‌گر حقیقی بودن و معامله با سرمایهٔ شخصی؛ و (۳) داشتن حداقل شش ماه سابقهٔ معامله‌گری واقعی. در هر یک از این سه سؤال، پاسخ منفی به پایان فرم و نمایش پیام تشکر منجر می‌شود؛ به این ترتیب، ملاک‌های ورود به‌صورت خودکار و پیش از ورود به بخش اصلی پرسشنامه‌ها اعمال می‌شوند و تنها شرکت‌کنندگان واجد شرایط به ابزارهای اصلی دسترسی خواهند یافت. این منطق غربالگری در فرم آنلاین به‌صورت شرطی پیاده‌سازی شده است تا هیچ پاسخ غیرمربوطی وارد داده‌های تحلیل نشود.</w:t>
+        <w:t xml:space="preserve">پس از تأیید رضایت، نوبت به منطق غربالگری می‌رسد؛ منطقی متشکل از سه سؤال بله/خیر اجباری: (۱) داشتن ۱۸ سال یا بیشتر؛ (۲) معامله‌گر حقیقی بودن و معامله با سرمایه شخصی؛ و (۳) داشتن حداقل شش ماه سابقه معامله‌گری واقعی. در هر یک از این سه سؤال، پاسخ منفی به پایان فرم و نمایش پیام تشکر منجر می‌شود؛ به این ترتیب، ملاک‌های ورود به‌صورت خودکار و پیش از ورود به بخش اصلی پرسشنامه‌ها اعمال می‌شوند و تنها شرکت‌کنندگان واجد شرایط به ابزارهای اصلی دسترسی خواهند یافت. این منطق غربالگری در فرم آنلاین به‌صورت شرطی پیاده‌سازی شده است تا هیچ پاسخ غیرمربوطی وارد داده‌های تحلیل نشود.</w:t>
       </w:r>
     </w:p>
     <w:p>
@@ -10257,7 +10268,7 @@
           <w:sz w:val="24"/>
           <w:szCs w:val="24"/>
         </w:rPr>
-        <w:t xml:space="preserve">ترتیب اجرای پرسشنامه‌ها نیز به این صورت است. نخست اطلاعات جمعیت‌شناختی و معاملاتی ثبت می‌شود؛ متغیرهایی شامل سن، جنسیت، وضعیت تأهل، سطح تحصیلات و وضعیت اشتغال، و نیز بازار اصلی فعالیت، سابقهٔ معامله‌گری به ماه، تعداد معاملات در شش ماه اخیر و حدود سرمایه. سپس پرسشنامهٔ اضطراب صفتی اسپیلبرگر اجرا می‌شود؛ پس از آن پرسشنامهٔ طرحواره‌های ناسازگار اولیهٔ یانگ در سه صفحه ارائه می‌شود؛ و در نهایت مقیاس تحمل ریسک مالی گرابل و لایتون اجرا خواهد شد. این ترتیب در مشخصهٔ ساخت فرم آنلاین نیز به همین شکل تعیین شده است.</w:t>
+        <w:t xml:space="preserve">ترتیب اجرای پرسشنامه‌ها نیز به این صورت است. نخست اطلاعات جمعیت‌شناختی و معاملاتی ثبت می‌شود؛ متغیرهایی شامل سن، جنسیت، وضعیت تأهل، سطح تحصیلات و وضعیت اشتغال، و نیز بازار اصلی فعالیت، سابقه معامله‌گری به ماه، تعداد معاملات در شش ماه اخیر و حدود سرمایه. سپس پرسشنامه اضطراب صفتی اسپیلبرگر اجرا می‌شود؛ پس از آن پرسشنامه طرحواره‌های ناسازگار اولیه یانگ در سه صفحه ارائه می‌شود؛ و در نهایت مقیاس تحمل ریسک مالی گرابل و لایتون اجرا خواهد شد. این ترتیب در مشخصه ساخت فرم آنلاین نیز به همین شکل تعیین شده است.</w:t>
       </w:r>
     </w:p>
     <w:p>
@@ -10274,7 +10285,7 @@
           <w:sz w:val="24"/>
           <w:szCs w:val="24"/>
         </w:rPr>
-        <w:t xml:space="preserve">گردآوری داده‌ها به مدت تقریبی دو ماه برنامه‌ریزی شده است. لینک فرم از طریق کانال‌ها، گروه‌ها و انجمن‌های تخصصی معامله‌گری در شبکه‌های اجتماعی (مانند تلگرام، اینستاگرام و سایر پلتفرم‌ها) منتشر خواهد شد و از شرکت‌کنندگان واجد شرایط نیز خواسته می‌شود لینک را برای سایر معامله‌گران آشنای خود ارسال کنند. پس از رسیدن به حجم نمونهٔ هدف، گردآوری داده‌ها متوقف می‌شود. از آنجا که فرآیند گردآوری کاملاً آنلاین انجام می‌شود، همهٔ مراحل اجرا برای تمامی شرکت‌کنندگان با ترتیب یکسانی صورت می‌گیرد و شرایط اجرا برای همهٔ افراد یکسان است؛ این یکنواختی، قابلیت مقایسهٔ پاسخ‌ها را افزایش می‌دهد و در پایان فرم نیز صفحهٔ تشکر از شرکت‌کنندگان نمایش داده می‌شود.</w:t>
+        <w:t xml:space="preserve">گردآوری داده‌ها به مدت تقریبی دو ماه برنامه‌ریزی شده است. لینک فرم از طریق کانال‌ها، گروه‌ها و انجمن‌های تخصصی معامله‌گری در شبکه‌های اجتماعی (مانند تلگرام، اینستاگرام و سایر پلتفرم‌ها) منتشر خواهد شد و از شرکت‌کنندگان واجد شرایط نیز خواسته می‌شود لینک را برای سایر معامله‌گران آشنای خود ارسال کنند. پس از رسیدن به حجم نمونه هدف، گردآوری داده‌ها متوقف می‌شود. از آنجا که فرآیند گردآوری کاملاً آنلاین انجام می‌شود، همه مراحل اجرا برای تمامی شرکت‌کنندگان با ترتیب یکسانی صورت می‌گیرد و شرایط اجرا برای همه افراد یکسان است؛ این یکنواختی، قابلیت مقایسه پاسخ‌ها را افزایش می‌دهد و در پایان فرم نیز صفحه تشکر از شرکت‌کنندگان نمایش داده می‌شود.</w:t>
       </w:r>
     </w:p>
     <w:p>
@@ -10291,7 +10302,7 @@
           <w:sz w:val="24"/>
           <w:szCs w:val="24"/>
         </w:rPr>
-        <w:t xml:space="preserve">در راستای حفاظت از ناشناس‌بودن پاسخ‌ها، در فرم هیچ سؤالی برای دریافت نام، شماره تماس، کد ملی یا ایمیل گنجانده نشده است و اطلاعات هویتی ذخیره نخواهد شد. برای جلوگیری از ثبت پاسخ تکراری نیز محدودیت «هر کاربر فقط یک بار» بدون ذخیرهٔ هیچ دادهٔ هویتی فعال می‌شود.</w:t>
+        <w:t xml:space="preserve">در راستای حفاظت از ناشناس‌بودن پاسخ‌ها، در فرم هیچ سؤالی برای دریافت نام، شماره تماس، کد ملی یا ایمیل گنجانده نشده است و اطلاعات هویتی ذخیره نخواهد شد. برای جلوگیری از ثبت پاسخ تکراری نیز محدودیت «هر کاربر فقط یک بار» بدون ذخیره هیچ داده هویتی فعال می‌شود.</w:t>
       </w:r>
     </w:p>
     <w:p>
@@ -10308,13 +10319,14 @@
           <w:sz w:val="24"/>
           <w:szCs w:val="24"/>
         </w:rPr>
-        <w:t xml:space="preserve">کنترل کیفیت داده‌ها پس از اتمام گردآوری و در مرحلهٔ پاک‌سازی صورت می‌گیرد. در این مرحله، پاسخ‌های فاقد تأیید رضایت‌نامه حذف می‌شوند؛ فرم‌های ناقص کنار گذاشته می‌شوند؛ پاسخ‌هایی که الگوی یکنواخت و غیرواقعی دارند (مانند انتخاب یک گزینهٔ ثابت در همهٔ گویه‌ها) شناسایی و از مجموعهٔ داده خارج می‌شوند؛ پاسخ‌هایی که زمان تکمیل آن‌ها به‌طور نامتعارفی کوتاه‌تر از حداقل زمان لازم برای مطالعهٔ سؤالات باشد حذف می‌گردند؛ و تکرار احتمالی پاسخ‌ها نیز بررسی می‌شود. همچنین در صورت مشاهدهٔ پاسخ‌های مشابه از سوی بیش از یک نفر، موارد تکراری بررسی و در صورت لزوم حذف می‌شوند. در پایان، داده‌های باقی‌مانده بر اساس کدهای خروجی فرم کدگذاری می‌شوند و برای تحلیل در اختیار نرم‌افزار آماری قرار می‌گیرند.</w:t>
+        <w:t xml:space="preserve">کنترل کیفیت داده‌ها پس از اتمام گردآوری و در مرحله پاک‌سازی صورت می‌گیرد. در این مرحله، پاسخ‌های فاقد تأیید رضایت‌نامه حذف می‌شوند؛ فرم‌های ناقص کنار گذاشته می‌شوند؛ پاسخ‌هایی که الگوی یکنواخت و غیرواقعی دارند (مانند انتخاب یک گزینه ثابت در همه گویه‌ها) شناسایی و از مجموعه داده خارج می‌شوند؛ پاسخ‌هایی که زمان تکمیل آن‌ها به‌طور نامتعارفی کوتاه‌تر از حداقل زمان لازم برای مطالعه سؤالات باشد حذف می‌گردند؛ و تکرار احتمالی پاسخ‌ها نیز بررسی می‌شود. همچنین در صورت مشاهده پاسخ‌های مشابه از سوی بیش از یک نفر، موارد تکراری بررسی و در صورت لزوم حذف می‌شوند. در پایان، داده‌های باقی‌مانده بر اساس کدهای خروجی فرم کدگذاری می‌شوند و برای تحلیل در اختیار نرم‌افزار آماری قرار می‌گیرند.</w:t>
       </w:r>
     </w:p>
     <w:p>
       <w:pPr>
         <w:pStyle w:val="Heading2"/>
         <w:bidi w:val="1"/>
+        <w:jc w:val="right"/>
       </w:pPr>
       <w:r>
         <w:rPr>
@@ -10372,7 +10384,7 @@
           <w:sz w:val="24"/>
           <w:szCs w:val="24"/>
         </w:rPr>
-        <w:t xml:space="preserve"> پس از پایان گردآوری و اعمال کنترل‌های کیفی بیان‌شده در بخش روش اجرا، داده‌های خام بر اساس کدهای خروجی فرم شامل سؤالات جمعیت‌شناختی و معاملاتی، گویه‌های اضطراب صفتی، گویه‌های طرحواره‌ها و سؤالات تحمل ریسک کدگذاری می‌شوند؛ متغیرهای طبقه‌ای مانند جنسیت، سطح تحصیلات و بازار اصلی فعالیت نیز در همین مرحله کد عددی می‌گیرند. نمره‌گذاری گویه‌ها بر اساس راهنمای رسمی هر ابزار صورت می‌گیرد (اسپیلبرگر، ۱۹۸۳؛ یانگ، ۱۹۹۸؛ گرابل و لایتون، ۱۹۹۹). برای فرم صفتی اسپیلبرگر، نمرهٔ کل با احتساب نمره‌گذاری معکوس گویه‌های معکوس طبق راهنمای ابزار، در دامنهٔ ۲۰ تا ۸۰ محاسبه می‌شود؛ برای فرم کوتاه یانگ، نمرهٔ هر یک از ۱۵ طرحواره در دامنهٔ ۵ تا ۳۰ به دست می‌آید؛ و نمرهٔ کل مقیاس تحمل ریسک مالی بین ۱۳ تا ۴۵ محاسبه می‌شود. از آنجا که کلید نمره‌گذاری، فهرست گویه‌های معکوس و مرز خرده‌مقیاس‌ها در فرم منتشرشده درج نشده است، این کلیدها پیش از تحلیل از راهنمای اصلی ابزارها استخراج می‌شوند. در همین مرحله، داده‌های ناقص باقی‌مانده، پاسخ‌های پرت و الگوهای مشکوک نیز بررسی می‌شوند و وضعیت آن‌ها تعیین می‌گردد. گفتنی است که به دلیل اجباری‌بودن همهٔ سؤالات فرم، وقوع دادهٔ گمشده به حداقل ممکن محدود شده است و موارد معدود باقی‌مانده نیز پیش از تحلیل رسیدگی می‌شوند.</w:t>
+        <w:t xml:space="preserve"> پس از پایان گردآوری و اعمال کنترل‌های کیفی بیان‌شده در بخش روش اجرا، داده‌های خام بر اساس کدهای خروجی فرم شامل سؤالات جمعیت‌شناختی و معاملاتی، گویه‌های اضطراب صفتی، گویه‌های طرحواره‌ها و سؤالات تحمل ریسک کدگذاری می‌شوند؛ متغیرهای طبقه‌ای مانند جنسیت، سطح تحصیلات و بازار اصلی فعالیت نیز در همین مرحله کد عددی می‌گیرند. نمره‌گذاری گویه‌ها بر اساس راهنمای رسمی هر ابزار صورت می‌گیرد (اسپیلبرگر، ۱۹۸۳؛ یانگ، ۱۹۹۸؛ گرابل و لایتون، ۱۹۹۹). برای فرم صفتی اسپیلبرگر، نمره کل با احتساب نمره‌گذاری معکوس گویه‌های معکوس طبق راهنمای ابزار، در دامنه ۲۰ تا ۸۰ محاسبه می‌شود؛ برای فرم کوتاه یانگ، نمره هر یک از ۱۵ طرحواره در دامنه ۵ تا ۳۰ به دست می‌آید؛ و نمره کل مقیاس تحمل ریسک مالی بین ۱۳ تا ۴۵ محاسبه می‌شود. از آنجا که کلید نمره‌گذاری، فهرست گویه‌های معکوس و مرز خرده‌مقیاس‌ها در فرم منتشرشده درج نشده است، این کلیدها پیش از تحلیل از راهنمای اصلی ابزارها استخراج می‌شوند. در همین مرحله، داده‌های ناقص باقی‌مانده، پاسخ‌های پرت و الگوهای مشکوک نیز بررسی می‌شوند و وضعیت آن‌ها تعیین می‌گردد. گفتنی است که به دلیل اجباری‌بودن همه سؤالات فرم، وقوع داده گمشده به حداقل ممکن محدود شده است و موارد معدود باقی‌مانده نیز پیش از تحلیل رسیدگی می‌شوند.</w:t>
       </w:r>
     </w:p>
     <w:p>
@@ -10401,7 +10413,7 @@
           <w:sz w:val="24"/>
           <w:szCs w:val="24"/>
         </w:rPr>
-        <w:t xml:space="preserve"> برای توصیف متغیرهای اصلی پژوهش — اضطراب صفتی، طرحواره‌های ناسازگار اولیه و رفتارهای مالی پرخطر — از شاخص‌های میانگین، انحراف معیار، حداقل و حداکثر استفاده می‌شود. برای متغیرهای جمعیت‌شناختی و معاملاتی نیز فراوانی و درصد گزارش می‌شود؛ این متغیرها شامل سن، جنسیت، وضعیت تأهل و سطح تحصیلات از یک سو و وضعیت اشتغال، بازار اصلی فعالیت و سابقهٔ معامله‌گری از سوی دیگر هستند. این شاخص‌ها تصویری کلی از ویژگی‌های نمونه ارائه می‌دهند و مبنای تفسیر یافته‌های استنباطی خواهند بود و در قالب جدول و نمودار در فصل چهارم ارائه می‌شوند.</w:t>
+        <w:t xml:space="preserve"> برای توصیف متغیرهای اصلی پژوهش — اضطراب صفتی، طرحواره‌های ناسازگار اولیه و رفتارهای مالی پرخطر — از شاخص‌های میانگین، انحراف معیار، حداقل و حداکثر استفاده می‌شود. برای متغیرهای جمعیت‌شناختی و معاملاتی نیز فراوانی و درصد گزارش می‌شود؛ این متغیرها شامل سن، جنسیت، وضعیت تأهل و سطح تحصیلات از یک سو و وضعیت اشتغال، بازار اصلی فعالیت و سابقه معامله‌گری از سوی دیگر هستند. این شاخص‌ها تصویری کلی از ویژگی‌های نمونه ارائه می‌دهند و مبنای تفسیر یافته‌های استنباطی خواهند بود و در قالب جدول و نمودار در فصل چهارم ارائه می‌شوند.</w:t>
       </w:r>
     </w:p>
     <w:p>
@@ -10420,17 +10432,17 @@
           <w:b/>
           <w:bCs/>
         </w:rPr>
-        <w:t xml:space="preserve">پایایی ابزارها در نمونهٔ پژوهش.</w:t>
-      </w:r>
-      <w:r>
-        <w:rPr>
-          <w:rFonts w:ascii="B Nazanin" w:hAnsi="B Nazanin" w:cs="B Nazanin" w:hint="cs"/>
-          <w:rtl/>
-          <w:lang w:bidi="fa-IR"/>
-          <w:sz w:val="24"/>
-          <w:szCs w:val="24"/>
-        </w:rPr>
-        <w:t xml:space="preserve"> پایایی درونی هر سه ابزار برای نمونهٔ پژوهش حاضر با آلفای کرونباخ محاسبه می‌شود و مقادیر آن به تفکیک ابزار و خرده‌مقیاس‌ها در فصل چهارم گزارش خواهد شد. افزون بر نمره‌های کل سه ابزار، پایایی ۱۵ خرده‌مقیاس فرم کوتاه یانگ نیز به‌صورت جداگانه ارزیابی می‌شود. از آنجا که در این مرحله از تدوین رساله هنوز داده‌ای گردآوری نشده است، هیچ مقدار عددی برای پایایی در این فصل ذکر نمی‌شود و گزارش کمّی آن به فصل چهارم موکول می‌گردد و سازگاری مقادیر به‌دست‌آمده با یافته‌های روان‌سنجی پژوهش‌های پیشین نیز در همان فصل بحث می‌شود.</w:t>
+        <w:t xml:space="preserve">پایایی ابزارها در نمونه پژوهش.</w:t>
+      </w:r>
+      <w:r>
+        <w:rPr>
+          <w:rFonts w:ascii="B Nazanin" w:hAnsi="B Nazanin" w:cs="B Nazanin" w:hint="cs"/>
+          <w:rtl/>
+          <w:lang w:bidi="fa-IR"/>
+          <w:sz w:val="24"/>
+          <w:szCs w:val="24"/>
+        </w:rPr>
+        <w:t xml:space="preserve"> پایایی درونی هر سه ابزار برای نمونه پژوهش حاضر با آلفای کرونباخ محاسبه می‌شود و مقادیر آن به تفکیک ابزار و خرده‌مقیاس‌ها در فصل چهارم گزارش خواهد شد. افزون بر نمره‌های کل سه ابزار، پایایی ۱۵ خرده‌مقیاس فرم کوتاه یانگ نیز به‌صورت جداگانه ارزیابی می‌شود. از آنجا که در این مرحله از تدوین رساله هنوز داده‌ای گردآوری نشده است، هیچ مقدار عددی برای پایایی در این فصل ذکر نمی‌شود و گزارش کمّی آن به فصل چهارم موکول می‌گردد و سازگاری مقادیر به‌دست‌آمده با یافته‌های روان‌سنجی پژوهش‌های پیشین نیز در همان فصل بحث می‌شود.</w:t>
       </w:r>
     </w:p>
     <w:p>
@@ -10459,7 +10471,7 @@
           <w:sz w:val="24"/>
           <w:szCs w:val="24"/>
         </w:rPr>
-        <w:t xml:space="preserve"> پیش از اجرای آزمون‌های استنباطی، مفروضه‌های لازم بررسی می‌شوند: نرمال‌بودن توزیع متغیرها با شاخص‌های توصیفی مانند چولگی و کشیدگی و نیز بررسی نمودارها ارزیابی می‌شود. در صورت انحراف شدید از توزیع نرمال نیز تصمیم مقتضی دربارهٔ شیوهٔ تحلیل بر همین اساس اتخاذ می‌گردد. خطی‌بودن روابط میان متغیرها بررسی می‌شود؛ نبود هم‌خطی شدید میان متغیرهای پیش‌بین ارزیابی می‌گردد؛ داده‌های پرت — که می‌توانند برآورد ضرایب همبستگی و پارامترهای مدل میانجی‌گری را مخدوش کنند — شناسایی و وضعیت آن‌ها تعیین می‌شود؛ و کفایت حجم نمونه برای روش اصلی تحلیل مورد ارزیابی قرار می‌گیرد. بر اساس قواعد تجربی مدل‌یابی معادلات ساختاری، حجم نمونه‌ای در حدود ۲۰۰ نفر برای برآوردهای پایا مناسب تلقی می‌شود (کلاین، ۲۰۱۶)؛ همان‌گونه که در بخش حجم نمونه بیان شد، هدف پژوهش رسیدن به همین کران است و در صورت عدم دسترسی کافی، تحلیل با حداقل ۱۰۰ نفر و با ذکر صریح محدودیت انجام می‌گیرد. نتیجهٔ بررسی این پیش‌فرض‌ها، چارچوب روش تحلیلی نهایی را مشخص می‌کند و مستندسازی آن در گزارش فصل چهارم انجام می‌گیرد.</w:t>
+        <w:t xml:space="preserve"> پیش از اجرای آزمون‌های استنباطی، مفروضه‌های لازم بررسی می‌شوند: نرمال‌بودن توزیع متغیرها با شاخص‌های توصیفی مانند چولگی و کشیدگی و نیز بررسی نمودارها ارزیابی می‌شود. در صورت انحراف شدید از توزیع نرمال نیز تصمیم مقتضی درباره شیوه تحلیل بر همین اساس اتخاذ می‌گردد. خطی‌بودن روابط میان متغیرها بررسی می‌شود؛ نبود هم‌خطی شدید میان متغیرهای پیش‌بین ارزیابی می‌گردد؛ داده‌های پرت — که می‌توانند برآورد ضرایب همبستگی و پارامترهای مدل میانجی‌گری را مخدوش کنند — شناسایی و وضعیت آن‌ها تعیین می‌شود؛ و کفایت حجم نمونه برای روش اصلی تحلیل مورد ارزیابی قرار می‌گیرد. بر اساس قواعد تجربی مدل‌یابی معادلات ساختاری، حجم نمونه‌ای در حدود ۲۰۰ نفر برای برآوردهای پایا مناسب تلقی می‌شود (کلاین، ۲۰۱۶)؛ همان‌گونه که در بخش حجم نمونه بیان شد، هدف پژوهش رسیدن به همین کران است و در صورت عدم دسترسی کافی، تحلیل با حداقل ۱۰۰ نفر و با ذکر صریح محدودیت انجام می‌گیرد. نتیجه بررسی این پیش‌فرض‌ها، چارچوب روش تحلیلی نهایی را مشخص می‌کند و مستندسازی آن در گزارش فصل چهارم انجام می‌گیرد.</w:t>
       </w:r>
     </w:p>
     <w:p>
@@ -10488,7 +10500,7 @@
           <w:sz w:val="24"/>
           <w:szCs w:val="24"/>
         </w:rPr>
-        <w:t xml:space="preserve"> برای بررسی روابط دوجانبهٔ میان متغیرهای پژوهش در قالب فرضیه‌های فرعی، از ضریب همبستگی پیرسون استفاده خواهد شد؛ پیش از آن، ماتریس همبستگی میان همهٔ متغیرهای اصلی تشکیل می‌شود که مبنای بررسی هم‌خطی نیز خواهد بود. این ضریب، جهت و شدت رابطهٔ خطی میان هر جفت از متغیرها را نشان می‌دهد. باید توجه داشت که با توجه به مقطعی‌بودن طرح پژوهش، همبستگی‌ها صرفاً در سطح رابطه تفسیر می‌شوند و دلالت علّی ندارند. سطح معناداری در همهٔ آزمون‌های پژوهش ۰٫۰۵ در نظر گرفته شده است.</w:t>
+        <w:t xml:space="preserve"> برای بررسی روابط دوجانبه میان متغیرهای پژوهش در قالب فرضیه‌های فرعی، از ضریب همبستگی پیرسون استفاده خواهد شد؛ پیش از آن، ماتریس همبستگی میان همه متغیرهای اصلی تشکیل می‌شود که مبنای بررسی هم‌خطی نیز خواهد بود. این ضریب، جهت و شدت رابطه خطی میان هر جفت از متغیرها را نشان می‌دهد. باید توجه داشت که با توجه به مقطعی‌بودن طرح پژوهش، همبستگی‌ها صرفاً در سطح رابطه تفسیر می‌شوند و دلالت علّی ندارند. سطح معناداری در همه آزمون‌های پژوهش ۰٫۰۵ در نظر گرفته شده است.</w:t>
       </w:r>
     </w:p>
     <w:p>
@@ -10507,17 +10519,17 @@
           <w:b/>
           <w:bCs/>
         </w:rPr>
-        <w:t xml:space="preserve">آزمون فرضیهٔ اصلی و مدل میانجی‌گری.</w:t>
-      </w:r>
-      <w:r>
-        <w:rPr>
-          <w:rFonts w:ascii="B Nazanin" w:hAnsi="B Nazanin" w:cs="B Nazanin" w:hint="cs"/>
-          <w:rtl/>
-          <w:lang w:bidi="fa-IR"/>
-          <w:sz w:val="24"/>
-          <w:szCs w:val="24"/>
-        </w:rPr>
-        <w:t xml:space="preserve"> برای آزمون نقش میانجی طرحواره‌های ناسازگار اولیه در رابطهٔ میان اضطراب صفتی و رفتارهای مالی پرخطر، دو چارچوب تحلیلی در نظر گرفته شده است. در این مدل، اثر کل اضطراب صفتی بر رفتارهای مالی پرخطر به دو مؤلفهٔ اثر مستقیم و اثر غیرمستقیم تجزیه می‌شود و مؤلفهٔ غیرمستقیم، مسیری است که از مجرای طرحواره‌های ناسازگار اولیه عبور می‌کند. روش اصلی، مدل‌سازی معادلات ساختاری در نرم‌افزار </w:t>
+        <w:t xml:space="preserve">آزمون فرضیه اصلی و مدل میانجی‌گری.</w:t>
+      </w:r>
+      <w:r>
+        <w:rPr>
+          <w:rFonts w:ascii="B Nazanin" w:hAnsi="B Nazanin" w:cs="B Nazanin" w:hint="cs"/>
+          <w:rtl/>
+          <w:lang w:bidi="fa-IR"/>
+          <w:sz w:val="24"/>
+          <w:szCs w:val="24"/>
+        </w:rPr>
+        <w:t xml:space="preserve"> برای آزمون نقش میانجی طرحواره‌های ناسازگار اولیه در رابطه میان اضطراب صفتی و رفتارهای مالی پرخطر، دو چارچوب تحلیلی در نظر گرفته شده است. در این مدل، اثر کل اضطراب صفتی بر رفتارهای مالی پرخطر به دو مؤلفه اثر مستقیم و اثر غیرمستقیم تجزیه می‌شود و مؤلفه غیرمستقیم، مسیری است که از مجرای طرحواره‌های ناسازگار اولیه عبور می‌کند. روش اصلی، مدل‌سازی معادلات ساختاری در نرم‌افزار </w:t>
       </w:r>
       <w:r>
         <w:rPr>
@@ -10536,7 +10548,7 @@
           <w:sz w:val="24"/>
           <w:szCs w:val="24"/>
         </w:rPr>
-        <w:t xml:space="preserve"> است که در صورت کفایت حجم نمونه (در حدود ۲۰۰ نفر) به کار می‌رود و برازش مدل با شاخص‌های کای‌دو نسبت به درجهٔ آزادی، شاخص برازش تطبیقی و ریشهٔ میانگین مربعات خطای برآورد ارزیابی می‌شود. روش جایگزین و تکمیلی، تحلیل مسیر با ماکروی </w:t>
+        <w:t xml:space="preserve"> است که در صورت کفایت حجم نمونه (در حدود ۲۰۰ نفر) به کار می‌رود و برازش مدل با شاخص‌های کای‌دو نسبت به درجه آزادی، شاخص برازش تطبیقی و ریشه میانگین مربعات خطای برآورد ارزیابی می‌شود. روش جایگزین و تکمیلی، تحلیل مسیر با ماکروی </w:t>
       </w:r>
       <w:r>
         <w:rPr>
@@ -10555,7 +10567,7 @@
           <w:sz w:val="24"/>
           <w:szCs w:val="24"/>
         </w:rPr>
-        <w:t xml:space="preserve"> و الگوی شمارهٔ ۴ است که اثرات مستقیم و غیرمستقیم را برآورد می‌کند و معناداری اثر غیرمستقیم از طریق روش بوت‌استرپ همراه با فاصلهٔ اطمینان ۹۵ درصد آزمون می‌شود (هایز، ۲۰۱۸)؛ در این چارچوب، در صورتی که فاصلهٔ اطمینان بوت‌استرپ برای اثر غیرمستقیم عدد صفر را در بر نگیرد، اثر میانجی در سطح ۰٫۰۵ معنادار تلقی می‌شود. انتخاب میان این دو روش بر اساس حجم نهایی نمونهٔ تحقق‌یافته و نتایج بررسی پیش‌فرض‌ها صورت می‌گیرد؛ در هر دو حالت، تفسیر نتایج بر اساس منطق میانجی‌گری و در چارچوب نظری پژوهش انجام می‌شود و هیچ نتیجه‌ای پیش از گردآوری و تحلیل واقعی داده‌ها قابل گزارش نیست.</w:t>
+        <w:t xml:space="preserve"> و الگوی شماره ۴ است که اثرات مستقیم و غیرمستقیم را برآورد می‌کند و معناداری اثر غیرمستقیم از طریق روش بوت‌استرپ همراه با فاصله اطمینان ۹۵ درصد آزمون می‌شود (هایز، ۲۰۱۸)؛ در این چارچوب، در صورتی که فاصله اطمینان بوت‌استرپ برای اثر غیرمستقیم عدد صفر را در بر نگیرد، اثر میانجی در سطح ۰٫۰۵ معنادار تلقی می‌شود. انتخاب میان این دو روش بر اساس حجم نهایی نمونه تحقق‌یافته و نتایج بررسی پیش‌فرض‌ها صورت می‌گیرد؛ در هر دو حالت، تفسیر نتایج بر اساس منطق میانجی‌گری و در چارچوب نظری پژوهش انجام می‌شود و هیچ نتیجه‌ای پیش از گردآوری و تحلیل واقعی داده‌ها قابل گزارش نیست.</w:t>
       </w:r>
     </w:p>
     <w:p>
@@ -10603,7 +10615,7 @@
           <w:sz w:val="24"/>
           <w:szCs w:val="24"/>
         </w:rPr>
-        <w:t xml:space="preserve"> نسخهٔ ۲۶ و (در صورت امکان) نرم‌افزار </w:t>
+        <w:t xml:space="preserve"> نسخه ۲۶ و (در صورت امکان) نرم‌افزار </w:t>
       </w:r>
       <w:r>
         <w:rPr>
@@ -10622,7 +10634,7 @@
           <w:sz w:val="24"/>
           <w:szCs w:val="24"/>
         </w:rPr>
-        <w:t xml:space="preserve"> نسخهٔ ۲۴ انجام می‌شود و برای تحلیل مسیر جایگزین، از ماکروی </w:t>
+        <w:t xml:space="preserve"> نسخه ۲۴ انجام می‌شود و برای تحلیل مسیر جایگزین، از ماکروی </w:t>
       </w:r>
       <w:r>
         <w:rPr>
@@ -10677,13 +10689,14 @@
           <w:sz w:val="24"/>
           <w:szCs w:val="24"/>
         </w:rPr>
-        <w:t xml:space="preserve">نتیجهٔ همهٔ تحلیل‌های توصیفی و استنباطی یادشده در فصل چهارم در قالب جدول‌ها و نمودارها گزارش می‌شود و در فصل حاضر هیچ نتیجه، عدد تحلیلی یا یافته‌ای پیش از گردآوری واقعی داده‌ها ارائه نمی‌شود.</w:t>
+        <w:t xml:space="preserve">نتیجه همه تحلیل‌های توصیفی و استنباطی یادشده در فصل چهارم در قالب جدول‌ها و نمودارها گزارش می‌شود و در فصل حاضر هیچ نتیجه، عدد تحلیلی یا یافته‌ای پیش از گردآوری واقعی داده‌ها ارائه نمی‌شود.</w:t>
       </w:r>
     </w:p>
     <w:p>
       <w:pPr>
         <w:pStyle w:val="Heading2"/>
         <w:bidi w:val="1"/>
+        <w:jc w:val="right"/>
       </w:pPr>
       <w:r>
         <w:rPr>
@@ -10712,7 +10725,7 @@
           <w:sz w:val="24"/>
           <w:szCs w:val="24"/>
         </w:rPr>
-        <w:t xml:space="preserve">رعایت اصول اخلاقی در این پژوهش یک الزام بنیادین است. پژوهش حاضر نیز با پایبندی کامل به اصول اخلاقی حاکم بر پژوهش‌های رفتاری با شرکت انسان‌ها طراحی شده و بر همین مبنا اجرا خواهد گردید. پیش از آغاز گردآوری داده‌ها، پروپوزال پس از تصویب شورای تحصیلات تکمیلی گروه روان‌شناسی برای بررسی ملاحظات اخلاقی به کمیتهٔ اخلاق در پژوهش دانشگاه علم و هنر یزد ارسال خواهد شد و کد اخلاق پژوهش از این کمیته اخذ می‌گردد؛ آغاز جمع‌آوری داده‌ها منوط به دریافت تأییدیهٔ نهایی کمیتهٔ اخلاق است و اجرای کامل پژوهش، در صورت نیاز، پس از اخذ مجوزهای دانشگاهی انجام خواهد شد.</w:t>
+        <w:t xml:space="preserve">رعایت اصول اخلاقی در این پژوهش یک الزام بنیادین است. پژوهش حاضر نیز با پایبندی کامل به اصول اخلاقی حاکم بر پژوهش‌های رفتاری با شرکت انسان‌ها طراحی شده و بر همین مبنا اجرا خواهد گردید. پیش از آغاز گردآوری داده‌ها، پروپوزال پس از تصویب شورای تحصیلات تکمیلی گروه روان‌شناسی برای بررسی ملاحظات اخلاقی به کمیته اخلاق در پژوهش دانشگاه علم و هنر یزد ارسال خواهد شد و کد اخلاق پژوهش از این کمیته اخذ می‌گردد؛ آغاز جمع‌آوری داده‌ها منوط به دریافت تأییدیه نهایی کمیته اخلاق است و اجرای کامل پژوهش، در صورت نیاز، پس از اخذ مجوزهای دانشگاهی انجام خواهد شد.</w:t>
       </w:r>
     </w:p>
     <w:p>
@@ -10729,7 +10742,7 @@
           <w:sz w:val="24"/>
           <w:szCs w:val="24"/>
         </w:rPr>
-        <w:t xml:space="preserve">شرکت در پژوهش کاملاً داوطلبانه است. در صفحهٔ ابتدایی فرم، هدف و ماهیت پژوهش به‌طور روشن برای شرکت‌کنندگان توضیح داده می‌شود و شرکت‌کنندگان تنها در صورت تأیید رضایت‌نامهٔ آگاهانه وارد فرم می‌شوند. در متن رضایت‌نامه بر آزادانه و آگاهانه‌بودن رضایت تأکید می‌شود و بیان می‌گردد که شرکت‌کننده اطلاعات مربوط به پژوهش را مطالعه کرده و فرصت پرسیدن سؤالات خود را داشته است؛ همچنین تصریح می‌شود که این پژوهش شامل هیچ‌گونه مداخلهٔ درمانی یا مالی نیست و پاسخ‌ها هیچ تأثیری بر وضعیت شغلی یا مالی معامله‌گران نخواهد داشت. همچنین به شرکت‌کنندگان اعلام می‌شود که در هر مرحله امکان انصراف بدون هیچ پیامد منفی را دارند؛ در فرم آنلاین، خروج از فرم در هر لحظه به‌منزلهٔ انصراف تلقی می‌شود و داده‌های ثبت‌نشده در هیچ تحلیلی وارد نخواهند شد.</w:t>
+        <w:t xml:space="preserve">شرکت در پژوهش کاملاً داوطلبانه است. در صفحه ابتدایی فرم، هدف و ماهیت پژوهش به‌طور روشن برای شرکت‌کنندگان توضیح داده می‌شود و شرکت‌کنندگان تنها در صورت تأیید رضایت‌نامه آگاهانه وارد فرم می‌شوند. در متن رضایت‌نامه بر آزادانه و آگاهانه‌بودن رضایت تأکید می‌شود و بیان می‌گردد که شرکت‌کننده اطلاعات مربوط به پژوهش را مطالعه کرده و فرصت پرسیدن سؤالات خود را داشته است؛ همچنین تصریح می‌شود که این پژوهش شامل هیچ‌گونه مداخله درمانی یا مالی نیست و پاسخ‌ها هیچ تأثیری بر وضعیت شغلی یا مالی معامله‌گران نخواهد داشت. همچنین به شرکت‌کنندگان اعلام می‌شود که در هر مرحله امکان انصراف بدون هیچ پیامد منفی را دارند؛ در فرم آنلاین، خروج از فرم در هر لحظه به‌منزله انصراف تلقی می‌شود و داده‌های ثبت‌نشده در هیچ تحلیلی وارد نخواهند شد.</w:t>
       </w:r>
     </w:p>
     <w:p>
@@ -10746,7 +10759,7 @@
           <w:sz w:val="24"/>
           <w:szCs w:val="24"/>
         </w:rPr>
-        <w:t xml:space="preserve">ناشناس‌بودن و محرمانگی پاسخ‌ها در تمام مراحل حفظ می‌شود. هیچ‌گونه اطلاعات هویتی قابل شناسایی مانند نام، نام خانوادگی، شماره تماس، کد ملی یا ایمیل دریافت نمی‌شود و برای جلوگیری از پاسخ تکراری نیز از سازوکاری استفاده می‌شود که در آن هیچ دادهٔ هویتی ذخیره نمی‌شود. داده‌ها صرفاً برای اهداف علمی گردآوری می‌شوند و فقط به‌صورت کلی و گروهی و در چارچوب اهداف علمی گزارش می‌شوند و در اختیار هیچ شخص یا نهاد ثالثی قرار نمی‌گیرند؛ هیچ گزارشی در سطح فردی منتشر نمی‌شود و در انتشار نتایج پژوهش نیز هیچ اطلاعاتی که بتواند منجر به شناسایی افراد شود ارائه نمی‌گردد. فایل‌های خروجی پژوهش نیز به‌صورت امن نگهداری می‌شوند و تنها در دسترس پژوهشگر و برای اهداف علمی و دانشگاهی مورد استفاده قرار می‌گیرند.</w:t>
+        <w:t xml:space="preserve">ناشناس‌بودن و محرمانگی پاسخ‌ها در تمام مراحل حفظ می‌شود. هیچ‌گونه اطلاعات هویتی قابل شناسایی مانند نام، نام خانوادگی، شماره تماس، کد ملی یا ایمیل دریافت نمی‌شود و برای جلوگیری از پاسخ تکراری نیز از سازوکاری استفاده می‌شود که در آن هیچ داده هویتی ذخیره نمی‌شود. داده‌ها صرفاً برای اهداف علمی گردآوری می‌شوند و فقط به‌صورت کلی و گروهی و در چارچوب اهداف علمی گزارش می‌شوند و در اختیار هیچ شخص یا نهاد ثالثی قرار نمی‌گیرند؛ هیچ گزارشی در سطح فردی منتشر نمی‌شود و در انتشار نتایج پژوهش نیز هیچ اطلاعاتی که بتواند منجر به شناسایی افراد شود ارائه نمی‌گردد. فایل‌های خروجی پژوهش نیز به‌صورت امن نگهداری می‌شوند و تنها در دسترس پژوهشگر و برای اهداف علمی و دانشگاهی مورد استفاده قرار می‌گیرند.</w:t>
       </w:r>
     </w:p>
     <w:p>
@@ -10763,7 +10776,7 @@
           <w:sz w:val="24"/>
           <w:szCs w:val="24"/>
         </w:rPr>
-        <w:t xml:space="preserve">از آنجا که بخشی از سؤالات پژوهش به احساسات، نگرانی‌ها و تصمیم‌های مالی شرکت‌کنندگان — از جمله تجربه‌های مرتبط با زیان مالی — مربوط می‌شوند، ممکن است پاسخ‌دادن به این سؤالات برای برخی افراد حساسیت‌برانگیز باشد. این نکته در طراحی ابزارها لحاظ شده است؛ چه آنکه گویه‌ها در قالب عبارات کلی دربارهٔ احساسات و رفتارهای معمول مطرح می‌شوند و شرکت‌کننده را ملزم به بازگویی جزئیات رویدادهای خاص نمی‌کنند. برای مدیریت این حساسیت، امکان توقف یا انصراف در هر لحظه فراهم است و در رضایت‌نامه به‌طور صریح ذکر می‌شود که پاسخ‌ها هیچ پیامد شغلی یا مالی برای فرد نخواهند داشت. با توجه به ماهیت توصیفی و غیرمداخله‌ای پژوهش، هیچ‌گونه عوارضی متوجه شرکت‌کنندگان نخواهد بود و چارچوب اجرای پژوهش به‌گونه‌ای طراحی شده است که پاسخ‌دادن به سؤالات، بار روانی غیرمتعارفی بر شرکت‌کنندگان تحمیل نکند.</w:t>
+        <w:t xml:space="preserve">از آنجا که بخشی از سؤالات پژوهش به احساسات، نگرانی‌ها و تصمیم‌های مالی شرکت‌کنندگان — از جمله تجربه‌های مرتبط با زیان مالی — مربوط می‌شوند، ممکن است پاسخ‌دادن به این سؤالات برای برخی افراد حساسیت‌برانگیز باشد. این نکته در طراحی ابزارها لحاظ شده است؛ چه آنکه گویه‌ها در قالب عبارات کلی درباره احساسات و رفتارهای معمول مطرح می‌شوند و شرکت‌کننده را ملزم به بازگویی جزئیات رویدادهای خاص نمی‌کنند. برای مدیریت این حساسیت، امکان توقف یا انصراف در هر لحظه فراهم است و در رضایت‌نامه به‌طور صریح ذکر می‌شود که پاسخ‌ها هیچ پیامد شغلی یا مالی برای فرد نخواهند داشت. با توجه به ماهیت توصیفی و غیرمداخله‌ای پژوهش، هیچ‌گونه عوارضی متوجه شرکت‌کنندگان نخواهد بود و چارچوب اجرای پژوهش به‌گونه‌ای طراحی شده است که پاسخ‌دادن به سؤالات، بار روانی غیرمتعارفی بر شرکت‌کنندگان تحمیل نکند.</w:t>
       </w:r>
     </w:p>
     <w:p>
@@ -10780,7 +10793,7 @@
           <w:sz w:val="24"/>
           <w:szCs w:val="24"/>
         </w:rPr>
-        <w:t xml:space="preserve">بدین ترتیب، چهارچوب اخلاقی پژوهش بر سه اصل داوطلبانه‌بودن شرکت، ناشناس‌بودن و محرمانگی داده‌ها، و محدود بودن استفاده از داده‌ها به اهداف علمی استوار است و همهٔ سازوکارهای اجرایی فرم آنلاین نیز بر همین اساس طراحی شده‌اند. این ملاحظات، تعهدات پژوهشگر مندرج در پروپوزال و رضایت‌نامهٔ آگاهانهٔ پژوهش را نیز پوشش می‌دهند.</w:t>
+        <w:t xml:space="preserve">بدین ترتیب، چهارچوب اخلاقی پژوهش بر سه اصل داوطلبانه‌بودن شرکت، ناشناس‌بودن و محرمانگی داده‌ها، و محدود بودن استفاده از داده‌ها به اهداف علمی استوار است و همه سازوکارهای اجرایی فرم آنلاین نیز بر همین اساس طراحی شده‌اند. این ملاحظات، تعهدات پژوهشگر مندرج در پروپوزال و رضایت‌نامه آگاهانه پژوهش را نیز پوشش می‌دهند.</w:t>
       </w:r>
     </w:p>
     <w:p>
@@ -13274,7 +13287,7 @@
           <w:sz w:val="20"/>
           <w:szCs w:val="20"/>
         </w:rPr>
-        <w:t xml:space="preserve"> Mahato et al.</w:t>
+        <w:t xml:space="preserve"> OECD, 2021</w:t>
       </w:r>
     </w:p>
   </w:footnote>
@@ -13295,7 +13308,7 @@
           <w:sz w:val="20"/>
           <w:szCs w:val="20"/>
         </w:rPr>
-        <w:t xml:space="preserve"> Grall-Bronnec et al.</w:t>
+        <w:t xml:space="preserve"> Mahato et al.</w:t>
       </w:r>
     </w:p>
   </w:footnote>
@@ -13316,7 +13329,7 @@
           <w:sz w:val="20"/>
           <w:szCs w:val="20"/>
         </w:rPr>
-        <w:t xml:space="preserve"> Mishkin</w:t>
+        <w:t xml:space="preserve"> Grall-Bronnec et al.</w:t>
       </w:r>
     </w:p>
   </w:footnote>
@@ -13337,7 +13350,7 @@
           <w:sz w:val="20"/>
           <w:szCs w:val="20"/>
         </w:rPr>
-        <w:t xml:space="preserve"> Bodie, Kane, &amp; Marcus</w:t>
+        <w:t xml:space="preserve"> Mishkin</w:t>
       </w:r>
     </w:p>
   </w:footnote>
@@ -13358,7 +13371,7 @@
           <w:sz w:val="20"/>
           <w:szCs w:val="20"/>
         </w:rPr>
-        <w:t xml:space="preserve"> Shiller</w:t>
+        <w:t xml:space="preserve"> Bodie, Kane, &amp; Marcus</w:t>
       </w:r>
     </w:p>
   </w:footnote>
@@ -13379,7 +13392,7 @@
           <w:sz w:val="20"/>
           <w:szCs w:val="20"/>
         </w:rPr>
-        <w:t xml:space="preserve"> Malkiel</w:t>
+        <w:t xml:space="preserve"> Shiller</w:t>
       </w:r>
     </w:p>
   </w:footnote>
@@ -13400,7 +13413,7 @@
           <w:sz w:val="20"/>
           <w:szCs w:val="20"/>
         </w:rPr>
-        <w:t xml:space="preserve"> Thaler</w:t>
+        <w:t xml:space="preserve"> Malkiel</w:t>
       </w:r>
     </w:p>
   </w:footnote>
@@ -13421,7 +13434,7 @@
           <w:sz w:val="20"/>
           <w:szCs w:val="20"/>
         </w:rPr>
-        <w:t xml:space="preserve"> Kahneman &amp; Tversky</w:t>
+        <w:t xml:space="preserve"> Thaler</w:t>
       </w:r>
     </w:p>
   </w:footnote>
@@ -13442,7 +13455,7 @@
           <w:sz w:val="20"/>
           <w:szCs w:val="20"/>
         </w:rPr>
-        <w:t xml:space="preserve"> Kahneman</w:t>
+        <w:t xml:space="preserve"> Kahneman &amp; Tversky</w:t>
       </w:r>
     </w:p>
   </w:footnote>
@@ -13463,7 +13476,7 @@
           <w:sz w:val="20"/>
           <w:szCs w:val="20"/>
         </w:rPr>
-        <w:t xml:space="preserve"> Auer &amp; Schuhmacher</w:t>
+        <w:t xml:space="preserve"> Kahneman</w:t>
       </w:r>
     </w:p>
   </w:footnote>
@@ -13484,7 +13497,7 @@
           <w:sz w:val="20"/>
           <w:szCs w:val="20"/>
         </w:rPr>
-        <w:t xml:space="preserve"> Hwang &amp; Salmon</w:t>
+        <w:t xml:space="preserve"> Auer &amp; Schuhmacher</w:t>
       </w:r>
     </w:p>
   </w:footnote>
@@ -13505,7 +13518,7 @@
           <w:sz w:val="20"/>
           <w:szCs w:val="20"/>
         </w:rPr>
-        <w:t xml:space="preserve"> Spielberger</w:t>
+        <w:t xml:space="preserve"> Hwang &amp; Salmon</w:t>
       </w:r>
     </w:p>
   </w:footnote>
@@ -13526,7 +13539,7 @@
           <w:sz w:val="20"/>
           <w:szCs w:val="20"/>
         </w:rPr>
-        <w:t xml:space="preserve"> Beck</w:t>
+        <w:t xml:space="preserve"> Spielberger</w:t>
       </w:r>
     </w:p>
   </w:footnote>
@@ -13547,7 +13560,7 @@
           <w:sz w:val="20"/>
           <w:szCs w:val="20"/>
         </w:rPr>
-        <w:t xml:space="preserve"> Bishop</w:t>
+        <w:t xml:space="preserve"> Beck</w:t>
       </w:r>
     </w:p>
   </w:footnote>
@@ -13568,7 +13581,7 @@
           <w:sz w:val="20"/>
           <w:szCs w:val="20"/>
         </w:rPr>
-        <w:t xml:space="preserve"> Beck &amp; Clark</w:t>
+        <w:t xml:space="preserve"> Bishop</w:t>
       </w:r>
     </w:p>
   </w:footnote>
@@ -13589,7 +13602,7 @@
           <w:sz w:val="20"/>
           <w:szCs w:val="20"/>
         </w:rPr>
-        <w:t xml:space="preserve"> Grupe &amp; Nitschke</w:t>
+        <w:t xml:space="preserve"> Beck &amp; Clark</w:t>
       </w:r>
     </w:p>
   </w:footnote>
@@ -13610,7 +13623,7 @@
           <w:sz w:val="20"/>
           <w:szCs w:val="20"/>
         </w:rPr>
-        <w:t xml:space="preserve"> Eysenck et al.</w:t>
+        <w:t xml:space="preserve"> Grupe &amp; Nitschke</w:t>
       </w:r>
     </w:p>
   </w:footnote>
@@ -13631,7 +13644,7 @@
           <w:sz w:val="20"/>
           <w:szCs w:val="20"/>
         </w:rPr>
-        <w:t xml:space="preserve"> Baddeley, Eysenck, &amp; Anderson</w:t>
+        <w:t xml:space="preserve"> Eysenck et al.</w:t>
       </w:r>
     </w:p>
   </w:footnote>
@@ -13652,7 +13665,7 @@
           <w:sz w:val="20"/>
           <w:szCs w:val="20"/>
         </w:rPr>
-        <w:t xml:space="preserve"> Young et al.</w:t>
+        <w:t xml:space="preserve"> Baddeley, Eysenck, &amp; Anderson</w:t>
       </w:r>
     </w:p>
   </w:footnote>
@@ -13673,7 +13686,7 @@
           <w:sz w:val="20"/>
           <w:szCs w:val="20"/>
         </w:rPr>
-        <w:t xml:space="preserve"> Arntz &amp; Jacob</w:t>
+        <w:t xml:space="preserve"> Young et al.</w:t>
       </w:r>
     </w:p>
   </w:footnote>
@@ -13694,7 +13707,7 @@
           <w:sz w:val="20"/>
           <w:szCs w:val="20"/>
         </w:rPr>
-        <w:t xml:space="preserve"> Shorey et al.</w:t>
+        <w:t xml:space="preserve"> Arntz &amp; Jacob</w:t>
       </w:r>
     </w:p>
   </w:footnote>
@@ -13715,7 +13728,7 @@
           <w:sz w:val="20"/>
           <w:szCs w:val="20"/>
         </w:rPr>
-        <w:t xml:space="preserve"> Lindberg et al.</w:t>
+        <w:t xml:space="preserve"> Shorey et al.</w:t>
       </w:r>
     </w:p>
   </w:footnote>
@@ -13736,7 +13749,7 @@
           <w:sz w:val="20"/>
           <w:szCs w:val="20"/>
         </w:rPr>
-        <w:t xml:space="preserve"> Baker &amp; Nofsinger</w:t>
+        <w:t xml:space="preserve"> Lindberg et al.</w:t>
       </w:r>
     </w:p>
   </w:footnote>
@@ -13757,7 +13770,7 @@
           <w:sz w:val="20"/>
           <w:szCs w:val="20"/>
         </w:rPr>
-        <w:t xml:space="preserve"> Barber &amp; Odean</w:t>
+        <w:t xml:space="preserve"> Baker &amp; Nofsinger</w:t>
       </w:r>
     </w:p>
   </w:footnote>
@@ -13778,7 +13791,7 @@
           <w:sz w:val="20"/>
           <w:szCs w:val="20"/>
         </w:rPr>
-        <w:t xml:space="preserve"> Shefrin &amp; Statman</w:t>
+        <w:t xml:space="preserve"> Barber &amp; Odean</w:t>
       </w:r>
     </w:p>
   </w:footnote>
@@ -13799,7 +13812,7 @@
           <w:sz w:val="20"/>
           <w:szCs w:val="20"/>
         </w:rPr>
-        <w:t xml:space="preserve"> Goetzmann &amp; Kumar</w:t>
+        <w:t xml:space="preserve"> Shefrin &amp; Statman</w:t>
       </w:r>
     </w:p>
   </w:footnote>
@@ -13820,7 +13833,7 @@
           <w:sz w:val="20"/>
           <w:szCs w:val="20"/>
         </w:rPr>
-        <w:t xml:space="preserve"> Zuckerman</w:t>
+        <w:t xml:space="preserve"> Goetzmann &amp; Kumar</w:t>
       </w:r>
     </w:p>
   </w:footnote>
@@ -13841,7 +13854,7 @@
           <w:sz w:val="20"/>
           <w:szCs w:val="20"/>
         </w:rPr>
-        <w:t xml:space="preserve"> Lauriola &amp; Levin</w:t>
+        <w:t xml:space="preserve"> Zuckerman</w:t>
       </w:r>
     </w:p>
   </w:footnote>
@@ -13862,7 +13875,7 @@
           <w:sz w:val="20"/>
           <w:szCs w:val="20"/>
         </w:rPr>
-        <w:t xml:space="preserve"> Fenton-O'Creevy et al., 2012</w:t>
+        <w:t xml:space="preserve"> Lauriola &amp; Levin</w:t>
       </w:r>
     </w:p>
   </w:footnote>
@@ -13883,7 +13896,7 @@
           <w:sz w:val="20"/>
           <w:szCs w:val="20"/>
         </w:rPr>
-        <w:t xml:space="preserve"> Maner &amp; Schmidt</w:t>
+        <w:t xml:space="preserve"> Fenton-O'Creevy et al., 2012</w:t>
       </w:r>
     </w:p>
   </w:footnote>
@@ -13904,7 +13917,7 @@
           <w:sz w:val="20"/>
           <w:szCs w:val="20"/>
         </w:rPr>
-        <w:t xml:space="preserve"> Young, Klosko, &amp; Weishaar</w:t>
+        <w:t xml:space="preserve"> Maner &amp; Schmidt</w:t>
       </w:r>
     </w:p>
   </w:footnote>
@@ -13925,7 +13938,7 @@
           <w:sz w:val="20"/>
           <w:szCs w:val="20"/>
         </w:rPr>
-        <w:t xml:space="preserve"> Young</w:t>
+        <w:t xml:space="preserve"> Young, Klosko, &amp; Weishaar</w:t>
       </w:r>
     </w:p>
   </w:footnote>
@@ -13946,7 +13959,7 @@
           <w:sz w:val="20"/>
           <w:szCs w:val="20"/>
         </w:rPr>
-        <w:t xml:space="preserve"> Grable &amp; Lytton</w:t>
+        <w:t xml:space="preserve"> Young</w:t>
       </w:r>
     </w:p>
   </w:footnote>
@@ -13967,7 +13980,7 @@
           <w:sz w:val="20"/>
           <w:szCs w:val="20"/>
         </w:rPr>
-        <w:t xml:space="preserve"> Grable</w:t>
+        <w:t xml:space="preserve"> Grable &amp; Lytton</w:t>
       </w:r>
     </w:p>
   </w:footnote>
@@ -13988,7 +14001,7 @@
           <w:sz w:val="20"/>
           <w:szCs w:val="20"/>
         </w:rPr>
-        <w:t xml:space="preserve"> Baddeley et al.</w:t>
+        <w:t xml:space="preserve"> Grable</w:t>
       </w:r>
     </w:p>
   </w:footnote>
@@ -14009,7 +14022,7 @@
           <w:sz w:val="20"/>
           <w:szCs w:val="20"/>
         </w:rPr>
-        <w:t xml:space="preserve"> Barlow</w:t>
+        <w:t xml:space="preserve"> Baddeley et al.</w:t>
       </w:r>
     </w:p>
   </w:footnote>
@@ -14030,7 +14043,7 @@
           <w:sz w:val="20"/>
           <w:szCs w:val="20"/>
         </w:rPr>
-        <w:t xml:space="preserve"> Borkovec</w:t>
+        <w:t xml:space="preserve"> Barlow</w:t>
       </w:r>
     </w:p>
   </w:footnote>
@@ -14051,7 +14064,7 @@
           <w:sz w:val="20"/>
           <w:szCs w:val="20"/>
         </w:rPr>
-        <w:t xml:space="preserve"> Kaplan &amp; Sadock</w:t>
+        <w:t xml:space="preserve"> Borkovec</w:t>
       </w:r>
     </w:p>
   </w:footnote>
@@ -14072,7 +14085,7 @@
           <w:sz w:val="20"/>
           <w:szCs w:val="20"/>
         </w:rPr>
-        <w:t xml:space="preserve"> Mitte</w:t>
+        <w:t xml:space="preserve"> Kaplan &amp; Sadock</w:t>
       </w:r>
     </w:p>
   </w:footnote>
@@ -14093,7 +14106,7 @@
           <w:sz w:val="20"/>
           <w:szCs w:val="20"/>
         </w:rPr>
-        <w:t xml:space="preserve"> Hartley &amp; Phelps</w:t>
+        <w:t xml:space="preserve"> Mitte</w:t>
       </w:r>
     </w:p>
   </w:footnote>
@@ -14114,7 +14127,7 @@
           <w:sz w:val="20"/>
           <w:szCs w:val="20"/>
         </w:rPr>
-        <w:t xml:space="preserve"> American Psychiatric Association</w:t>
+        <w:t xml:space="preserve"> Hartley &amp; Phelps</w:t>
       </w:r>
     </w:p>
   </w:footnote>
@@ -14135,7 +14148,7 @@
           <w:sz w:val="20"/>
           <w:szCs w:val="20"/>
         </w:rPr>
-        <w:t xml:space="preserve"> Gambetti &amp; Giusberti</w:t>
+        <w:t xml:space="preserve"> American Psychiatric Association</w:t>
       </w:r>
     </w:p>
   </w:footnote>
@@ -14156,7 +14169,7 @@
           <w:sz w:val="20"/>
           <w:szCs w:val="20"/>
         </w:rPr>
-        <w:t xml:space="preserve"> Lo et al.</w:t>
+        <w:t xml:space="preserve"> Gambetti &amp; Giusberti</w:t>
       </w:r>
     </w:p>
   </w:footnote>
@@ -14177,7 +14190,7 @@
           <w:sz w:val="20"/>
           <w:szCs w:val="20"/>
         </w:rPr>
-        <w:t xml:space="preserve"> De Martino et al.</w:t>
+        <w:t xml:space="preserve"> Lo et al.</w:t>
       </w:r>
     </w:p>
   </w:footnote>
@@ -14198,7 +14211,7 @@
           <w:sz w:val="20"/>
           <w:szCs w:val="20"/>
         </w:rPr>
-        <w:t xml:space="preserve"> Kuhnen &amp; Chiao</w:t>
+        <w:t xml:space="preserve"> De Martino et al.</w:t>
       </w:r>
     </w:p>
   </w:footnote>
@@ -14219,7 +14232,7 @@
           <w:sz w:val="20"/>
           <w:szCs w:val="20"/>
         </w:rPr>
-        <w:t xml:space="preserve"> Sigmund Freud</w:t>
+        <w:t xml:space="preserve"> Kuhnen &amp; Chiao</w:t>
       </w:r>
     </w:p>
   </w:footnote>
@@ -14240,7 +14253,7 @@
           <w:sz w:val="20"/>
           <w:szCs w:val="20"/>
         </w:rPr>
-        <w:t xml:space="preserve"> Albert Ellis</w:t>
+        <w:t xml:space="preserve"> Sigmund Freud</w:t>
       </w:r>
     </w:p>
   </w:footnote>
@@ -14261,7 +14274,7 @@
           <w:sz w:val="20"/>
           <w:szCs w:val="20"/>
         </w:rPr>
-        <w:t xml:space="preserve"> Daniel, Hirshleifer, &amp; Subrahmanyam</w:t>
+        <w:t xml:space="preserve"> Albert Ellis</w:t>
       </w:r>
     </w:p>
   </w:footnote>
@@ -14282,7 +14295,7 @@
           <w:sz w:val="20"/>
           <w:szCs w:val="20"/>
         </w:rPr>
-        <w:t xml:space="preserve"> Rollo May</w:t>
+        <w:t xml:space="preserve"> Daniel, Hirshleifer, &amp; Subrahmanyam</w:t>
       </w:r>
     </w:p>
   </w:footnote>
@@ -14303,7 +14316,7 @@
           <w:sz w:val="20"/>
           <w:szCs w:val="20"/>
         </w:rPr>
-        <w:t xml:space="preserve"> Yalom</w:t>
+        <w:t xml:space="preserve"> Rollo May</w:t>
       </w:r>
     </w:p>
   </w:footnote>
@@ -14324,7 +14337,7 @@
           <w:sz w:val="20"/>
           <w:szCs w:val="20"/>
         </w:rPr>
-        <w:t xml:space="preserve"> Charles &amp; Kasilingam</w:t>
+        <w:t xml:space="preserve"> Yalom</w:t>
       </w:r>
     </w:p>
   </w:footnote>
@@ -14345,7 +14358,7 @@
           <w:sz w:val="20"/>
           <w:szCs w:val="20"/>
         </w:rPr>
-        <w:t xml:space="preserve"> An, Li, &amp; Wu</w:t>
+        <w:t xml:space="preserve"> Charles &amp; Kasilingam</w:t>
       </w:r>
     </w:p>
   </w:footnote>
@@ -14366,7 +14379,7 @@
           <w:sz w:val="20"/>
           <w:szCs w:val="20"/>
         </w:rPr>
-        <w:t xml:space="preserve"> Vieira et al.</w:t>
+        <w:t xml:space="preserve"> An, Li, &amp; Wu</w:t>
       </w:r>
     </w:p>
   </w:footnote>
@@ -14387,7 +14400,7 @@
           <w:sz w:val="20"/>
           <w:szCs w:val="20"/>
         </w:rPr>
-        <w:t xml:space="preserve"> Schmidt et al.</w:t>
+        <w:t xml:space="preserve"> Vieira et al.</w:t>
       </w:r>
     </w:p>
   </w:footnote>
@@ -14408,7 +14421,7 @@
           <w:sz w:val="20"/>
           <w:szCs w:val="20"/>
         </w:rPr>
-        <w:t xml:space="preserve"> Saggino et al.</w:t>
+        <w:t xml:space="preserve"> Schmidt et al.</w:t>
       </w:r>
     </w:p>
   </w:footnote>
@@ -14429,7 +14442,7 @@
           <w:sz w:val="20"/>
           <w:szCs w:val="20"/>
         </w:rPr>
-        <w:t xml:space="preserve"> Hayes</w:t>
+        <w:t xml:space="preserve"> Saggino et al.</w:t>
       </w:r>
     </w:p>
   </w:footnote>
@@ -14450,7 +14463,7 @@
           <w:sz w:val="20"/>
           <w:szCs w:val="20"/>
         </w:rPr>
-        <w:t xml:space="preserve"> Estévez et al.</w:t>
+        <w:t xml:space="preserve"> Hayes</w:t>
       </w:r>
     </w:p>
   </w:footnote>
@@ -14471,7 +14484,7 @@
           <w:sz w:val="20"/>
           <w:szCs w:val="20"/>
         </w:rPr>
-        <w:t xml:space="preserve"> Sedighi Arfaee et al.</w:t>
+        <w:t xml:space="preserve"> Estévez et al.</w:t>
       </w:r>
     </w:p>
   </w:footnote>
@@ -14492,7 +14505,7 @@
           <w:sz w:val="20"/>
           <w:szCs w:val="20"/>
         </w:rPr>
-        <w:t xml:space="preserve"> Arena et al.</w:t>
+        <w:t xml:space="preserve"> Sedighi Arfaee et al.</w:t>
       </w:r>
     </w:p>
   </w:footnote>
@@ -14513,7 +14526,7 @@
           <w:sz w:val="20"/>
           <w:szCs w:val="20"/>
         </w:rPr>
-        <w:t xml:space="preserve"> An et al.</w:t>
+        <w:t xml:space="preserve"> Arena et al.</w:t>
       </w:r>
     </w:p>
   </w:footnote>
@@ -14534,7 +14547,7 @@
           <w:sz w:val="20"/>
           <w:szCs w:val="20"/>
         </w:rPr>
-        <w:t xml:space="preserve"> Rehm et al.</w:t>
+        <w:t xml:space="preserve"> An et al.</w:t>
       </w:r>
     </w:p>
   </w:footnote>
@@ -14555,7 +14568,7 @@
           <w:sz w:val="20"/>
           <w:szCs w:val="20"/>
         </w:rPr>
-        <w:t xml:space="preserve"> Fenton-O'Creevy et al., 2011</w:t>
+        <w:t xml:space="preserve"> Rehm et al.</w:t>
       </w:r>
     </w:p>
   </w:footnote>
@@ -14576,7 +14589,7 @@
           <w:sz w:val="20"/>
           <w:szCs w:val="20"/>
         </w:rPr>
-        <w:t xml:space="preserve"> Halvorsen et al.</w:t>
+        <w:t xml:space="preserve"> Fenton-O'Creevy et al., 2011</w:t>
       </w:r>
     </w:p>
   </w:footnote>
@@ -14597,7 +14610,7 @@
           <w:sz w:val="20"/>
           <w:szCs w:val="20"/>
         </w:rPr>
-        <w:t xml:space="preserve"> Lo &amp; Repin</w:t>
+        <w:t xml:space="preserve"> Halvorsen et al.</w:t>
       </w:r>
     </w:p>
   </w:footnote>
@@ -14618,7 +14631,7 @@
           <w:sz w:val="20"/>
           <w:szCs w:val="20"/>
         </w:rPr>
-        <w:t xml:space="preserve"> Safitri et al.</w:t>
+        <w:t xml:space="preserve"> Lo &amp; Repin</w:t>
       </w:r>
     </w:p>
   </w:footnote>
@@ -14639,7 +14652,7 @@
           <w:sz w:val="20"/>
           <w:szCs w:val="20"/>
         </w:rPr>
-        <w:t xml:space="preserve"> Ololo et al.</w:t>
+        <w:t xml:space="preserve"> Safitri et al.</w:t>
       </w:r>
     </w:p>
   </w:footnote>
@@ -14660,11 +14673,32 @@
           <w:sz w:val="20"/>
           <w:szCs w:val="20"/>
         </w:rPr>
-        <w:t xml:space="preserve"> Kline</w:t>
+        <w:t xml:space="preserve"> Ololo et al.</w:t>
       </w:r>
     </w:p>
   </w:footnote>
   <w:footnote w:id="111">
+    <w:p>
+      <w:pPr>
+        <w:bidi w:val="0"/>
+      </w:pPr>
+      <w:r>
+        <w:rPr>
+          <w:vertAlign w:val="superscript"/>
+        </w:rPr>
+        <w:footnoteRef/>
+      </w:r>
+      <w:r>
+        <w:rPr>
+          <w:rFonts w:ascii="Times New Roman" w:hAnsi="Times New Roman" w:cs="Times New Roman"/>
+          <w:sz w:val="20"/>
+          <w:szCs w:val="20"/>
+        </w:rPr>
+        <w:t xml:space="preserve"> Kline</w:t>
+      </w:r>
+    </w:p>
+  </w:footnote>
+  <w:footnote w:id="112">
     <w:p>
       <w:pPr>
         <w:bidi w:val="0"/>
@@ -15135,10 +15169,10 @@
     <w:pPr>
       <w:keepNext/>
       <w:keepLines/>
+      <w:bidi w:val="1"/>
       <w:spacing w:before="240" w:after="60" w:lineRule="exact" w:line="580"/>
       <w:jc w:val="right"/>
       <w:outlineLvl w:val="1"/>
-      <w:bidi w:val="1"/>
     </w:pPr>
     <w:rPr>
       <w:rFonts w:ascii="Times New Roman" w:hAnsi="Times New Roman" w:cs="B Nazanin"/>
@@ -15161,10 +15195,10 @@
     <w:pPr>
       <w:keepNext/>
       <w:keepLines/>
+      <w:bidi w:val="1"/>
       <w:spacing w:before="180" w:after="40" w:lineRule="exact" w:line="580"/>
       <w:jc w:val="right"/>
       <w:outlineLvl w:val="2"/>
-      <w:bidi w:val="1"/>
     </w:pPr>
     <w:rPr>
       <w:rFonts w:ascii="Times New Roman" w:hAnsi="Times New Roman" w:cs="B Nazanin"/>

</xml_diff>

<commit_message>
fix: unify heading runs and fix english-term parentheses in headings
</commit_message>
<xml_diff>
--- a/output/final/thesis_ch1_to_ch3.docx
+++ b/output/final/thesis_ch1_to_ch3.docx
@@ -413,7 +413,7 @@
           <w:rtl/>
           <w:lang w:bidi="fa-IR"/>
         </w:rPr>
-        <w:t xml:space="preserve">[فهرست مطالب در </w:t>
+        <w:t xml:space="preserve">[فهرست مطالب در</w:t>
       </w:r>
       <w:r>
         <w:rPr>
@@ -422,17 +422,17 @@
           <w:szCs w:val="22"/>
           <w:lang w:val="en-US"/>
         </w:rPr>
-        <w:t xml:space="preserve">Word</w:t>
-      </w:r>
-      <w:r>
-        <w:rPr>
-          <w:rFonts w:ascii="B Nazanin" w:hAnsi="B Nazanin" w:cs="B Nazanin" w:hint="cs"/>
-          <w:sz w:val="24"/>
-          <w:szCs w:val="24"/>
-          <w:rtl/>
-          <w:lang w:bidi="fa-IR"/>
-        </w:rPr>
-        <w:t xml:space="preserve"> از مسیر </w:t>
+        <w:t xml:space="preserve"> Word </w:t>
+      </w:r>
+      <w:r>
+        <w:rPr>
+          <w:rFonts w:ascii="B Nazanin" w:hAnsi="B Nazanin" w:cs="B Nazanin" w:hint="cs"/>
+          <w:sz w:val="24"/>
+          <w:szCs w:val="24"/>
+          <w:rtl/>
+          <w:lang w:bidi="fa-IR"/>
+        </w:rPr>
+        <w:t xml:space="preserve">از مسیر</w:t>
       </w:r>
       <w:r>
         <w:rPr>
@@ -441,17 +441,17 @@
           <w:szCs w:val="22"/>
           <w:lang w:val="en-US"/>
         </w:rPr>
-        <w:t xml:space="preserve">References &gt; Table of Contents</w:t>
-      </w:r>
-      <w:r>
-        <w:rPr>
-          <w:rFonts w:ascii="B Nazanin" w:hAnsi="B Nazanin" w:cs="B Nazanin" w:hint="cs"/>
-          <w:sz w:val="24"/>
-          <w:szCs w:val="24"/>
-          <w:rtl/>
-          <w:lang w:bidi="fa-IR"/>
-        </w:rPr>
-        <w:t xml:space="preserve"> ساخته و به‌روزرسانی شود — با کلیک راست و </w:t>
+        <w:t xml:space="preserve"> References &gt; Table of Contents </w:t>
+      </w:r>
+      <w:r>
+        <w:rPr>
+          <w:rFonts w:ascii="B Nazanin" w:hAnsi="B Nazanin" w:cs="B Nazanin" w:hint="cs"/>
+          <w:sz w:val="24"/>
+          <w:szCs w:val="24"/>
+          <w:rtl/>
+          <w:lang w:bidi="fa-IR"/>
+        </w:rPr>
+        <w:t xml:space="preserve">ساخته و به‌روزرسانی شود — با کلیک راست و</w:t>
       </w:r>
       <w:r>
         <w:rPr>
@@ -460,7 +460,7 @@
           <w:szCs w:val="22"/>
           <w:lang w:val="en-US"/>
         </w:rPr>
-        <w:t xml:space="preserve">Update Field]</w:t>
+        <w:t xml:space="preserve"> Update Field]</w:t>
       </w:r>
       <w:r>
         <w:fldChar w:fldCharType="end"/>
@@ -504,7 +504,7 @@
           <w:rtl/>
           <w:lang w:bidi="fa-IR"/>
         </w:rPr>
-        <w:t xml:space="preserve">جدول ۲-۱. حوزه‌ها و طرحواره‌های ناسازگار اولیه در مدل یانگ — [شماره صفحه پس از صفحه‌بندی نهایی در </w:t>
+        <w:t xml:space="preserve">جدول ۲-۱. حوزه‌ها و طرحواره‌های ناسازگار اولیه در مدل یانگ — [شماره صفحه پس از صفحه‌بندی نهایی در</w:t>
       </w:r>
       <w:r>
         <w:rPr>
@@ -513,17 +513,17 @@
           <w:szCs w:val="24"/>
           <w:lang w:val="en-US"/>
         </w:rPr>
-        <w:t xml:space="preserve">Word</w:t>
-      </w:r>
-      <w:r>
-        <w:rPr>
-          <w:rFonts w:ascii="B Nazanin" w:hAnsi="B Nazanin" w:cs="B Nazanin" w:hint="cs"/>
-          <w:sz w:val="24"/>
-          <w:szCs w:val="24"/>
-          <w:rtl/>
-          <w:lang w:bidi="fa-IR"/>
-        </w:rPr>
-        <w:t xml:space="preserve"> تکمیل شود]</w:t>
+        <w:t xml:space="preserve"> Word </w:t>
+      </w:r>
+      <w:r>
+        <w:rPr>
+          <w:rFonts w:ascii="B Nazanin" w:hAnsi="B Nazanin" w:cs="B Nazanin" w:hint="cs"/>
+          <w:sz w:val="24"/>
+          <w:szCs w:val="24"/>
+          <w:rtl/>
+          <w:lang w:bidi="fa-IR"/>
+        </w:rPr>
+        <w:t xml:space="preserve">تکمیل شود]</w:t>
       </w:r>
     </w:p>
     <w:p>
@@ -540,7 +540,7 @@
           <w:rtl/>
           <w:lang w:bidi="fa-IR"/>
         </w:rPr>
-        <w:t xml:space="preserve">جدول ۳-۱. خلاصه ابزارهای پژوهش — [شماره صفحه پس از صفحه‌بندی نهایی در </w:t>
+        <w:t xml:space="preserve">جدول ۳-۱. خلاصه ابزارهای پژوهش — [شماره صفحه پس از صفحه‌بندی نهایی در</w:t>
       </w:r>
       <w:r>
         <w:rPr>
@@ -549,17 +549,17 @@
           <w:szCs w:val="24"/>
           <w:lang w:val="en-US"/>
         </w:rPr>
-        <w:t xml:space="preserve">Word</w:t>
-      </w:r>
-      <w:r>
-        <w:rPr>
-          <w:rFonts w:ascii="B Nazanin" w:hAnsi="B Nazanin" w:cs="B Nazanin" w:hint="cs"/>
-          <w:sz w:val="24"/>
-          <w:szCs w:val="24"/>
-          <w:rtl/>
-          <w:lang w:bidi="fa-IR"/>
-        </w:rPr>
-        <w:t xml:space="preserve"> تکمیل شود]</w:t>
+        <w:t xml:space="preserve"> Word </w:t>
+      </w:r>
+      <w:r>
+        <w:rPr>
+          <w:rFonts w:ascii="B Nazanin" w:hAnsi="B Nazanin" w:cs="B Nazanin" w:hint="cs"/>
+          <w:sz w:val="24"/>
+          <w:szCs w:val="24"/>
+          <w:rtl/>
+          <w:lang w:bidi="fa-IR"/>
+        </w:rPr>
+        <w:t xml:space="preserve">تکمیل شود]</w:t>
       </w:r>
     </w:p>
     <w:p>
@@ -600,7 +600,7 @@
           <w:rtl/>
           <w:lang w:bidi="fa-IR"/>
         </w:rPr>
-        <w:t xml:space="preserve">شکل ۲-۱. مدل مفهومی پژوهش — [شماره صفحه پس از صفحه‌بندی نهایی در </w:t>
+        <w:t xml:space="preserve">شکل ۲-۱. مدل مفهومی پژوهش — [شماره صفحه پس از صفحه‌بندی نهایی در</w:t>
       </w:r>
       <w:r>
         <w:rPr>
@@ -609,17 +609,17 @@
           <w:szCs w:val="24"/>
           <w:lang w:val="en-US"/>
         </w:rPr>
-        <w:t xml:space="preserve">Word</w:t>
-      </w:r>
-      <w:r>
-        <w:rPr>
-          <w:rFonts w:ascii="B Nazanin" w:hAnsi="B Nazanin" w:cs="B Nazanin" w:hint="cs"/>
-          <w:sz w:val="24"/>
-          <w:szCs w:val="24"/>
-          <w:rtl/>
-          <w:lang w:bidi="fa-IR"/>
-        </w:rPr>
-        <w:t xml:space="preserve"> تکمیل شود]</w:t>
+        <w:t xml:space="preserve"> Word </w:t>
+      </w:r>
+      <w:r>
+        <w:rPr>
+          <w:rFonts w:ascii="B Nazanin" w:hAnsi="B Nazanin" w:cs="B Nazanin" w:hint="cs"/>
+          <w:sz w:val="24"/>
+          <w:szCs w:val="24"/>
+          <w:rtl/>
+          <w:lang w:bidi="fa-IR"/>
+        </w:rPr>
+        <w:t xml:space="preserve">تکمیل شود]</w:t>
       </w:r>
     </w:p>
     <w:p>
@@ -3026,6 +3026,17 @@
         </w:rPr>
         <w:t xml:space="preserve">۱-۶-۱. اضطراب صفتی</w:t>
       </w:r>
+      <w:r>
+        <w:rPr>
+          <w:rFonts w:ascii="Times New Roman" w:hAnsi="Times New Roman" w:cs="Times New Roman"/>
+          <w:b/>
+          <w:bCs/>
+          <w:sz w:val="26"/>
+          <w:szCs w:val="26"/>
+          <w:lang w:val="en-US"/>
+        </w:rPr>
+        <w:t xml:space="preserve"> (Trait Anxiety)</w:t>
+      </w:r>
     </w:p>
     <w:p>
       <w:pPr>
@@ -3134,7 +3145,7 @@
           <w:rtl/>
           <w:lang w:bidi="fa-IR"/>
         </w:rPr>
-        <w:t xml:space="preserve"> در پژوهش حاضر، منظور از اضطراب صفتی، نمره‌ای است که آزمودنی از پاسخگویی به ۲۰ گویه بخش دوم فرم (</w:t>
+        <w:t xml:space="preserve"> در پژوهش حاضر، منظور از اضطراب صفتی، نمره‌ای است که آزمودنی از پاسخگویی به ۲۰ گویه بخش دوم فرم</w:t>
       </w:r>
       <w:r>
         <w:rPr>
@@ -3143,17 +3154,17 @@
           <w:szCs w:val="22"/>
           <w:lang w:val="en-US"/>
         </w:rPr>
-        <w:t xml:space="preserve">Y</w:t>
-      </w:r>
-      <w:r>
-        <w:rPr>
-          <w:rFonts w:ascii="B Nazanin" w:hAnsi="B Nazanin" w:cs="B Nazanin" w:hint="cs"/>
-          <w:sz w:val="24"/>
-          <w:szCs w:val="24"/>
-          <w:rtl/>
-          <w:lang w:bidi="fa-IR"/>
-        </w:rPr>
-        <w:t xml:space="preserve">-2) پرسشنامه استاندارد اضطراب حالت-صفت اسپیلبرگر </w:t>
+        <w:t xml:space="preserve"> (Y-2) </w:t>
+      </w:r>
+      <w:r>
+        <w:rPr>
+          <w:rFonts w:ascii="B Nazanin" w:hAnsi="B Nazanin" w:cs="B Nazanin" w:hint="cs"/>
+          <w:sz w:val="24"/>
+          <w:szCs w:val="24"/>
+          <w:rtl/>
+          <w:lang w:bidi="fa-IR"/>
+        </w:rPr>
+        <w:t xml:space="preserve">پرسشنامه استاندارد اضطراب حالت-صفت اسپیلبرگر </w:t>
       </w:r>
       <w:r>
         <w:rPr>
@@ -3192,153 +3203,175 @@
         </w:rPr>
         <w:t xml:space="preserve">۱-۶-۲. طرحواره‌های ناسازگار اولیه</w:t>
       </w:r>
-    </w:p>
-    <w:p>
-      <w:pPr>
-        <w:bidi w:val="1"/>
-        <w:spacing w:lineRule="exact" w:line="580" w:after="0"/>
-        <w:jc w:val="both"/>
-      </w:pPr>
-      <w:r>
-        <w:rPr>
-          <w:rFonts w:ascii="B Nazanin" w:hAnsi="B Nazanin" w:cs="B Nazanin" w:hint="cs"/>
-          <w:b/>
-          <w:bCs/>
-          <w:sz w:val="24"/>
-          <w:szCs w:val="24"/>
-          <w:rtl/>
-          <w:lang w:bidi="fa-IR"/>
-        </w:rPr>
-        <w:t xml:space="preserve">تعریف نظری:</w:t>
-      </w:r>
-      <w:r>
-        <w:rPr>
-          <w:rFonts w:ascii="B Nazanin" w:hAnsi="B Nazanin" w:cs="B Nazanin" w:hint="cs"/>
-          <w:sz w:val="24"/>
-          <w:szCs w:val="24"/>
-          <w:rtl/>
-          <w:lang w:bidi="fa-IR"/>
-        </w:rPr>
-        <w:t xml:space="preserve"> طرحواره‌های ناسازگار اولیه، الگوهای هیجانی و شناختی عمیق، فراگیر و خود-آسیب‌رسانی هستند که در دوران کودکی یا نوجوانی شکل گرفته و در سراسر زندگی فرد تداوم می‌یابند. این الگوها که از خاطرات، هیجانات، شناخت‌واره‌ها و احساسات بدنی تشکیل شده‌اند، باورهای بنیادین و ناکارآمدی درباره خود و رابطه با دیگران هستند که از ناکامی در ارضای نیازهای هیجانی اساسی (مانند امنیت و دلبستگی) نشأت می‌گیرند (یانگ، کلوسکو و ویشار</w:t>
-      </w:r>
-      <w:r>
-        <w:rPr>
-          <w:rFonts w:ascii="B Nazanin" w:hAnsi="B Nazanin" w:cs="B Nazanin" w:hint="cs"/>
-          <w:vertAlign w:val="superscript"/>
-          <w:rtl/>
-        </w:rPr>
-        <w:footnoteReference w:id="75"/>
-      </w:r>
-      <w:r>
-        <w:rPr>
-          <w:rFonts w:ascii="B Nazanin" w:hAnsi="B Nazanin" w:cs="B Nazanin" w:hint="cs"/>
-          <w:sz w:val="24"/>
-          <w:szCs w:val="24"/>
-          <w:rtl/>
-          <w:lang w:bidi="fa-IR"/>
-        </w:rPr>
-        <w:t xml:space="preserve">، ۲۰۰۳).</w:t>
-      </w:r>
-    </w:p>
-    <w:p>
-      <w:pPr>
-        <w:bidi w:val="1"/>
-        <w:spacing w:lineRule="exact" w:line="580" w:after="0"/>
-        <w:jc w:val="both"/>
-      </w:pPr>
-      <w:r>
-        <w:rPr>
-          <w:rFonts w:ascii="B Nazanin" w:hAnsi="B Nazanin" w:cs="B Nazanin" w:hint="cs"/>
-          <w:sz w:val="24"/>
-          <w:szCs w:val="24"/>
-          <w:rtl/>
-          <w:lang w:bidi="fa-IR"/>
-        </w:rPr>
-        <w:t xml:space="preserve">طرحواره‌های ناسازگار اولیه در حوزه‌هایی سازمان می‌یابند که هسته مشترک آن‌ها ناکامی در ارضای نیازهای هیجانی بنیادین است؛ نیاز هایی مانند امنیت، دلبستگی، خودمختاری، پذیرش و محبت که هرگاه در محیط خانواده به طور مزمن برآورده نشوند، زمینه‌ساز شکل‌گیری طرحواره‌ها در حوزه‌هایی نظیر «بریدگی و طرد» و «محدودیت‌های مختل» می‌شوند (یانگ و همکاران، ۲۰۰۳). این طرحواره‌ها در بیشتر افراد، در حالت خفته باقی می‌مانند و در مواجهه با موقعیت‌های فعال‌ساز — به ویژه موقعیت‌های استرس‌زا و پرفشار — فعال می‌شوند؛ فعال‌سازی‌ای که ادراک، تفسیر و حافظه فرد از موقعیت را رنگ‌آمیزی کرده و رفتار او را جهت می‌دهد (آرنتز و جیکوب، ۲۰۱۲). در بافت معامله‌گری، یک زیان مالی یا نوسان شدید می‌تواند نقش چنین فعال‌سازی را ایفا کند و به جای واکنش متوازن، واکنش‌های هیجانی و رفتاری طرحواره‌محور را برانگیزد.</w:t>
-      </w:r>
-    </w:p>
-    <w:p>
-      <w:pPr>
-        <w:bidi w:val="1"/>
-        <w:spacing w:lineRule="exact" w:line="580" w:after="0"/>
-        <w:jc w:val="both"/>
-      </w:pPr>
-      <w:r>
-        <w:rPr>
-          <w:rFonts w:ascii="B Nazanin" w:hAnsi="B Nazanin" w:cs="B Nazanin" w:hint="cs"/>
-          <w:b/>
-          <w:bCs/>
-          <w:sz w:val="24"/>
-          <w:szCs w:val="24"/>
-          <w:rtl/>
-          <w:lang w:bidi="fa-IR"/>
-        </w:rPr>
-        <w:t xml:space="preserve">تعریف عملیاتی:</w:t>
-      </w:r>
-      <w:r>
-        <w:rPr>
-          <w:rFonts w:ascii="B Nazanin" w:hAnsi="B Nazanin" w:cs="B Nazanin" w:hint="cs"/>
-          <w:sz w:val="24"/>
-          <w:szCs w:val="24"/>
-          <w:rtl/>
-          <w:lang w:bidi="fa-IR"/>
-        </w:rPr>
-        <w:t xml:space="preserve"> در این پژوهش، منظور از طرحواره‌های ناسازگار اولیه، نمره‌ای است که آزمودنی از پرسشنامه طرحواره یانگ-فرم کوتاه </w:t>
-      </w:r>
-      <w:r>
-        <w:rPr>
-          <w:rFonts w:ascii="B Nazanin" w:hAnsi="B Nazanin" w:cs="B Nazanin" w:hint="cs"/>
-          <w:vertAlign w:val="superscript"/>
-          <w:rtl/>
-        </w:rPr>
-        <w:footnoteReference w:id="15"/>
-      </w:r>
-      <w:r>
-        <w:rPr>
-          <w:rFonts w:ascii="B Nazanin" w:hAnsi="B Nazanin" w:cs="B Nazanin" w:hint="cs"/>
-          <w:sz w:val="24"/>
-          <w:szCs w:val="24"/>
-          <w:rtl/>
-          <w:lang w:bidi="fa-IR"/>
-        </w:rPr>
-        <w:t xml:space="preserve"> که دارای ۷۵ گویه و ۱۵ خرده‌مقیاس است، به دست می‌آورد. نمره‌گذاری گویه‌ها بر اساس مقیاس ۶ درجه‌ای لیکرت (از ۱=کاملاً درباره من نادرست است تا ۶=کاملاً مرا توصیف می‌کند) انجام می‌شود؛ برای هر طرحواره نمره‌ای بین ۵ تا ۳۰ به دست می‌آید و نمره بالاتر، نشان‌دهنده شدت بیشتر آن طرحواره است (یانگ</w:t>
-      </w:r>
-      <w:r>
-        <w:rPr>
-          <w:rFonts w:ascii="B Nazanin" w:hAnsi="B Nazanin" w:cs="B Nazanin" w:hint="cs"/>
-          <w:vertAlign w:val="superscript"/>
-          <w:rtl/>
-        </w:rPr>
-        <w:footnoteReference w:id="76"/>
-      </w:r>
-      <w:r>
-        <w:rPr>
-          <w:rFonts w:ascii="B Nazanin" w:hAnsi="B Nazanin" w:cs="B Nazanin" w:hint="cs"/>
-          <w:sz w:val="24"/>
-          <w:szCs w:val="24"/>
-          <w:rtl/>
-          <w:lang w:bidi="fa-IR"/>
-        </w:rPr>
-        <w:t xml:space="preserve">، ۱۹۹۸). پایایی نسخه فارسی این پرسشنامه در پژوهش یوسفی (۱۳۹۶) با ضرایب آلفای ۰٫۶۸ تا ۰٫۸۵ برای خرده‌مقیاس‌ها گزارش شده و روایی سازه آن در نمونه غیربالینی قابل قبول بوده است (یوسفی، ۱۳۹۶).</w:t>
-      </w:r>
-    </w:p>
-    <w:p>
-      <w:pPr>
-        <w:pStyle w:val="Heading3"/>
-        <w:bidi w:val="1"/>
-        <w:jc w:val="right"/>
-      </w:pPr>
-      <w:r>
-        <w:rPr>
-          <w:rFonts w:ascii="B Nazanin" w:hAnsi="B Nazanin" w:cs="B Nazanin" w:hint="cs"/>
+      <w:r>
+        <w:rPr>
+          <w:rFonts w:ascii="Times New Roman" w:hAnsi="Times New Roman" w:cs="Times New Roman"/>
           <w:b/>
           <w:bCs/>
           <w:sz w:val="26"/>
           <w:szCs w:val="26"/>
+          <w:lang w:val="en-US"/>
+        </w:rPr>
+        <w:t xml:space="preserve"> (Early Maladaptive Schemas)</w:t>
+      </w:r>
+    </w:p>
+    <w:p>
+      <w:pPr>
+        <w:bidi w:val="1"/>
+        <w:spacing w:lineRule="exact" w:line="580" w:after="0"/>
+        <w:jc w:val="both"/>
+      </w:pPr>
+      <w:r>
+        <w:rPr>
+          <w:rFonts w:ascii="B Nazanin" w:hAnsi="B Nazanin" w:cs="B Nazanin" w:hint="cs"/>
+          <w:b/>
+          <w:bCs/>
+          <w:sz w:val="24"/>
+          <w:szCs w:val="24"/>
+          <w:rtl/>
+          <w:lang w:bidi="fa-IR"/>
+        </w:rPr>
+        <w:t xml:space="preserve">تعریف نظری:</w:t>
+      </w:r>
+      <w:r>
+        <w:rPr>
+          <w:rFonts w:ascii="B Nazanin" w:hAnsi="B Nazanin" w:cs="B Nazanin" w:hint="cs"/>
+          <w:sz w:val="24"/>
+          <w:szCs w:val="24"/>
+          <w:rtl/>
+          <w:lang w:bidi="fa-IR"/>
+        </w:rPr>
+        <w:t xml:space="preserve"> طرحواره‌های ناسازگار اولیه، الگوهای هیجانی و شناختی عمیق، فراگیر و خود-آسیب‌رسانی هستند که در دوران کودکی یا نوجوانی شکل گرفته و در سراسر زندگی فرد تداوم می‌یابند. این الگوها که از خاطرات، هیجانات، شناخت‌واره‌ها و احساسات بدنی تشکیل شده‌اند، باورهای بنیادین و ناکارآمدی درباره خود و رابطه با دیگران هستند که از ناکامی در ارضای نیازهای هیجانی اساسی (مانند امنیت و دلبستگی) نشأت می‌گیرند (یانگ، کلوسکو و ویشار</w:t>
+      </w:r>
+      <w:r>
+        <w:rPr>
+          <w:rFonts w:ascii="B Nazanin" w:hAnsi="B Nazanin" w:cs="B Nazanin" w:hint="cs"/>
+          <w:vertAlign w:val="superscript"/>
+          <w:rtl/>
+        </w:rPr>
+        <w:footnoteReference w:id="75"/>
+      </w:r>
+      <w:r>
+        <w:rPr>
+          <w:rFonts w:ascii="B Nazanin" w:hAnsi="B Nazanin" w:cs="B Nazanin" w:hint="cs"/>
+          <w:sz w:val="24"/>
+          <w:szCs w:val="24"/>
+          <w:rtl/>
+          <w:lang w:bidi="fa-IR"/>
+        </w:rPr>
+        <w:t xml:space="preserve">، ۲۰۰۳).</w:t>
+      </w:r>
+    </w:p>
+    <w:p>
+      <w:pPr>
+        <w:bidi w:val="1"/>
+        <w:spacing w:lineRule="exact" w:line="580" w:after="0"/>
+        <w:jc w:val="both"/>
+      </w:pPr>
+      <w:r>
+        <w:rPr>
+          <w:rFonts w:ascii="B Nazanin" w:hAnsi="B Nazanin" w:cs="B Nazanin" w:hint="cs"/>
+          <w:sz w:val="24"/>
+          <w:szCs w:val="24"/>
+          <w:rtl/>
+          <w:lang w:bidi="fa-IR"/>
+        </w:rPr>
+        <w:t xml:space="preserve">طرحواره‌های ناسازگار اولیه در حوزه‌هایی سازمان می‌یابند که هسته مشترک آن‌ها ناکامی در ارضای نیازهای هیجانی بنیادین است؛ نیاز هایی مانند امنیت، دلبستگی، خودمختاری، پذیرش و محبت که هرگاه در محیط خانواده به طور مزمن برآورده نشوند، زمینه‌ساز شکل‌گیری طرحواره‌ها در حوزه‌هایی نظیر «بریدگی و طرد» و «محدودیت‌های مختل» می‌شوند (یانگ و همکاران، ۲۰۰۳). این طرحواره‌ها در بیشتر افراد، در حالت خفته باقی می‌مانند و در مواجهه با موقعیت‌های فعال‌ساز — به ویژه موقعیت‌های استرس‌زا و پرفشار — فعال می‌شوند؛ فعال‌سازی‌ای که ادراک، تفسیر و حافظه فرد از موقعیت را رنگ‌آمیزی کرده و رفتار او را جهت می‌دهد (آرنتز و جیکوب، ۲۰۱۲). در بافت معامله‌گری، یک زیان مالی یا نوسان شدید می‌تواند نقش چنین فعال‌سازی را ایفا کند و به جای واکنش متوازن، واکنش‌های هیجانی و رفتاری طرحواره‌محور را برانگیزد.</w:t>
+      </w:r>
+    </w:p>
+    <w:p>
+      <w:pPr>
+        <w:bidi w:val="1"/>
+        <w:spacing w:lineRule="exact" w:line="580" w:after="0"/>
+        <w:jc w:val="both"/>
+      </w:pPr>
+      <w:r>
+        <w:rPr>
+          <w:rFonts w:ascii="B Nazanin" w:hAnsi="B Nazanin" w:cs="B Nazanin" w:hint="cs"/>
+          <w:b/>
+          <w:bCs/>
+          <w:sz w:val="24"/>
+          <w:szCs w:val="24"/>
+          <w:rtl/>
+          <w:lang w:bidi="fa-IR"/>
+        </w:rPr>
+        <w:t xml:space="preserve">تعریف عملیاتی:</w:t>
+      </w:r>
+      <w:r>
+        <w:rPr>
+          <w:rFonts w:ascii="B Nazanin" w:hAnsi="B Nazanin" w:cs="B Nazanin" w:hint="cs"/>
+          <w:sz w:val="24"/>
+          <w:szCs w:val="24"/>
+          <w:rtl/>
+          <w:lang w:bidi="fa-IR"/>
+        </w:rPr>
+        <w:t xml:space="preserve"> در این پژوهش، منظور از طرحواره‌های ناسازگار اولیه، نمره‌ای است که آزمودنی از پرسشنامه طرحواره یانگ-فرم کوتاه </w:t>
+      </w:r>
+      <w:r>
+        <w:rPr>
+          <w:rFonts w:ascii="B Nazanin" w:hAnsi="B Nazanin" w:cs="B Nazanin" w:hint="cs"/>
+          <w:vertAlign w:val="superscript"/>
+          <w:rtl/>
+        </w:rPr>
+        <w:footnoteReference w:id="15"/>
+      </w:r>
+      <w:r>
+        <w:rPr>
+          <w:rFonts w:ascii="B Nazanin" w:hAnsi="B Nazanin" w:cs="B Nazanin" w:hint="cs"/>
+          <w:sz w:val="24"/>
+          <w:szCs w:val="24"/>
+          <w:rtl/>
+          <w:lang w:bidi="fa-IR"/>
+        </w:rPr>
+        <w:t xml:space="preserve"> که دارای ۷۵ گویه و ۱۵ خرده‌مقیاس است، به دست می‌آورد. نمره‌گذاری گویه‌ها بر اساس مقیاس ۶ درجه‌ای لیکرت (از ۱=کاملاً درباره من نادرست است تا ۶=کاملاً مرا توصیف می‌کند) انجام می‌شود؛ برای هر طرحواره نمره‌ای بین ۵ تا ۳۰ به دست می‌آید و نمره بالاتر، نشان‌دهنده شدت بیشتر آن طرحواره است (یانگ</w:t>
+      </w:r>
+      <w:r>
+        <w:rPr>
+          <w:rFonts w:ascii="B Nazanin" w:hAnsi="B Nazanin" w:cs="B Nazanin" w:hint="cs"/>
+          <w:vertAlign w:val="superscript"/>
+          <w:rtl/>
+        </w:rPr>
+        <w:footnoteReference w:id="76"/>
+      </w:r>
+      <w:r>
+        <w:rPr>
+          <w:rFonts w:ascii="B Nazanin" w:hAnsi="B Nazanin" w:cs="B Nazanin" w:hint="cs"/>
+          <w:sz w:val="24"/>
+          <w:szCs w:val="24"/>
+          <w:rtl/>
+          <w:lang w:bidi="fa-IR"/>
+        </w:rPr>
+        <w:t xml:space="preserve">، ۱۹۹۸). پایایی نسخه فارسی این پرسشنامه در پژوهش یوسفی (۱۳۹۶) با ضرایب آلفای ۰٫۶۸ تا ۰٫۸۵ برای خرده‌مقیاس‌ها گزارش شده و روایی سازه آن در نمونه غیربالینی قابل قبول بوده است (یوسفی، ۱۳۹۶).</w:t>
+      </w:r>
+    </w:p>
+    <w:p>
+      <w:pPr>
+        <w:pStyle w:val="Heading3"/>
+        <w:bidi w:val="1"/>
+        <w:jc w:val="right"/>
+      </w:pPr>
+      <w:r>
+        <w:rPr>
+          <w:rFonts w:ascii="B Nazanin" w:hAnsi="B Nazanin" w:cs="B Nazanin" w:hint="cs"/>
+          <w:b/>
+          <w:bCs/>
+          <w:sz w:val="26"/>
+          <w:szCs w:val="26"/>
           <w:rtl/>
           <w:lang w:bidi="fa-IR"/>
         </w:rPr>
         <w:t xml:space="preserve">۱-۶-۳. رفتارهای مالی پرخطر</w:t>
+      </w:r>
+      <w:r>
+        <w:rPr>
+          <w:rFonts w:ascii="Times New Roman" w:hAnsi="Times New Roman" w:cs="Times New Roman"/>
+          <w:b/>
+          <w:bCs/>
+          <w:sz w:val="26"/>
+          <w:szCs w:val="26"/>
+          <w:lang w:val="en-US"/>
+        </w:rPr>
+        <w:t xml:space="preserve"> (High-Risk Financial Behaviors)</w:t>
       </w:r>
     </w:p>
     <w:p>
@@ -3756,7 +3789,7 @@
           <w:rtl/>
           <w:lang w:bidi="fa-IR"/>
         </w:rPr>
-        <w:t xml:space="preserve">این وضعیت عصب‌شناختی، منجر به شکل‌گیری یک «سوگیری توجهی» مشخص و نیرومند به سمت پردازش محرک‌های تهدیدآمیز می‌گردد؛ به این معنا که سیستم توجهی فرد به طور خودکار و سریع، بر روی هر گونه نشانه بالقوه خطر (مانند نوسان منفی قیمت یا اخبار بد اقتصادی) متمرکز شده و منابع شناختی را از پردازش سایر اطلاعات خنثی یا مثبت منحرف می‌کند. در نتیجه، فرد در یک حالت گوش‌به‌زنگی دائمی و آماده‌باش برای مقابله با خطر قرار می‌گیرد که اگرچه از نظر تکاملی برای بقا مفید است، اما در محیط پیچیده بازار مالی، به مانعی جدی برای تصمیم‌گیری عقلانی و بی‌طرفانه تبدیل می‌شود (بیشاپ، ۲۰۰۷(</w:t>
+        <w:t xml:space="preserve">این وضعیت عصب‌شناختی، منجر به شکل‌گیری یک «سوگیری توجهی» مشخص و نیرومند به سمت پردازش محرک‌های تهدیدآمیز می‌گردد؛ به این معنا که سیستم توجهی فرد به طور خودکار و سریع، بر روی هر گونه نشانه بالقوه خطر (مانند نوسان منفی قیمت یا اخبار بد اقتصادی) متمرکز شده و منابع شناختی را از پردازش سایر اطلاعات خنثی یا مثبت منحرف می‌کند. در نتیجه، فرد در یک حالت گوش‌به‌زنگی دائمی و آماده‌باش برای مقابله با خطر قرار می‌گیرد که اگرچه از نظر تکاملی برای بقا مفید است، اما در محیط پیچیده بازار مالی، به مانعی جدی برای تصمیم‌گیری عقلانی و بی‌طرفانه تبدیل می‌شود (بیشاپ، ۲۰۰۷)</w:t>
       </w:r>
     </w:p>
     <w:p>
@@ -3824,7 +3857,7 @@
           <w:rtl/>
           <w:lang w:bidi="fa-IR"/>
         </w:rPr>
-        <w:t xml:space="preserve">بر اساس این مدل، اضطراب تعادل میان دو سیستم اصلی توجه در مغز را برهم می‌زند: از یک سو، باعث افزایش نفوذ و غلبه سیستم توجهی «محرک-محور« (پایین-به-بالا) می‌شود؛ سیستمی که مسئول پایش محیط و واکنش سریع و خودکار به محرک‌های برجسته، ناگهانی و تهدیدآمیز است. و از سوی دیگر، موجب کاهش کارایی و تضعیف سیستم توجهی «هدف-محور« (بالا-به-پایین) می‌گردد؛ سیستمی ارادی و آگاهانه که مسئولیت تمرکز پایدار بر اهداف بلندمدت، برنامه‌ریزی استراتژیک و نادیده گرفتن عوامل مزاحم را بر عهده دارد. در نتیجه این عدم تعادل، فرد مضطرب به راحتی تسلیم حواس‌پرتی‌های محیطی شده و توانایی خود را برای حفظ تمرکز بر روی استراتژی اصلی و هدف نهایی از دست می‌دهد. (آیزنک و همکاران، ۲۰۰۷(</w:t>
+        <w:t xml:space="preserve">بر اساس این مدل، اضطراب تعادل میان دو سیستم اصلی توجه در مغز را برهم می‌زند: از یک سو، باعث افزایش نفوذ و غلبه سیستم توجهی «محرک-محور« (پایین-به-بالا) می‌شود؛ سیستمی که مسئول پایش محیط و واکنش سریع و خودکار به محرک‌های برجسته، ناگهانی و تهدیدآمیز است. و از سوی دیگر، موجب کاهش کارایی و تضعیف سیستم توجهی «هدف-محور« (بالا-به-پایین) می‌گردد؛ سیستمی ارادی و آگاهانه که مسئولیت تمرکز پایدار بر اهداف بلندمدت، برنامه‌ریزی استراتژیک و نادیده گرفتن عوامل مزاحم را بر عهده دارد. در نتیجه این عدم تعادل، فرد مضطرب به راحتی تسلیم حواس‌پرتی‌های محیطی شده و توانایی خود را برای حفظ تمرکز بر روی استراتژی اصلی و هدف نهایی از دست می‌دهد. (آیزنک و همکاران، ۲۰۰۷)</w:t>
       </w:r>
     </w:p>
     <w:p>
@@ -3928,7 +3961,7 @@
           <w:rtl/>
           <w:lang w:bidi="fa-IR"/>
         </w:rPr>
-        <w:t xml:space="preserve"> ریشه در کلمه لاتین </w:t>
+        <w:t xml:space="preserve"> ریشه در کلمه لاتین</w:t>
       </w:r>
       <w:r>
         <w:rPr>
@@ -3937,17 +3970,17 @@
           <w:szCs w:val="22"/>
           <w:lang w:val="en-US"/>
         </w:rPr>
-        <w:t xml:space="preserve">Angere</w:t>
-      </w:r>
-      <w:r>
-        <w:rPr>
-          <w:rFonts w:ascii="B Nazanin" w:hAnsi="B Nazanin" w:cs="B Nazanin" w:hint="cs"/>
-          <w:sz w:val="24"/>
-          <w:szCs w:val="24"/>
-          <w:rtl/>
-          <w:lang w:bidi="fa-IR"/>
-        </w:rPr>
-        <w:t xml:space="preserve"> به معنای «فشردن»، «منقبض کردن» یا «خفه کردن» دارد. این ریشه، توصیفی دقیق از تجربه جسمانی اضطراب است که اغلب با احساس فشار در قفسه سینه، تنگی نفس و یک حس ناخوشایند درونی همراه بوده و نشان‌دهنده ماهیت روان‌تنی این هیجان است (بارلو</w:t>
+        <w:t xml:space="preserve"> Angere </w:t>
+      </w:r>
+      <w:r>
+        <w:rPr>
+          <w:rFonts w:ascii="B Nazanin" w:hAnsi="B Nazanin" w:cs="B Nazanin" w:hint="cs"/>
+          <w:sz w:val="24"/>
+          <w:szCs w:val="24"/>
+          <w:rtl/>
+          <w:lang w:bidi="fa-IR"/>
+        </w:rPr>
+        <w:t xml:space="preserve">به معنای «فشردن»، «منقبض کردن» یا «خفه کردن» دارد. این ریشه، توصیفی دقیق از تجربه جسمانی اضطراب است که اغلب با احساس فشار در قفسه سینه، تنگی نفس و یک حس ناخوشایند درونی همراه بوده و نشان‌دهنده ماهیت روان‌تنی این هیجان است (بارلو</w:t>
       </w:r>
       <w:r>
         <w:rPr>
@@ -4109,6 +4142,25 @@
     </w:p>
     <w:p>
       <w:pPr>
+        <w:pStyle w:val="Heading4"/>
+        <w:bidi w:val="1"/>
+        <w:jc w:val="right"/>
+      </w:pPr>
+      <w:r>
+        <w:rPr>
+          <w:rFonts w:ascii="B Nazanin" w:hAnsi="B Nazanin" w:cs="B Nazanin" w:hint="cs"/>
+          <w:b/>
+          <w:bCs/>
+          <w:sz w:val="24"/>
+          <w:szCs w:val="24"/>
+          <w:rtl/>
+          <w:lang w:bidi="fa-IR"/>
+        </w:rPr>
+        <w:t xml:space="preserve">۲-۲-۱-۱ تمایزهای مفهومی کلیدی</w:t>
+      </w:r>
+    </w:p>
+    <w:p>
+      <w:pPr>
         <w:bidi w:val="1"/>
         <w:spacing w:lineRule="exact" w:line="580" w:after="0"/>
         <w:jc w:val="both"/>
@@ -4121,7 +4173,7 @@
           <w:rtl/>
           <w:lang w:bidi="fa-IR"/>
         </w:rPr>
-        <w:t xml:space="preserve">#### ۲-۲-۱-۱ تمایزهای مفهومی کلیدی</w:t>
+        <w:t xml:space="preserve">برای درک عمیق ماهیت اضطراب و نقش آن در رفتارهای پیچیده‌ای همچون تصمیم‌گیری مالی، لازم است ابتدا دو تمایز مفهومی بنیادین را روشن سازیم. اولین تمایز، تفاوت بین هیجان «ترس» و «اضطراب» است و دومین تمایز، مرزبندی بین «اضطراب بهنجار» و «اضطراب مرضی» است. این تفکیک‌ها، چارچوبی برای فهم این موضوع فراهم می‌آورند که چگونه یک واکنش هیجانی طبیعی می‌تواند به یک عامل مخرب و آسیب‌زا در عملکرد فرد، به ویژه در عرصه پرچالش معامله‌گری، تبدیل شود.</w:t>
       </w:r>
     </w:p>
     <w:p>
@@ -4133,12 +4185,14 @@
       <w:r>
         <w:rPr>
           <w:rFonts w:ascii="B Nazanin" w:hAnsi="B Nazanin" w:cs="B Nazanin" w:hint="cs"/>
-          <w:sz w:val="24"/>
-          <w:szCs w:val="24"/>
-          <w:rtl/>
-          <w:lang w:bidi="fa-IR"/>
-        </w:rPr>
-        <w:t xml:space="preserve">برای درک عمیق ماهیت اضطراب و نقش آن در رفتارهای پیچیده‌ای همچون تصمیم‌گیری مالی، لازم است ابتدا دو تمایز مفهومی بنیادین را روشن سازیم. اولین تمایز، تفاوت بین هیجان «ترس» و «اضطراب» است و دومین تمایز، مرزبندی بین «اضطراب بهنجار» و «اضطراب مرضی» است. این تفکیک‌ها، چارچوبی برای فهم این موضوع فراهم می‌آورند که چگونه یک واکنش هیجانی طبیعی می‌تواند به یک عامل مخرب و آسیب‌زا در عملکرد فرد، به ویژه در عرصه پرچالش معامله‌گری، تبدیل شود.</w:t>
+          <w:b/>
+          <w:bCs/>
+          <w:sz w:val="24"/>
+          <w:szCs w:val="24"/>
+          <w:rtl/>
+          <w:lang w:bidi="fa-IR"/>
+        </w:rPr>
+        <w:t xml:space="preserve">تفاوت ترس و اضطراب.</w:t>
       </w:r>
     </w:p>
     <w:p>
@@ -4150,14 +4204,30 @@
       <w:r>
         <w:rPr>
           <w:rFonts w:ascii="B Nazanin" w:hAnsi="B Nazanin" w:cs="B Nazanin" w:hint="cs"/>
-          <w:b/>
-          <w:bCs/>
-          <w:sz w:val="24"/>
-          <w:szCs w:val="24"/>
-          <w:rtl/>
-          <w:lang w:bidi="fa-IR"/>
-        </w:rPr>
-        <w:t xml:space="preserve">تفاوت ترس و اضطراب.</w:t>
+          <w:sz w:val="24"/>
+          <w:szCs w:val="24"/>
+          <w:rtl/>
+          <w:lang w:bidi="fa-IR"/>
+        </w:rPr>
+        <w:t xml:space="preserve">گرچه در زبان روزمره، واژگان ترس و اضطراب اغلب به جای یکدیگر به کار می‌روند، اما در روانشناسی، این دو، سازه‌هایی کاملاً متمایز با مدارهای عصبی متفاوت هستند. اصلی‌ترین تفاوت آن‌ها در منبع و زمان‌بندی تهدید ادراک‌شده نهفته است (بارلو، ۲۰۰۲؛ هارتلی و فلپس</w:t>
+      </w:r>
+      <w:r>
+        <w:rPr>
+          <w:rFonts w:ascii="B Nazanin" w:hAnsi="B Nazanin" w:cs="B Nazanin" w:hint="cs"/>
+          <w:vertAlign w:val="superscript"/>
+          <w:rtl/>
+        </w:rPr>
+        <w:footnoteReference w:id="84"/>
+      </w:r>
+      <w:r>
+        <w:rPr>
+          <w:rFonts w:ascii="B Nazanin" w:hAnsi="B Nazanin" w:cs="B Nazanin" w:hint="cs"/>
+          <w:sz w:val="24"/>
+          <w:szCs w:val="24"/>
+          <w:rtl/>
+          <w:lang w:bidi="fa-IR"/>
+        </w:rPr>
+        <w:t xml:space="preserve">، ۲۰۱۲).</w:t>
       </w:r>
     </w:p>
     <w:p>
@@ -4174,25 +4244,7 @@
           <w:rtl/>
           <w:lang w:bidi="fa-IR"/>
         </w:rPr>
-        <w:t xml:space="preserve">گرچه در زبان روزمره، واژگان ترس و اضطراب اغلب به جای یکدیگر به کار می‌روند، اما در روانشناسی، این دو، سازه‌هایی کاملاً متمایز با مدارهای عصبی متفاوت هستند. اصلی‌ترین تفاوت آن‌ها در منبع و زمان‌بندی تهدید ادراک‌شده نهفته است (بارلو، ۲۰۰۲؛ هارتلی و فلپس</w:t>
-      </w:r>
-      <w:r>
-        <w:rPr>
-          <w:rFonts w:ascii="B Nazanin" w:hAnsi="B Nazanin" w:cs="B Nazanin" w:hint="cs"/>
-          <w:vertAlign w:val="superscript"/>
-          <w:rtl/>
-        </w:rPr>
-        <w:footnoteReference w:id="84"/>
-      </w:r>
-      <w:r>
-        <w:rPr>
-          <w:rFonts w:ascii="B Nazanin" w:hAnsi="B Nazanin" w:cs="B Nazanin" w:hint="cs"/>
-          <w:sz w:val="24"/>
-          <w:szCs w:val="24"/>
-          <w:rtl/>
-          <w:lang w:bidi="fa-IR"/>
-        </w:rPr>
-        <w:t xml:space="preserve">، ۲۰۱۲).</w:t>
+        <w:t xml:space="preserve">منبع تهدید: ترس، واکنشی هیجانی به یک خطر مشخص، عینی و قریب‌الوقوع در زمان حال است. برای مثال، مواجهه با یک حیوان درنده یا مشاهده سقوط ناگهانی و شدید شاخص بورس، واکنش ترس را برمی‌انگیزد. در مقابل، اضطراب واکنشی به یک تهدید مبهم، درونی و معطوف به آینده است. معامله‌گری که نگران احتمال وقوع یک بحران مالی در ماه‌های آینده است یا از امکان شکست در معاملات بعدی خود هراسان است، در حال تجربه اضطراب است، نه ترس (گروپ و نیچکه، ۲۰۱۳). به عبارت دیگر، ترس پاسخی به یک خطر واقعی و حاضر است، در حالی که اضطراب پاسخی به یک «چه می‌شود اگر...» است.</w:t>
       </w:r>
     </w:p>
     <w:p>
@@ -4209,7 +4261,7 @@
           <w:rtl/>
           <w:lang w:bidi="fa-IR"/>
         </w:rPr>
-        <w:t xml:space="preserve">منبع تهدید: ترس، واکنشی هیجانی به یک خطر مشخص، عینی و قریب‌الوقوع در زمان حال است. برای مثال، مواجهه با یک حیوان درنده یا مشاهده سقوط ناگهانی و شدید شاخص بورس، واکنش ترس را برمی‌انگیزد. در مقابل، اضطراب واکنشی به یک تهدید مبهم، درونی و معطوف به آینده است. معامله‌گری که نگران احتمال وقوع یک بحران مالی در ماه‌های آینده است یا از امکان شکست در معاملات بعدی خود هراسان است، در حال تجربه اضطراب است، نه ترس (گروپ و نیچکه، ۲۰۱۳). به عبارت دیگر، ترس پاسخی به یک خطر واقعی و حاضر است، در حالی که اضطراب پاسخی به یک «چه می‌شود اگر...» است.</w:t>
+        <w:t xml:space="preserve">جهت‌گیری زمانی: این تفاوت در منبع، مستقیماً به جهت‌گیری زمانی این دو هیجان منجر می‌شود. ترس، یک هیجان حال-محور است که سیستم «جنگ یا گریز» را برای بقای فوری فعال می‌کند. اما اضطراب، یک حالت هیجانی آینده-محور است که فرد را در یک وضعیت «آماده‌باش و گوش‌به‌زنگی» مزمن برای مواجهه با خطرات احتمالی آینده قرار می‌دهد. این حالت گوش‌به‌زنگی، اگرچه می‌تواند سازگارانه باشد، اما در صورت تداوم، منابع شناختی فرد را به شدت تحلیل برده و او را مستعد سوگیری در پردازش اطلاعات می‌کند (بیشاپ، ۲۰۰۷).</w:t>
       </w:r>
     </w:p>
     <w:p>
@@ -4226,7 +4278,25 @@
           <w:rtl/>
           <w:lang w:bidi="fa-IR"/>
         </w:rPr>
-        <w:t xml:space="preserve">جهت‌گیری زمانی: این تفاوت در منبع، مستقیماً به جهت‌گیری زمانی این دو هیجان منجر می‌شود. ترس، یک هیجان حال-محور است که سیستم «جنگ یا گریز» را برای بقای فوری فعال می‌کند. اما اضطراب، یک حالت هیجانی آینده-محور است که فرد را در یک وضعیت «آماده‌باش و گوش‌به‌زنگی» مزمن برای مواجهه با خطرات احتمالی آینده قرار می‌دهد. این حالت گوش‌به‌زنگی، اگرچه می‌تواند سازگارانه باشد، اما در صورت تداوم، منابع شناختی فرد را به شدت تحلیل برده و او را مستعد سوگیری در پردازش اطلاعات می‌کند (بیشاپ، ۲۰۰۷).</w:t>
+        <w:t xml:space="preserve">مدار عصبی: از منظر عصب‌شناختی، ترس پاسخی سریع و خودکار است که عمدتاً توسط آمیگدال مدیریت می‌شود تا واکنش فوری برای بقا را ممکن سازد. در مقابل، اضطراب فرآیندی پیچیده‌تر است که شامل فعالیت پایدار در هسته بستر استریا ترمینالیس </w:t>
+      </w:r>
+      <w:r>
+        <w:rPr>
+          <w:rFonts w:ascii="B Nazanin" w:hAnsi="B Nazanin" w:cs="B Nazanin" w:hint="cs"/>
+          <w:vertAlign w:val="superscript"/>
+          <w:rtl/>
+        </w:rPr>
+        <w:footnoteReference w:id="20"/>
+      </w:r>
+      <w:r>
+        <w:rPr>
+          <w:rFonts w:ascii="B Nazanin" w:hAnsi="B Nazanin" w:cs="B Nazanin" w:hint="cs"/>
+          <w:sz w:val="24"/>
+          <w:szCs w:val="24"/>
+          <w:rtl/>
+          <w:lang w:bidi="fa-IR"/>
+        </w:rPr>
+        <w:t xml:space="preserve"> و تعامل گسترده با قشر پیش‌پیشانی (مرکز برنامه‌ریزی و تفکر انتزاعی) می‌شود (گروپ و نیچکه، ۲۰۱۳). این تمایز بسیار کلیدی است؛ زیرا نشان می‌دهد اضطراب، برخلاف ترس، به شدت با فرآیندهای شناختی عالی مانند قضاوت، تحلیل و پیش‌بینی گره خورده و به همین دلیل پتانسیل بالایی برای ایجاد سوگیری در این فرآیندها دارد..</w:t>
       </w:r>
     </w:p>
     <w:p>
@@ -4238,30 +4308,14 @@
       <w:r>
         <w:rPr>
           <w:rFonts w:ascii="B Nazanin" w:hAnsi="B Nazanin" w:cs="B Nazanin" w:hint="cs"/>
-          <w:sz w:val="24"/>
-          <w:szCs w:val="24"/>
-          <w:rtl/>
-          <w:lang w:bidi="fa-IR"/>
-        </w:rPr>
-        <w:t xml:space="preserve">مدار عصبی: از منظر عصب‌شناختی، ترس پاسخی سریع و خودکار است که عمدتاً توسط آمیگدال مدیریت می‌شود تا واکنش فوری برای بقا را ممکن سازد. در مقابل، اضطراب فرآیندی پیچیده‌تر است که شامل فعالیت پایدار در هسته بستر استریا ترمینالیس </w:t>
-      </w:r>
-      <w:r>
-        <w:rPr>
-          <w:rFonts w:ascii="B Nazanin" w:hAnsi="B Nazanin" w:cs="B Nazanin" w:hint="cs"/>
-          <w:vertAlign w:val="superscript"/>
-          <w:rtl/>
-        </w:rPr>
-        <w:footnoteReference w:id="20"/>
-      </w:r>
-      <w:r>
-        <w:rPr>
-          <w:rFonts w:ascii="B Nazanin" w:hAnsi="B Nazanin" w:cs="B Nazanin" w:hint="cs"/>
-          <w:sz w:val="24"/>
-          <w:szCs w:val="24"/>
-          <w:rtl/>
-          <w:lang w:bidi="fa-IR"/>
-        </w:rPr>
-        <w:t xml:space="preserve"> و تعامل گسترده با قشر پیش‌پیشانی (مرکز برنامه‌ریزی و تفکر انتزاعی) می‌شود (گروپ و نیچکه، ۲۰۱۳). این تمایز بسیار کلیدی است؛ زیرا نشان می‌دهد اضطراب، برخلاف ترس، به شدت با فرآیندهای شناختی عالی مانند قضاوت، تحلیل و پیش‌بینی گره خورده و به همین دلیل پتانسیل بالایی برای ایجاد سوگیری در این فرآیندها دارد..</w:t>
+          <w:b/>
+          <w:bCs/>
+          <w:sz w:val="24"/>
+          <w:szCs w:val="24"/>
+          <w:rtl/>
+          <w:lang w:bidi="fa-IR"/>
+        </w:rPr>
+        <w:t xml:space="preserve">تفاوت اضطراب بهنجار و مرضی.</w:t>
       </w:r>
     </w:p>
     <w:p>
@@ -4273,14 +4327,12 @@
       <w:r>
         <w:rPr>
           <w:rFonts w:ascii="B Nazanin" w:hAnsi="B Nazanin" w:cs="B Nazanin" w:hint="cs"/>
-          <w:b/>
-          <w:bCs/>
-          <w:sz w:val="24"/>
-          <w:szCs w:val="24"/>
-          <w:rtl/>
-          <w:lang w:bidi="fa-IR"/>
-        </w:rPr>
-        <w:t xml:space="preserve">تفاوت اضطراب بهنجار و مرضی.</w:t>
+          <w:sz w:val="24"/>
+          <w:szCs w:val="24"/>
+          <w:rtl/>
+          <w:lang w:bidi="fa-IR"/>
+        </w:rPr>
+        <w:t xml:space="preserve">اضطراب، به خودی خود، یک اختلال نیست؛ بلکه یک هیجان طبیعی و ضروری برای زندگی است. مرز بین اضطراب بهنجار (سازگارانه) و مرضی (ناسازگارانه) با سه معیار اصلی تعیین می‌شود: شدت، مدت و اختلال در عملکرد.</w:t>
       </w:r>
     </w:p>
     <w:p>
@@ -4297,7 +4349,7 @@
           <w:rtl/>
           <w:lang w:bidi="fa-IR"/>
         </w:rPr>
-        <w:t xml:space="preserve">اضطراب، به خودی خود، یک اختلال نیست؛ بلکه یک هیجان طبیعی و ضروری برای زندگی است. مرز بین اضطراب بهنجار (سازگارانه) و مرضی (ناسازگارانه) با سه معیار اصلی تعیین می‌شود: شدت، مدت و اختلال در عملکرد.</w:t>
+        <w:t xml:space="preserve">شدت و مدت: اضطراب بهنجار، واکنشی متناسب با موقعیت است و با برطرف شدن عامل تهدید، فروکش می‌کند. برای مثال، احساس دلهره پیش از یک ارائه مهم، کاملاً طبیعی است. اما اضطراب مرضی، واکنشی نامتناسب، شدید و طولانی‌مدت است. این حالت پایدار، نتیجه چیزی است که بارلو (۲۰۰۲) آن را «هشدار کاذب» می‌نامد؛ در این وضعیت، سیستم اضطراب بدن در غیاب یک تهدید واقعی فعال شده و فرد را در یک حالت برانگیختگی مزمن نگه می‌دارد.که حتی در غیاب یک محرک واقعی نیز ادامه می‌یابد. فردی که هفته‌ها پس از یک زیان کوچک در بازار، همچنان دچار بی‌خوابی و نگرانی فلج‌کننده است، اضطراب مرضی را تجربه می‌کند.</w:t>
       </w:r>
     </w:p>
     <w:p>
@@ -4314,7 +4366,80 @@
           <w:rtl/>
           <w:lang w:bidi="fa-IR"/>
         </w:rPr>
-        <w:t xml:space="preserve">شدت و مدت: اضطراب بهنجار، واکنشی متناسب با موقعیت است و با برطرف شدن عامل تهدید، فروکش می‌کند. برای مثال، احساس دلهره پیش از یک ارائه مهم، کاملاً طبیعی است. اما اضطراب مرضی، واکنشی نامتناسب، شدید و طولانی‌مدت است. این حالت پایدار، نتیجه چیزی است که بارلو (۲۰۰۲) آن را «هشدار کاذب» می‌نامد؛ در این وضعیت، سیستم اضطراب بدن در غیاب یک تهدید واقعی فعال شده و فرد را در یک حالت برانگیختگی مزمن نگه می‌دارد.که حتی در غیاب یک محرک واقعی نیز ادامه می‌یابد. فردی که هفته‌ها پس از یک زیان کوچک در بازار، همچنان دچار بی‌خوابی و نگرانی فلج‌کننده است، اضطراب مرضی را تجربه می‌کند.</w:t>
+        <w:t xml:space="preserve">اختلال در عملکرد: مهم‌ترین شاخص برای تمایز این دو، میزان تأثیر مخرب بر زندگی روزمره فرد است. اضطراب زمانی مرضی تلقی می‌شود که به طور معناداری عملکرد شغلی، تحصیلی یا اجتماعی فرد را مختل کند (انجمن روانپزشکی آمریکا</w:t>
+      </w:r>
+      <w:r>
+        <w:rPr>
+          <w:rFonts w:ascii="B Nazanin" w:hAnsi="B Nazanin" w:cs="B Nazanin" w:hint="cs"/>
+          <w:vertAlign w:val="superscript"/>
+          <w:rtl/>
+        </w:rPr>
+        <w:footnoteReference w:id="85"/>
+      </w:r>
+      <w:r>
+        <w:rPr>
+          <w:rFonts w:ascii="B Nazanin" w:hAnsi="B Nazanin" w:cs="B Nazanin" w:hint="cs"/>
+          <w:sz w:val="24"/>
+          <w:szCs w:val="24"/>
+          <w:rtl/>
+          <w:lang w:bidi="fa-IR"/>
+        </w:rPr>
+        <w:t xml:space="preserve">، ۲۰۱۳). برای یک معامله‌گر، این اختلال می‌تواند خود را به شکل «فلج تحلیلی» (ناتوانی درتمرکز و تصمیم‌گیری) (گامبتی و گیوسبرتی</w:t>
+      </w:r>
+      <w:r>
+        <w:rPr>
+          <w:rFonts w:ascii="B Nazanin" w:hAnsi="B Nazanin" w:cs="B Nazanin" w:hint="cs"/>
+          <w:vertAlign w:val="superscript"/>
+          <w:rtl/>
+        </w:rPr>
+        <w:footnoteReference w:id="86"/>
+      </w:r>
+      <w:r>
+        <w:rPr>
+          <w:rFonts w:ascii="B Nazanin" w:hAnsi="B Nazanin" w:cs="B Nazanin" w:hint="cs"/>
+          <w:sz w:val="24"/>
+          <w:szCs w:val="24"/>
+          <w:rtl/>
+          <w:lang w:bidi="fa-IR"/>
+        </w:rPr>
+        <w:t xml:space="preserve">، ۲۰۱۲).، «اجتناب از بازار» (ترس از انجام هرگونه معامله) یا برعکس(لو و همکاران</w:t>
+      </w:r>
+      <w:r>
+        <w:rPr>
+          <w:rFonts w:ascii="B Nazanin" w:hAnsi="B Nazanin" w:cs="B Nazanin" w:hint="cs"/>
+          <w:vertAlign w:val="superscript"/>
+          <w:rtl/>
+        </w:rPr>
+        <w:footnoteReference w:id="87"/>
+      </w:r>
+      <w:r>
+        <w:rPr>
+          <w:rFonts w:ascii="B Nazanin" w:hAnsi="B Nazanin" w:cs="B Nazanin" w:hint="cs"/>
+          <w:sz w:val="24"/>
+          <w:szCs w:val="24"/>
+          <w:rtl/>
+          <w:lang w:bidi="fa-IR"/>
+        </w:rPr>
+        <w:t xml:space="preserve">، ۲۰۰۵).، «رفتارهای تکانشی و پرخطر» (برای فرار از حس ناخوشایند اضطراب) نشان دهد. در واقع، اضطراب از یک «ابزار» مفید به یک «مانع» بزرگ در مسیر تصمیم‌گیری عقلانی تبدیل می‌شود.</w:t>
+      </w:r>
+    </w:p>
+    <w:p>
+      <w:pPr>
+        <w:pStyle w:val="Heading4"/>
+        <w:bidi w:val="1"/>
+        <w:jc w:val="right"/>
+      </w:pPr>
+      <w:r>
+        <w:rPr>
+          <w:rFonts w:ascii="B Nazanin" w:hAnsi="B Nazanin" w:cs="B Nazanin" w:hint="cs"/>
+          <w:b/>
+          <w:bCs/>
+          <w:sz w:val="24"/>
+          <w:szCs w:val="24"/>
+          <w:rtl/>
+          <w:lang w:bidi="fa-IR"/>
+        </w:rPr>
+        <w:t xml:space="preserve">۲-۲-۱-۲ مبانی زیست‌شناختی و عصب‌شناختی اضطراب</w:t>
       </w:r>
     </w:p>
     <w:p>
@@ -4331,61 +4456,7 @@
           <w:rtl/>
           <w:lang w:bidi="fa-IR"/>
         </w:rPr>
-        <w:t xml:space="preserve">اختلال در عملکرد: مهم‌ترین شاخص برای تمایز این دو، میزان تأثیر مخرب بر زندگی روزمره فرد است. اضطراب زمانی مرضی تلقی می‌شود که به طور معناداری عملکرد شغلی، تحصیلی یا اجتماعی فرد را مختل کند (انجمن روانپزشکی آمریکا</w:t>
-      </w:r>
-      <w:r>
-        <w:rPr>
-          <w:rFonts w:ascii="B Nazanin" w:hAnsi="B Nazanin" w:cs="B Nazanin" w:hint="cs"/>
-          <w:vertAlign w:val="superscript"/>
-          <w:rtl/>
-        </w:rPr>
-        <w:footnoteReference w:id="85"/>
-      </w:r>
-      <w:r>
-        <w:rPr>
-          <w:rFonts w:ascii="B Nazanin" w:hAnsi="B Nazanin" w:cs="B Nazanin" w:hint="cs"/>
-          <w:sz w:val="24"/>
-          <w:szCs w:val="24"/>
-          <w:rtl/>
-          <w:lang w:bidi="fa-IR"/>
-        </w:rPr>
-        <w:t xml:space="preserve">، ۲۰۱۳). برای یک معامله‌گر، این اختلال می‌تواند خود را به شکل «فلج تحلیلی» (ناتوانی درتمرکز و تصمیم‌گیری) (گامبتی و گیوسبرتی</w:t>
-      </w:r>
-      <w:r>
-        <w:rPr>
-          <w:rFonts w:ascii="B Nazanin" w:hAnsi="B Nazanin" w:cs="B Nazanin" w:hint="cs"/>
-          <w:vertAlign w:val="superscript"/>
-          <w:rtl/>
-        </w:rPr>
-        <w:footnoteReference w:id="86"/>
-      </w:r>
-      <w:r>
-        <w:rPr>
-          <w:rFonts w:ascii="B Nazanin" w:hAnsi="B Nazanin" w:cs="B Nazanin" w:hint="cs"/>
-          <w:sz w:val="24"/>
-          <w:szCs w:val="24"/>
-          <w:rtl/>
-          <w:lang w:bidi="fa-IR"/>
-        </w:rPr>
-        <w:t xml:space="preserve">، ۲۰۱۲).، «اجتناب از بازار» (ترس از انجام هرگونه معامله) یا برعکس(لو و همکاران</w:t>
-      </w:r>
-      <w:r>
-        <w:rPr>
-          <w:rFonts w:ascii="B Nazanin" w:hAnsi="B Nazanin" w:cs="B Nazanin" w:hint="cs"/>
-          <w:vertAlign w:val="superscript"/>
-          <w:rtl/>
-        </w:rPr>
-        <w:footnoteReference w:id="87"/>
-      </w:r>
-      <w:r>
-        <w:rPr>
-          <w:rFonts w:ascii="B Nazanin" w:hAnsi="B Nazanin" w:cs="B Nazanin" w:hint="cs"/>
-          <w:sz w:val="24"/>
-          <w:szCs w:val="24"/>
-          <w:rtl/>
-          <w:lang w:bidi="fa-IR"/>
-        </w:rPr>
-        <w:t xml:space="preserve">، ۲۰۰۵).، «رفتارهای تکانشی و پرخطر» (برای فرار از حس ناخوشایند اضطراب) نشان دهد. در واقع، اضطراب از یک «ابزار» مفید به یک «مانع» بزرگ در مسیر تصمیم‌گیری عقلانی تبدیل می‌شود.</w:t>
+        <w:t xml:space="preserve">دیدگاه‌های روانشناختی، چارچوبی برای فهم تجربه و تفسیر اضطراب فراهم می‌کنند، اما پیشرفت‌های چشمگیر در علوم اعصاب در دهه‌های اخیر، این امکان را فراهم آورده است که به «سخت‌افزار» بیولوژیک این هیجان بتوان نگاهی عمیق‌تر انداخت. درک مبانی زیست‌شناختی نشان می‌دهد که چرا برخی افراد به طور ذاتی مستعد اضطراب بیشتری هستند و چگونه این استعداد در سطح مدارهای مغزی، انتقال‌دهنده‌های عصبی و واکنش‌های فیزیولوژیک، به یک واقعیت ملموس تبدیل می‌شود.</w:t>
       </w:r>
     </w:p>
     <w:p>
@@ -4397,12 +4468,14 @@
       <w:r>
         <w:rPr>
           <w:rFonts w:ascii="B Nazanin" w:hAnsi="B Nazanin" w:cs="B Nazanin" w:hint="cs"/>
-          <w:sz w:val="24"/>
-          <w:szCs w:val="24"/>
-          <w:rtl/>
-          <w:lang w:bidi="fa-IR"/>
-        </w:rPr>
-        <w:t xml:space="preserve">#### ۲-۲-۱-۲ مبانی زیست‌شناختی و عصب‌شناختی اضطراب</w:t>
+          <w:b/>
+          <w:bCs/>
+          <w:sz w:val="24"/>
+          <w:szCs w:val="24"/>
+          <w:rtl/>
+          <w:lang w:bidi="fa-IR"/>
+        </w:rPr>
+        <w:t xml:space="preserve">ساختارهای مغزی درگیر در اضطراب.</w:t>
       </w:r>
     </w:p>
     <w:p>
@@ -4419,7 +4492,7 @@
           <w:rtl/>
           <w:lang w:bidi="fa-IR"/>
         </w:rPr>
-        <w:t xml:space="preserve">دیدگاه‌های روانشناختی، چارچوبی برای فهم تجربه و تفسیر اضطراب فراهم می‌کنند، اما پیشرفت‌های چشمگیر در علوم اعصاب در دهه‌های اخیر، این امکان را فراهم آورده است که به «سخت‌افزار» بیولوژیک این هیجان بتوان نگاهی عمیق‌تر انداخت. درک مبانی زیست‌شناختی نشان می‌دهد که چرا برخی افراد به طور ذاتی مستعد اضطراب بیشتری هستند و چگونه این استعداد در سطح مدارهای مغزی، انتقال‌دهنده‌های عصبی و واکنش‌های فیزیولوژیک، به یک واقعیت ملموس تبدیل می‌شود.</w:t>
+        <w:t xml:space="preserve">اضطراب محصول فعالیت یک بخش مجزا از مغز نیست، بلکه نتیجه تعامل پیچیده در شبکه‌ای از ساختارهای مغزی است که به آن «شبکه ترس» یا «شبکه اضطراب» می‌گویند. سه بخش کلیدی در این شبکه عبارتند از:</w:t>
       </w:r>
     </w:p>
     <w:p>
@@ -4431,14 +4504,12 @@
       <w:r>
         <w:rPr>
           <w:rFonts w:ascii="B Nazanin" w:hAnsi="B Nazanin" w:cs="B Nazanin" w:hint="cs"/>
-          <w:b/>
-          <w:bCs/>
-          <w:sz w:val="24"/>
-          <w:szCs w:val="24"/>
-          <w:rtl/>
-          <w:lang w:bidi="fa-IR"/>
-        </w:rPr>
-        <w:t xml:space="preserve">ساختارهای مغزی درگیر در اضطراب.</w:t>
+          <w:sz w:val="24"/>
+          <w:szCs w:val="24"/>
+          <w:rtl/>
+          <w:lang w:bidi="fa-IR"/>
+        </w:rPr>
+        <w:t xml:space="preserve">آمیگدال: این ساختار بادامی‌شکل در عمق لوب گیجگاهی، به عنوان «آژیر خطر» یا «سیستم تشخیص تهدید» مغز عمل می‌کند. آمیگدال به طور مداوم اطلاعات ورودی از حواس را برای یافتن نشانه‌های خطر اسکن کرده و قادر است پیش از آنکه اطلاعات به قشر مغز (مرکز تفکر آگاهانه) برسد، یک واکنش سریع و خودکار ترس را فعال کند (بیشاپ، ۲۰۰۷). در افراد با اضطراب صفتی بالا، آمیگدال بیش‌فعال است؛ یعنی آستانه تحریک آن پایین‌تر بوده و حتی به محرک‌های خنثی یا مبهم نیز به گونه‌ای واکنش نشان می‌دهد که گویی یک تهدید واقعی هستند. این پدیده توضیح می‌دهد چرا یک نوسان عادی در نمودار قیمت می‌تواند در یک معامله‌گر مضطرب، یک واکنش هیجانی شدید و آنی ایجاد کند.</w:t>
       </w:r>
     </w:p>
     <w:p>
@@ -4455,7 +4526,25 @@
           <w:rtl/>
           <w:lang w:bidi="fa-IR"/>
         </w:rPr>
-        <w:t xml:space="preserve">اضطراب محصول فعالیت یک بخش مجزا از مغز نیست، بلکه نتیجه تعامل پیچیده در شبکه‌ای از ساختارهای مغزی است که به آن «شبکه ترس» یا «شبکه اضطراب» می‌گویند. سه بخش کلیدی در این شبکه عبارتند از:</w:t>
+        <w:t xml:space="preserve">قشر پیش‌پیشانی: این بخش، که در جلوی مغز قرار دارد، «مدیرعامل» اجرایی مغز است و مسئول کارکردهایی نظیر برنامه‌ریزی، تصمیم‌گیری منطقی، کنترل تکانه و تنظیم هیجان است. یکی از وظایف اصلی قشر پیش‌پیشانی، اعمال کنترل «بالا به پایین» بر آمیگدال و تعدیل واکنش‌های هیجانی است. در یک مغز سالم، زمانی که آمیگدال سیگنال خطر را صادر می‌کند، قشر پیش‌پیشانی به سرعت موقعیت را ارزیابی کرده و در صورت غیرواقعی بودن تهدید، به آمیگدال دستور «آرام باش» می‌دهد. اما پژوهش‌های تصویربرداری عصبی نشان داده‌اند که در افراد مضطرب، این ارتباط دوطرفه مختل است؛ فعالیت بیش از حد آمیگدال، عملکرد قشر پیش‌پیشانی را «می‌رباید» و توانایی فرد برای تفکر منطقی و تنظیم هیجان را به شدت کاهش می‌دهد (هارتلی و فلپس، ۲۰۱۲؛ دی مارتینو و همکاران</w:t>
+      </w:r>
+      <w:r>
+        <w:rPr>
+          <w:rFonts w:ascii="B Nazanin" w:hAnsi="B Nazanin" w:cs="B Nazanin" w:hint="cs"/>
+          <w:vertAlign w:val="superscript"/>
+          <w:rtl/>
+        </w:rPr>
+        <w:footnoteReference w:id="88"/>
+      </w:r>
+      <w:r>
+        <w:rPr>
+          <w:rFonts w:ascii="B Nazanin" w:hAnsi="B Nazanin" w:cs="B Nazanin" w:hint="cs"/>
+          <w:sz w:val="24"/>
+          <w:szCs w:val="24"/>
+          <w:rtl/>
+          <w:lang w:bidi="fa-IR"/>
+        </w:rPr>
+        <w:t xml:space="preserve">، ۲۰۰۶).</w:t>
       </w:r>
     </w:p>
     <w:p>
@@ -4472,7 +4561,7 @@
           <w:rtl/>
           <w:lang w:bidi="fa-IR"/>
         </w:rPr>
-        <w:t xml:space="preserve">آمیگدال: این ساختار بادامی‌شکل در عمق لوب گیجگاهی، به عنوان «آژیر خطر» یا «سیستم تشخیص تهدید» مغز عمل می‌کند. آمیگدال به طور مداوم اطلاعات ورودی از حواس را برای یافتن نشانه‌های خطر اسکن کرده و قادر است پیش از آنکه اطلاعات به قشر مغز (مرکز تفکر آگاهانه) برسد، یک واکنش سریع و خودکار ترس را فعال کند (بیشاپ، ۲۰۰۷). در افراد با اضطراب صفتی بالا، آمیگدال بیش‌فعال است؛ یعنی آستانه تحریک آن پایین‌تر بوده و حتی به محرک‌های خنثی یا مبهم نیز به گونه‌ای واکنش نشان می‌دهد که گویی یک تهدید واقعی هستند. این پدیده توضیح می‌دهد چرا یک نوسان عادی در نمودار قیمت می‌تواند در یک معامله‌گر مضطرب، یک واکنش هیجانی شدید و آنی ایجاد کند.</w:t>
+        <w:t xml:space="preserve">هیپوکامپ: این ساختار که در مجاورت آمیگدال قرار دارد، نقشی کلیدی در شکل‌گیری و بازیابی حافظه، به ویژه حافظه مرتبط با زمینه (کانتکست) ایفا می‌کند. هیپوکامپ به مغز کمک می‌کند تا تشخیص دهد که یک محرک خاص در چه زمینه‌ای خطرناک و در چه زمینه‌ای ایمن است. اختلال در عملکرد هیپوکامپ می‌تواند منجر به «تعمیم بیش از حد ترس» شود؛ به این معنا که فرد اضطراب آموخته‌شده در یک موقعیت خاص (مثلاً زیان در بازار سهام) را به موقعیت‌های مشابه اما ایمن (مثلاً هر نوع سرمایه‌گذاری دیگر) نیز تعمیم می‌دهد.</w:t>
       </w:r>
     </w:p>
     <w:p>
@@ -4484,30 +4573,14 @@
       <w:r>
         <w:rPr>
           <w:rFonts w:ascii="B Nazanin" w:hAnsi="B Nazanin" w:cs="B Nazanin" w:hint="cs"/>
-          <w:sz w:val="24"/>
-          <w:szCs w:val="24"/>
-          <w:rtl/>
-          <w:lang w:bidi="fa-IR"/>
-        </w:rPr>
-        <w:t xml:space="preserve">قشر پیش‌پیشانی: این بخش، که در جلوی مغز قرار دارد، «مدیرعامل» اجرایی مغز است و مسئول کارکردهایی نظیر برنامه‌ریزی، تصمیم‌گیری منطقی، کنترل تکانه و تنظیم هیجان است. یکی از وظایف اصلی قشر پیش‌پیشانی، اعمال کنترل «بالا به پایین» بر آمیگدال و تعدیل واکنش‌های هیجانی است. در یک مغز سالم، زمانی که آمیگدال سیگنال خطر را صادر می‌کند، قشر پیش‌پیشانی به سرعت موقعیت را ارزیابی کرده و در صورت غیرواقعی بودن تهدید، به آمیگدال دستور «آرام باش» می‌دهد. اما پژوهش‌های تصویربرداری عصبی نشان داده‌اند که در افراد مضطرب، این ارتباط دوطرفه مختل است؛ فعالیت بیش از حد آمیگدال، عملکرد قشر پیش‌پیشانی را «می‌رباید» و توانایی فرد برای تفکر منطقی و تنظیم هیجان را به شدت کاهش می‌دهد (هارتلی و فلپس، ۲۰۱۲؛ دی مارتینو و همکاران</w:t>
-      </w:r>
-      <w:r>
-        <w:rPr>
-          <w:rFonts w:ascii="B Nazanin" w:hAnsi="B Nazanin" w:cs="B Nazanin" w:hint="cs"/>
-          <w:vertAlign w:val="superscript"/>
-          <w:rtl/>
-        </w:rPr>
-        <w:footnoteReference w:id="88"/>
-      </w:r>
-      <w:r>
-        <w:rPr>
-          <w:rFonts w:ascii="B Nazanin" w:hAnsi="B Nazanin" w:cs="B Nazanin" w:hint="cs"/>
-          <w:sz w:val="24"/>
-          <w:szCs w:val="24"/>
-          <w:rtl/>
-          <w:lang w:bidi="fa-IR"/>
-        </w:rPr>
-        <w:t xml:space="preserve">، ۲۰۰۶).</w:t>
+          <w:b/>
+          <w:bCs/>
+          <w:sz w:val="24"/>
+          <w:szCs w:val="24"/>
+          <w:rtl/>
+          <w:lang w:bidi="fa-IR"/>
+        </w:rPr>
+        <w:t xml:space="preserve">نقش انتقال‌دهنده‌های عصبی.</w:t>
       </w:r>
     </w:p>
     <w:p>
@@ -4524,7 +4597,7 @@
           <w:rtl/>
           <w:lang w:bidi="fa-IR"/>
         </w:rPr>
-        <w:t xml:space="preserve">هیپوکامپ: این ساختار که در مجاورت آمیگدال قرار دارد، نقشی کلیدی در شکل‌گیری و بازیابی حافظه، به ویژه حافظه مرتبط با زمینه (کانتکست) ایفا می‌کند. هیپوکامپ به مغز کمک می‌کند تا تشخیص دهد که یک محرک خاص در چه زمینه‌ای خطرناک و در چه زمینه‌ای ایمن است. اختلال در عملکرد هیپوکامپ می‌تواند منجر به «تعمیم بیش از حد ترس» شود؛ به این معنا که فرد اضطراب آموخته‌شده در یک موقعیت خاص (مثلاً زیان در بازار سهام) را به موقعیت‌های مشابه اما ایمن (مثلاً هر نوع سرمایه‌گذاری دیگر) نیز تعمیم می‌دهد.</w:t>
+        <w:t xml:space="preserve">ارتباط بین این ساختارهای مغزی از طریق مواد شیمیایی به نام انتقال‌دهنده‌های عصبی برقرار می‌شود. عدم تعادل در سه سیستم اصلی انتقال‌دهنده عصبی، ارتباط تنگاتنگی با اضطراب دارد:</w:t>
       </w:r>
     </w:p>
     <w:p>
@@ -4536,14 +4609,12 @@
       <w:r>
         <w:rPr>
           <w:rFonts w:ascii="B Nazanin" w:hAnsi="B Nazanin" w:cs="B Nazanin" w:hint="cs"/>
-          <w:b/>
-          <w:bCs/>
-          <w:sz w:val="24"/>
-          <w:szCs w:val="24"/>
-          <w:rtl/>
-          <w:lang w:bidi="fa-IR"/>
-        </w:rPr>
-        <w:t xml:space="preserve">نقش انتقال‌دهنده‌های عصبی.</w:t>
+          <w:sz w:val="24"/>
+          <w:szCs w:val="24"/>
+          <w:rtl/>
+          <w:lang w:bidi="fa-IR"/>
+        </w:rPr>
+        <w:t xml:space="preserve">سیستم گابا: گابا اصلی‌ترین انتقال‌دهنده عصبی مهارکننده در مغز است و مانند «ترمز» سیستم عصبی عمل می‌کند. کاهش فعالیت گابا یا حساسیت کم گیرنده‌های آن، منجر به برانگیختگی و فعالیت عصبی کنترل‌نشده می‌شود که در سطح ذهنی به صورت اضطراب تجربه می‌گردد. بسیاری از داروهای ضداضطراب رایج، مانند بنزودیازپین‌ها، با تقویت اثر گابا عمل می‌کنند.</w:t>
       </w:r>
     </w:p>
     <w:p>
@@ -4560,40 +4631,6 @@
           <w:rtl/>
           <w:lang w:bidi="fa-IR"/>
         </w:rPr>
-        <w:t xml:space="preserve">ارتباط بین این ساختارهای مغزی از طریق مواد شیمیایی به نام انتقال‌دهنده‌های عصبی برقرار می‌شود. عدم تعادل در سه سیستم اصلی انتقال‌دهنده عصبی، ارتباط تنگاتنگی با اضطراب دارد:</w:t>
-      </w:r>
-    </w:p>
-    <w:p>
-      <w:pPr>
-        <w:bidi w:val="1"/>
-        <w:spacing w:lineRule="exact" w:line="580" w:after="0"/>
-        <w:jc w:val="both"/>
-      </w:pPr>
-      <w:r>
-        <w:rPr>
-          <w:rFonts w:ascii="B Nazanin" w:hAnsi="B Nazanin" w:cs="B Nazanin" w:hint="cs"/>
-          <w:sz w:val="24"/>
-          <w:szCs w:val="24"/>
-          <w:rtl/>
-          <w:lang w:bidi="fa-IR"/>
-        </w:rPr>
-        <w:t xml:space="preserve">سیستم گابا: گابا اصلی‌ترین انتقال‌دهنده عصبی مهارکننده در مغز است و مانند «ترمز» سیستم عصبی عمل می‌کند. کاهش فعالیت گابا یا حساسیت کم گیرنده‌های آن، منجر به برانگیختگی و فعالیت عصبی کنترل‌نشده می‌شود که در سطح ذهنی به صورت اضطراب تجربه می‌گردد. بسیاری از داروهای ضداضطراب رایج، مانند بنزودیازپین‌ها، با تقویت اثر گابا عمل می‌کنند.</w:t>
-      </w:r>
-    </w:p>
-    <w:p>
-      <w:pPr>
-        <w:bidi w:val="1"/>
-        <w:spacing w:lineRule="exact" w:line="580" w:after="0"/>
-        <w:jc w:val="both"/>
-      </w:pPr>
-      <w:r>
-        <w:rPr>
-          <w:rFonts w:ascii="B Nazanin" w:hAnsi="B Nazanin" w:cs="B Nazanin" w:hint="cs"/>
-          <w:sz w:val="24"/>
-          <w:szCs w:val="24"/>
-          <w:rtl/>
-          <w:lang w:bidi="fa-IR"/>
-        </w:rPr>
         <w:t xml:space="preserve">سیستم سروتونین: این سیستم نقشی بسیار پیچیده در تنظیم خلق، خواب و اضطراب دارد. شواهد متعددی نشان می‌دهند که اختلال در عملکرد سروتونین با اضطراب و افسردگی مرتبط است. داروهای مهارکننده بازجذب سروتونین </w:t>
       </w:r>
       <w:r>
@@ -4612,7 +4649,7 @@
           <w:rtl/>
           <w:lang w:bidi="fa-IR"/>
         </w:rPr>
-        <w:t xml:space="preserve"> که خط اول درمان بسیاری از اختلالات اضطرابی هستند، با افزایش سطح سروتونین در سیناپس‌ها عمل می‌کنند. پژوهش‌های ژنتیکی نیز نشان داده‌اند که برخی از واریانت‌های ژن انتقال‌دهنده سروتونین (5-</w:t>
+        <w:t xml:space="preserve"> که خط اول درمان بسیاری از اختلالات اضطرابی هستند، با افزایش سطح سروتونین در سیناپس‌ها عمل می‌کنند. پژوهش‌های ژنتیکی نیز نشان داده‌اند که برخی از واریانت‌های ژن انتقال‌دهنده سروتونین</w:t>
       </w:r>
       <w:r>
         <w:rPr>
@@ -4621,17 +4658,17 @@
           <w:szCs w:val="22"/>
           <w:lang w:val="en-US"/>
         </w:rPr>
-        <w:t xml:space="preserve">HTTLPR</w:t>
-      </w:r>
-      <w:r>
-        <w:rPr>
-          <w:rFonts w:ascii="B Nazanin" w:hAnsi="B Nazanin" w:cs="B Nazanin" w:hint="cs"/>
-          <w:sz w:val="24"/>
-          <w:szCs w:val="24"/>
-          <w:rtl/>
-          <w:lang w:bidi="fa-IR"/>
-        </w:rPr>
-        <w:t xml:space="preserve">)، افراد را به طور ذاتی مستعد اضطراب صفتی بالاتر و رفتارهای مالی ریسک‌گریزتر می‌کند (کوهنن و چیائو</w:t>
+        <w:t xml:space="preserve"> (5-HTTLPR)</w:t>
+      </w:r>
+      <w:r>
+        <w:rPr>
+          <w:rFonts w:ascii="B Nazanin" w:hAnsi="B Nazanin" w:cs="B Nazanin" w:hint="cs"/>
+          <w:sz w:val="24"/>
+          <w:szCs w:val="24"/>
+          <w:rtl/>
+          <w:lang w:bidi="fa-IR"/>
+        </w:rPr>
+        <w:t xml:space="preserve">، افراد را به طور ذاتی مستعد اضطراب صفتی بالاتر و رفتارهای مالی ریسک‌گریزتر می‌کند (کوهنن و چیائو</w:t>
       </w:r>
       <w:r>
         <w:rPr>
@@ -4720,7 +4757,7 @@
           <w:rtl/>
           <w:lang w:bidi="fa-IR"/>
         </w:rPr>
-        <w:t xml:space="preserve"> است. </w:t>
+        <w:t xml:space="preserve"> است</w:t>
       </w:r>
       <w:r>
         <w:rPr>
@@ -4729,17 +4766,17 @@
           <w:szCs w:val="22"/>
           <w:lang w:val="en-US"/>
         </w:rPr>
-        <w:t xml:space="preserve">HRV</w:t>
-      </w:r>
-      <w:r>
-        <w:rPr>
-          <w:rFonts w:ascii="B Nazanin" w:hAnsi="B Nazanin" w:cs="B Nazanin" w:hint="cs"/>
-          <w:sz w:val="24"/>
-          <w:szCs w:val="24"/>
-          <w:rtl/>
-          <w:lang w:bidi="fa-IR"/>
-        </w:rPr>
-        <w:t xml:space="preserve"> بالا نشان‌دهنده انعطاف‌پذیری سیستم عصبی و توانایی خوب در تنظیم هیجان است. مطالعات نشان داده‌اند که معامله‌گران حرفه‌ای و موفق، </w:t>
+        <w:t xml:space="preserve">. HRV </w:t>
+      </w:r>
+      <w:r>
+        <w:rPr>
+          <w:rFonts w:ascii="B Nazanin" w:hAnsi="B Nazanin" w:cs="B Nazanin" w:hint="cs"/>
+          <w:sz w:val="24"/>
+          <w:szCs w:val="24"/>
+          <w:rtl/>
+          <w:lang w:bidi="fa-IR"/>
+        </w:rPr>
+        <w:t xml:space="preserve">بالا نشان‌دهنده انعطاف‌پذیری سیستم عصبی و توانایی خوب در تنظیم هیجان است. مطالعات نشان داده‌اند که معامله‌گران حرفه‌ای و موفق،</w:t>
       </w:r>
       <w:r>
         <w:rPr>
@@ -4748,17 +4785,36 @@
           <w:szCs w:val="22"/>
           <w:lang w:val="en-US"/>
         </w:rPr>
-        <w:t xml:space="preserve">HRV</w:t>
-      </w:r>
-      <w:r>
-        <w:rPr>
-          <w:rFonts w:ascii="B Nazanin" w:hAnsi="B Nazanin" w:cs="B Nazanin" w:hint="cs"/>
-          <w:sz w:val="24"/>
-          <w:szCs w:val="24"/>
-          <w:rtl/>
-          <w:lang w:bidi="fa-IR"/>
-        </w:rPr>
-        <w:t xml:space="preserve"> بالاتری نسبت به معامله‌گران مبتدی دارند، که این امر نشان‌دهنده توانایی فیزیولوژیک آن‌ها در حفظ آرامش تحت فشار است (فنتون-اکریوی و همکاران، ۲۰۱۲).</w:t>
+        <w:t xml:space="preserve"> HRV </w:t>
+      </w:r>
+      <w:r>
+        <w:rPr>
+          <w:rFonts w:ascii="B Nazanin" w:hAnsi="B Nazanin" w:cs="B Nazanin" w:hint="cs"/>
+          <w:sz w:val="24"/>
+          <w:szCs w:val="24"/>
+          <w:rtl/>
+          <w:lang w:bidi="fa-IR"/>
+        </w:rPr>
+        <w:t xml:space="preserve">بالاتری نسبت به معامله‌گران مبتدی دارند، که این امر نشان‌دهنده توانایی فیزیولوژیک آن‌ها در حفظ آرامش تحت فشار است (فنتون-اکریوی و همکاران، ۲۰۱۲).</w:t>
+      </w:r>
+    </w:p>
+    <w:p>
+      <w:pPr>
+        <w:pStyle w:val="Heading4"/>
+        <w:bidi w:val="1"/>
+        <w:jc w:val="right"/>
+      </w:pPr>
+      <w:r>
+        <w:rPr>
+          <w:rFonts w:ascii="B Nazanin" w:hAnsi="B Nazanin" w:cs="B Nazanin" w:hint="cs"/>
+          <w:b/>
+          <w:bCs/>
+          <w:sz w:val="24"/>
+          <w:szCs w:val="24"/>
+          <w:rtl/>
+          <w:lang w:bidi="fa-IR"/>
+        </w:rPr>
+        <w:t xml:space="preserve">۲-۲-۱-۳ دیدگاه‌های روانشناختی درباره اضطراب</w:t>
       </w:r>
     </w:p>
     <w:p>
@@ -4775,7 +4831,7 @@
           <w:rtl/>
           <w:lang w:bidi="fa-IR"/>
         </w:rPr>
-        <w:t xml:space="preserve">#### ۲-۲-۱-۳ دیدگاه‌های روانشناختی درباره اضطراب</w:t>
+        <w:t xml:space="preserve">تلاش برای تبیین ریشه‌ها و مکانیزم‌های اضطراب، منجر به شکل‌گیری مکاتب و دیدگاه‌های نظری متعددی در حوزه روانشناسی شده است. هر یک از این دیدگاه‌ها، از زاویه‌ای متفاوت به این هیجان پیچیده نگریسته و جنبه‌ای از آن را روشن ساخته‌اند. در ادامه، چهار دیدگاه اصلی روانکاوی، رفتاری، شناختی و وجودی که درک کنونی از اضطراب را شکل داده‌اند، مورد بررسی قرار می‌گیرند.</w:t>
       </w:r>
     </w:p>
     <w:p>
@@ -4787,12 +4843,14 @@
       <w:r>
         <w:rPr>
           <w:rFonts w:ascii="B Nazanin" w:hAnsi="B Nazanin" w:cs="B Nazanin" w:hint="cs"/>
-          <w:sz w:val="24"/>
-          <w:szCs w:val="24"/>
-          <w:rtl/>
-          <w:lang w:bidi="fa-IR"/>
-        </w:rPr>
-        <w:t xml:space="preserve">تلاش برای تبیین ریشه‌ها و مکانیزم‌های اضطراب، منجر به شکل‌گیری مکاتب و دیدگاه‌های نظری متعددی در حوزه روانشناسی شده است. هر یک از این دیدگاه‌ها، از زاویه‌ای متفاوت به این هیجان پیچیده نگریسته و جنبه‌ای از آن را روشن ساخته‌اند. در ادامه، چهار دیدگاه اصلی روانکاوی، رفتاری، شناختی و وجودی که درک کنونی از اضطراب را شکل داده‌اند، مورد بررسی قرار می‌گیرند.</w:t>
+          <w:b/>
+          <w:bCs/>
+          <w:sz w:val="24"/>
+          <w:szCs w:val="24"/>
+          <w:rtl/>
+          <w:lang w:bidi="fa-IR"/>
+        </w:rPr>
+        <w:t xml:space="preserve">دیدگاه روانکاوی.</w:t>
       </w:r>
     </w:p>
     <w:p>
@@ -4804,14 +4862,30 @@
       <w:r>
         <w:rPr>
           <w:rFonts w:ascii="B Nazanin" w:hAnsi="B Nazanin" w:cs="B Nazanin" w:hint="cs"/>
-          <w:b/>
-          <w:bCs/>
-          <w:sz w:val="24"/>
-          <w:szCs w:val="24"/>
-          <w:rtl/>
-          <w:lang w:bidi="fa-IR"/>
-        </w:rPr>
-        <w:t xml:space="preserve">دیدگاه روانکاوی.</w:t>
+          <w:sz w:val="24"/>
+          <w:szCs w:val="24"/>
+          <w:rtl/>
+          <w:lang w:bidi="fa-IR"/>
+        </w:rPr>
+        <w:t xml:space="preserve">در نظریه روانکاوی کلاسیک، زیگموند فروید</w:t>
+      </w:r>
+      <w:r>
+        <w:rPr>
+          <w:rFonts w:ascii="B Nazanin" w:hAnsi="B Nazanin" w:cs="B Nazanin" w:hint="cs"/>
+          <w:vertAlign w:val="superscript"/>
+          <w:rtl/>
+        </w:rPr>
+        <w:footnoteReference w:id="90"/>
+      </w:r>
+      <w:r>
+        <w:rPr>
+          <w:rFonts w:ascii="B Nazanin" w:hAnsi="B Nazanin" w:cs="B Nazanin" w:hint="cs"/>
+          <w:sz w:val="24"/>
+          <w:szCs w:val="24"/>
+          <w:rtl/>
+          <w:lang w:bidi="fa-IR"/>
+        </w:rPr>
+        <w:t xml:space="preserve"> اضطراب را به عنوان «هسته اصلی روان‌رنجوری» و یک سیگنال خطر حیاتی برای «من» (ایگو) تلقی می‌کرد. از نظر فروید، اضطراب هشداری است که به «من» اعلام می‌کند تعادل روانی در خطر است و یک تکانه غریزی و غیرقابل قبول از سوی «نهاد» (اید) در شرف ورود به حیطه آگاهی است (کاپلان و سادوک، ۲۰۱۵). او سه نوع اضطراب را از هم متمایز کرد: اضطراب واقعی (پاسخ به یک خطر بیرونی)، اضطراب نوروتیک (ترس از اینکه تکانه‌های «نهاد» از کنترل خارج شوند) و اضطراب اخلاقی (ترس از قضاوت «فرامن» یا وجدان).</w:t>
       </w:r>
     </w:p>
     <w:p>
@@ -4828,25 +4902,7 @@
           <w:rtl/>
           <w:lang w:bidi="fa-IR"/>
         </w:rPr>
-        <w:t xml:space="preserve">در نظریه روانکاوی کلاسیک، زیگموند فروید</w:t>
-      </w:r>
-      <w:r>
-        <w:rPr>
-          <w:rFonts w:ascii="B Nazanin" w:hAnsi="B Nazanin" w:cs="B Nazanin" w:hint="cs"/>
-          <w:vertAlign w:val="superscript"/>
-          <w:rtl/>
-        </w:rPr>
-        <w:footnoteReference w:id="90"/>
-      </w:r>
-      <w:r>
-        <w:rPr>
-          <w:rFonts w:ascii="B Nazanin" w:hAnsi="B Nazanin" w:cs="B Nazanin" w:hint="cs"/>
-          <w:sz w:val="24"/>
-          <w:szCs w:val="24"/>
-          <w:rtl/>
-          <w:lang w:bidi="fa-IR"/>
-        </w:rPr>
-        <w:t xml:space="preserve"> اضطراب را به عنوان «هسته اصلی روان‌رنجوری» و یک سیگنال خطر حیاتی برای «من» (ایگو) تلقی می‌کرد. از نظر فروید، اضطراب هشداری است که به «من» اعلام می‌کند تعادل روانی در خطر است و یک تکانه غریزی و غیرقابل قبول از سوی «نهاد» (اید) در شرف ورود به حیطه آگاهی است (کاپلان و سادوک، ۲۰۱۵). او سه نوع اضطراب را از هم متمایز کرد: اضطراب واقعی (پاسخ به یک خطر بیرونی)، اضطراب نوروتیک (ترس از اینکه تکانه‌های «نهاد» از کنترل خارج شوند) و اضطراب اخلاقی (ترس از قضاوت «فرامن» یا وجدان).</w:t>
+        <w:t xml:space="preserve">از منظر این دیدگاه، اضطراب صفتی ریشه در تعارضات حل‌نشده دوران کودکی، به ویژه در مراحل اولیه رشد روانی-جنسی دارد. این تعارضات به صورت انرژی روانی آزادنشده در ساختار شخصیت فرد باقی مانده و او را در بزرگسالی مستعد واکنش‌های اضطرابی شدید می‌کند. این دیدگاه، اگرچه آزمون تجربی آن دشوار است، اما با تاکید بر ریشه‌های تحولی، پیوندی مفهومی با متغیر دیگر این پژوهش، یعنی «طرحواره‌های ناسازگار اولیه» برقرار می‌کند؛ زیرا هر دو نظریه معتقدند که تجارب ناخوشایند کودکی، الگوهای فکری و هیجانی بزرگسالی را شکل می‌دهند (یانگ و همکاران، ۲۰۰۳).</w:t>
       </w:r>
     </w:p>
     <w:p>
@@ -4858,12 +4914,14 @@
       <w:r>
         <w:rPr>
           <w:rFonts w:ascii="B Nazanin" w:hAnsi="B Nazanin" w:cs="B Nazanin" w:hint="cs"/>
-          <w:sz w:val="24"/>
-          <w:szCs w:val="24"/>
-          <w:rtl/>
-          <w:lang w:bidi="fa-IR"/>
-        </w:rPr>
-        <w:t xml:space="preserve">از منظر این دیدگاه، اضطراب صفتی ریشه در تعارضات حل‌نشده دوران کودکی، به ویژه در مراحل اولیه رشد روانی-جنسی دارد. این تعارضات به صورت انرژی روانی آزادنشده در ساختار شخصیت فرد باقی مانده و او را در بزرگسالی مستعد واکنش‌های اضطرابی شدید می‌کند. این دیدگاه، اگرچه آزمون تجربی آن دشوار است، اما با تاکید بر ریشه‌های تحولی، پیوندی مفهومی با متغیر دیگر این پژوهش، یعنی «طرحواره‌های ناسازگار اولیه» برقرار می‌کند؛ زیرا هر دو نظریه معتقدند که تجارب ناخوشایند کودکی، الگوهای فکری و هیجانی بزرگسالی را شکل می‌دهند (یانگ و همکاران، ۲۰۰۳).</w:t>
+          <w:b/>
+          <w:bCs/>
+          <w:sz w:val="24"/>
+          <w:szCs w:val="24"/>
+          <w:rtl/>
+          <w:lang w:bidi="fa-IR"/>
+        </w:rPr>
+        <w:t xml:space="preserve">دیدگاه رفتاری (یادگیری).</w:t>
       </w:r>
     </w:p>
     <w:p>
@@ -4875,14 +4933,12 @@
       <w:r>
         <w:rPr>
           <w:rFonts w:ascii="B Nazanin" w:hAnsi="B Nazanin" w:cs="B Nazanin" w:hint="cs"/>
-          <w:b/>
-          <w:bCs/>
-          <w:sz w:val="24"/>
-          <w:szCs w:val="24"/>
-          <w:rtl/>
-          <w:lang w:bidi="fa-IR"/>
-        </w:rPr>
-        <w:t xml:space="preserve">دیدگاه رفتاری (یادگیری).</w:t>
+          <w:sz w:val="24"/>
+          <w:szCs w:val="24"/>
+          <w:rtl/>
+          <w:lang w:bidi="fa-IR"/>
+        </w:rPr>
+        <w:t xml:space="preserve">در نقطه مقابل دیدگاه روانکاوی، رفتارگرایان اضطراب را نه یک تعارض درونی، بلکه یک پاسخ آموخته‌شده به محرک‌های محیطی می‌دانند. این دیدگاه بر دو اصل کلیدی یادگیری استوار است:</w:t>
       </w:r>
     </w:p>
     <w:p>
@@ -4899,7 +4955,7 @@
           <w:rtl/>
           <w:lang w:bidi="fa-IR"/>
         </w:rPr>
-        <w:t xml:space="preserve">در نقطه مقابل دیدگاه روانکاوی، رفتارگرایان اضطراب را نه یک تعارض درونی، بلکه یک پاسخ آموخته‌شده به محرک‌های محیطی می‌دانند. این دیدگاه بر دو اصل کلیدی یادگیری استوار است:</w:t>
+        <w:t xml:space="preserve">شرطی‌سازی کلاسیک: بر اساس اصول پاولف، یک محرک خنثی (مانند صدای زنگ اخبار اقتصادی) اگر به طور مکرر با یک محرک ناخوشایند واقعی (مانند یک زیان سنگین مالی) همراه شود، به تدریج به یک محرک شرطی تبدیل شده و به تنهایی قادر خواهد بود پاسخ اضطراب را برانگیزد.</w:t>
       </w:r>
     </w:p>
     <w:p>
@@ -4916,7 +4972,7 @@
           <w:rtl/>
           <w:lang w:bidi="fa-IR"/>
         </w:rPr>
-        <w:t xml:space="preserve">شرطی‌سازی کلاسیک: بر اساس اصول پاولف، یک محرک خنثی (مانند صدای زنگ اخبار اقتصادی) اگر به طور مکرر با یک محرک ناخوشایند واقعی (مانند یک زیان سنگین مالی) همراه شود، به تدریج به یک محرک شرطی تبدیل شده و به تنهایی قادر خواهد بود پاسخ اضطراب را برانگیزد.</w:t>
+        <w:t xml:space="preserve">شرطی‌سازی عامل: طبق نظریه اسکینر، رفتارها توسط پیامدهایشان تقویت یا تضعیف می‌شوند. در زمینه اضطراب، «اجتناب» نقش کلیدی دارد. زمانی که یک معامله‌گر با اجتناب از ورود به یک معامله، از احساس ناخوشایند اضطراب رهایی می‌یابد، رفتار اجتنابی او از طریق «تقویت منفی» تحکیم می‌شود. این چرخه معیوب (موقعیت -&gt; اضطراب -&gt; اجتناب -&gt; تسکین موقت) باعث تداوم و تشدید الگوهای اضطرابی و ریسک‌گریزی افراطی می‌شود (مانر و اشمیت، ۲۰۰۶).</w:t>
       </w:r>
     </w:p>
     <w:p>
@@ -4928,12 +4984,14 @@
       <w:r>
         <w:rPr>
           <w:rFonts w:ascii="B Nazanin" w:hAnsi="B Nazanin" w:cs="B Nazanin" w:hint="cs"/>
-          <w:sz w:val="24"/>
-          <w:szCs w:val="24"/>
-          <w:rtl/>
-          <w:lang w:bidi="fa-IR"/>
-        </w:rPr>
-        <w:t xml:space="preserve">شرطی‌سازی عامل: طبق نظریه اسکینر، رفتارها توسط پیامدهایشان تقویت یا تضعیف می‌شوند. در زمینه اضطراب، «اجتناب» نقش کلیدی دارد. زمانی که یک معامله‌گر با اجتناب از ورود به یک معامله، از احساس ناخوشایند اضطراب رهایی می‌یابد، رفتار اجتنابی او از طریق «تقویت منفی» تحکیم می‌شود. این چرخه معیوب (موقعیت -&gt; اضطراب -&gt; اجتناب -&gt; تسکین موقت) باعث تداوم و تشدید الگوهای اضطرابی و ریسک‌گریزی افراطی می‌شود (مانر و اشمیت، ۲۰۰۶).</w:t>
+          <w:b/>
+          <w:bCs/>
+          <w:sz w:val="24"/>
+          <w:szCs w:val="24"/>
+          <w:rtl/>
+          <w:lang w:bidi="fa-IR"/>
+        </w:rPr>
+        <w:t xml:space="preserve">دیدگاه شناختی.</w:t>
       </w:r>
     </w:p>
     <w:p>
@@ -4945,14 +5003,48 @@
       <w:r>
         <w:rPr>
           <w:rFonts w:ascii="B Nazanin" w:hAnsi="B Nazanin" w:cs="B Nazanin" w:hint="cs"/>
-          <w:b/>
-          <w:bCs/>
-          <w:sz w:val="24"/>
-          <w:szCs w:val="24"/>
-          <w:rtl/>
-          <w:lang w:bidi="fa-IR"/>
-        </w:rPr>
-        <w:t xml:space="preserve">دیدگاه شناختی.</w:t>
+          <w:sz w:val="24"/>
+          <w:szCs w:val="24"/>
+          <w:rtl/>
+          <w:lang w:bidi="fa-IR"/>
+        </w:rPr>
+        <w:t xml:space="preserve">انقلاب شناختی در روانشناسی، کانون توجه را از محیط بیرونی به فرآیندهای پردازش اطلاعات درونی فرد معطوف کرد. طبق این دیدگاه، که پیشگامان آن آرون بک و آلبرت الیس</w:t>
+      </w:r>
+      <w:r>
+        <w:rPr>
+          <w:rFonts w:ascii="B Nazanin" w:hAnsi="B Nazanin" w:cs="B Nazanin" w:hint="cs"/>
+          <w:vertAlign w:val="superscript"/>
+          <w:rtl/>
+        </w:rPr>
+        <w:footnoteReference w:id="91"/>
+      </w:r>
+      <w:r>
+        <w:rPr>
+          <w:rFonts w:ascii="B Nazanin" w:hAnsi="B Nazanin" w:cs="B Nazanin" w:hint="cs"/>
+          <w:sz w:val="24"/>
+          <w:szCs w:val="24"/>
+          <w:rtl/>
+          <w:lang w:bidi="fa-IR"/>
+        </w:rPr>
+        <w:t xml:space="preserve"> بودند، این خود رویدادها نیستند که باعث اضطراب می‌شوند، بلکه تفسیر و ارزیابی فرد از آن رویدادهاست که هیجانات را شکل می‌دهد (بک، ۱۹۷۶). افراد مضطرب دارای «طرحواره‌های خطر» هستند که مانند یک فیلتر ذهنی، باعث می‌شوند اطلاعات محیطی به طور سوگیرانه پردازش شوند. این سوگیری‌ها در قالب «خطاهای شناختی» مشخصی ظاهر می‌شوند که در زمینه بازارهای مالی بسیار رایج هستند (دانیل، هیرشلایفر و سوبرامانیام</w:t>
+      </w:r>
+      <w:r>
+        <w:rPr>
+          <w:rFonts w:ascii="B Nazanin" w:hAnsi="B Nazanin" w:cs="B Nazanin" w:hint="cs"/>
+          <w:vertAlign w:val="superscript"/>
+          <w:rtl/>
+        </w:rPr>
+        <w:footnoteReference w:id="92"/>
+      </w:r>
+      <w:r>
+        <w:rPr>
+          <w:rFonts w:ascii="B Nazanin" w:hAnsi="B Nazanin" w:cs="B Nazanin" w:hint="cs"/>
+          <w:sz w:val="24"/>
+          <w:szCs w:val="24"/>
+          <w:rtl/>
+          <w:lang w:bidi="fa-IR"/>
+        </w:rPr>
+        <w:t xml:space="preserve">، ۱۹۹۸)</w:t>
       </w:r>
     </w:p>
     <w:p>
@@ -4969,43 +5061,7 @@
           <w:rtl/>
           <w:lang w:bidi="fa-IR"/>
         </w:rPr>
-        <w:t xml:space="preserve">انقلاب شناختی در روانشناسی، کانون توجه را از محیط بیرونی به فرآیندهای پردازش اطلاعات درونی فرد معطوف کرد. طبق این دیدگاه، که پیشگامان آن آرون بک و آلبرت الیس</w:t>
-      </w:r>
-      <w:r>
-        <w:rPr>
-          <w:rFonts w:ascii="B Nazanin" w:hAnsi="B Nazanin" w:cs="B Nazanin" w:hint="cs"/>
-          <w:vertAlign w:val="superscript"/>
-          <w:rtl/>
-        </w:rPr>
-        <w:footnoteReference w:id="91"/>
-      </w:r>
-      <w:r>
-        <w:rPr>
-          <w:rFonts w:ascii="B Nazanin" w:hAnsi="B Nazanin" w:cs="B Nazanin" w:hint="cs"/>
-          <w:sz w:val="24"/>
-          <w:szCs w:val="24"/>
-          <w:rtl/>
-          <w:lang w:bidi="fa-IR"/>
-        </w:rPr>
-        <w:t xml:space="preserve"> بودند، این خود رویدادها نیستند که باعث اضطراب می‌شوند، بلکه تفسیر و ارزیابی فرد از آن رویدادهاست که هیجانات را شکل می‌دهد (بک، ۱۹۷۶). افراد مضطرب دارای «طرحواره‌های خطر» هستند که مانند یک فیلتر ذهنی، باعث می‌شوند اطلاعات محیطی به طور سوگیرانه پردازش شوند. این سوگیری‌ها در قالب «خطاهای شناختی» مشخصی ظاهر می‌شوند که در زمینه بازارهای مالی بسیار رایج هستند (دانیل، هیرشلایفر و سوبرامانیام</w:t>
-      </w:r>
-      <w:r>
-        <w:rPr>
-          <w:rFonts w:ascii="B Nazanin" w:hAnsi="B Nazanin" w:cs="B Nazanin" w:hint="cs"/>
-          <w:vertAlign w:val="superscript"/>
-          <w:rtl/>
-        </w:rPr>
-        <w:footnoteReference w:id="92"/>
-      </w:r>
-      <w:r>
-        <w:rPr>
-          <w:rFonts w:ascii="B Nazanin" w:hAnsi="B Nazanin" w:cs="B Nazanin" w:hint="cs"/>
-          <w:sz w:val="24"/>
-          <w:szCs w:val="24"/>
-          <w:rtl/>
-          <w:lang w:bidi="fa-IR"/>
-        </w:rPr>
-        <w:t xml:space="preserve">، ۱۹۹۸)</w:t>
+        <w:t xml:space="preserve">فاجعه‌سازی: تمایل به تفسیر یک رویداد منفی کوچک (مانند افت ۱ درصدی سهم) به عنوان یک فاجعه غیرقابل جبران («بازار در حال سقوط است، من ورشکست خواهم شد»).</w:t>
       </w:r>
     </w:p>
     <w:p>
@@ -5022,7 +5078,7 @@
           <w:rtl/>
           <w:lang w:bidi="fa-IR"/>
         </w:rPr>
-        <w:t xml:space="preserve">فاجعه‌سازی: تمایل به تفسیر یک رویداد منفی کوچک (مانند افت ۱ درصدی سهم) به عنوان یک فاجعه غیرقابل جبران («بازار در حال سقوط است، من ورشکست خواهم شد»).</w:t>
+        <w:t xml:space="preserve">بزرگ‌نمایی و کوچک‌نمایی: اغراق در اهمیت اطلاعات منفی و بی‌اهمیت جلوه دادن اطلاعات مثبت.</w:t>
       </w:r>
     </w:p>
     <w:p>
@@ -5039,7 +5095,7 @@
           <w:rtl/>
           <w:lang w:bidi="fa-IR"/>
         </w:rPr>
-        <w:t xml:space="preserve">بزرگ‌نمایی و کوچک‌نمایی: اغراق در اهمیت اطلاعات منفی و بی‌اهمیت جلوه دادن اطلاعات مثبت.</w:t>
+        <w:t xml:space="preserve">تفکر دوقطبی (همه یا هیچ): ارزیابی عملکرد خود در قالب دو قطب افراطی («یا من یک معامله‌گر نابغه هستم یا یک بازنده تمام‌عیار»).</w:t>
       </w:r>
     </w:p>
     <w:p>
@@ -5056,7 +5112,7 @@
           <w:rtl/>
           <w:lang w:bidi="fa-IR"/>
         </w:rPr>
-        <w:t xml:space="preserve">تفکر دوقطبی (همه یا هیچ): ارزیابی عملکرد خود در قالب دو قطب افراطی («یا من یک معامله‌گر نابغه هستم یا یک بازنده تمام‌عیار»).</w:t>
+        <w:t xml:space="preserve">بر اساس مدل شناختی طرحواره‌ها، این ساختارهای شناختی ناسازگار با فعال‌سازی سوگیری‌های پردازش اطلاعات، فرد را در چرخه‌ای مزمن از ارزیابی بیش‌ازحد تهدید، گوش‌به‌زنگی و اضطراب مداوم گرفتار می‌سازند (بک و کلارک، ۱۹۹۷؛ یانگ و همکاران، ۲۰۰۳).</w:t>
       </w:r>
     </w:p>
     <w:p>
@@ -5068,12 +5124,14 @@
       <w:r>
         <w:rPr>
           <w:rFonts w:ascii="B Nazanin" w:hAnsi="B Nazanin" w:cs="B Nazanin" w:hint="cs"/>
-          <w:sz w:val="24"/>
-          <w:szCs w:val="24"/>
-          <w:rtl/>
-          <w:lang w:bidi="fa-IR"/>
-        </w:rPr>
-        <w:t xml:space="preserve">بر اساس مدل شناختی طرحواره‌ها، این ساختارهای شناختی ناسازگار با فعال‌سازی سوگیری‌های پردازش اطلاعات، فرد را در چرخه‌ای مزمن از ارزیابی بیش‌ازحد تهدید، گوش‌به‌زنگی و اضطراب مداوم گرفتار می‌سازند (بک و کلارک، ۱۹۹۷؛ یانگ و همکاران، ۲۰۰۳).</w:t>
+          <w:b/>
+          <w:bCs/>
+          <w:sz w:val="24"/>
+          <w:szCs w:val="24"/>
+          <w:rtl/>
+          <w:lang w:bidi="fa-IR"/>
+        </w:rPr>
+        <w:t xml:space="preserve">دیدگاه وجودی (اگزیستانسیال).</w:t>
       </w:r>
     </w:p>
     <w:p>
@@ -5085,6 +5143,59 @@
       <w:r>
         <w:rPr>
           <w:rFonts w:ascii="B Nazanin" w:hAnsi="B Nazanin" w:cs="B Nazanin" w:hint="cs"/>
+          <w:sz w:val="24"/>
+          <w:szCs w:val="24"/>
+          <w:rtl/>
+          <w:lang w:bidi="fa-IR"/>
+        </w:rPr>
+        <w:t xml:space="preserve">این دیدگاه فلسفی‌تر، اضطراب را نه یک بیماری یا نقص، بلکه بخشی اجتناب‌ناپذیر از شرایط انسانی می‌داند. متفکرانی چون رولو می</w:t>
+      </w:r>
+      <w:r>
+        <w:rPr>
+          <w:rFonts w:ascii="B Nazanin" w:hAnsi="B Nazanin" w:cs="B Nazanin" w:hint="cs"/>
+          <w:vertAlign w:val="superscript"/>
+          <w:rtl/>
+        </w:rPr>
+        <w:footnoteReference w:id="93"/>
+      </w:r>
+      <w:r>
+        <w:rPr>
+          <w:rFonts w:ascii="B Nazanin" w:hAnsi="B Nazanin" w:cs="B Nazanin" w:hint="cs"/>
+          <w:sz w:val="24"/>
+          <w:szCs w:val="24"/>
+          <w:rtl/>
+          <w:lang w:bidi="fa-IR"/>
+        </w:rPr>
+        <w:t xml:space="preserve"> و اروین یالوم معتقدند که اضطراب، واکنشی عمیق به آگاهی از «دلواپسی‌های غایی» زندگی است: مرگ، آزادی، تنهایی و پوچی. از منظر این دیدگاه، اضطراب یک معامله‌گر صرفاً ناشی از ترس از زیان مالی نیست، بلکه می‌تواند تجلی «اضطراب وجودی» باشد. آزادی انتخاب برای خرید یا فروش و مسئولیت کامل در قبال پیامدهای آن، می‌تواند بار روانی سنگینی ایجاد کند. تنهایی در تصمیم‌گیری و آگاهی از اینکه در نهایت هیچ‌کس جز خود فرد مسئول سرنوشت مالی‌اش نیست، این اضطراب را تشدید می‌کند (یالوم</w:t>
+      </w:r>
+      <w:r>
+        <w:rPr>
+          <w:rFonts w:ascii="B Nazanin" w:hAnsi="B Nazanin" w:cs="B Nazanin" w:hint="cs"/>
+          <w:vertAlign w:val="superscript"/>
+          <w:rtl/>
+        </w:rPr>
+        <w:footnoteReference w:id="94"/>
+      </w:r>
+      <w:r>
+        <w:rPr>
+          <w:rFonts w:ascii="B Nazanin" w:hAnsi="B Nazanin" w:cs="B Nazanin" w:hint="cs"/>
+          <w:sz w:val="24"/>
+          <w:szCs w:val="24"/>
+          <w:rtl/>
+          <w:lang w:bidi="fa-IR"/>
+        </w:rPr>
+        <w:t xml:space="preserve">، ۱۹۸۰).</w:t>
+      </w:r>
+    </w:p>
+    <w:p>
+      <w:pPr>
+        <w:pStyle w:val="Heading4"/>
+        <w:bidi w:val="1"/>
+        <w:jc w:val="right"/>
+      </w:pPr>
+      <w:r>
+        <w:rPr>
+          <w:rFonts w:ascii="B Nazanin" w:hAnsi="B Nazanin" w:cs="B Nazanin" w:hint="cs"/>
           <w:b/>
           <w:bCs/>
           <w:sz w:val="24"/>
@@ -5092,77 +5203,7 @@
           <w:rtl/>
           <w:lang w:bidi="fa-IR"/>
         </w:rPr>
-        <w:t xml:space="preserve">دیدگاه وجودی (اگزیستانسیال).</w:t>
-      </w:r>
-    </w:p>
-    <w:p>
-      <w:pPr>
-        <w:bidi w:val="1"/>
-        <w:spacing w:lineRule="exact" w:line="580" w:after="0"/>
-        <w:jc w:val="both"/>
-      </w:pPr>
-      <w:r>
-        <w:rPr>
-          <w:rFonts w:ascii="B Nazanin" w:hAnsi="B Nazanin" w:cs="B Nazanin" w:hint="cs"/>
-          <w:sz w:val="24"/>
-          <w:szCs w:val="24"/>
-          <w:rtl/>
-          <w:lang w:bidi="fa-IR"/>
-        </w:rPr>
-        <w:t xml:space="preserve">این دیدگاه فلسفی‌تر، اضطراب را نه یک بیماری یا نقص، بلکه بخشی اجتناب‌ناپذیر از شرایط انسانی می‌داند. متفکرانی چون رولو می</w:t>
-      </w:r>
-      <w:r>
-        <w:rPr>
-          <w:rFonts w:ascii="B Nazanin" w:hAnsi="B Nazanin" w:cs="B Nazanin" w:hint="cs"/>
-          <w:vertAlign w:val="superscript"/>
-          <w:rtl/>
-        </w:rPr>
-        <w:footnoteReference w:id="93"/>
-      </w:r>
-      <w:r>
-        <w:rPr>
-          <w:rFonts w:ascii="B Nazanin" w:hAnsi="B Nazanin" w:cs="B Nazanin" w:hint="cs"/>
-          <w:sz w:val="24"/>
-          <w:szCs w:val="24"/>
-          <w:rtl/>
-          <w:lang w:bidi="fa-IR"/>
-        </w:rPr>
-        <w:t xml:space="preserve"> و اروین یالوم معتقدند که اضطراب، واکنشی عمیق به آگاهی از «دلواپسی‌های غایی» زندگی است: مرگ، آزادی، تنهایی و پوچی. از منظر این دیدگاه، اضطراب یک معامله‌گر صرفاً ناشی از ترس از زیان مالی نیست، بلکه می‌تواند تجلی «اضطراب وجودی» باشد. آزادی انتخاب برای خرید یا فروش و مسئولیت کامل در قبال پیامدهای آن، می‌تواند بار روانی سنگینی ایجاد کند. تنهایی در تصمیم‌گیری و آگاهی از اینکه در نهایت هیچ‌کس جز خود فرد مسئول سرنوشت مالی‌اش نیست، این اضطراب را تشدید می‌کند (یالوم</w:t>
-      </w:r>
-      <w:r>
-        <w:rPr>
-          <w:rFonts w:ascii="B Nazanin" w:hAnsi="B Nazanin" w:cs="B Nazanin" w:hint="cs"/>
-          <w:vertAlign w:val="superscript"/>
-          <w:rtl/>
-        </w:rPr>
-        <w:footnoteReference w:id="94"/>
-      </w:r>
-      <w:r>
-        <w:rPr>
-          <w:rFonts w:ascii="B Nazanin" w:hAnsi="B Nazanin" w:cs="B Nazanin" w:hint="cs"/>
-          <w:sz w:val="24"/>
-          <w:szCs w:val="24"/>
-          <w:rtl/>
-          <w:lang w:bidi="fa-IR"/>
-        </w:rPr>
-        <w:t xml:space="preserve">، ۱۹۸۰).</w:t>
-      </w:r>
-    </w:p>
-    <w:p>
-      <w:pPr>
-        <w:bidi w:val="1"/>
-        <w:spacing w:lineRule="exact" w:line="580" w:after="0"/>
-        <w:jc w:val="both"/>
-      </w:pPr>
-      <w:r>
-        <w:rPr>
-          <w:rFonts w:ascii="B Nazanin" w:hAnsi="B Nazanin" w:cs="B Nazanin" w:hint="cs"/>
-          <w:sz w:val="24"/>
-          <w:szCs w:val="24"/>
-          <w:rtl/>
-          <w:lang w:bidi="fa-IR"/>
-        </w:rPr>
-        <w:t xml:space="preserve">#### ۲-۲-۱-۴ جمع‌بندی: جایگاه اضطراب صفتی در تصمیم‌گیری مالی</w:t>
+        <w:t xml:space="preserve">۲-۲-۱-۴ جمع‌بندی: جایگاه اضطراب صفتی در تصمیم‌گیری مالی</w:t>
       </w:r>
     </w:p>
     <w:p>
@@ -5514,19 +5555,21 @@
     </w:p>
     <w:p>
       <w:pPr>
+        <w:pStyle w:val="Heading4"/>
         <w:bidi w:val="1"/>
-        <w:spacing w:lineRule="exact" w:line="580" w:after="0"/>
-        <w:jc w:val="both"/>
-      </w:pPr>
-      <w:r>
-        <w:rPr>
-          <w:rFonts w:ascii="B Nazanin" w:hAnsi="B Nazanin" w:cs="B Nazanin" w:hint="cs"/>
-          <w:sz w:val="24"/>
-          <w:szCs w:val="24"/>
-          <w:rtl/>
-          <w:lang w:bidi="fa-IR"/>
-        </w:rPr>
-        <w:t xml:space="preserve">#### ۲-۲-۲-۱ حوزه‌ها و طرحواره‌های ناسازگار اولیه و سبک‌های مقابله‌ای</w:t>
+        <w:jc w:val="right"/>
+      </w:pPr>
+      <w:r>
+        <w:rPr>
+          <w:rFonts w:ascii="B Nazanin" w:hAnsi="B Nazanin" w:cs="B Nazanin" w:hint="cs"/>
+          <w:b/>
+          <w:bCs/>
+          <w:sz w:val="24"/>
+          <w:szCs w:val="24"/>
+          <w:rtl/>
+          <w:lang w:bidi="fa-IR"/>
+        </w:rPr>
+        <w:t xml:space="preserve">۲-۲-۲-۱ حوزه‌ها و طرحواره‌های ناسازگار اولیه و سبک‌های مقابله‌ای</w:t>
       </w:r>
     </w:p>
     <w:p>
@@ -5688,7 +5731,7 @@
                 <w:rtl/>
                 <w:lang w:bidi="fa-IR"/>
               </w:rPr>
-              <w:t xml:space="preserve">۱. بریدگی و طرد (</w:t>
+              <w:t xml:space="preserve">۱. بریدگی و طرد</w:t>
             </w:r>
             <w:r>
               <w:rPr>
@@ -5697,7 +5740,7 @@
                 <w:szCs w:val="20"/>
                 <w:lang w:val="en-US"/>
               </w:rPr>
-              <w:t xml:space="preserve">Disconnection and Rejection)</w:t>
+              <w:t xml:space="preserve"> (Disconnection and Rejection)</w:t>
             </w:r>
           </w:p>
         </w:tc>
@@ -5741,7 +5784,7 @@
                 <w:rtl/>
                 <w:lang w:bidi="fa-IR"/>
               </w:rPr>
-              <w:t xml:space="preserve">رهاشدگی/بی‌ثباتی (</w:t>
+              <w:t xml:space="preserve">رهاشدگی/بی‌ثباتی</w:t>
             </w:r>
             <w:r>
               <w:rPr>
@@ -5750,7 +5793,7 @@
                 <w:szCs w:val="20"/>
                 <w:lang w:val="en-US"/>
               </w:rPr>
-              <w:t xml:space="preserve">Abandonment/Instability</w:t>
+              <w:t xml:space="preserve"> (Abandonment/Instability)</w:t>
             </w:r>
             <w:r>
               <w:rPr>
@@ -5760,7 +5803,7 @@
                 <w:rtl/>
                 <w:lang w:bidi="fa-IR"/>
               </w:rPr>
-              <w:t xml:space="preserve">)؛ بی‌اعتمادی/بدرفتاری (</w:t>
+              <w:t xml:space="preserve">؛ بی‌اعتمادی/بدرفتاری</w:t>
             </w:r>
             <w:r>
               <w:rPr>
@@ -5769,7 +5812,7 @@
                 <w:szCs w:val="20"/>
                 <w:lang w:val="en-US"/>
               </w:rPr>
-              <w:t xml:space="preserve">Mistrust/Abuse</w:t>
+              <w:t xml:space="preserve"> (Mistrust/Abuse)</w:t>
             </w:r>
             <w:r>
               <w:rPr>
@@ -5779,7 +5822,7 @@
                 <w:rtl/>
                 <w:lang w:bidi="fa-IR"/>
               </w:rPr>
-              <w:t xml:space="preserve">)؛ محرومیت هیجانی (</w:t>
+              <w:t xml:space="preserve">؛ محرومیت هیجانی</w:t>
             </w:r>
             <w:r>
               <w:rPr>
@@ -5788,7 +5831,7 @@
                 <w:szCs w:val="20"/>
                 <w:lang w:val="en-US"/>
               </w:rPr>
-              <w:t xml:space="preserve">Emotional Deprivation</w:t>
+              <w:t xml:space="preserve"> (Emotional Deprivation)</w:t>
             </w:r>
             <w:r>
               <w:rPr>
@@ -5798,7 +5841,7 @@
                 <w:rtl/>
                 <w:lang w:bidi="fa-IR"/>
               </w:rPr>
-              <w:t xml:space="preserve">)؛ نقص/شرم (</w:t>
+              <w:t xml:space="preserve">؛ نقص/شرم</w:t>
             </w:r>
             <w:r>
               <w:rPr>
@@ -5807,7 +5850,7 @@
                 <w:szCs w:val="20"/>
                 <w:lang w:val="en-US"/>
               </w:rPr>
-              <w:t xml:space="preserve">Defectiveness/Shame</w:t>
+              <w:t xml:space="preserve"> (Defectiveness/Shame)</w:t>
             </w:r>
             <w:r>
               <w:rPr>
@@ -5817,7 +5860,7 @@
                 <w:rtl/>
                 <w:lang w:bidi="fa-IR"/>
               </w:rPr>
-              <w:t xml:space="preserve">)؛ انزوای اجتماعی/بیگانگی (</w:t>
+              <w:t xml:space="preserve">؛ انزوای اجتماعی/بیگانگی</w:t>
             </w:r>
             <w:r>
               <w:rPr>
@@ -5826,7 +5869,7 @@
                 <w:szCs w:val="20"/>
                 <w:lang w:val="en-US"/>
               </w:rPr>
-              <w:t xml:space="preserve">Social Isolation/Alienation)</w:t>
+              <w:t xml:space="preserve"> (Social Isolation/Alienation)</w:t>
             </w:r>
           </w:p>
         </w:tc>
@@ -5850,7 +5893,7 @@
                 <w:rtl/>
                 <w:lang w:bidi="fa-IR"/>
               </w:rPr>
-              <w:t xml:space="preserve">۲. آسیب‌دیدگی در خودمختاری و عملکرد (</w:t>
+              <w:t xml:space="preserve">۲. آسیب‌دیدگی در خودمختاری و عملکرد</w:t>
             </w:r>
             <w:r>
               <w:rPr>
@@ -5859,7 +5902,7 @@
                 <w:szCs w:val="20"/>
                 <w:lang w:val="en-US"/>
               </w:rPr>
-              <w:t xml:space="preserve">Impaired Autonomy and Performance)</w:t>
+              <w:t xml:space="preserve"> (Impaired Autonomy and Performance)</w:t>
             </w:r>
           </w:p>
         </w:tc>
@@ -5903,7 +5946,7 @@
                 <w:rtl/>
                 <w:lang w:bidi="fa-IR"/>
               </w:rPr>
-              <w:t xml:space="preserve">آسیب‌پذیری نسبت به آسیب یا بیماری (</w:t>
+              <w:t xml:space="preserve">آسیب‌پذیری نسبت به آسیب یا بیماری</w:t>
             </w:r>
             <w:r>
               <w:rPr>
@@ -5912,7 +5955,7 @@
                 <w:szCs w:val="20"/>
                 <w:lang w:val="en-US"/>
               </w:rPr>
-              <w:t xml:space="preserve">Vulnerability to Harm or Illness</w:t>
+              <w:t xml:space="preserve"> (Vulnerability to Harm or Illness)</w:t>
             </w:r>
             <w:r>
               <w:rPr>
@@ -5922,7 +5965,7 @@
                 <w:rtl/>
                 <w:lang w:bidi="fa-IR"/>
               </w:rPr>
-              <w:t xml:space="preserve">)؛ وابستگی/بی‌کفایتی (</w:t>
+              <w:t xml:space="preserve">؛ وابستگی/بی‌کفایتی</w:t>
             </w:r>
             <w:r>
               <w:rPr>
@@ -5931,7 +5974,7 @@
                 <w:szCs w:val="20"/>
                 <w:lang w:val="en-US"/>
               </w:rPr>
-              <w:t xml:space="preserve">Dependence/Incompetence</w:t>
+              <w:t xml:space="preserve"> (Dependence/Incompetence)</w:t>
             </w:r>
             <w:r>
               <w:rPr>
@@ -5941,7 +5984,7 @@
                 <w:rtl/>
                 <w:lang w:bidi="fa-IR"/>
               </w:rPr>
-              <w:t xml:space="preserve">)؛ درهم‌تنیدگی/خویشتن رشدنایافته (</w:t>
+              <w:t xml:space="preserve">؛ درهم‌تنیدگی/خویشتن رشدنایافته</w:t>
             </w:r>
             <w:r>
               <w:rPr>
@@ -5950,7 +5993,7 @@
                 <w:szCs w:val="20"/>
                 <w:lang w:val="en-US"/>
               </w:rPr>
-              <w:t xml:space="preserve">Enmeshment/Undeveloped Self</w:t>
+              <w:t xml:space="preserve"> (Enmeshment/Undeveloped Self)</w:t>
             </w:r>
             <w:r>
               <w:rPr>
@@ -5960,7 +6003,7 @@
                 <w:rtl/>
                 <w:lang w:bidi="fa-IR"/>
               </w:rPr>
-              <w:t xml:space="preserve">)؛ شکست (</w:t>
+              <w:t xml:space="preserve">؛ شکست</w:t>
             </w:r>
             <w:r>
               <w:rPr>
@@ -5969,7 +6012,7 @@
                 <w:szCs w:val="20"/>
                 <w:lang w:val="en-US"/>
               </w:rPr>
-              <w:t xml:space="preserve">Failure)</w:t>
+              <w:t xml:space="preserve"> (Failure)</w:t>
             </w:r>
           </w:p>
         </w:tc>
@@ -5993,7 +6036,7 @@
                 <w:rtl/>
                 <w:lang w:bidi="fa-IR"/>
               </w:rPr>
-              <w:t xml:space="preserve">۳. محدودیت‌های مختل (</w:t>
+              <w:t xml:space="preserve">۳. محدودیت‌های مختل</w:t>
             </w:r>
             <w:r>
               <w:rPr>
@@ -6002,7 +6045,7 @@
                 <w:szCs w:val="20"/>
                 <w:lang w:val="en-US"/>
               </w:rPr>
-              <w:t xml:space="preserve">Impaired Limits)</w:t>
+              <w:t xml:space="preserve"> (Impaired Limits)</w:t>
             </w:r>
           </w:p>
         </w:tc>
@@ -6046,7 +6089,7 @@
                 <w:rtl/>
                 <w:lang w:bidi="fa-IR"/>
               </w:rPr>
-              <w:t xml:space="preserve">استحقاق/بزرگ‌منشی (</w:t>
+              <w:t xml:space="preserve">استحقاق/بزرگ‌منشی</w:t>
             </w:r>
             <w:r>
               <w:rPr>
@@ -6055,7 +6098,7 @@
                 <w:szCs w:val="20"/>
                 <w:lang w:val="en-US"/>
               </w:rPr>
-              <w:t xml:space="preserve">Entitlement/Grandiosity</w:t>
+              <w:t xml:space="preserve"> (Entitlement/Grandiosity)</w:t>
             </w:r>
             <w:r>
               <w:rPr>
@@ -6065,7 +6108,7 @@
                 <w:rtl/>
                 <w:lang w:bidi="fa-IR"/>
               </w:rPr>
-              <w:t xml:space="preserve">)؛ خویشتن‌داری/خودانضباطی ناکافی (</w:t>
+              <w:t xml:space="preserve">؛ خویشتن‌داری/خودانضباطی ناکافی</w:t>
             </w:r>
             <w:r>
               <w:rPr>
@@ -6074,7 +6117,7 @@
                 <w:szCs w:val="20"/>
                 <w:lang w:val="en-US"/>
               </w:rPr>
-              <w:t xml:space="preserve">Insufficient Self-Control/Self-Discipline)</w:t>
+              <w:t xml:space="preserve"> (Insufficient Self-Control/Self-Discipline)</w:t>
             </w:r>
           </w:p>
         </w:tc>
@@ -6098,7 +6141,7 @@
                 <w:rtl/>
                 <w:lang w:bidi="fa-IR"/>
               </w:rPr>
-              <w:t xml:space="preserve">۴. دیگرجهت‌مندی (</w:t>
+              <w:t xml:space="preserve">۴. دیگرجهت‌مندی</w:t>
             </w:r>
             <w:r>
               <w:rPr>
@@ -6107,7 +6150,7 @@
                 <w:szCs w:val="20"/>
                 <w:lang w:val="en-US"/>
               </w:rPr>
-              <w:t xml:space="preserve">Other-Directedness)</w:t>
+              <w:t xml:space="preserve"> (Other-Directedness)</w:t>
             </w:r>
           </w:p>
         </w:tc>
@@ -6151,7 +6194,7 @@
                 <w:rtl/>
                 <w:lang w:bidi="fa-IR"/>
               </w:rPr>
-              <w:t xml:space="preserve">اطاعت (</w:t>
+              <w:t xml:space="preserve">اطاعت</w:t>
             </w:r>
             <w:r>
               <w:rPr>
@@ -6160,7 +6203,7 @@
                 <w:szCs w:val="20"/>
                 <w:lang w:val="en-US"/>
               </w:rPr>
-              <w:t xml:space="preserve">Subjugation</w:t>
+              <w:t xml:space="preserve"> (Subjugation)</w:t>
             </w:r>
             <w:r>
               <w:rPr>
@@ -6170,7 +6213,7 @@
                 <w:rtl/>
                 <w:lang w:bidi="fa-IR"/>
               </w:rPr>
-              <w:t xml:space="preserve">)؛ ایثار (</w:t>
+              <w:t xml:space="preserve">؛ ایثار</w:t>
             </w:r>
             <w:r>
               <w:rPr>
@@ -6179,7 +6222,7 @@
                 <w:szCs w:val="20"/>
                 <w:lang w:val="en-US"/>
               </w:rPr>
-              <w:t xml:space="preserve">Self-Sacrifice</w:t>
+              <w:t xml:space="preserve"> (Self-Sacrifice)</w:t>
             </w:r>
             <w:r>
               <w:rPr>
@@ -6189,7 +6232,7 @@
                 <w:rtl/>
                 <w:lang w:bidi="fa-IR"/>
               </w:rPr>
-              <w:t xml:space="preserve">)؛ تأییدطلبی/جلب توجه (</w:t>
+              <w:t xml:space="preserve">؛ تأییدطلبی/جلب توجه</w:t>
             </w:r>
             <w:r>
               <w:rPr>
@@ -6198,7 +6241,7 @@
                 <w:szCs w:val="20"/>
                 <w:lang w:val="en-US"/>
               </w:rPr>
-              <w:t xml:space="preserve">Approval-Seeking/Recognition-Seeking)</w:t>
+              <w:t xml:space="preserve"> (Approval-Seeking/Recognition-Seeking)</w:t>
             </w:r>
           </w:p>
         </w:tc>
@@ -6222,7 +6265,7 @@
                 <w:rtl/>
                 <w:lang w:bidi="fa-IR"/>
               </w:rPr>
-              <w:t xml:space="preserve">۵. گوش‌به‌زنگی بیش از حد و بازداری (</w:t>
+              <w:t xml:space="preserve">۵. گوش‌به‌زنگی بیش از حد و بازداری</w:t>
             </w:r>
             <w:r>
               <w:rPr>
@@ -6231,7 +6274,7 @@
                 <w:szCs w:val="20"/>
                 <w:lang w:val="en-US"/>
               </w:rPr>
-              <w:t xml:space="preserve">Overvigilance and Inhibition)</w:t>
+              <w:t xml:space="preserve"> (Overvigilance and Inhibition)</w:t>
             </w:r>
           </w:p>
         </w:tc>
@@ -6275,7 +6318,7 @@
                 <w:rtl/>
                 <w:lang w:bidi="fa-IR"/>
               </w:rPr>
-              <w:t xml:space="preserve">منفی‌گرایی/بدبینی (</w:t>
+              <w:t xml:space="preserve">منفی‌گرایی/بدبینی</w:t>
             </w:r>
             <w:r>
               <w:rPr>
@@ -6284,7 +6327,7 @@
                 <w:szCs w:val="20"/>
                 <w:lang w:val="en-US"/>
               </w:rPr>
-              <w:t xml:space="preserve">Negativity/Pessimism</w:t>
+              <w:t xml:space="preserve"> (Negativity/Pessimism)</w:t>
             </w:r>
             <w:r>
               <w:rPr>
@@ -6294,7 +6337,7 @@
                 <w:rtl/>
                 <w:lang w:bidi="fa-IR"/>
               </w:rPr>
-              <w:t xml:space="preserve">)؛ بازداری هیجانی (</w:t>
+              <w:t xml:space="preserve">؛ بازداری هیجانی</w:t>
             </w:r>
             <w:r>
               <w:rPr>
@@ -6303,7 +6346,7 @@
                 <w:szCs w:val="20"/>
                 <w:lang w:val="en-US"/>
               </w:rPr>
-              <w:t xml:space="preserve">Emotional Inhibition</w:t>
+              <w:t xml:space="preserve"> (Emotional Inhibition)</w:t>
             </w:r>
             <w:r>
               <w:rPr>
@@ -6313,7 +6356,7 @@
                 <w:rtl/>
                 <w:lang w:bidi="fa-IR"/>
               </w:rPr>
-              <w:t xml:space="preserve">)؛ معیارهای سرسختانه/کمال‌گرایی افراطی (</w:t>
+              <w:t xml:space="preserve">؛ معیارهای سرسختانه/کمال‌گرایی افراطی</w:t>
             </w:r>
             <w:r>
               <w:rPr>
@@ -6322,7 +6365,7 @@
                 <w:szCs w:val="20"/>
                 <w:lang w:val="en-US"/>
               </w:rPr>
-              <w:t xml:space="preserve">Unrelenting Standards/Hypercriticalness</w:t>
+              <w:t xml:space="preserve"> (Unrelenting Standards/Hypercriticalness)</w:t>
             </w:r>
             <w:r>
               <w:rPr>
@@ -6332,7 +6375,7 @@
                 <w:rtl/>
                 <w:lang w:bidi="fa-IR"/>
               </w:rPr>
-              <w:t xml:space="preserve">)؛ تنبیه‌گری (</w:t>
+              <w:t xml:space="preserve">؛ تنبیه‌گری</w:t>
             </w:r>
             <w:r>
               <w:rPr>
@@ -6341,7 +6384,7 @@
                 <w:szCs w:val="20"/>
                 <w:lang w:val="en-US"/>
               </w:rPr>
-              <w:t xml:space="preserve">Punitiveness)</w:t>
+              <w:t xml:space="preserve"> (Punitiveness)</w:t>
             </w:r>
           </w:p>
         </w:tc>
@@ -6502,7 +6545,7 @@
           <w:rtl/>
           <w:lang w:bidi="fa-IR"/>
         </w:rPr>
-        <w:t xml:space="preserve">، ۱۹۹۵). این پرسشنامه در دو قالب اصلی تدوین شده است: فرم بلند که پوشش تفصیلی همه طرحواره‌ها را برای اهداف پژوهشی و بالینی فراهم می‌آورد و فرم کوتاه که نسخه فشرده آن برای غربالگری و پژوهش‌های میدانی طراحی شده است. در ادامه، نسخه‌های بین‌المللی این ابزار نیز در فرهنگ‌های مختلف اعتباریابی شده‌اند؛ از جمله ساژینو و همکاران که ویژگی‌های روان‌سنجی نسخه ایتالیایی فرم بلند پرسشنامه (</w:t>
+        <w:t xml:space="preserve">، ۱۹۹۵). این پرسشنامه در دو قالب اصلی تدوین شده است: فرم بلند که پوشش تفصیلی همه طرحواره‌ها را برای اهداف پژوهشی و بالینی فراهم می‌آورد و فرم کوتاه که نسخه فشرده آن برای غربالگری و پژوهش‌های میدانی طراحی شده است. در ادامه، نسخه‌های بین‌المللی این ابزار نیز در فرهنگ‌های مختلف اعتباریابی شده‌اند؛ از جمله ساژینو و همکاران که ویژگی‌های روان‌سنجی نسخه ایتالیایی فرم بلند پرسشنامه</w:t>
       </w:r>
       <w:r>
         <w:rPr>
@@ -6511,17 +6554,17 @@
           <w:szCs w:val="22"/>
           <w:lang w:val="en-US"/>
         </w:rPr>
-        <w:t xml:space="preserve">YSQ–L</w:t>
-      </w:r>
-      <w:r>
-        <w:rPr>
-          <w:rFonts w:ascii="B Nazanin" w:hAnsi="B Nazanin" w:cs="B Nazanin" w:hint="cs"/>
-          <w:sz w:val="24"/>
-          <w:szCs w:val="24"/>
-          <w:rtl/>
-          <w:lang w:bidi="fa-IR"/>
-        </w:rPr>
-        <w:t xml:space="preserve">3) را در یک مطالعه مقدماتی ارزیابی کردند و شواهدی برای ساختار عاملی این نسخه ارائه دادند (ساژینو و همکاران</w:t>
+        <w:t xml:space="preserve"> (YSQ–L3) </w:t>
+      </w:r>
+      <w:r>
+        <w:rPr>
+          <w:rFonts w:ascii="B Nazanin" w:hAnsi="B Nazanin" w:cs="B Nazanin" w:hint="cs"/>
+          <w:sz w:val="24"/>
+          <w:szCs w:val="24"/>
+          <w:rtl/>
+          <w:lang w:bidi="fa-IR"/>
+        </w:rPr>
+        <w:t xml:space="preserve">را در یک مطالعه مقدماتی ارزیابی کردند و شواهدی برای ساختار عاملی این نسخه ارائه دادند (ساژینو و همکاران</w:t>
       </w:r>
       <w:r>
         <w:rPr>
@@ -6835,19 +6878,21 @@
     </w:p>
     <w:p>
       <w:pPr>
+        <w:pStyle w:val="Heading4"/>
         <w:bidi w:val="1"/>
-        <w:spacing w:lineRule="exact" w:line="580" w:after="0"/>
-        <w:jc w:val="both"/>
-      </w:pPr>
-      <w:r>
-        <w:rPr>
-          <w:rFonts w:ascii="B Nazanin" w:hAnsi="B Nazanin" w:cs="B Nazanin" w:hint="cs"/>
-          <w:sz w:val="24"/>
-          <w:szCs w:val="24"/>
-          <w:rtl/>
-          <w:lang w:bidi="fa-IR"/>
-        </w:rPr>
-        <w:t xml:space="preserve">#### ۲-۲-۳-۱ تحمل ریسک مالی</w:t>
+        <w:jc w:val="right"/>
+      </w:pPr>
+      <w:r>
+        <w:rPr>
+          <w:rFonts w:ascii="B Nazanin" w:hAnsi="B Nazanin" w:cs="B Nazanin" w:hint="cs"/>
+          <w:b/>
+          <w:bCs/>
+          <w:sz w:val="24"/>
+          <w:szCs w:val="24"/>
+          <w:rtl/>
+          <w:lang w:bidi="fa-IR"/>
+        </w:rPr>
+        <w:t xml:space="preserve">۲-۲-۳-۱ تحمل ریسک مالی</w:t>
       </w:r>
     </w:p>
     <w:p>
@@ -7043,19 +7088,21 @@
     </w:p>
     <w:p>
       <w:pPr>
+        <w:pStyle w:val="Heading4"/>
         <w:bidi w:val="1"/>
-        <w:spacing w:lineRule="exact" w:line="580" w:after="0"/>
-        <w:jc w:val="both"/>
-      </w:pPr>
-      <w:r>
-        <w:rPr>
-          <w:rFonts w:ascii="B Nazanin" w:hAnsi="B Nazanin" w:cs="B Nazanin" w:hint="cs"/>
-          <w:sz w:val="24"/>
-          <w:szCs w:val="24"/>
-          <w:rtl/>
-          <w:lang w:bidi="fa-IR"/>
-        </w:rPr>
-        <w:t xml:space="preserve">#### ۲-۲-۴-۱ سازوکار نظری مدل میانجی‌گری</w:t>
+        <w:jc w:val="right"/>
+      </w:pPr>
+      <w:r>
+        <w:rPr>
+          <w:rFonts w:ascii="B Nazanin" w:hAnsi="B Nazanin" w:cs="B Nazanin" w:hint="cs"/>
+          <w:b/>
+          <w:bCs/>
+          <w:sz w:val="24"/>
+          <w:szCs w:val="24"/>
+          <w:rtl/>
+          <w:lang w:bidi="fa-IR"/>
+        </w:rPr>
+        <w:t xml:space="preserve">۲-۲-۴-۱ سازوکار نظری مدل میانجی‌گری</w:t>
       </w:r>
     </w:p>
     <w:p>
@@ -7194,17 +7241,17 @@
           <w:szCs w:val="22"/>
           <w:lang w:val="en-US"/>
         </w:rPr>
-        <w:t xml:space="preserve"> (PROCESS Model</w:t>
-      </w:r>
-      <w:r>
-        <w:rPr>
-          <w:rFonts w:ascii="B Nazanin" w:hAnsi="B Nazanin" w:cs="B Nazanin" w:hint="cs"/>
-          <w:sz w:val="24"/>
-          <w:szCs w:val="24"/>
-          <w:rtl/>
-          <w:lang w:bidi="fa-IR"/>
-        </w:rPr>
-        <w:t xml:space="preserve"> 4) که برای آزمون چنین ساختارهایی طراحی شده است (هایز، ۲۰۱۸). انتخاب روش نهایی برآورد، تابع حجم نمونه و مفروضه‌های آماری خواهد بود و در فصل روش‌شناسی تفصیل می‌یابد.</w:t>
+        <w:t xml:space="preserve"> (PROCESS Model 4) </w:t>
+      </w:r>
+      <w:r>
+        <w:rPr>
+          <w:rFonts w:ascii="B Nazanin" w:hAnsi="B Nazanin" w:cs="B Nazanin" w:hint="cs"/>
+          <w:sz w:val="24"/>
+          <w:szCs w:val="24"/>
+          <w:rtl/>
+          <w:lang w:bidi="fa-IR"/>
+        </w:rPr>
+        <w:t xml:space="preserve">که برای آزمون چنین ساختارهایی طراحی شده است (هایز، ۲۰۱۸). انتخاب روش نهایی برآورد، تابع حجم نمونه و مفروضه‌های آماری خواهد بود و در فصل روش‌شناسی تفصیل می‌یابد.</w:t>
       </w:r>
     </w:p>
     <w:p>
@@ -7431,7 +7478,7 @@
           <w:rtl/>
           <w:lang w:bidi="fa-IR"/>
         </w:rPr>
-        <w:t xml:space="preserve">سافیتری و همکاران  )۲۰۲۵ (در مطالعه‌ای با عنوان "تأثیر اجتماعی-روانی در تصمیم‌گیری سرمایه‌گذاری با میانجی‌گری تحمل ریسک"، یک مدل ساختاری را آزمون کردند. موضوع دقیق پژوهش آن‌ها، بررسی دقیق مسیری بود که عوامل روانی از طریق آن بر تصمیم نهایی خرید یا فروش اثر می‌گذارند. یافته کلیدی این مطالعه با قطعیت آماری (</w:t>
+        <w:t xml:space="preserve">سافیتری و همکاران  )۲۰۲۵ (در مطالعه‌ای با عنوان "تأثیر اجتماعی-روانی در تصمیم‌گیری سرمایه‌گذاری با میانجی‌گری تحمل ریسک"، یک مدل ساختاری را آزمون کردند. موضوع دقیق پژوهش آن‌ها، بررسی دقیق مسیری بود که عوامل روانی از طریق آن بر تصمیم نهایی خرید یا فروش اثر می‌گذارند. یافته کلیدی این مطالعه با قطعیت آماری</w:t>
       </w:r>
       <w:r>
         <w:rPr>
@@ -7440,17 +7487,17 @@
           <w:szCs w:val="22"/>
           <w:lang w:val="en-US"/>
         </w:rPr>
-        <w:t xml:space="preserve">P</w:t>
-      </w:r>
-      <w:r>
-        <w:rPr>
-          <w:rFonts w:ascii="B Nazanin" w:hAnsi="B Nazanin" w:cs="B Nazanin" w:hint="cs"/>
-          <w:sz w:val="24"/>
-          <w:szCs w:val="24"/>
-          <w:rtl/>
-          <w:lang w:bidi="fa-IR"/>
-        </w:rPr>
-        <w:t xml:space="preserve">&lt;0.05) نشان داد که عوامل اضطرابی هم بر خودِ فرآیند "تصمیم‌گیری" و هم بر ظرفیت روانی "تحمل ریسک" اثر تخریبی دارند. این مطالعه مستقیماً از مدل مفهومی تحقیق حاضر پشتیبانی می‌کند، زیرا نشان می‌دهد متغیرهای روانشناختی (مانند اضطراب) مستقیماً ظرفیت ریسک‌پذیری (تحمل ریسک) را که شاخص اصلی رفتار مالی در پژوهش حاضر است، دستخوش تغییر می‌کنند.</w:t>
+        <w:t xml:space="preserve"> (P&lt;0.05) </w:t>
+      </w:r>
+      <w:r>
+        <w:rPr>
+          <w:rFonts w:ascii="B Nazanin" w:hAnsi="B Nazanin" w:cs="B Nazanin" w:hint="cs"/>
+          <w:sz w:val="24"/>
+          <w:szCs w:val="24"/>
+          <w:rtl/>
+          <w:lang w:bidi="fa-IR"/>
+        </w:rPr>
+        <w:t xml:space="preserve">نشان داد که عوامل اضطرابی هم بر خودِ فرآیند "تصمیم‌گیری" و هم بر ظرفیت روانی "تحمل ریسک" اثر تخریبی دارند. این مطالعه مستقیماً از مدل مفهومی تحقیق حاضر پشتیبانی می‌کند، زیرا نشان می‌دهد متغیرهای روانشناختی (مانند اضطراب) مستقیماً ظرفیت ریسک‌پذیری (تحمل ریسک) را که شاخص اصلی رفتار مالی در پژوهش حاضر است، دستخوش تغییر می‌کنند.</w:t>
       </w:r>
     </w:p>
     <w:p>
@@ -8076,7 +8123,7 @@
           <w:rtl/>
           <w:lang w:bidi="fa-IR"/>
         </w:rPr>
-        <w:t xml:space="preserve">بر پایه مبانی نظری و پیشینه پژوهشی مرورشده در این فصل، مدل مفهومی پژوهش حاضر از سه متغیر اصلی تشکیل شده است که جایگاه هر یک در ساختار مدل و ابزار سنجش آن به‌طور مشخص تعریف می‌شود. اضطراب صفتی به‌عنوان متغیر مستقل، نقطه آغاز مدل است و با فرم اضطراب صفتی (</w:t>
+        <w:t xml:space="preserve">بر پایه مبانی نظری و پیشینه پژوهشی مرورشده در این فصل، مدل مفهومی پژوهش حاضر از سه متغیر اصلی تشکیل شده است که جایگاه هر یک در ساختار مدل و ابزار سنجش آن به‌طور مشخص تعریف می‌شود. اضطراب صفتی به‌عنوان متغیر مستقل، نقطه آغاز مدل است و با فرم اضطراب صفتی</w:t>
       </w:r>
       <w:r>
         <w:rPr>
@@ -8085,17 +8132,17 @@
           <w:szCs w:val="22"/>
           <w:lang w:val="en-US"/>
         </w:rPr>
-        <w:t xml:space="preserve">Y</w:t>
-      </w:r>
-      <w:r>
-        <w:rPr>
-          <w:rFonts w:ascii="B Nazanin" w:hAnsi="B Nazanin" w:cs="B Nazanin" w:hint="cs"/>
-          <w:sz w:val="24"/>
-          <w:szCs w:val="24"/>
-          <w:rtl/>
-          <w:lang w:bidi="fa-IR"/>
-        </w:rPr>
-        <w:t xml:space="preserve">-2) پرسشنامه اضطراب حالت-صفت اسپیلبرگر سنجیده می‌شود. طرحواره‌های ناسازگار اولیه به‌عنوان متغیر میانجی، مکانیسم انتقال اثر اضطراب به رفتار مالی را بازنمایی می‌کنند و با پرسشنامه طرحواره یانگ — فرم کوتاه ارزیابی می‌گردند. رفتارهای مالی پرخطر نیز به‌عنوان متغیر وابسته، در قالب سازه تحمل ریسک مالی و با مقیاس سیزده‌سؤالی گرابل و لایتون اندازه‌گیری می‌شود؛ به‌گونه‌ای که نمرات بالاتر، نشان‌دهنده تمایل بیشتر به پذیرش ریسک و در نتیجه بروز بیشتر رفتارهای مالی پرخطر است. انتخاب این سه سازه و ابزارهای سنجش آن‌ها، برآیند مستقیم تحلیل نظری فصل حاضر است و در عین حال با تعاریف عملیاتی مندرج در فصل اول پایان‌نامه هم‌خوانی کامل دارد.</w:t>
+        <w:t xml:space="preserve"> (Y-2) </w:t>
+      </w:r>
+      <w:r>
+        <w:rPr>
+          <w:rFonts w:ascii="B Nazanin" w:hAnsi="B Nazanin" w:cs="B Nazanin" w:hint="cs"/>
+          <w:sz w:val="24"/>
+          <w:szCs w:val="24"/>
+          <w:rtl/>
+          <w:lang w:bidi="fa-IR"/>
+        </w:rPr>
+        <w:t xml:space="preserve">پرسشنامه اضطراب حالت-صفت اسپیلبرگر سنجیده می‌شود. طرحواره‌های ناسازگار اولیه به‌عنوان متغیر میانجی، مکانیسم انتقال اثر اضطراب به رفتار مالی را بازنمایی می‌کنند و با پرسشنامه طرحواره یانگ — فرم کوتاه ارزیابی می‌گردند. رفتارهای مالی پرخطر نیز به‌عنوان متغیر وابسته، در قالب سازه تحمل ریسک مالی و با مقیاس سیزده‌سؤالی گرابل و لایتون اندازه‌گیری می‌شود؛ به‌گونه‌ای که نمرات بالاتر، نشان‌دهنده تمایل بیشتر به پذیرش ریسک و در نتیجه بروز بیشتر رفتارهای مالی پرخطر است. انتخاب این سه سازه و ابزارهای سنجش آن‌ها، برآیند مستقیم تحلیل نظری فصل حاضر است و در عین حال با تعاریف عملیاتی مندرج در فصل اول پایان‌نامه هم‌خوانی کامل دارد.</w:t>
       </w:r>
     </w:p>
     <w:tbl>
@@ -8203,7 +8250,7 @@
                 <w:rtl/>
                 <w:lang w:bidi="fa-IR"/>
               </w:rPr>
-              <w:t xml:space="preserve">مسیر </w:t>
+              <w:t xml:space="preserve">مسیر</w:t>
             </w:r>
             <w:r>
               <w:rPr>
@@ -8212,7 +8259,7 @@
                 <w:szCs w:val="20"/>
                 <w:lang w:val="en-US"/>
               </w:rPr>
-              <w:t xml:space="preserve">a</w:t>
+              <w:t xml:space="preserve"> a</w:t>
             </w:r>
           </w:p>
         </w:tc>
@@ -8234,7 +8281,7 @@
                 <w:rtl/>
                 <w:lang w:bidi="fa-IR"/>
               </w:rPr>
-              <w:t xml:space="preserve">مسیر غیرمستقیم (</w:t>
+              <w:t xml:space="preserve">مسیر غیرمستقیم</w:t>
             </w:r>
             <w:r>
               <w:rPr>
@@ -8243,7 +8290,7 @@
                 <w:szCs w:val="20"/>
                 <w:lang w:val="en-US"/>
               </w:rPr>
-              <w:t xml:space="preserve">a×b)</w:t>
+              <w:t xml:space="preserve"> (a×b)</w:t>
             </w:r>
           </w:p>
         </w:tc>
@@ -8265,7 +8312,7 @@
                 <w:rtl/>
                 <w:lang w:bidi="fa-IR"/>
               </w:rPr>
-              <w:t xml:space="preserve">مسیر </w:t>
+              <w:t xml:space="preserve">مسیر</w:t>
             </w:r>
             <w:r>
               <w:rPr>
@@ -8274,7 +8321,7 @@
                 <w:szCs w:val="20"/>
                 <w:lang w:val="en-US"/>
               </w:rPr>
-              <w:t xml:space="preserve">b</w:t>
+              <w:t xml:space="preserve"> b</w:t>
             </w:r>
           </w:p>
         </w:tc>
@@ -8349,7 +8396,7 @@
           <w:rtl/>
           <w:lang w:bidi="fa-IR"/>
         </w:rPr>
-        <w:t xml:space="preserve">• مسیر </w:t>
+        <w:t xml:space="preserve">• مسیر</w:t>
       </w:r>
       <w:r>
         <w:rPr>
@@ -8358,17 +8405,17 @@
           <w:szCs w:val="22"/>
           <w:lang w:val="en-US"/>
         </w:rPr>
-        <w:t xml:space="preserve">a</w:t>
-      </w:r>
-      <w:r>
-        <w:rPr>
-          <w:rFonts w:ascii="B Nazanin" w:hAnsi="B Nazanin" w:cs="B Nazanin" w:hint="cs"/>
-          <w:sz w:val="24"/>
-          <w:szCs w:val="24"/>
-          <w:rtl/>
-          <w:lang w:bidi="fa-IR"/>
-        </w:rPr>
-        <w:t xml:space="preserve">: اضطراب صفتی ← طرحواره‌های ناسازگار اولیه</w:t>
+        <w:t xml:space="preserve"> a: </w:t>
+      </w:r>
+      <w:r>
+        <w:rPr>
+          <w:rFonts w:ascii="B Nazanin" w:hAnsi="B Nazanin" w:cs="B Nazanin" w:hint="cs"/>
+          <w:sz w:val="24"/>
+          <w:szCs w:val="24"/>
+          <w:rtl/>
+          <w:lang w:bidi="fa-IR"/>
+        </w:rPr>
+        <w:t xml:space="preserve">اضطراب صفتی ← طرحواره‌های ناسازگار اولیه</w:t>
       </w:r>
     </w:p>
     <w:p>
@@ -8386,7 +8433,7 @@
           <w:rtl/>
           <w:lang w:bidi="fa-IR"/>
         </w:rPr>
-        <w:t xml:space="preserve">• مسیر </w:t>
+        <w:t xml:space="preserve">• مسیر</w:t>
       </w:r>
       <w:r>
         <w:rPr>
@@ -8395,17 +8442,17 @@
           <w:szCs w:val="22"/>
           <w:lang w:val="en-US"/>
         </w:rPr>
-        <w:t xml:space="preserve">b</w:t>
-      </w:r>
-      <w:r>
-        <w:rPr>
-          <w:rFonts w:ascii="B Nazanin" w:hAnsi="B Nazanin" w:cs="B Nazanin" w:hint="cs"/>
-          <w:sz w:val="24"/>
-          <w:szCs w:val="24"/>
-          <w:rtl/>
-          <w:lang w:bidi="fa-IR"/>
-        </w:rPr>
-        <w:t xml:space="preserve">: طرحواره‌های ناسازگار اولیه ← رفتارهای مالی پرخطر</w:t>
+        <w:t xml:space="preserve"> b: </w:t>
+      </w:r>
+      <w:r>
+        <w:rPr>
+          <w:rFonts w:ascii="B Nazanin" w:hAnsi="B Nazanin" w:cs="B Nazanin" w:hint="cs"/>
+          <w:sz w:val="24"/>
+          <w:szCs w:val="24"/>
+          <w:rtl/>
+          <w:lang w:bidi="fa-IR"/>
+        </w:rPr>
+        <w:t xml:space="preserve">طرحواره‌های ناسازگار اولیه ← رفتارهای مالی پرخطر</w:t>
       </w:r>
     </w:p>
     <w:p>
@@ -8423,7 +8470,7 @@
           <w:rtl/>
           <w:lang w:bidi="fa-IR"/>
         </w:rPr>
-        <w:t xml:space="preserve">• مسیر غیرمستقیم (</w:t>
+        <w:t xml:space="preserve">• مسیر غیرمستقیم</w:t>
       </w:r>
       <w:r>
         <w:rPr>
@@ -8432,17 +8479,17 @@
           <w:szCs w:val="22"/>
           <w:lang w:val="en-US"/>
         </w:rPr>
-        <w:t xml:space="preserve">a×b</w:t>
-      </w:r>
-      <w:r>
-        <w:rPr>
-          <w:rFonts w:ascii="B Nazanin" w:hAnsi="B Nazanin" w:cs="B Nazanin" w:hint="cs"/>
-          <w:sz w:val="24"/>
-          <w:szCs w:val="24"/>
-          <w:rtl/>
-          <w:lang w:bidi="fa-IR"/>
-        </w:rPr>
-        <w:t xml:space="preserve">): اثر میانجی طرحواره‌ها در انتقال اثر اضطراب صفتی به رفتارهای مالی پرخطر</w:t>
+        <w:t xml:space="preserve"> (a×b): </w:t>
+      </w:r>
+      <w:r>
+        <w:rPr>
+          <w:rFonts w:ascii="B Nazanin" w:hAnsi="B Nazanin" w:cs="B Nazanin" w:hint="cs"/>
+          <w:sz w:val="24"/>
+          <w:szCs w:val="24"/>
+          <w:rtl/>
+          <w:lang w:bidi="fa-IR"/>
+        </w:rPr>
+        <w:t xml:space="preserve">اثر میانجی طرحواره‌ها در انتقال اثر اضطراب صفتی به رفتارهای مالی پرخطر</w:t>
       </w:r>
     </w:p>
     <w:p>
@@ -8459,7 +8506,7 @@
           <w:rtl/>
           <w:lang w:bidi="fa-IR"/>
         </w:rPr>
-        <w:t xml:space="preserve">فرضیه‌های پژوهش دقیقاً بر همین ساختار مسیرها استوارند و هر فرضیه به مسیر متناظر خود در مدل ارجاع می‌شود. بر این اساس، فرضیه فرعی دوم مقرر می‌دارد که «بین اضطراب صفتی و رفتارهای مالی پرخطر، رابطه مثبت و معناداری وجود دارد» و ناظر به مسیر مستقیم مدل است. فرضیه فرعی سوم بیان می‌کند که «بین اضطراب صفتی و طرحواره‌های ناسازگار اولیه، رابطه مثبت و معناداری وجود دارد» و مسیر </w:t>
+        <w:t xml:space="preserve">فرضیه‌های پژوهش دقیقاً بر همین ساختار مسیرها استوارند و هر فرضیه به مسیر متناظر خود در مدل ارجاع می‌شود. بر این اساس، فرضیه فرعی دوم مقرر می‌دارد که «بین اضطراب صفتی و رفتارهای مالی پرخطر، رابطه مثبت و معناداری وجود دارد» و ناظر به مسیر مستقیم مدل است. فرضیه فرعی سوم بیان می‌کند که «بین اضطراب صفتی و طرحواره‌های ناسازگار اولیه، رابطه مثبت و معناداری وجود دارد» و مسیر</w:t>
       </w:r>
       <w:r>
         <w:rPr>
@@ -8468,17 +8515,17 @@
           <w:szCs w:val="22"/>
           <w:lang w:val="en-US"/>
         </w:rPr>
-        <w:t xml:space="preserve">a</w:t>
-      </w:r>
-      <w:r>
-        <w:rPr>
-          <w:rFonts w:ascii="B Nazanin" w:hAnsi="B Nazanin" w:cs="B Nazanin" w:hint="cs"/>
-          <w:sz w:val="24"/>
-          <w:szCs w:val="24"/>
-          <w:rtl/>
-          <w:lang w:bidi="fa-IR"/>
-        </w:rPr>
-        <w:t xml:space="preserve"> را آزمون می‌کند. فرضیه فرعی چهارم نیز مقرر می‌دارد که «بین طرحواره‌های ناسازگار اولیه و رفتارهای مالی پرخطر، رابطه مثبت و معناداری وجود دارد» و با مسیر </w:t>
+        <w:t xml:space="preserve"> a </w:t>
+      </w:r>
+      <w:r>
+        <w:rPr>
+          <w:rFonts w:ascii="B Nazanin" w:hAnsi="B Nazanin" w:cs="B Nazanin" w:hint="cs"/>
+          <w:sz w:val="24"/>
+          <w:szCs w:val="24"/>
+          <w:rtl/>
+          <w:lang w:bidi="fa-IR"/>
+        </w:rPr>
+        <w:t xml:space="preserve">را آزمون می‌کند. فرضیه فرعی چهارم نیز مقرر می‌دارد که «بین طرحواره‌های ناسازگار اولیه و رفتارهای مالی پرخطر، رابطه مثبت و معناداری وجود دارد» و با مسیر</w:t>
       </w:r>
       <w:r>
         <w:rPr>
@@ -8487,17 +8534,17 @@
           <w:szCs w:val="22"/>
           <w:lang w:val="en-US"/>
         </w:rPr>
-        <w:t xml:space="preserve">b</w:t>
-      </w:r>
-      <w:r>
-        <w:rPr>
-          <w:rFonts w:ascii="B Nazanin" w:hAnsi="B Nazanin" w:cs="B Nazanin" w:hint="cs"/>
-          <w:sz w:val="24"/>
-          <w:szCs w:val="24"/>
-          <w:rtl/>
-          <w:lang w:bidi="fa-IR"/>
-        </w:rPr>
-        <w:t xml:space="preserve"> متناظر است. در نهایت، فرضیه اصلی پژوهش تصریح می‌کند که «طرحواره‌های ناسازگار اولیه در رابطه بین اضطراب صفتی و رفتارهای مالی پرخطر، نقش میانجی‌گر معناداری دارند»؛ این فرضیه به‌طور مشخص بر معناداری مسیر غیرمستقیم (</w:t>
+        <w:t xml:space="preserve"> b </w:t>
+      </w:r>
+      <w:r>
+        <w:rPr>
+          <w:rFonts w:ascii="B Nazanin" w:hAnsi="B Nazanin" w:cs="B Nazanin" w:hint="cs"/>
+          <w:sz w:val="24"/>
+          <w:szCs w:val="24"/>
+          <w:rtl/>
+          <w:lang w:bidi="fa-IR"/>
+        </w:rPr>
+        <w:t xml:space="preserve">متناظر است. در نهایت، فرضیه اصلی پژوهش تصریح می‌کند که «طرحواره‌های ناسازگار اولیه در رابطه بین اضطراب صفتی و رفتارهای مالی پرخطر، نقش میانجی‌گر معناداری دارند»؛ این فرضیه به‌طور مشخص بر معناداری مسیر غیرمستقیم</w:t>
       </w:r>
       <w:r>
         <w:rPr>
@@ -8506,17 +8553,17 @@
           <w:szCs w:val="22"/>
           <w:lang w:val="en-US"/>
         </w:rPr>
-        <w:t xml:space="preserve">a×b</w:t>
-      </w:r>
-      <w:r>
-        <w:rPr>
-          <w:rFonts w:ascii="B Nazanin" w:hAnsi="B Nazanin" w:cs="B Nazanin" w:hint="cs"/>
-          <w:sz w:val="24"/>
-          <w:szCs w:val="24"/>
-          <w:rtl/>
-          <w:lang w:bidi="fa-IR"/>
-        </w:rPr>
-        <w:t xml:space="preserve">) دلالت دارد و آزمون آن، هسته تحلیلی پژوهش حاضر را تشکیل می‌دهد.</w:t>
+        <w:t xml:space="preserve"> (a×b) </w:t>
+      </w:r>
+      <w:r>
+        <w:rPr>
+          <w:rFonts w:ascii="B Nazanin" w:hAnsi="B Nazanin" w:cs="B Nazanin" w:hint="cs"/>
+          <w:sz w:val="24"/>
+          <w:szCs w:val="24"/>
+          <w:rtl/>
+          <w:lang w:bidi="fa-IR"/>
+        </w:rPr>
+        <w:t xml:space="preserve">دلالت دارد و آزمون آن، هسته تحلیلی پژوهش حاضر را تشکیل می‌دهد.</w:t>
       </w:r>
     </w:p>
     <w:p>
@@ -8802,7 +8849,7 @@
           <w:rtl/>
           <w:lang w:bidi="fa-IR"/>
         </w:rPr>
-        <w:t xml:space="preserve">برای برآورد این مدل، دو چارچوب تحلیلی در نظر گرفته شده است: روش اصلی، مدل‌سازی معادلات ساختاری است که در صورت کفایت حجم نمونه به کار گرفته خواهد شد، و روش جایگزین، تحلیل مسیر با ماکروی پراسس — الگوی شماره ۴ (</w:t>
+        <w:t xml:space="preserve">برای برآورد این مدل، دو چارچوب تحلیلی در نظر گرفته شده است: روش اصلی، مدل‌سازی معادلات ساختاری است که در صورت کفایت حجم نمونه به کار گرفته خواهد شد، و روش جایگزین، تحلیل مسیر با ماکروی پراسس — الگوی شماره ۴</w:t>
       </w:r>
       <w:r>
         <w:rPr>
@@ -8811,17 +8858,17 @@
           <w:szCs w:val="22"/>
           <w:lang w:val="en-US"/>
         </w:rPr>
-        <w:t xml:space="preserve">PROCESS, Model</w:t>
-      </w:r>
-      <w:r>
-        <w:rPr>
-          <w:rFonts w:ascii="B Nazanin" w:hAnsi="B Nazanin" w:cs="B Nazanin" w:hint="cs"/>
-          <w:sz w:val="24"/>
-          <w:szCs w:val="24"/>
-          <w:rtl/>
-          <w:lang w:bidi="fa-IR"/>
-        </w:rPr>
-        <w:t xml:space="preserve"> 4) همراه با آزمون بوت‌استرپ برای اثرات غیرمستقیم است (هایز، ۲۰۱۸). تفصیل روش‌های تحلیل، مفروضه‌ها و شاخص‌های برازش در بخش روش تحلیل داده‌ها ارائه خواهد شد.</w:t>
+        <w:t xml:space="preserve"> (PROCESS, Model 4) </w:t>
+      </w:r>
+      <w:r>
+        <w:rPr>
+          <w:rFonts w:ascii="B Nazanin" w:hAnsi="B Nazanin" w:cs="B Nazanin" w:hint="cs"/>
+          <w:sz w:val="24"/>
+          <w:szCs w:val="24"/>
+          <w:rtl/>
+          <w:lang w:bidi="fa-IR"/>
+        </w:rPr>
+        <w:t xml:space="preserve">همراه با آزمون بوت‌استرپ برای اثرات غیرمستقیم است (هایز، ۲۰۱۸). تفصیل روش‌های تحلیل، مفروضه‌ها و شاخص‌های برازش در بخش روش تحلیل داده‌ها ارائه خواهد شد.</w:t>
       </w:r>
     </w:p>
     <w:p>
@@ -9200,7 +9247,7 @@
           <w:rtl/>
           <w:lang w:bidi="fa-IR"/>
         </w:rPr>
-        <w:t xml:space="preserve">برای سنجش متغیرهای پژوهش از سه ابزار استاندارد استفاده می‌شود که هر یک با یکی از متغیرهای مدل میانجی‌گری متناظر است: پرسشنامه اضطراب حالت-صفت اسپیلبرگر — فرم صفتی (</w:t>
+        <w:t xml:space="preserve">برای سنجش متغیرهای پژوهش از سه ابزار استاندارد استفاده می‌شود که هر یک با یکی از متغیرهای مدل میانجی‌گری متناظر است: پرسشنامه اضطراب حالت-صفت اسپیلبرگر — فرم صفتی</w:t>
       </w:r>
       <w:r>
         <w:rPr>
@@ -9209,17 +9256,17 @@
           <w:szCs w:val="22"/>
           <w:lang w:val="en-US"/>
         </w:rPr>
-        <w:t xml:space="preserve">Y</w:t>
-      </w:r>
-      <w:r>
-        <w:rPr>
-          <w:rFonts w:ascii="B Nazanin" w:hAnsi="B Nazanin" w:cs="B Nazanin" w:hint="cs"/>
-          <w:sz w:val="24"/>
-          <w:szCs w:val="24"/>
-          <w:rtl/>
-          <w:lang w:bidi="fa-IR"/>
-        </w:rPr>
-        <w:t xml:space="preserve">-2) برای سنجش اضطراب صفتی، پرسشنامه طرحواره یانگ — فرم کوتاه برای سنجش طرحواره‌های ناسازگار اولیه، و مقیاس تحمل ریسک مالی گرابل و لایتون برای سنجش رفتارهای مالی پرخطر. این سه ابزار به همراه سؤالات جمعیت‌شناختی در قالب یک پرسشنامه آنلاین یکپارچه ارائه می‌شوند. در ادامه، ساختار، نمره‌گذاری و ویژگی‌های روان‌سنجی هر ابزار به تفصیل بیان می‌شود. در فرم آنلاین، این ابزارها به ترتیب پس از سؤالات جمعیت‌شناختی و با فاصله‌گذاری مناسب ارائه می‌شوند تا خستگی پاسخ‌دهنده به حداقل برسد.</w:t>
+        <w:t xml:space="preserve"> (Y-2) </w:t>
+      </w:r>
+      <w:r>
+        <w:rPr>
+          <w:rFonts w:ascii="B Nazanin" w:hAnsi="B Nazanin" w:cs="B Nazanin" w:hint="cs"/>
+          <w:sz w:val="24"/>
+          <w:szCs w:val="24"/>
+          <w:rtl/>
+          <w:lang w:bidi="fa-IR"/>
+        </w:rPr>
+        <w:t xml:space="preserve">برای سنجش اضطراب صفتی، پرسشنامه طرحواره یانگ — فرم کوتاه برای سنجش طرحواره‌های ناسازگار اولیه، و مقیاس تحمل ریسک مالی گرابل و لایتون برای سنجش رفتارهای مالی پرخطر. این سه ابزار به همراه سؤالات جمعیت‌شناختی در قالب یک پرسشنامه آنلاین یکپارچه ارائه می‌شوند. در ادامه، ساختار، نمره‌گذاری و ویژگی‌های روان‌سنجی هر ابزار به تفصیل بیان می‌شود. در فرم آنلاین، این ابزارها به ترتیب پس از سؤالات جمعیت‌شناختی و با فاصله‌گذاری مناسب ارائه می‌شوند تا خستگی پاسخ‌دهنده به حداقل برسد.</w:t>
       </w:r>
     </w:p>
     <w:p>
@@ -9238,7 +9285,7 @@
           <w:rtl/>
           <w:lang w:bidi="fa-IR"/>
         </w:rPr>
-        <w:t xml:space="preserve">۳-۴-۱. پرسشنامه اضطراب حالت-صفت اسپیلبرگر — فرم صفتی (</w:t>
+        <w:t xml:space="preserve">۳-۴-۱. پرسشنامه اضطراب حالت-صفت اسپیلبرگر — فرم صفتی</w:t>
       </w:r>
       <w:r>
         <w:rPr>
@@ -9249,7 +9296,7 @@
           <w:szCs w:val="26"/>
           <w:lang w:val="en-US"/>
         </w:rPr>
-        <w:t xml:space="preserve">STAI-Y2)</w:t>
+        <w:t xml:space="preserve"> (STAI-Y2)</w:t>
       </w:r>
     </w:p>
     <w:p>
@@ -9302,7 +9349,7 @@
           <w:rtl/>
           <w:lang w:bidi="fa-IR"/>
         </w:rPr>
-        <w:t xml:space="preserve"> (۱۹۷۰) ساخته شد و راهنمای بازنگری‌شده آن توسط اسپیلبرگر (۱۹۸۳) منتشر شده است. این پرسشنامه برای سنجش اضطراب در دو سطح طراحی شده است. سطح نخست، اضطراب حالتی است؛ واکنشی هیجانی، گذرا و وابسته به موقعیت. سطح دوم، اضطراب صفتی؛ یعنی ویژگی شخصیتی پایدار فرد. در پژوهش حاضر تنها از فرم اضطراب صفتی (</w:t>
+        <w:t xml:space="preserve"> (۱۹۷۰) ساخته شد و راهنمای بازنگری‌شده آن توسط اسپیلبرگر (۱۹۸۳) منتشر شده است. این پرسشنامه برای سنجش اضطراب در دو سطح طراحی شده است. سطح نخست، اضطراب حالتی است؛ واکنشی هیجانی، گذرا و وابسته به موقعیت. سطح دوم، اضطراب صفتی؛ یعنی ویژگی شخصیتی پایدار فرد. در پژوهش حاضر تنها از فرم اضطراب صفتی</w:t>
       </w:r>
       <w:r>
         <w:rPr>
@@ -9311,17 +9358,17 @@
           <w:szCs w:val="22"/>
           <w:lang w:val="en-US"/>
         </w:rPr>
-        <w:t xml:space="preserve">Y</w:t>
-      </w:r>
-      <w:r>
-        <w:rPr>
-          <w:rFonts w:ascii="B Nazanin" w:hAnsi="B Nazanin" w:cs="B Nazanin" w:hint="cs"/>
-          <w:sz w:val="24"/>
-          <w:szCs w:val="24"/>
-          <w:rtl/>
-          <w:lang w:bidi="fa-IR"/>
-        </w:rPr>
-        <w:t xml:space="preserve">-2) استفاده می‌شود؛ هدف، سنجش زمینه شخصیتی پایدار اضطراب در معامله‌گران است، نه واکنش لحظه‌ای آنان به یک موقعیت خاص. بر همین اساس، فرم حالت (اضطراب حالتی) در این پژوهش اجرا نمی‌شود؛ چه آنکه هدف، سنجش زمینه پایدار آسیب‌پذیری در برابر فشارهای بازار است، نه شدت اضطراب آزمودنی در لحظه پاسخ‌دهی.</w:t>
+        <w:t xml:space="preserve"> (Y-2) </w:t>
+      </w:r>
+      <w:r>
+        <w:rPr>
+          <w:rFonts w:ascii="B Nazanin" w:hAnsi="B Nazanin" w:cs="B Nazanin" w:hint="cs"/>
+          <w:sz w:val="24"/>
+          <w:szCs w:val="24"/>
+          <w:rtl/>
+          <w:lang w:bidi="fa-IR"/>
+        </w:rPr>
+        <w:t xml:space="preserve">استفاده می‌شود؛ هدف، سنجش زمینه شخصیتی پایدار اضطراب در معامله‌گران است، نه واکنش لحظه‌ای آنان به یک موقعیت خاص. بر همین اساس، فرم حالت (اضطراب حالتی) در این پژوهش اجرا نمی‌شود؛ چه آنکه هدف، سنجش زمینه پایدار آسیب‌پذیری در برابر فشارهای بازار است، نه شدت اضطراب آزمودنی در لحظه پاسخ‌دهی.</w:t>
       </w:r>
     </w:p>
     <w:p>
@@ -9392,111 +9439,6 @@
           <w:lang w:bidi="fa-IR"/>
         </w:rPr>
         <w:t xml:space="preserve">۳-۴-۲. پرسشنامه طرحواره‌های ناسازگار اولیه یانگ — فرم کوتاه</w:t>
-      </w:r>
-    </w:p>
-    <w:p>
-      <w:pPr>
-        <w:bidi w:val="1"/>
-        <w:spacing w:lineRule="exact" w:line="580" w:after="0"/>
-        <w:jc w:val="both"/>
-      </w:pPr>
-      <w:r>
-        <w:rPr>
-          <w:rFonts w:ascii="B Nazanin" w:hAnsi="B Nazanin" w:cs="B Nazanin" w:hint="cs"/>
-          <w:sz w:val="24"/>
-          <w:szCs w:val="24"/>
-          <w:rtl/>
-          <w:lang w:bidi="fa-IR"/>
-        </w:rPr>
-        <w:t xml:space="preserve">پرسشنامه طرحواره یانگ — فرم کوتاه </w:t>
-      </w:r>
-      <w:r>
-        <w:rPr>
-          <w:rFonts w:ascii="B Nazanin" w:hAnsi="B Nazanin" w:cs="B Nazanin" w:hint="cs"/>
-          <w:vertAlign w:val="superscript"/>
-          <w:rtl/>
-        </w:rPr>
-        <w:footnoteReference w:id="41"/>
-      </w:r>
-      <w:r>
-        <w:rPr>
-          <w:rFonts w:ascii="B Nazanin" w:hAnsi="B Nazanin" w:cs="B Nazanin" w:hint="cs"/>
-          <w:sz w:val="24"/>
-          <w:szCs w:val="24"/>
-          <w:rtl/>
-          <w:lang w:bidi="fa-IR"/>
-        </w:rPr>
-        <w:t xml:space="preserve"> توسط یانگ (۱۹۹۸) به عنوان نسخه‌ای کوتاه‌تر از ابزار اصلی برای سنجش ۱۵ طرحواره ناسازگار اولیه تدوین شده است. این پرسشنامه شامل ۷۵ گویه است که به ازای هر طرحواره، ۵ گویه را در بر می‌گیرد و بر اساس نظریه طرحواره، الگوهای هیجانی و شناختی عمیق و پایداری را می‌سنجد که در دوران کودکی و نوجوانی شکل گرفته‌اند و تفسیر فرد از موقعیت‌های زندگی را جهت می‌دهند.</w:t>
-      </w:r>
-    </w:p>
-    <w:p>
-      <w:pPr>
-        <w:bidi w:val="1"/>
-        <w:spacing w:lineRule="exact" w:line="580" w:after="0"/>
-        <w:jc w:val="both"/>
-      </w:pPr>
-      <w:r>
-        <w:rPr>
-          <w:rFonts w:ascii="B Nazanin" w:hAnsi="B Nazanin" w:cs="B Nazanin" w:hint="cs"/>
-          <w:sz w:val="24"/>
-          <w:szCs w:val="24"/>
-          <w:rtl/>
-          <w:lang w:bidi="fa-IR"/>
-        </w:rPr>
-        <w:t xml:space="preserve">نمره‌گذاری گویه‌ها بر اساس مقیاس ۶ درجه‌ای لیکرت انجام می‌شود. گزینه‌های این مقیاس — همان‌گونه که در نسخه آنلاین منتشرشده پژوهش آمده است — به ترتیب عبارت‌اند از: «۱=کاملاً در مورد من غلط است»، «۲=تقریباً غلط است»، «۳=بیشتر غلط است تا درست»، «۴=اندکی درست است»، «۵=تقریباً درست است» و «۶=کاملاً مرا توصیف می‌کند». برای هر طرحواره نمره‌ای بین ۵ تا ۳۰ به دست می‌آید و نمره بالاتر نشان‌دهنده شدت بیشتر آن طرحواره است. ترتیب گزینه‌ها در نسخه آنلاین منتشرشده پژوهش با همین جهت نمره‌گذاری هم‌خوان است و نیازی به وارونه‌سازی نمرات در مرحله کدگذاری وجود ندارد.</w:t>
-      </w:r>
-    </w:p>
-    <w:p>
-      <w:pPr>
-        <w:bidi w:val="1"/>
-        <w:spacing w:lineRule="exact" w:line="580" w:after="0"/>
-        <w:jc w:val="both"/>
-      </w:pPr>
-      <w:r>
-        <w:rPr>
-          <w:rFonts w:ascii="B Nazanin" w:hAnsi="B Nazanin" w:cs="B Nazanin" w:hint="cs"/>
-          <w:sz w:val="24"/>
-          <w:szCs w:val="24"/>
-          <w:rtl/>
-          <w:lang w:bidi="fa-IR"/>
-        </w:rPr>
-        <w:t xml:space="preserve">ویژگی‌های روان‌سنجی ابزار اصلی طرحواره‌ها در مطالعات متعدد بررسی و تأیید شده است (یانگ، ۱۹۹۸؛ اشمیت و همکاران، ۱۹۹۵). در ایران نیز پژوهش یوسفی (۱۳۹۶) ویژگی‌های روان‌سنجی نسخه فارسی این پرسشنامه را در نمونه غیربالینی بررسی کرده است؛ در این پژوهش پایایی خرده‌مقیاس‌ها با ضرایب آلفای ۰٫۶۸ تا ۰٫۸۵ و روایی سازه قابل قبول گزارش شده است.</w:t>
-      </w:r>
-    </w:p>
-    <w:p>
-      <w:pPr>
-        <w:bidi w:val="1"/>
-        <w:spacing w:lineRule="exact" w:line="580" w:after="0"/>
-        <w:jc w:val="both"/>
-      </w:pPr>
-      <w:r>
-        <w:rPr>
-          <w:rFonts w:ascii="B Nazanin" w:hAnsi="B Nazanin" w:cs="B Nazanin" w:hint="cs"/>
-          <w:sz w:val="24"/>
-          <w:szCs w:val="24"/>
-          <w:rtl/>
-          <w:lang w:bidi="fa-IR"/>
-        </w:rPr>
-        <w:t xml:space="preserve">پایایی ابزار در نمونه پژوهش حاضر با آلفای کرونباخ محاسبه و در فصل چهارم گزارش خواهد شد.</w:t>
-      </w:r>
-    </w:p>
-    <w:p>
-      <w:pPr>
-        <w:pStyle w:val="Heading3"/>
-        <w:bidi w:val="1"/>
-        <w:jc w:val="right"/>
-      </w:pPr>
-      <w:r>
-        <w:rPr>
-          <w:rFonts w:ascii="B Nazanin" w:hAnsi="B Nazanin" w:cs="B Nazanin" w:hint="cs"/>
-          <w:b/>
-          <w:bCs/>
-          <w:sz w:val="26"/>
-          <w:szCs w:val="26"/>
-          <w:rtl/>
-          <w:lang w:bidi="fa-IR"/>
-        </w:rPr>
-        <w:t xml:space="preserve">۳-۴-۳. مقیاس تحمل ریسک مالی گرابل و لایتون (</w:t>
       </w:r>
       <w:r>
         <w:rPr>
@@ -9507,7 +9449,123 @@
           <w:szCs w:val="26"/>
           <w:lang w:val="en-US"/>
         </w:rPr>
-        <w:t xml:space="preserve">GL-RTS)</w:t>
+        <w:t xml:space="preserve"> (YSQ-SF)</w:t>
+      </w:r>
+    </w:p>
+    <w:p>
+      <w:pPr>
+        <w:bidi w:val="1"/>
+        <w:spacing w:lineRule="exact" w:line="580" w:after="0"/>
+        <w:jc w:val="both"/>
+      </w:pPr>
+      <w:r>
+        <w:rPr>
+          <w:rFonts w:ascii="B Nazanin" w:hAnsi="B Nazanin" w:cs="B Nazanin" w:hint="cs"/>
+          <w:sz w:val="24"/>
+          <w:szCs w:val="24"/>
+          <w:rtl/>
+          <w:lang w:bidi="fa-IR"/>
+        </w:rPr>
+        <w:t xml:space="preserve">پرسشنامه طرحواره یانگ — فرم کوتاه </w:t>
+      </w:r>
+      <w:r>
+        <w:rPr>
+          <w:rFonts w:ascii="B Nazanin" w:hAnsi="B Nazanin" w:cs="B Nazanin" w:hint="cs"/>
+          <w:vertAlign w:val="superscript"/>
+          <w:rtl/>
+        </w:rPr>
+        <w:footnoteReference w:id="41"/>
+      </w:r>
+      <w:r>
+        <w:rPr>
+          <w:rFonts w:ascii="B Nazanin" w:hAnsi="B Nazanin" w:cs="B Nazanin" w:hint="cs"/>
+          <w:sz w:val="24"/>
+          <w:szCs w:val="24"/>
+          <w:rtl/>
+          <w:lang w:bidi="fa-IR"/>
+        </w:rPr>
+        <w:t xml:space="preserve"> توسط یانگ (۱۹۹۸) به عنوان نسخه‌ای کوتاه‌تر از ابزار اصلی برای سنجش ۱۵ طرحواره ناسازگار اولیه تدوین شده است. این پرسشنامه شامل ۷۵ گویه است که به ازای هر طرحواره، ۵ گویه را در بر می‌گیرد و بر اساس نظریه طرحواره، الگوهای هیجانی و شناختی عمیق و پایداری را می‌سنجد که در دوران کودکی و نوجوانی شکل گرفته‌اند و تفسیر فرد از موقعیت‌های زندگی را جهت می‌دهند.</w:t>
+      </w:r>
+    </w:p>
+    <w:p>
+      <w:pPr>
+        <w:bidi w:val="1"/>
+        <w:spacing w:lineRule="exact" w:line="580" w:after="0"/>
+        <w:jc w:val="both"/>
+      </w:pPr>
+      <w:r>
+        <w:rPr>
+          <w:rFonts w:ascii="B Nazanin" w:hAnsi="B Nazanin" w:cs="B Nazanin" w:hint="cs"/>
+          <w:sz w:val="24"/>
+          <w:szCs w:val="24"/>
+          <w:rtl/>
+          <w:lang w:bidi="fa-IR"/>
+        </w:rPr>
+        <w:t xml:space="preserve">نمره‌گذاری گویه‌ها بر اساس مقیاس ۶ درجه‌ای لیکرت انجام می‌شود. گزینه‌های این مقیاس — همان‌گونه که در نسخه آنلاین منتشرشده پژوهش آمده است — به ترتیب عبارت‌اند از: «۱=کاملاً در مورد من غلط است»، «۲=تقریباً غلط است»، «۳=بیشتر غلط است تا درست»، «۴=اندکی درست است»، «۵=تقریباً درست است» و «۶=کاملاً مرا توصیف می‌کند». برای هر طرحواره نمره‌ای بین ۵ تا ۳۰ به دست می‌آید و نمره بالاتر نشان‌دهنده شدت بیشتر آن طرحواره است. ترتیب گزینه‌ها در نسخه آنلاین منتشرشده پژوهش با همین جهت نمره‌گذاری هم‌خوان است و نیازی به وارونه‌سازی نمرات در مرحله کدگذاری وجود ندارد.</w:t>
+      </w:r>
+    </w:p>
+    <w:p>
+      <w:pPr>
+        <w:bidi w:val="1"/>
+        <w:spacing w:lineRule="exact" w:line="580" w:after="0"/>
+        <w:jc w:val="both"/>
+      </w:pPr>
+      <w:r>
+        <w:rPr>
+          <w:rFonts w:ascii="B Nazanin" w:hAnsi="B Nazanin" w:cs="B Nazanin" w:hint="cs"/>
+          <w:sz w:val="24"/>
+          <w:szCs w:val="24"/>
+          <w:rtl/>
+          <w:lang w:bidi="fa-IR"/>
+        </w:rPr>
+        <w:t xml:space="preserve">ویژگی‌های روان‌سنجی ابزار اصلی طرحواره‌ها در مطالعات متعدد بررسی و تأیید شده است (یانگ، ۱۹۹۸؛ اشمیت و همکاران، ۱۹۹۵). در ایران نیز پژوهش یوسفی (۱۳۹۶) ویژگی‌های روان‌سنجی نسخه فارسی این پرسشنامه را در نمونه غیربالینی بررسی کرده است؛ در این پژوهش پایایی خرده‌مقیاس‌ها با ضرایب آلفای ۰٫۶۸ تا ۰٫۸۵ و روایی سازه قابل قبول گزارش شده است.</w:t>
+      </w:r>
+    </w:p>
+    <w:p>
+      <w:pPr>
+        <w:bidi w:val="1"/>
+        <w:spacing w:lineRule="exact" w:line="580" w:after="0"/>
+        <w:jc w:val="both"/>
+      </w:pPr>
+      <w:r>
+        <w:rPr>
+          <w:rFonts w:ascii="B Nazanin" w:hAnsi="B Nazanin" w:cs="B Nazanin" w:hint="cs"/>
+          <w:sz w:val="24"/>
+          <w:szCs w:val="24"/>
+          <w:rtl/>
+          <w:lang w:bidi="fa-IR"/>
+        </w:rPr>
+        <w:t xml:space="preserve">پایایی ابزار در نمونه پژوهش حاضر با آلفای کرونباخ محاسبه و در فصل چهارم گزارش خواهد شد.</w:t>
+      </w:r>
+    </w:p>
+    <w:p>
+      <w:pPr>
+        <w:pStyle w:val="Heading3"/>
+        <w:bidi w:val="1"/>
+        <w:jc w:val="right"/>
+      </w:pPr>
+      <w:r>
+        <w:rPr>
+          <w:rFonts w:ascii="B Nazanin" w:hAnsi="B Nazanin" w:cs="B Nazanin" w:hint="cs"/>
+          <w:b/>
+          <w:bCs/>
+          <w:sz w:val="26"/>
+          <w:szCs w:val="26"/>
+          <w:rtl/>
+          <w:lang w:bidi="fa-IR"/>
+        </w:rPr>
+        <w:t xml:space="preserve">۳-۴-۳. مقیاس تحمل ریسک مالی گرابل و لایتون</w:t>
+      </w:r>
+      <w:r>
+        <w:rPr>
+          <w:rFonts w:ascii="Times New Roman" w:hAnsi="Times New Roman" w:cs="Times New Roman"/>
+          <w:b/>
+          <w:bCs/>
+          <w:sz w:val="26"/>
+          <w:szCs w:val="26"/>
+          <w:lang w:val="en-US"/>
+        </w:rPr>
+        <w:t xml:space="preserve"> (GL-RTS)</w:t>
       </w:r>
     </w:p>
     <w:p>
@@ -9805,7 +9863,7 @@
                 <w:rtl/>
                 <w:lang w:bidi="fa-IR"/>
               </w:rPr>
-              <w:t xml:space="preserve">پرسشنامه اضطراب حالت-صفت اسپیلبرگر — فرم صفتی (</w:t>
+              <w:t xml:space="preserve">پرسشنامه اضطراب حالت-صفت اسپیلبرگر — فرم صفتی</w:t>
             </w:r>
             <w:r>
               <w:rPr>
@@ -9814,7 +9872,7 @@
                 <w:szCs w:val="20"/>
                 <w:lang w:val="en-US"/>
               </w:rPr>
-              <w:t xml:space="preserve">STAI-Y2)</w:t>
+              <w:t xml:space="preserve"> (STAI-Y2)</w:t>
             </w:r>
           </w:p>
         </w:tc>
@@ -9926,7 +9984,7 @@
                 <w:rtl/>
                 <w:lang w:bidi="fa-IR"/>
               </w:rPr>
-              <w:t xml:space="preserve">پرسشنامه طرحواره یانگ — فرم کوتاه (</w:t>
+              <w:t xml:space="preserve">پرسشنامه طرحواره یانگ — فرم کوتاه</w:t>
             </w:r>
             <w:r>
               <w:rPr>
@@ -9935,7 +9993,7 @@
                 <w:szCs w:val="20"/>
                 <w:lang w:val="en-US"/>
               </w:rPr>
-              <w:t xml:space="preserve">YSQ-SF)</w:t>
+              <w:t xml:space="preserve"> (YSQ-SF)</w:t>
             </w:r>
           </w:p>
         </w:tc>
@@ -10047,7 +10105,7 @@
                 <w:rtl/>
                 <w:lang w:bidi="fa-IR"/>
               </w:rPr>
-              <w:t xml:space="preserve">مقیاس تحمل ریسک مالی گرابل و لایتون (</w:t>
+              <w:t xml:space="preserve">مقیاس تحمل ریسک مالی گرابل و لایتون</w:t>
             </w:r>
             <w:r>
               <w:rPr>
@@ -10056,7 +10114,7 @@
                 <w:szCs w:val="20"/>
                 <w:lang w:val="en-US"/>
               </w:rPr>
-              <w:t xml:space="preserve">GL-RTS)</w:t>
+              <w:t xml:space="preserve"> (GL-RTS)</w:t>
             </w:r>
           </w:p>
         </w:tc>
@@ -10529,7 +10587,7 @@
           <w:rtl/>
           <w:lang w:bidi="fa-IR"/>
         </w:rPr>
-        <w:t xml:space="preserve"> برای آزمون نقش میانجی طرحواره‌های ناسازگار اولیه در رابطه میان اضطراب صفتی و رفتارهای مالی پرخطر، دو چارچوب تحلیلی در نظر گرفته شده است. در این مدل، اثر کل اضطراب صفتی بر رفتارهای مالی پرخطر به دو مؤلفه اثر مستقیم و اثر غیرمستقیم تجزیه می‌شود و مؤلفه غیرمستقیم، مسیری است که از مجرای طرحواره‌های ناسازگار اولیه عبور می‌کند. روش اصلی، مدل‌سازی معادلات ساختاری در نرم‌افزار </w:t>
+        <w:t xml:space="preserve"> برای آزمون نقش میانجی طرحواره‌های ناسازگار اولیه در رابطه میان اضطراب صفتی و رفتارهای مالی پرخطر، دو چارچوب تحلیلی در نظر گرفته شده است. در این مدل، اثر کل اضطراب صفتی بر رفتارهای مالی پرخطر به دو مؤلفه اثر مستقیم و اثر غیرمستقیم تجزیه می‌شود و مؤلفه غیرمستقیم، مسیری است که از مجرای طرحواره‌های ناسازگار اولیه عبور می‌کند. روش اصلی، مدل‌سازی معادلات ساختاری در نرم‌افزار</w:t>
       </w:r>
       <w:r>
         <w:rPr>
@@ -10538,17 +10596,17 @@
           <w:szCs w:val="22"/>
           <w:lang w:val="en-US"/>
         </w:rPr>
-        <w:t xml:space="preserve">Amos</w:t>
-      </w:r>
-      <w:r>
-        <w:rPr>
-          <w:rFonts w:ascii="B Nazanin" w:hAnsi="B Nazanin" w:cs="B Nazanin" w:hint="cs"/>
-          <w:sz w:val="24"/>
-          <w:szCs w:val="24"/>
-          <w:rtl/>
-          <w:lang w:bidi="fa-IR"/>
-        </w:rPr>
-        <w:t xml:space="preserve"> است که در صورت کفایت حجم نمونه (در حدود ۲۰۰ نفر) به کار می‌رود و برازش مدل با شاخص‌های کای‌دو نسبت به درجه آزادی، شاخص برازش تطبیقی و ریشه میانگین مربعات خطای برآورد ارزیابی می‌شود. روش جایگزین و تکمیلی، تحلیل مسیر با ماکروی </w:t>
+        <w:t xml:space="preserve"> Amos </w:t>
+      </w:r>
+      <w:r>
+        <w:rPr>
+          <w:rFonts w:ascii="B Nazanin" w:hAnsi="B Nazanin" w:cs="B Nazanin" w:hint="cs"/>
+          <w:sz w:val="24"/>
+          <w:szCs w:val="24"/>
+          <w:rtl/>
+          <w:lang w:bidi="fa-IR"/>
+        </w:rPr>
+        <w:t xml:space="preserve">است که در صورت کفایت حجم نمونه (در حدود ۲۰۰ نفر) به کار می‌رود و برازش مدل با شاخص‌های کای‌دو نسبت به درجه آزادی، شاخص برازش تطبیقی و ریشه میانگین مربعات خطای برآورد ارزیابی می‌شود. روش جایگزین و تکمیلی، تحلیل مسیر با ماکروی</w:t>
       </w:r>
       <w:r>
         <w:rPr>
@@ -10557,17 +10615,17 @@
           <w:szCs w:val="22"/>
           <w:lang w:val="en-US"/>
         </w:rPr>
-        <w:t xml:space="preserve">PROCESS</w:t>
-      </w:r>
-      <w:r>
-        <w:rPr>
-          <w:rFonts w:ascii="B Nazanin" w:hAnsi="B Nazanin" w:cs="B Nazanin" w:hint="cs"/>
-          <w:sz w:val="24"/>
-          <w:szCs w:val="24"/>
-          <w:rtl/>
-          <w:lang w:bidi="fa-IR"/>
-        </w:rPr>
-        <w:t xml:space="preserve"> و الگوی شماره ۴ است که اثرات مستقیم و غیرمستقیم را برآورد می‌کند و معناداری اثر غیرمستقیم از طریق روش بوت‌استرپ همراه با فاصله اطمینان ۹۵ درصد آزمون می‌شود (هایز، ۲۰۱۸)؛ در این چارچوب، در صورتی که فاصله اطمینان بوت‌استرپ برای اثر غیرمستقیم عدد صفر را در بر نگیرد، اثر میانجی در سطح ۰٫۰۵ معنادار تلقی می‌شود. انتخاب میان این دو روش بر اساس حجم نهایی نمونه تحقق‌یافته و نتایج بررسی پیش‌فرض‌ها صورت می‌گیرد؛ در هر دو حالت، تفسیر نتایج بر اساس منطق میانجی‌گری و در چارچوب نظری پژوهش انجام می‌شود و هیچ نتیجه‌ای پیش از گردآوری و تحلیل واقعی داده‌ها قابل گزارش نیست.</w:t>
+        <w:t xml:space="preserve"> PROCESS </w:t>
+      </w:r>
+      <w:r>
+        <w:rPr>
+          <w:rFonts w:ascii="B Nazanin" w:hAnsi="B Nazanin" w:cs="B Nazanin" w:hint="cs"/>
+          <w:sz w:val="24"/>
+          <w:szCs w:val="24"/>
+          <w:rtl/>
+          <w:lang w:bidi="fa-IR"/>
+        </w:rPr>
+        <w:t xml:space="preserve">و الگوی شماره ۴ است که اثرات مستقیم و غیرمستقیم را برآورد می‌کند و معناداری اثر غیرمستقیم از طریق روش بوت‌استرپ همراه با فاصله اطمینان ۹۵ درصد آزمون می‌شود (هایز، ۲۰۱۸)؛ در این چارچوب، در صورتی که فاصله اطمینان بوت‌استرپ برای اثر غیرمستقیم عدد صفر را در بر نگیرد، اثر میانجی در سطح ۰٫۰۵ معنادار تلقی می‌شود. انتخاب میان این دو روش بر اساس حجم نهایی نمونه تحقق‌یافته و نتایج بررسی پیش‌فرض‌ها صورت می‌گیرد؛ در هر دو حالت، تفسیر نتایج بر اساس منطق میانجی‌گری و در چارچوب نظری پژوهش انجام می‌شود و هیچ نتیجه‌ای پیش از گردآوری و تحلیل واقعی داده‌ها قابل گزارش نیست.</w:t>
       </w:r>
     </w:p>
     <w:p>
@@ -10596,7 +10654,7 @@
           <w:rtl/>
           <w:lang w:bidi="fa-IR"/>
         </w:rPr>
-        <w:t xml:space="preserve"> تحلیل‌های آماری پژوهش با نرم‌افزار </w:t>
+        <w:t xml:space="preserve"> تحلیل‌های آماری پژوهش با نرم‌افزار</w:t>
       </w:r>
       <w:r>
         <w:rPr>
@@ -10605,17 +10663,17 @@
           <w:szCs w:val="22"/>
           <w:lang w:val="en-US"/>
         </w:rPr>
-        <w:t xml:space="preserve">SPSS</w:t>
-      </w:r>
-      <w:r>
-        <w:rPr>
-          <w:rFonts w:ascii="B Nazanin" w:hAnsi="B Nazanin" w:cs="B Nazanin" w:hint="cs"/>
-          <w:sz w:val="24"/>
-          <w:szCs w:val="24"/>
-          <w:rtl/>
-          <w:lang w:bidi="fa-IR"/>
-        </w:rPr>
-        <w:t xml:space="preserve"> نسخه ۲۶ و (در صورت امکان) نرم‌افزار </w:t>
+        <w:t xml:space="preserve"> SPSS </w:t>
+      </w:r>
+      <w:r>
+        <w:rPr>
+          <w:rFonts w:ascii="B Nazanin" w:hAnsi="B Nazanin" w:cs="B Nazanin" w:hint="cs"/>
+          <w:sz w:val="24"/>
+          <w:szCs w:val="24"/>
+          <w:rtl/>
+          <w:lang w:bidi="fa-IR"/>
+        </w:rPr>
+        <w:t xml:space="preserve">نسخه ۲۶ و (در صورت امکان) نرم‌افزار</w:t>
       </w:r>
       <w:r>
         <w:rPr>
@@ -10624,17 +10682,17 @@
           <w:szCs w:val="22"/>
           <w:lang w:val="en-US"/>
         </w:rPr>
-        <w:t xml:space="preserve">Amos</w:t>
-      </w:r>
-      <w:r>
-        <w:rPr>
-          <w:rFonts w:ascii="B Nazanin" w:hAnsi="B Nazanin" w:cs="B Nazanin" w:hint="cs"/>
-          <w:sz w:val="24"/>
-          <w:szCs w:val="24"/>
-          <w:rtl/>
-          <w:lang w:bidi="fa-IR"/>
-        </w:rPr>
-        <w:t xml:space="preserve"> نسخه ۲۴ انجام می‌شود و برای تحلیل مسیر جایگزین، از ماکروی </w:t>
+        <w:t xml:space="preserve"> Amos </w:t>
+      </w:r>
+      <w:r>
+        <w:rPr>
+          <w:rFonts w:ascii="B Nazanin" w:hAnsi="B Nazanin" w:cs="B Nazanin" w:hint="cs"/>
+          <w:sz w:val="24"/>
+          <w:szCs w:val="24"/>
+          <w:rtl/>
+          <w:lang w:bidi="fa-IR"/>
+        </w:rPr>
+        <w:t xml:space="preserve">نسخه ۲۴ انجام می‌شود و برای تحلیل مسیر جایگزین، از ماکروی</w:t>
       </w:r>
       <w:r>
         <w:rPr>
@@ -10643,17 +10701,17 @@
           <w:szCs w:val="22"/>
           <w:lang w:val="en-US"/>
         </w:rPr>
-        <w:t xml:space="preserve">PROCESS</w:t>
-      </w:r>
-      <w:r>
-        <w:rPr>
-          <w:rFonts w:ascii="B Nazanin" w:hAnsi="B Nazanin" w:cs="B Nazanin" w:hint="cs"/>
-          <w:sz w:val="24"/>
-          <w:szCs w:val="24"/>
-          <w:rtl/>
-          <w:lang w:bidi="fa-IR"/>
-        </w:rPr>
-        <w:t xml:space="preserve"> بر بستر </w:t>
+        <w:t xml:space="preserve"> PROCESS </w:t>
+      </w:r>
+      <w:r>
+        <w:rPr>
+          <w:rFonts w:ascii="B Nazanin" w:hAnsi="B Nazanin" w:cs="B Nazanin" w:hint="cs"/>
+          <w:sz w:val="24"/>
+          <w:szCs w:val="24"/>
+          <w:rtl/>
+          <w:lang w:bidi="fa-IR"/>
+        </w:rPr>
+        <w:t xml:space="preserve">بر بستر</w:t>
       </w:r>
       <w:r>
         <w:rPr>
@@ -10662,17 +10720,17 @@
           <w:szCs w:val="22"/>
           <w:lang w:val="en-US"/>
         </w:rPr>
-        <w:t xml:space="preserve">SPSS</w:t>
-      </w:r>
-      <w:r>
-        <w:rPr>
-          <w:rFonts w:ascii="B Nazanin" w:hAnsi="B Nazanin" w:cs="B Nazanin" w:hint="cs"/>
-          <w:sz w:val="24"/>
-          <w:szCs w:val="24"/>
-          <w:rtl/>
-          <w:lang w:bidi="fa-IR"/>
-        </w:rPr>
-        <w:t xml:space="preserve"> استفاده می‌گردد.</w:t>
+        <w:t xml:space="preserve"> SPSS </w:t>
+      </w:r>
+      <w:r>
+        <w:rPr>
+          <w:rFonts w:ascii="B Nazanin" w:hAnsi="B Nazanin" w:cs="B Nazanin" w:hint="cs"/>
+          <w:sz w:val="24"/>
+          <w:szCs w:val="24"/>
+          <w:rtl/>
+          <w:lang w:bidi="fa-IR"/>
+        </w:rPr>
+        <w:t xml:space="preserve">استفاده می‌گردد.</w:t>
       </w:r>
     </w:p>
     <w:p>
@@ -15221,16 +15279,17 @@
     <w:pPr>
       <w:keepNext/>
       <w:keepLines/>
-      <w:spacing w:before="200" w:after="0"/>
+      <w:bidi w:val="1"/>
+      <w:spacing w:before="120" w:after="40" w:lineRule="exact" w:line="580"/>
+      <w:jc w:val="right"/>
       <w:outlineLvl w:val="3"/>
     </w:pPr>
     <w:rPr>
-      <w:rFonts/>
+      <w:rFonts w:ascii="Times New Roman" w:hAnsi="Times New Roman" w:cs="B Nazanin"/>
       <w:b/>
       <w:bCs/>
-      <w:i/>
-      <w:iCs/>
-      <w:color w:val="4F81BD"/>
+      <w:color w:val="000000"/>
+      <w:sz w:val="24"/>
     </w:rPr>
   </w:style>
   <w:style w:type="paragraph" w:styleId="Heading5">

</xml_diff>

<commit_message>
fix: move English equivalents to footnotes only at first document occurrence
</commit_message>
<xml_diff>
--- a/output/final/thesis_ch1_to_ch3.docx
+++ b/output/final/thesis_ch1_to_ch3.docx
@@ -752,7 +752,7 @@
           <w:rtl/>
           <w:lang w:bidi="fa-IR"/>
         </w:rPr>
-        <w:t xml:space="preserve">رفتارهای مالی پرخطر </w:t>
+        <w:t xml:space="preserve">رفتارهای مالی پرخطر</w:t>
       </w:r>
       <w:r>
         <w:rPr>
@@ -770,7 +770,7 @@
           <w:rtl/>
           <w:lang w:bidi="fa-IR"/>
         </w:rPr>
-        <w:t xml:space="preserve"> در بازارهای مالی نوین، پیامد صرفِ ندانستن یا بی‌دقتی نیستند. ریشه آن‌ها در تعاملی پیچیده نهفته است که میان ویژگی‌های شخصیتی پایدار، الگوهای شناختی عمیق و فشارهای لحظه‌ای محیط معاملاتی شکل می‌گیرد. پژوهش حاضر با عنوان «تعیین نقش میانجی‌گر طرحواره‌های ناسازگار اولیه در رابطه بین اضطراب صفتی و رفتارهای مالی پرخطر در معامله‌گران بازارهای مالی»، در پی آن است که نشان دهد چگونه این ویژگی، اضطراب صفتی </w:t>
+        <w:t xml:space="preserve"> در بازارهای مالی نوین، پیامد صرفِ ندانستن یا بی‌دقتی نیستند. ریشه آن‌ها در تعاملی پیچیده نهفته است که میان ویژگی‌های شخصیتی پایدار، الگوهای شناختی عمیق و فشارهای لحظه‌ای محیط معاملاتی شکل می‌گیرد. پژوهش حاضر با عنوان «تعیین نقش میانجی‌گر طرحواره‌های ناسازگار اولیه در رابطه بین اضطراب صفتی و رفتارهای مالی پرخطر در معامله‌گران بازارهای مالی»، در پی آن است که نشان دهد چگونه این ویژگی، اضطراب صفتی</w:t>
       </w:r>
       <w:r>
         <w:rPr>
@@ -788,7 +788,7 @@
           <w:rtl/>
           <w:lang w:bidi="fa-IR"/>
         </w:rPr>
-        <w:t xml:space="preserve"> به‌عنوان یک ویژگی شخصیتی پایدار، از مجرای طرحواره‌های ناسازگار اولیه </w:t>
+        <w:t xml:space="preserve"> به‌عنوان یک ویژگی شخصیتی پایدار، از مجرای طرحواره‌های ناسازگار اولیه</w:t>
       </w:r>
       <w:r>
         <w:rPr>
@@ -831,7 +831,7 @@
           <w:vertAlign w:val="superscript"/>
           <w:rtl/>
         </w:rPr>
-        <w:footnoteReference w:id="44"/>
+        <w:footnoteReference w:id="41"/>
       </w:r>
       <w:r>
         <w:rPr>
@@ -849,7 +849,7 @@
           <w:vertAlign w:val="superscript"/>
           <w:rtl/>
         </w:rPr>
-        <w:footnoteReference w:id="45"/>
+        <w:footnoteReference w:id="42"/>
       </w:r>
       <w:r>
         <w:rPr>
@@ -901,7 +901,7 @@
           <w:vertAlign w:val="superscript"/>
           <w:rtl/>
         </w:rPr>
-        <w:footnoteReference w:id="46"/>
+        <w:footnoteReference w:id="43"/>
       </w:r>
       <w:r>
         <w:rPr>
@@ -974,7 +974,7 @@
           <w:vertAlign w:val="superscript"/>
           <w:rtl/>
         </w:rPr>
-        <w:footnoteReference w:id="47"/>
+        <w:footnoteReference w:id="44"/>
       </w:r>
       <w:r>
         <w:rPr>
@@ -1043,7 +1043,7 @@
           <w:vertAlign w:val="superscript"/>
           <w:rtl/>
         </w:rPr>
-        <w:footnoteReference w:id="48"/>
+        <w:footnoteReference w:id="45"/>
       </w:r>
       <w:r>
         <w:rPr>
@@ -1078,7 +1078,7 @@
           <w:vertAlign w:val="superscript"/>
           <w:rtl/>
         </w:rPr>
-        <w:footnoteReference w:id="49"/>
+        <w:footnoteReference w:id="46"/>
       </w:r>
       <w:r>
         <w:rPr>
@@ -1175,7 +1175,7 @@
           <w:rtl/>
           <w:lang w:bidi="fa-IR"/>
         </w:rPr>
-        <w:t xml:space="preserve">در بخش بزرگی از قرن بیستم، ادبیات آکادمیک تحلیل بازارهای مالی تحت سیطره فرضیه بازار کارا </w:t>
+        <w:t xml:space="preserve">در بخش بزرگی از قرن بیستم، ادبیات آکادمیک تحلیل بازارهای مالی تحت سیطره فرضیه بازار کارا</w:t>
       </w:r>
       <w:r>
         <w:rPr>
@@ -1201,7 +1201,7 @@
           <w:vertAlign w:val="superscript"/>
           <w:rtl/>
         </w:rPr>
-        <w:footnoteReference w:id="50"/>
+        <w:footnoteReference w:id="47"/>
       </w:r>
       <w:r>
         <w:rPr>
@@ -1262,7 +1262,7 @@
           <w:rtl/>
           <w:lang w:bidi="fa-IR"/>
         </w:rPr>
-        <w:t xml:space="preserve">این ناهنجاری‌ها زمینه را برای ظهور اقتصاد رفتاری </w:t>
+        <w:t xml:space="preserve">این ناهنجاری‌ها زمینه را برای ظهور اقتصاد رفتاری</w:t>
       </w:r>
       <w:r>
         <w:rPr>
@@ -1288,17 +1288,17 @@
           <w:vertAlign w:val="superscript"/>
           <w:rtl/>
         </w:rPr>
-        <w:footnoteReference w:id="51"/>
-      </w:r>
-      <w:r>
-        <w:rPr>
-          <w:rFonts w:ascii="B Nazanin" w:hAnsi="B Nazanin" w:cs="B Nazanin" w:hint="cs"/>
-          <w:sz w:val="24"/>
-          <w:szCs w:val="24"/>
-          <w:rtl/>
-          <w:lang w:bidi="fa-IR"/>
-        </w:rPr>
-        <w:t xml:space="preserve">، ۲۰۱۶). سنگ بنای این حوزه، نظریه چشم‌انداز </w:t>
+        <w:footnoteReference w:id="48"/>
+      </w:r>
+      <w:r>
+        <w:rPr>
+          <w:rFonts w:ascii="B Nazanin" w:hAnsi="B Nazanin" w:cs="B Nazanin" w:hint="cs"/>
+          <w:sz w:val="24"/>
+          <w:szCs w:val="24"/>
+          <w:rtl/>
+          <w:lang w:bidi="fa-IR"/>
+        </w:rPr>
+        <w:t xml:space="preserve">، ۲۰۱۶). سنگ بنای این حوزه، نظریه چشم‌انداز</w:t>
       </w:r>
       <w:r>
         <w:rPr>
@@ -1324,17 +1324,17 @@
           <w:vertAlign w:val="superscript"/>
           <w:rtl/>
         </w:rPr>
-        <w:footnoteReference w:id="52"/>
-      </w:r>
-      <w:r>
-        <w:rPr>
-          <w:rFonts w:ascii="B Nazanin" w:hAnsi="B Nazanin" w:cs="B Nazanin" w:hint="cs"/>
-          <w:sz w:val="24"/>
-          <w:szCs w:val="24"/>
-          <w:rtl/>
-          <w:lang w:bidi="fa-IR"/>
-        </w:rPr>
-        <w:t xml:space="preserve"> (۱۹۷۹) آن را ارائه کردند و بر پایه آن، افراد به‌جای ارزیابی سطح نهایی ثروت، تغییرات سود و زیان را نسبت به یک نقطه مرجع ذهنی می‌سنجند و زیان‌گریزی </w:t>
+        <w:footnoteReference w:id="49"/>
+      </w:r>
+      <w:r>
+        <w:rPr>
+          <w:rFonts w:ascii="B Nazanin" w:hAnsi="B Nazanin" w:cs="B Nazanin" w:hint="cs"/>
+          <w:sz w:val="24"/>
+          <w:szCs w:val="24"/>
+          <w:rtl/>
+          <w:lang w:bidi="fa-IR"/>
+        </w:rPr>
+        <w:t xml:space="preserve"> (۱۹۷۹) آن را ارائه کردند و بر پایه آن، افراد به‌جای ارزیابی سطح نهایی ثروت، تغییرات سود و زیان را نسبت به یک نقطه مرجع ذهنی می‌سنجند و زیان‌گریزی</w:t>
       </w:r>
       <w:r>
         <w:rPr>
@@ -1360,7 +1360,7 @@
           <w:vertAlign w:val="superscript"/>
           <w:rtl/>
         </w:rPr>
-        <w:footnoteReference w:id="53"/>
+        <w:footnoteReference w:id="50"/>
       </w:r>
       <w:r>
         <w:rPr>
@@ -1387,7 +1387,7 @@
           <w:rtl/>
           <w:lang w:bidi="fa-IR"/>
         </w:rPr>
-        <w:t xml:space="preserve">یکی از قدرتمندترین فشارهای روانشناختی بر این نسل جدید از سرمایه‌گذاران، ترس از دست دادن فرصت </w:t>
+        <w:t xml:space="preserve">یکی از قدرتمندترین فشارهای روانشناختی بر این نسل جدید از سرمایه‌گذاران، ترس از دست دادن فرصت</w:t>
       </w:r>
       <w:r>
         <w:rPr>
@@ -1413,7 +1413,7 @@
           <w:vertAlign w:val="superscript"/>
           <w:rtl/>
         </w:rPr>
-        <w:footnoteReference w:id="54"/>
+        <w:footnoteReference w:id="51"/>
       </w:r>
       <w:r>
         <w:rPr>
@@ -1431,7 +1431,7 @@
           <w:vertAlign w:val="superscript"/>
           <w:rtl/>
         </w:rPr>
-        <w:footnoteReference w:id="55"/>
+        <w:footnoteReference w:id="52"/>
       </w:r>
       <w:r>
         <w:rPr>
@@ -1572,7 +1572,7 @@
           <w:vertAlign w:val="superscript"/>
           <w:rtl/>
         </w:rPr>
-        <w:footnoteReference w:id="56"/>
+        <w:footnoteReference w:id="53"/>
       </w:r>
       <w:r>
         <w:rPr>
@@ -1590,7 +1590,7 @@
           <w:vertAlign w:val="superscript"/>
           <w:rtl/>
         </w:rPr>
-        <w:footnoteReference w:id="57"/>
+        <w:footnoteReference w:id="54"/>
       </w:r>
       <w:r>
         <w:rPr>
@@ -1625,7 +1625,7 @@
           <w:vertAlign w:val="superscript"/>
           <w:rtl/>
         </w:rPr>
-        <w:footnoteReference w:id="58"/>
+        <w:footnoteReference w:id="55"/>
       </w:r>
       <w:r>
         <w:rPr>
@@ -1643,7 +1643,7 @@
           <w:vertAlign w:val="superscript"/>
           <w:rtl/>
         </w:rPr>
-        <w:footnoteReference w:id="59"/>
+        <w:footnoteReference w:id="56"/>
       </w:r>
       <w:r>
         <w:rPr>
@@ -1678,17 +1678,17 @@
           <w:vertAlign w:val="superscript"/>
           <w:rtl/>
         </w:rPr>
-        <w:footnoteReference w:id="60"/>
-      </w:r>
-      <w:r>
-        <w:rPr>
-          <w:rFonts w:ascii="B Nazanin" w:hAnsi="B Nazanin" w:cs="B Nazanin" w:hint="cs"/>
-          <w:sz w:val="24"/>
-          <w:szCs w:val="24"/>
-          <w:rtl/>
-          <w:lang w:bidi="fa-IR"/>
-        </w:rPr>
-        <w:t xml:space="preserve">، ۲۰۱۳). بر اساس نظریه کنترل توجه </w:t>
+        <w:footnoteReference w:id="57"/>
+      </w:r>
+      <w:r>
+        <w:rPr>
+          <w:rFonts w:ascii="B Nazanin" w:hAnsi="B Nazanin" w:cs="B Nazanin" w:hint="cs"/>
+          <w:sz w:val="24"/>
+          <w:szCs w:val="24"/>
+          <w:rtl/>
+          <w:lang w:bidi="fa-IR"/>
+        </w:rPr>
+        <w:t xml:space="preserve">، ۲۰۱۳). بر اساس نظریه کنترل توجه</w:t>
       </w:r>
       <w:r>
         <w:rPr>
@@ -1714,7 +1714,7 @@
           <w:vertAlign w:val="superscript"/>
           <w:rtl/>
         </w:rPr>
-        <w:footnoteReference w:id="61"/>
+        <w:footnoteReference w:id="58"/>
       </w:r>
       <w:r>
         <w:rPr>
@@ -1732,7 +1732,7 @@
           <w:vertAlign w:val="superscript"/>
           <w:rtl/>
         </w:rPr>
-        <w:footnoteReference w:id="62"/>
+        <w:footnoteReference w:id="59"/>
       </w:r>
       <w:r>
         <w:rPr>
@@ -1767,7 +1767,7 @@
           <w:vertAlign w:val="superscript"/>
           <w:rtl/>
         </w:rPr>
-        <w:footnoteReference w:id="63"/>
+        <w:footnoteReference w:id="60"/>
       </w:r>
       <w:r>
         <w:rPr>
@@ -1802,7 +1802,7 @@
           <w:vertAlign w:val="superscript"/>
           <w:rtl/>
         </w:rPr>
-        <w:footnoteReference w:id="64"/>
+        <w:footnoteReference w:id="61"/>
       </w:r>
       <w:r>
         <w:rPr>
@@ -1837,7 +1837,7 @@
           <w:vertAlign w:val="superscript"/>
           <w:rtl/>
         </w:rPr>
-        <w:footnoteReference w:id="65"/>
+        <w:footnoteReference w:id="62"/>
       </w:r>
       <w:r>
         <w:rPr>
@@ -1855,7 +1855,7 @@
           <w:vertAlign w:val="superscript"/>
           <w:rtl/>
         </w:rPr>
-        <w:footnoteReference w:id="66"/>
+        <w:footnoteReference w:id="63"/>
       </w:r>
       <w:r>
         <w:rPr>
@@ -1907,115 +1907,115 @@
           <w:vertAlign w:val="superscript"/>
           <w:rtl/>
         </w:rPr>
+        <w:footnoteReference w:id="64"/>
+      </w:r>
+      <w:r>
+        <w:rPr>
+          <w:rFonts w:ascii="B Nazanin" w:hAnsi="B Nazanin" w:cs="B Nazanin" w:hint="cs"/>
+          <w:sz w:val="24"/>
+          <w:szCs w:val="24"/>
+          <w:rtl/>
+          <w:lang w:bidi="fa-IR"/>
+        </w:rPr>
+        <w:t xml:space="preserve">، ۲۰۱۰). ابعاد کلیدی این سازه در ادبیات مالی رفتاری چهار موردند: معامله‌گری بیش از حد</w:t>
+      </w:r>
+      <w:r>
+        <w:rPr>
+          <w:rFonts w:ascii="B Nazanin" w:hAnsi="B Nazanin" w:cs="B Nazanin" w:hint="cs"/>
+          <w:vertAlign w:val="superscript"/>
+          <w:rtl/>
+        </w:rPr>
+        <w:footnoteReference w:id="10"/>
+      </w:r>
+      <w:r>
+        <w:rPr>
+          <w:rFonts w:ascii="B Nazanin" w:hAnsi="B Nazanin" w:cs="B Nazanin" w:hint="cs"/>
+          <w:sz w:val="24"/>
+          <w:szCs w:val="24"/>
+          <w:rtl/>
+          <w:lang w:bidi="fa-IR"/>
+        </w:rPr>
+        <w:t xml:space="preserve"> (باربر و اودین</w:t>
+      </w:r>
+      <w:r>
+        <w:rPr>
+          <w:rFonts w:ascii="B Nazanin" w:hAnsi="B Nazanin" w:cs="B Nazanin" w:hint="cs"/>
+          <w:vertAlign w:val="superscript"/>
+          <w:rtl/>
+        </w:rPr>
+        <w:footnoteReference w:id="65"/>
+      </w:r>
+      <w:r>
+        <w:rPr>
+          <w:rFonts w:ascii="B Nazanin" w:hAnsi="B Nazanin" w:cs="B Nazanin" w:hint="cs"/>
+          <w:sz w:val="24"/>
+          <w:szCs w:val="24"/>
+          <w:rtl/>
+          <w:lang w:bidi="fa-IR"/>
+        </w:rPr>
+        <w:t xml:space="preserve">، ۲۰۰۰)؛ اثر گرایش</w:t>
+      </w:r>
+      <w:r>
+        <w:rPr>
+          <w:rFonts w:ascii="B Nazanin" w:hAnsi="B Nazanin" w:cs="B Nazanin" w:hint="cs"/>
+          <w:vertAlign w:val="superscript"/>
+          <w:rtl/>
+        </w:rPr>
+        <w:footnoteReference w:id="11"/>
+      </w:r>
+      <w:r>
+        <w:rPr>
+          <w:rFonts w:ascii="B Nazanin" w:hAnsi="B Nazanin" w:cs="B Nazanin" w:hint="cs"/>
+          <w:sz w:val="24"/>
+          <w:szCs w:val="24"/>
+          <w:rtl/>
+          <w:lang w:bidi="fa-IR"/>
+        </w:rPr>
+        <w:t xml:space="preserve"> (شفرین و استاتمن</w:t>
+      </w:r>
+      <w:r>
+        <w:rPr>
+          <w:rFonts w:ascii="B Nazanin" w:hAnsi="B Nazanin" w:cs="B Nazanin" w:hint="cs"/>
+          <w:vertAlign w:val="superscript"/>
+          <w:rtl/>
+        </w:rPr>
+        <w:footnoteReference w:id="66"/>
+      </w:r>
+      <w:r>
+        <w:rPr>
+          <w:rFonts w:ascii="B Nazanin" w:hAnsi="B Nazanin" w:cs="B Nazanin" w:hint="cs"/>
+          <w:sz w:val="24"/>
+          <w:szCs w:val="24"/>
+          <w:rtl/>
+          <w:lang w:bidi="fa-IR"/>
+        </w:rPr>
+        <w:t xml:space="preserve">، ۱۹۸۵)؛ رفتار گله‌ای</w:t>
+      </w:r>
+      <w:r>
+        <w:rPr>
+          <w:rFonts w:ascii="B Nazanin" w:hAnsi="B Nazanin" w:cs="B Nazanin" w:hint="cs"/>
+          <w:vertAlign w:val="superscript"/>
+          <w:rtl/>
+        </w:rPr>
+        <w:footnoteReference w:id="12"/>
+      </w:r>
+      <w:r>
+        <w:rPr>
+          <w:rFonts w:ascii="B Nazanin" w:hAnsi="B Nazanin" w:cs="B Nazanin" w:hint="cs"/>
+          <w:sz w:val="24"/>
+          <w:szCs w:val="24"/>
+          <w:rtl/>
+          <w:lang w:bidi="fa-IR"/>
+        </w:rPr>
+        <w:t xml:space="preserve"> (هوانگ و سالمون، ۲۰۰۴)؛ و تمرکز ناکافی سبد دارایی (گوتزمن و کومار</w:t>
+      </w:r>
+      <w:r>
+        <w:rPr>
+          <w:rFonts w:ascii="B Nazanin" w:hAnsi="B Nazanin" w:cs="B Nazanin" w:hint="cs"/>
+          <w:vertAlign w:val="superscript"/>
+          <w:rtl/>
+        </w:rPr>
         <w:footnoteReference w:id="67"/>
-      </w:r>
-      <w:r>
-        <w:rPr>
-          <w:rFonts w:ascii="B Nazanin" w:hAnsi="B Nazanin" w:cs="B Nazanin" w:hint="cs"/>
-          <w:sz w:val="24"/>
-          <w:szCs w:val="24"/>
-          <w:rtl/>
-          <w:lang w:bidi="fa-IR"/>
-        </w:rPr>
-        <w:t xml:space="preserve">، ۲۰۱۰). ابعاد کلیدی این سازه در ادبیات مالی رفتاری چهار موردند: معامله‌گری بیش از حد </w:t>
-      </w:r>
-      <w:r>
-        <w:rPr>
-          <w:rFonts w:ascii="B Nazanin" w:hAnsi="B Nazanin" w:cs="B Nazanin" w:hint="cs"/>
-          <w:vertAlign w:val="superscript"/>
-          <w:rtl/>
-        </w:rPr>
-        <w:footnoteReference w:id="10"/>
-      </w:r>
-      <w:r>
-        <w:rPr>
-          <w:rFonts w:ascii="B Nazanin" w:hAnsi="B Nazanin" w:cs="B Nazanin" w:hint="cs"/>
-          <w:sz w:val="24"/>
-          <w:szCs w:val="24"/>
-          <w:rtl/>
-          <w:lang w:bidi="fa-IR"/>
-        </w:rPr>
-        <w:t xml:space="preserve"> (باربر و اودین</w:t>
-      </w:r>
-      <w:r>
-        <w:rPr>
-          <w:rFonts w:ascii="B Nazanin" w:hAnsi="B Nazanin" w:cs="B Nazanin" w:hint="cs"/>
-          <w:vertAlign w:val="superscript"/>
-          <w:rtl/>
-        </w:rPr>
-        <w:footnoteReference w:id="68"/>
-      </w:r>
-      <w:r>
-        <w:rPr>
-          <w:rFonts w:ascii="B Nazanin" w:hAnsi="B Nazanin" w:cs="B Nazanin" w:hint="cs"/>
-          <w:sz w:val="24"/>
-          <w:szCs w:val="24"/>
-          <w:rtl/>
-          <w:lang w:bidi="fa-IR"/>
-        </w:rPr>
-        <w:t xml:space="preserve">، ۲۰۰۰)؛ اثر گرایش </w:t>
-      </w:r>
-      <w:r>
-        <w:rPr>
-          <w:rFonts w:ascii="B Nazanin" w:hAnsi="B Nazanin" w:cs="B Nazanin" w:hint="cs"/>
-          <w:vertAlign w:val="superscript"/>
-          <w:rtl/>
-        </w:rPr>
-        <w:footnoteReference w:id="11"/>
-      </w:r>
-      <w:r>
-        <w:rPr>
-          <w:rFonts w:ascii="B Nazanin" w:hAnsi="B Nazanin" w:cs="B Nazanin" w:hint="cs"/>
-          <w:sz w:val="24"/>
-          <w:szCs w:val="24"/>
-          <w:rtl/>
-          <w:lang w:bidi="fa-IR"/>
-        </w:rPr>
-        <w:t xml:space="preserve"> (شفرین و استاتمن</w:t>
-      </w:r>
-      <w:r>
-        <w:rPr>
-          <w:rFonts w:ascii="B Nazanin" w:hAnsi="B Nazanin" w:cs="B Nazanin" w:hint="cs"/>
-          <w:vertAlign w:val="superscript"/>
-          <w:rtl/>
-        </w:rPr>
-        <w:footnoteReference w:id="69"/>
-      </w:r>
-      <w:r>
-        <w:rPr>
-          <w:rFonts w:ascii="B Nazanin" w:hAnsi="B Nazanin" w:cs="B Nazanin" w:hint="cs"/>
-          <w:sz w:val="24"/>
-          <w:szCs w:val="24"/>
-          <w:rtl/>
-          <w:lang w:bidi="fa-IR"/>
-        </w:rPr>
-        <w:t xml:space="preserve">، ۱۹۸۵)؛ رفتار گله‌ای </w:t>
-      </w:r>
-      <w:r>
-        <w:rPr>
-          <w:rFonts w:ascii="B Nazanin" w:hAnsi="B Nazanin" w:cs="B Nazanin" w:hint="cs"/>
-          <w:vertAlign w:val="superscript"/>
-          <w:rtl/>
-        </w:rPr>
-        <w:footnoteReference w:id="12"/>
-      </w:r>
-      <w:r>
-        <w:rPr>
-          <w:rFonts w:ascii="B Nazanin" w:hAnsi="B Nazanin" w:cs="B Nazanin" w:hint="cs"/>
-          <w:sz w:val="24"/>
-          <w:szCs w:val="24"/>
-          <w:rtl/>
-          <w:lang w:bidi="fa-IR"/>
-        </w:rPr>
-        <w:t xml:space="preserve"> (هوانگ و سالمون، ۲۰۰۴)؛ و تمرکز ناکافی سبد دارایی (گوتزمن و کومار</w:t>
-      </w:r>
-      <w:r>
-        <w:rPr>
-          <w:rFonts w:ascii="B Nazanin" w:hAnsi="B Nazanin" w:cs="B Nazanin" w:hint="cs"/>
-          <w:vertAlign w:val="superscript"/>
-          <w:rtl/>
-        </w:rPr>
-        <w:footnoteReference w:id="70"/>
       </w:r>
       <w:r>
         <w:rPr>
@@ -2095,7 +2095,7 @@
           <w:rtl/>
           <w:lang w:bidi="fa-IR"/>
         </w:rPr>
-        <w:t xml:space="preserve">با وجود این شواهد، یک شکاف تبیینی آشکار در ادبیات علمی وجود دارد. اغلب مطالعات به بررسی روابط دوجانبه پرداخته‌اند، اما سازوکار روانشناختی که نشان دهد چگونه یک ویژگی شخصیتی پایدار مانند اضطراب صفتی، از طریق یک فیلتر شناختی عمیق مانند طرحواره‌های ناسازگار اولیه، به رفتارهای مالی مشخص تبدیل می‌شود — به‌ویژه در جامعه معامله‌گران — به ندرت مورد بررسی قرار گرفته است. پژوهش حاضر برای پر کردن همین شکاف، مدل میانجی‌گری را بر پایه مدل استعداد-استرس </w:t>
+        <w:t xml:space="preserve">با وجود این شواهد، یک شکاف تبیینی آشکار در ادبیات علمی وجود دارد. اغلب مطالعات به بررسی روابط دوجانبه پرداخته‌اند، اما سازوکار روانشناختی که نشان دهد چگونه یک ویژگی شخصیتی پایدار مانند اضطراب صفتی، از طریق یک فیلتر شناختی عمیق مانند طرحواره‌های ناسازگار اولیه، به رفتارهای مالی مشخص تبدیل می‌شود — به‌ویژه در جامعه معامله‌گران — به ندرت مورد بررسی قرار گرفته است. پژوهش حاضر برای پر کردن همین شکاف، مدل میانجی‌گری را بر پایه مدل استعداد-استرس</w:t>
       </w:r>
       <w:r>
         <w:rPr>
@@ -2121,7 +2121,7 @@
           <w:vertAlign w:val="superscript"/>
           <w:rtl/>
         </w:rPr>
-        <w:footnoteReference w:id="71"/>
+        <w:footnoteReference w:id="68"/>
       </w:r>
       <w:r>
         <w:rPr>
@@ -2245,7 +2245,7 @@
           <w:vertAlign w:val="superscript"/>
           <w:rtl/>
         </w:rPr>
-        <w:footnoteReference w:id="72"/>
+        <w:footnoteReference w:id="69"/>
       </w:r>
       <w:r>
         <w:rPr>
@@ -2384,7 +2384,7 @@
           <w:vertAlign w:val="superscript"/>
           <w:rtl/>
         </w:rPr>
-        <w:footnoteReference w:id="73"/>
+        <w:footnoteReference w:id="70"/>
       </w:r>
       <w:r>
         <w:rPr>
@@ -3026,16 +3026,152 @@
         </w:rPr>
         <w:t xml:space="preserve">۱-۶-۱. اضطراب صفتی</w:t>
       </w:r>
-      <w:r>
-        <w:rPr>
-          <w:rFonts w:ascii="Times New Roman" w:hAnsi="Times New Roman" w:cs="Times New Roman"/>
+    </w:p>
+    <w:p>
+      <w:pPr>
+        <w:bidi w:val="1"/>
+        <w:spacing w:lineRule="exact" w:line="580" w:after="0"/>
+        <w:jc w:val="both"/>
+      </w:pPr>
+      <w:r>
+        <w:rPr>
+          <w:rFonts w:ascii="B Nazanin" w:hAnsi="B Nazanin" w:cs="B Nazanin" w:hint="cs"/>
+          <w:b/>
+          <w:bCs/>
+          <w:sz w:val="24"/>
+          <w:szCs w:val="24"/>
+          <w:rtl/>
+          <w:lang w:bidi="fa-IR"/>
+        </w:rPr>
+        <w:t xml:space="preserve">تعریف نظری:</w:t>
+      </w:r>
+      <w:r>
+        <w:rPr>
+          <w:rFonts w:ascii="B Nazanin" w:hAnsi="B Nazanin" w:cs="B Nazanin" w:hint="cs"/>
+          <w:sz w:val="24"/>
+          <w:szCs w:val="24"/>
+          <w:rtl/>
+          <w:lang w:bidi="fa-IR"/>
+        </w:rPr>
+        <w:t xml:space="preserve"> اضطراب صفتی یک ویژگی شخصیتی پایدار است که تمایل فرد به درک موقعیت‌های مبهم یا چالش‌برانگیز به عنوان تهدیدآمیز و پاسخ به آن‌ها با اضطراب، تنش، نگرانی و برانگیختگی فیزیولوژیک شدیدتر را نشان می‌دهد. بر اساس نظریه حالت-صفت اسپیلبرگر، اضطراب صفتی به یک سیستم هشدار روانیِ بیش‌فعال اشاره دارد که در طول زمان پایدار است و پایه‌ی پاسخ‌های اضطرابی (حالت اضطراب) فرد در موقعیت‌های مختلف را تشکیل می‌دهد (اسپیلبرگر، ۱۹۸۳).</w:t>
+      </w:r>
+    </w:p>
+    <w:p>
+      <w:pPr>
+        <w:bidi w:val="1"/>
+        <w:spacing w:lineRule="exact" w:line="580" w:after="0"/>
+        <w:jc w:val="both"/>
+      </w:pPr>
+      <w:r>
+        <w:rPr>
+          <w:rFonts w:ascii="B Nazanin" w:hAnsi="B Nazanin" w:cs="B Nazanin" w:hint="cs"/>
+          <w:sz w:val="24"/>
+          <w:szCs w:val="24"/>
+          <w:rtl/>
+          <w:lang w:bidi="fa-IR"/>
+        </w:rPr>
+        <w:t xml:space="preserve">اضطراب صفتی در ادبیات روانشناسی بازارهای مالی از توجه ویژه‌ای برخوردار شده است؛ زیرا ویژگی‌ای پایدار و قابل سنجش است که مستقیماً با نحوه پردازش عدم قطعیت و تهدید توسط فرد ارتباط دارد. شواهد نشان می‌دهند که افراد مضطرب به طور کلی به اجتناب از ریسک گرایش دارند و حتی در شرایطی که ارزش مورد انتظار گزینه‌ها یکسان است، گزینه‌های کم‌خطرتر را برمی‌گزینند؛ گرایشی که در رفتار مالی واقعی می‌تواند به شکل سبدهای محافظه‌کارانه یا اجتناب از تصمیم‌گیری نمود یابد (مانر و اشمیت</w:t>
+      </w:r>
+      <w:r>
+        <w:rPr>
+          <w:rFonts w:ascii="B Nazanin" w:hAnsi="B Nazanin" w:cs="B Nazanin" w:hint="cs"/>
+          <w:vertAlign w:val="superscript"/>
+          <w:rtl/>
+        </w:rPr>
+        <w:footnoteReference w:id="71"/>
+      </w:r>
+      <w:r>
+        <w:rPr>
+          <w:rFonts w:ascii="B Nazanin" w:hAnsi="B Nazanin" w:cs="B Nazanin" w:hint="cs"/>
+          <w:sz w:val="24"/>
+          <w:szCs w:val="24"/>
+          <w:rtl/>
+          <w:lang w:bidi="fa-IR"/>
+        </w:rPr>
+        <w:t xml:space="preserve">، ۲۰۰۶). با این حال، در شرایط فشار بازار، همین اجتناب می‌تواند به شکلی ناگهانی به واکنش‌های تکانشی برای فرار از تنش تبدیل شود. بنابراین، اضطراب صفتی را می‌توان یکی از متغیرهای فردی کلیدی در تبیین تنوع رفتار معامله‌گران دانست.</w:t>
+      </w:r>
+    </w:p>
+    <w:p>
+      <w:pPr>
+        <w:bidi w:val="1"/>
+        <w:spacing w:lineRule="exact" w:line="580" w:after="0"/>
+        <w:jc w:val="both"/>
+      </w:pPr>
+      <w:r>
+        <w:rPr>
+          <w:rFonts w:ascii="B Nazanin" w:hAnsi="B Nazanin" w:cs="B Nazanin" w:hint="cs"/>
+          <w:sz w:val="24"/>
+          <w:szCs w:val="24"/>
+          <w:rtl/>
+          <w:lang w:bidi="fa-IR"/>
+        </w:rPr>
+        <w:t xml:space="preserve">نکته مهم در فهم مفهومی این سازه، تمایز میان دو سطح «حالت» و «صفت» در نظریه اسپیلبرگر است. اضطراب حالتی به واکنش هیجانی گذرا و وابسته به موقعیت اطلاق می‌شود که با تنش و برانگیختگی فیزیولوژیک همراه است و با رفع موقعیت فروکش می‌کند؛ اما اضطراب صفتی، تفاوت فردی پایداری در فراوانی و شدت تجربه این حالت‌هاست و تعیین می‌کند که فرد با چه بسامدی در برابر عوامل استرس‌زا، واکنش اضطرابی نشان دهد (اسپیلبرگر، ۱۹۸۳). بر اساس این دیدگاه، معامله‌گر با اضطراب صفتی بالا، در مواجهه با نوسانات بازار، اپیزودهای مکررتر و شدیدتری از اضطراب حالتی را نسبت به دیگران تجربه می‌کند و در عمل، به طور مداوم با سطح پایه‌ای بالاتری از تنش روانی وارد فرآیند تصمیم‌گیری می‌شود؛ وضعیتی که تمام کارکردهای تحلیلی و رفتاری او را تحت تأثیر قرار می‌دهد.</w:t>
+      </w:r>
+    </w:p>
+    <w:p>
+      <w:pPr>
+        <w:bidi w:val="1"/>
+        <w:spacing w:lineRule="exact" w:line="580" w:after="0"/>
+        <w:jc w:val="both"/>
+      </w:pPr>
+      <w:r>
+        <w:rPr>
+          <w:rFonts w:ascii="B Nazanin" w:hAnsi="B Nazanin" w:cs="B Nazanin" w:hint="cs"/>
+          <w:b/>
+          <w:bCs/>
+          <w:sz w:val="24"/>
+          <w:szCs w:val="24"/>
+          <w:rtl/>
+          <w:lang w:bidi="fa-IR"/>
+        </w:rPr>
+        <w:t xml:space="preserve">تعریف عملیاتی:</w:t>
+      </w:r>
+      <w:r>
+        <w:rPr>
+          <w:rFonts w:ascii="B Nazanin" w:hAnsi="B Nazanin" w:cs="B Nazanin" w:hint="cs"/>
+          <w:sz w:val="24"/>
+          <w:szCs w:val="24"/>
+          <w:rtl/>
+          <w:lang w:bidi="fa-IR"/>
+        </w:rPr>
+        <w:t xml:space="preserve"> در پژوهش حاضر، منظور از اضطراب صفتی، نمره‌ای است که آزمودنی از پاسخگویی به ۲۰ گویه بخش دوم فرم پرسشنامه استاندارد اضطراب حالت-صفت اسپیلبرگر</w:t>
+      </w:r>
+      <w:r>
+        <w:rPr>
+          <w:rFonts w:ascii="B Nazanin" w:hAnsi="B Nazanin" w:cs="B Nazanin" w:hint="cs"/>
+          <w:vertAlign w:val="superscript"/>
+          <w:rtl/>
+        </w:rPr>
+        <w:footnoteReference w:id="14"/>
+      </w:r>
+      <w:r>
+        <w:rPr>
+          <w:rFonts w:ascii="B Nazanin" w:hAnsi="B Nazanin" w:cs="B Nazanin" w:hint="cs"/>
+          <w:sz w:val="24"/>
+          <w:szCs w:val="24"/>
+          <w:rtl/>
+          <w:lang w:bidi="fa-IR"/>
+        </w:rPr>
+        <w:t xml:space="preserve"> کسب می‌کند. نمرات بالاتر در این مقیاس، نشان‌دهنده سطح بالاتر اضطراب صفتی است. نمره‌گذاری گویه‌های این فرم بر اساس مقیاس ۴ درجه‌ای لیکرت (از ۱=تقریباً هرگز تا ۴=تقریباً همیشه) انجام می‌شود و دامنه نمره کل بین ۲۰ تا ۸۰ است. پایایی درونی این ابزار در مطالعات متعدد با ضرایب آلفای کرونباخ بالا تأیید شده است (اسپیلبرگر، ۱۹۸۳) و در ایران نیز پژوهش بشارت و همکاران (۱۳۹۵) ساختار عاملی آن را در نمونه‌های ایرانی مجدداً تأیید کرده است؛ پایایی نسخه فارسی این ابزار در پژوهش بشارت و همکاران (۱۳۹۵) با آلفای کرونباخ ۰٫۸۹ گزارش شده است.</w:t>
+      </w:r>
+    </w:p>
+    <w:p>
+      <w:pPr>
+        <w:pStyle w:val="Heading3"/>
+        <w:bidi w:val="1"/>
+        <w:jc w:val="right"/>
+      </w:pPr>
+      <w:r>
+        <w:rPr>
+          <w:rFonts w:ascii="B Nazanin" w:hAnsi="B Nazanin" w:cs="B Nazanin" w:hint="cs"/>
           <w:b/>
           <w:bCs/>
           <w:sz w:val="26"/>
           <w:szCs w:val="26"/>
-          <w:lang w:val="en-US"/>
-        </w:rPr>
-        <w:t xml:space="preserve"> (Trait Anxiety)</w:t>
+          <w:rtl/>
+          <w:lang w:bidi="fa-IR"/>
+        </w:rPr>
+        <w:t xml:space="preserve">۱-۶-۲. طرحواره‌های ناسازگار اولیه</w:t>
       </w:r>
     </w:p>
     <w:p>
@@ -3064,7 +3200,25 @@
           <w:rtl/>
           <w:lang w:bidi="fa-IR"/>
         </w:rPr>
-        <w:t xml:space="preserve"> اضطراب صفتی یک ویژگی شخصیتی پایدار است که تمایل فرد به درک موقعیت‌های مبهم یا چالش‌برانگیز به عنوان تهدیدآمیز و پاسخ به آن‌ها با اضطراب، تنش، نگرانی و برانگیختگی فیزیولوژیک شدیدتر را نشان می‌دهد. بر اساس نظریه حالت-صفت اسپیلبرگر، اضطراب صفتی به یک سیستم هشدار روانیِ بیش‌فعال اشاره دارد که در طول زمان پایدار است و پایه‌ی پاسخ‌های اضطرابی (حالت اضطراب) فرد در موقعیت‌های مختلف را تشکیل می‌دهد (اسپیلبرگر، ۱۹۸۳).</w:t>
+        <w:t xml:space="preserve"> طرحواره‌های ناسازگار اولیه، الگوهای هیجانی و شناختی عمیق، فراگیر و خود-آسیب‌رسانی هستند که در دوران کودکی یا نوجوانی شکل گرفته و در سراسر زندگی فرد تداوم می‌یابند. این الگوها که از خاطرات، هیجانات، شناخت‌واره‌ها و احساسات بدنی تشکیل شده‌اند، باورهای بنیادین و ناکارآمدی درباره خود و رابطه با دیگران هستند که از ناکامی در ارضای نیازهای هیجانی اساسی (مانند امنیت و دلبستگی) نشأت می‌گیرند (یانگ، کلوسکو و ویشار</w:t>
+      </w:r>
+      <w:r>
+        <w:rPr>
+          <w:rFonts w:ascii="B Nazanin" w:hAnsi="B Nazanin" w:cs="B Nazanin" w:hint="cs"/>
+          <w:vertAlign w:val="superscript"/>
+          <w:rtl/>
+        </w:rPr>
+        <w:footnoteReference w:id="72"/>
+      </w:r>
+      <w:r>
+        <w:rPr>
+          <w:rFonts w:ascii="B Nazanin" w:hAnsi="B Nazanin" w:cs="B Nazanin" w:hint="cs"/>
+          <w:sz w:val="24"/>
+          <w:szCs w:val="24"/>
+          <w:rtl/>
+          <w:lang w:bidi="fa-IR"/>
+        </w:rPr>
+        <w:t xml:space="preserve">، ۲۰۰۳).</w:t>
       </w:r>
     </w:p>
     <w:p>
@@ -3081,25 +3235,7 @@
           <w:rtl/>
           <w:lang w:bidi="fa-IR"/>
         </w:rPr>
-        <w:t xml:space="preserve">اضطراب صفتی در ادبیات روانشناسی بازارهای مالی از توجه ویژه‌ای برخوردار شده است؛ زیرا ویژگی‌ای پایدار و قابل سنجش است که مستقیماً با نحوه پردازش عدم قطعیت و تهدید توسط فرد ارتباط دارد. شواهد نشان می‌دهند که افراد مضطرب به طور کلی به اجتناب از ریسک گرایش دارند و حتی در شرایطی که ارزش مورد انتظار گزینه‌ها یکسان است، گزینه‌های کم‌خطرتر را برمی‌گزینند؛ گرایشی که در رفتار مالی واقعی می‌تواند به شکل سبدهای محافظه‌کارانه یا اجتناب از تصمیم‌گیری نمود یابد (مانر و اشمیت</w:t>
-      </w:r>
-      <w:r>
-        <w:rPr>
-          <w:rFonts w:ascii="B Nazanin" w:hAnsi="B Nazanin" w:cs="B Nazanin" w:hint="cs"/>
-          <w:vertAlign w:val="superscript"/>
-          <w:rtl/>
-        </w:rPr>
-        <w:footnoteReference w:id="74"/>
-      </w:r>
-      <w:r>
-        <w:rPr>
-          <w:rFonts w:ascii="B Nazanin" w:hAnsi="B Nazanin" w:cs="B Nazanin" w:hint="cs"/>
-          <w:sz w:val="24"/>
-          <w:szCs w:val="24"/>
-          <w:rtl/>
-          <w:lang w:bidi="fa-IR"/>
-        </w:rPr>
-        <w:t xml:space="preserve">، ۲۰۰۶). با این حال، در شرایط فشار بازار، همین اجتناب می‌تواند به شکلی ناگهانی به واکنش‌های تکانشی برای فرار از تنش تبدیل شود. بنابراین، اضطراب صفتی را می‌توان یکی از متغیرهای فردی کلیدی در تبیین تنوع رفتار معامله‌گران دانست.</w:t>
+        <w:t xml:space="preserve">طرحواره‌های ناسازگار اولیه در حوزه‌هایی سازمان می‌یابند که هسته مشترک آن‌ها ناکامی در ارضای نیازهای هیجانی بنیادین است؛ نیاز هایی مانند امنیت، دلبستگی، خودمختاری، پذیرش و محبت که هرگاه در محیط خانواده به طور مزمن برآورده نشوند، زمینه‌ساز شکل‌گیری طرحواره‌ها در حوزه‌هایی نظیر «بریدگی و طرد» و «محدودیت‌های مختل» می‌شوند (یانگ و همکاران، ۲۰۰۳). این طرحواره‌ها در بیشتر افراد، در حالت خفته باقی می‌مانند و در مواجهه با موقعیت‌های فعال‌ساز — به ویژه موقعیت‌های استرس‌زا و پرفشار — فعال می‌شوند؛ فعال‌سازی‌ای که ادراک، تفسیر و حافظه فرد از موقعیت را رنگ‌آمیزی کرده و رفتار او را جهت می‌دهد (آرنتز و جیکوب، ۲۰۱۲). در بافت معامله‌گری، یک زیان مالی یا نوسان شدید می‌تواند نقش چنین فعال‌سازی را ایفا کند و به جای واکنش متوازن، واکنش‌های هیجانی و رفتاری طرحواره‌محور را برانگیزد.</w:t>
       </w:r>
     </w:p>
     <w:p>
@@ -3111,23 +3247,6 @@
       <w:r>
         <w:rPr>
           <w:rFonts w:ascii="B Nazanin" w:hAnsi="B Nazanin" w:cs="B Nazanin" w:hint="cs"/>
-          <w:sz w:val="24"/>
-          <w:szCs w:val="24"/>
-          <w:rtl/>
-          <w:lang w:bidi="fa-IR"/>
-        </w:rPr>
-        <w:t xml:space="preserve">نکته مهم در فهم مفهومی این سازه، تمایز میان دو سطح «حالت» و «صفت» در نظریه اسپیلبرگر است. اضطراب حالتی به واکنش هیجانی گذرا و وابسته به موقعیت اطلاق می‌شود که با تنش و برانگیختگی فیزیولوژیک همراه است و با رفع موقعیت فروکش می‌کند؛ اما اضطراب صفتی، تفاوت فردی پایداری در فراوانی و شدت تجربه این حالت‌هاست و تعیین می‌کند که فرد با چه بسامدی در برابر عوامل استرس‌زا، واکنش اضطرابی نشان دهد (اسپیلبرگر، ۱۹۸۳). بر اساس این دیدگاه، معامله‌گر با اضطراب صفتی بالا، در مواجهه با نوسانات بازار، اپیزودهای مکررتر و شدیدتری از اضطراب حالتی را نسبت به دیگران تجربه می‌کند و در عمل، به طور مداوم با سطح پایه‌ای بالاتری از تنش روانی وارد فرآیند تصمیم‌گیری می‌شود؛ وضعیتی که تمام کارکردهای تحلیلی و رفتاری او را تحت تأثیر قرار می‌دهد.</w:t>
-      </w:r>
-    </w:p>
-    <w:p>
-      <w:pPr>
-        <w:bidi w:val="1"/>
-        <w:spacing w:lineRule="exact" w:line="580" w:after="0"/>
-        <w:jc w:val="both"/>
-      </w:pPr>
-      <w:r>
-        <w:rPr>
-          <w:rFonts w:ascii="B Nazanin" w:hAnsi="B Nazanin" w:cs="B Nazanin" w:hint="cs"/>
           <w:b/>
           <w:bCs/>
           <w:sz w:val="24"/>
@@ -3145,26 +3264,7 @@
           <w:rtl/>
           <w:lang w:bidi="fa-IR"/>
         </w:rPr>
-        <w:t xml:space="preserve"> در پژوهش حاضر، منظور از اضطراب صفتی، نمره‌ای است که آزمودنی از پاسخگویی به ۲۰ گویه بخش دوم فرم</w:t>
-      </w:r>
-      <w:r>
-        <w:rPr>
-          <w:rFonts w:ascii="Times New Roman" w:hAnsi="Times New Roman" w:cs="Times New Roman"/>
-          <w:sz w:val="22"/>
-          <w:szCs w:val="22"/>
-          <w:lang w:val="en-US"/>
-        </w:rPr>
-        <w:t xml:space="preserve"> (Y-2) </w:t>
-      </w:r>
-      <w:r>
-        <w:rPr>
-          <w:rFonts w:ascii="B Nazanin" w:hAnsi="B Nazanin" w:cs="B Nazanin" w:hint="cs"/>
-          <w:sz w:val="24"/>
-          <w:szCs w:val="24"/>
-          <w:rtl/>
-          <w:lang w:bidi="fa-IR"/>
-        </w:rPr>
-        <w:t xml:space="preserve">پرسشنامه استاندارد اضطراب حالت-صفت اسپیلبرگر </w:t>
+        <w:t xml:space="preserve"> در این پژوهش، منظور از طرحواره‌های ناسازگار اولیه، نمره‌ای است که آزمودنی از پرسشنامه طرحواره یانگ-فرم کوتاه</w:t>
       </w:r>
       <w:r>
         <w:rPr>
@@ -3172,17 +3272,35 @@
           <w:vertAlign w:val="superscript"/>
           <w:rtl/>
         </w:rPr>
-        <w:footnoteReference w:id="14"/>
-      </w:r>
-      <w:r>
-        <w:rPr>
-          <w:rFonts w:ascii="B Nazanin" w:hAnsi="B Nazanin" w:cs="B Nazanin" w:hint="cs"/>
-          <w:sz w:val="24"/>
-          <w:szCs w:val="24"/>
-          <w:rtl/>
-          <w:lang w:bidi="fa-IR"/>
-        </w:rPr>
-        <w:t xml:space="preserve"> کسب می‌کند. نمرات بالاتر در این مقیاس، نشان‌دهنده سطح بالاتر اضطراب صفتی است. نمره‌گذاری گویه‌های این فرم بر اساس مقیاس ۴ درجه‌ای لیکرت (از ۱=تقریباً هرگز تا ۴=تقریباً همیشه) انجام می‌شود و دامنه نمره کل بین ۲۰ تا ۸۰ است. پایایی درونی این ابزار در مطالعات متعدد با ضرایب آلفای کرونباخ بالا تأیید شده است (اسپیلبرگر، ۱۹۸۳) و در ایران نیز پژوهش بشارت و همکاران (۱۳۹۵) ساختار عاملی آن را در نمونه‌های ایرانی مجدداً تأیید کرده است؛ پایایی نسخه فارسی این ابزار در پژوهش بشارت و همکاران (۱۳۹۵) با آلفای کرونباخ ۰٫۸۹ گزارش شده است.</w:t>
+        <w:footnoteReference w:id="15"/>
+      </w:r>
+      <w:r>
+        <w:rPr>
+          <w:rFonts w:ascii="B Nazanin" w:hAnsi="B Nazanin" w:cs="B Nazanin" w:hint="cs"/>
+          <w:sz w:val="24"/>
+          <w:szCs w:val="24"/>
+          <w:rtl/>
+          <w:lang w:bidi="fa-IR"/>
+        </w:rPr>
+        <w:t xml:space="preserve"> که دارای ۷۵ گویه و ۱۵ خرده‌مقیاس است، به دست می‌آورد. نمره‌گذاری گویه‌ها بر اساس مقیاس ۶ درجه‌ای لیکرت (از ۱=کاملاً درباره من نادرست است تا ۶=کاملاً مرا توصیف می‌کند) انجام می‌شود؛ برای هر طرحواره نمره‌ای بین ۵ تا ۳۰ به دست می‌آید و نمره بالاتر، نشان‌دهنده شدت بیشتر آن طرحواره است (یانگ</w:t>
+      </w:r>
+      <w:r>
+        <w:rPr>
+          <w:rFonts w:ascii="B Nazanin" w:hAnsi="B Nazanin" w:cs="B Nazanin" w:hint="cs"/>
+          <w:vertAlign w:val="superscript"/>
+          <w:rtl/>
+        </w:rPr>
+        <w:footnoteReference w:id="73"/>
+      </w:r>
+      <w:r>
+        <w:rPr>
+          <w:rFonts w:ascii="B Nazanin" w:hAnsi="B Nazanin" w:cs="B Nazanin" w:hint="cs"/>
+          <w:sz w:val="24"/>
+          <w:szCs w:val="24"/>
+          <w:rtl/>
+          <w:lang w:bidi="fa-IR"/>
+        </w:rPr>
+        <w:t xml:space="preserve">، ۱۹۹۸). پایایی نسخه فارسی این پرسشنامه در پژوهش یوسفی (۱۳۹۶) با ضرایب آلفای ۰٫۶۸ تا ۰٫۸۵ برای خرده‌مقیاس‌ها گزارش شده و روایی سازه آن در نمونه غیربالینی قابل قبول بوده است (یوسفی، ۱۳۹۶).</w:t>
       </w:r>
     </w:p>
     <w:p>
@@ -3201,18 +3319,7 @@
           <w:rtl/>
           <w:lang w:bidi="fa-IR"/>
         </w:rPr>
-        <w:t xml:space="preserve">۱-۶-۲. طرحواره‌های ناسازگار اولیه</w:t>
-      </w:r>
-      <w:r>
-        <w:rPr>
-          <w:rFonts w:ascii="Times New Roman" w:hAnsi="Times New Roman" w:cs="Times New Roman"/>
-          <w:b/>
-          <w:bCs/>
-          <w:sz w:val="26"/>
-          <w:szCs w:val="26"/>
-          <w:lang w:val="en-US"/>
-        </w:rPr>
-        <w:t xml:space="preserve"> (Early Maladaptive Schemas)</w:t>
+        <w:t xml:space="preserve">۱-۶-۳. رفتارهای مالی پرخطر</w:t>
       </w:r>
     </w:p>
     <w:p>
@@ -3241,25 +3348,7 @@
           <w:rtl/>
           <w:lang w:bidi="fa-IR"/>
         </w:rPr>
-        <w:t xml:space="preserve"> طرحواره‌های ناسازگار اولیه، الگوهای هیجانی و شناختی عمیق، فراگیر و خود-آسیب‌رسانی هستند که در دوران کودکی یا نوجوانی شکل گرفته و در سراسر زندگی فرد تداوم می‌یابند. این الگوها که از خاطرات، هیجانات، شناخت‌واره‌ها و احساسات بدنی تشکیل شده‌اند، باورهای بنیادین و ناکارآمدی درباره خود و رابطه با دیگران هستند که از ناکامی در ارضای نیازهای هیجانی اساسی (مانند امنیت و دلبستگی) نشأت می‌گیرند (یانگ، کلوسکو و ویشار</w:t>
-      </w:r>
-      <w:r>
-        <w:rPr>
-          <w:rFonts w:ascii="B Nazanin" w:hAnsi="B Nazanin" w:cs="B Nazanin" w:hint="cs"/>
-          <w:vertAlign w:val="superscript"/>
-          <w:rtl/>
-        </w:rPr>
-        <w:footnoteReference w:id="75"/>
-      </w:r>
-      <w:r>
-        <w:rPr>
-          <w:rFonts w:ascii="B Nazanin" w:hAnsi="B Nazanin" w:cs="B Nazanin" w:hint="cs"/>
-          <w:sz w:val="24"/>
-          <w:szCs w:val="24"/>
-          <w:rtl/>
-          <w:lang w:bidi="fa-IR"/>
-        </w:rPr>
-        <w:t xml:space="preserve">، ۲۰۰۳).</w:t>
+        <w:t xml:space="preserve"> رفتارهای مالی پرخطر، به مجموعه‌ای از تصمیمات و اعمالی اطلاق می‌شود که در آن‌ها، سطح ریسک پذیرفته‌شده، نامتناسب با بازده احتمالی بوده و اغلب از هیجانات کنترل‌نشده، سوگیری‌های شناختی و تکانشگری نشأت می‌گیرد، تا اینکه محصول یک تحلیل منطقی و محاسبه‌شده باشد (بیکر و نوفسینگر، ۲۰۱۰). این متغیر، در این پژوهش، از طریق مفهوم "تحمل ریسک مالی" سنجیده می‌شود.</w:t>
       </w:r>
     </w:p>
     <w:p>
@@ -3276,7 +3365,7 @@
           <w:rtl/>
           <w:lang w:bidi="fa-IR"/>
         </w:rPr>
-        <w:t xml:space="preserve">طرحواره‌های ناسازگار اولیه در حوزه‌هایی سازمان می‌یابند که هسته مشترک آن‌ها ناکامی در ارضای نیازهای هیجانی بنیادین است؛ نیاز هایی مانند امنیت، دلبستگی، خودمختاری، پذیرش و محبت که هرگاه در محیط خانواده به طور مزمن برآورده نشوند، زمینه‌ساز شکل‌گیری طرحواره‌ها در حوزه‌هایی نظیر «بریدگی و طرد» و «محدودیت‌های مختل» می‌شوند (یانگ و همکاران، ۲۰۰۳). این طرحواره‌ها در بیشتر افراد، در حالت خفته باقی می‌مانند و در مواجهه با موقعیت‌های فعال‌ساز — به ویژه موقعیت‌های استرس‌زا و پرفشار — فعال می‌شوند؛ فعال‌سازی‌ای که ادراک، تفسیر و حافظه فرد از موقعیت را رنگ‌آمیزی کرده و رفتار او را جهت می‌دهد (آرنتز و جیکوب، ۲۰۱۲). در بافت معامله‌گری، یک زیان مالی یا نوسان شدید می‌تواند نقش چنین فعال‌سازی را ایفا کند و به جای واکنش متوازن، واکنش‌های هیجانی و رفتاری طرحواره‌محور را برانگیزد.</w:t>
+        <w:t xml:space="preserve">در ادبیات مالی رفتاری، سازه رفتارهای مالی پرخطر با چهار بُعد اصلی شناسایی و سنجیده می‌شود: «معامله‌گری بیش از حد» که به انجام معاملات فراتر از ضرورت اطلاعاتی و برخاسته از بیش‌اطمینانی اشاره دارد؛ «اثر گرایش» که تمایل به فروش زودهنگام دارایی‌های سودده و نگهداری طولانی‌مدت دارایی‌های زیان‌ده است؛ «رفتار گله‌ای» که تقلید از دیگر معامله‌گران به جای اتکا بر تحلیل شخصی، به ویژه در شرایط پرنوسان، محسوب می‌شود؛ و «تمرکز ناکافی سبد دارایی» که از سوگیری‌هایی مانند تمایل به آشنایی نشأت می‌گیرد (بیکر و نوفسینگر، ۲۰۱۰؛ باربر و اودین، ۲۰۰۰؛ شفرین و استاتمن، ۱۹۸۵؛ هوانگ و سالمون، ۲۰۰۴؛ گوتزمن و کومار، ۲۰۰۸). در پژوهش حاضر، این مجموعه از ابعاد در قالب سازه تحمل ریسک مالی اندازه‌گیری می‌شود.</w:t>
       </w:r>
     </w:p>
     <w:p>
@@ -3288,24 +3377,12 @@
       <w:r>
         <w:rPr>
           <w:rFonts w:ascii="B Nazanin" w:hAnsi="B Nazanin" w:cs="B Nazanin" w:hint="cs"/>
-          <w:b/>
-          <w:bCs/>
-          <w:sz w:val="24"/>
-          <w:szCs w:val="24"/>
-          <w:rtl/>
-          <w:lang w:bidi="fa-IR"/>
-        </w:rPr>
-        <w:t xml:space="preserve">تعریف عملیاتی:</w:t>
-      </w:r>
-      <w:r>
-        <w:rPr>
-          <w:rFonts w:ascii="B Nazanin" w:hAnsi="B Nazanin" w:cs="B Nazanin" w:hint="cs"/>
-          <w:sz w:val="24"/>
-          <w:szCs w:val="24"/>
-          <w:rtl/>
-          <w:lang w:bidi="fa-IR"/>
-        </w:rPr>
-        <w:t xml:space="preserve"> در این پژوهش، منظور از طرحواره‌های ناسازگار اولیه، نمره‌ای است که آزمودنی از پرسشنامه طرحواره یانگ-فرم کوتاه </w:t>
+          <w:sz w:val="24"/>
+          <w:szCs w:val="24"/>
+          <w:rtl/>
+          <w:lang w:bidi="fa-IR"/>
+        </w:rPr>
+        <w:t xml:space="preserve">تحمل ریسک مالی</w:t>
       </w:r>
       <w:r>
         <w:rPr>
@@ -3313,17 +3390,17 @@
           <w:vertAlign w:val="superscript"/>
           <w:rtl/>
         </w:rPr>
-        <w:footnoteReference w:id="15"/>
-      </w:r>
-      <w:r>
-        <w:rPr>
-          <w:rFonts w:ascii="B Nazanin" w:hAnsi="B Nazanin" w:cs="B Nazanin" w:hint="cs"/>
-          <w:sz w:val="24"/>
-          <w:szCs w:val="24"/>
-          <w:rtl/>
-          <w:lang w:bidi="fa-IR"/>
-        </w:rPr>
-        <w:t xml:space="preserve"> که دارای ۷۵ گویه و ۱۵ خرده‌مقیاس است، به دست می‌آورد. نمره‌گذاری گویه‌ها بر اساس مقیاس ۶ درجه‌ای لیکرت (از ۱=کاملاً درباره من نادرست است تا ۶=کاملاً مرا توصیف می‌کند) انجام می‌شود؛ برای هر طرحواره نمره‌ای بین ۵ تا ۳۰ به دست می‌آید و نمره بالاتر، نشان‌دهنده شدت بیشتر آن طرحواره است (یانگ</w:t>
+        <w:footnoteReference w:id="16"/>
+      </w:r>
+      <w:r>
+        <w:rPr>
+          <w:rFonts w:ascii="B Nazanin" w:hAnsi="B Nazanin" w:cs="B Nazanin" w:hint="cs"/>
+          <w:sz w:val="24"/>
+          <w:szCs w:val="24"/>
+          <w:rtl/>
+          <w:lang w:bidi="fa-IR"/>
+        </w:rPr>
+        <w:t xml:space="preserve"> به بیشینه سطح عدم قطعیتی اطلاق می‌شود که یک سرمایه‌گذار در اتخاذ تصمیم‌های مالی مایل به پذیرش آن است و میزان آمادگی روانشناختی فرد برای مواجهه با پیامدهای نامطلوب احتمالی را منعکس می‌کند. در این تعریف، تفکیک میان ظرفیت عینی ریسک — که به منابع و شرایط اقتصادی فرد بستگی دارد — و تحمل ذهنی ریسک — که ویژگی‌ای ادراکی و شخصیتی است — اهمیت بنیادین دارد؛ ناهماهنگی میان این دو سطح، به‌ویژه زمانی که تحمل ذهنی از ظرفیت عینی فراتر رود، یکی از زمینه‌های اصلی تصمیم‌های مالی آسیب‌زا محسوب می‌شود (گرابل و لایتون</w:t>
       </w:r>
       <w:r>
         <w:rPr>
@@ -3331,110 +3408,17 @@
           <w:vertAlign w:val="superscript"/>
           <w:rtl/>
         </w:rPr>
-        <w:footnoteReference w:id="76"/>
-      </w:r>
-      <w:r>
-        <w:rPr>
-          <w:rFonts w:ascii="B Nazanin" w:hAnsi="B Nazanin" w:cs="B Nazanin" w:hint="cs"/>
-          <w:sz w:val="24"/>
-          <w:szCs w:val="24"/>
-          <w:rtl/>
-          <w:lang w:bidi="fa-IR"/>
-        </w:rPr>
-        <w:t xml:space="preserve">، ۱۹۹۸). پایایی نسخه فارسی این پرسشنامه در پژوهش یوسفی (۱۳۹۶) با ضرایب آلفای ۰٫۶۸ تا ۰٫۸۵ برای خرده‌مقیاس‌ها گزارش شده و روایی سازه آن در نمونه غیربالینی قابل قبول بوده است (یوسفی، ۱۳۹۶).</w:t>
-      </w:r>
-    </w:p>
-    <w:p>
-      <w:pPr>
-        <w:pStyle w:val="Heading3"/>
-        <w:bidi w:val="1"/>
-        <w:jc w:val="right"/>
-      </w:pPr>
-      <w:r>
-        <w:rPr>
-          <w:rFonts w:ascii="B Nazanin" w:hAnsi="B Nazanin" w:cs="B Nazanin" w:hint="cs"/>
-          <w:b/>
-          <w:bCs/>
-          <w:sz w:val="26"/>
-          <w:szCs w:val="26"/>
-          <w:rtl/>
-          <w:lang w:bidi="fa-IR"/>
-        </w:rPr>
-        <w:t xml:space="preserve">۱-۶-۳. رفتارهای مالی پرخطر</w:t>
-      </w:r>
-      <w:r>
-        <w:rPr>
-          <w:rFonts w:ascii="Times New Roman" w:hAnsi="Times New Roman" w:cs="Times New Roman"/>
-          <w:b/>
-          <w:bCs/>
-          <w:sz w:val="26"/>
-          <w:szCs w:val="26"/>
-          <w:lang w:val="en-US"/>
-        </w:rPr>
-        <w:t xml:space="preserve"> (High-Risk Financial Behaviors)</w:t>
-      </w:r>
-    </w:p>
-    <w:p>
-      <w:pPr>
-        <w:bidi w:val="1"/>
-        <w:spacing w:lineRule="exact" w:line="580" w:after="0"/>
-        <w:jc w:val="both"/>
-      </w:pPr>
-      <w:r>
-        <w:rPr>
-          <w:rFonts w:ascii="B Nazanin" w:hAnsi="B Nazanin" w:cs="B Nazanin" w:hint="cs"/>
-          <w:b/>
-          <w:bCs/>
-          <w:sz w:val="24"/>
-          <w:szCs w:val="24"/>
-          <w:rtl/>
-          <w:lang w:bidi="fa-IR"/>
-        </w:rPr>
-        <w:t xml:space="preserve">تعریف نظری:</w:t>
-      </w:r>
-      <w:r>
-        <w:rPr>
-          <w:rFonts w:ascii="B Nazanin" w:hAnsi="B Nazanin" w:cs="B Nazanin" w:hint="cs"/>
-          <w:sz w:val="24"/>
-          <w:szCs w:val="24"/>
-          <w:rtl/>
-          <w:lang w:bidi="fa-IR"/>
-        </w:rPr>
-        <w:t xml:space="preserve"> رفتارهای مالی پرخطر، به مجموعه‌ای از تصمیمات و اعمالی اطلاق می‌شود که در آن‌ها، سطح ریسک پذیرفته‌شده، نامتناسب با بازده احتمالی بوده و اغلب از هیجانات کنترل‌نشده، سوگیری‌های شناختی و تکانشگری نشأت می‌گیرد، تا اینکه محصول یک تحلیل منطقی و محاسبه‌شده باشد (بیکر و نوفسینگر، ۲۰۱۰). این متغیر، در این پژوهش، از طریق مفهوم "تحمل ریسک مالی" سنجیده می‌شود.</w:t>
-      </w:r>
-    </w:p>
-    <w:p>
-      <w:pPr>
-        <w:bidi w:val="1"/>
-        <w:spacing w:lineRule="exact" w:line="580" w:after="0"/>
-        <w:jc w:val="both"/>
-      </w:pPr>
-      <w:r>
-        <w:rPr>
-          <w:rFonts w:ascii="B Nazanin" w:hAnsi="B Nazanin" w:cs="B Nazanin" w:hint="cs"/>
-          <w:sz w:val="24"/>
-          <w:szCs w:val="24"/>
-          <w:rtl/>
-          <w:lang w:bidi="fa-IR"/>
-        </w:rPr>
-        <w:t xml:space="preserve">در ادبیات مالی رفتاری، سازه رفتارهای مالی پرخطر با چهار بُعد اصلی شناسایی و سنجیده می‌شود: «معامله‌گری بیش از حد» که به انجام معاملات فراتر از ضرورت اطلاعاتی و برخاسته از بیش‌اطمینانی اشاره دارد؛ «اثر گرایش» که تمایل به فروش زودهنگام دارایی‌های سودده و نگهداری طولانی‌مدت دارایی‌های زیان‌ده است؛ «رفتار گله‌ای» که تقلید از دیگر معامله‌گران به جای اتکا بر تحلیل شخصی، به ویژه در شرایط پرنوسان، محسوب می‌شود؛ و «تمرکز ناکافی سبد دارایی» که از سوگیری‌هایی مانند تمایل به آشنایی نشأت می‌گیرد (بیکر و نوفسینگر، ۲۰۱۰؛ باربر و اودین، ۲۰۰۰؛ شفرین و استاتمن، ۱۹۸۵؛ هوانگ و سالمون، ۲۰۰۴؛ گوتزمن و کومار، ۲۰۰۸). در پژوهش حاضر، این مجموعه از ابعاد در قالب سازه تحمل ریسک مالی اندازه‌گیری می‌شود.</w:t>
-      </w:r>
-    </w:p>
-    <w:p>
-      <w:pPr>
-        <w:bidi w:val="1"/>
-        <w:spacing w:lineRule="exact" w:line="580" w:after="0"/>
-        <w:jc w:val="both"/>
-      </w:pPr>
-      <w:r>
-        <w:rPr>
-          <w:rFonts w:ascii="B Nazanin" w:hAnsi="B Nazanin" w:cs="B Nazanin" w:hint="cs"/>
-          <w:sz w:val="24"/>
-          <w:szCs w:val="24"/>
-          <w:rtl/>
-          <w:lang w:bidi="fa-IR"/>
-        </w:rPr>
-        <w:t xml:space="preserve">تحمل ریسک مالی </w:t>
+        <w:footnoteReference w:id="74"/>
+      </w:r>
+      <w:r>
+        <w:rPr>
+          <w:rFonts w:ascii="B Nazanin" w:hAnsi="B Nazanin" w:cs="B Nazanin" w:hint="cs"/>
+          <w:sz w:val="24"/>
+          <w:szCs w:val="24"/>
+          <w:rtl/>
+          <w:lang w:bidi="fa-IR"/>
+        </w:rPr>
+        <w:t xml:space="preserve">، ۱۹۹۹). البته اگرچه تحمل ریسک یک نگرش و رفتار پرخطر یک عمل است، شواهد گسترده پژوهشی از روایی پیش‌بین بالای این مقیاس برای رفتار واقعی مالی حمایت می‌کنند؛ از این رو، مقیاس یادشده شاخص نیابتی قابل اعتمادی برای سنجش تمایل به رفتارهای مالی پرخطر به شمار می‌رود (گرابل</w:t>
       </w:r>
       <w:r>
         <w:rPr>
@@ -3442,43 +3426,7 @@
           <w:vertAlign w:val="superscript"/>
           <w:rtl/>
         </w:rPr>
-        <w:footnoteReference w:id="16"/>
-      </w:r>
-      <w:r>
-        <w:rPr>
-          <w:rFonts w:ascii="B Nazanin" w:hAnsi="B Nazanin" w:cs="B Nazanin" w:hint="cs"/>
-          <w:sz w:val="24"/>
-          <w:szCs w:val="24"/>
-          <w:rtl/>
-          <w:lang w:bidi="fa-IR"/>
-        </w:rPr>
-        <w:t xml:space="preserve"> به بیشینه سطح عدم قطعیتی اطلاق می‌شود که یک سرمایه‌گذار در اتخاذ تصمیم‌های مالی مایل به پذیرش آن است و میزان آمادگی روانشناختی فرد برای مواجهه با پیامدهای نامطلوب احتمالی را منعکس می‌کند. در این تعریف، تفکیک میان ظرفیت عینی ریسک — که به منابع و شرایط اقتصادی فرد بستگی دارد — و تحمل ذهنی ریسک — که ویژگی‌ای ادراکی و شخصیتی است — اهمیت بنیادین دارد؛ ناهماهنگی میان این دو سطح، به‌ویژه زمانی که تحمل ذهنی از ظرفیت عینی فراتر رود، یکی از زمینه‌های اصلی تصمیم‌های مالی آسیب‌زا محسوب می‌شود (گرابل و لایتون</w:t>
-      </w:r>
-      <w:r>
-        <w:rPr>
-          <w:rFonts w:ascii="B Nazanin" w:hAnsi="B Nazanin" w:cs="B Nazanin" w:hint="cs"/>
-          <w:vertAlign w:val="superscript"/>
-          <w:rtl/>
-        </w:rPr>
-        <w:footnoteReference w:id="77"/>
-      </w:r>
-      <w:r>
-        <w:rPr>
-          <w:rFonts w:ascii="B Nazanin" w:hAnsi="B Nazanin" w:cs="B Nazanin" w:hint="cs"/>
-          <w:sz w:val="24"/>
-          <w:szCs w:val="24"/>
-          <w:rtl/>
-          <w:lang w:bidi="fa-IR"/>
-        </w:rPr>
-        <w:t xml:space="preserve">، ۱۹۹۹). البته اگرچه تحمل ریسک یک نگرش و رفتار پرخطر یک عمل است، شواهد گسترده پژوهشی از روایی پیش‌بین بالای این مقیاس برای رفتار واقعی مالی حمایت می‌کنند؛ از این رو، مقیاس یادشده شاخص نیابتی قابل اعتمادی برای سنجش تمایل به رفتارهای مالی پرخطر به شمار می‌رود (گرابل</w:t>
-      </w:r>
-      <w:r>
-        <w:rPr>
-          <w:rFonts w:ascii="B Nazanin" w:hAnsi="B Nazanin" w:cs="B Nazanin" w:hint="cs"/>
-          <w:vertAlign w:val="superscript"/>
-          <w:rtl/>
-        </w:rPr>
-        <w:footnoteReference w:id="78"/>
+        <w:footnoteReference w:id="75"/>
       </w:r>
       <w:r>
         <w:rPr>
@@ -3647,7 +3595,7 @@
           <w:rtl/>
           <w:lang w:bidi="fa-IR"/>
         </w:rPr>
-        <w:t xml:space="preserve">فصل حاضر به مرور جامع مبانی نظری و پیشینه تجربی متغیرهای اصلی مطالعه حاضر اختصاص دارد. در مدل مفهومی این مطالعه، اضطراب صفتی به‌عنوان متغیر مستقل، رفتارهای مالی پرخطر به‌عنوان متغیر وابسته و طرحواره‌های ناسازگار اولیه به‌عنوان متغیر میانجی در نظر گرفته شده‌اند. مبانی نظری پژوهش ریشه در رویکردهای شناختی دارد؛ در دیدگاه بک، رویدادها به‌خودی‌خود موجب شکل‌گیری هیجان‌ها نمی‌شوند، بلکه تفسیر و ارزیابی فرد از آن رویدادهاست که واکنش‌های هیجانی را می‌سازد (بک، ۱۹۷۶). بر این اساس، اضطراب صفتی را می‌توان نوعی آسیب‌پذیری شناختی-هیجانی پایدار دانست که بر شیوه پردازش اطلاعات و تصمیم‌گیری اثر می‌گذارد. از سوی دیگر، طرحواره‌های ناسازگار اولیه در مدل یانگ، الگوهایی فراگیر و عمیق هستند که در جریان رشد اولیه شکل گرفته‌اند و ادراک فرد از خود و محیط را در بزرگسالی نیز هدایت می‌کنند (یانگ و همکاران، ۲۰۰۳). مرور این چارچوب‌های نظری و یافته‌های تجربی برخاسته از آن‌ها به تبیین دقیق‌تر مکانیسم‌های شناختی و هیجانی حاکم بر تصمیم‌گیری معامله‌گران بازارهای مالی </w:t>
+        <w:t xml:space="preserve">فصل حاضر به مرور جامع مبانی نظری و پیشینه تجربی متغیرهای اصلی مطالعه حاضر اختصاص دارد. در مدل مفهومی این مطالعه، اضطراب صفتی به‌عنوان متغیر مستقل، رفتارهای مالی پرخطر به‌عنوان متغیر وابسته و طرحواره‌های ناسازگار اولیه به‌عنوان متغیر میانجی در نظر گرفته شده‌اند. مبانی نظری پژوهش ریشه در رویکردهای شناختی دارد؛ در دیدگاه بک، رویدادها به‌خودی‌خود موجب شکل‌گیری هیجان‌ها نمی‌شوند، بلکه تفسیر و ارزیابی فرد از آن رویدادهاست که واکنش‌های هیجانی را می‌سازد (بک، ۱۹۷۶). بر این اساس، اضطراب صفتی را می‌توان نوعی آسیب‌پذیری شناختی-هیجانی پایدار دانست که بر شیوه پردازش اطلاعات و تصمیم‌گیری اثر می‌گذارد. از سوی دیگر، طرحواره‌های ناسازگار اولیه در مدل یانگ، الگوهایی فراگیر و عمیق هستند که در جریان رشد اولیه شکل گرفته‌اند و ادراک فرد از خود و محیط را در بزرگسالی نیز هدایت می‌کنند (یانگ و همکاران، ۲۰۰۳). مرور این چارچوب‌های نظری و یافته‌های تجربی برخاسته از آن‌ها به تبیین دقیق‌تر مکانیسم‌های شناختی و هیجانی حاکم بر تصمیم‌گیری معامله‌گران بازارهای مالی</w:t>
       </w:r>
       <w:r>
         <w:rPr>
@@ -3682,7 +3630,7 @@
           <w:rtl/>
           <w:lang w:bidi="fa-IR"/>
         </w:rPr>
-        <w:t xml:space="preserve">ساختار فصل حاضر مسیر مشخصی را طی می‌کند. نخست در بخش‌های ۲-۲-۱ تا ۲-۲-۳، تعاریف، نظریه‌ها و ابعاد هر یک از متغیرهای پژوهش به‌طور مجزا بررسی می‌شود. در ادامه، در بخش ۲-۲-۴ روابط بین متغیرها و مدل نظری میانجی‌گری تحلیل می‌گردد؛ از جمله روابط دوجانبه میان اضطراب صفتی و رفتارهای مالی پرخطر و نقش طرحواره‌های ناسازگار اولیه در تبیین این روابط. سپس در بخش ۲-۳ پیشینه پژوهشی داخلی و خارجی مرور می‌شود و مدل میانجی‌گری پژوهش در پرتو آن به تصویر درمی‌آید؛ هدف، مشخص‌شدن شکاف پژوهشی </w:t>
+        <w:t xml:space="preserve">ساختار فصل حاضر مسیر مشخصی را طی می‌کند. نخست در بخش‌های ۲-۲-۱ تا ۲-۲-۳، تعاریف، نظریه‌ها و ابعاد هر یک از متغیرهای پژوهش به‌طور مجزا بررسی می‌شود. در ادامه، در بخش ۲-۲-۴ روابط بین متغیرها و مدل نظری میانجی‌گری تحلیل می‌گردد؛ از جمله روابط دوجانبه میان اضطراب صفتی و رفتارهای مالی پرخطر و نقش طرحواره‌های ناسازگار اولیه در تبیین این روابط. سپس در بخش ۲-۳ پیشینه پژوهشی داخلی و خارجی مرور می‌شود و مدل میانجی‌گری پژوهش در پرتو آن به تصویر درمی‌آید؛ هدف، مشخص‌شدن شکاف پژوهشی</w:t>
       </w:r>
       <w:r>
         <w:rPr>
@@ -3899,7 +3847,7 @@
           <w:vertAlign w:val="superscript"/>
           <w:rtl/>
         </w:rPr>
-        <w:footnoteReference w:id="79"/>
+        <w:footnoteReference w:id="76"/>
       </w:r>
       <w:r>
         <w:rPr>
@@ -3943,7 +3891,7 @@
           <w:rtl/>
           <w:lang w:bidi="fa-IR"/>
         </w:rPr>
-        <w:t xml:space="preserve">از منظر ریشه‌شناسی، واژه اضطراب </w:t>
+        <w:t xml:space="preserve">از منظر ریشه‌شناسی، واژه اضطراب</w:t>
       </w:r>
       <w:r>
         <w:rPr>
@@ -3988,7 +3936,7 @@
           <w:vertAlign w:val="superscript"/>
           <w:rtl/>
         </w:rPr>
-        <w:footnoteReference w:id="80"/>
+        <w:footnoteReference w:id="77"/>
       </w:r>
       <w:r>
         <w:rPr>
@@ -4040,7 +3988,7 @@
           <w:vertAlign w:val="superscript"/>
           <w:rtl/>
         </w:rPr>
-        <w:footnoteReference w:id="81"/>
+        <w:footnoteReference w:id="78"/>
       </w:r>
       <w:r>
         <w:rPr>
@@ -4075,7 +4023,7 @@
           <w:vertAlign w:val="superscript"/>
           <w:rtl/>
         </w:rPr>
-        <w:footnoteReference w:id="82"/>
+        <w:footnoteReference w:id="79"/>
       </w:r>
       <w:r>
         <w:rPr>
@@ -4127,7 +4075,7 @@
           <w:vertAlign w:val="superscript"/>
           <w:rtl/>
         </w:rPr>
-        <w:footnoteReference w:id="83"/>
+        <w:footnoteReference w:id="80"/>
       </w:r>
       <w:r>
         <w:rPr>
@@ -4217,7 +4165,7 @@
           <w:vertAlign w:val="superscript"/>
           <w:rtl/>
         </w:rPr>
-        <w:footnoteReference w:id="84"/>
+        <w:footnoteReference w:id="81"/>
       </w:r>
       <w:r>
         <w:rPr>
@@ -4278,7 +4226,7 @@
           <w:rtl/>
           <w:lang w:bidi="fa-IR"/>
         </w:rPr>
-        <w:t xml:space="preserve">مدار عصبی: از منظر عصب‌شناختی، ترس پاسخی سریع و خودکار است که عمدتاً توسط آمیگدال مدیریت می‌شود تا واکنش فوری برای بقا را ممکن سازد. در مقابل، اضطراب فرآیندی پیچیده‌تر است که شامل فعالیت پایدار در هسته بستر استریا ترمینالیس </w:t>
+        <w:t xml:space="preserve">مدار عصبی: از منظر عصب‌شناختی، ترس پاسخی سریع و خودکار است که عمدتاً توسط آمیگدال مدیریت می‌شود تا واکنش فوری برای بقا را ممکن سازد. در مقابل، اضطراب فرآیندی پیچیده‌تر است که شامل فعالیت پایدار در هسته بستر استریا ترمینالیس</w:t>
       </w:r>
       <w:r>
         <w:rPr>
@@ -4374,7 +4322,7 @@
           <w:vertAlign w:val="superscript"/>
           <w:rtl/>
         </w:rPr>
-        <w:footnoteReference w:id="85"/>
+        <w:footnoteReference w:id="82"/>
       </w:r>
       <w:r>
         <w:rPr>
@@ -4392,7 +4340,7 @@
           <w:vertAlign w:val="superscript"/>
           <w:rtl/>
         </w:rPr>
-        <w:footnoteReference w:id="86"/>
+        <w:footnoteReference w:id="83"/>
       </w:r>
       <w:r>
         <w:rPr>
@@ -4410,7 +4358,7 @@
           <w:vertAlign w:val="superscript"/>
           <w:rtl/>
         </w:rPr>
-        <w:footnoteReference w:id="87"/>
+        <w:footnoteReference w:id="84"/>
       </w:r>
       <w:r>
         <w:rPr>
@@ -4534,7 +4482,7 @@
           <w:vertAlign w:val="superscript"/>
           <w:rtl/>
         </w:rPr>
-        <w:footnoteReference w:id="88"/>
+        <w:footnoteReference w:id="85"/>
       </w:r>
       <w:r>
         <w:rPr>
@@ -4631,7 +4579,7 @@
           <w:rtl/>
           <w:lang w:bidi="fa-IR"/>
         </w:rPr>
-        <w:t xml:space="preserve">سیستم سروتونین: این سیستم نقشی بسیار پیچیده در تنظیم خلق، خواب و اضطراب دارد. شواهد متعددی نشان می‌دهند که اختلال در عملکرد سروتونین با اضطراب و افسردگی مرتبط است. داروهای مهارکننده بازجذب سروتونین </w:t>
+        <w:t xml:space="preserve">سیستم سروتونین: این سیستم نقشی بسیار پیچیده در تنظیم خلق، خواب و اضطراب دارد. شواهد متعددی نشان می‌دهند که اختلال در عملکرد سروتونین با اضطراب و افسردگی مرتبط است. داروهای مهارکننده بازجذب سروتونین</w:t>
       </w:r>
       <w:r>
         <w:rPr>
@@ -4676,7 +4624,7 @@
           <w:vertAlign w:val="superscript"/>
           <w:rtl/>
         </w:rPr>
-        <w:footnoteReference w:id="89"/>
+        <w:footnoteReference w:id="86"/>
       </w:r>
       <w:r>
         <w:rPr>
@@ -4739,7 +4687,7 @@
           <w:rtl/>
           <w:lang w:bidi="fa-IR"/>
         </w:rPr>
-        <w:t xml:space="preserve">تجربه بدنی اضطراب، محصول فعالیت سیستم عصبی خودمختار است که خود به دو شاخه تقسیم می‌شود: شاخه سمپاتیک (گاز) که بدن را برای عمل بسیج می‌کند، و شاخه پاراسمپاتیک (ترمز) که بدن را به حالت آرامش بازمی‌گرداند. در حالت اضطراب، تعادل به نفع شاخه سمپاتیک به هم می‌خورد و مجموعه‌ای از واکنش‌های فیزیولوژیک مانند افزایش ضربان قلب، تنفس سریع و سطحی، تعریق و انقباض عضلات رخ می‌دهد. یکی از شاخص‌های مهم این تعادل، «تغییرپذیری ضربان قلب» </w:t>
+        <w:t xml:space="preserve">تجربه بدنی اضطراب، محصول فعالیت سیستم عصبی خودمختار است که خود به دو شاخه تقسیم می‌شود: شاخه سمپاتیک (گاز) که بدن را برای عمل بسیج می‌کند، و شاخه پاراسمپاتیک (ترمز) که بدن را به حالت آرامش بازمی‌گرداند. در حالت اضطراب، تعادل به نفع شاخه سمپاتیک به هم می‌خورد و مجموعه‌ای از واکنش‌های فیزیولوژیک مانند افزایش ضربان قلب، تنفس سریع و سطحی، تعریق و انقباض عضلات رخ می‌دهد. یکی از شاخص‌های مهم این تعادل، «تغییرپذیری ضربان قلب»</w:t>
       </w:r>
       <w:r>
         <w:rPr>
@@ -4875,7 +4823,7 @@
           <w:vertAlign w:val="superscript"/>
           <w:rtl/>
         </w:rPr>
-        <w:footnoteReference w:id="90"/>
+        <w:footnoteReference w:id="87"/>
       </w:r>
       <w:r>
         <w:rPr>
@@ -5016,7 +4964,7 @@
           <w:vertAlign w:val="superscript"/>
           <w:rtl/>
         </w:rPr>
-        <w:footnoteReference w:id="91"/>
+        <w:footnoteReference w:id="88"/>
       </w:r>
       <w:r>
         <w:rPr>
@@ -5034,7 +4982,7 @@
           <w:vertAlign w:val="superscript"/>
           <w:rtl/>
         </w:rPr>
-        <w:footnoteReference w:id="92"/>
+        <w:footnoteReference w:id="89"/>
       </w:r>
       <w:r>
         <w:rPr>
@@ -5156,7 +5104,7 @@
           <w:vertAlign w:val="superscript"/>
           <w:rtl/>
         </w:rPr>
-        <w:footnoteReference w:id="93"/>
+        <w:footnoteReference w:id="90"/>
       </w:r>
       <w:r>
         <w:rPr>
@@ -5174,7 +5122,7 @@
           <w:vertAlign w:val="superscript"/>
           <w:rtl/>
         </w:rPr>
-        <w:footnoteReference w:id="94"/>
+        <w:footnoteReference w:id="91"/>
       </w:r>
       <w:r>
         <w:rPr>
@@ -5237,7 +5185,7 @@
           <w:rtl/>
           <w:lang w:bidi="fa-IR"/>
         </w:rPr>
-        <w:t xml:space="preserve">یکی از مجراهای اصلی اثرگذاری اضطراب صفتی بر رفتار مالی، تحریف نظام‌مند ادراک ریسک </w:t>
+        <w:t xml:space="preserve">یکی از مجراهای اصلی اثرگذاری اضطراب صفتی بر رفتار مالی، تحریف نظام‌مند ادراک ریسک</w:t>
       </w:r>
       <w:r>
         <w:rPr>
@@ -5280,7 +5228,7 @@
           <w:vertAlign w:val="superscript"/>
           <w:rtl/>
         </w:rPr>
-        <w:footnoteReference w:id="95"/>
+        <w:footnoteReference w:id="92"/>
       </w:r>
       <w:r>
         <w:rPr>
@@ -5298,7 +5246,7 @@
           <w:vertAlign w:val="superscript"/>
           <w:rtl/>
         </w:rPr>
-        <w:footnoteReference w:id="96"/>
+        <w:footnoteReference w:id="93"/>
       </w:r>
       <w:r>
         <w:rPr>
@@ -5325,7 +5273,7 @@
           <w:rtl/>
           <w:lang w:bidi="fa-IR"/>
         </w:rPr>
-        <w:t xml:space="preserve">فراتر از جهت‌گیری انتخاب‌ها، اضطراب صفتی بر کیفیت فرایند تصمیم‌گیری </w:t>
+        <w:t xml:space="preserve">فراتر از جهت‌گیری انتخاب‌ها، اضطراب صفتی بر کیفیت فرایند تصمیم‌گیری</w:t>
       </w:r>
       <w:r>
         <w:rPr>
@@ -5506,7 +5454,7 @@
           <w:vertAlign w:val="superscript"/>
           <w:rtl/>
         </w:rPr>
-        <w:footnoteReference w:id="97"/>
+        <w:footnoteReference w:id="94"/>
       </w:r>
       <w:r>
         <w:rPr>
@@ -5586,7 +5534,7 @@
           <w:rtl/>
           <w:lang w:bidi="fa-IR"/>
         </w:rPr>
-        <w:t xml:space="preserve">نظریه طرحواره یانگ، ساختار شخصیت را بر پایه مجموعه‌ای از نیازهای هیجانی بنیادین تبیین می‌کند که برآورده‌نشدن آن‌ها در دوران رشد، زمینه شکل‌گیری طرحواره‌های ناسازگار اولیه را فراهم می‌آورد. در مدل یانگ و همکاران، هجده طرحواره در قالب پنج حوزه طرحواره‌ای </w:t>
+        <w:t xml:space="preserve">نظریه طرحواره یانگ، ساختار شخصیت را بر پایه مجموعه‌ای از نیازهای هیجانی بنیادین تبیین می‌کند که برآورده‌نشدن آن‌ها در دوران رشد، زمینه شکل‌گیری طرحواره‌های ناسازگار اولیه را فراهم می‌آورد. در مدل یانگ و همکاران، هجده طرحواره در قالب پنج حوزه طرحواره‌ای</w:t>
       </w:r>
       <w:r>
         <w:rPr>
@@ -6421,7 +6369,7 @@
           <w:rtl/>
           <w:lang w:bidi="fa-IR"/>
         </w:rPr>
-        <w:t xml:space="preserve">فعال شدن هر یک از این طرحواره‌ها در بزرگسالی، لزوماً به یک رفتار مشخص و قابل پیش‌بینی منجر نمی‌شود؛ بلکه واکنش رفتاری فرد به سبک مقابله‌ای </w:t>
+        <w:t xml:space="preserve">فعال شدن هر یک از این طرحواره‌ها در بزرگسالی، لزوماً به یک رفتار مشخص و قابل پیش‌بینی منجر نمی‌شود؛ بلکه واکنش رفتاری فرد به سبک مقابله‌ای</w:t>
       </w:r>
       <w:r>
         <w:rPr>
@@ -6439,7 +6387,7 @@
           <w:rtl/>
           <w:lang w:bidi="fa-IR"/>
         </w:rPr>
-        <w:t xml:space="preserve"> او بستگی دارد. یانگ و همکاران سه سبک مقابله‌ای کلی را شناسایی کرده‌اند: تسلیم </w:t>
+        <w:t xml:space="preserve"> او بستگی دارد. یانگ و همکاران سه سبک مقابله‌ای کلی را شناسایی کرده‌اند: تسلیم</w:t>
       </w:r>
       <w:r>
         <w:rPr>
@@ -6457,7 +6405,7 @@
           <w:rtl/>
           <w:lang w:bidi="fa-IR"/>
         </w:rPr>
-        <w:t xml:space="preserve">، که در آن فرد پیام طرحواره را می‌پذیرد و تجربه‌های دردناک اولیه را در زندگی بزرگسالی بازتولید می‌کند؛ اجتناب </w:t>
+        <w:t xml:space="preserve">، که در آن فرد پیام طرحواره را می‌پذیرد و تجربه‌های دردناک اولیه را در زندگی بزرگسالی بازتولید می‌کند؛ اجتناب</w:t>
       </w:r>
       <w:r>
         <w:rPr>
@@ -6475,7 +6423,7 @@
           <w:rtl/>
           <w:lang w:bidi="fa-IR"/>
         </w:rPr>
-        <w:t xml:space="preserve">، که در آن فرد چیدمان زندگی خود را به‌گونه‌ای تنظیم می‌کند که طرحواره فعال نشود و از موقعیت‌ها، افکار و هیجان‌های مرتبط با آن می‌گریزد؛ و جبران افراطی </w:t>
+        <w:t xml:space="preserve">، که در آن فرد چیدمان زندگی خود را به‌گونه‌ای تنظیم می‌کند که طرحواره فعال نشود و از موقعیت‌ها، افکار و هیجان‌های مرتبط با آن می‌گریزد؛ و جبران افراطی</w:t>
       </w:r>
       <w:r>
         <w:rPr>
@@ -6535,7 +6483,7 @@
           <w:vertAlign w:val="superscript"/>
           <w:rtl/>
         </w:rPr>
-        <w:footnoteReference w:id="98"/>
+        <w:footnoteReference w:id="95"/>
       </w:r>
       <w:r>
         <w:rPr>
@@ -6572,7 +6520,7 @@
           <w:vertAlign w:val="superscript"/>
           <w:rtl/>
         </w:rPr>
-        <w:footnoteReference w:id="99"/>
+        <w:footnoteReference w:id="96"/>
       </w:r>
       <w:r>
         <w:rPr>
@@ -6909,7 +6857,7 @@
           <w:rtl/>
           <w:lang w:bidi="fa-IR"/>
         </w:rPr>
-        <w:t xml:space="preserve">علاوه بر سازه‌های شناختی و ابعاد رفتاری مرورشده، یکی دیگر از متغیرهای کلیدی در تبیین تصمیم‌های مالی پرخطر، سازه تحمل ریسک مالی  است. این سازه به بیشینه مقدار عدم قطعیتی اشاره دارد که یک سرمایه‌گذار در اتخاذ تصمیم‌های مالی مایل به پذیرش آن است و سطح آمادگی روانشناختی فرد برای مواجهه با پیامدهای نامطلوب احتمالی را منعکس می‌کند. در ادبیات روانشناسی مالی، تفکیک میان ظرفیت عینی ریسک </w:t>
+        <w:t xml:space="preserve">علاوه بر سازه‌های شناختی و ابعاد رفتاری مرورشده، یکی دیگر از متغیرهای کلیدی در تبیین تصمیم‌های مالی پرخطر، سازه تحمل ریسک مالی  است. این سازه به بیشینه مقدار عدم قطعیتی اشاره دارد که یک سرمایه‌گذار در اتخاذ تصمیم‌های مالی مایل به پذیرش آن است و سطح آمادگی روانشناختی فرد برای مواجهه با پیامدهای نامطلوب احتمالی را منعکس می‌کند. در ادبیات روانشناسی مالی، تفکیک میان ظرفیت عینی ریسک</w:t>
       </w:r>
       <w:r>
         <w:rPr>
@@ -6927,7 +6875,7 @@
           <w:rtl/>
           <w:lang w:bidi="fa-IR"/>
         </w:rPr>
-        <w:t xml:space="preserve"> و تحمل ذهنی ریسک </w:t>
+        <w:t xml:space="preserve"> و تحمل ذهنی ریسک</w:t>
       </w:r>
       <w:r>
         <w:rPr>
@@ -7127,7 +7075,7 @@
           <w:vertAlign w:val="superscript"/>
           <w:rtl/>
         </w:rPr>
-        <w:footnoteReference w:id="100"/>
+        <w:footnoteReference w:id="97"/>
       </w:r>
       <w:r>
         <w:rPr>
@@ -7179,7 +7127,7 @@
           <w:vertAlign w:val="superscript"/>
           <w:rtl/>
         </w:rPr>
-        <w:footnoteReference w:id="101"/>
+        <w:footnoteReference w:id="98"/>
       </w:r>
       <w:r>
         <w:rPr>
@@ -7206,7 +7154,7 @@
           <w:rtl/>
           <w:lang w:bidi="fa-IR"/>
         </w:rPr>
-        <w:t xml:space="preserve">در سطح تحلیل آماری، این چارچوب نظری به مدل میانجی‌گری ساده‌ای ترجمه می‌شود که در آن اضطراب صفتی متغیر پیش‌بین، رفتارهای مالی پرخطر متغیر ملاک و طرحواره‌های ناسازگار اولیه متغیر میانجی است. منطق این مدل بر تجزیه اثر کل به دو مؤلفه استوار است: اثر مستقیم متغیر پیش‌بین بر ملاک و اثر غیرمستقیمی که از ضرب مسیر پیش‌بین به میانجی در مسیر میانجی به ملاک به دست می‌آید؛ معناداری این اثر غیرمستقیم، شاهد آماری بر مکانیسم میانجی‌گری تلقی می‌شود (هایز، ۲۰۱۸). این الگو را می‌توان در چارچوب مدل‌سازی معادلات ساختاری </w:t>
+        <w:t xml:space="preserve">در سطح تحلیل آماری، این چارچوب نظری به مدل میانجی‌گری ساده‌ای ترجمه می‌شود که در آن اضطراب صفتی متغیر پیش‌بین، رفتارهای مالی پرخطر متغیر ملاک و طرحواره‌های ناسازگار اولیه متغیر میانجی است. منطق این مدل بر تجزیه اثر کل به دو مؤلفه استوار است: اثر مستقیم متغیر پیش‌بین بر ملاک و اثر غیرمستقیمی که از ضرب مسیر پیش‌بین به میانجی در مسیر میانجی به ملاک به دست می‌آید؛ معناداری این اثر غیرمستقیم، شاهد آماری بر مکانیسم میانجی‌گری تلقی می‌شود (هایز، ۲۰۱۸). این الگو را می‌توان در چارچوب مدل‌سازی معادلات ساختاری</w:t>
       </w:r>
       <w:r>
         <w:rPr>
@@ -7224,15 +7172,7 @@
           <w:rtl/>
           <w:lang w:bidi="fa-IR"/>
         </w:rPr>
-        <w:t xml:space="preserve"> برآورد کرد که امکان سنجش هم‌زمان مسیرها و ارزیابی برازش کلی مدل را فراهم می‌آورد، و نیز در چارچوب رگرسیون‌محور با الگوی شماره ۴ ابزار پراسس </w:t>
-      </w:r>
-      <w:r>
-        <w:rPr>
-          <w:rFonts w:ascii="B Nazanin" w:hAnsi="B Nazanin" w:cs="B Nazanin" w:hint="cs"/>
-          <w:vertAlign w:val="superscript"/>
-          <w:rtl/>
-        </w:rPr>
-        <w:footnoteReference w:id="33"/>
+        <w:t xml:space="preserve"> برآورد کرد که امکان سنجش هم‌زمان مسیرها و ارزیابی برازش کلی مدل را فراهم می‌آورد، و نیز در چارچوب رگرسیون‌محور با الگوی شماره ۴ ابزار پراسس</w:t>
       </w:r>
       <w:r>
         <w:rPr>
@@ -7241,7 +7181,7 @@
           <w:szCs w:val="22"/>
           <w:lang w:val="en-US"/>
         </w:rPr>
-        <w:t xml:space="preserve"> (PROCESS Model 4) </w:t>
+        <w:t xml:space="preserve"> (PROCESS) (PROCESS Model 4) </w:t>
       </w:r>
       <w:r>
         <w:rPr>
@@ -7531,7 +7471,7 @@
           <w:rtl/>
           <w:lang w:bidi="fa-IR"/>
         </w:rPr>
-        <w:t xml:space="preserve">اولولو و همکاران) ۲۰۲۴ (در پژوهشی با عنوان "مداخله کوچینگ رفتاردرمانی عقلانی-هیجانی و شناختی برای ارتقای تحمل ریسک مالی دانشجویان"، اثر تغییر باورها بر رفتار مالی را به صورت تجربی آزمون کردند. موضوع دقیق پژوهش، بررسی اثربخشی تغییر الگوهای فکری و طرحواره‌ای بر میزان تحمل ریسک مالی واقعی افراد بود. یافته کلیدی نشان داد که مداخلات شناختی </w:t>
+        <w:t xml:space="preserve">اولولو و همکاران) ۲۰۲۴ (در پژوهشی با عنوان "مداخله کوچینگ رفتاردرمانی عقلانی-هیجانی و شناختی برای ارتقای تحمل ریسک مالی دانشجویان"، اثر تغییر باورها بر رفتار مالی را به صورت تجربی آزمون کردند. موضوع دقیق پژوهش، بررسی اثربخشی تغییر الگوهای فکری و طرحواره‌ای بر میزان تحمل ریسک مالی واقعی افراد بود. یافته کلیدی نشان داد که مداخلات شناختی</w:t>
       </w:r>
       <w:r>
         <w:rPr>
@@ -7539,7 +7479,7 @@
           <w:vertAlign w:val="superscript"/>
           <w:rtl/>
         </w:rPr>
-        <w:footnoteReference w:id="34"/>
+        <w:footnoteReference w:id="33"/>
       </w:r>
       <w:r>
         <w:rPr>
@@ -7574,7 +7514,7 @@
           <w:vertAlign w:val="superscript"/>
           <w:rtl/>
         </w:rPr>
-        <w:footnoteReference w:id="102"/>
+        <w:footnoteReference w:id="99"/>
       </w:r>
       <w:r>
         <w:rPr>
@@ -7609,7 +7549,7 @@
           <w:vertAlign w:val="superscript"/>
           <w:rtl/>
         </w:rPr>
-        <w:footnoteReference w:id="103"/>
+        <w:footnoteReference w:id="100"/>
       </w:r>
       <w:r>
         <w:rPr>
@@ -7661,7 +7601,7 @@
           <w:vertAlign w:val="superscript"/>
           <w:rtl/>
         </w:rPr>
-        <w:footnoteReference w:id="104"/>
+        <w:footnoteReference w:id="101"/>
       </w:r>
       <w:r>
         <w:rPr>
@@ -7764,7 +7704,7 @@
           <w:vertAlign w:val="superscript"/>
           <w:rtl/>
         </w:rPr>
-        <w:footnoteReference w:id="105"/>
+        <w:footnoteReference w:id="102"/>
       </w:r>
       <w:r>
         <w:rPr>
@@ -7799,7 +7739,7 @@
           <w:vertAlign w:val="superscript"/>
           <w:rtl/>
         </w:rPr>
-        <w:footnoteReference w:id="106"/>
+        <w:footnoteReference w:id="103"/>
       </w:r>
       <w:r>
         <w:rPr>
@@ -7851,7 +7791,7 @@
           <w:vertAlign w:val="superscript"/>
           <w:rtl/>
         </w:rPr>
-        <w:footnoteReference w:id="107"/>
+        <w:footnoteReference w:id="104"/>
       </w:r>
       <w:r>
         <w:rPr>
@@ -7920,7 +7860,7 @@
           <w:vertAlign w:val="superscript"/>
           <w:rtl/>
         </w:rPr>
-        <w:footnoteReference w:id="108"/>
+        <w:footnoteReference w:id="105"/>
       </w:r>
       <w:r>
         <w:rPr>
@@ -8025,7 +7965,7 @@
           <w:vertAlign w:val="superscript"/>
           <w:rtl/>
         </w:rPr>
-        <w:footnoteReference w:id="109"/>
+        <w:footnoteReference w:id="106"/>
       </w:r>
       <w:r>
         <w:rPr>
@@ -8060,7 +8000,7 @@
           <w:vertAlign w:val="superscript"/>
           <w:rtl/>
         </w:rPr>
-        <w:footnoteReference w:id="110"/>
+        <w:footnoteReference w:id="107"/>
       </w:r>
       <w:r>
         <w:rPr>
@@ -8123,26 +8063,7 @@
           <w:rtl/>
           <w:lang w:bidi="fa-IR"/>
         </w:rPr>
-        <w:t xml:space="preserve">بر پایه مبانی نظری و پیشینه پژوهشی مرورشده در این فصل، مدل مفهومی پژوهش حاضر از سه متغیر اصلی تشکیل شده است که جایگاه هر یک در ساختار مدل و ابزار سنجش آن به‌طور مشخص تعریف می‌شود. اضطراب صفتی به‌عنوان متغیر مستقل، نقطه آغاز مدل است و با فرم اضطراب صفتی</w:t>
-      </w:r>
-      <w:r>
-        <w:rPr>
-          <w:rFonts w:ascii="Times New Roman" w:hAnsi="Times New Roman" w:cs="Times New Roman"/>
-          <w:sz w:val="22"/>
-          <w:szCs w:val="22"/>
-          <w:lang w:val="en-US"/>
-        </w:rPr>
-        <w:t xml:space="preserve"> (Y-2) </w:t>
-      </w:r>
-      <w:r>
-        <w:rPr>
-          <w:rFonts w:ascii="B Nazanin" w:hAnsi="B Nazanin" w:cs="B Nazanin" w:hint="cs"/>
-          <w:sz w:val="24"/>
-          <w:szCs w:val="24"/>
-          <w:rtl/>
-          <w:lang w:bidi="fa-IR"/>
-        </w:rPr>
-        <w:t xml:space="preserve">پرسشنامه اضطراب حالت-صفت اسپیلبرگر سنجیده می‌شود. طرحواره‌های ناسازگار اولیه به‌عنوان متغیر میانجی، مکانیسم انتقال اثر اضطراب به رفتار مالی را بازنمایی می‌کنند و با پرسشنامه طرحواره یانگ — فرم کوتاه ارزیابی می‌گردند. رفتارهای مالی پرخطر نیز به‌عنوان متغیر وابسته، در قالب سازه تحمل ریسک مالی و با مقیاس سیزده‌سؤالی گرابل و لایتون اندازه‌گیری می‌شود؛ به‌گونه‌ای که نمرات بالاتر، نشان‌دهنده تمایل بیشتر به پذیرش ریسک و در نتیجه بروز بیشتر رفتارهای مالی پرخطر است. انتخاب این سه سازه و ابزارهای سنجش آن‌ها، برآیند مستقیم تحلیل نظری فصل حاضر است و در عین حال با تعاریف عملیاتی مندرج در فصل اول پایان‌نامه هم‌خوانی کامل دارد.</w:t>
+        <w:t xml:space="preserve">بر پایه مبانی نظری و پیشینه پژوهشی مرورشده در این فصل، مدل مفهومی پژوهش حاضر از سه متغیر اصلی تشکیل شده است که جایگاه هر یک در ساختار مدل و ابزار سنجش آن به‌طور مشخص تعریف می‌شود. اضطراب صفتی به‌عنوان متغیر مستقل، نقطه آغاز مدل است و با فرم اضطراب صفتی پرسشنامه اضطراب حالت-صفت اسپیلبرگر سنجیده می‌شود. طرحواره‌های ناسازگار اولیه به‌عنوان متغیر میانجی، مکانیسم انتقال اثر اضطراب به رفتار مالی را بازنمایی می‌کنند و با پرسشنامه طرحواره یانگ — فرم کوتاه ارزیابی می‌گردند. رفتارهای مالی پرخطر نیز به‌عنوان متغیر وابسته، در قالب سازه تحمل ریسک مالی و با مقیاس سیزده‌سؤالی گرابل و لایتون اندازه‌گیری می‌شود؛ به‌گونه‌ای که نمرات بالاتر، نشان‌دهنده تمایل بیشتر به پذیرش ریسک و در نتیجه بروز بیشتر رفتارهای مالی پرخطر است. انتخاب این سه سازه و ابزارهای سنجش آن‌ها، برآیند مستقیم تحلیل نظری فصل حاضر است و در عین حال با تعاریف عملیاتی مندرج در فصل اول پایان‌نامه هم‌خوانی کامل دارد.</w:t>
       </w:r>
     </w:p>
     <w:tbl>
@@ -8727,7 +8648,7 @@
           <w:rtl/>
           <w:lang w:bidi="fa-IR"/>
         </w:rPr>
-        <w:t xml:space="preserve">پژوهش حاضر از نظر هدف، در زمره پژوهش‌های کاربردی </w:t>
+        <w:t xml:space="preserve">پژوهش حاضر از نظر هدف، در زمره پژوهش‌های کاربردی</w:t>
       </w:r>
       <w:r>
         <w:rPr>
@@ -8735,7 +8656,7 @@
           <w:vertAlign w:val="superscript"/>
           <w:rtl/>
         </w:rPr>
-        <w:footnoteReference w:id="35"/>
+        <w:footnoteReference w:id="34"/>
       </w:r>
       <w:r>
         <w:rPr>
@@ -8762,7 +8683,7 @@
           <w:rtl/>
           <w:lang w:bidi="fa-IR"/>
         </w:rPr>
-        <w:t xml:space="preserve">از نظر روش گردآوری داده‌ها، این پژوهش توصیفی-همبستگی </w:t>
+        <w:t xml:space="preserve">از نظر روش گردآوری داده‌ها، این پژوهش توصیفی-همبستگی</w:t>
       </w:r>
       <w:r>
         <w:rPr>
@@ -8770,7 +8691,7 @@
           <w:vertAlign w:val="superscript"/>
           <w:rtl/>
         </w:rPr>
-        <w:footnoteReference w:id="36"/>
+        <w:footnoteReference w:id="35"/>
       </w:r>
       <w:r>
         <w:rPr>
@@ -8797,7 +8718,7 @@
           <w:rtl/>
           <w:lang w:bidi="fa-IR"/>
         </w:rPr>
-        <w:t xml:space="preserve">مهم‌تر آنکه، مدل تحلیلی پژوهش از نوع مدل میانجی‌گری </w:t>
+        <w:t xml:space="preserve">مهم‌تر آنکه، مدل تحلیلی پژوهش از نوع مدل میانجی‌گری</w:t>
       </w:r>
       <w:r>
         <w:rPr>
@@ -8805,7 +8726,7 @@
           <w:vertAlign w:val="superscript"/>
           <w:rtl/>
         </w:rPr>
-        <w:footnoteReference w:id="37"/>
+        <w:footnoteReference w:id="36"/>
       </w:r>
       <w:r>
         <w:rPr>
@@ -8976,7 +8897,7 @@
           <w:rtl/>
           <w:lang w:bidi="fa-IR"/>
         </w:rPr>
-        <w:t xml:space="preserve">با توجه به نبود فهرست جامع و قابل دسترس از تمامی معامله‌گران فعال و نامشخص بودن حجم دقیق جامعه، در این پژوهش از روش نمونه‌گیری غیرتصادفی در دسترس </w:t>
+        <w:t xml:space="preserve">با توجه به نبود فهرست جامع و قابل دسترس از تمامی معامله‌گران فعال و نامشخص بودن حجم دقیق جامعه، در این پژوهش از روش نمونه‌گیری غیرتصادفی در دسترس</w:t>
       </w:r>
       <w:r>
         <w:rPr>
@@ -8984,25 +8905,25 @@
           <w:vertAlign w:val="superscript"/>
           <w:rtl/>
         </w:rPr>
+        <w:footnoteReference w:id="37"/>
+      </w:r>
+      <w:r>
+        <w:rPr>
+          <w:rFonts w:ascii="B Nazanin" w:hAnsi="B Nazanin" w:cs="B Nazanin" w:hint="cs"/>
+          <w:sz w:val="24"/>
+          <w:szCs w:val="24"/>
+          <w:rtl/>
+          <w:lang w:bidi="fa-IR"/>
+        </w:rPr>
+        <w:t xml:space="preserve"> به همراه روش گلوله‌برفی</w:t>
+      </w:r>
+      <w:r>
+        <w:rPr>
+          <w:rFonts w:ascii="B Nazanin" w:hAnsi="B Nazanin" w:cs="B Nazanin" w:hint="cs"/>
+          <w:vertAlign w:val="superscript"/>
+          <w:rtl/>
+        </w:rPr>
         <w:footnoteReference w:id="38"/>
-      </w:r>
-      <w:r>
-        <w:rPr>
-          <w:rFonts w:ascii="B Nazanin" w:hAnsi="B Nazanin" w:cs="B Nazanin" w:hint="cs"/>
-          <w:sz w:val="24"/>
-          <w:szCs w:val="24"/>
-          <w:rtl/>
-          <w:lang w:bidi="fa-IR"/>
-        </w:rPr>
-        <w:t xml:space="preserve"> به همراه روش گلوله‌برفی </w:t>
-      </w:r>
-      <w:r>
-        <w:rPr>
-          <w:rFonts w:ascii="B Nazanin" w:hAnsi="B Nazanin" w:cs="B Nazanin" w:hint="cs"/>
-          <w:vertAlign w:val="superscript"/>
-          <w:rtl/>
-        </w:rPr>
-        <w:footnoteReference w:id="39"/>
       </w:r>
       <w:r>
         <w:rPr>
@@ -9107,7 +9028,7 @@
           <w:vertAlign w:val="superscript"/>
           <w:rtl/>
         </w:rPr>
-        <w:footnoteReference w:id="111"/>
+        <w:footnoteReference w:id="108"/>
       </w:r>
       <w:r>
         <w:rPr>
@@ -9247,26 +9168,7 @@
           <w:rtl/>
           <w:lang w:bidi="fa-IR"/>
         </w:rPr>
-        <w:t xml:space="preserve">برای سنجش متغیرهای پژوهش از سه ابزار استاندارد استفاده می‌شود که هر یک با یکی از متغیرهای مدل میانجی‌گری متناظر است: پرسشنامه اضطراب حالت-صفت اسپیلبرگر — فرم صفتی</w:t>
-      </w:r>
-      <w:r>
-        <w:rPr>
-          <w:rFonts w:ascii="Times New Roman" w:hAnsi="Times New Roman" w:cs="Times New Roman"/>
-          <w:sz w:val="22"/>
-          <w:szCs w:val="22"/>
-          <w:lang w:val="en-US"/>
-        </w:rPr>
-        <w:t xml:space="preserve"> (Y-2) </w:t>
-      </w:r>
-      <w:r>
-        <w:rPr>
-          <w:rFonts w:ascii="B Nazanin" w:hAnsi="B Nazanin" w:cs="B Nazanin" w:hint="cs"/>
-          <w:sz w:val="24"/>
-          <w:szCs w:val="24"/>
-          <w:rtl/>
-          <w:lang w:bidi="fa-IR"/>
-        </w:rPr>
-        <w:t xml:space="preserve">برای سنجش اضطراب صفتی، پرسشنامه طرحواره یانگ — فرم کوتاه برای سنجش طرحواره‌های ناسازگار اولیه، و مقیاس تحمل ریسک مالی گرابل و لایتون برای سنجش رفتارهای مالی پرخطر. این سه ابزار به همراه سؤالات جمعیت‌شناختی در قالب یک پرسشنامه آنلاین یکپارچه ارائه می‌شوند. در ادامه، ساختار، نمره‌گذاری و ویژگی‌های روان‌سنجی هر ابزار به تفصیل بیان می‌شود. در فرم آنلاین، این ابزارها به ترتیب پس از سؤالات جمعیت‌شناختی و با فاصله‌گذاری مناسب ارائه می‌شوند تا خستگی پاسخ‌دهنده به حداقل برسد.</w:t>
+        <w:t xml:space="preserve">برای سنجش متغیرهای پژوهش از سه ابزار استاندارد استفاده می‌شود که هر یک با یکی از متغیرهای مدل میانجی‌گری متناظر است: پرسشنامه اضطراب حالت-صفت اسپیلبرگر — فرم صفتی برای سنجش اضطراب صفتی، پرسشنامه طرحواره یانگ — فرم کوتاه برای سنجش طرحواره‌های ناسازگار اولیه، و مقیاس تحمل ریسک مالی گرابل و لایتون برای سنجش رفتارهای مالی پرخطر. این سه ابزار به همراه سؤالات جمعیت‌شناختی در قالب یک پرسشنامه آنلاین یکپارچه ارائه می‌شوند. در ادامه، ساختار، نمره‌گذاری و ویژگی‌های روان‌سنجی هر ابزار به تفصیل بیان می‌شود. در فرم آنلاین، این ابزارها به ترتیب پس از سؤالات جمعیت‌شناختی و با فاصله‌گذاری مناسب ارائه می‌شوند تا خستگی پاسخ‌دهنده به حداقل برسد.</w:t>
       </w:r>
     </w:p>
     <w:p>
@@ -9287,16 +9189,110 @@
         </w:rPr>
         <w:t xml:space="preserve">۳-۴-۱. پرسشنامه اضطراب حالت-صفت اسپیلبرگر — فرم صفتی</w:t>
       </w:r>
-      <w:r>
-        <w:rPr>
-          <w:rFonts w:ascii="Times New Roman" w:hAnsi="Times New Roman" w:cs="Times New Roman"/>
+    </w:p>
+    <w:p>
+      <w:pPr>
+        <w:bidi w:val="1"/>
+        <w:spacing w:lineRule="exact" w:line="580" w:after="0"/>
+        <w:jc w:val="both"/>
+      </w:pPr>
+      <w:r>
+        <w:rPr>
+          <w:rFonts w:ascii="B Nazanin" w:hAnsi="B Nazanin" w:cs="B Nazanin" w:hint="cs"/>
+          <w:sz w:val="24"/>
+          <w:szCs w:val="24"/>
+          <w:rtl/>
+          <w:lang w:bidi="fa-IR"/>
+        </w:rPr>
+        <w:t xml:space="preserve">پرسشنامه اضطراب حالت-صفت اسپیلبرگر در اصل توسط اسپیلبرگر، گورچ و لوشن</w:t>
+      </w:r>
+      <w:r>
+        <w:rPr>
+          <w:rFonts w:ascii="B Nazanin" w:hAnsi="B Nazanin" w:cs="B Nazanin" w:hint="cs"/>
+          <w:vertAlign w:val="superscript"/>
+          <w:rtl/>
+        </w:rPr>
+        <w:footnoteReference w:id="109"/>
+      </w:r>
+      <w:r>
+        <w:rPr>
+          <w:rFonts w:ascii="B Nazanin" w:hAnsi="B Nazanin" w:cs="B Nazanin" w:hint="cs"/>
+          <w:sz w:val="24"/>
+          <w:szCs w:val="24"/>
+          <w:rtl/>
+          <w:lang w:bidi="fa-IR"/>
+        </w:rPr>
+        <w:t xml:space="preserve"> (۱۹۷۰) ساخته شد و راهنمای بازنگری‌شده آن توسط اسپیلبرگر (۱۹۸۳) منتشر شده است. این پرسشنامه برای سنجش اضطراب در دو سطح طراحی شده است. سطح نخست، اضطراب حالتی است؛ واکنشی هیجانی، گذرا و وابسته به موقعیت. سطح دوم، اضطراب صفتی؛ یعنی ویژگی شخصیتی پایدار فرد. در پژوهش حاضر تنها از فرم اضطراب صفتی استفاده می‌شود؛ هدف، سنجش زمینه شخصیتی پایدار اضطراب در معامله‌گران است، نه واکنش لحظه‌ای آنان به یک موقعیت خاص. بر همین اساس، فرم حالت (اضطراب حالتی) در این پژوهش اجرا نمی‌شود؛ چه آنکه هدف، سنجش زمینه پایدار آسیب‌پذیری در برابر فشارهای بازار است، نه شدت اضطراب آزمودنی در لحظه پاسخ‌دهی.</w:t>
+      </w:r>
+    </w:p>
+    <w:p>
+      <w:pPr>
+        <w:bidi w:val="1"/>
+        <w:spacing w:lineRule="exact" w:line="580" w:after="0"/>
+        <w:jc w:val="both"/>
+      </w:pPr>
+      <w:r>
+        <w:rPr>
+          <w:rFonts w:ascii="B Nazanin" w:hAnsi="B Nazanin" w:cs="B Nazanin" w:hint="cs"/>
+          <w:sz w:val="24"/>
+          <w:szCs w:val="24"/>
+          <w:rtl/>
+          <w:lang w:bidi="fa-IR"/>
+        </w:rPr>
+        <w:t xml:space="preserve">فرم صفتی شامل ۲۰ گویه است که احساسات کلی و معمول فرد را توصیف می‌کنند و آزمودنی میزان انطباق هر گویه با احساسات خود را بر اساس مقیاس ۴ درجه‌ای لیکرت با گزینه‌های «تقریباً هرگز»، «گاهی اوقات»، «بیشتر اوقات» و «تقریباً همیشه» (از ۱ تا ۴) مشخص می‌کند. این فرم شامل گویه‌هایی با نمره‌گذاری معکوس نیز هست. دامنه نمره کل بین ۲۰ تا ۸۰ است و نمره بالاتر نشان‌دهنده سطح بالاتر اضطراب صفتی است.</w:t>
+      </w:r>
+    </w:p>
+    <w:p>
+      <w:pPr>
+        <w:bidi w:val="1"/>
+        <w:spacing w:lineRule="exact" w:line="580" w:after="0"/>
+        <w:jc w:val="both"/>
+      </w:pPr>
+      <w:r>
+        <w:rPr>
+          <w:rFonts w:ascii="B Nazanin" w:hAnsi="B Nazanin" w:cs="B Nazanin" w:hint="cs"/>
+          <w:sz w:val="24"/>
+          <w:szCs w:val="24"/>
+          <w:rtl/>
+          <w:lang w:bidi="fa-IR"/>
+        </w:rPr>
+        <w:t xml:space="preserve">از نظر ویژگی‌های روان‌سنجی، پایایی درونی این ابزار از ابتدا با ضرایب آلفای کرونباخ بالا (۰٫۸۶ تا ۰٫۹۵) تأیید شده است (اسپیلبرگر، ۱۹۸۳). در ایران نیز پژوهش بشارت و همکاران (۱۳۹۵) ساختار عاملی و پایایی نسخه فارسی این پرسشنامه را در نمونه‌های ایرانی بررسی و تأیید کرده است؛ در این پژوهش آلفای کرونباخ ۰٫۸۹ گزارش شده است.</w:t>
+      </w:r>
+    </w:p>
+    <w:p>
+      <w:pPr>
+        <w:bidi w:val="1"/>
+        <w:spacing w:lineRule="exact" w:line="580" w:after="0"/>
+        <w:jc w:val="both"/>
+      </w:pPr>
+      <w:r>
+        <w:rPr>
+          <w:rFonts w:ascii="B Nazanin" w:hAnsi="B Nazanin" w:cs="B Nazanin" w:hint="cs"/>
+          <w:sz w:val="24"/>
+          <w:szCs w:val="24"/>
+          <w:rtl/>
+          <w:lang w:bidi="fa-IR"/>
+        </w:rPr>
+        <w:t xml:space="preserve">پایایی ابزار در نمونه پژوهش حاضر با آلفای کرونباخ محاسبه و در فصل چهارم گزارش خواهد شد.</w:t>
+      </w:r>
+    </w:p>
+    <w:p>
+      <w:pPr>
+        <w:pStyle w:val="Heading3"/>
+        <w:bidi w:val="1"/>
+        <w:jc w:val="right"/>
+      </w:pPr>
+      <w:r>
+        <w:rPr>
+          <w:rFonts w:ascii="B Nazanin" w:hAnsi="B Nazanin" w:cs="B Nazanin" w:hint="cs"/>
           <w:b/>
           <w:bCs/>
           <w:sz w:val="26"/>
           <w:szCs w:val="26"/>
-          <w:lang w:val="en-US"/>
-        </w:rPr>
-        <w:t xml:space="preserve"> (STAI-Y2)</w:t>
+          <w:rtl/>
+          <w:lang w:bidi="fa-IR"/>
+        </w:rPr>
+        <w:t xml:space="preserve">۳-۴-۲. پرسشنامه طرحواره‌های ناسازگار اولیه یانگ — فرم کوتاه</w:t>
       </w:r>
     </w:p>
     <w:p>
@@ -9313,62 +9309,7 @@
           <w:rtl/>
           <w:lang w:bidi="fa-IR"/>
         </w:rPr>
-        <w:t xml:space="preserve">پرسشنامه اضطراب حالت-صفت اسپیلبرگر </w:t>
-      </w:r>
-      <w:r>
-        <w:rPr>
-          <w:rFonts w:ascii="B Nazanin" w:hAnsi="B Nazanin" w:cs="B Nazanin" w:hint="cs"/>
-          <w:vertAlign w:val="superscript"/>
-          <w:rtl/>
-        </w:rPr>
-        <w:footnoteReference w:id="40"/>
-      </w:r>
-      <w:r>
-        <w:rPr>
-          <w:rFonts w:ascii="B Nazanin" w:hAnsi="B Nazanin" w:cs="B Nazanin" w:hint="cs"/>
-          <w:sz w:val="24"/>
-          <w:szCs w:val="24"/>
-          <w:rtl/>
-          <w:lang w:bidi="fa-IR"/>
-        </w:rPr>
-        <w:t xml:space="preserve"> در اصل توسط اسپیلبرگر، گورچ و لوشن</w:t>
-      </w:r>
-      <w:r>
-        <w:rPr>
-          <w:rFonts w:ascii="B Nazanin" w:hAnsi="B Nazanin" w:cs="B Nazanin" w:hint="cs"/>
-          <w:vertAlign w:val="superscript"/>
-          <w:rtl/>
-        </w:rPr>
-        <w:footnoteReference w:id="112"/>
-      </w:r>
-      <w:r>
-        <w:rPr>
-          <w:rFonts w:ascii="B Nazanin" w:hAnsi="B Nazanin" w:cs="B Nazanin" w:hint="cs"/>
-          <w:sz w:val="24"/>
-          <w:szCs w:val="24"/>
-          <w:rtl/>
-          <w:lang w:bidi="fa-IR"/>
-        </w:rPr>
-        <w:t xml:space="preserve"> (۱۹۷۰) ساخته شد و راهنمای بازنگری‌شده آن توسط اسپیلبرگر (۱۹۸۳) منتشر شده است. این پرسشنامه برای سنجش اضطراب در دو سطح طراحی شده است. سطح نخست، اضطراب حالتی است؛ واکنشی هیجانی، گذرا و وابسته به موقعیت. سطح دوم، اضطراب صفتی؛ یعنی ویژگی شخصیتی پایدار فرد. در پژوهش حاضر تنها از فرم اضطراب صفتی</w:t>
-      </w:r>
-      <w:r>
-        <w:rPr>
-          <w:rFonts w:ascii="Times New Roman" w:hAnsi="Times New Roman" w:cs="Times New Roman"/>
-          <w:sz w:val="22"/>
-          <w:szCs w:val="22"/>
-          <w:lang w:val="en-US"/>
-        </w:rPr>
-        <w:t xml:space="preserve"> (Y-2) </w:t>
-      </w:r>
-      <w:r>
-        <w:rPr>
-          <w:rFonts w:ascii="B Nazanin" w:hAnsi="B Nazanin" w:cs="B Nazanin" w:hint="cs"/>
-          <w:sz w:val="24"/>
-          <w:szCs w:val="24"/>
-          <w:rtl/>
-          <w:lang w:bidi="fa-IR"/>
-        </w:rPr>
-        <w:t xml:space="preserve">استفاده می‌شود؛ هدف، سنجش زمینه شخصیتی پایدار اضطراب در معامله‌گران است، نه واکنش لحظه‌ای آنان به یک موقعیت خاص. بر همین اساس، فرم حالت (اضطراب حالتی) در این پژوهش اجرا نمی‌شود؛ چه آنکه هدف، سنجش زمینه پایدار آسیب‌پذیری در برابر فشارهای بازار است، نه شدت اضطراب آزمودنی در لحظه پاسخ‌دهی.</w:t>
+        <w:t xml:space="preserve">پرسشنامه طرحواره یانگ — فرم کوتاه توسط یانگ (۱۹۹۸) به عنوان نسخه‌ای کوتاه‌تر از ابزار اصلی برای سنجش ۱۵ طرحواره ناسازگار اولیه تدوین شده است. این پرسشنامه شامل ۷۵ گویه است که به ازای هر طرحواره، ۵ گویه را در بر می‌گیرد و بر اساس نظریه طرحواره، الگوهای هیجانی و شناختی عمیق و پایداری را می‌سنجد که در دوران کودکی و نوجوانی شکل گرفته‌اند و تفسیر فرد از موقعیت‌های زندگی را جهت می‌دهند.</w:t>
       </w:r>
     </w:p>
     <w:p>
@@ -9385,7 +9326,7 @@
           <w:rtl/>
           <w:lang w:bidi="fa-IR"/>
         </w:rPr>
-        <w:t xml:space="preserve">فرم صفتی شامل ۲۰ گویه است که احساسات کلی و معمول فرد را توصیف می‌کنند و آزمودنی میزان انطباق هر گویه با احساسات خود را بر اساس مقیاس ۴ درجه‌ای لیکرت با گزینه‌های «تقریباً هرگز»، «گاهی اوقات»، «بیشتر اوقات» و «تقریباً همیشه» (از ۱ تا ۴) مشخص می‌کند. این فرم شامل گویه‌هایی با نمره‌گذاری معکوس نیز هست. دامنه نمره کل بین ۲۰ تا ۸۰ است و نمره بالاتر نشان‌دهنده سطح بالاتر اضطراب صفتی است.</w:t>
+        <w:t xml:space="preserve">نمره‌گذاری گویه‌ها بر اساس مقیاس ۶ درجه‌ای لیکرت انجام می‌شود. گزینه‌های این مقیاس — همان‌گونه که در نسخه آنلاین منتشرشده پژوهش آمده است — به ترتیب عبارت‌اند از: «۱=کاملاً در مورد من غلط است»، «۲=تقریباً غلط است»، «۳=بیشتر غلط است تا درست»، «۴=اندکی درست است»، «۵=تقریباً درست است» و «۶=کاملاً مرا توصیف می‌کند». برای هر طرحواره نمره‌ای بین ۵ تا ۳۰ به دست می‌آید و نمره بالاتر نشان‌دهنده شدت بیشتر آن طرحواره است. ترتیب گزینه‌ها در نسخه آنلاین منتشرشده پژوهش با همین جهت نمره‌گذاری هم‌خوان است و نیازی به وارونه‌سازی نمرات در مرحله کدگذاری وجود ندارد.</w:t>
       </w:r>
     </w:p>
     <w:p>
@@ -9402,7 +9343,7 @@
           <w:rtl/>
           <w:lang w:bidi="fa-IR"/>
         </w:rPr>
-        <w:t xml:space="preserve">از نظر ویژگی‌های روان‌سنجی، پایایی درونی این ابزار از ابتدا با ضرایب آلفای کرونباخ بالا (۰٫۸۶ تا ۰٫۹۵) تأیید شده است (اسپیلبرگر، ۱۹۸۳). در ایران نیز پژوهش بشارت و همکاران (۱۳۹۵) ساختار عاملی و پایایی نسخه فارسی این پرسشنامه را در نمونه‌های ایرانی بررسی و تأیید کرده است؛ در این پژوهش آلفای کرونباخ ۰٫۸۹ گزارش شده است.</w:t>
+        <w:t xml:space="preserve">ویژگی‌های روان‌سنجی ابزار اصلی طرحواره‌ها در مطالعات متعدد بررسی و تأیید شده است (یانگ، ۱۹۹۸؛ اشمیت و همکاران، ۱۹۹۵). در ایران نیز پژوهش یوسفی (۱۳۹۶) ویژگی‌های روان‌سنجی نسخه فارسی این پرسشنامه را در نمونه غیربالینی بررسی کرده است؛ در این پژوهش پایایی خرده‌مقیاس‌ها با ضرایب آلفای ۰٫۶۸ تا ۰٫۸۵ و روایی سازه قابل قبول گزارش شده است.</w:t>
       </w:r>
     </w:p>
     <w:p>
@@ -9438,18 +9379,15 @@
           <w:rtl/>
           <w:lang w:bidi="fa-IR"/>
         </w:rPr>
-        <w:t xml:space="preserve">۳-۴-۲. پرسشنامه طرحواره‌های ناسازگار اولیه یانگ — فرم کوتاه</w:t>
-      </w:r>
-      <w:r>
-        <w:rPr>
-          <w:rFonts w:ascii="Times New Roman" w:hAnsi="Times New Roman" w:cs="Times New Roman"/>
-          <w:b/>
-          <w:bCs/>
-          <w:sz w:val="26"/>
-          <w:szCs w:val="26"/>
-          <w:lang w:val="en-US"/>
-        </w:rPr>
-        <w:t xml:space="preserve"> (YSQ-SF)</w:t>
+        <w:t xml:space="preserve">۳-۴-۳. مقیاس تحمل ریسک مالی گرابل و لایتون</w:t>
+      </w:r>
+      <w:r>
+        <w:rPr>
+          <w:rFonts w:ascii="B Nazanin" w:hAnsi="B Nazanin" w:cs="B Nazanin" w:hint="cs"/>
+          <w:vertAlign w:val="superscript"/>
+          <w:rtl/>
+        </w:rPr>
+        <w:footnoteReference w:id="39"/>
       </w:r>
     </w:p>
     <w:p>
@@ -9466,25 +9404,7 @@
           <w:rtl/>
           <w:lang w:bidi="fa-IR"/>
         </w:rPr>
-        <w:t xml:space="preserve">پرسشنامه طرحواره یانگ — فرم کوتاه </w:t>
-      </w:r>
-      <w:r>
-        <w:rPr>
-          <w:rFonts w:ascii="B Nazanin" w:hAnsi="B Nazanin" w:cs="B Nazanin" w:hint="cs"/>
-          <w:vertAlign w:val="superscript"/>
-          <w:rtl/>
-        </w:rPr>
-        <w:footnoteReference w:id="41"/>
-      </w:r>
-      <w:r>
-        <w:rPr>
-          <w:rFonts w:ascii="B Nazanin" w:hAnsi="B Nazanin" w:cs="B Nazanin" w:hint="cs"/>
-          <w:sz w:val="24"/>
-          <w:szCs w:val="24"/>
-          <w:rtl/>
-          <w:lang w:bidi="fa-IR"/>
-        </w:rPr>
-        <w:t xml:space="preserve"> توسط یانگ (۱۹۹۸) به عنوان نسخه‌ای کوتاه‌تر از ابزار اصلی برای سنجش ۱۵ طرحواره ناسازگار اولیه تدوین شده است. این پرسشنامه شامل ۷۵ گویه است که به ازای هر طرحواره، ۵ گویه را در بر می‌گیرد و بر اساس نظریه طرحواره، الگوهای هیجانی و شناختی عمیق و پایداری را می‌سنجد که در دوران کودکی و نوجوانی شکل گرفته‌اند و تفسیر فرد از موقعیت‌های زندگی را جهت می‌دهند.</w:t>
+        <w:t xml:space="preserve">مقیاس تحمل ریسک مالی توسط گرابل و لایتون (۱۹۹۹) ساخته شده است؛ ابزاری برای سنجش تمایل، ظرفیت و نگرش فرد نسبت به پذیرش ریسک در تصمیم‌های مالی. این مقیاس شامل ۱۳ سؤال تک‌گزینه‌ای است که هر سؤال گزینه‌های متنی مختص خود را دارد و پاسخ‌دهنده از میان چهار گزینه هر سؤال، گزینه‌ای را انتخاب می‌کند که به بهترین وجه دیدگاه یا ترجیح واقعی او را منعکس می‌سازد؛ در این مقیاس پاسخ درست یا غلطی وجود ندارد. سؤالات این مقیاس عمدتاً در قالب موقعیت‌های فرضی و سؤالات ترجیحی طراحی شده‌اند؛ برای نمونه، انتخاب میان دریافت مبلغ قطعی یا شرکت در یک شانس با بازده بالاتر، یا تعیین ترجیح میان انواع دارایی‌های سرمایه‌گذاری. این ساختار موجب می‌شود پاسخ‌دهنده بدون آنکه خود را در معرض قضاوت ببیند، تمایل واقعی خود به پذیرش ریسک را آشکار سازد.</w:t>
       </w:r>
     </w:p>
     <w:p>
@@ -9501,7 +9421,7 @@
           <w:rtl/>
           <w:lang w:bidi="fa-IR"/>
         </w:rPr>
-        <w:t xml:space="preserve">نمره‌گذاری گویه‌ها بر اساس مقیاس ۶ درجه‌ای لیکرت انجام می‌شود. گزینه‌های این مقیاس — همان‌گونه که در نسخه آنلاین منتشرشده پژوهش آمده است — به ترتیب عبارت‌اند از: «۱=کاملاً در مورد من غلط است»، «۲=تقریباً غلط است»، «۳=بیشتر غلط است تا درست»، «۴=اندکی درست است»، «۵=تقریباً درست است» و «۶=کاملاً مرا توصیف می‌کند». برای هر طرحواره نمره‌ای بین ۵ تا ۳۰ به دست می‌آید و نمره بالاتر نشان‌دهنده شدت بیشتر آن طرحواره است. ترتیب گزینه‌ها در نسخه آنلاین منتشرشده پژوهش با همین جهت نمره‌گذاری هم‌خوان است و نیازی به وارونه‌سازی نمرات در مرحله کدگذاری وجود ندارد.</w:t>
+        <w:t xml:space="preserve">نمره کل مقیاس بین ۱۳ تا ۴۵ محاسبه می‌شود و نمره بالاتر نشان‌دهنده تحمل ریسک بیشتر و در نتیجه تمایل بالاتر به بروز رفتارهای مالی پرخطر است.</w:t>
       </w:r>
     </w:p>
     <w:p>
@@ -9518,71 +9438,7 @@
           <w:rtl/>
           <w:lang w:bidi="fa-IR"/>
         </w:rPr>
-        <w:t xml:space="preserve">ویژگی‌های روان‌سنجی ابزار اصلی طرحواره‌ها در مطالعات متعدد بررسی و تأیید شده است (یانگ، ۱۹۹۸؛ اشمیت و همکاران، ۱۹۹۵). در ایران نیز پژوهش یوسفی (۱۳۹۶) ویژگی‌های روان‌سنجی نسخه فارسی این پرسشنامه را در نمونه غیربالینی بررسی کرده است؛ در این پژوهش پایایی خرده‌مقیاس‌ها با ضرایب آلفای ۰٫۶۸ تا ۰٫۸۵ و روایی سازه قابل قبول گزارش شده است.</w:t>
-      </w:r>
-    </w:p>
-    <w:p>
-      <w:pPr>
-        <w:bidi w:val="1"/>
-        <w:spacing w:lineRule="exact" w:line="580" w:after="0"/>
-        <w:jc w:val="both"/>
-      </w:pPr>
-      <w:r>
-        <w:rPr>
-          <w:rFonts w:ascii="B Nazanin" w:hAnsi="B Nazanin" w:cs="B Nazanin" w:hint="cs"/>
-          <w:sz w:val="24"/>
-          <w:szCs w:val="24"/>
-          <w:rtl/>
-          <w:lang w:bidi="fa-IR"/>
-        </w:rPr>
-        <w:t xml:space="preserve">پایایی ابزار در نمونه پژوهش حاضر با آلفای کرونباخ محاسبه و در فصل چهارم گزارش خواهد شد.</w:t>
-      </w:r>
-    </w:p>
-    <w:p>
-      <w:pPr>
-        <w:pStyle w:val="Heading3"/>
-        <w:bidi w:val="1"/>
-        <w:jc w:val="right"/>
-      </w:pPr>
-      <w:r>
-        <w:rPr>
-          <w:rFonts w:ascii="B Nazanin" w:hAnsi="B Nazanin" w:cs="B Nazanin" w:hint="cs"/>
-          <w:b/>
-          <w:bCs/>
-          <w:sz w:val="26"/>
-          <w:szCs w:val="26"/>
-          <w:rtl/>
-          <w:lang w:bidi="fa-IR"/>
-        </w:rPr>
-        <w:t xml:space="preserve">۳-۴-۳. مقیاس تحمل ریسک مالی گرابل و لایتون</w:t>
-      </w:r>
-      <w:r>
-        <w:rPr>
-          <w:rFonts w:ascii="Times New Roman" w:hAnsi="Times New Roman" w:cs="Times New Roman"/>
-          <w:b/>
-          <w:bCs/>
-          <w:sz w:val="26"/>
-          <w:szCs w:val="26"/>
-          <w:lang w:val="en-US"/>
-        </w:rPr>
-        <w:t xml:space="preserve"> (GL-RTS)</w:t>
-      </w:r>
-    </w:p>
-    <w:p>
-      <w:pPr>
-        <w:bidi w:val="1"/>
-        <w:spacing w:lineRule="exact" w:line="580" w:after="0"/>
-        <w:jc w:val="both"/>
-      </w:pPr>
-      <w:r>
-        <w:rPr>
-          <w:rFonts w:ascii="B Nazanin" w:hAnsi="B Nazanin" w:cs="B Nazanin" w:hint="cs"/>
-          <w:sz w:val="24"/>
-          <w:szCs w:val="24"/>
-          <w:rtl/>
-          <w:lang w:bidi="fa-IR"/>
-        </w:rPr>
-        <w:t xml:space="preserve">مقیاس تحمل ریسک مالی </w:t>
+        <w:t xml:space="preserve">به‌کارگیری این مقیاس به عنوان شاخص عملیاتی رفتارهای مالی پرخطر نیازمند توضیح روش‌شناختی مشخص است. نکته کلیدی این است: «تحمل ریسک» یک نگرش روانشناختی است و «رفتار پرخطر» یک عمل عینی. با این حال، ادبیات پژوهشی گسترده نشان داده است که مقیاس گرابل و لایتون از روایی پیش‌بین بسیار بالایی برخوردار است؛ به این معنا که نمرات افراد در این مقیاس توانایی پیش‌بینی رفتارهای مالی واقعی آنان را دارد (گرابل و لایتون، ۱۹۹۹؛ گرابل، ۲۰۱۷). بر همین اساس، در پژوهش حاضر این مقیاس به عنوان شاخص نیابتی</w:t>
       </w:r>
       <w:r>
         <w:rPr>
@@ -9590,59 +9446,7 @@
           <w:vertAlign w:val="superscript"/>
           <w:rtl/>
         </w:rPr>
-        <w:footnoteReference w:id="42"/>
-      </w:r>
-      <w:r>
-        <w:rPr>
-          <w:rFonts w:ascii="B Nazanin" w:hAnsi="B Nazanin" w:cs="B Nazanin" w:hint="cs"/>
-          <w:sz w:val="24"/>
-          <w:szCs w:val="24"/>
-          <w:rtl/>
-          <w:lang w:bidi="fa-IR"/>
-        </w:rPr>
-        <w:t xml:space="preserve"> توسط گرابل و لایتون (۱۹۹۹) ساخته شده است؛ ابزاری برای سنجش تمایل، ظرفیت و نگرش فرد نسبت به پذیرش ریسک در تصمیم‌های مالی. این مقیاس شامل ۱۳ سؤال تک‌گزینه‌ای است که هر سؤال گزینه‌های متنی مختص خود را دارد و پاسخ‌دهنده از میان چهار گزینه هر سؤال، گزینه‌ای را انتخاب می‌کند که به بهترین وجه دیدگاه یا ترجیح واقعی او را منعکس می‌سازد؛ در این مقیاس پاسخ درست یا غلطی وجود ندارد. سؤالات این مقیاس عمدتاً در قالب موقعیت‌های فرضی و سؤالات ترجیحی طراحی شده‌اند؛ برای نمونه، انتخاب میان دریافت مبلغ قطعی یا شرکت در یک شانس با بازده بالاتر، یا تعیین ترجیح میان انواع دارایی‌های سرمایه‌گذاری. این ساختار موجب می‌شود پاسخ‌دهنده بدون آنکه خود را در معرض قضاوت ببیند، تمایل واقعی خود به پذیرش ریسک را آشکار سازد.</w:t>
-      </w:r>
-    </w:p>
-    <w:p>
-      <w:pPr>
-        <w:bidi w:val="1"/>
-        <w:spacing w:lineRule="exact" w:line="580" w:after="0"/>
-        <w:jc w:val="both"/>
-      </w:pPr>
-      <w:r>
-        <w:rPr>
-          <w:rFonts w:ascii="B Nazanin" w:hAnsi="B Nazanin" w:cs="B Nazanin" w:hint="cs"/>
-          <w:sz w:val="24"/>
-          <w:szCs w:val="24"/>
-          <w:rtl/>
-          <w:lang w:bidi="fa-IR"/>
-        </w:rPr>
-        <w:t xml:space="preserve">نمره کل مقیاس بین ۱۳ تا ۴۵ محاسبه می‌شود و نمره بالاتر نشان‌دهنده تحمل ریسک بیشتر و در نتیجه تمایل بالاتر به بروز رفتارهای مالی پرخطر است.</w:t>
-      </w:r>
-    </w:p>
-    <w:p>
-      <w:pPr>
-        <w:bidi w:val="1"/>
-        <w:spacing w:lineRule="exact" w:line="580" w:after="0"/>
-        <w:jc w:val="both"/>
-      </w:pPr>
-      <w:r>
-        <w:rPr>
-          <w:rFonts w:ascii="B Nazanin" w:hAnsi="B Nazanin" w:cs="B Nazanin" w:hint="cs"/>
-          <w:sz w:val="24"/>
-          <w:szCs w:val="24"/>
-          <w:rtl/>
-          <w:lang w:bidi="fa-IR"/>
-        </w:rPr>
-        <w:t xml:space="preserve">به‌کارگیری این مقیاس به عنوان شاخص عملیاتی رفتارهای مالی پرخطر نیازمند توضیح روش‌شناختی مشخص است. نکته کلیدی این است: «تحمل ریسک» یک نگرش روانشناختی است و «رفتار پرخطر» یک عمل عینی. با این حال، ادبیات پژوهشی گسترده نشان داده است که مقیاس گرابل و لایتون از روایی پیش‌بین بسیار بالایی برخوردار است؛ به این معنا که نمرات افراد در این مقیاس توانایی پیش‌بینی رفتارهای مالی واقعی آنان را دارد (گرابل و لایتون، ۱۹۹۹؛ گرابل، ۲۰۱۷). بر همین اساس، در پژوهش حاضر این مقیاس به عنوان شاخص نیابتی </w:t>
-      </w:r>
-      <w:r>
-        <w:rPr>
-          <w:rFonts w:ascii="B Nazanin" w:hAnsi="B Nazanin" w:cs="B Nazanin" w:hint="cs"/>
-          <w:vertAlign w:val="superscript"/>
-          <w:rtl/>
-        </w:rPr>
-        <w:footnoteReference w:id="43"/>
+        <w:footnoteReference w:id="40"/>
       </w:r>
       <w:r>
         <w:rPr>
@@ -12715,7 +12519,7 @@
           <w:sz w:val="20"/>
           <w:szCs w:val="20"/>
         </w:rPr>
-        <w:t xml:space="preserve"> STAI</w:t>
+        <w:t xml:space="preserve"> State-Trait Anxiety Inventory, Form Y-2 (STAI-Y2)</w:t>
       </w:r>
     </w:p>
   </w:footnote>
@@ -12736,7 +12540,7 @@
           <w:sz w:val="20"/>
           <w:szCs w:val="20"/>
         </w:rPr>
-        <w:t xml:space="preserve"> YSQ-SF</w:t>
+        <w:t xml:space="preserve"> Young Schema Questionnaire – Short Form (YSQ-SF)</w:t>
       </w:r>
     </w:p>
   </w:footnote>
@@ -13114,7 +12918,7 @@
           <w:sz w:val="20"/>
           <w:szCs w:val="20"/>
         </w:rPr>
-        <w:t xml:space="preserve"> PROCESS</w:t>
+        <w:t xml:space="preserve"> CBT</w:t>
       </w:r>
     </w:p>
   </w:footnote>
@@ -13135,7 +12939,7 @@
           <w:sz w:val="20"/>
           <w:szCs w:val="20"/>
         </w:rPr>
-        <w:t xml:space="preserve"> CBT</w:t>
+        <w:t xml:space="preserve"> Applied Research</w:t>
       </w:r>
     </w:p>
   </w:footnote>
@@ -13156,7 +12960,7 @@
           <w:sz w:val="20"/>
           <w:szCs w:val="20"/>
         </w:rPr>
-        <w:t xml:space="preserve"> Applied Research</w:t>
+        <w:t xml:space="preserve"> Descriptive-Correlational</w:t>
       </w:r>
     </w:p>
   </w:footnote>
@@ -13177,7 +12981,7 @@
           <w:sz w:val="20"/>
           <w:szCs w:val="20"/>
         </w:rPr>
-        <w:t xml:space="preserve"> Descriptive-Correlational</w:t>
+        <w:t xml:space="preserve"> Mediation Model</w:t>
       </w:r>
     </w:p>
   </w:footnote>
@@ -13198,7 +13002,7 @@
           <w:sz w:val="20"/>
           <w:szCs w:val="20"/>
         </w:rPr>
-        <w:t xml:space="preserve"> Mediation Model</w:t>
+        <w:t xml:space="preserve"> Convenience Sampling</w:t>
       </w:r>
     </w:p>
   </w:footnote>
@@ -13219,7 +13023,7 @@
           <w:sz w:val="20"/>
           <w:szCs w:val="20"/>
         </w:rPr>
-        <w:t xml:space="preserve"> Convenience Sampling</w:t>
+        <w:t xml:space="preserve"> Snowball Sampling</w:t>
       </w:r>
     </w:p>
   </w:footnote>
@@ -13240,7 +13044,7 @@
           <w:sz w:val="20"/>
           <w:szCs w:val="20"/>
         </w:rPr>
-        <w:t xml:space="preserve"> Snowball Sampling</w:t>
+        <w:t xml:space="preserve"> Financial Risk Tolerance Scale (GL-RTS)</w:t>
       </w:r>
     </w:p>
   </w:footnote>
@@ -13261,7 +13065,7 @@
           <w:sz w:val="20"/>
           <w:szCs w:val="20"/>
         </w:rPr>
-        <w:t xml:space="preserve"> Spielberger State-Trait Anxiety Inventory</w:t>
+        <w:t xml:space="preserve"> Proxy Measure</w:t>
       </w:r>
     </w:p>
   </w:footnote>
@@ -13282,7 +13086,7 @@
           <w:sz w:val="20"/>
           <w:szCs w:val="20"/>
         </w:rPr>
-        <w:t xml:space="preserve"> Young Schema Questionnaire – Short Form</w:t>
+        <w:t xml:space="preserve"> OECD, 2021</w:t>
       </w:r>
     </w:p>
   </w:footnote>
@@ -13303,7 +13107,7 @@
           <w:sz w:val="20"/>
           <w:szCs w:val="20"/>
         </w:rPr>
-        <w:t xml:space="preserve"> Financial Risk Tolerance Scale</w:t>
+        <w:t xml:space="preserve"> Mahato et al.</w:t>
       </w:r>
     </w:p>
   </w:footnote>
@@ -13324,7 +13128,7 @@
           <w:sz w:val="20"/>
           <w:szCs w:val="20"/>
         </w:rPr>
-        <w:t xml:space="preserve"> Proxy Measure</w:t>
+        <w:t xml:space="preserve"> Grall-Bronnec et al.</w:t>
       </w:r>
     </w:p>
   </w:footnote>
@@ -13345,7 +13149,7 @@
           <w:sz w:val="20"/>
           <w:szCs w:val="20"/>
         </w:rPr>
-        <w:t xml:space="preserve"> OECD, 2021</w:t>
+        <w:t xml:space="preserve"> Mishkin</w:t>
       </w:r>
     </w:p>
   </w:footnote>
@@ -13366,7 +13170,7 @@
           <w:sz w:val="20"/>
           <w:szCs w:val="20"/>
         </w:rPr>
-        <w:t xml:space="preserve"> Mahato et al.</w:t>
+        <w:t xml:space="preserve"> Bodie, Kane, &amp; Marcus</w:t>
       </w:r>
     </w:p>
   </w:footnote>
@@ -13387,7 +13191,7 @@
           <w:sz w:val="20"/>
           <w:szCs w:val="20"/>
         </w:rPr>
-        <w:t xml:space="preserve"> Grall-Bronnec et al.</w:t>
+        <w:t xml:space="preserve"> Shiller</w:t>
       </w:r>
     </w:p>
   </w:footnote>
@@ -13408,7 +13212,7 @@
           <w:sz w:val="20"/>
           <w:szCs w:val="20"/>
         </w:rPr>
-        <w:t xml:space="preserve"> Mishkin</w:t>
+        <w:t xml:space="preserve"> Malkiel</w:t>
       </w:r>
     </w:p>
   </w:footnote>
@@ -13429,7 +13233,7 @@
           <w:sz w:val="20"/>
           <w:szCs w:val="20"/>
         </w:rPr>
-        <w:t xml:space="preserve"> Bodie, Kane, &amp; Marcus</w:t>
+        <w:t xml:space="preserve"> Thaler</w:t>
       </w:r>
     </w:p>
   </w:footnote>
@@ -13450,7 +13254,7 @@
           <w:sz w:val="20"/>
           <w:szCs w:val="20"/>
         </w:rPr>
-        <w:t xml:space="preserve"> Shiller</w:t>
+        <w:t xml:space="preserve"> Kahneman &amp; Tversky</w:t>
       </w:r>
     </w:p>
   </w:footnote>
@@ -13471,7 +13275,7 @@
           <w:sz w:val="20"/>
           <w:szCs w:val="20"/>
         </w:rPr>
-        <w:t xml:space="preserve"> Malkiel</w:t>
+        <w:t xml:space="preserve"> Kahneman</w:t>
       </w:r>
     </w:p>
   </w:footnote>
@@ -13492,7 +13296,7 @@
           <w:sz w:val="20"/>
           <w:szCs w:val="20"/>
         </w:rPr>
-        <w:t xml:space="preserve"> Thaler</w:t>
+        <w:t xml:space="preserve"> Auer &amp; Schuhmacher</w:t>
       </w:r>
     </w:p>
   </w:footnote>
@@ -13513,7 +13317,7 @@
           <w:sz w:val="20"/>
           <w:szCs w:val="20"/>
         </w:rPr>
-        <w:t xml:space="preserve"> Kahneman &amp; Tversky</w:t>
+        <w:t xml:space="preserve"> Hwang &amp; Salmon</w:t>
       </w:r>
     </w:p>
   </w:footnote>
@@ -13534,7 +13338,7 @@
           <w:sz w:val="20"/>
           <w:szCs w:val="20"/>
         </w:rPr>
-        <w:t xml:space="preserve"> Kahneman</w:t>
+        <w:t xml:space="preserve"> Spielberger</w:t>
       </w:r>
     </w:p>
   </w:footnote>
@@ -13555,7 +13359,7 @@
           <w:sz w:val="20"/>
           <w:szCs w:val="20"/>
         </w:rPr>
-        <w:t xml:space="preserve"> Auer &amp; Schuhmacher</w:t>
+        <w:t xml:space="preserve"> Beck</w:t>
       </w:r>
     </w:p>
   </w:footnote>
@@ -13576,7 +13380,7 @@
           <w:sz w:val="20"/>
           <w:szCs w:val="20"/>
         </w:rPr>
-        <w:t xml:space="preserve"> Hwang &amp; Salmon</w:t>
+        <w:t xml:space="preserve"> Bishop</w:t>
       </w:r>
     </w:p>
   </w:footnote>
@@ -13597,7 +13401,7 @@
           <w:sz w:val="20"/>
           <w:szCs w:val="20"/>
         </w:rPr>
-        <w:t xml:space="preserve"> Spielberger</w:t>
+        <w:t xml:space="preserve"> Beck &amp; Clark</w:t>
       </w:r>
     </w:p>
   </w:footnote>
@@ -13618,7 +13422,7 @@
           <w:sz w:val="20"/>
           <w:szCs w:val="20"/>
         </w:rPr>
-        <w:t xml:space="preserve"> Beck</w:t>
+        <w:t xml:space="preserve"> Grupe &amp; Nitschke</w:t>
       </w:r>
     </w:p>
   </w:footnote>
@@ -13639,7 +13443,7 @@
           <w:sz w:val="20"/>
           <w:szCs w:val="20"/>
         </w:rPr>
-        <w:t xml:space="preserve"> Bishop</w:t>
+        <w:t xml:space="preserve"> Eysenck et al.</w:t>
       </w:r>
     </w:p>
   </w:footnote>
@@ -13660,7 +13464,7 @@
           <w:sz w:val="20"/>
           <w:szCs w:val="20"/>
         </w:rPr>
-        <w:t xml:space="preserve"> Beck &amp; Clark</w:t>
+        <w:t xml:space="preserve"> Baddeley, Eysenck, &amp; Anderson</w:t>
       </w:r>
     </w:p>
   </w:footnote>
@@ -13681,7 +13485,7 @@
           <w:sz w:val="20"/>
           <w:szCs w:val="20"/>
         </w:rPr>
-        <w:t xml:space="preserve"> Grupe &amp; Nitschke</w:t>
+        <w:t xml:space="preserve"> Young et al.</w:t>
       </w:r>
     </w:p>
   </w:footnote>
@@ -13702,7 +13506,7 @@
           <w:sz w:val="20"/>
           <w:szCs w:val="20"/>
         </w:rPr>
-        <w:t xml:space="preserve"> Eysenck et al.</w:t>
+        <w:t xml:space="preserve"> Arntz &amp; Jacob</w:t>
       </w:r>
     </w:p>
   </w:footnote>
@@ -13723,7 +13527,7 @@
           <w:sz w:val="20"/>
           <w:szCs w:val="20"/>
         </w:rPr>
-        <w:t xml:space="preserve"> Baddeley, Eysenck, &amp; Anderson</w:t>
+        <w:t xml:space="preserve"> Shorey et al.</w:t>
       </w:r>
     </w:p>
   </w:footnote>
@@ -13744,7 +13548,7 @@
           <w:sz w:val="20"/>
           <w:szCs w:val="20"/>
         </w:rPr>
-        <w:t xml:space="preserve"> Young et al.</w:t>
+        <w:t xml:space="preserve"> Lindberg et al.</w:t>
       </w:r>
     </w:p>
   </w:footnote>
@@ -13765,7 +13569,7 @@
           <w:sz w:val="20"/>
           <w:szCs w:val="20"/>
         </w:rPr>
-        <w:t xml:space="preserve"> Arntz &amp; Jacob</w:t>
+        <w:t xml:space="preserve"> Baker &amp; Nofsinger</w:t>
       </w:r>
     </w:p>
   </w:footnote>
@@ -13786,7 +13590,7 @@
           <w:sz w:val="20"/>
           <w:szCs w:val="20"/>
         </w:rPr>
-        <w:t xml:space="preserve"> Shorey et al.</w:t>
+        <w:t xml:space="preserve"> Barber &amp; Odean</w:t>
       </w:r>
     </w:p>
   </w:footnote>
@@ -13807,7 +13611,7 @@
           <w:sz w:val="20"/>
           <w:szCs w:val="20"/>
         </w:rPr>
-        <w:t xml:space="preserve"> Lindberg et al.</w:t>
+        <w:t xml:space="preserve"> Shefrin &amp; Statman</w:t>
       </w:r>
     </w:p>
   </w:footnote>
@@ -13828,7 +13632,7 @@
           <w:sz w:val="20"/>
           <w:szCs w:val="20"/>
         </w:rPr>
-        <w:t xml:space="preserve"> Baker &amp; Nofsinger</w:t>
+        <w:t xml:space="preserve"> Goetzmann &amp; Kumar</w:t>
       </w:r>
     </w:p>
   </w:footnote>
@@ -13849,7 +13653,7 @@
           <w:sz w:val="20"/>
           <w:szCs w:val="20"/>
         </w:rPr>
-        <w:t xml:space="preserve"> Barber &amp; Odean</w:t>
+        <w:t xml:space="preserve"> Zuckerman</w:t>
       </w:r>
     </w:p>
   </w:footnote>
@@ -13870,7 +13674,7 @@
           <w:sz w:val="20"/>
           <w:szCs w:val="20"/>
         </w:rPr>
-        <w:t xml:space="preserve"> Shefrin &amp; Statman</w:t>
+        <w:t xml:space="preserve"> Lauriola &amp; Levin</w:t>
       </w:r>
     </w:p>
   </w:footnote>
@@ -13891,7 +13695,7 @@
           <w:sz w:val="20"/>
           <w:szCs w:val="20"/>
         </w:rPr>
-        <w:t xml:space="preserve"> Goetzmann &amp; Kumar</w:t>
+        <w:t xml:space="preserve"> Fenton-O'Creevy et al., 2012</w:t>
       </w:r>
     </w:p>
   </w:footnote>
@@ -13912,7 +13716,7 @@
           <w:sz w:val="20"/>
           <w:szCs w:val="20"/>
         </w:rPr>
-        <w:t xml:space="preserve"> Zuckerman</w:t>
+        <w:t xml:space="preserve"> Maner &amp; Schmidt</w:t>
       </w:r>
     </w:p>
   </w:footnote>
@@ -13933,7 +13737,7 @@
           <w:sz w:val="20"/>
           <w:szCs w:val="20"/>
         </w:rPr>
-        <w:t xml:space="preserve"> Lauriola &amp; Levin</w:t>
+        <w:t xml:space="preserve"> Young, Klosko, &amp; Weishaar</w:t>
       </w:r>
     </w:p>
   </w:footnote>
@@ -13954,7 +13758,7 @@
           <w:sz w:val="20"/>
           <w:szCs w:val="20"/>
         </w:rPr>
-        <w:t xml:space="preserve"> Fenton-O'Creevy et al., 2012</w:t>
+        <w:t xml:space="preserve"> Young</w:t>
       </w:r>
     </w:p>
   </w:footnote>
@@ -13975,7 +13779,7 @@
           <w:sz w:val="20"/>
           <w:szCs w:val="20"/>
         </w:rPr>
-        <w:t xml:space="preserve"> Maner &amp; Schmidt</w:t>
+        <w:t xml:space="preserve"> Grable &amp; Lytton</w:t>
       </w:r>
     </w:p>
   </w:footnote>
@@ -13996,7 +13800,7 @@
           <w:sz w:val="20"/>
           <w:szCs w:val="20"/>
         </w:rPr>
-        <w:t xml:space="preserve"> Young, Klosko, &amp; Weishaar</w:t>
+        <w:t xml:space="preserve"> Grable</w:t>
       </w:r>
     </w:p>
   </w:footnote>
@@ -14017,7 +13821,7 @@
           <w:sz w:val="20"/>
           <w:szCs w:val="20"/>
         </w:rPr>
-        <w:t xml:space="preserve"> Young</w:t>
+        <w:t xml:space="preserve"> Baddeley et al.</w:t>
       </w:r>
     </w:p>
   </w:footnote>
@@ -14038,7 +13842,7 @@
           <w:sz w:val="20"/>
           <w:szCs w:val="20"/>
         </w:rPr>
-        <w:t xml:space="preserve"> Grable &amp; Lytton</w:t>
+        <w:t xml:space="preserve"> Barlow</w:t>
       </w:r>
     </w:p>
   </w:footnote>
@@ -14059,7 +13863,7 @@
           <w:sz w:val="20"/>
           <w:szCs w:val="20"/>
         </w:rPr>
-        <w:t xml:space="preserve"> Grable</w:t>
+        <w:t xml:space="preserve"> Borkovec</w:t>
       </w:r>
     </w:p>
   </w:footnote>
@@ -14080,7 +13884,7 @@
           <w:sz w:val="20"/>
           <w:szCs w:val="20"/>
         </w:rPr>
-        <w:t xml:space="preserve"> Baddeley et al.</w:t>
+        <w:t xml:space="preserve"> Kaplan &amp; Sadock</w:t>
       </w:r>
     </w:p>
   </w:footnote>
@@ -14101,7 +13905,7 @@
           <w:sz w:val="20"/>
           <w:szCs w:val="20"/>
         </w:rPr>
-        <w:t xml:space="preserve"> Barlow</w:t>
+        <w:t xml:space="preserve"> Mitte</w:t>
       </w:r>
     </w:p>
   </w:footnote>
@@ -14122,7 +13926,7 @@
           <w:sz w:val="20"/>
           <w:szCs w:val="20"/>
         </w:rPr>
-        <w:t xml:space="preserve"> Borkovec</w:t>
+        <w:t xml:space="preserve"> Hartley &amp; Phelps</w:t>
       </w:r>
     </w:p>
   </w:footnote>
@@ -14143,7 +13947,7 @@
           <w:sz w:val="20"/>
           <w:szCs w:val="20"/>
         </w:rPr>
-        <w:t xml:space="preserve"> Kaplan &amp; Sadock</w:t>
+        <w:t xml:space="preserve"> American Psychiatric Association</w:t>
       </w:r>
     </w:p>
   </w:footnote>
@@ -14164,7 +13968,7 @@
           <w:sz w:val="20"/>
           <w:szCs w:val="20"/>
         </w:rPr>
-        <w:t xml:space="preserve"> Mitte</w:t>
+        <w:t xml:space="preserve"> Gambetti &amp; Giusberti</w:t>
       </w:r>
     </w:p>
   </w:footnote>
@@ -14185,7 +13989,7 @@
           <w:sz w:val="20"/>
           <w:szCs w:val="20"/>
         </w:rPr>
-        <w:t xml:space="preserve"> Hartley &amp; Phelps</w:t>
+        <w:t xml:space="preserve"> Lo et al.</w:t>
       </w:r>
     </w:p>
   </w:footnote>
@@ -14206,7 +14010,7 @@
           <w:sz w:val="20"/>
           <w:szCs w:val="20"/>
         </w:rPr>
-        <w:t xml:space="preserve"> American Psychiatric Association</w:t>
+        <w:t xml:space="preserve"> De Martino et al.</w:t>
       </w:r>
     </w:p>
   </w:footnote>
@@ -14227,7 +14031,7 @@
           <w:sz w:val="20"/>
           <w:szCs w:val="20"/>
         </w:rPr>
-        <w:t xml:space="preserve"> Gambetti &amp; Giusberti</w:t>
+        <w:t xml:space="preserve"> Kuhnen &amp; Chiao</w:t>
       </w:r>
     </w:p>
   </w:footnote>
@@ -14248,7 +14052,7 @@
           <w:sz w:val="20"/>
           <w:szCs w:val="20"/>
         </w:rPr>
-        <w:t xml:space="preserve"> Lo et al.</w:t>
+        <w:t xml:space="preserve"> Sigmund Freud</w:t>
       </w:r>
     </w:p>
   </w:footnote>
@@ -14269,7 +14073,7 @@
           <w:sz w:val="20"/>
           <w:szCs w:val="20"/>
         </w:rPr>
-        <w:t xml:space="preserve"> De Martino et al.</w:t>
+        <w:t xml:space="preserve"> Albert Ellis</w:t>
       </w:r>
     </w:p>
   </w:footnote>
@@ -14290,7 +14094,7 @@
           <w:sz w:val="20"/>
           <w:szCs w:val="20"/>
         </w:rPr>
-        <w:t xml:space="preserve"> Kuhnen &amp; Chiao</w:t>
+        <w:t xml:space="preserve"> Daniel, Hirshleifer, &amp; Subrahmanyam</w:t>
       </w:r>
     </w:p>
   </w:footnote>
@@ -14311,7 +14115,7 @@
           <w:sz w:val="20"/>
           <w:szCs w:val="20"/>
         </w:rPr>
-        <w:t xml:space="preserve"> Sigmund Freud</w:t>
+        <w:t xml:space="preserve"> Rollo May</w:t>
       </w:r>
     </w:p>
   </w:footnote>
@@ -14332,7 +14136,7 @@
           <w:sz w:val="20"/>
           <w:szCs w:val="20"/>
         </w:rPr>
-        <w:t xml:space="preserve"> Albert Ellis</w:t>
+        <w:t xml:space="preserve"> Yalom</w:t>
       </w:r>
     </w:p>
   </w:footnote>
@@ -14353,7 +14157,7 @@
           <w:sz w:val="20"/>
           <w:szCs w:val="20"/>
         </w:rPr>
-        <w:t xml:space="preserve"> Daniel, Hirshleifer, &amp; Subrahmanyam</w:t>
+        <w:t xml:space="preserve"> Charles &amp; Kasilingam</w:t>
       </w:r>
     </w:p>
   </w:footnote>
@@ -14374,7 +14178,7 @@
           <w:sz w:val="20"/>
           <w:szCs w:val="20"/>
         </w:rPr>
-        <w:t xml:space="preserve"> Rollo May</w:t>
+        <w:t xml:space="preserve"> An, Li, &amp; Wu</w:t>
       </w:r>
     </w:p>
   </w:footnote>
@@ -14395,7 +14199,7 @@
           <w:sz w:val="20"/>
           <w:szCs w:val="20"/>
         </w:rPr>
-        <w:t xml:space="preserve"> Yalom</w:t>
+        <w:t xml:space="preserve"> Vieira et al.</w:t>
       </w:r>
     </w:p>
   </w:footnote>
@@ -14416,7 +14220,7 @@
           <w:sz w:val="20"/>
           <w:szCs w:val="20"/>
         </w:rPr>
-        <w:t xml:space="preserve"> Charles &amp; Kasilingam</w:t>
+        <w:t xml:space="preserve"> Schmidt et al.</w:t>
       </w:r>
     </w:p>
   </w:footnote>
@@ -14437,7 +14241,7 @@
           <w:sz w:val="20"/>
           <w:szCs w:val="20"/>
         </w:rPr>
-        <w:t xml:space="preserve"> An, Li, &amp; Wu</w:t>
+        <w:t xml:space="preserve"> Saggino et al.</w:t>
       </w:r>
     </w:p>
   </w:footnote>
@@ -14458,7 +14262,7 @@
           <w:sz w:val="20"/>
           <w:szCs w:val="20"/>
         </w:rPr>
-        <w:t xml:space="preserve"> Vieira et al.</w:t>
+        <w:t xml:space="preserve"> Hayes</w:t>
       </w:r>
     </w:p>
   </w:footnote>
@@ -14479,7 +14283,7 @@
           <w:sz w:val="20"/>
           <w:szCs w:val="20"/>
         </w:rPr>
-        <w:t xml:space="preserve"> Schmidt et al.</w:t>
+        <w:t xml:space="preserve"> Estévez et al.</w:t>
       </w:r>
     </w:p>
   </w:footnote>
@@ -14500,7 +14304,7 @@
           <w:sz w:val="20"/>
           <w:szCs w:val="20"/>
         </w:rPr>
-        <w:t xml:space="preserve"> Saggino et al.</w:t>
+        <w:t xml:space="preserve"> Sedighi Arfaee et al.</w:t>
       </w:r>
     </w:p>
   </w:footnote>
@@ -14521,7 +14325,7 @@
           <w:sz w:val="20"/>
           <w:szCs w:val="20"/>
         </w:rPr>
-        <w:t xml:space="preserve"> Hayes</w:t>
+        <w:t xml:space="preserve"> Arena et al.</w:t>
       </w:r>
     </w:p>
   </w:footnote>
@@ -14542,7 +14346,7 @@
           <w:sz w:val="20"/>
           <w:szCs w:val="20"/>
         </w:rPr>
-        <w:t xml:space="preserve"> Estévez et al.</w:t>
+        <w:t xml:space="preserve"> An et al.</w:t>
       </w:r>
     </w:p>
   </w:footnote>
@@ -14563,7 +14367,7 @@
           <w:sz w:val="20"/>
           <w:szCs w:val="20"/>
         </w:rPr>
-        <w:t xml:space="preserve"> Sedighi Arfaee et al.</w:t>
+        <w:t xml:space="preserve"> Rehm et al.</w:t>
       </w:r>
     </w:p>
   </w:footnote>
@@ -14584,7 +14388,7 @@
           <w:sz w:val="20"/>
           <w:szCs w:val="20"/>
         </w:rPr>
-        <w:t xml:space="preserve"> Arena et al.</w:t>
+        <w:t xml:space="preserve"> Fenton-O'Creevy et al., 2011</w:t>
       </w:r>
     </w:p>
   </w:footnote>
@@ -14605,7 +14409,7 @@
           <w:sz w:val="20"/>
           <w:szCs w:val="20"/>
         </w:rPr>
-        <w:t xml:space="preserve"> An et al.</w:t>
+        <w:t xml:space="preserve"> Halvorsen et al.</w:t>
       </w:r>
     </w:p>
   </w:footnote>
@@ -14626,7 +14430,7 @@
           <w:sz w:val="20"/>
           <w:szCs w:val="20"/>
         </w:rPr>
-        <w:t xml:space="preserve"> Rehm et al.</w:t>
+        <w:t xml:space="preserve"> Lo &amp; Repin</w:t>
       </w:r>
     </w:p>
   </w:footnote>
@@ -14647,7 +14451,7 @@
           <w:sz w:val="20"/>
           <w:szCs w:val="20"/>
         </w:rPr>
-        <w:t xml:space="preserve"> Fenton-O'Creevy et al., 2011</w:t>
+        <w:t xml:space="preserve"> Safitri et al.</w:t>
       </w:r>
     </w:p>
   </w:footnote>
@@ -14668,7 +14472,7 @@
           <w:sz w:val="20"/>
           <w:szCs w:val="20"/>
         </w:rPr>
-        <w:t xml:space="preserve"> Halvorsen et al.</w:t>
+        <w:t xml:space="preserve"> Ololo et al.</w:t>
       </w:r>
     </w:p>
   </w:footnote>
@@ -14689,74 +14493,11 @@
           <w:sz w:val="20"/>
           <w:szCs w:val="20"/>
         </w:rPr>
-        <w:t xml:space="preserve"> Lo &amp; Repin</w:t>
+        <w:t xml:space="preserve"> Kline</w:t>
       </w:r>
     </w:p>
   </w:footnote>
   <w:footnote w:id="109">
-    <w:p>
-      <w:pPr>
-        <w:bidi w:val="0"/>
-      </w:pPr>
-      <w:r>
-        <w:rPr>
-          <w:vertAlign w:val="superscript"/>
-        </w:rPr>
-        <w:footnoteRef/>
-      </w:r>
-      <w:r>
-        <w:rPr>
-          <w:rFonts w:ascii="Times New Roman" w:hAnsi="Times New Roman" w:cs="Times New Roman"/>
-          <w:sz w:val="20"/>
-          <w:szCs w:val="20"/>
-        </w:rPr>
-        <w:t xml:space="preserve"> Safitri et al.</w:t>
-      </w:r>
-    </w:p>
-  </w:footnote>
-  <w:footnote w:id="110">
-    <w:p>
-      <w:pPr>
-        <w:bidi w:val="0"/>
-      </w:pPr>
-      <w:r>
-        <w:rPr>
-          <w:vertAlign w:val="superscript"/>
-        </w:rPr>
-        <w:footnoteRef/>
-      </w:r>
-      <w:r>
-        <w:rPr>
-          <w:rFonts w:ascii="Times New Roman" w:hAnsi="Times New Roman" w:cs="Times New Roman"/>
-          <w:sz w:val="20"/>
-          <w:szCs w:val="20"/>
-        </w:rPr>
-        <w:t xml:space="preserve"> Ololo et al.</w:t>
-      </w:r>
-    </w:p>
-  </w:footnote>
-  <w:footnote w:id="111">
-    <w:p>
-      <w:pPr>
-        <w:bidi w:val="0"/>
-      </w:pPr>
-      <w:r>
-        <w:rPr>
-          <w:vertAlign w:val="superscript"/>
-        </w:rPr>
-        <w:footnoteRef/>
-      </w:r>
-      <w:r>
-        <w:rPr>
-          <w:rFonts w:ascii="Times New Roman" w:hAnsi="Times New Roman" w:cs="Times New Roman"/>
-          <w:sz w:val="20"/>
-          <w:szCs w:val="20"/>
-        </w:rPr>
-        <w:t xml:space="preserve"> Kline</w:t>
-      </w:r>
-    </w:p>
-  </w:footnote>
-  <w:footnote w:id="112">
     <w:p>
       <w:pPr>
         <w:bidi w:val="0"/>

</xml_diff>